<commit_message>
Agrega Módulo 20: Datos de seguridad de red al resumen de módulos 19 en adelante
Co-Authored-By: Claude Sonnet 5.5 <noreply@anthropic.com>
Claude-Session: https://claude.ai/code/session_013iWwbBbHxw2c1QtKDe5PjZ
</commit_message>
<xml_diff>
--- a/Modulos_19_en_adelante_Resumen.docx
+++ b/Modulos_19_en_adelante_Resumen.docx
@@ -2458,6 +2458,1984 @@
           <w:rFonts w:ascii="Calibri" w:cs="Calibri" w:eastAsia="Calibri" w:hAnsi="Calibri"/>
         </w:rPr>
         <w:t xml:space="preserve"> si el analista no sabe que son parte del funcionamiento del LBM.</w:t>
+      </w:r>
+    </w:p>
+    <w:p>
+      <w:r>
+        <w:br w:type="page"/>
+      </w:r>
+    </w:p>
+    <w:p>
+      <w:pPr>
+        <w:spacing w:after="60"/>
+        <w:jc w:val="center"/>
+      </w:pPr>
+      <w:r>
+        <w:rPr>
+          <w:rFonts w:ascii="Calibri" w:cs="Calibri" w:eastAsia="Calibri" w:hAnsi="Calibri"/>
+          <w:b/>
+          <w:bCs/>
+          <w:color w:val="000000"/>
+          <w:sz w:val="24"/>
+          <w:szCs w:val="24"/>
+        </w:rPr>
+        <w:t xml:space="preserve">Módulo 20: Datos de seguridad de red</w:t>
+      </w:r>
+    </w:p>
+    <w:p>
+      <w:pPr>
+        <w:spacing w:after="200"/>
+        <w:jc w:val="center"/>
+      </w:pPr>
+      <w:r>
+        <w:rPr>
+          <w:rFonts w:ascii="Calibri" w:cs="Calibri" w:eastAsia="Calibri" w:hAnsi="Calibri"/>
+          <w:color w:val="000000"/>
+          <w:sz w:val="24"/>
+          <w:szCs w:val="24"/>
+        </w:rPr>
+        <w:t xml:space="preserve">Resumen de ciberseguridad</w:t>
+      </w:r>
+    </w:p>
+    <w:p>
+      <w:pPr>
+        <w:spacing w:after="120" w:before="280"/>
+      </w:pPr>
+      <w:r>
+        <w:rPr>
+          <w:rFonts w:ascii="Calibri" w:cs="Calibri" w:eastAsia="Calibri" w:hAnsi="Calibri"/>
+          <w:b/>
+          <w:bCs/>
+        </w:rPr>
+        <w:t xml:space="preserve">1. Tipos de datos de seguridad</w:t>
+      </w:r>
+    </w:p>
+    <w:p>
+      <w:pPr>
+        <w:spacing w:after="80" w:before="160"/>
+      </w:pPr>
+      <w:r>
+        <w:rPr>
+          <w:rFonts w:ascii="Calibri" w:cs="Calibri" w:eastAsia="Calibri" w:hAnsi="Calibri"/>
+          <w:b/>
+          <w:bCs/>
+        </w:rPr>
+        <w:t xml:space="preserve">Datos de alertas</w:t>
+      </w:r>
+    </w:p>
+    <w:p>
+      <w:pPr>
+        <w:pStyle w:val="ListParagraph"/>
+        <w:numPr>
+          <w:ilvl w:val="0"/>
+          <w:numId w:val="2"/>
+        </w:numPr>
+        <w:spacing w:after="60"/>
+      </w:pPr>
+      <w:r>
+        <w:rPr>
+          <w:rFonts w:ascii="Calibri" w:cs="Calibri" w:eastAsia="Calibri" w:hAnsi="Calibri"/>
+        </w:rPr>
+        <w:t xml:space="preserve">Son mensajes generados por un </w:t>
+      </w:r>
+      <w:r>
+        <w:rPr>
+          <w:rFonts w:ascii="Calibri" w:cs="Calibri" w:eastAsia="Calibri" w:hAnsi="Calibri"/>
+          <w:b/>
+          <w:bCs/>
+        </w:rPr>
+        <w:t xml:space="preserve">IPS</w:t>
+      </w:r>
+      <w:r>
+        <w:rPr>
+          <w:rFonts w:ascii="Calibri" w:cs="Calibri" w:eastAsia="Calibri" w:hAnsi="Calibri"/>
+        </w:rPr>
+        <w:t xml:space="preserve"> o un </w:t>
+      </w:r>
+      <w:r>
+        <w:rPr>
+          <w:rFonts w:ascii="Calibri" w:cs="Calibri" w:eastAsia="Calibri" w:hAnsi="Calibri"/>
+          <w:b/>
+          <w:bCs/>
+        </w:rPr>
+        <w:t xml:space="preserve">IDS</w:t>
+      </w:r>
+      <w:r>
+        <w:rPr>
+          <w:rFonts w:ascii="Calibri" w:cs="Calibri" w:eastAsia="Calibri" w:hAnsi="Calibri"/>
+        </w:rPr>
+        <w:t xml:space="preserve"> como respuesta al tráfico que </w:t>
+      </w:r>
+      <w:r>
+        <w:rPr>
+          <w:rFonts w:ascii="Calibri" w:cs="Calibri" w:eastAsia="Calibri" w:hAnsi="Calibri"/>
+          <w:b/>
+          <w:bCs/>
+        </w:rPr>
+        <w:t xml:space="preserve">viola una regla</w:t>
+      </w:r>
+      <w:r>
+        <w:rPr>
+          <w:rFonts w:ascii="Calibri" w:cs="Calibri" w:eastAsia="Calibri" w:hAnsi="Calibri"/>
+        </w:rPr>
+        <w:t xml:space="preserve"> o coincide con la </w:t>
+      </w:r>
+      <w:r>
+        <w:rPr>
+          <w:rFonts w:ascii="Calibri" w:cs="Calibri" w:eastAsia="Calibri" w:hAnsi="Calibri"/>
+          <w:b/>
+          <w:bCs/>
+        </w:rPr>
+        <w:t xml:space="preserve">firma de un ataque conocido</w:t>
+      </w:r>
+      <w:r>
+        <w:rPr>
+          <w:rFonts w:ascii="Calibri" w:cs="Calibri" w:eastAsia="Calibri" w:hAnsi="Calibri"/>
+        </w:rPr>
+        <w:t xml:space="preserve">.</w:t>
+      </w:r>
+    </w:p>
+    <w:p>
+      <w:pPr>
+        <w:pStyle w:val="ListParagraph"/>
+        <w:numPr>
+          <w:ilvl w:val="0"/>
+          <w:numId w:val="2"/>
+        </w:numPr>
+        <w:spacing w:after="60"/>
+      </w:pPr>
+      <w:r>
+        <w:rPr>
+          <w:rFonts w:ascii="Calibri" w:cs="Calibri" w:eastAsia="Calibri" w:hAnsi="Calibri"/>
+          <w:b/>
+          <w:bCs/>
+        </w:rPr>
+        <w:t xml:space="preserve">Snort</w:t>
+      </w:r>
+      <w:r>
+        <w:rPr>
+          <w:rFonts w:ascii="Calibri" w:cs="Calibri" w:eastAsia="Calibri" w:hAnsi="Calibri"/>
+        </w:rPr>
+        <w:t xml:space="preserve"> genera las alertas. Se pueden leer y buscar con aplicaciones como </w:t>
+      </w:r>
+      <w:r>
+        <w:rPr>
+          <w:rFonts w:ascii="Calibri" w:cs="Calibri" w:eastAsia="Calibri" w:hAnsi="Calibri"/>
+          <w:b/>
+          <w:bCs/>
+        </w:rPr>
+        <w:t xml:space="preserve">Sguil, Squert y Kibana</w:t>
+      </w:r>
+      <w:r>
+        <w:rPr>
+          <w:rFonts w:ascii="Calibri" w:cs="Calibri" w:eastAsia="Calibri" w:hAnsi="Calibri"/>
+        </w:rPr>
+        <w:t xml:space="preserve">, que forman parte del conjunto </w:t>
+      </w:r>
+      <w:r>
+        <w:rPr>
+          <w:rFonts w:ascii="Calibri" w:cs="Calibri" w:eastAsia="Calibri" w:hAnsi="Calibri"/>
+          <w:b/>
+          <w:bCs/>
+        </w:rPr>
+        <w:t xml:space="preserve">Security Onion</w:t>
+      </w:r>
+      <w:r>
+        <w:rPr>
+          <w:rFonts w:ascii="Calibri" w:cs="Calibri" w:eastAsia="Calibri" w:hAnsi="Calibri"/>
+        </w:rPr>
+        <w:t xml:space="preserve"> de herramientas de NSM.</w:t>
+      </w:r>
+    </w:p>
+    <w:p>
+      <w:pPr>
+        <w:spacing w:after="80" w:before="160"/>
+      </w:pPr>
+      <w:r>
+        <w:rPr>
+          <w:rFonts w:ascii="Calibri" w:cs="Calibri" w:eastAsia="Calibri" w:hAnsi="Calibri"/>
+          <w:b/>
+          <w:bCs/>
+        </w:rPr>
+        <w:t xml:space="preserve">Datos de sesión</w:t>
+      </w:r>
+    </w:p>
+    <w:p>
+      <w:pPr>
+        <w:pStyle w:val="ListParagraph"/>
+        <w:numPr>
+          <w:ilvl w:val="0"/>
+          <w:numId w:val="2"/>
+        </w:numPr>
+        <w:spacing w:after="60"/>
+      </w:pPr>
+      <w:r>
+        <w:rPr>
+          <w:rFonts w:ascii="Calibri" w:cs="Calibri" w:eastAsia="Calibri" w:hAnsi="Calibri"/>
+        </w:rPr>
+        <w:t xml:space="preserve">Son un registro de una </w:t>
+      </w:r>
+      <w:r>
+        <w:rPr>
+          <w:rFonts w:ascii="Calibri" w:cs="Calibri" w:eastAsia="Calibri" w:hAnsi="Calibri"/>
+          <w:b/>
+          <w:bCs/>
+        </w:rPr>
+        <w:t xml:space="preserve">conversación entre dos terminales</w:t>
+      </w:r>
+      <w:r>
+        <w:rPr>
+          <w:rFonts w:ascii="Calibri" w:cs="Calibri" w:eastAsia="Calibri" w:hAnsi="Calibri"/>
+        </w:rPr>
+        <w:t xml:space="preserve"> de red, normalmente un cliente y un servidor.</w:t>
+      </w:r>
+    </w:p>
+    <w:p>
+      <w:pPr>
+        <w:pStyle w:val="ListParagraph"/>
+        <w:numPr>
+          <w:ilvl w:val="0"/>
+          <w:numId w:val="2"/>
+        </w:numPr>
+        <w:spacing w:after="60"/>
+      </w:pPr>
+      <w:r>
+        <w:rPr>
+          <w:rFonts w:ascii="Calibri" w:cs="Calibri" w:eastAsia="Calibri" w:hAnsi="Calibri"/>
+        </w:rPr>
+        <w:t xml:space="preserve">El servidor puede estar dentro de la red de la empresa o en un lugar con acceso a Internet.</w:t>
+      </w:r>
+    </w:p>
+    <w:p>
+      <w:pPr>
+        <w:pStyle w:val="ListParagraph"/>
+        <w:numPr>
+          <w:ilvl w:val="0"/>
+          <w:numId w:val="2"/>
+        </w:numPr>
+        <w:spacing w:after="60"/>
+      </w:pPr>
+      <w:r>
+        <w:rPr>
+          <w:rFonts w:ascii="Calibri" w:cs="Calibri" w:eastAsia="Calibri" w:hAnsi="Calibri"/>
+        </w:rPr>
+        <w:t xml:space="preserve">Incluyen información de identificación, como la </w:t>
+      </w:r>
+      <w:r>
+        <w:rPr>
+          <w:rFonts w:ascii="Calibri" w:cs="Calibri" w:eastAsia="Calibri" w:hAnsi="Calibri"/>
+          <w:b/>
+          <w:bCs/>
+        </w:rPr>
+        <w:t xml:space="preserve">cinco tupla</w:t>
+      </w:r>
+      <w:r>
+        <w:rPr>
+          <w:rFonts w:ascii="Calibri" w:cs="Calibri" w:eastAsia="Calibri" w:hAnsi="Calibri"/>
+        </w:rPr>
+        <w:t xml:space="preserve">:</w:t>
+      </w:r>
+    </w:p>
+    <w:p>
+      <w:pPr>
+        <w:pStyle w:val="ListParagraph"/>
+        <w:numPr>
+          <w:ilvl w:val="1"/>
+          <w:numId w:val="2"/>
+        </w:numPr>
+        <w:spacing w:after="60"/>
+      </w:pPr>
+      <w:r>
+        <w:rPr>
+          <w:rFonts w:ascii="Calibri" w:cs="Calibri" w:eastAsia="Calibri" w:hAnsi="Calibri"/>
+        </w:rPr>
+        <w:t xml:space="preserve">Direcciones IP de origen y destino</w:t>
+      </w:r>
+    </w:p>
+    <w:p>
+      <w:pPr>
+        <w:pStyle w:val="ListParagraph"/>
+        <w:numPr>
+          <w:ilvl w:val="1"/>
+          <w:numId w:val="2"/>
+        </w:numPr>
+        <w:spacing w:after="60"/>
+      </w:pPr>
+      <w:r>
+        <w:rPr>
+          <w:rFonts w:ascii="Calibri" w:cs="Calibri" w:eastAsia="Calibri" w:hAnsi="Calibri"/>
+        </w:rPr>
+        <w:t xml:space="preserve">Números de puerto de origen y destino</w:t>
+      </w:r>
+    </w:p>
+    <w:p>
+      <w:pPr>
+        <w:pStyle w:val="ListParagraph"/>
+        <w:numPr>
+          <w:ilvl w:val="1"/>
+          <w:numId w:val="2"/>
+        </w:numPr>
+        <w:spacing w:after="60"/>
+      </w:pPr>
+      <w:r>
+        <w:rPr>
+          <w:rFonts w:ascii="Calibri" w:cs="Calibri" w:eastAsia="Calibri" w:hAnsi="Calibri"/>
+        </w:rPr>
+        <w:t xml:space="preserve">Código IP del protocolo en uso</w:t>
+      </w:r>
+    </w:p>
+    <w:p>
+      <w:pPr>
+        <w:pStyle w:val="ListParagraph"/>
+        <w:numPr>
+          <w:ilvl w:val="0"/>
+          <w:numId w:val="2"/>
+        </w:numPr>
+        <w:spacing w:after="60"/>
+      </w:pPr>
+      <w:r>
+        <w:rPr>
+          <w:rFonts w:ascii="Calibri" w:cs="Calibri" w:eastAsia="Calibri" w:hAnsi="Calibri"/>
+        </w:rPr>
+        <w:t xml:space="preserve">También suelen traer un </w:t>
+      </w:r>
+      <w:r>
+        <w:rPr>
+          <w:rFonts w:ascii="Calibri" w:cs="Calibri" w:eastAsia="Calibri" w:hAnsi="Calibri"/>
+          <w:b/>
+          <w:bCs/>
+        </w:rPr>
+        <w:t xml:space="preserve">identificador de la sesión</w:t>
+      </w:r>
+      <w:r>
+        <w:rPr>
+          <w:rFonts w:ascii="Calibri" w:cs="Calibri" w:eastAsia="Calibri" w:hAnsi="Calibri"/>
+        </w:rPr>
+        <w:t xml:space="preserve">, la </w:t>
+      </w:r>
+      <w:r>
+        <w:rPr>
+          <w:rFonts w:ascii="Calibri" w:cs="Calibri" w:eastAsia="Calibri" w:hAnsi="Calibri"/>
+          <w:b/>
+          <w:bCs/>
+        </w:rPr>
+        <w:t xml:space="preserve">cantidad de datos transferidos</w:t>
+      </w:r>
+      <w:r>
+        <w:rPr>
+          <w:rFonts w:ascii="Calibri" w:cs="Calibri" w:eastAsia="Calibri" w:hAnsi="Calibri"/>
+        </w:rPr>
+        <w:t xml:space="preserve"> por el origen y el destino y la </w:t>
+      </w:r>
+      <w:r>
+        <w:rPr>
+          <w:rFonts w:ascii="Calibri" w:cs="Calibri" w:eastAsia="Calibri" w:hAnsi="Calibri"/>
+          <w:b/>
+          <w:bCs/>
+        </w:rPr>
+        <w:t xml:space="preserve">duración</w:t>
+      </w:r>
+      <w:r>
+        <w:rPr>
+          <w:rFonts w:ascii="Calibri" w:cs="Calibri" w:eastAsia="Calibri" w:hAnsi="Calibri"/>
+        </w:rPr>
+        <w:t xml:space="preserve"> de la sesión.</w:t>
+      </w:r>
+    </w:p>
+    <w:p>
+      <w:pPr>
+        <w:spacing w:after="80" w:before="160"/>
+      </w:pPr>
+      <w:r>
+        <w:rPr>
+          <w:rFonts w:ascii="Calibri" w:cs="Calibri" w:eastAsia="Calibri" w:hAnsi="Calibri"/>
+          <w:b/>
+          <w:bCs/>
+        </w:rPr>
+        <w:t xml:space="preserve">Captura de paquetes completos</w:t>
+      </w:r>
+    </w:p>
+    <w:p>
+      <w:pPr>
+        <w:pStyle w:val="ListParagraph"/>
+        <w:numPr>
+          <w:ilvl w:val="0"/>
+          <w:numId w:val="2"/>
+        </w:numPr>
+        <w:spacing w:after="60"/>
+      </w:pPr>
+      <w:r>
+        <w:rPr>
+          <w:rFonts w:ascii="Calibri" w:cs="Calibri" w:eastAsia="Calibri" w:hAnsi="Calibri"/>
+        </w:rPr>
+        <w:t xml:space="preserve">Es la captura que obtiene los </w:t>
+      </w:r>
+      <w:r>
+        <w:rPr>
+          <w:rFonts w:ascii="Calibri" w:cs="Calibri" w:eastAsia="Calibri" w:hAnsi="Calibri"/>
+          <w:b/>
+          <w:bCs/>
+        </w:rPr>
+        <w:t xml:space="preserve">datos más detallados</w:t>
+      </w:r>
+      <w:r>
+        <w:rPr>
+          <w:rFonts w:ascii="Calibri" w:cs="Calibri" w:eastAsia="Calibri" w:hAnsi="Calibri"/>
+        </w:rPr>
+        <w:t xml:space="preserve"> de la red.</w:t>
+      </w:r>
+    </w:p>
+    <w:p>
+      <w:pPr>
+        <w:pStyle w:val="ListParagraph"/>
+        <w:numPr>
+          <w:ilvl w:val="0"/>
+          <w:numId w:val="2"/>
+        </w:numPr>
+        <w:spacing w:after="60"/>
+      </w:pPr>
+      <w:r>
+        <w:rPr>
+          <w:rFonts w:ascii="Calibri" w:cs="Calibri" w:eastAsia="Calibri" w:hAnsi="Calibri"/>
+        </w:rPr>
+        <w:t xml:space="preserve">Es la que </w:t>
+      </w:r>
+      <w:r>
+        <w:rPr>
+          <w:rFonts w:ascii="Calibri" w:cs="Calibri" w:eastAsia="Calibri" w:hAnsi="Calibri"/>
+          <w:b/>
+          <w:bCs/>
+        </w:rPr>
+        <w:t xml:space="preserve">requiere el mayor almacenamiento</w:t>
+      </w:r>
+      <w:r>
+        <w:rPr>
+          <w:rFonts w:ascii="Calibri" w:cs="Calibri" w:eastAsia="Calibri" w:hAnsi="Calibri"/>
+        </w:rPr>
+        <w:t xml:space="preserve">.</w:t>
+      </w:r>
+    </w:p>
+    <w:p>
+      <w:pPr>
+        <w:pStyle w:val="ListParagraph"/>
+        <w:numPr>
+          <w:ilvl w:val="0"/>
+          <w:numId w:val="2"/>
+        </w:numPr>
+        <w:spacing w:after="60"/>
+      </w:pPr>
+      <w:r>
+        <w:rPr>
+          <w:rFonts w:ascii="Calibri" w:cs="Calibri" w:eastAsia="Calibri" w:hAnsi="Calibri"/>
+        </w:rPr>
+        <w:t xml:space="preserve">Contiene todo el material de las conversaciones: mensajes de texto o correo, el HTML de páginas web y los archivos que entran o salen de la red.</w:t>
+      </w:r>
+    </w:p>
+    <w:p>
+      <w:pPr>
+        <w:pStyle w:val="ListParagraph"/>
+        <w:numPr>
+          <w:ilvl w:val="0"/>
+          <w:numId w:val="2"/>
+        </w:numPr>
+        <w:spacing w:after="60"/>
+      </w:pPr>
+      <w:r>
+        <w:rPr>
+          <w:rFonts w:ascii="Calibri" w:cs="Calibri" w:eastAsia="Calibri" w:hAnsi="Calibri"/>
+        </w:rPr>
+        <w:t xml:space="preserve">Ese contenido se puede </w:t>
+      </w:r>
+      <w:r>
+        <w:rPr>
+          <w:rFonts w:ascii="Calibri" w:cs="Calibri" w:eastAsia="Calibri" w:hAnsi="Calibri"/>
+          <w:b/>
+          <w:bCs/>
+        </w:rPr>
+        <w:t xml:space="preserve">recuperar y analizar</w:t>
+      </w:r>
+      <w:r>
+        <w:rPr>
+          <w:rFonts w:ascii="Calibri" w:cs="Calibri" w:eastAsia="Calibri" w:hAnsi="Calibri"/>
+        </w:rPr>
+        <w:t xml:space="preserve"> en busca de malware o comportamiento del usuario que viole las políticas de la empresa y de seguridad.</w:t>
+      </w:r>
+    </w:p>
+    <w:p>
+      <w:pPr>
+        <w:spacing w:after="80" w:before="160"/>
+      </w:pPr>
+      <w:r>
+        <w:rPr>
+          <w:rFonts w:ascii="Calibri" w:cs="Calibri" w:eastAsia="Calibri" w:hAnsi="Calibri"/>
+          <w:b/>
+          <w:bCs/>
+        </w:rPr>
+        <w:t xml:space="preserve">Datos estadísticos</w:t>
+      </w:r>
+    </w:p>
+    <w:p>
+      <w:pPr>
+        <w:pStyle w:val="ListParagraph"/>
+        <w:numPr>
+          <w:ilvl w:val="0"/>
+          <w:numId w:val="2"/>
+        </w:numPr>
+        <w:spacing w:after="60"/>
+      </w:pPr>
+      <w:r>
+        <w:rPr>
+          <w:rFonts w:ascii="Calibri" w:cs="Calibri" w:eastAsia="Calibri" w:hAnsi="Calibri"/>
+        </w:rPr>
+        <w:t xml:space="preserve">Se crean </w:t>
+      </w:r>
+      <w:r>
+        <w:rPr>
+          <w:rFonts w:ascii="Calibri" w:cs="Calibri" w:eastAsia="Calibri" w:hAnsi="Calibri"/>
+          <w:b/>
+          <w:bCs/>
+        </w:rPr>
+        <w:t xml:space="preserve">analizando varias formas de datos de red</w:t>
+      </w:r>
+      <w:r>
+        <w:rPr>
+          <w:rFonts w:ascii="Calibri" w:cs="Calibri" w:eastAsia="Calibri" w:hAnsi="Calibri"/>
+        </w:rPr>
+        <w:t xml:space="preserve">.</w:t>
+      </w:r>
+    </w:p>
+    <w:p>
+      <w:pPr>
+        <w:pStyle w:val="ListParagraph"/>
+        <w:numPr>
+          <w:ilvl w:val="0"/>
+          <w:numId w:val="2"/>
+        </w:numPr>
+        <w:spacing w:after="60"/>
+      </w:pPr>
+      <w:r>
+        <w:rPr>
+          <w:rFonts w:ascii="Calibri" w:cs="Calibri" w:eastAsia="Calibri" w:hAnsi="Calibri"/>
+        </w:rPr>
+        <w:t xml:space="preserve">Las características estadísticas del </w:t>
+      </w:r>
+      <w:r>
+        <w:rPr>
+          <w:rFonts w:ascii="Calibri" w:cs="Calibri" w:eastAsia="Calibri" w:hAnsi="Calibri"/>
+          <w:b/>
+          <w:bCs/>
+        </w:rPr>
+        <w:t xml:space="preserve">comportamiento normal</w:t>
+      </w:r>
+      <w:r>
+        <w:rPr>
+          <w:rFonts w:ascii="Calibri" w:cs="Calibri" w:eastAsia="Calibri" w:hAnsi="Calibri"/>
+        </w:rPr>
+        <w:t xml:space="preserve"> de la red se comparan con el tráfico actual para </w:t>
+      </w:r>
+      <w:r>
+        <w:rPr>
+          <w:rFonts w:ascii="Calibri" w:cs="Calibri" w:eastAsia="Calibri" w:hAnsi="Calibri"/>
+          <w:b/>
+          <w:bCs/>
+        </w:rPr>
+        <w:t xml:space="preserve">detectar anomalías</w:t>
+      </w:r>
+      <w:r>
+        <w:rPr>
+          <w:rFonts w:ascii="Calibri" w:cs="Calibri" w:eastAsia="Calibri" w:hAnsi="Calibri"/>
+        </w:rPr>
+        <w:t xml:space="preserve">.</w:t>
+      </w:r>
+    </w:p>
+    <w:p>
+      <w:pPr>
+        <w:pStyle w:val="ListParagraph"/>
+        <w:numPr>
+          <w:ilvl w:val="0"/>
+          <w:numId w:val="2"/>
+        </w:numPr>
+        <w:spacing w:after="60"/>
+      </w:pPr>
+      <w:r>
+        <w:rPr>
+          <w:rFonts w:ascii="Calibri" w:cs="Calibri" w:eastAsia="Calibri" w:hAnsi="Calibri"/>
+        </w:rPr>
+        <w:t xml:space="preserve">Sirven para caracterizar los volúmenes normales y la variación de los patrones de tráfico, e identificar condiciones </w:t>
+      </w:r>
+      <w:r>
+        <w:rPr>
+          <w:rFonts w:ascii="Calibri" w:cs="Calibri" w:eastAsia="Calibri" w:hAnsi="Calibri"/>
+          <w:b/>
+          <w:bCs/>
+        </w:rPr>
+        <w:t xml:space="preserve">significativamente fuera de esos rangos</w:t>
+      </w:r>
+      <w:r>
+        <w:rPr>
+          <w:rFonts w:ascii="Calibri" w:cs="Calibri" w:eastAsia="Calibri" w:hAnsi="Calibri"/>
+        </w:rPr>
+        <w:t xml:space="preserve">.</w:t>
+      </w:r>
+    </w:p>
+    <w:p>
+      <w:pPr>
+        <w:pStyle w:val="ListParagraph"/>
+        <w:numPr>
+          <w:ilvl w:val="0"/>
+          <w:numId w:val="2"/>
+        </w:numPr>
+        <w:spacing w:after="60"/>
+      </w:pPr>
+      <w:r>
+        <w:rPr>
+          <w:rFonts w:ascii="Calibri" w:cs="Calibri" w:eastAsia="Calibri" w:hAnsi="Calibri"/>
+        </w:rPr>
+        <w:t xml:space="preserve">Las diferencias estadísticamente significativas deben </w:t>
+      </w:r>
+      <w:r>
+        <w:rPr>
+          <w:rFonts w:ascii="Calibri" w:cs="Calibri" w:eastAsia="Calibri" w:hAnsi="Calibri"/>
+          <w:b/>
+          <w:bCs/>
+        </w:rPr>
+        <w:t xml:space="preserve">disparar alarmas</w:t>
+      </w:r>
+      <w:r>
+        <w:rPr>
+          <w:rFonts w:ascii="Calibri" w:cs="Calibri" w:eastAsia="Calibri" w:hAnsi="Calibri"/>
+        </w:rPr>
+        <w:t xml:space="preserve"> e impulsar la investigación.</w:t>
+      </w:r>
+    </w:p>
+    <w:p>
+      <w:pPr>
+        <w:spacing w:after="120" w:before="280"/>
+      </w:pPr>
+      <w:r>
+        <w:rPr>
+          <w:rFonts w:ascii="Calibri" w:cs="Calibri" w:eastAsia="Calibri" w:hAnsi="Calibri"/>
+          <w:b/>
+          <w:bCs/>
+        </w:rPr>
+        <w:t xml:space="preserve">2. Registros de terminales</w:t>
+      </w:r>
+    </w:p>
+    <w:p>
+      <w:pPr>
+        <w:spacing w:after="80" w:before="160"/>
+      </w:pPr>
+      <w:r>
+        <w:rPr>
+          <w:rFonts w:ascii="Calibri" w:cs="Calibri" w:eastAsia="Calibri" w:hAnsi="Calibri"/>
+          <w:b/>
+          <w:bCs/>
+        </w:rPr>
+        <w:t xml:space="preserve">HIDS (Host-based Intrusion Detection System)</w:t>
+      </w:r>
+    </w:p>
+    <w:p>
+      <w:pPr>
+        <w:pStyle w:val="ListParagraph"/>
+        <w:numPr>
+          <w:ilvl w:val="0"/>
+          <w:numId w:val="2"/>
+        </w:numPr>
+        <w:spacing w:after="60"/>
+      </w:pPr>
+      <w:r>
+        <w:rPr>
+          <w:rFonts w:ascii="Calibri" w:cs="Calibri" w:eastAsia="Calibri" w:hAnsi="Calibri"/>
+        </w:rPr>
+        <w:t xml:space="preserve">Se ejecuta en </w:t>
+      </w:r>
+      <w:r>
+        <w:rPr>
+          <w:rFonts w:ascii="Calibri" w:cs="Calibri" w:eastAsia="Calibri" w:hAnsi="Calibri"/>
+          <w:b/>
+          <w:bCs/>
+        </w:rPr>
+        <w:t xml:space="preserve">hosts individuales</w:t>
+      </w:r>
+      <w:r>
+        <w:rPr>
+          <w:rFonts w:ascii="Calibri" w:cs="Calibri" w:eastAsia="Calibri" w:hAnsi="Calibri"/>
+        </w:rPr>
+        <w:t xml:space="preserve">.</w:t>
+      </w:r>
+    </w:p>
+    <w:p>
+      <w:pPr>
+        <w:pStyle w:val="ListParagraph"/>
+        <w:numPr>
+          <w:ilvl w:val="0"/>
+          <w:numId w:val="2"/>
+        </w:numPr>
+        <w:spacing w:after="60"/>
+      </w:pPr>
+      <w:r>
+        <w:rPr>
+          <w:rFonts w:ascii="Calibri" w:cs="Calibri" w:eastAsia="Calibri" w:hAnsi="Calibri"/>
+        </w:rPr>
+        <w:t xml:space="preserve">No solo detecta intrusiones: en forma de </w:t>
+      </w:r>
+      <w:r>
+        <w:rPr>
+          <w:rFonts w:ascii="Calibri" w:cs="Calibri" w:eastAsia="Calibri" w:hAnsi="Calibri"/>
+          <w:b/>
+          <w:bCs/>
+        </w:rPr>
+        <w:t xml:space="preserve">firewalls basados en host</w:t>
+      </w:r>
+      <w:r>
+        <w:rPr>
+          <w:rFonts w:ascii="Calibri" w:cs="Calibri" w:eastAsia="Calibri" w:hAnsi="Calibri"/>
+        </w:rPr>
+        <w:t xml:space="preserve">, también puede </w:t>
+      </w:r>
+      <w:r>
+        <w:rPr>
+          <w:rFonts w:ascii="Calibri" w:cs="Calibri" w:eastAsia="Calibri" w:hAnsi="Calibri"/>
+          <w:b/>
+          <w:bCs/>
+        </w:rPr>
+        <w:t xml:space="preserve">prevenirlas</w:t>
+      </w:r>
+      <w:r>
+        <w:rPr>
+          <w:rFonts w:ascii="Calibri" w:cs="Calibri" w:eastAsia="Calibri" w:hAnsi="Calibri"/>
+        </w:rPr>
+        <w:t xml:space="preserve">.</w:t>
+      </w:r>
+    </w:p>
+    <w:p>
+      <w:pPr>
+        <w:pStyle w:val="ListParagraph"/>
+        <w:numPr>
+          <w:ilvl w:val="0"/>
+          <w:numId w:val="2"/>
+        </w:numPr>
+        <w:spacing w:after="60"/>
+      </w:pPr>
+      <w:r>
+        <w:rPr>
+          <w:rFonts w:ascii="Calibri" w:cs="Calibri" w:eastAsia="Calibri" w:hAnsi="Calibri"/>
+        </w:rPr>
+        <w:t xml:space="preserve">Crea registros y los guarda en el host.</w:t>
+      </w:r>
+    </w:p>
+    <w:p>
+      <w:pPr>
+        <w:pStyle w:val="ListParagraph"/>
+        <w:numPr>
+          <w:ilvl w:val="0"/>
+          <w:numId w:val="2"/>
+        </w:numPr>
+        <w:spacing w:after="60"/>
+      </w:pPr>
+      <w:r>
+        <w:rPr>
+          <w:rFonts w:ascii="Calibri" w:cs="Calibri" w:eastAsia="Calibri" w:hAnsi="Calibri"/>
+        </w:rPr>
+        <w:t xml:space="preserve">Muchas protecciones basadas en host mandan registros a </w:t>
+      </w:r>
+      <w:r>
+        <w:rPr>
+          <w:rFonts w:ascii="Calibri" w:cs="Calibri" w:eastAsia="Calibri" w:hAnsi="Calibri"/>
+          <w:b/>
+          <w:bCs/>
+        </w:rPr>
+        <w:t xml:space="preserve">servidores de administración de registros centralizados</w:t>
+      </w:r>
+      <w:r>
+        <w:rPr>
+          <w:rFonts w:ascii="Calibri" w:cs="Calibri" w:eastAsia="Calibri" w:hAnsi="Calibri"/>
+        </w:rPr>
+        <w:t xml:space="preserve">, para buscarlos desde un solo lugar con herramientas de NSM.</w:t>
+      </w:r>
+    </w:p>
+    <w:p>
+      <w:pPr>
+        <w:pStyle w:val="ListParagraph"/>
+        <w:numPr>
+          <w:ilvl w:val="0"/>
+          <w:numId w:val="2"/>
+        </w:numPr>
+        <w:spacing w:after="60"/>
+      </w:pPr>
+      <w:r>
+        <w:rPr>
+          <w:rFonts w:ascii="Calibri" w:cs="Calibri" w:eastAsia="Calibri" w:hAnsi="Calibri"/>
+          <w:b/>
+          <w:bCs/>
+        </w:rPr>
+        <w:t xml:space="preserve">OSSEC</w:t>
+      </w:r>
+      <w:r>
+        <w:rPr>
+          <w:rFonts w:ascii="Calibri" w:cs="Calibri" w:eastAsia="Calibri" w:hAnsi="Calibri"/>
+        </w:rPr>
+        <w:t xml:space="preserve"> es un HIDS de código abierto muy conocido, con una funcionalidad muy fuerte de recopilación y análisis de registros.</w:t>
+      </w:r>
+    </w:p>
+    <w:p>
+      <w:pPr>
+        <w:spacing w:after="80" w:before="160"/>
+      </w:pPr>
+      <w:r>
+        <w:rPr>
+          <w:rFonts w:ascii="Calibri" w:cs="Calibri" w:eastAsia="Calibri" w:hAnsi="Calibri"/>
+          <w:b/>
+          <w:bCs/>
+        </w:rPr>
+        <w:t xml:space="preserve">Syslog</w:t>
+      </w:r>
+    </w:p>
+    <w:p>
+      <w:pPr>
+        <w:pStyle w:val="ListParagraph"/>
+        <w:numPr>
+          <w:ilvl w:val="0"/>
+          <w:numId w:val="2"/>
+        </w:numPr>
+        <w:spacing w:after="60"/>
+      </w:pPr>
+      <w:r>
+        <w:rPr>
+          <w:rFonts w:ascii="Calibri" w:cs="Calibri" w:eastAsia="Calibri" w:hAnsi="Calibri"/>
+        </w:rPr>
+        <w:t xml:space="preserve">Incluye especificaciones para </w:t>
+      </w:r>
+      <w:r>
+        <w:rPr>
+          <w:rFonts w:ascii="Calibri" w:cs="Calibri" w:eastAsia="Calibri" w:hAnsi="Calibri"/>
+          <w:b/>
+          <w:bCs/>
+        </w:rPr>
+        <w:t xml:space="preserve">formatos de mensajes</w:t>
+      </w:r>
+      <w:r>
+        <w:rPr>
+          <w:rFonts w:ascii="Calibri" w:cs="Calibri" w:eastAsia="Calibri" w:hAnsi="Calibri"/>
+        </w:rPr>
+        <w:t xml:space="preserve">, una estructura de aplicación </w:t>
+      </w:r>
+      <w:r>
+        <w:rPr>
+          <w:rFonts w:ascii="Calibri" w:cs="Calibri" w:eastAsia="Calibri" w:hAnsi="Calibri"/>
+          <w:b/>
+          <w:bCs/>
+        </w:rPr>
+        <w:t xml:space="preserve">cliente y servidor</w:t>
+      </w:r>
+      <w:r>
+        <w:rPr>
+          <w:rFonts w:ascii="Calibri" w:cs="Calibri" w:eastAsia="Calibri" w:hAnsi="Calibri"/>
+        </w:rPr>
+        <w:t xml:space="preserve"> y un </w:t>
+      </w:r>
+      <w:r>
+        <w:rPr>
+          <w:rFonts w:ascii="Calibri" w:cs="Calibri" w:eastAsia="Calibri" w:hAnsi="Calibri"/>
+          <w:b/>
+          <w:bCs/>
+        </w:rPr>
+        <w:t xml:space="preserve">protocolo de red</w:t>
+      </w:r>
+      <w:r>
+        <w:rPr>
+          <w:rFonts w:ascii="Calibri" w:cs="Calibri" w:eastAsia="Calibri" w:hAnsi="Calibri"/>
+        </w:rPr>
+        <w:t xml:space="preserve">.</w:t>
+      </w:r>
+    </w:p>
+    <w:p>
+      <w:pPr>
+        <w:pStyle w:val="ListParagraph"/>
+        <w:numPr>
+          <w:ilvl w:val="0"/>
+          <w:numId w:val="2"/>
+        </w:numPr>
+        <w:spacing w:after="60"/>
+      </w:pPr>
+      <w:r>
+        <w:rPr>
+          <w:rFonts w:ascii="Calibri" w:cs="Calibri" w:eastAsia="Calibri" w:hAnsi="Calibri"/>
+        </w:rPr>
+        <w:t xml:space="preserve">Muchos tipos de dispositivos de red se pueden configurar con el estándar de syslog para registrar eventos en </w:t>
+      </w:r>
+      <w:r>
+        <w:rPr>
+          <w:rFonts w:ascii="Calibri" w:cs="Calibri" w:eastAsia="Calibri" w:hAnsi="Calibri"/>
+          <w:b/>
+          <w:bCs/>
+        </w:rPr>
+        <w:t xml:space="preserve">servidores de syslog centralizados</w:t>
+      </w:r>
+      <w:r>
+        <w:rPr>
+          <w:rFonts w:ascii="Calibri" w:cs="Calibri" w:eastAsia="Calibri" w:hAnsi="Calibri"/>
+        </w:rPr>
+        <w:t xml:space="preserve">.</w:t>
+      </w:r>
+    </w:p>
+    <w:p>
+      <w:pPr>
+        <w:spacing w:after="80" w:before="160"/>
+      </w:pPr>
+      <w:r>
+        <w:rPr>
+          <w:rFonts w:ascii="Calibri" w:cs="Calibri" w:eastAsia="Calibri" w:hAnsi="Calibri"/>
+          <w:b/>
+          <w:bCs/>
+        </w:rPr>
+        <w:t xml:space="preserve">Registros del servidor</w:t>
+      </w:r>
+    </w:p>
+    <w:p>
+      <w:pPr>
+        <w:pStyle w:val="ListParagraph"/>
+        <w:numPr>
+          <w:ilvl w:val="0"/>
+          <w:numId w:val="2"/>
+        </w:numPr>
+        <w:spacing w:after="60"/>
+      </w:pPr>
+      <w:r>
+        <w:rPr>
+          <w:rFonts w:ascii="Calibri" w:cs="Calibri" w:eastAsia="Calibri" w:hAnsi="Calibri"/>
+        </w:rPr>
+        <w:t xml:space="preserve">Son una fuente esencial para el monitoreo de la seguridad de la red.</w:t>
+      </w:r>
+    </w:p>
+    <w:p>
+      <w:pPr>
+        <w:pStyle w:val="ListParagraph"/>
+        <w:numPr>
+          <w:ilvl w:val="0"/>
+          <w:numId w:val="2"/>
+        </w:numPr>
+        <w:spacing w:after="60"/>
+      </w:pPr>
+      <w:r>
+        <w:rPr>
+          <w:rFonts w:ascii="Calibri" w:cs="Calibri" w:eastAsia="Calibri" w:hAnsi="Calibri"/>
+        </w:rPr>
+        <w:t xml:space="preserve">Los servidores de aplicaciones, como los de </w:t>
+      </w:r>
+      <w:r>
+        <w:rPr>
+          <w:rFonts w:ascii="Calibri" w:cs="Calibri" w:eastAsia="Calibri" w:hAnsi="Calibri"/>
+          <w:b/>
+          <w:bCs/>
+        </w:rPr>
+        <w:t xml:space="preserve">web y correo</w:t>
+      </w:r>
+      <w:r>
+        <w:rPr>
+          <w:rFonts w:ascii="Calibri" w:cs="Calibri" w:eastAsia="Calibri" w:hAnsi="Calibri"/>
+        </w:rPr>
+        <w:t xml:space="preserve">, tienen archivos de registro de </w:t>
+      </w:r>
+      <w:r>
+        <w:rPr>
+          <w:rFonts w:ascii="Calibri" w:cs="Calibri" w:eastAsia="Calibri" w:hAnsi="Calibri"/>
+          <w:b/>
+          <w:bCs/>
+        </w:rPr>
+        <w:t xml:space="preserve">acceso y de errores</w:t>
+      </w:r>
+      <w:r>
+        <w:rPr>
+          <w:rFonts w:ascii="Calibri" w:cs="Calibri" w:eastAsia="Calibri" w:hAnsi="Calibri"/>
+        </w:rPr>
+        <w:t xml:space="preserve">.</w:t>
+      </w:r>
+    </w:p>
+    <w:p>
+      <w:pPr>
+        <w:pStyle w:val="ListParagraph"/>
+        <w:numPr>
+          <w:ilvl w:val="0"/>
+          <w:numId w:val="2"/>
+        </w:numPr>
+        <w:spacing w:after="60"/>
+      </w:pPr>
+      <w:r>
+        <w:rPr>
+          <w:rFonts w:ascii="Calibri" w:cs="Calibri" w:eastAsia="Calibri" w:hAnsi="Calibri"/>
+        </w:rPr>
+        <w:t xml:space="preserve">El </w:t>
+      </w:r>
+      <w:r>
+        <w:rPr>
+          <w:rFonts w:ascii="Calibri" w:cs="Calibri" w:eastAsia="Calibri" w:hAnsi="Calibri"/>
+          <w:b/>
+          <w:bCs/>
+        </w:rPr>
+        <w:t xml:space="preserve">servidor proxy DNS</w:t>
+      </w:r>
+      <w:r>
+        <w:rPr>
+          <w:rFonts w:ascii="Calibri" w:cs="Calibri" w:eastAsia="Calibri" w:hAnsi="Calibri"/>
+        </w:rPr>
+        <w:t xml:space="preserve"> registra todas las consultas y respuestas de DNS dentro de la red.</w:t>
+      </w:r>
+    </w:p>
+    <w:p>
+      <w:pPr>
+        <w:pStyle w:val="ListParagraph"/>
+        <w:numPr>
+          <w:ilvl w:val="0"/>
+          <w:numId w:val="2"/>
+        </w:numPr>
+        <w:spacing w:after="60"/>
+      </w:pPr>
+      <w:r>
+        <w:rPr>
+          <w:rFonts w:ascii="Calibri" w:cs="Calibri" w:eastAsia="Calibri" w:hAnsi="Calibri"/>
+        </w:rPr>
+        <w:t xml:space="preserve">Esos registros sirven para identificar hosts que pudieron visitar </w:t>
+      </w:r>
+      <w:r>
+        <w:rPr>
+          <w:rFonts w:ascii="Calibri" w:cs="Calibri" w:eastAsia="Calibri" w:hAnsi="Calibri"/>
+          <w:b/>
+          <w:bCs/>
+        </w:rPr>
+        <w:t xml:space="preserve">sitios web peligrosos</w:t>
+      </w:r>
+      <w:r>
+        <w:rPr>
+          <w:rFonts w:ascii="Calibri" w:cs="Calibri" w:eastAsia="Calibri" w:hAnsi="Calibri"/>
+        </w:rPr>
+        <w:t xml:space="preserve"> y para detectar </w:t>
+      </w:r>
+      <w:r>
+        <w:rPr>
+          <w:rFonts w:ascii="Calibri" w:cs="Calibri" w:eastAsia="Calibri" w:hAnsi="Calibri"/>
+          <w:b/>
+          <w:bCs/>
+        </w:rPr>
+        <w:t xml:space="preserve">exfiltración de datos por DNS</w:t>
+      </w:r>
+      <w:r>
+        <w:rPr>
+          <w:rFonts w:ascii="Calibri" w:cs="Calibri" w:eastAsia="Calibri" w:hAnsi="Calibri"/>
+        </w:rPr>
+        <w:t xml:space="preserve"> y conexiones a servidores de </w:t>
+      </w:r>
+      <w:r>
+        <w:rPr>
+          <w:rFonts w:ascii="Calibri" w:cs="Calibri" w:eastAsia="Calibri" w:hAnsi="Calibri"/>
+          <w:b/>
+          <w:bCs/>
+        </w:rPr>
+        <w:t xml:space="preserve">comando y control</w:t>
+      </w:r>
+      <w:r>
+        <w:rPr>
+          <w:rFonts w:ascii="Calibri" w:cs="Calibri" w:eastAsia="Calibri" w:hAnsi="Calibri"/>
+        </w:rPr>
+        <w:t xml:space="preserve"> de malware.</w:t>
+      </w:r>
+    </w:p>
+    <w:p>
+      <w:pPr>
+        <w:spacing w:after="80" w:before="160"/>
+      </w:pPr>
+      <w:r>
+        <w:rPr>
+          <w:rFonts w:ascii="Calibri" w:cs="Calibri" w:eastAsia="Calibri" w:hAnsi="Calibri"/>
+          <w:b/>
+          <w:bCs/>
+        </w:rPr>
+        <w:t xml:space="preserve">SIEM</w:t>
+      </w:r>
+    </w:p>
+    <w:p>
+      <w:pPr>
+        <w:pStyle w:val="ListParagraph"/>
+        <w:numPr>
+          <w:ilvl w:val="0"/>
+          <w:numId w:val="2"/>
+        </w:numPr>
+        <w:spacing w:after="60"/>
+      </w:pPr>
+      <w:r>
+        <w:rPr>
+          <w:rFonts w:ascii="Calibri" w:cs="Calibri" w:eastAsia="Calibri" w:hAnsi="Calibri"/>
+        </w:rPr>
+        <w:t xml:space="preserve">Combina las funciones de </w:t>
+      </w:r>
+      <w:r>
+        <w:rPr>
+          <w:rFonts w:ascii="Calibri" w:cs="Calibri" w:eastAsia="Calibri" w:hAnsi="Calibri"/>
+          <w:b/>
+          <w:bCs/>
+        </w:rPr>
+        <w:t xml:space="preserve">SEM</w:t>
+      </w:r>
+      <w:r>
+        <w:rPr>
+          <w:rFonts w:ascii="Calibri" w:cs="Calibri" w:eastAsia="Calibri" w:hAnsi="Calibri"/>
+        </w:rPr>
+        <w:t xml:space="preserve"> (administración de eventos de seguridad) y </w:t>
+      </w:r>
+      <w:r>
+        <w:rPr>
+          <w:rFonts w:ascii="Calibri" w:cs="Calibri" w:eastAsia="Calibri" w:hAnsi="Calibri"/>
+          <w:b/>
+          <w:bCs/>
+        </w:rPr>
+        <w:t xml:space="preserve">SIM</w:t>
+      </w:r>
+      <w:r>
+        <w:rPr>
+          <w:rFonts w:ascii="Calibri" w:cs="Calibri" w:eastAsia="Calibri" w:hAnsi="Calibri"/>
+        </w:rPr>
+        <w:t xml:space="preserve"> (administración de información de seguridad).</w:t>
+      </w:r>
+    </w:p>
+    <w:p>
+      <w:pPr>
+        <w:pStyle w:val="ListParagraph"/>
+        <w:numPr>
+          <w:ilvl w:val="0"/>
+          <w:numId w:val="2"/>
+        </w:numPr>
+        <w:spacing w:after="60"/>
+      </w:pPr>
+      <w:r>
+        <w:rPr>
+          <w:rFonts w:ascii="Calibri" w:cs="Calibri" w:eastAsia="Calibri" w:hAnsi="Calibri"/>
+        </w:rPr>
+        <w:t xml:space="preserve">Da una perspectiva completa de las redes de la empresa usando:</w:t>
+      </w:r>
+    </w:p>
+    <w:p>
+      <w:pPr>
+        <w:pStyle w:val="ListParagraph"/>
+        <w:numPr>
+          <w:ilvl w:val="1"/>
+          <w:numId w:val="2"/>
+        </w:numPr>
+        <w:spacing w:after="60"/>
+      </w:pPr>
+      <w:r>
+        <w:rPr>
+          <w:rFonts w:ascii="Calibri" w:cs="Calibri" w:eastAsia="Calibri" w:hAnsi="Calibri"/>
+        </w:rPr>
+        <w:t xml:space="preserve">Recolectores de registros</w:t>
+      </w:r>
+    </w:p>
+    <w:p>
+      <w:pPr>
+        <w:pStyle w:val="ListParagraph"/>
+        <w:numPr>
+          <w:ilvl w:val="1"/>
+          <w:numId w:val="2"/>
+        </w:numPr>
+        <w:spacing w:after="60"/>
+      </w:pPr>
+      <w:r>
+        <w:rPr>
+          <w:rFonts w:ascii="Calibri" w:cs="Calibri" w:eastAsia="Calibri" w:hAnsi="Calibri"/>
+        </w:rPr>
+        <w:t xml:space="preserve">Normalización</w:t>
+      </w:r>
+    </w:p>
+    <w:p>
+      <w:pPr>
+        <w:pStyle w:val="ListParagraph"/>
+        <w:numPr>
+          <w:ilvl w:val="1"/>
+          <w:numId w:val="2"/>
+        </w:numPr>
+        <w:spacing w:after="60"/>
+      </w:pPr>
+      <w:r>
+        <w:rPr>
+          <w:rFonts w:ascii="Calibri" w:cs="Calibri" w:eastAsia="Calibri" w:hAnsi="Calibri"/>
+        </w:rPr>
+        <w:t xml:space="preserve">Correlación</w:t>
+      </w:r>
+    </w:p>
+    <w:p>
+      <w:pPr>
+        <w:pStyle w:val="ListParagraph"/>
+        <w:numPr>
+          <w:ilvl w:val="1"/>
+          <w:numId w:val="2"/>
+        </w:numPr>
+        <w:spacing w:after="60"/>
+      </w:pPr>
+      <w:r>
+        <w:rPr>
+          <w:rFonts w:ascii="Calibri" w:cs="Calibri" w:eastAsia="Calibri" w:hAnsi="Calibri"/>
+        </w:rPr>
+        <w:t xml:space="preserve">Agregación</w:t>
+      </w:r>
+    </w:p>
+    <w:p>
+      <w:pPr>
+        <w:pStyle w:val="ListParagraph"/>
+        <w:numPr>
+          <w:ilvl w:val="1"/>
+          <w:numId w:val="2"/>
+        </w:numPr>
+        <w:spacing w:after="60"/>
+      </w:pPr>
+      <w:r>
+        <w:rPr>
+          <w:rFonts w:ascii="Calibri" w:cs="Calibri" w:eastAsia="Calibri" w:hAnsi="Calibri"/>
+        </w:rPr>
+        <w:t xml:space="preserve">Reporte</w:t>
+      </w:r>
+    </w:p>
+    <w:p>
+      <w:pPr>
+        <w:pStyle w:val="ListParagraph"/>
+        <w:numPr>
+          <w:ilvl w:val="1"/>
+          <w:numId w:val="2"/>
+        </w:numPr>
+        <w:spacing w:after="60"/>
+      </w:pPr>
+      <w:r>
+        <w:rPr>
+          <w:rFonts w:ascii="Calibri" w:cs="Calibri" w:eastAsia="Calibri" w:hAnsi="Calibri"/>
+        </w:rPr>
+        <w:t xml:space="preserve">Conformidad</w:t>
+      </w:r>
+    </w:p>
+    <w:p>
+      <w:pPr>
+        <w:spacing w:after="120" w:before="280"/>
+      </w:pPr>
+      <w:r>
+        <w:rPr>
+          <w:rFonts w:ascii="Calibri" w:cs="Calibri" w:eastAsia="Calibri" w:hAnsi="Calibri"/>
+          <w:b/>
+          <w:bCs/>
+        </w:rPr>
+        <w:t xml:space="preserve">3. Registros de redes</w:t>
+      </w:r>
+    </w:p>
+    <w:p>
+      <w:pPr>
+        <w:spacing w:after="80" w:before="160"/>
+      </w:pPr>
+      <w:r>
+        <w:rPr>
+          <w:rFonts w:ascii="Calibri" w:cs="Calibri" w:eastAsia="Calibri" w:hAnsi="Calibri"/>
+          <w:b/>
+          <w:bCs/>
+        </w:rPr>
+        <w:t xml:space="preserve">tcpdump</w:t>
+      </w:r>
+    </w:p>
+    <w:p>
+      <w:pPr>
+        <w:pStyle w:val="ListParagraph"/>
+        <w:numPr>
+          <w:ilvl w:val="0"/>
+          <w:numId w:val="2"/>
+        </w:numPr>
+        <w:spacing w:after="60"/>
+      </w:pPr>
+      <w:r>
+        <w:rPr>
+          <w:rFonts w:ascii="Calibri" w:cs="Calibri" w:eastAsia="Calibri" w:hAnsi="Calibri"/>
+        </w:rPr>
+        <w:t xml:space="preserve">Herramienta de línea de comandos, analizador de paquetes muy popular.</w:t>
+      </w:r>
+    </w:p>
+    <w:p>
+      <w:pPr>
+        <w:pStyle w:val="ListParagraph"/>
+        <w:numPr>
+          <w:ilvl w:val="0"/>
+          <w:numId w:val="2"/>
+        </w:numPr>
+        <w:spacing w:after="60"/>
+      </w:pPr>
+      <w:r>
+        <w:rPr>
+          <w:rFonts w:ascii="Calibri" w:cs="Calibri" w:eastAsia="Calibri" w:hAnsi="Calibri"/>
+        </w:rPr>
+        <w:t xml:space="preserve">Muestra capturas de paquetes </w:t>
+      </w:r>
+      <w:r>
+        <w:rPr>
+          <w:rFonts w:ascii="Calibri" w:cs="Calibri" w:eastAsia="Calibri" w:hAnsi="Calibri"/>
+          <w:b/>
+          <w:bCs/>
+        </w:rPr>
+        <w:t xml:space="preserve">en tiempo real</w:t>
+      </w:r>
+      <w:r>
+        <w:rPr>
+          <w:rFonts w:ascii="Calibri" w:cs="Calibri" w:eastAsia="Calibri" w:hAnsi="Calibri"/>
+        </w:rPr>
+        <w:t xml:space="preserve"> o las </w:t>
+      </w:r>
+      <w:r>
+        <w:rPr>
+          <w:rFonts w:ascii="Calibri" w:cs="Calibri" w:eastAsia="Calibri" w:hAnsi="Calibri"/>
+          <w:b/>
+          <w:bCs/>
+        </w:rPr>
+        <w:t xml:space="preserve">escribe en un archivo</w:t>
+      </w:r>
+      <w:r>
+        <w:rPr>
+          <w:rFonts w:ascii="Calibri" w:cs="Calibri" w:eastAsia="Calibri" w:hAnsi="Calibri"/>
+        </w:rPr>
+        <w:t xml:space="preserve">.</w:t>
+      </w:r>
+    </w:p>
+    <w:p>
+      <w:pPr>
+        <w:pStyle w:val="ListParagraph"/>
+        <w:numPr>
+          <w:ilvl w:val="0"/>
+          <w:numId w:val="2"/>
+        </w:numPr>
+        <w:spacing w:after="60"/>
+      </w:pPr>
+      <w:r>
+        <w:rPr>
+          <w:rFonts w:ascii="Calibri" w:cs="Calibri" w:eastAsia="Calibri" w:hAnsi="Calibri"/>
+        </w:rPr>
+        <w:t xml:space="preserve">Las capturas incluyen protocolos de paquetes detallados y datos de contenido que se pueden ver con </w:t>
+      </w:r>
+      <w:r>
+        <w:rPr>
+          <w:rFonts w:ascii="Calibri" w:cs="Calibri" w:eastAsia="Calibri" w:hAnsi="Calibri"/>
+          <w:b/>
+          <w:bCs/>
+        </w:rPr>
+        <w:t xml:space="preserve">Wireshark</w:t>
+      </w:r>
+      <w:r>
+        <w:rPr>
+          <w:rFonts w:ascii="Calibri" w:cs="Calibri" w:eastAsia="Calibri" w:hAnsi="Calibri"/>
+        </w:rPr>
+        <w:t xml:space="preserve">.</w:t>
+      </w:r>
+    </w:p>
+    <w:p>
+      <w:pPr>
+        <w:spacing w:after="80" w:before="160"/>
+      </w:pPr>
+      <w:r>
+        <w:rPr>
+          <w:rFonts w:ascii="Calibri" w:cs="Calibri" w:eastAsia="Calibri" w:hAnsi="Calibri"/>
+          <w:b/>
+          <w:bCs/>
+        </w:rPr>
+        <w:t xml:space="preserve">NetFlow</w:t>
+      </w:r>
+    </w:p>
+    <w:p>
+      <w:pPr>
+        <w:pStyle w:val="ListParagraph"/>
+        <w:numPr>
+          <w:ilvl w:val="0"/>
+          <w:numId w:val="2"/>
+        </w:numPr>
+        <w:spacing w:after="60"/>
+      </w:pPr>
+      <w:r>
+        <w:rPr>
+          <w:rFonts w:ascii="Calibri" w:cs="Calibri" w:eastAsia="Calibri" w:hAnsi="Calibri"/>
+        </w:rPr>
+        <w:t xml:space="preserve">Da un conjunto importante de servicios para aplicaciones IP:</w:t>
+      </w:r>
+    </w:p>
+    <w:p>
+      <w:pPr>
+        <w:pStyle w:val="ListParagraph"/>
+        <w:numPr>
+          <w:ilvl w:val="1"/>
+          <w:numId w:val="2"/>
+        </w:numPr>
+        <w:spacing w:after="60"/>
+      </w:pPr>
+      <w:r>
+        <w:rPr>
+          <w:rFonts w:ascii="Calibri" w:cs="Calibri" w:eastAsia="Calibri" w:hAnsi="Calibri"/>
+        </w:rPr>
+        <w:t xml:space="preserve">Auditoría de tráfico de red</w:t>
+      </w:r>
+    </w:p>
+    <w:p>
+      <w:pPr>
+        <w:pStyle w:val="ListParagraph"/>
+        <w:numPr>
+          <w:ilvl w:val="1"/>
+          <w:numId w:val="2"/>
+        </w:numPr>
+        <w:spacing w:after="60"/>
+      </w:pPr>
+      <w:r>
+        <w:rPr>
+          <w:rFonts w:ascii="Calibri" w:cs="Calibri" w:eastAsia="Calibri" w:hAnsi="Calibri"/>
+        </w:rPr>
+        <w:t xml:space="preserve">Facturación de redes según el uso</w:t>
+      </w:r>
+    </w:p>
+    <w:p>
+      <w:pPr>
+        <w:pStyle w:val="ListParagraph"/>
+        <w:numPr>
+          <w:ilvl w:val="1"/>
+          <w:numId w:val="2"/>
+        </w:numPr>
+        <w:spacing w:after="60"/>
+      </w:pPr>
+      <w:r>
+        <w:rPr>
+          <w:rFonts w:ascii="Calibri" w:cs="Calibri" w:eastAsia="Calibri" w:hAnsi="Calibri"/>
+        </w:rPr>
+        <w:t xml:space="preserve">Planificación de la red</w:t>
+      </w:r>
+    </w:p>
+    <w:p>
+      <w:pPr>
+        <w:pStyle w:val="ListParagraph"/>
+        <w:numPr>
+          <w:ilvl w:val="1"/>
+          <w:numId w:val="2"/>
+        </w:numPr>
+        <w:spacing w:after="60"/>
+      </w:pPr>
+      <w:r>
+        <w:rPr>
+          <w:rFonts w:ascii="Calibri" w:cs="Calibri" w:eastAsia="Calibri" w:hAnsi="Calibri"/>
+        </w:rPr>
+        <w:t xml:space="preserve">Seguridad</w:t>
+      </w:r>
+    </w:p>
+    <w:p>
+      <w:pPr>
+        <w:pStyle w:val="ListParagraph"/>
+        <w:numPr>
+          <w:ilvl w:val="1"/>
+          <w:numId w:val="2"/>
+        </w:numPr>
+        <w:spacing w:after="60"/>
+      </w:pPr>
+      <w:r>
+        <w:rPr>
+          <w:rFonts w:ascii="Calibri" w:cs="Calibri" w:eastAsia="Calibri" w:hAnsi="Calibri"/>
+        </w:rPr>
+        <w:t xml:space="preserve">Funcionalidades de monitoreo de denegación de servicio y monitoreo de la red</w:t>
+      </w:r>
+    </w:p>
+    <w:p>
+      <w:pPr>
+        <w:pStyle w:val="ListParagraph"/>
+        <w:numPr>
+          <w:ilvl w:val="0"/>
+          <w:numId w:val="2"/>
+        </w:numPr>
+        <w:spacing w:after="60"/>
+      </w:pPr>
+      <w:r>
+        <w:rPr>
+          <w:rFonts w:ascii="Calibri" w:cs="Calibri" w:eastAsia="Calibri" w:hAnsi="Calibri"/>
+        </w:rPr>
+        <w:t xml:space="preserve">Brinda información sobre </w:t>
+      </w:r>
+      <w:r>
+        <w:rPr>
+          <w:rFonts w:ascii="Calibri" w:cs="Calibri" w:eastAsia="Calibri" w:hAnsi="Calibri"/>
+          <w:b/>
+          <w:bCs/>
+        </w:rPr>
+        <w:t xml:space="preserve">usuarios y aplicaciones</w:t>
+      </w:r>
+      <w:r>
+        <w:rPr>
+          <w:rFonts w:ascii="Calibri" w:cs="Calibri" w:eastAsia="Calibri" w:hAnsi="Calibri"/>
+        </w:rPr>
+        <w:t xml:space="preserve"> de la red, </w:t>
+      </w:r>
+      <w:r>
+        <w:rPr>
+          <w:rFonts w:ascii="Calibri" w:cs="Calibri" w:eastAsia="Calibri" w:hAnsi="Calibri"/>
+          <w:b/>
+          <w:bCs/>
+        </w:rPr>
+        <w:t xml:space="preserve">horarios pico</w:t>
+      </w:r>
+      <w:r>
+        <w:rPr>
+          <w:rFonts w:ascii="Calibri" w:cs="Calibri" w:eastAsia="Calibri" w:hAnsi="Calibri"/>
+        </w:rPr>
+        <w:t xml:space="preserve"> de uso y </w:t>
+      </w:r>
+      <w:r>
+        <w:rPr>
+          <w:rFonts w:ascii="Calibri" w:cs="Calibri" w:eastAsia="Calibri" w:hAnsi="Calibri"/>
+          <w:b/>
+          <w:bCs/>
+        </w:rPr>
+        <w:t xml:space="preserve">routing de tráfico</w:t>
+      </w:r>
+      <w:r>
+        <w:rPr>
+          <w:rFonts w:ascii="Calibri" w:cs="Calibri" w:eastAsia="Calibri" w:hAnsi="Calibri"/>
+        </w:rPr>
+        <w:t xml:space="preserve">.</w:t>
+      </w:r>
+    </w:p>
+    <w:p>
+      <w:pPr>
+        <w:spacing w:after="80" w:before="160"/>
+      </w:pPr>
+      <w:r>
+        <w:rPr>
+          <w:rFonts w:ascii="Calibri" w:cs="Calibri" w:eastAsia="Calibri" w:hAnsi="Calibri"/>
+          <w:b/>
+          <w:bCs/>
+        </w:rPr>
+        <w:t xml:space="preserve">Control y visibilidad de aplicaciones de Cisco (NBAR2)</w:t>
+      </w:r>
+    </w:p>
+    <w:p>
+      <w:pPr>
+        <w:pStyle w:val="ListParagraph"/>
+        <w:numPr>
+          <w:ilvl w:val="0"/>
+          <w:numId w:val="2"/>
+        </w:numPr>
+        <w:spacing w:after="60"/>
+      </w:pPr>
+      <w:r>
+        <w:rPr>
+          <w:rFonts w:ascii="Calibri" w:cs="Calibri" w:eastAsia="Calibri" w:hAnsi="Calibri"/>
+        </w:rPr>
+        <w:t xml:space="preserve">Usa el </w:t>
+      </w:r>
+      <w:r>
+        <w:rPr>
+          <w:rFonts w:ascii="Calibri" w:cs="Calibri" w:eastAsia="Calibri" w:hAnsi="Calibri"/>
+          <w:b/>
+          <w:bCs/>
+        </w:rPr>
+        <w:t xml:space="preserve">reconocimiento versión 2 basado en la red (NBAR2)</w:t>
+      </w:r>
+      <w:r>
+        <w:rPr>
+          <w:rFonts w:ascii="Calibri" w:cs="Calibri" w:eastAsia="Calibri" w:hAnsi="Calibri"/>
+        </w:rPr>
+        <w:t xml:space="preserve">, también llamado </w:t>
+      </w:r>
+      <w:r>
+        <w:rPr>
+          <w:rFonts w:ascii="Calibri" w:cs="Calibri" w:eastAsia="Calibri" w:hAnsi="Calibri"/>
+          <w:b/>
+          <w:bCs/>
+        </w:rPr>
+        <w:t xml:space="preserve">Next-Generation NBAR</w:t>
+      </w:r>
+      <w:r>
+        <w:rPr>
+          <w:rFonts w:ascii="Calibri" w:cs="Calibri" w:eastAsia="Calibri" w:hAnsi="Calibri"/>
+        </w:rPr>
+        <w:t xml:space="preserve">, para </w:t>
+      </w:r>
+      <w:r>
+        <w:rPr>
+          <w:rFonts w:ascii="Calibri" w:cs="Calibri" w:eastAsia="Calibri" w:hAnsi="Calibri"/>
+          <w:b/>
+          <w:bCs/>
+        </w:rPr>
+        <w:t xml:space="preserve">descubrir y clasificar</w:t>
+      </w:r>
+      <w:r>
+        <w:rPr>
+          <w:rFonts w:ascii="Calibri" w:cs="Calibri" w:eastAsia="Calibri" w:hAnsi="Calibri"/>
+        </w:rPr>
+        <w:t xml:space="preserve"> las aplicaciones en uso en la red.</w:t>
+      </w:r>
+    </w:p>
+    <w:p>
+      <w:pPr>
+        <w:pStyle w:val="ListParagraph"/>
+        <w:numPr>
+          <w:ilvl w:val="0"/>
+          <w:numId w:val="2"/>
+        </w:numPr>
+        <w:spacing w:after="60"/>
+      </w:pPr>
+      <w:r>
+        <w:rPr>
+          <w:rFonts w:ascii="Calibri" w:cs="Calibri" w:eastAsia="Calibri" w:hAnsi="Calibri"/>
+        </w:rPr>
+        <w:t xml:space="preserve">El motor de reconocimiento NBAR2 admite </w:t>
+      </w:r>
+      <w:r>
+        <w:rPr>
+          <w:rFonts w:ascii="Calibri" w:cs="Calibri" w:eastAsia="Calibri" w:hAnsi="Calibri"/>
+          <w:b/>
+          <w:bCs/>
+        </w:rPr>
+        <w:t xml:space="preserve">más de 1000 aplicaciones</w:t>
+      </w:r>
+      <w:r>
+        <w:rPr>
+          <w:rFonts w:ascii="Calibri" w:cs="Calibri" w:eastAsia="Calibri" w:hAnsi="Calibri"/>
+        </w:rPr>
+        <w:t xml:space="preserve"> de red.</w:t>
+      </w:r>
+    </w:p>
+    <w:p>
+      <w:pPr>
+        <w:spacing w:after="80" w:before="160"/>
+      </w:pPr>
+      <w:r>
+        <w:rPr>
+          <w:rFonts w:ascii="Calibri" w:cs="Calibri" w:eastAsia="Calibri" w:hAnsi="Calibri"/>
+          <w:b/>
+          <w:bCs/>
+        </w:rPr>
+        <w:t xml:space="preserve">Cisco ESA y WSA</w:t>
+      </w:r>
+    </w:p>
+    <w:p>
+      <w:pPr>
+        <w:pStyle w:val="ListParagraph"/>
+        <w:numPr>
+          <w:ilvl w:val="0"/>
+          <w:numId w:val="2"/>
+        </w:numPr>
+        <w:spacing w:after="60"/>
+      </w:pPr>
+      <w:r>
+        <w:rPr>
+          <w:rFonts w:ascii="Calibri" w:cs="Calibri" w:eastAsia="Calibri" w:hAnsi="Calibri"/>
+          <w:b/>
+          <w:bCs/>
+        </w:rPr>
+        <w:t xml:space="preserve">Cisco Email Security Appliance (ESA)</w:t>
+      </w:r>
+      <w:r>
+        <w:rPr>
+          <w:rFonts w:ascii="Calibri" w:cs="Calibri" w:eastAsia="Calibri" w:hAnsi="Calibri"/>
+        </w:rPr>
+        <w:t xml:space="preserve"> y </w:t>
+      </w:r>
+      <w:r>
+        <w:rPr>
+          <w:rFonts w:ascii="Calibri" w:cs="Calibri" w:eastAsia="Calibri" w:hAnsi="Calibri"/>
+          <w:b/>
+          <w:bCs/>
+        </w:rPr>
+        <w:t xml:space="preserve">Cisco Web Security Appliance (WSA)</w:t>
+      </w:r>
+      <w:r>
+        <w:rPr>
+          <w:rFonts w:ascii="Calibri" w:cs="Calibri" w:eastAsia="Calibri" w:hAnsi="Calibri"/>
+        </w:rPr>
+        <w:t xml:space="preserve"> ofrecen muchas funcionalidades de monitoreo de seguridad con </w:t>
+      </w:r>
+      <w:r>
+        <w:rPr>
+          <w:rFonts w:ascii="Calibri" w:cs="Calibri" w:eastAsia="Calibri" w:hAnsi="Calibri"/>
+          <w:b/>
+          <w:bCs/>
+        </w:rPr>
+        <w:t xml:space="preserve">filtro de contenido</w:t>
+      </w:r>
+      <w:r>
+        <w:rPr>
+          <w:rFonts w:ascii="Calibri" w:cs="Calibri" w:eastAsia="Calibri" w:hAnsi="Calibri"/>
+        </w:rPr>
+        <w:t xml:space="preserve">.</w:t>
+      </w:r>
+    </w:p>
+    <w:p>
+      <w:pPr>
+        <w:pStyle w:val="ListParagraph"/>
+        <w:numPr>
+          <w:ilvl w:val="0"/>
+          <w:numId w:val="2"/>
+        </w:numPr>
+        <w:spacing w:after="60"/>
+      </w:pPr>
+      <w:r>
+        <w:rPr>
+          <w:rFonts w:ascii="Calibri" w:cs="Calibri" w:eastAsia="Calibri" w:hAnsi="Calibri"/>
+        </w:rPr>
+        <w:t xml:space="preserve">Se pueden generar archivos de registro para muchas de esas funcionalidades.</w:t>
+      </w:r>
+    </w:p>
+    <w:p>
+      <w:pPr>
+        <w:spacing w:after="80" w:before="160"/>
+      </w:pPr>
+      <w:r>
+        <w:rPr>
+          <w:rFonts w:ascii="Calibri" w:cs="Calibri" w:eastAsia="Calibri" w:hAnsi="Calibri"/>
+          <w:b/>
+          <w:bCs/>
+        </w:rPr>
+        <w:t xml:space="preserve">Servidores proxy</w:t>
+      </w:r>
+    </w:p>
+    <w:p>
+      <w:pPr>
+        <w:pStyle w:val="ListParagraph"/>
+        <w:numPr>
+          <w:ilvl w:val="0"/>
+          <w:numId w:val="2"/>
+        </w:numPr>
+        <w:spacing w:after="60"/>
+      </w:pPr>
+      <w:r>
+        <w:rPr>
+          <w:rFonts w:ascii="Calibri" w:cs="Calibri" w:eastAsia="Calibri" w:hAnsi="Calibri"/>
+        </w:rPr>
+        <w:t xml:space="preserve">Son </w:t>
+      </w:r>
+      <w:r>
+        <w:rPr>
+          <w:rFonts w:ascii="Calibri" w:cs="Calibri" w:eastAsia="Calibri" w:hAnsi="Calibri"/>
+          <w:b/>
+          <w:bCs/>
+        </w:rPr>
+        <w:t xml:space="preserve">intermediarios</w:t>
+      </w:r>
+      <w:r>
+        <w:rPr>
+          <w:rFonts w:ascii="Calibri" w:cs="Calibri" w:eastAsia="Calibri" w:hAnsi="Calibri"/>
+        </w:rPr>
+        <w:t xml:space="preserve"> de los clientes de la red.</w:t>
+      </w:r>
+    </w:p>
+    <w:p>
+      <w:pPr>
+        <w:pStyle w:val="ListParagraph"/>
+        <w:numPr>
+          <w:ilvl w:val="0"/>
+          <w:numId w:val="2"/>
+        </w:numPr>
+        <w:spacing w:after="60"/>
+      </w:pPr>
+      <w:r>
+        <w:rPr>
+          <w:rFonts w:ascii="Calibri" w:cs="Calibri" w:eastAsia="Calibri" w:hAnsi="Calibri"/>
+        </w:rPr>
+        <w:t xml:space="preserve">Una empresa puede configurar un proxy web para manejar las solicitudes web </w:t>
+      </w:r>
+      <w:r>
+        <w:rPr>
+          <w:rFonts w:ascii="Calibri" w:cs="Calibri" w:eastAsia="Calibri" w:hAnsi="Calibri"/>
+          <w:b/>
+          <w:bCs/>
+        </w:rPr>
+        <w:t xml:space="preserve">en nombre de los clientes</w:t>
+      </w:r>
+      <w:r>
+        <w:rPr>
+          <w:rFonts w:ascii="Calibri" w:cs="Calibri" w:eastAsia="Calibri" w:hAnsi="Calibri"/>
+        </w:rPr>
+        <w:t xml:space="preserve">.</w:t>
+      </w:r>
+    </w:p>
+    <w:p>
+      <w:pPr>
+        <w:pStyle w:val="ListParagraph"/>
+        <w:numPr>
+          <w:ilvl w:val="0"/>
+          <w:numId w:val="2"/>
+        </w:numPr>
+        <w:spacing w:after="60"/>
+      </w:pPr>
+      <w:r>
+        <w:rPr>
+          <w:rFonts w:ascii="Calibri" w:cs="Calibri" w:eastAsia="Calibri" w:hAnsi="Calibri"/>
+        </w:rPr>
+        <w:t xml:space="preserve">La solicitud va primero al </w:t>
+      </w:r>
+      <w:r>
+        <w:rPr>
+          <w:rFonts w:ascii="Calibri" w:cs="Calibri" w:eastAsia="Calibri" w:hAnsi="Calibri"/>
+          <w:b/>
+          <w:bCs/>
+        </w:rPr>
+        <w:t xml:space="preserve">servidor proxy</w:t>
+      </w:r>
+      <w:r>
+        <w:rPr>
+          <w:rFonts w:ascii="Calibri" w:cs="Calibri" w:eastAsia="Calibri" w:hAnsi="Calibri"/>
+        </w:rPr>
+        <w:t xml:space="preserve">, que pide los recursos y los devuelve al cliente.</w:t>
+      </w:r>
+    </w:p>
+    <w:p>
+      <w:pPr>
+        <w:pStyle w:val="ListParagraph"/>
+        <w:numPr>
+          <w:ilvl w:val="0"/>
+          <w:numId w:val="2"/>
+        </w:numPr>
+        <w:spacing w:after="60"/>
+      </w:pPr>
+      <w:r>
+        <w:rPr>
+          <w:rFonts w:ascii="Calibri" w:cs="Calibri" w:eastAsia="Calibri" w:hAnsi="Calibri"/>
+        </w:rPr>
+        <w:t xml:space="preserve">El proxy genera registros de todas las peticiones y respuestas. Se analizan para saber </w:t>
+      </w:r>
+      <w:r>
+        <w:rPr>
+          <w:rFonts w:ascii="Calibri" w:cs="Calibri" w:eastAsia="Calibri" w:hAnsi="Calibri"/>
+          <w:b/>
+          <w:bCs/>
+        </w:rPr>
+        <w:t xml:space="preserve">qué hosts hacen las solicitudes</w:t>
+      </w:r>
+      <w:r>
+        <w:rPr>
+          <w:rFonts w:ascii="Calibri" w:cs="Calibri" w:eastAsia="Calibri" w:hAnsi="Calibri"/>
+        </w:rPr>
+        <w:t xml:space="preserve">, si los destinos son </w:t>
+      </w:r>
+      <w:r>
+        <w:rPr>
+          <w:rFonts w:ascii="Calibri" w:cs="Calibri" w:eastAsia="Calibri" w:hAnsi="Calibri"/>
+          <w:b/>
+          <w:bCs/>
+        </w:rPr>
+        <w:t xml:space="preserve">seguros o maliciosos</w:t>
+      </w:r>
+      <w:r>
+        <w:rPr>
+          <w:rFonts w:ascii="Calibri" w:cs="Calibri" w:eastAsia="Calibri" w:hAnsi="Calibri"/>
+        </w:rPr>
+        <w:t xml:space="preserve"> y qué tipos de recursos se descargan.</w:t>
+      </w:r>
+    </w:p>
+    <w:p>
+      <w:pPr>
+        <w:spacing w:after="80" w:before="160"/>
+      </w:pPr>
+      <w:r>
+        <w:rPr>
+          <w:rFonts w:ascii="Calibri" w:cs="Calibri" w:eastAsia="Calibri" w:hAnsi="Calibri"/>
+          <w:b/>
+          <w:bCs/>
+        </w:rPr>
+        <w:t xml:space="preserve">Firewall NextGen</w:t>
+      </w:r>
+    </w:p>
+    <w:p>
+      <w:pPr>
+        <w:pStyle w:val="ListParagraph"/>
+        <w:numPr>
+          <w:ilvl w:val="0"/>
+          <w:numId w:val="2"/>
+        </w:numPr>
+        <w:spacing w:after="60"/>
+      </w:pPr>
+      <w:r>
+        <w:rPr>
+          <w:rFonts w:ascii="Calibri" w:cs="Calibri" w:eastAsia="Calibri" w:hAnsi="Calibri"/>
+        </w:rPr>
+        <w:t xml:space="preserve">Extiende la seguridad más allá de las </w:t>
+      </w:r>
+      <w:r>
+        <w:rPr>
+          <w:rFonts w:ascii="Calibri" w:cs="Calibri" w:eastAsia="Calibri" w:hAnsi="Calibri"/>
+          <w:b/>
+          <w:bCs/>
+        </w:rPr>
+        <w:t xml:space="preserve">direcciones IP y puertos de capa 4</w:t>
+      </w:r>
+      <w:r>
+        <w:rPr>
+          <w:rFonts w:ascii="Calibri" w:cs="Calibri" w:eastAsia="Calibri" w:hAnsi="Calibri"/>
+        </w:rPr>
+        <w:t xml:space="preserve">, hasta la </w:t>
+      </w:r>
+      <w:r>
+        <w:rPr>
+          <w:rFonts w:ascii="Calibri" w:cs="Calibri" w:eastAsia="Calibri" w:hAnsi="Calibri"/>
+          <w:b/>
+          <w:bCs/>
+        </w:rPr>
+        <w:t xml:space="preserve">capa de aplicación</w:t>
+      </w:r>
+      <w:r>
+        <w:rPr>
+          <w:rFonts w:ascii="Calibri" w:cs="Calibri" w:eastAsia="Calibri" w:hAnsi="Calibri"/>
+        </w:rPr>
+        <w:t xml:space="preserve"> y más allá.</w:t>
+      </w:r>
+    </w:p>
+    <w:p>
+      <w:pPr>
+        <w:pStyle w:val="ListParagraph"/>
+        <w:numPr>
+          <w:ilvl w:val="0"/>
+          <w:numId w:val="2"/>
+        </w:numPr>
+        <w:spacing w:after="60"/>
+      </w:pPr>
+      <w:r>
+        <w:rPr>
+          <w:rFonts w:ascii="Calibri" w:cs="Calibri" w:eastAsia="Calibri" w:hAnsi="Calibri"/>
+        </w:rPr>
+        <w:t xml:space="preserve">Son dispositivos avanzados con mucha más funcionalidad que las generaciones anteriores.</w:t>
+      </w:r>
+    </w:p>
+    <w:p>
+      <w:pPr>
+        <w:pStyle w:val="ListParagraph"/>
+        <w:numPr>
+          <w:ilvl w:val="0"/>
+          <w:numId w:val="2"/>
+        </w:numPr>
+        <w:spacing w:after="60"/>
+      </w:pPr>
+      <w:r>
+        <w:rPr>
+          <w:rFonts w:ascii="Calibri" w:cs="Calibri" w:eastAsia="Calibri" w:hAnsi="Calibri"/>
+        </w:rPr>
+        <w:t xml:space="preserve">Tienen </w:t>
+      </w:r>
+      <w:r>
+        <w:rPr>
+          <w:rFonts w:ascii="Calibri" w:cs="Calibri" w:eastAsia="Calibri" w:hAnsi="Calibri"/>
+          <w:b/>
+          <w:bCs/>
+        </w:rPr>
+        <w:t xml:space="preserve">tableros de reporte</w:t>
+      </w:r>
+      <w:r>
+        <w:rPr>
+          <w:rFonts w:ascii="Calibri" w:cs="Calibri" w:eastAsia="Calibri" w:hAnsi="Calibri"/>
+        </w:rPr>
+        <w:t xml:space="preserve"> con funciones interactivas que permiten reportes rápidos, en un clic, sobre información muy específica </w:t>
+      </w:r>
+      <w:r>
+        <w:rPr>
+          <w:rFonts w:ascii="Calibri" w:cs="Calibri" w:eastAsia="Calibri" w:hAnsi="Calibri"/>
+          <w:b/>
+          <w:bCs/>
+        </w:rPr>
+        <w:t xml:space="preserve">sin necesidad de SIEM</w:t>
+      </w:r>
+      <w:r>
+        <w:rPr>
+          <w:rFonts w:ascii="Calibri" w:cs="Calibri" w:eastAsia="Calibri" w:hAnsi="Calibri"/>
+        </w:rPr>
+        <w:t xml:space="preserve"> ni otros eventos de correlación.</w:t>
       </w:r>
     </w:p>
     <w:sectPr>

</xml_diff>

<commit_message>
Agrega Módulo 21: Evaluar alertas al resumen de módulos 19 en adelante
Co-Authored-By: Claude Sonnet 5.5 <noreply@anthropic.com>
Claude-Session: https://claude.ai/code/session_013iWwbBbHxw2c1QtKDe5PjZ
</commit_message>
<xml_diff>
--- a/Modulos_19_en_adelante_Resumen.docx
+++ b/Modulos_19_en_adelante_Resumen.docx
@@ -4437,6 +4437,2349 @@
         </w:rPr>
         <w:t xml:space="preserve"> ni otros eventos de correlación.</w:t>
       </w:r>
+    </w:p>
+    <w:p>
+      <w:r>
+        <w:br w:type="page"/>
+      </w:r>
+    </w:p>
+    <w:p>
+      <w:pPr>
+        <w:spacing w:after="60"/>
+        <w:jc w:val="center"/>
+      </w:pPr>
+      <w:r>
+        <w:rPr>
+          <w:rFonts w:ascii="Calibri" w:cs="Calibri" w:eastAsia="Calibri" w:hAnsi="Calibri"/>
+          <w:b/>
+          <w:bCs/>
+          <w:color w:val="000000"/>
+          <w:sz w:val="24"/>
+          <w:szCs w:val="24"/>
+        </w:rPr>
+        <w:t xml:space="preserve">Módulo 21: Evaluar alertas</w:t>
+      </w:r>
+    </w:p>
+    <w:p>
+      <w:pPr>
+        <w:spacing w:after="200"/>
+        <w:jc w:val="center"/>
+      </w:pPr>
+      <w:r>
+        <w:rPr>
+          <w:rFonts w:ascii="Calibri" w:cs="Calibri" w:eastAsia="Calibri" w:hAnsi="Calibri"/>
+          <w:color w:val="000000"/>
+          <w:sz w:val="24"/>
+          <w:szCs w:val="24"/>
+        </w:rPr>
+        <w:t xml:space="preserve">Resumen de ciberseguridad</w:t>
+      </w:r>
+    </w:p>
+    <w:p>
+      <w:pPr>
+        <w:spacing w:after="120" w:before="280"/>
+      </w:pPr>
+      <w:r>
+        <w:rPr>
+          <w:rFonts w:ascii="Calibri" w:cs="Calibri" w:eastAsia="Calibri" w:hAnsi="Calibri"/>
+          <w:b/>
+          <w:bCs/>
+        </w:rPr>
+        <w:t xml:space="preserve">1. Fuentes de las alertas</w:t>
+      </w:r>
+    </w:p>
+    <w:p>
+      <w:pPr>
+        <w:spacing w:after="80" w:before="160"/>
+      </w:pPr>
+      <w:r>
+        <w:rPr>
+          <w:rFonts w:ascii="Calibri" w:cs="Calibri" w:eastAsia="Calibri" w:hAnsi="Calibri"/>
+          <w:b/>
+          <w:bCs/>
+        </w:rPr>
+        <w:t xml:space="preserve">Cebolla de seguridad (Security Onion)</w:t>
+      </w:r>
+    </w:p>
+    <w:p>
+      <w:pPr>
+        <w:pStyle w:val="ListParagraph"/>
+        <w:numPr>
+          <w:ilvl w:val="0"/>
+          <w:numId w:val="2"/>
+        </w:numPr>
+        <w:spacing w:after="60"/>
+      </w:pPr>
+      <w:r>
+        <w:rPr>
+          <w:rFonts w:ascii="Calibri" w:cs="Calibri" w:eastAsia="Calibri" w:hAnsi="Calibri"/>
+        </w:rPr>
+        <w:t xml:space="preserve">Es una suite de </w:t>
+      </w:r>
+      <w:r>
+        <w:rPr>
+          <w:rFonts w:ascii="Calibri" w:cs="Calibri" w:eastAsia="Calibri" w:hAnsi="Calibri"/>
+          <w:b/>
+          <w:bCs/>
+        </w:rPr>
+        <w:t xml:space="preserve">código abierto</w:t>
+      </w:r>
+      <w:r>
+        <w:rPr>
+          <w:rFonts w:ascii="Calibri" w:cs="Calibri" w:eastAsia="Calibri" w:hAnsi="Calibri"/>
+        </w:rPr>
+        <w:t xml:space="preserve"> de herramientas de </w:t>
+      </w:r>
+      <w:r>
+        <w:rPr>
+          <w:rFonts w:ascii="Calibri" w:cs="Calibri" w:eastAsia="Calibri" w:hAnsi="Calibri"/>
+          <w:b/>
+          <w:bCs/>
+        </w:rPr>
+        <w:t xml:space="preserve">Monitoreo de la seguridad de la red (NSM)</w:t>
+      </w:r>
+      <w:r>
+        <w:rPr>
+          <w:rFonts w:ascii="Calibri" w:cs="Calibri" w:eastAsia="Calibri" w:hAnsi="Calibri"/>
+        </w:rPr>
+        <w:t xml:space="preserve"> que corre en una distribución </w:t>
+      </w:r>
+      <w:r>
+        <w:rPr>
+          <w:rFonts w:ascii="Calibri" w:cs="Calibri" w:eastAsia="Calibri" w:hAnsi="Calibri"/>
+          <w:b/>
+          <w:bCs/>
+        </w:rPr>
+        <w:t xml:space="preserve">Ubuntu de Linux</w:t>
+      </w:r>
+      <w:r>
+        <w:rPr>
+          <w:rFonts w:ascii="Calibri" w:cs="Calibri" w:eastAsia="Calibri" w:hAnsi="Calibri"/>
+        </w:rPr>
+        <w:t xml:space="preserve">.</w:t>
+      </w:r>
+    </w:p>
+    <w:p>
+      <w:pPr>
+        <w:pStyle w:val="ListParagraph"/>
+        <w:numPr>
+          <w:ilvl w:val="0"/>
+          <w:numId w:val="2"/>
+        </w:numPr>
+        <w:spacing w:after="60"/>
+      </w:pPr>
+      <w:r>
+        <w:rPr>
+          <w:rFonts w:ascii="Calibri" w:cs="Calibri" w:eastAsia="Calibri" w:hAnsi="Calibri"/>
+        </w:rPr>
+        <w:t xml:space="preserve">Sus herramientas dan </w:t>
+      </w:r>
+      <w:r>
+        <w:rPr>
+          <w:rFonts w:ascii="Calibri" w:cs="Calibri" w:eastAsia="Calibri" w:hAnsi="Calibri"/>
+          <w:b/>
+          <w:bCs/>
+        </w:rPr>
+        <w:t xml:space="preserve">3 funciones principales</w:t>
+      </w:r>
+      <w:r>
+        <w:rPr>
+          <w:rFonts w:ascii="Calibri" w:cs="Calibri" w:eastAsia="Calibri" w:hAnsi="Calibri"/>
+        </w:rPr>
+        <w:t xml:space="preserve"> para el análisis de ciberseguridad:</w:t>
+      </w:r>
+    </w:p>
+    <w:p>
+      <w:pPr>
+        <w:pStyle w:val="ListParagraph"/>
+        <w:numPr>
+          <w:ilvl w:val="1"/>
+          <w:numId w:val="2"/>
+        </w:numPr>
+        <w:spacing w:after="60"/>
+      </w:pPr>
+      <w:r>
+        <w:rPr>
+          <w:rFonts w:ascii="Calibri" w:cs="Calibri" w:eastAsia="Calibri" w:hAnsi="Calibri"/>
+        </w:rPr>
+        <w:t xml:space="preserve">Captura completa de paquetes y tipos de datos</w:t>
+      </w:r>
+    </w:p>
+    <w:p>
+      <w:pPr>
+        <w:pStyle w:val="ListParagraph"/>
+        <w:numPr>
+          <w:ilvl w:val="1"/>
+          <w:numId w:val="2"/>
+        </w:numPr>
+        <w:spacing w:after="60"/>
+      </w:pPr>
+      <w:r>
+        <w:rPr>
+          <w:rFonts w:ascii="Calibri" w:cs="Calibri" w:eastAsia="Calibri" w:hAnsi="Calibri"/>
+        </w:rPr>
+        <w:t xml:space="preserve">Sistemas de detección de intrusión basados en el host y en la red</w:t>
+      </w:r>
+    </w:p>
+    <w:p>
+      <w:pPr>
+        <w:pStyle w:val="ListParagraph"/>
+        <w:numPr>
+          <w:ilvl w:val="1"/>
+          <w:numId w:val="2"/>
+        </w:numPr>
+        <w:spacing w:after="60"/>
+      </w:pPr>
+      <w:r>
+        <w:rPr>
+          <w:rFonts w:ascii="Calibri" w:cs="Calibri" w:eastAsia="Calibri" w:hAnsi="Calibri"/>
+        </w:rPr>
+        <w:t xml:space="preserve">Herramientas de análisis de alertas</w:t>
+      </w:r>
+    </w:p>
+    <w:p>
+      <w:pPr>
+        <w:pStyle w:val="ListParagraph"/>
+        <w:numPr>
+          <w:ilvl w:val="0"/>
+          <w:numId w:val="2"/>
+        </w:numPr>
+        <w:spacing w:after="60"/>
+      </w:pPr>
+      <w:r>
+        <w:rPr>
+          <w:rFonts w:ascii="Calibri" w:cs="Calibri" w:eastAsia="Calibri" w:hAnsi="Calibri"/>
+        </w:rPr>
+        <w:t xml:space="preserve">Algunos componentes son propiedad de corporaciones que los mantienen (como </w:t>
+      </w:r>
+      <w:r>
+        <w:rPr>
+          <w:rFonts w:ascii="Calibri" w:cs="Calibri" w:eastAsia="Calibri" w:hAnsi="Calibri"/>
+          <w:b/>
+          <w:bCs/>
+        </w:rPr>
+        <w:t xml:space="preserve">Cisco</w:t>
+      </w:r>
+      <w:r>
+        <w:rPr>
+          <w:rFonts w:ascii="Calibri" w:cs="Calibri" w:eastAsia="Calibri" w:hAnsi="Calibri"/>
+        </w:rPr>
+        <w:t xml:space="preserve"> y </w:t>
+      </w:r>
+      <w:r>
+        <w:rPr>
+          <w:rFonts w:ascii="Calibri" w:cs="Calibri" w:eastAsia="Calibri" w:hAnsi="Calibri"/>
+          <w:b/>
+          <w:bCs/>
+        </w:rPr>
+        <w:t xml:space="preserve">Riverbed Technologies</w:t>
+      </w:r>
+      <w:r>
+        <w:rPr>
+          <w:rFonts w:ascii="Calibri" w:cs="Calibri" w:eastAsia="Calibri" w:hAnsi="Calibri"/>
+        </w:rPr>
+        <w:t xml:space="preserve">), pero está disponible como plataforma de código abierto.</w:t>
+      </w:r>
+    </w:p>
+    <w:p>
+      <w:pPr>
+        <w:pStyle w:val="ListParagraph"/>
+        <w:numPr>
+          <w:ilvl w:val="0"/>
+          <w:numId w:val="2"/>
+        </w:numPr>
+        <w:spacing w:after="60"/>
+      </w:pPr>
+      <w:r>
+        <w:rPr>
+          <w:rFonts w:ascii="Calibri" w:cs="Calibri" w:eastAsia="Calibri" w:hAnsi="Calibri"/>
+        </w:rPr>
+        <w:t xml:space="preserve">Es un </w:t>
+      </w:r>
+      <w:r>
+        <w:rPr>
+          <w:rFonts w:ascii="Calibri" w:cs="Calibri" w:eastAsia="Calibri" w:hAnsi="Calibri"/>
+          <w:b/>
+          <w:bCs/>
+        </w:rPr>
+        <w:t xml:space="preserve">entorno integrado</w:t>
+      </w:r>
+      <w:r>
+        <w:rPr>
+          <w:rFonts w:ascii="Calibri" w:cs="Calibri" w:eastAsia="Calibri" w:hAnsi="Calibri"/>
+        </w:rPr>
+        <w:t xml:space="preserve"> para simplificar la implementación de una solución completa de NSM. Junta distintos tipos de datos y registros del IDS en una sola plataforma.</w:t>
+      </w:r>
+    </w:p>
+    <w:p>
+      <w:pPr>
+        <w:spacing w:after="80" w:before="160"/>
+      </w:pPr>
+      <w:r>
+        <w:rPr>
+          <w:rFonts w:ascii="Calibri" w:cs="Calibri" w:eastAsia="Calibri" w:hAnsi="Calibri"/>
+          <w:b/>
+          <w:bCs/>
+        </w:rPr>
+        <w:t xml:space="preserve">Herramientas de Cebolla de seguridad</w:t>
+      </w:r>
+    </w:p>
+    <w:tbl>
+      <w:tblPr>
+        <w:tblW w:type="dxa" w:w="9360"/>
+        <w:tblBorders>
+          <w:top w:val="single" w:color="auto" w:sz="4"/>
+          <w:left w:val="single" w:color="auto" w:sz="4"/>
+          <w:bottom w:val="single" w:color="auto" w:sz="4"/>
+          <w:right w:val="single" w:color="auto" w:sz="4"/>
+          <w:insideH w:val="single" w:color="auto" w:sz="4"/>
+          <w:insideV w:val="single" w:color="auto" w:sz="4"/>
+        </w:tblBorders>
+      </w:tblPr>
+      <w:tblGrid>
+        <w:gridCol w:w="2200"/>
+        <w:gridCol w:w="7160"/>
+      </w:tblGrid>
+      <w:tr>
+        <w:trPr>
+          <w:tblHeader/>
+        </w:trPr>
+        <w:tc>
+          <w:tcPr>
+            <w:tcW w:type="dxa" w:w="2200"/>
+            <w:tcBorders>
+              <w:top w:val="single" w:color="000000" w:sz="4"/>
+              <w:left w:val="single" w:color="000000" w:sz="4"/>
+              <w:bottom w:val="single" w:color="000000" w:sz="4"/>
+              <w:right w:val="single" w:color="000000" w:sz="4"/>
+            </w:tcBorders>
+            <w:shd w:fill="D9D9D9" w:val="clear"/>
+            <w:tcMar>
+              <w:top w:type="dxa" w:w="60"/>
+              <w:left w:type="dxa" w:w="100"/>
+              <w:bottom w:type="dxa" w:w="60"/>
+              <w:right w:type="dxa" w:w="100"/>
+            </w:tcMar>
+          </w:tcPr>
+          <w:p>
+            <w:r>
+              <w:rPr>
+                <w:rFonts w:ascii="Calibri" w:cs="Calibri" w:eastAsia="Calibri" w:hAnsi="Calibri"/>
+                <w:b/>
+                <w:bCs/>
+                <w:color w:val="000000"/>
+              </w:rPr>
+              <w:t xml:space="preserve">Herramienta</w:t>
+            </w:r>
+          </w:p>
+        </w:tc>
+        <w:tc>
+          <w:tcPr>
+            <w:tcW w:type="dxa" w:w="7160"/>
+            <w:tcBorders>
+              <w:top w:val="single" w:color="000000" w:sz="4"/>
+              <w:left w:val="single" w:color="000000" w:sz="4"/>
+              <w:bottom w:val="single" w:color="000000" w:sz="4"/>
+              <w:right w:val="single" w:color="000000" w:sz="4"/>
+            </w:tcBorders>
+            <w:shd w:fill="D9D9D9" w:val="clear"/>
+            <w:tcMar>
+              <w:top w:type="dxa" w:w="60"/>
+              <w:left w:type="dxa" w:w="100"/>
+              <w:bottom w:type="dxa" w:w="60"/>
+              <w:right w:type="dxa" w:w="100"/>
+            </w:tcMar>
+          </w:tcPr>
+          <w:p>
+            <w:r>
+              <w:rPr>
+                <w:rFonts w:ascii="Calibri" w:cs="Calibri" w:eastAsia="Calibri" w:hAnsi="Calibri"/>
+                <w:b/>
+                <w:bCs/>
+                <w:color w:val="000000"/>
+              </w:rPr>
+              <w:t xml:space="preserve">Para qué sirve</w:t>
+            </w:r>
+          </w:p>
+        </w:tc>
+      </w:tr>
+      <w:tr>
+        <w:tc>
+          <w:tcPr>
+            <w:tcW w:type="dxa" w:w="2200"/>
+            <w:tcBorders>
+              <w:top w:val="single" w:color="000000" w:sz="4"/>
+              <w:left w:val="single" w:color="000000" w:sz="4"/>
+              <w:bottom w:val="single" w:color="000000" w:sz="4"/>
+              <w:right w:val="single" w:color="000000" w:sz="4"/>
+            </w:tcBorders>
+            <w:shd w:fill="FFFFFF" w:val="clear"/>
+            <w:tcMar>
+              <w:top w:type="dxa" w:w="60"/>
+              <w:left w:type="dxa" w:w="100"/>
+              <w:bottom w:type="dxa" w:w="60"/>
+              <w:right w:type="dxa" w:w="100"/>
+            </w:tcMar>
+          </w:tcPr>
+          <w:p>
+            <w:r>
+              <w:rPr>
+                <w:rFonts w:ascii="Calibri" w:cs="Calibri" w:eastAsia="Calibri" w:hAnsi="Calibri"/>
+                <w:b/>
+                <w:bCs/>
+              </w:rPr>
+              <w:t xml:space="preserve">Sguil</w:t>
+            </w:r>
+          </w:p>
+        </w:tc>
+        <w:tc>
+          <w:tcPr>
+            <w:tcW w:type="dxa" w:w="7160"/>
+            <w:tcBorders>
+              <w:top w:val="single" w:color="000000" w:sz="4"/>
+              <w:left w:val="single" w:color="000000" w:sz="4"/>
+              <w:bottom w:val="single" w:color="000000" w:sz="4"/>
+              <w:right w:val="single" w:color="000000" w:sz="4"/>
+            </w:tcBorders>
+            <w:shd w:fill="FFFFFF" w:val="clear"/>
+            <w:tcMar>
+              <w:top w:type="dxa" w:w="60"/>
+              <w:left w:type="dxa" w:w="100"/>
+              <w:bottom w:type="dxa" w:w="60"/>
+              <w:right w:type="dxa" w:w="100"/>
+            </w:tcMar>
+          </w:tcPr>
+          <w:p>
+            <w:r>
+              <w:rPr>
+                <w:rFonts w:ascii="Calibri" w:cs="Calibri" w:eastAsia="Calibri" w:hAnsi="Calibri"/>
+              </w:rPr>
+              <w:t xml:space="preserve">Punto de inicio para investigar alertas de seguridad</w:t>
+            </w:r>
+          </w:p>
+        </w:tc>
+      </w:tr>
+      <w:tr>
+        <w:tc>
+          <w:tcPr>
+            <w:tcW w:type="dxa" w:w="2200"/>
+            <w:tcBorders>
+              <w:top w:val="single" w:color="000000" w:sz="4"/>
+              <w:left w:val="single" w:color="000000" w:sz="4"/>
+              <w:bottom w:val="single" w:color="000000" w:sz="4"/>
+              <w:right w:val="single" w:color="000000" w:sz="4"/>
+            </w:tcBorders>
+            <w:shd w:fill="FFFFFF" w:val="clear"/>
+            <w:tcMar>
+              <w:top w:type="dxa" w:w="60"/>
+              <w:left w:type="dxa" w:w="100"/>
+              <w:bottom w:type="dxa" w:w="60"/>
+              <w:right w:type="dxa" w:w="100"/>
+            </w:tcMar>
+          </w:tcPr>
+          <w:p>
+            <w:r>
+              <w:rPr>
+                <w:rFonts w:ascii="Calibri" w:cs="Calibri" w:eastAsia="Calibri" w:hAnsi="Calibri"/>
+                <w:b/>
+                <w:bCs/>
+              </w:rPr>
+              <w:t xml:space="preserve">Kibana</w:t>
+            </w:r>
+          </w:p>
+        </w:tc>
+        <w:tc>
+          <w:tcPr>
+            <w:tcW w:type="dxa" w:w="7160"/>
+            <w:tcBorders>
+              <w:top w:val="single" w:color="000000" w:sz="4"/>
+              <w:left w:val="single" w:color="000000" w:sz="4"/>
+              <w:bottom w:val="single" w:color="000000" w:sz="4"/>
+              <w:right w:val="single" w:color="000000" w:sz="4"/>
+            </w:tcBorders>
+            <w:shd w:fill="FFFFFF" w:val="clear"/>
+            <w:tcMar>
+              <w:top w:type="dxa" w:w="60"/>
+              <w:left w:type="dxa" w:w="100"/>
+              <w:bottom w:type="dxa" w:w="60"/>
+              <w:right w:type="dxa" w:w="100"/>
+            </w:tcMar>
+          </w:tcPr>
+          <w:p>
+            <w:r>
+              <w:rPr>
+                <w:rFonts w:ascii="Calibri" w:cs="Calibri" w:eastAsia="Calibri" w:hAnsi="Calibri"/>
+              </w:rPr>
+              <w:t xml:space="preserve">Interfaz interactiva para datos de </w:t>
+            </w:r>
+            <w:r>
+              <w:rPr>
+                <w:rFonts w:ascii="Calibri" w:cs="Calibri" w:eastAsia="Calibri" w:hAnsi="Calibri"/>
+                <w:b/>
+                <w:bCs/>
+              </w:rPr>
+              <w:t xml:space="preserve">Elasticsearch</w:t>
+            </w:r>
+            <w:r>
+              <w:rPr>
+                <w:rFonts w:ascii="Calibri" w:cs="Calibri" w:eastAsia="Calibri" w:hAnsi="Calibri"/>
+              </w:rPr>
+              <w:t xml:space="preserve">. Permite consultar datos de NSM y da visualizaciones flexibles de esos datos</w:t>
+            </w:r>
+          </w:p>
+        </w:tc>
+      </w:tr>
+      <w:tr>
+        <w:tc>
+          <w:tcPr>
+            <w:tcW w:type="dxa" w:w="2200"/>
+            <w:tcBorders>
+              <w:top w:val="single" w:color="000000" w:sz="4"/>
+              <w:left w:val="single" w:color="000000" w:sz="4"/>
+              <w:bottom w:val="single" w:color="000000" w:sz="4"/>
+              <w:right w:val="single" w:color="000000" w:sz="4"/>
+            </w:tcBorders>
+            <w:shd w:fill="FFFFFF" w:val="clear"/>
+            <w:tcMar>
+              <w:top w:type="dxa" w:w="60"/>
+              <w:left w:type="dxa" w:w="100"/>
+              <w:bottom w:type="dxa" w:w="60"/>
+              <w:right w:type="dxa" w:w="100"/>
+            </w:tcMar>
+          </w:tcPr>
+          <w:p>
+            <w:r>
+              <w:rPr>
+                <w:rFonts w:ascii="Calibri" w:cs="Calibri" w:eastAsia="Calibri" w:hAnsi="Calibri"/>
+                <w:b/>
+                <w:bCs/>
+              </w:rPr>
+              <w:t xml:space="preserve">Wireshark</w:t>
+            </w:r>
+          </w:p>
+        </w:tc>
+        <w:tc>
+          <w:tcPr>
+            <w:tcW w:type="dxa" w:w="7160"/>
+            <w:tcBorders>
+              <w:top w:val="single" w:color="000000" w:sz="4"/>
+              <w:left w:val="single" w:color="000000" w:sz="4"/>
+              <w:bottom w:val="single" w:color="000000" w:sz="4"/>
+              <w:right w:val="single" w:color="000000" w:sz="4"/>
+            </w:tcBorders>
+            <w:shd w:fill="FFFFFF" w:val="clear"/>
+            <w:tcMar>
+              <w:top w:type="dxa" w:w="60"/>
+              <w:left w:type="dxa" w:w="100"/>
+              <w:bottom w:type="dxa" w:w="60"/>
+              <w:right w:type="dxa" w:w="100"/>
+            </w:tcMar>
+          </w:tcPr>
+          <w:p>
+            <w:r>
+              <w:rPr>
+                <w:rFonts w:ascii="Calibri" w:cs="Calibri" w:eastAsia="Calibri" w:hAnsi="Calibri"/>
+              </w:rPr>
+              <w:t xml:space="preserve">Capturador de paquetes, integrado en el conjunto de Cebolla de seguridad</w:t>
+            </w:r>
+          </w:p>
+        </w:tc>
+      </w:tr>
+      <w:tr>
+        <w:tc>
+          <w:tcPr>
+            <w:tcW w:type="dxa" w:w="2200"/>
+            <w:tcBorders>
+              <w:top w:val="single" w:color="000000" w:sz="4"/>
+              <w:left w:val="single" w:color="000000" w:sz="4"/>
+              <w:bottom w:val="single" w:color="000000" w:sz="4"/>
+              <w:right w:val="single" w:color="000000" w:sz="4"/>
+            </w:tcBorders>
+            <w:shd w:fill="FFFFFF" w:val="clear"/>
+            <w:tcMar>
+              <w:top w:type="dxa" w:w="60"/>
+              <w:left w:type="dxa" w:w="100"/>
+              <w:bottom w:type="dxa" w:w="60"/>
+              <w:right w:type="dxa" w:w="100"/>
+            </w:tcMar>
+          </w:tcPr>
+          <w:p>
+            <w:r>
+              <w:rPr>
+                <w:rFonts w:ascii="Calibri" w:cs="Calibri" w:eastAsia="Calibri" w:hAnsi="Calibri"/>
+                <w:b/>
+                <w:bCs/>
+              </w:rPr>
+              <w:t xml:space="preserve">Zeek</w:t>
+            </w:r>
+          </w:p>
+        </w:tc>
+        <w:tc>
+          <w:tcPr>
+            <w:tcW w:type="dxa" w:w="7160"/>
+            <w:tcBorders>
+              <w:top w:val="single" w:color="000000" w:sz="4"/>
+              <w:left w:val="single" w:color="000000" w:sz="4"/>
+              <w:bottom w:val="single" w:color="000000" w:sz="4"/>
+              <w:right w:val="single" w:color="000000" w:sz="4"/>
+            </w:tcBorders>
+            <w:shd w:fill="FFFFFF" w:val="clear"/>
+            <w:tcMar>
+              <w:top w:type="dxa" w:w="60"/>
+              <w:left w:type="dxa" w:w="100"/>
+              <w:bottom w:type="dxa" w:w="60"/>
+              <w:right w:type="dxa" w:w="100"/>
+            </w:tcMar>
+          </w:tcPr>
+          <w:p>
+            <w:r>
+              <w:rPr>
+                <w:rFonts w:ascii="Calibri" w:cs="Calibri" w:eastAsia="Calibri" w:hAnsi="Calibri"/>
+              </w:rPr>
+              <w:t xml:space="preserve">Analizador de tráfico de red que sirve como </w:t>
+            </w:r>
+            <w:r>
+              <w:rPr>
+                <w:rFonts w:ascii="Calibri" w:cs="Calibri" w:eastAsia="Calibri" w:hAnsi="Calibri"/>
+                <w:b/>
+                <w:bCs/>
+              </w:rPr>
+              <w:t xml:space="preserve">monitor de seguridad</w:t>
+            </w:r>
+            <w:r>
+              <w:rPr>
+                <w:rFonts w:ascii="Calibri" w:cs="Calibri" w:eastAsia="Calibri" w:hAnsi="Calibri"/>
+              </w:rPr>
+              <w:t xml:space="preserve">. Inspecciona todo el tráfico en un segmento de red y permite un análisis detallado de esos datos</w:t>
+            </w:r>
+          </w:p>
+        </w:tc>
+      </w:tr>
+    </w:tbl>
+    <w:p>
+      <w:pPr>
+        <w:spacing w:after="80"/>
+      </w:pPr>
+    </w:p>
+    <w:p>
+      <w:pPr>
+        <w:spacing w:after="80" w:before="160"/>
+      </w:pPr>
+      <w:r>
+        <w:rPr>
+          <w:rFonts w:ascii="Calibri" w:cs="Calibri" w:eastAsia="Calibri" w:hAnsi="Calibri"/>
+          <w:b/>
+          <w:bCs/>
+        </w:rPr>
+        <w:t xml:space="preserve">Alertas de seguridad</w:t>
+      </w:r>
+    </w:p>
+    <w:p>
+      <w:pPr>
+        <w:pStyle w:val="ListParagraph"/>
+        <w:numPr>
+          <w:ilvl w:val="0"/>
+          <w:numId w:val="2"/>
+        </w:numPr>
+        <w:spacing w:after="60"/>
+      </w:pPr>
+      <w:r>
+        <w:rPr>
+          <w:rFonts w:ascii="Calibri" w:cs="Calibri" w:eastAsia="Calibri" w:hAnsi="Calibri"/>
+        </w:rPr>
+        <w:t xml:space="preserve">Son </w:t>
+      </w:r>
+      <w:r>
+        <w:rPr>
+          <w:rFonts w:ascii="Calibri" w:cs="Calibri" w:eastAsia="Calibri" w:hAnsi="Calibri"/>
+          <w:b/>
+          <w:bCs/>
+        </w:rPr>
+        <w:t xml:space="preserve">mensajes de notificación</w:t>
+      </w:r>
+      <w:r>
+        <w:rPr>
+          <w:rFonts w:ascii="Calibri" w:cs="Calibri" w:eastAsia="Calibri" w:hAnsi="Calibri"/>
+        </w:rPr>
+        <w:t xml:space="preserve"> que generan las herramientas, sistemas y dispositivos de seguridad de NSM.</w:t>
+      </w:r>
+    </w:p>
+    <w:p>
+      <w:pPr>
+        <w:pStyle w:val="ListParagraph"/>
+        <w:numPr>
+          <w:ilvl w:val="0"/>
+          <w:numId w:val="2"/>
+        </w:numPr>
+        <w:spacing w:after="60"/>
+      </w:pPr>
+      <w:r>
+        <w:rPr>
+          <w:rFonts w:ascii="Calibri" w:cs="Calibri" w:eastAsia="Calibri" w:hAnsi="Calibri"/>
+        </w:rPr>
+        <w:t xml:space="preserve">En Cebolla de seguridad, </w:t>
+      </w:r>
+      <w:r>
+        <w:rPr>
+          <w:rFonts w:ascii="Calibri" w:cs="Calibri" w:eastAsia="Calibri" w:hAnsi="Calibri"/>
+          <w:b/>
+          <w:bCs/>
+        </w:rPr>
+        <w:t xml:space="preserve">Sguil</w:t>
+      </w:r>
+      <w:r>
+        <w:rPr>
+          <w:rFonts w:ascii="Calibri" w:cs="Calibri" w:eastAsia="Calibri" w:hAnsi="Calibri"/>
+        </w:rPr>
+        <w:t xml:space="preserve"> da una consola que reúne alertas de varias fuentes en una </w:t>
+      </w:r>
+      <w:r>
+        <w:rPr>
+          <w:rFonts w:ascii="Calibri" w:cs="Calibri" w:eastAsia="Calibri" w:hAnsi="Calibri"/>
+          <w:b/>
+          <w:bCs/>
+        </w:rPr>
+        <w:t xml:space="preserve">cola con marca de hora</w:t>
+      </w:r>
+      <w:r>
+        <w:rPr>
+          <w:rFonts w:ascii="Calibri" w:cs="Calibri" w:eastAsia="Calibri" w:hAnsi="Calibri"/>
+        </w:rPr>
+        <w:t xml:space="preserve">.</w:t>
+      </w:r>
+    </w:p>
+    <w:p>
+      <w:pPr>
+        <w:pStyle w:val="ListParagraph"/>
+        <w:numPr>
+          <w:ilvl w:val="0"/>
+          <w:numId w:val="2"/>
+        </w:numPr>
+        <w:spacing w:after="60"/>
+      </w:pPr>
+      <w:r>
+        <w:rPr>
+          <w:rFonts w:ascii="Calibri" w:cs="Calibri" w:eastAsia="Calibri" w:hAnsi="Calibri"/>
+        </w:rPr>
+        <w:t xml:space="preserve">El analista puede recorrer la cola investigando, clasificando, derivando o retirando alertas.</w:t>
+      </w:r>
+    </w:p>
+    <w:p>
+      <w:pPr>
+        <w:pStyle w:val="ListParagraph"/>
+        <w:numPr>
+          <w:ilvl w:val="0"/>
+          <w:numId w:val="2"/>
+        </w:numPr>
+        <w:spacing w:after="60"/>
+      </w:pPr>
+      <w:r>
+        <w:rPr>
+          <w:rFonts w:ascii="Calibri" w:cs="Calibri" w:eastAsia="Calibri" w:hAnsi="Calibri"/>
+        </w:rPr>
+        <w:t xml:space="preserve">Suelen incluir la </w:t>
+      </w:r>
+      <w:r>
+        <w:rPr>
+          <w:rFonts w:ascii="Calibri" w:cs="Calibri" w:eastAsia="Calibri" w:hAnsi="Calibri"/>
+          <w:b/>
+          <w:bCs/>
+        </w:rPr>
+        <w:t xml:space="preserve">cinco tupla</w:t>
+      </w:r>
+      <w:r>
+        <w:rPr>
+          <w:rFonts w:ascii="Calibri" w:cs="Calibri" w:eastAsia="Calibri" w:hAnsi="Calibri"/>
+        </w:rPr>
+        <w:t xml:space="preserve"> (cuando está disponible), </w:t>
+      </w:r>
+      <w:r>
+        <w:rPr>
+          <w:rFonts w:ascii="Calibri" w:cs="Calibri" w:eastAsia="Calibri" w:hAnsi="Calibri"/>
+          <w:b/>
+          <w:bCs/>
+        </w:rPr>
+        <w:t xml:space="preserve">marcas de hora</w:t>
+      </w:r>
+      <w:r>
+        <w:rPr>
+          <w:rFonts w:ascii="Calibri" w:cs="Calibri" w:eastAsia="Calibri" w:hAnsi="Calibri"/>
+        </w:rPr>
+        <w:t xml:space="preserve"> y la información para identificar qué dispositivo o sistema generó la alerta.</w:t>
+      </w:r>
+    </w:p>
+    <w:p>
+      <w:pPr>
+        <w:pStyle w:val="ListParagraph"/>
+        <w:numPr>
+          <w:ilvl w:val="0"/>
+          <w:numId w:val="2"/>
+        </w:numPr>
+        <w:spacing w:after="60"/>
+      </w:pPr>
+      <w:r>
+        <w:rPr>
+          <w:rFonts w:ascii="Calibri" w:cs="Calibri" w:eastAsia="Calibri" w:hAnsi="Calibri"/>
+        </w:rPr>
+        <w:t xml:space="preserve">Según la tecnología, se pueden generar alertas con base en </w:t>
+      </w:r>
+      <w:r>
+        <w:rPr>
+          <w:rFonts w:ascii="Calibri" w:cs="Calibri" w:eastAsia="Calibri" w:hAnsi="Calibri"/>
+          <w:b/>
+          <w:bCs/>
+        </w:rPr>
+        <w:t xml:space="preserve">reglas, firmas, anomalías o comportamientos</w:t>
+      </w:r>
+      <w:r>
+        <w:rPr>
+          <w:rFonts w:ascii="Calibri" w:cs="Calibri" w:eastAsia="Calibri" w:hAnsi="Calibri"/>
+        </w:rPr>
+        <w:t xml:space="preserve">.</w:t>
+      </w:r>
+    </w:p>
+    <w:p>
+      <w:pPr>
+        <w:pStyle w:val="ListParagraph"/>
+        <w:numPr>
+          <w:ilvl w:val="0"/>
+          <w:numId w:val="2"/>
+        </w:numPr>
+        <w:spacing w:after="60"/>
+      </w:pPr>
+      <w:r>
+        <w:rPr>
+          <w:rFonts w:ascii="Calibri" w:cs="Calibri" w:eastAsia="Calibri" w:hAnsi="Calibri"/>
+        </w:rPr>
+        <w:t xml:space="preserve">Pueden venir de varios orígenes, como </w:t>
+      </w:r>
+      <w:r>
+        <w:rPr>
+          <w:rFonts w:ascii="Calibri" w:cs="Calibri" w:eastAsia="Calibri" w:hAnsi="Calibri"/>
+          <w:b/>
+          <w:bCs/>
+        </w:rPr>
+        <w:t xml:space="preserve">NIDS</w:t>
+      </w:r>
+      <w:r>
+        <w:rPr>
+          <w:rFonts w:ascii="Calibri" w:cs="Calibri" w:eastAsia="Calibri" w:hAnsi="Calibri"/>
+        </w:rPr>
+        <w:t xml:space="preserve">, administración y supervisión de activos, transacciones </w:t>
+      </w:r>
+      <w:r>
+        <w:rPr>
+          <w:rFonts w:ascii="Calibri" w:cs="Calibri" w:eastAsia="Calibri" w:hAnsi="Calibri"/>
+          <w:b/>
+          <w:bCs/>
+        </w:rPr>
+        <w:t xml:space="preserve">HTTP, DNS y TCP</w:t>
+      </w:r>
+      <w:r>
+        <w:rPr>
+          <w:rFonts w:ascii="Calibri" w:cs="Calibri" w:eastAsia="Calibri" w:hAnsi="Calibri"/>
+        </w:rPr>
+        <w:t xml:space="preserve">, y mensajes </w:t>
+      </w:r>
+      <w:r>
+        <w:rPr>
+          <w:rFonts w:ascii="Calibri" w:cs="Calibri" w:eastAsia="Calibri" w:hAnsi="Calibri"/>
+          <w:b/>
+          <w:bCs/>
+        </w:rPr>
+        <w:t xml:space="preserve">Syslog</w:t>
+      </w:r>
+      <w:r>
+        <w:rPr>
+          <w:rFonts w:ascii="Calibri" w:cs="Calibri" w:eastAsia="Calibri" w:hAnsi="Calibri"/>
+        </w:rPr>
+        <w:t xml:space="preserve">.</w:t>
+      </w:r>
+    </w:p>
+    <w:p>
+      <w:pPr>
+        <w:spacing w:after="80" w:before="160"/>
+      </w:pPr>
+      <w:r>
+        <w:rPr>
+          <w:rFonts w:ascii="Calibri" w:cs="Calibri" w:eastAsia="Calibri" w:hAnsi="Calibri"/>
+          <w:b/>
+          <w:bCs/>
+        </w:rPr>
+        <w:t xml:space="preserve">Snort</w:t>
+      </w:r>
+    </w:p>
+    <w:p>
+      <w:pPr>
+        <w:pStyle w:val="ListParagraph"/>
+        <w:numPr>
+          <w:ilvl w:val="0"/>
+          <w:numId w:val="2"/>
+        </w:numPr>
+        <w:spacing w:after="60"/>
+      </w:pPr>
+      <w:r>
+        <w:rPr>
+          <w:rFonts w:ascii="Calibri" w:cs="Calibri" w:eastAsia="Calibri" w:hAnsi="Calibri"/>
+        </w:rPr>
+        <w:t xml:space="preserve">Es un </w:t>
+      </w:r>
+      <w:r>
+        <w:rPr>
+          <w:rFonts w:ascii="Calibri" w:cs="Calibri" w:eastAsia="Calibri" w:hAnsi="Calibri"/>
+          <w:b/>
+          <w:bCs/>
+        </w:rPr>
+        <w:t xml:space="preserve">NIDS</w:t>
+      </w:r>
+      <w:r>
+        <w:rPr>
+          <w:rFonts w:ascii="Calibri" w:cs="Calibri" w:eastAsia="Calibri" w:hAnsi="Calibri"/>
+        </w:rPr>
+        <w:t xml:space="preserve"> (sistema de detección de intrusiones en la red).</w:t>
+      </w:r>
+    </w:p>
+    <w:p>
+      <w:pPr>
+        <w:pStyle w:val="ListParagraph"/>
+        <w:numPr>
+          <w:ilvl w:val="0"/>
+          <w:numId w:val="2"/>
+        </w:numPr>
+        <w:spacing w:after="60"/>
+      </w:pPr>
+      <w:r>
+        <w:rPr>
+          <w:rFonts w:ascii="Calibri" w:cs="Calibri" w:eastAsia="Calibri" w:hAnsi="Calibri"/>
+        </w:rPr>
+        <w:t xml:space="preserve">Es una fuente importante de datos de alerta, que se indexan en </w:t>
+      </w:r>
+      <w:r>
+        <w:rPr>
+          <w:rFonts w:ascii="Calibri" w:cs="Calibri" w:eastAsia="Calibri" w:hAnsi="Calibri"/>
+          <w:b/>
+          <w:bCs/>
+        </w:rPr>
+        <w:t xml:space="preserve">Sguil</w:t>
+      </w:r>
+      <w:r>
+        <w:rPr>
+          <w:rFonts w:ascii="Calibri" w:cs="Calibri" w:eastAsia="Calibri" w:hAnsi="Calibri"/>
+        </w:rPr>
+        <w:t xml:space="preserve">.</w:t>
+      </w:r>
+    </w:p>
+    <w:p>
+      <w:pPr>
+        <w:pStyle w:val="ListParagraph"/>
+        <w:numPr>
+          <w:ilvl w:val="0"/>
+          <w:numId w:val="2"/>
+        </w:numPr>
+        <w:spacing w:after="60"/>
+      </w:pPr>
+      <w:r>
+        <w:rPr>
+          <w:rFonts w:ascii="Calibri" w:cs="Calibri" w:eastAsia="Calibri" w:hAnsi="Calibri"/>
+        </w:rPr>
+        <w:t xml:space="preserve">Usa </w:t>
+      </w:r>
+      <w:r>
+        <w:rPr>
+          <w:rFonts w:ascii="Calibri" w:cs="Calibri" w:eastAsia="Calibri" w:hAnsi="Calibri"/>
+          <w:b/>
+          <w:bCs/>
+        </w:rPr>
+        <w:t xml:space="preserve">reglas</w:t>
+      </w:r>
+      <w:r>
+        <w:rPr>
+          <w:rFonts w:ascii="Calibri" w:cs="Calibri" w:eastAsia="Calibri" w:hAnsi="Calibri"/>
+        </w:rPr>
+        <w:t xml:space="preserve"> para identificar tráfico potencialmente malicioso.</w:t>
+      </w:r>
+    </w:p>
+    <w:p>
+      <w:pPr>
+        <w:pStyle w:val="ListParagraph"/>
+        <w:numPr>
+          <w:ilvl w:val="0"/>
+          <w:numId w:val="2"/>
+        </w:numPr>
+        <w:spacing w:after="60"/>
+      </w:pPr>
+      <w:r>
+        <w:rPr>
+          <w:rFonts w:ascii="Calibri" w:cs="Calibri" w:eastAsia="Calibri" w:hAnsi="Calibri"/>
+        </w:rPr>
+        <w:t xml:space="preserve">Las reglas tienen </w:t>
+      </w:r>
+      <w:r>
+        <w:rPr>
+          <w:rFonts w:ascii="Calibri" w:cs="Calibri" w:eastAsia="Calibri" w:hAnsi="Calibri"/>
+          <w:b/>
+          <w:bCs/>
+        </w:rPr>
+        <w:t xml:space="preserve">2 secciones</w:t>
+      </w:r>
+      <w:r>
+        <w:rPr>
+          <w:rFonts w:ascii="Calibri" w:cs="Calibri" w:eastAsia="Calibri" w:hAnsi="Calibri"/>
+        </w:rPr>
+        <w:t xml:space="preserve">:</w:t>
+      </w:r>
+    </w:p>
+    <w:p>
+      <w:pPr>
+        <w:pStyle w:val="ListParagraph"/>
+        <w:numPr>
+          <w:ilvl w:val="1"/>
+          <w:numId w:val="2"/>
+        </w:numPr>
+        <w:spacing w:after="60"/>
+      </w:pPr>
+      <w:r>
+        <w:rPr>
+          <w:rFonts w:ascii="Calibri" w:cs="Calibri" w:eastAsia="Calibri" w:hAnsi="Calibri"/>
+          <w:b/>
+          <w:bCs/>
+        </w:rPr>
+        <w:t xml:space="preserve">Encabezado de la regla:</w:t>
+      </w:r>
+      <w:r>
+        <w:rPr>
+          <w:rFonts w:ascii="Calibri" w:cs="Calibri" w:eastAsia="Calibri" w:hAnsi="Calibri"/>
+        </w:rPr>
+        <w:t xml:space="preserve"> la acción, el protocolo, las direcciones IP y máscaras de red de origen y destino, y la información del puerto de origen y destino.</w:t>
+      </w:r>
+    </w:p>
+    <w:p>
+      <w:pPr>
+        <w:pStyle w:val="ListParagraph"/>
+        <w:numPr>
+          <w:ilvl w:val="1"/>
+          <w:numId w:val="2"/>
+        </w:numPr>
+        <w:spacing w:after="60"/>
+      </w:pPr>
+      <w:r>
+        <w:rPr>
+          <w:rFonts w:ascii="Calibri" w:cs="Calibri" w:eastAsia="Calibri" w:hAnsi="Calibri"/>
+          <w:b/>
+          <w:bCs/>
+        </w:rPr>
+        <w:t xml:space="preserve">Opciones de la regla:</w:t>
+      </w:r>
+      <w:r>
+        <w:rPr>
+          <w:rFonts w:ascii="Calibri" w:cs="Calibri" w:eastAsia="Calibri" w:hAnsi="Calibri"/>
+        </w:rPr>
+        <w:t xml:space="preserve"> mensajes de alerta e información sobre qué partes del paquete se deben inspeccionar para decidir si se toma la acción de la regla. Su estructura es </w:t>
+      </w:r>
+      <w:r>
+        <w:rPr>
+          <w:rFonts w:ascii="Calibri" w:cs="Calibri" w:eastAsia="Calibri" w:hAnsi="Calibri"/>
+          <w:b/>
+          <w:bCs/>
+        </w:rPr>
+        <w:t xml:space="preserve">variable</w:t>
+      </w:r>
+      <w:r>
+        <w:rPr>
+          <w:rFonts w:ascii="Calibri" w:cs="Calibri" w:eastAsia="Calibri" w:hAnsi="Calibri"/>
+        </w:rPr>
+        <w:t xml:space="preserve">.</w:t>
+      </w:r>
+    </w:p>
+    <w:p>
+      <w:pPr>
+        <w:spacing w:after="120" w:before="280"/>
+      </w:pPr>
+      <w:r>
+        <w:rPr>
+          <w:rFonts w:ascii="Calibri" w:cs="Calibri" w:eastAsia="Calibri" w:hAnsi="Calibri"/>
+          <w:b/>
+          <w:bCs/>
+        </w:rPr>
+        <w:t xml:space="preserve">2. Descripción general de la evaluación de alertas</w:t>
+      </w:r>
+    </w:p>
+    <w:p>
+      <w:pPr>
+        <w:spacing w:after="80" w:before="160"/>
+      </w:pPr>
+      <w:r>
+        <w:rPr>
+          <w:rFonts w:ascii="Calibri" w:cs="Calibri" w:eastAsia="Calibri" w:hAnsi="Calibri"/>
+          <w:b/>
+          <w:bCs/>
+        </w:rPr>
+        <w:t xml:space="preserve">El panorama de amenazas</w:t>
+      </w:r>
+    </w:p>
+    <w:p>
+      <w:pPr>
+        <w:pStyle w:val="ListParagraph"/>
+        <w:numPr>
+          <w:ilvl w:val="0"/>
+          <w:numId w:val="2"/>
+        </w:numPr>
+        <w:spacing w:after="60"/>
+      </w:pPr>
+      <w:r>
+        <w:rPr>
+          <w:rFonts w:ascii="Calibri" w:cs="Calibri" w:eastAsia="Calibri" w:hAnsi="Calibri"/>
+        </w:rPr>
+        <w:t xml:space="preserve">Cambia </w:t>
+      </w:r>
+      <w:r>
+        <w:rPr>
+          <w:rFonts w:ascii="Calibri" w:cs="Calibri" w:eastAsia="Calibri" w:hAnsi="Calibri"/>
+          <w:b/>
+          <w:bCs/>
+        </w:rPr>
+        <w:t xml:space="preserve">constantemente</w:t>
+      </w:r>
+      <w:r>
+        <w:rPr>
+          <w:rFonts w:ascii="Calibri" w:cs="Calibri" w:eastAsia="Calibri" w:hAnsi="Calibri"/>
+        </w:rPr>
+        <w:t xml:space="preserve"> con la detección de nuevas vulnerabilidades y la evolución de nuevas amenazas.</w:t>
+      </w:r>
+    </w:p>
+    <w:p>
+      <w:pPr>
+        <w:pStyle w:val="ListParagraph"/>
+        <w:numPr>
+          <w:ilvl w:val="0"/>
+          <w:numId w:val="2"/>
+        </w:numPr>
+        <w:spacing w:after="60"/>
+      </w:pPr>
+      <w:r>
+        <w:rPr>
+          <w:rFonts w:ascii="Calibri" w:cs="Calibri" w:eastAsia="Calibri" w:hAnsi="Calibri"/>
+        </w:rPr>
+        <w:t xml:space="preserve">Si cambian las necesidades de usuarios y organizaciones, cambia también la </w:t>
+      </w:r>
+      <w:r>
+        <w:rPr>
+          <w:rFonts w:ascii="Calibri" w:cs="Calibri" w:eastAsia="Calibri" w:hAnsi="Calibri"/>
+          <w:b/>
+          <w:bCs/>
+        </w:rPr>
+        <w:t xml:space="preserve">superficie de ataque</w:t>
+      </w:r>
+      <w:r>
+        <w:rPr>
+          <w:rFonts w:ascii="Calibri" w:cs="Calibri" w:eastAsia="Calibri" w:hAnsi="Calibri"/>
+        </w:rPr>
+        <w:t xml:space="preserve">.</w:t>
+      </w:r>
+    </w:p>
+    <w:p>
+      <w:pPr>
+        <w:pStyle w:val="ListParagraph"/>
+        <w:numPr>
+          <w:ilvl w:val="0"/>
+          <w:numId w:val="2"/>
+        </w:numPr>
+        <w:spacing w:after="60"/>
+      </w:pPr>
+      <w:r>
+        <w:rPr>
+          <w:rFonts w:ascii="Calibri" w:cs="Calibri" w:eastAsia="Calibri" w:hAnsi="Calibri"/>
+        </w:rPr>
+        <w:t xml:space="preserve">Los atacantes aprendieron a cambiar rápido las características de sus ataques para </w:t>
+      </w:r>
+      <w:r>
+        <w:rPr>
+          <w:rFonts w:ascii="Calibri" w:cs="Calibri" w:eastAsia="Calibri" w:hAnsi="Calibri"/>
+          <w:b/>
+          <w:bCs/>
+        </w:rPr>
+        <w:t xml:space="preserve">evadir la detección</w:t>
+      </w:r>
+      <w:r>
+        <w:rPr>
+          <w:rFonts w:ascii="Calibri" w:cs="Calibri" w:eastAsia="Calibri" w:hAnsi="Calibri"/>
+        </w:rPr>
+        <w:t xml:space="preserve">.</w:t>
+      </w:r>
+    </w:p>
+    <w:p>
+      <w:pPr>
+        <w:pStyle w:val="ListParagraph"/>
+        <w:numPr>
+          <w:ilvl w:val="0"/>
+          <w:numId w:val="2"/>
+        </w:numPr>
+        <w:spacing w:after="60"/>
+      </w:pPr>
+      <w:r>
+        <w:rPr>
+          <w:rFonts w:ascii="Calibri" w:cs="Calibri" w:eastAsia="Calibri" w:hAnsi="Calibri"/>
+        </w:rPr>
+        <w:t xml:space="preserve">Las reglas de detección deben ser </w:t>
+      </w:r>
+      <w:r>
+        <w:rPr>
+          <w:rFonts w:ascii="Calibri" w:cs="Calibri" w:eastAsia="Calibri" w:hAnsi="Calibri"/>
+          <w:b/>
+          <w:bCs/>
+        </w:rPr>
+        <w:t xml:space="preserve">excesivamente conservadoras</w:t>
+      </w:r>
+      <w:r>
+        <w:rPr>
+          <w:rFonts w:ascii="Calibri" w:cs="Calibri" w:eastAsia="Calibri" w:hAnsi="Calibri"/>
+        </w:rPr>
+        <w:t xml:space="preserve">: es mejor tener alertas ocasionales por tráfico inocente que reglas que no detecten tráfico malicioso.</w:t>
+      </w:r>
+    </w:p>
+    <w:p>
+      <w:pPr>
+        <w:pStyle w:val="ListParagraph"/>
+        <w:numPr>
+          <w:ilvl w:val="0"/>
+          <w:numId w:val="2"/>
+        </w:numPr>
+        <w:spacing w:after="60"/>
+      </w:pPr>
+      <w:r>
+        <w:rPr>
+          <w:rFonts w:ascii="Calibri" w:cs="Calibri" w:eastAsia="Calibri" w:hAnsi="Calibri"/>
+        </w:rPr>
+        <w:t xml:space="preserve">Por eso hacen falta </w:t>
+      </w:r>
+      <w:r>
+        <w:rPr>
+          <w:rFonts w:ascii="Calibri" w:cs="Calibri" w:eastAsia="Calibri" w:hAnsi="Calibri"/>
+          <w:b/>
+          <w:bCs/>
+        </w:rPr>
+        <w:t xml:space="preserve">analistas de ciberseguridad calificados</w:t>
+      </w:r>
+      <w:r>
+        <w:rPr>
+          <w:rFonts w:ascii="Calibri" w:cs="Calibri" w:eastAsia="Calibri" w:hAnsi="Calibri"/>
+        </w:rPr>
+        <w:t xml:space="preserve"> que investiguen las alertas y determinen si de verdad hubo un ataque.</w:t>
+      </w:r>
+    </w:p>
+    <w:p>
+      <w:pPr>
+        <w:spacing w:after="80" w:before="160"/>
+      </w:pPr>
+      <w:r>
+        <w:rPr>
+          <w:rFonts w:ascii="Calibri" w:cs="Calibri" w:eastAsia="Calibri" w:hAnsi="Calibri"/>
+          <w:b/>
+          <w:bCs/>
+        </w:rPr>
+        <w:t xml:space="preserve">Clasificación de las alertas</w:t>
+      </w:r>
+    </w:p>
+    <w:p>
+      <w:pPr>
+        <w:pStyle w:val="ListParagraph"/>
+        <w:numPr>
+          <w:ilvl w:val="0"/>
+          <w:numId w:val="2"/>
+        </w:numPr>
+        <w:spacing w:after="60"/>
+      </w:pPr>
+      <w:r>
+        <w:rPr>
+          <w:rFonts w:ascii="Calibri" w:cs="Calibri" w:eastAsia="Calibri" w:hAnsi="Calibri"/>
+        </w:rPr>
+        <w:t xml:space="preserve">Los incidentes se clasifican con un esquema tomado del ámbito de los </w:t>
+      </w:r>
+      <w:r>
+        <w:rPr>
+          <w:rFonts w:ascii="Calibri" w:cs="Calibri" w:eastAsia="Calibri" w:hAnsi="Calibri"/>
+          <w:b/>
+          <w:bCs/>
+        </w:rPr>
+        <w:t xml:space="preserve">diagnósticos médicos</w:t>
+      </w:r>
+      <w:r>
+        <w:rPr>
+          <w:rFonts w:ascii="Calibri" w:cs="Calibri" w:eastAsia="Calibri" w:hAnsi="Calibri"/>
+        </w:rPr>
+        <w:t xml:space="preserve">. Sirve para guiar acciones y evaluar los procedimientos de diagnóstico.</w:t>
+      </w:r>
+    </w:p>
+    <w:p>
+      <w:pPr>
+        <w:pStyle w:val="ListParagraph"/>
+        <w:numPr>
+          <w:ilvl w:val="0"/>
+          <w:numId w:val="2"/>
+        </w:numPr>
+        <w:spacing w:after="60"/>
+      </w:pPr>
+      <w:r>
+        <w:rPr>
+          <w:rFonts w:ascii="Calibri" w:cs="Calibri" w:eastAsia="Calibri" w:hAnsi="Calibri"/>
+        </w:rPr>
+        <w:t xml:space="preserve">Lo que importa es si el diagnóstico es </w:t>
+      </w:r>
+      <w:r>
+        <w:rPr>
+          <w:rFonts w:ascii="Calibri" w:cs="Calibri" w:eastAsia="Calibri" w:hAnsi="Calibri"/>
+          <w:b/>
+          <w:bCs/>
+        </w:rPr>
+        <w:t xml:space="preserve">exacto (verdadero)</w:t>
+      </w:r>
+      <w:r>
+        <w:rPr>
+          <w:rFonts w:ascii="Calibri" w:cs="Calibri" w:eastAsia="Calibri" w:hAnsi="Calibri"/>
+        </w:rPr>
+        <w:t xml:space="preserve"> o </w:t>
+      </w:r>
+      <w:r>
+        <w:rPr>
+          <w:rFonts w:ascii="Calibri" w:cs="Calibri" w:eastAsia="Calibri" w:hAnsi="Calibri"/>
+          <w:b/>
+          <w:bCs/>
+        </w:rPr>
+        <w:t xml:space="preserve">inexacto (falso)</w:t>
+      </w:r>
+      <w:r>
+        <w:rPr>
+          <w:rFonts w:ascii="Calibri" w:cs="Calibri" w:eastAsia="Calibri" w:hAnsi="Calibri"/>
+        </w:rPr>
+        <w:t xml:space="preserve">.</w:t>
+      </w:r>
+    </w:p>
+    <w:tbl>
+      <w:tblPr>
+        <w:tblW w:type="dxa" w:w="9360"/>
+        <w:tblBorders>
+          <w:top w:val="single" w:color="auto" w:sz="4"/>
+          <w:left w:val="single" w:color="auto" w:sz="4"/>
+          <w:bottom w:val="single" w:color="auto" w:sz="4"/>
+          <w:right w:val="single" w:color="auto" w:sz="4"/>
+          <w:insideH w:val="single" w:color="auto" w:sz="4"/>
+          <w:insideV w:val="single" w:color="auto" w:sz="4"/>
+        </w:tblBorders>
+      </w:tblPr>
+      <w:tblGrid>
+        <w:gridCol w:w="2300"/>
+        <w:gridCol w:w="2400"/>
+        <w:gridCol w:w="4660"/>
+      </w:tblGrid>
+      <w:tr>
+        <w:trPr>
+          <w:tblHeader/>
+        </w:trPr>
+        <w:tc>
+          <w:tcPr>
+            <w:tcW w:type="dxa" w:w="2300"/>
+            <w:tcBorders>
+              <w:top w:val="single" w:color="000000" w:sz="4"/>
+              <w:left w:val="single" w:color="000000" w:sz="4"/>
+              <w:bottom w:val="single" w:color="000000" w:sz="4"/>
+              <w:right w:val="single" w:color="000000" w:sz="4"/>
+            </w:tcBorders>
+            <w:shd w:fill="D9D9D9" w:val="clear"/>
+            <w:tcMar>
+              <w:top w:type="dxa" w:w="60"/>
+              <w:left w:type="dxa" w:w="100"/>
+              <w:bottom w:type="dxa" w:w="60"/>
+              <w:right w:type="dxa" w:w="100"/>
+            </w:tcMar>
+          </w:tcPr>
+          <w:p>
+            <w:r>
+              <w:rPr>
+                <w:rFonts w:ascii="Calibri" w:cs="Calibri" w:eastAsia="Calibri" w:hAnsi="Calibri"/>
+                <w:b/>
+                <w:bCs/>
+                <w:color w:val="000000"/>
+              </w:rPr>
+              <w:t xml:space="preserve">Resultado</w:t>
+            </w:r>
+          </w:p>
+        </w:tc>
+        <w:tc>
+          <w:tcPr>
+            <w:tcW w:type="dxa" w:w="2400"/>
+            <w:tcBorders>
+              <w:top w:val="single" w:color="000000" w:sz="4"/>
+              <w:left w:val="single" w:color="000000" w:sz="4"/>
+              <w:bottom w:val="single" w:color="000000" w:sz="4"/>
+              <w:right w:val="single" w:color="000000" w:sz="4"/>
+            </w:tcBorders>
+            <w:shd w:fill="D9D9D9" w:val="clear"/>
+            <w:tcMar>
+              <w:top w:type="dxa" w:w="60"/>
+              <w:left w:type="dxa" w:w="100"/>
+              <w:bottom w:type="dxa" w:w="60"/>
+              <w:right w:type="dxa" w:w="100"/>
+            </w:tcMar>
+          </w:tcPr>
+          <w:p>
+            <w:r>
+              <w:rPr>
+                <w:rFonts w:ascii="Calibri" w:cs="Calibri" w:eastAsia="Calibri" w:hAnsi="Calibri"/>
+                <w:b/>
+                <w:bCs/>
+                <w:color w:val="000000"/>
+              </w:rPr>
+              <w:t xml:space="preserve">Hubo alerta</w:t>
+            </w:r>
+          </w:p>
+        </w:tc>
+        <w:tc>
+          <w:tcPr>
+            <w:tcW w:type="dxa" w:w="4660"/>
+            <w:tcBorders>
+              <w:top w:val="single" w:color="000000" w:sz="4"/>
+              <w:left w:val="single" w:color="000000" w:sz="4"/>
+              <w:bottom w:val="single" w:color="000000" w:sz="4"/>
+              <w:right w:val="single" w:color="000000" w:sz="4"/>
+            </w:tcBorders>
+            <w:shd w:fill="D9D9D9" w:val="clear"/>
+            <w:tcMar>
+              <w:top w:type="dxa" w:w="60"/>
+              <w:left w:type="dxa" w:w="100"/>
+              <w:bottom w:type="dxa" w:w="60"/>
+              <w:right w:type="dxa" w:w="100"/>
+            </w:tcMar>
+          </w:tcPr>
+          <w:p>
+            <w:r>
+              <w:rPr>
+                <w:rFonts w:ascii="Calibri" w:cs="Calibri" w:eastAsia="Calibri" w:hAnsi="Calibri"/>
+                <w:b/>
+                <w:bCs/>
+                <w:color w:val="000000"/>
+              </w:rPr>
+              <w:t xml:space="preserve">Significado</w:t>
+            </w:r>
+          </w:p>
+        </w:tc>
+      </w:tr>
+      <w:tr>
+        <w:tc>
+          <w:tcPr>
+            <w:tcW w:type="dxa" w:w="2300"/>
+            <w:tcBorders>
+              <w:top w:val="single" w:color="000000" w:sz="4"/>
+              <w:left w:val="single" w:color="000000" w:sz="4"/>
+              <w:bottom w:val="single" w:color="000000" w:sz="4"/>
+              <w:right w:val="single" w:color="000000" w:sz="4"/>
+            </w:tcBorders>
+            <w:shd w:fill="FFFFFF" w:val="clear"/>
+            <w:tcMar>
+              <w:top w:type="dxa" w:w="60"/>
+              <w:left w:type="dxa" w:w="100"/>
+              <w:bottom w:type="dxa" w:w="60"/>
+              <w:right w:type="dxa" w:w="100"/>
+            </w:tcMar>
+          </w:tcPr>
+          <w:p>
+            <w:r>
+              <w:rPr>
+                <w:rFonts w:ascii="Calibri" w:cs="Calibri" w:eastAsia="Calibri" w:hAnsi="Calibri"/>
+                <w:b/>
+                <w:bCs/>
+              </w:rPr>
+              <w:t xml:space="preserve">Verdadero positivo</w:t>
+            </w:r>
+          </w:p>
+        </w:tc>
+        <w:tc>
+          <w:tcPr>
+            <w:tcW w:type="dxa" w:w="2400"/>
+            <w:tcBorders>
+              <w:top w:val="single" w:color="000000" w:sz="4"/>
+              <w:left w:val="single" w:color="000000" w:sz="4"/>
+              <w:bottom w:val="single" w:color="000000" w:sz="4"/>
+              <w:right w:val="single" w:color="000000" w:sz="4"/>
+            </w:tcBorders>
+            <w:shd w:fill="FFFFFF" w:val="clear"/>
+            <w:tcMar>
+              <w:top w:type="dxa" w:w="60"/>
+              <w:left w:type="dxa" w:w="100"/>
+              <w:bottom w:type="dxa" w:w="60"/>
+              <w:right w:type="dxa" w:w="100"/>
+            </w:tcMar>
+          </w:tcPr>
+          <w:p>
+            <w:r>
+              <w:rPr>
+                <w:rFonts w:ascii="Calibri" w:cs="Calibri" w:eastAsia="Calibri" w:hAnsi="Calibri"/>
+              </w:rPr>
+              <w:t xml:space="preserve">Sí</w:t>
+            </w:r>
+          </w:p>
+        </w:tc>
+        <w:tc>
+          <w:tcPr>
+            <w:tcW w:type="dxa" w:w="4660"/>
+            <w:tcBorders>
+              <w:top w:val="single" w:color="000000" w:sz="4"/>
+              <w:left w:val="single" w:color="000000" w:sz="4"/>
+              <w:bottom w:val="single" w:color="000000" w:sz="4"/>
+              <w:right w:val="single" w:color="000000" w:sz="4"/>
+            </w:tcBorders>
+            <w:shd w:fill="FFFFFF" w:val="clear"/>
+            <w:tcMar>
+              <w:top w:type="dxa" w:w="60"/>
+              <w:left w:type="dxa" w:w="100"/>
+              <w:bottom w:type="dxa" w:w="60"/>
+              <w:right w:type="dxa" w:w="100"/>
+            </w:tcMar>
+          </w:tcPr>
+          <w:p>
+            <w:r>
+              <w:rPr>
+                <w:rFonts w:ascii="Calibri" w:cs="Calibri" w:eastAsia="Calibri" w:hAnsi="Calibri"/>
+              </w:rPr>
+              <w:t xml:space="preserve">Se verificó que la alerta es un incidente de seguridad real</w:t>
+            </w:r>
+          </w:p>
+        </w:tc>
+      </w:tr>
+      <w:tr>
+        <w:tc>
+          <w:tcPr>
+            <w:tcW w:type="dxa" w:w="2300"/>
+            <w:tcBorders>
+              <w:top w:val="single" w:color="000000" w:sz="4"/>
+              <w:left w:val="single" w:color="000000" w:sz="4"/>
+              <w:bottom w:val="single" w:color="000000" w:sz="4"/>
+              <w:right w:val="single" w:color="000000" w:sz="4"/>
+            </w:tcBorders>
+            <w:shd w:fill="FFFFFF" w:val="clear"/>
+            <w:tcMar>
+              <w:top w:type="dxa" w:w="60"/>
+              <w:left w:type="dxa" w:w="100"/>
+              <w:bottom w:type="dxa" w:w="60"/>
+              <w:right w:type="dxa" w:w="100"/>
+            </w:tcMar>
+          </w:tcPr>
+          <w:p>
+            <w:r>
+              <w:rPr>
+                <w:rFonts w:ascii="Calibri" w:cs="Calibri" w:eastAsia="Calibri" w:hAnsi="Calibri"/>
+                <w:b/>
+                <w:bCs/>
+              </w:rPr>
+              <w:t xml:space="preserve">Falso positivo</w:t>
+            </w:r>
+          </w:p>
+        </w:tc>
+        <w:tc>
+          <w:tcPr>
+            <w:tcW w:type="dxa" w:w="2400"/>
+            <w:tcBorders>
+              <w:top w:val="single" w:color="000000" w:sz="4"/>
+              <w:left w:val="single" w:color="000000" w:sz="4"/>
+              <w:bottom w:val="single" w:color="000000" w:sz="4"/>
+              <w:right w:val="single" w:color="000000" w:sz="4"/>
+            </w:tcBorders>
+            <w:shd w:fill="FFFFFF" w:val="clear"/>
+            <w:tcMar>
+              <w:top w:type="dxa" w:w="60"/>
+              <w:left w:type="dxa" w:w="100"/>
+              <w:bottom w:type="dxa" w:w="60"/>
+              <w:right w:type="dxa" w:w="100"/>
+            </w:tcMar>
+          </w:tcPr>
+          <w:p>
+            <w:r>
+              <w:rPr>
+                <w:rFonts w:ascii="Calibri" w:cs="Calibri" w:eastAsia="Calibri" w:hAnsi="Calibri"/>
+              </w:rPr>
+              <w:t xml:space="preserve">Sí</w:t>
+            </w:r>
+          </w:p>
+        </w:tc>
+        <w:tc>
+          <w:tcPr>
+            <w:tcW w:type="dxa" w:w="4660"/>
+            <w:tcBorders>
+              <w:top w:val="single" w:color="000000" w:sz="4"/>
+              <w:left w:val="single" w:color="000000" w:sz="4"/>
+              <w:bottom w:val="single" w:color="000000" w:sz="4"/>
+              <w:right w:val="single" w:color="000000" w:sz="4"/>
+            </w:tcBorders>
+            <w:shd w:fill="FFFFFF" w:val="clear"/>
+            <w:tcMar>
+              <w:top w:type="dxa" w:w="60"/>
+              <w:left w:type="dxa" w:w="100"/>
+              <w:bottom w:type="dxa" w:w="60"/>
+              <w:right w:type="dxa" w:w="100"/>
+            </w:tcMar>
+          </w:tcPr>
+          <w:p>
+            <w:r>
+              <w:rPr>
+                <w:rFonts w:ascii="Calibri" w:cs="Calibri" w:eastAsia="Calibri" w:hAnsi="Calibri"/>
+              </w:rPr>
+              <w:t xml:space="preserve">La alerta </w:t>
+            </w:r>
+            <w:r>
+              <w:rPr>
+                <w:rFonts w:ascii="Calibri" w:cs="Calibri" w:eastAsia="Calibri" w:hAnsi="Calibri"/>
+                <w:b/>
+                <w:bCs/>
+              </w:rPr>
+              <w:t xml:space="preserve">no</w:t>
+            </w:r>
+            <w:r>
+              <w:rPr>
+                <w:rFonts w:ascii="Calibri" w:cs="Calibri" w:eastAsia="Calibri" w:hAnsi="Calibri"/>
+              </w:rPr>
+              <w:t xml:space="preserve"> indica un incidente de seguridad: no se produjo un ataque</w:t>
+            </w:r>
+          </w:p>
+        </w:tc>
+      </w:tr>
+      <w:tr>
+        <w:tc>
+          <w:tcPr>
+            <w:tcW w:type="dxa" w:w="2300"/>
+            <w:tcBorders>
+              <w:top w:val="single" w:color="000000" w:sz="4"/>
+              <w:left w:val="single" w:color="000000" w:sz="4"/>
+              <w:bottom w:val="single" w:color="000000" w:sz="4"/>
+              <w:right w:val="single" w:color="000000" w:sz="4"/>
+            </w:tcBorders>
+            <w:shd w:fill="FFFFFF" w:val="clear"/>
+            <w:tcMar>
+              <w:top w:type="dxa" w:w="60"/>
+              <w:left w:type="dxa" w:w="100"/>
+              <w:bottom w:type="dxa" w:w="60"/>
+              <w:right w:type="dxa" w:w="100"/>
+            </w:tcMar>
+          </w:tcPr>
+          <w:p>
+            <w:r>
+              <w:rPr>
+                <w:rFonts w:ascii="Calibri" w:cs="Calibri" w:eastAsia="Calibri" w:hAnsi="Calibri"/>
+                <w:b/>
+                <w:bCs/>
+              </w:rPr>
+              <w:t xml:space="preserve">Verdadero negativo</w:t>
+            </w:r>
+          </w:p>
+        </w:tc>
+        <w:tc>
+          <w:tcPr>
+            <w:tcW w:type="dxa" w:w="2400"/>
+            <w:tcBorders>
+              <w:top w:val="single" w:color="000000" w:sz="4"/>
+              <w:left w:val="single" w:color="000000" w:sz="4"/>
+              <w:bottom w:val="single" w:color="000000" w:sz="4"/>
+              <w:right w:val="single" w:color="000000" w:sz="4"/>
+            </w:tcBorders>
+            <w:shd w:fill="FFFFFF" w:val="clear"/>
+            <w:tcMar>
+              <w:top w:type="dxa" w:w="60"/>
+              <w:left w:type="dxa" w:w="100"/>
+              <w:bottom w:type="dxa" w:w="60"/>
+              <w:right w:type="dxa" w:w="100"/>
+            </w:tcMar>
+          </w:tcPr>
+          <w:p>
+            <w:r>
+              <w:rPr>
+                <w:rFonts w:ascii="Calibri" w:cs="Calibri" w:eastAsia="Calibri" w:hAnsi="Calibri"/>
+              </w:rPr>
+              <w:t xml:space="preserve">No</w:t>
+            </w:r>
+          </w:p>
+        </w:tc>
+        <w:tc>
+          <w:tcPr>
+            <w:tcW w:type="dxa" w:w="4660"/>
+            <w:tcBorders>
+              <w:top w:val="single" w:color="000000" w:sz="4"/>
+              <w:left w:val="single" w:color="000000" w:sz="4"/>
+              <w:bottom w:val="single" w:color="000000" w:sz="4"/>
+              <w:right w:val="single" w:color="000000" w:sz="4"/>
+            </w:tcBorders>
+            <w:shd w:fill="FFFFFF" w:val="clear"/>
+            <w:tcMar>
+              <w:top w:type="dxa" w:w="60"/>
+              <w:left w:type="dxa" w:w="100"/>
+              <w:bottom w:type="dxa" w:w="60"/>
+              <w:right w:type="dxa" w:w="100"/>
+            </w:tcMar>
+          </w:tcPr>
+          <w:p>
+            <w:r>
+              <w:rPr>
+                <w:rFonts w:ascii="Calibri" w:cs="Calibri" w:eastAsia="Calibri" w:hAnsi="Calibri"/>
+              </w:rPr>
+              <w:t xml:space="preserve">No se produjo ningún incidente de seguridad. La actividad es benigna</w:t>
+            </w:r>
+          </w:p>
+        </w:tc>
+      </w:tr>
+      <w:tr>
+        <w:tc>
+          <w:tcPr>
+            <w:tcW w:type="dxa" w:w="2300"/>
+            <w:tcBorders>
+              <w:top w:val="single" w:color="000000" w:sz="4"/>
+              <w:left w:val="single" w:color="000000" w:sz="4"/>
+              <w:bottom w:val="single" w:color="000000" w:sz="4"/>
+              <w:right w:val="single" w:color="000000" w:sz="4"/>
+            </w:tcBorders>
+            <w:shd w:fill="FFFFFF" w:val="clear"/>
+            <w:tcMar>
+              <w:top w:type="dxa" w:w="60"/>
+              <w:left w:type="dxa" w:w="100"/>
+              <w:bottom w:type="dxa" w:w="60"/>
+              <w:right w:type="dxa" w:w="100"/>
+            </w:tcMar>
+          </w:tcPr>
+          <w:p>
+            <w:r>
+              <w:rPr>
+                <w:rFonts w:ascii="Calibri" w:cs="Calibri" w:eastAsia="Calibri" w:hAnsi="Calibri"/>
+                <w:b/>
+                <w:bCs/>
+              </w:rPr>
+              <w:t xml:space="preserve">Falso negativo</w:t>
+            </w:r>
+          </w:p>
+        </w:tc>
+        <w:tc>
+          <w:tcPr>
+            <w:tcW w:type="dxa" w:w="2400"/>
+            <w:tcBorders>
+              <w:top w:val="single" w:color="000000" w:sz="4"/>
+              <w:left w:val="single" w:color="000000" w:sz="4"/>
+              <w:bottom w:val="single" w:color="000000" w:sz="4"/>
+              <w:right w:val="single" w:color="000000" w:sz="4"/>
+            </w:tcBorders>
+            <w:shd w:fill="FFFFFF" w:val="clear"/>
+            <w:tcMar>
+              <w:top w:type="dxa" w:w="60"/>
+              <w:left w:type="dxa" w:w="100"/>
+              <w:bottom w:type="dxa" w:w="60"/>
+              <w:right w:type="dxa" w:w="100"/>
+            </w:tcMar>
+          </w:tcPr>
+          <w:p>
+            <w:r>
+              <w:rPr>
+                <w:rFonts w:ascii="Calibri" w:cs="Calibri" w:eastAsia="Calibri" w:hAnsi="Calibri"/>
+              </w:rPr>
+              <w:t xml:space="preserve">No</w:t>
+            </w:r>
+          </w:p>
+        </w:tc>
+        <w:tc>
+          <w:tcPr>
+            <w:tcW w:type="dxa" w:w="4660"/>
+            <w:tcBorders>
+              <w:top w:val="single" w:color="000000" w:sz="4"/>
+              <w:left w:val="single" w:color="000000" w:sz="4"/>
+              <w:bottom w:val="single" w:color="000000" w:sz="4"/>
+              <w:right w:val="single" w:color="000000" w:sz="4"/>
+            </w:tcBorders>
+            <w:shd w:fill="FFFFFF" w:val="clear"/>
+            <w:tcMar>
+              <w:top w:type="dxa" w:w="60"/>
+              <w:left w:type="dxa" w:w="100"/>
+              <w:bottom w:type="dxa" w:w="60"/>
+              <w:right w:type="dxa" w:w="100"/>
+            </w:tcMar>
+          </w:tcPr>
+          <w:p>
+            <w:r>
+              <w:rPr>
+                <w:rFonts w:ascii="Calibri" w:cs="Calibri" w:eastAsia="Calibri" w:hAnsi="Calibri"/>
+              </w:rPr>
+              <w:t xml:space="preserve">Un incidente </w:t>
+            </w:r>
+            <w:r>
+              <w:rPr>
+                <w:rFonts w:ascii="Calibri" w:cs="Calibri" w:eastAsia="Calibri" w:hAnsi="Calibri"/>
+                <w:b/>
+                <w:bCs/>
+              </w:rPr>
+              <w:t xml:space="preserve">no se detectó</w:t>
+            </w:r>
+            <w:r>
+              <w:rPr>
+                <w:rFonts w:ascii="Calibri" w:cs="Calibri" w:eastAsia="Calibri" w:hAnsi="Calibri"/>
+              </w:rPr>
+              <w:t xml:space="preserve"> pero sí ocurrió</w:t>
+            </w:r>
+          </w:p>
+        </w:tc>
+      </w:tr>
+    </w:tbl>
+    <w:p>
+      <w:pPr>
+        <w:spacing w:after="80"/>
+      </w:pPr>
+    </w:p>
+    <w:p>
+      <w:pPr>
+        <w:pStyle w:val="ListParagraph"/>
+        <w:numPr>
+          <w:ilvl w:val="0"/>
+          <w:numId w:val="2"/>
+        </w:numPr>
+        <w:spacing w:after="60"/>
+      </w:pPr>
+      <w:r>
+        <w:rPr>
+          <w:rFonts w:ascii="Calibri" w:cs="Calibri" w:eastAsia="Calibri" w:hAnsi="Calibri"/>
+        </w:rPr>
+        <w:t xml:space="preserve">Los </w:t>
+      </w:r>
+      <w:r>
+        <w:rPr>
+          <w:rFonts w:ascii="Calibri" w:cs="Calibri" w:eastAsia="Calibri" w:hAnsi="Calibri"/>
+          <w:b/>
+          <w:bCs/>
+        </w:rPr>
+        <w:t xml:space="preserve">verdaderos positivos</w:t>
+      </w:r>
+      <w:r>
+        <w:rPr>
+          <w:rFonts w:ascii="Calibri" w:cs="Calibri" w:eastAsia="Calibri" w:hAnsi="Calibri"/>
+        </w:rPr>
+        <w:t xml:space="preserve"> y los </w:t>
+      </w:r>
+      <w:r>
+        <w:rPr>
+          <w:rFonts w:ascii="Calibri" w:cs="Calibri" w:eastAsia="Calibri" w:hAnsi="Calibri"/>
+          <w:b/>
+          <w:bCs/>
+        </w:rPr>
+        <w:t xml:space="preserve">verdaderos negativos</w:t>
+      </w:r>
+      <w:r>
+        <w:rPr>
+          <w:rFonts w:ascii="Calibri" w:cs="Calibri" w:eastAsia="Calibri" w:hAnsi="Calibri"/>
+        </w:rPr>
+        <w:t xml:space="preserve"> son deseables.</w:t>
+      </w:r>
+    </w:p>
+    <w:p>
+      <w:pPr>
+        <w:pStyle w:val="ListParagraph"/>
+        <w:numPr>
+          <w:ilvl w:val="0"/>
+          <w:numId w:val="2"/>
+        </w:numPr>
+        <w:spacing w:after="60"/>
+      </w:pPr>
+      <w:r>
+        <w:rPr>
+          <w:rFonts w:ascii="Calibri" w:cs="Calibri" w:eastAsia="Calibri" w:hAnsi="Calibri"/>
+        </w:rPr>
+        <w:t xml:space="preserve">Los </w:t>
+      </w:r>
+      <w:r>
+        <w:rPr>
+          <w:rFonts w:ascii="Calibri" w:cs="Calibri" w:eastAsia="Calibri" w:hAnsi="Calibri"/>
+          <w:b/>
+          <w:bCs/>
+        </w:rPr>
+        <w:t xml:space="preserve">falsos positivos</w:t>
+      </w:r>
+      <w:r>
+        <w:rPr>
+          <w:rFonts w:ascii="Calibri" w:cs="Calibri" w:eastAsia="Calibri" w:hAnsi="Calibri"/>
+        </w:rPr>
+        <w:t xml:space="preserve"> no son deseables, pero son inevitables.</w:t>
+      </w:r>
+    </w:p>
+    <w:p>
+      <w:pPr>
+        <w:pStyle w:val="ListParagraph"/>
+        <w:numPr>
+          <w:ilvl w:val="0"/>
+          <w:numId w:val="2"/>
+        </w:numPr>
+        <w:spacing w:after="60"/>
+      </w:pPr>
+      <w:r>
+        <w:rPr>
+          <w:rFonts w:ascii="Calibri" w:cs="Calibri" w:eastAsia="Calibri" w:hAnsi="Calibri"/>
+        </w:rPr>
+        <w:t xml:space="preserve">Los </w:t>
+      </w:r>
+      <w:r>
+        <w:rPr>
+          <w:rFonts w:ascii="Calibri" w:cs="Calibri" w:eastAsia="Calibri" w:hAnsi="Calibri"/>
+          <w:b/>
+          <w:bCs/>
+        </w:rPr>
+        <w:t xml:space="preserve">falsos negativos</w:t>
+      </w:r>
+      <w:r>
+        <w:rPr>
+          <w:rFonts w:ascii="Calibri" w:cs="Calibri" w:eastAsia="Calibri" w:hAnsi="Calibri"/>
+        </w:rPr>
+        <w:t xml:space="preserve"> son </w:t>
+      </w:r>
+      <w:r>
+        <w:rPr>
+          <w:rFonts w:ascii="Calibri" w:cs="Calibri" w:eastAsia="Calibri" w:hAnsi="Calibri"/>
+          <w:b/>
+          <w:bCs/>
+        </w:rPr>
+        <w:t xml:space="preserve">peligrosos</w:t>
+      </w:r>
+      <w:r>
+        <w:rPr>
+          <w:rFonts w:ascii="Calibri" w:cs="Calibri" w:eastAsia="Calibri" w:hAnsi="Calibri"/>
+        </w:rPr>
+        <w:t xml:space="preserve">.</w:t>
+      </w:r>
+    </w:p>
+    <w:p>
+      <w:pPr>
+        <w:spacing w:after="80" w:before="160"/>
+      </w:pPr>
+      <w:r>
+        <w:rPr>
+          <w:rFonts w:ascii="Calibri" w:cs="Calibri" w:eastAsia="Calibri" w:hAnsi="Calibri"/>
+          <w:b/>
+          <w:bCs/>
+        </w:rPr>
+        <w:t xml:space="preserve">Análisis de riesgo</w:t>
+      </w:r>
+    </w:p>
+    <w:p>
+      <w:pPr>
+        <w:pStyle w:val="ListParagraph"/>
+        <w:numPr>
+          <w:ilvl w:val="0"/>
+          <w:numId w:val="2"/>
+        </w:numPr>
+        <w:spacing w:after="60"/>
+      </w:pPr>
+      <w:r>
+        <w:rPr>
+          <w:rFonts w:ascii="Calibri" w:cs="Calibri" w:eastAsia="Calibri" w:hAnsi="Calibri"/>
+        </w:rPr>
+        <w:t xml:space="preserve">Se pueden usar técnicas estadísticas para evaluar el riesgo de que los ataques tengan éxito en una red. Ayuda a quienes toman decisiones a evaluar el costo de mitigar una amenaza respecto al daño que podría causar un ataque.</w:t>
+      </w:r>
+    </w:p>
+    <w:tbl>
+      <w:tblPr>
+        <w:tblW w:type="dxa" w:w="9360"/>
+        <w:tblBorders>
+          <w:top w:val="single" w:color="auto" w:sz="4"/>
+          <w:left w:val="single" w:color="auto" w:sz="4"/>
+          <w:bottom w:val="single" w:color="auto" w:sz="4"/>
+          <w:right w:val="single" w:color="auto" w:sz="4"/>
+          <w:insideH w:val="single" w:color="auto" w:sz="4"/>
+          <w:insideV w:val="single" w:color="auto" w:sz="4"/>
+        </w:tblBorders>
+      </w:tblPr>
+      <w:tblGrid>
+        <w:gridCol w:w="2400"/>
+        <w:gridCol w:w="3480"/>
+        <w:gridCol w:w="3480"/>
+      </w:tblGrid>
+      <w:tr>
+        <w:trPr>
+          <w:tblHeader/>
+        </w:trPr>
+        <w:tc>
+          <w:tcPr>
+            <w:tcW w:type="dxa" w:w="2400"/>
+            <w:tcBorders>
+              <w:top w:val="single" w:color="000000" w:sz="4"/>
+              <w:left w:val="single" w:color="000000" w:sz="4"/>
+              <w:bottom w:val="single" w:color="000000" w:sz="4"/>
+              <w:right w:val="single" w:color="000000" w:sz="4"/>
+            </w:tcBorders>
+            <w:shd w:fill="D9D9D9" w:val="clear"/>
+            <w:tcMar>
+              <w:top w:type="dxa" w:w="60"/>
+              <w:left w:type="dxa" w:w="100"/>
+              <w:bottom w:type="dxa" w:w="60"/>
+              <w:right w:type="dxa" w:w="100"/>
+            </w:tcMar>
+          </w:tcPr>
+          <w:p/>
+        </w:tc>
+        <w:tc>
+          <w:tcPr>
+            <w:tcW w:type="dxa" w:w="3480"/>
+            <w:tcBorders>
+              <w:top w:val="single" w:color="000000" w:sz="4"/>
+              <w:left w:val="single" w:color="000000" w:sz="4"/>
+              <w:bottom w:val="single" w:color="000000" w:sz="4"/>
+              <w:right w:val="single" w:color="000000" w:sz="4"/>
+            </w:tcBorders>
+            <w:shd w:fill="D9D9D9" w:val="clear"/>
+            <w:tcMar>
+              <w:top w:type="dxa" w:w="60"/>
+              <w:left w:type="dxa" w:w="100"/>
+              <w:bottom w:type="dxa" w:w="60"/>
+              <w:right w:type="dxa" w:w="100"/>
+            </w:tcMar>
+          </w:tcPr>
+          <w:p>
+            <w:r>
+              <w:rPr>
+                <w:rFonts w:ascii="Calibri" w:cs="Calibri" w:eastAsia="Calibri" w:hAnsi="Calibri"/>
+                <w:b/>
+                <w:bCs/>
+                <w:color w:val="000000"/>
+              </w:rPr>
+              <w:t xml:space="preserve">Análisis determinístico</w:t>
+            </w:r>
+          </w:p>
+        </w:tc>
+        <w:tc>
+          <w:tcPr>
+            <w:tcW w:type="dxa" w:w="3480"/>
+            <w:tcBorders>
+              <w:top w:val="single" w:color="000000" w:sz="4"/>
+              <w:left w:val="single" w:color="000000" w:sz="4"/>
+              <w:bottom w:val="single" w:color="000000" w:sz="4"/>
+              <w:right w:val="single" w:color="000000" w:sz="4"/>
+            </w:tcBorders>
+            <w:shd w:fill="D9D9D9" w:val="clear"/>
+            <w:tcMar>
+              <w:top w:type="dxa" w:w="60"/>
+              <w:left w:type="dxa" w:w="100"/>
+              <w:bottom w:type="dxa" w:w="60"/>
+              <w:right w:type="dxa" w:w="100"/>
+            </w:tcMar>
+          </w:tcPr>
+          <w:p>
+            <w:r>
+              <w:rPr>
+                <w:rFonts w:ascii="Calibri" w:cs="Calibri" w:eastAsia="Calibri" w:hAnsi="Calibri"/>
+                <w:b/>
+                <w:bCs/>
+                <w:color w:val="000000"/>
+              </w:rPr>
+              <w:t xml:space="preserve">Análisis probabilístico</w:t>
+            </w:r>
+          </w:p>
+        </w:tc>
+      </w:tr>
+      <w:tr>
+        <w:tc>
+          <w:tcPr>
+            <w:tcW w:type="dxa" w:w="2400"/>
+            <w:tcBorders>
+              <w:top w:val="single" w:color="000000" w:sz="4"/>
+              <w:left w:val="single" w:color="000000" w:sz="4"/>
+              <w:bottom w:val="single" w:color="000000" w:sz="4"/>
+              <w:right w:val="single" w:color="000000" w:sz="4"/>
+            </w:tcBorders>
+            <w:shd w:fill="FFFFFF" w:val="clear"/>
+            <w:tcMar>
+              <w:top w:type="dxa" w:w="60"/>
+              <w:left w:type="dxa" w:w="100"/>
+              <w:bottom w:type="dxa" w:w="60"/>
+              <w:right w:type="dxa" w:w="100"/>
+            </w:tcMar>
+          </w:tcPr>
+          <w:p>
+            <w:r>
+              <w:rPr>
+                <w:rFonts w:ascii="Calibri" w:cs="Calibri" w:eastAsia="Calibri" w:hAnsi="Calibri"/>
+                <w:b/>
+                <w:bCs/>
+              </w:rPr>
+              <w:t xml:space="preserve">Qué evalúa</w:t>
+            </w:r>
+          </w:p>
+        </w:tc>
+        <w:tc>
+          <w:tcPr>
+            <w:tcW w:type="dxa" w:w="3480"/>
+            <w:tcBorders>
+              <w:top w:val="single" w:color="000000" w:sz="4"/>
+              <w:left w:val="single" w:color="000000" w:sz="4"/>
+              <w:bottom w:val="single" w:color="000000" w:sz="4"/>
+              <w:right w:val="single" w:color="000000" w:sz="4"/>
+            </w:tcBorders>
+            <w:shd w:fill="FFFFFF" w:val="clear"/>
+            <w:tcMar>
+              <w:top w:type="dxa" w:w="60"/>
+              <w:left w:type="dxa" w:w="100"/>
+              <w:bottom w:type="dxa" w:w="60"/>
+              <w:right w:type="dxa" w:w="100"/>
+            </w:tcMar>
+          </w:tcPr>
+          <w:p>
+            <w:r>
+              <w:rPr>
+                <w:rFonts w:ascii="Calibri" w:cs="Calibri" w:eastAsia="Calibri" w:hAnsi="Calibri"/>
+              </w:rPr>
+              <w:t xml:space="preserve">El riesgo según lo que se conoce de una </w:t>
+            </w:r>
+            <w:r>
+              <w:rPr>
+                <w:rFonts w:ascii="Calibri" w:cs="Calibri" w:eastAsia="Calibri" w:hAnsi="Calibri"/>
+                <w:b/>
+                <w:bCs/>
+              </w:rPr>
+              <w:t xml:space="preserve">vulnerabilidad</w:t>
+            </w:r>
+          </w:p>
+        </w:tc>
+        <w:tc>
+          <w:tcPr>
+            <w:tcW w:type="dxa" w:w="3480"/>
+            <w:tcBorders>
+              <w:top w:val="single" w:color="000000" w:sz="4"/>
+              <w:left w:val="single" w:color="000000" w:sz="4"/>
+              <w:bottom w:val="single" w:color="000000" w:sz="4"/>
+              <w:right w:val="single" w:color="000000" w:sz="4"/>
+            </w:tcBorders>
+            <w:shd w:fill="FFFFFF" w:val="clear"/>
+            <w:tcMar>
+              <w:top w:type="dxa" w:w="60"/>
+              <w:left w:type="dxa" w:w="100"/>
+              <w:bottom w:type="dxa" w:w="60"/>
+              <w:right w:type="dxa" w:w="100"/>
+            </w:tcMar>
+          </w:tcPr>
+          <w:p>
+            <w:r>
+              <w:rPr>
+                <w:rFonts w:ascii="Calibri" w:cs="Calibri" w:eastAsia="Calibri" w:hAnsi="Calibri"/>
+              </w:rPr>
+              <w:t xml:space="preserve">El éxito potencial de un ataque, calculando la </w:t>
+            </w:r>
+            <w:r>
+              <w:rPr>
+                <w:rFonts w:ascii="Calibri" w:cs="Calibri" w:eastAsia="Calibri" w:hAnsi="Calibri"/>
+                <w:b/>
+                <w:bCs/>
+              </w:rPr>
+              <w:t xml:space="preserve">probabilidad</w:t>
+            </w:r>
+            <w:r>
+              <w:rPr>
+                <w:rFonts w:ascii="Calibri" w:cs="Calibri" w:eastAsia="Calibri" w:hAnsi="Calibri"/>
+              </w:rPr>
+              <w:t xml:space="preserve"> de que, si un paso concluye con éxito, el siguiente también lo haga</w:t>
+            </w:r>
+          </w:p>
+        </w:tc>
+      </w:tr>
+      <w:tr>
+        <w:tc>
+          <w:tcPr>
+            <w:tcW w:type="dxa" w:w="2400"/>
+            <w:tcBorders>
+              <w:top w:val="single" w:color="000000" w:sz="4"/>
+              <w:left w:val="single" w:color="000000" w:sz="4"/>
+              <w:bottom w:val="single" w:color="000000" w:sz="4"/>
+              <w:right w:val="single" w:color="000000" w:sz="4"/>
+            </w:tcBorders>
+            <w:shd w:fill="FFFFFF" w:val="clear"/>
+            <w:tcMar>
+              <w:top w:type="dxa" w:w="60"/>
+              <w:left w:type="dxa" w:w="100"/>
+              <w:bottom w:type="dxa" w:w="60"/>
+              <w:right w:type="dxa" w:w="100"/>
+            </w:tcMar>
+          </w:tcPr>
+          <w:p>
+            <w:r>
+              <w:rPr>
+                <w:rFonts w:ascii="Calibri" w:cs="Calibri" w:eastAsia="Calibri" w:hAnsi="Calibri"/>
+                <w:b/>
+                <w:bCs/>
+              </w:rPr>
+              <w:t xml:space="preserve">Supuesto</w:t>
+            </w:r>
+          </w:p>
+        </w:tc>
+        <w:tc>
+          <w:tcPr>
+            <w:tcW w:type="dxa" w:w="3480"/>
+            <w:tcBorders>
+              <w:top w:val="single" w:color="000000" w:sz="4"/>
+              <w:left w:val="single" w:color="000000" w:sz="4"/>
+              <w:bottom w:val="single" w:color="000000" w:sz="4"/>
+              <w:right w:val="single" w:color="000000" w:sz="4"/>
+            </w:tcBorders>
+            <w:shd w:fill="FFFFFF" w:val="clear"/>
+            <w:tcMar>
+              <w:top w:type="dxa" w:w="60"/>
+              <w:left w:type="dxa" w:w="100"/>
+              <w:bottom w:type="dxa" w:w="60"/>
+              <w:right w:type="dxa" w:w="100"/>
+            </w:tcMar>
+          </w:tcPr>
+          <w:p>
+            <w:r>
+              <w:rPr>
+                <w:rFonts w:ascii="Calibri" w:cs="Calibri" w:eastAsia="Calibri" w:hAnsi="Calibri"/>
+              </w:rPr>
+              <w:t xml:space="preserve">Para que un ataque tenga éxito, </w:t>
+            </w:r>
+            <w:r>
+              <w:rPr>
+                <w:rFonts w:ascii="Calibri" w:cs="Calibri" w:eastAsia="Calibri" w:hAnsi="Calibri"/>
+                <w:b/>
+                <w:bCs/>
+              </w:rPr>
+              <w:t xml:space="preserve">todos los pasos anteriores</w:t>
+            </w:r>
+            <w:r>
+              <w:rPr>
+                <w:rFonts w:ascii="Calibri" w:cs="Calibri" w:eastAsia="Calibri" w:hAnsi="Calibri"/>
+              </w:rPr>
+              <w:t xml:space="preserve"> también deben tener éxito</w:t>
+            </w:r>
+          </w:p>
+        </w:tc>
+        <w:tc>
+          <w:tcPr>
+            <w:tcW w:type="dxa" w:w="3480"/>
+            <w:tcBorders>
+              <w:top w:val="single" w:color="000000" w:sz="4"/>
+              <w:left w:val="single" w:color="000000" w:sz="4"/>
+              <w:bottom w:val="single" w:color="000000" w:sz="4"/>
+              <w:right w:val="single" w:color="000000" w:sz="4"/>
+            </w:tcBorders>
+            <w:shd w:fill="FFFFFF" w:val="clear"/>
+            <w:tcMar>
+              <w:top w:type="dxa" w:w="60"/>
+              <w:left w:type="dxa" w:w="100"/>
+              <w:bottom w:type="dxa" w:w="60"/>
+              <w:right w:type="dxa" w:w="100"/>
+            </w:tcMar>
+          </w:tcPr>
+          <w:p>
+            <w:r>
+              <w:rPr>
+                <w:rFonts w:ascii="Calibri" w:cs="Calibri" w:eastAsia="Calibri" w:hAnsi="Calibri"/>
+              </w:rPr>
+              <w:t xml:space="preserve">Cada paso tiene su probabilidad</w:t>
+            </w:r>
+          </w:p>
+        </w:tc>
+      </w:tr>
+      <w:tr>
+        <w:tc>
+          <w:tcPr>
+            <w:tcW w:type="dxa" w:w="2400"/>
+            <w:tcBorders>
+              <w:top w:val="single" w:color="000000" w:sz="4"/>
+              <w:left w:val="single" w:color="000000" w:sz="4"/>
+              <w:bottom w:val="single" w:color="000000" w:sz="4"/>
+              <w:right w:val="single" w:color="000000" w:sz="4"/>
+            </w:tcBorders>
+            <w:shd w:fill="FFFFFF" w:val="clear"/>
+            <w:tcMar>
+              <w:top w:type="dxa" w:w="60"/>
+              <w:left w:type="dxa" w:w="100"/>
+              <w:bottom w:type="dxa" w:w="60"/>
+              <w:right w:type="dxa" w:w="100"/>
+            </w:tcMar>
+          </w:tcPr>
+          <w:p>
+            <w:r>
+              <w:rPr>
+                <w:rFonts w:ascii="Calibri" w:cs="Calibri" w:eastAsia="Calibri" w:hAnsi="Calibri"/>
+                <w:b/>
+                <w:bCs/>
+              </w:rPr>
+              <w:t xml:space="preserve">Resultado / uso</w:t>
+            </w:r>
+          </w:p>
+        </w:tc>
+        <w:tc>
+          <w:tcPr>
+            <w:tcW w:type="dxa" w:w="3480"/>
+            <w:tcBorders>
+              <w:top w:val="single" w:color="000000" w:sz="4"/>
+              <w:left w:val="single" w:color="000000" w:sz="4"/>
+              <w:bottom w:val="single" w:color="000000" w:sz="4"/>
+              <w:right w:val="single" w:color="000000" w:sz="4"/>
+            </w:tcBorders>
+            <w:shd w:fill="FFFFFF" w:val="clear"/>
+            <w:tcMar>
+              <w:top w:type="dxa" w:w="60"/>
+              <w:left w:type="dxa" w:w="100"/>
+              <w:bottom w:type="dxa" w:w="60"/>
+              <w:right w:type="dxa" w:w="100"/>
+            </w:tcMar>
+          </w:tcPr>
+          <w:p>
+            <w:r>
+              <w:rPr>
+                <w:rFonts w:ascii="Calibri" w:cs="Calibri" w:eastAsia="Calibri" w:hAnsi="Calibri"/>
+              </w:rPr>
+              <w:t xml:space="preserve">Puede describir </w:t>
+            </w:r>
+            <w:r>
+              <w:rPr>
+                <w:rFonts w:ascii="Calibri" w:cs="Calibri" w:eastAsia="Calibri" w:hAnsi="Calibri"/>
+                <w:b/>
+                <w:bCs/>
+              </w:rPr>
+              <w:t xml:space="preserve">el peor de los casos</w:t>
+            </w:r>
+          </w:p>
+        </w:tc>
+        <w:tc>
+          <w:tcPr>
+            <w:tcW w:type="dxa" w:w="3480"/>
+            <w:tcBorders>
+              <w:top w:val="single" w:color="000000" w:sz="4"/>
+              <w:left w:val="single" w:color="000000" w:sz="4"/>
+              <w:bottom w:val="single" w:color="000000" w:sz="4"/>
+              <w:right w:val="single" w:color="000000" w:sz="4"/>
+            </w:tcBorders>
+            <w:shd w:fill="FFFFFF" w:val="clear"/>
+            <w:tcMar>
+              <w:top w:type="dxa" w:w="60"/>
+              <w:left w:type="dxa" w:w="100"/>
+              <w:bottom w:type="dxa" w:w="60"/>
+              <w:right w:type="dxa" w:w="100"/>
+            </w:tcMar>
+          </w:tcPr>
+          <w:p>
+            <w:r>
+              <w:rPr>
+                <w:rFonts w:ascii="Calibri" w:cs="Calibri" w:eastAsia="Calibri" w:hAnsi="Calibri"/>
+              </w:rPr>
+              <w:t xml:space="preserve">Útil en el análisis de seguridad de la red </w:t>
+            </w:r>
+            <w:r>
+              <w:rPr>
+                <w:rFonts w:ascii="Calibri" w:cs="Calibri" w:eastAsia="Calibri" w:hAnsi="Calibri"/>
+                <w:b/>
+                <w:bCs/>
+              </w:rPr>
+              <w:t xml:space="preserve">en tiempo real</w:t>
+            </w:r>
+            <w:r>
+              <w:rPr>
+                <w:rFonts w:ascii="Calibri" w:cs="Calibri" w:eastAsia="Calibri" w:hAnsi="Calibri"/>
+              </w:rPr>
+              <w:t xml:space="preserve">, donde hay muchas variables y el atacante toma decisiones desconocidas mientras persigue un ataque</w:t>
+            </w:r>
+          </w:p>
+        </w:tc>
+      </w:tr>
+    </w:tbl>
+    <w:p>
+      <w:pPr>
+        <w:spacing w:after="80"/>
+      </w:pPr>
     </w:p>
     <w:sectPr>
       <w:pgSz w:w="12240" w:h="15840" w:orient="portrait"/>

</xml_diff>

<commit_message>
Agrega Módulo 22: Gestión y cumplimiento al resumen de módulos 19 en adelante
Co-Authored-By: Claude Sonnet 5.5 <noreply@anthropic.com>
Claude-Session: https://claude.ai/code/session_013iWwbBbHxw2c1QtKDe5PjZ
</commit_message>
<xml_diff>
--- a/Modulos_19_en_adelante_Resumen.docx
+++ b/Modulos_19_en_adelante_Resumen.docx
@@ -6781,6 +6781,2543 @@
         <w:spacing w:after="80"/>
       </w:pPr>
     </w:p>
+    <w:p>
+      <w:r>
+        <w:br w:type="page"/>
+      </w:r>
+    </w:p>
+    <w:p>
+      <w:pPr>
+        <w:spacing w:after="60"/>
+        <w:jc w:val="center"/>
+      </w:pPr>
+      <w:r>
+        <w:rPr>
+          <w:rFonts w:ascii="Calibri" w:cs="Calibri" w:eastAsia="Calibri" w:hAnsi="Calibri"/>
+          <w:b/>
+          <w:bCs/>
+          <w:color w:val="000000"/>
+          <w:sz w:val="24"/>
+          <w:szCs w:val="24"/>
+        </w:rPr>
+        <w:t xml:space="preserve">Módulo 22: Gestión y cumplimiento</w:t>
+      </w:r>
+    </w:p>
+    <w:p>
+      <w:pPr>
+        <w:spacing w:after="200"/>
+        <w:jc w:val="center"/>
+      </w:pPr>
+      <w:r>
+        <w:rPr>
+          <w:rFonts w:ascii="Calibri" w:cs="Calibri" w:eastAsia="Calibri" w:hAnsi="Calibri"/>
+          <w:color w:val="000000"/>
+          <w:sz w:val="24"/>
+          <w:szCs w:val="24"/>
+        </w:rPr>
+        <w:t xml:space="preserve">Resumen de ciberseguridad</w:t>
+      </w:r>
+    </w:p>
+    <w:p>
+      <w:pPr>
+        <w:spacing w:after="120" w:before="280"/>
+      </w:pPr>
+      <w:r>
+        <w:rPr>
+          <w:rFonts w:ascii="Calibri" w:cs="Calibri" w:eastAsia="Calibri" w:hAnsi="Calibri"/>
+          <w:b/>
+          <w:bCs/>
+        </w:rPr>
+        <w:t xml:space="preserve">1. Gobernanza</w:t>
+      </w:r>
+    </w:p>
+    <w:p>
+      <w:pPr>
+        <w:spacing w:after="80" w:before="160"/>
+      </w:pPr>
+      <w:r>
+        <w:rPr>
+          <w:rFonts w:ascii="Calibri" w:cs="Calibri" w:eastAsia="Calibri" w:hAnsi="Calibri"/>
+          <w:b/>
+          <w:bCs/>
+        </w:rPr>
+        <w:t xml:space="preserve">Gobernanza de seguridad de TI</w:t>
+      </w:r>
+    </w:p>
+    <w:p>
+      <w:pPr>
+        <w:pStyle w:val="ListParagraph"/>
+        <w:numPr>
+          <w:ilvl w:val="0"/>
+          <w:numId w:val="2"/>
+        </w:numPr>
+        <w:spacing w:after="60"/>
+      </w:pPr>
+      <w:r>
+        <w:rPr>
+          <w:rFonts w:ascii="Calibri" w:cs="Calibri" w:eastAsia="Calibri" w:hAnsi="Calibri"/>
+        </w:rPr>
+        <w:t xml:space="preserve">Determina </w:t>
+      </w:r>
+      <w:r>
+        <w:rPr>
+          <w:rFonts w:ascii="Calibri" w:cs="Calibri" w:eastAsia="Calibri" w:hAnsi="Calibri"/>
+          <w:b/>
+          <w:bCs/>
+        </w:rPr>
+        <w:t xml:space="preserve">quién está autorizado a tomar decisiones</w:t>
+      </w:r>
+      <w:r>
+        <w:rPr>
+          <w:rFonts w:ascii="Calibri" w:cs="Calibri" w:eastAsia="Calibri" w:hAnsi="Calibri"/>
+        </w:rPr>
+        <w:t xml:space="preserve"> sobre los riesgos de ciberseguridad dentro de una organización.</w:t>
+      </w:r>
+    </w:p>
+    <w:p>
+      <w:pPr>
+        <w:pStyle w:val="ListParagraph"/>
+        <w:numPr>
+          <w:ilvl w:val="0"/>
+          <w:numId w:val="2"/>
+        </w:numPr>
+        <w:spacing w:after="60"/>
+      </w:pPr>
+      <w:r>
+        <w:rPr>
+          <w:rFonts w:ascii="Calibri" w:cs="Calibri" w:eastAsia="Calibri" w:hAnsi="Calibri"/>
+        </w:rPr>
+        <w:t xml:space="preserve">Demuestra </w:t>
+      </w:r>
+      <w:r>
+        <w:rPr>
+          <w:rFonts w:ascii="Calibri" w:cs="Calibri" w:eastAsia="Calibri" w:hAnsi="Calibri"/>
+          <w:b/>
+          <w:bCs/>
+        </w:rPr>
+        <w:t xml:space="preserve">responsabilidad</w:t>
+      </w:r>
+      <w:r>
+        <w:rPr>
+          <w:rFonts w:ascii="Calibri" w:cs="Calibri" w:eastAsia="Calibri" w:hAnsi="Calibri"/>
+        </w:rPr>
+        <w:t xml:space="preserve"> y da </w:t>
+      </w:r>
+      <w:r>
+        <w:rPr>
+          <w:rFonts w:ascii="Calibri" w:cs="Calibri" w:eastAsia="Calibri" w:hAnsi="Calibri"/>
+          <w:b/>
+          <w:bCs/>
+        </w:rPr>
+        <w:t xml:space="preserve">supervisión</w:t>
+      </w:r>
+      <w:r>
+        <w:rPr>
+          <w:rFonts w:ascii="Calibri" w:cs="Calibri" w:eastAsia="Calibri" w:hAnsi="Calibri"/>
+        </w:rPr>
+        <w:t xml:space="preserve"> para garantizar que cualquier riesgo se mitigue bien y que las estrategias de seguridad estén alineadas con los objetivos comerciales y cumplan con las regulaciones.</w:t>
+      </w:r>
+    </w:p>
+    <w:p>
+      <w:pPr>
+        <w:spacing w:after="80" w:before="160"/>
+      </w:pPr>
+      <w:r>
+        <w:rPr>
+          <w:rFonts w:ascii="Calibri" w:cs="Calibri" w:eastAsia="Calibri" w:hAnsi="Calibri"/>
+          <w:b/>
+          <w:bCs/>
+        </w:rPr>
+        <w:t xml:space="preserve">Gobernanza de datos</w:t>
+      </w:r>
+    </w:p>
+    <w:p>
+      <w:pPr>
+        <w:spacing w:after="100"/>
+      </w:pPr>
+      <w:r>
+        <w:rPr>
+          <w:rFonts w:ascii="Calibri" w:cs="Calibri" w:eastAsia="Calibri" w:hAnsi="Calibri"/>
+        </w:rPr>
+        <w:t xml:space="preserve">Los buenos programas tienen estos roles:</w:t>
+      </w:r>
+    </w:p>
+    <w:p>
+      <w:pPr>
+        <w:pStyle w:val="ListParagraph"/>
+        <w:numPr>
+          <w:ilvl w:val="0"/>
+          <w:numId w:val="2"/>
+        </w:numPr>
+        <w:spacing w:after="60"/>
+      </w:pPr>
+      <w:r>
+        <w:rPr>
+          <w:rFonts w:ascii="Calibri" w:cs="Calibri" w:eastAsia="Calibri" w:hAnsi="Calibri"/>
+        </w:rPr>
+        <w:t xml:space="preserve">Propietario de datos</w:t>
+      </w:r>
+    </w:p>
+    <w:p>
+      <w:pPr>
+        <w:pStyle w:val="ListParagraph"/>
+        <w:numPr>
+          <w:ilvl w:val="0"/>
+          <w:numId w:val="2"/>
+        </w:numPr>
+        <w:spacing w:after="60"/>
+      </w:pPr>
+      <w:r>
+        <w:rPr>
+          <w:rFonts w:ascii="Calibri" w:cs="Calibri" w:eastAsia="Calibri" w:hAnsi="Calibri"/>
+        </w:rPr>
+        <w:t xml:space="preserve">Controlador</w:t>
+      </w:r>
+    </w:p>
+    <w:p>
+      <w:pPr>
+        <w:pStyle w:val="ListParagraph"/>
+        <w:numPr>
+          <w:ilvl w:val="0"/>
+          <w:numId w:val="2"/>
+        </w:numPr>
+        <w:spacing w:after="60"/>
+      </w:pPr>
+      <w:r>
+        <w:rPr>
+          <w:rFonts w:ascii="Calibri" w:cs="Calibri" w:eastAsia="Calibri" w:hAnsi="Calibri"/>
+        </w:rPr>
+        <w:t xml:space="preserve">Procesador</w:t>
+      </w:r>
+    </w:p>
+    <w:p>
+      <w:pPr>
+        <w:pStyle w:val="ListParagraph"/>
+        <w:numPr>
+          <w:ilvl w:val="0"/>
+          <w:numId w:val="2"/>
+        </w:numPr>
+        <w:spacing w:after="60"/>
+      </w:pPr>
+      <w:r>
+        <w:rPr>
+          <w:rFonts w:ascii="Calibri" w:cs="Calibri" w:eastAsia="Calibri" w:hAnsi="Calibri"/>
+        </w:rPr>
+        <w:t xml:space="preserve">Custodio</w:t>
+      </w:r>
+    </w:p>
+    <w:p>
+      <w:pPr>
+        <w:pStyle w:val="ListParagraph"/>
+        <w:numPr>
+          <w:ilvl w:val="0"/>
+          <w:numId w:val="2"/>
+        </w:numPr>
+        <w:spacing w:after="60"/>
+      </w:pPr>
+      <w:r>
+        <w:rPr>
+          <w:rFonts w:ascii="Calibri" w:cs="Calibri" w:eastAsia="Calibri" w:hAnsi="Calibri"/>
+        </w:rPr>
+        <w:t xml:space="preserve">Administrador</w:t>
+      </w:r>
+    </w:p>
+    <w:p>
+      <w:pPr>
+        <w:pStyle w:val="ListParagraph"/>
+        <w:numPr>
+          <w:ilvl w:val="0"/>
+          <w:numId w:val="2"/>
+        </w:numPr>
+        <w:spacing w:after="60"/>
+      </w:pPr>
+      <w:r>
+        <w:rPr>
+          <w:rFonts w:ascii="Calibri" w:cs="Calibri" w:eastAsia="Calibri" w:hAnsi="Calibri"/>
+        </w:rPr>
+        <w:t xml:space="preserve">Funcionario de protección</w:t>
+      </w:r>
+    </w:p>
+    <w:p>
+      <w:pPr>
+        <w:spacing w:after="80" w:before="160"/>
+      </w:pPr>
+      <w:r>
+        <w:rPr>
+          <w:rFonts w:ascii="Calibri" w:cs="Calibri" w:eastAsia="Calibri" w:hAnsi="Calibri"/>
+          <w:b/>
+          <w:bCs/>
+        </w:rPr>
+        <w:t xml:space="preserve">Políticas de ciberseguridad</w:t>
+      </w:r>
+    </w:p>
+    <w:p>
+      <w:pPr>
+        <w:pStyle w:val="ListParagraph"/>
+        <w:numPr>
+          <w:ilvl w:val="0"/>
+          <w:numId w:val="2"/>
+        </w:numPr>
+        <w:spacing w:after="60"/>
+      </w:pPr>
+      <w:r>
+        <w:rPr>
+          <w:rFonts w:ascii="Calibri" w:cs="Calibri" w:eastAsia="Calibri" w:hAnsi="Calibri"/>
+        </w:rPr>
+        <w:t xml:space="preserve">Es un documento de </w:t>
+      </w:r>
+      <w:r>
+        <w:rPr>
+          <w:rFonts w:ascii="Calibri" w:cs="Calibri" w:eastAsia="Calibri" w:hAnsi="Calibri"/>
+          <w:b/>
+          <w:bCs/>
+        </w:rPr>
+        <w:t xml:space="preserve">alto nivel</w:t>
+      </w:r>
+      <w:r>
+        <w:rPr>
+          <w:rFonts w:ascii="Calibri" w:cs="Calibri" w:eastAsia="Calibri" w:hAnsi="Calibri"/>
+        </w:rPr>
+        <w:t xml:space="preserve"> que describe la visión de la organización para la ciberseguridad: objetivos, necesidades, alcance y responsabilidades.</w:t>
+      </w:r>
+    </w:p>
+    <w:tbl>
+      <w:tblPr>
+        <w:tblW w:type="dxa" w:w="9360"/>
+        <w:tblBorders>
+          <w:top w:val="single" w:color="auto" w:sz="4"/>
+          <w:left w:val="single" w:color="auto" w:sz="4"/>
+          <w:bottom w:val="single" w:color="auto" w:sz="4"/>
+          <w:right w:val="single" w:color="auto" w:sz="4"/>
+          <w:insideH w:val="single" w:color="auto" w:sz="4"/>
+          <w:insideV w:val="single" w:color="auto" w:sz="4"/>
+        </w:tblBorders>
+      </w:tblPr>
+      <w:tblGrid>
+        <w:gridCol w:w="3000"/>
+        <w:gridCol w:w="6360"/>
+      </w:tblGrid>
+      <w:tr>
+        <w:trPr>
+          <w:tblHeader/>
+        </w:trPr>
+        <w:tc>
+          <w:tcPr>
+            <w:tcW w:type="dxa" w:w="3000"/>
+            <w:tcBorders>
+              <w:top w:val="single" w:color="000000" w:sz="4"/>
+              <w:left w:val="single" w:color="000000" w:sz="4"/>
+              <w:bottom w:val="single" w:color="000000" w:sz="4"/>
+              <w:right w:val="single" w:color="000000" w:sz="4"/>
+            </w:tcBorders>
+            <w:shd w:fill="D9D9D9" w:val="clear"/>
+            <w:tcMar>
+              <w:top w:type="dxa" w:w="60"/>
+              <w:left w:type="dxa" w:w="100"/>
+              <w:bottom w:type="dxa" w:w="60"/>
+              <w:right w:type="dxa" w:w="100"/>
+            </w:tcMar>
+          </w:tcPr>
+          <w:p>
+            <w:r>
+              <w:rPr>
+                <w:rFonts w:ascii="Calibri" w:cs="Calibri" w:eastAsia="Calibri" w:hAnsi="Calibri"/>
+                <w:b/>
+                <w:bCs/>
+                <w:color w:val="000000"/>
+              </w:rPr>
+              <w:t xml:space="preserve">Tipo</w:t>
+            </w:r>
+          </w:p>
+        </w:tc>
+        <w:tc>
+          <w:tcPr>
+            <w:tcW w:type="dxa" w:w="6360"/>
+            <w:tcBorders>
+              <w:top w:val="single" w:color="000000" w:sz="4"/>
+              <w:left w:val="single" w:color="000000" w:sz="4"/>
+              <w:bottom w:val="single" w:color="000000" w:sz="4"/>
+              <w:right w:val="single" w:color="000000" w:sz="4"/>
+            </w:tcBorders>
+            <w:shd w:fill="D9D9D9" w:val="clear"/>
+            <w:tcMar>
+              <w:top w:type="dxa" w:w="60"/>
+              <w:left w:type="dxa" w:w="100"/>
+              <w:bottom w:type="dxa" w:w="60"/>
+              <w:right w:type="dxa" w:w="100"/>
+            </w:tcMar>
+          </w:tcPr>
+          <w:p>
+            <w:r>
+              <w:rPr>
+                <w:rFonts w:ascii="Calibri" w:cs="Calibri" w:eastAsia="Calibri" w:hAnsi="Calibri"/>
+                <w:b/>
+                <w:bCs/>
+                <w:color w:val="000000"/>
+              </w:rPr>
+              <w:t xml:space="preserve">Incluye</w:t>
+            </w:r>
+          </w:p>
+        </w:tc>
+      </w:tr>
+      <w:tr>
+        <w:tc>
+          <w:tcPr>
+            <w:tcW w:type="dxa" w:w="3000"/>
+            <w:tcBorders>
+              <w:top w:val="single" w:color="000000" w:sz="4"/>
+              <w:left w:val="single" w:color="000000" w:sz="4"/>
+              <w:bottom w:val="single" w:color="000000" w:sz="4"/>
+              <w:right w:val="single" w:color="000000" w:sz="4"/>
+            </w:tcBorders>
+            <w:shd w:fill="FFFFFF" w:val="clear"/>
+            <w:tcMar>
+              <w:top w:type="dxa" w:w="60"/>
+              <w:left w:type="dxa" w:w="100"/>
+              <w:bottom w:type="dxa" w:w="60"/>
+              <w:right w:type="dxa" w:w="100"/>
+            </w:tcMar>
+          </w:tcPr>
+          <w:p>
+            <w:r>
+              <w:rPr>
+                <w:rFonts w:ascii="Calibri" w:cs="Calibri" w:eastAsia="Calibri" w:hAnsi="Calibri"/>
+                <w:b/>
+                <w:bCs/>
+              </w:rPr>
+              <w:t xml:space="preserve">Políticas de alto nivel</w:t>
+            </w:r>
+          </w:p>
+        </w:tc>
+        <w:tc>
+          <w:tcPr>
+            <w:tcW w:type="dxa" w:w="6360"/>
+            <w:tcBorders>
+              <w:top w:val="single" w:color="000000" w:sz="4"/>
+              <w:left w:val="single" w:color="000000" w:sz="4"/>
+              <w:bottom w:val="single" w:color="000000" w:sz="4"/>
+              <w:right w:val="single" w:color="000000" w:sz="4"/>
+            </w:tcBorders>
+            <w:shd w:fill="FFFFFF" w:val="clear"/>
+            <w:tcMar>
+              <w:top w:type="dxa" w:w="60"/>
+              <w:left w:type="dxa" w:w="100"/>
+              <w:bottom w:type="dxa" w:w="60"/>
+              <w:right w:type="dxa" w:w="100"/>
+            </w:tcMar>
+          </w:tcPr>
+          <w:p>
+            <w:r>
+              <w:rPr>
+                <w:rFonts w:ascii="Calibri" w:cs="Calibri" w:eastAsia="Calibri" w:hAnsi="Calibri"/>
+              </w:rPr>
+              <w:t xml:space="preserve">Una política </w:t>
+            </w:r>
+            <w:r>
+              <w:rPr>
+                <w:rFonts w:ascii="Calibri" w:cs="Calibri" w:eastAsia="Calibri" w:hAnsi="Calibri"/>
+                <w:b/>
+                <w:bCs/>
+              </w:rPr>
+              <w:t xml:space="preserve">principal</w:t>
+            </w:r>
+            <w:r>
+              <w:rPr>
+                <w:rFonts w:ascii="Calibri" w:cs="Calibri" w:eastAsia="Calibri" w:hAnsi="Calibri"/>
+              </w:rPr>
+              <w:t xml:space="preserve">, una política específica del </w:t>
+            </w:r>
+            <w:r>
+              <w:rPr>
+                <w:rFonts w:ascii="Calibri" w:cs="Calibri" w:eastAsia="Calibri" w:hAnsi="Calibri"/>
+                <w:b/>
+                <w:bCs/>
+              </w:rPr>
+              <w:t xml:space="preserve">sistema</w:t>
+            </w:r>
+            <w:r>
+              <w:rPr>
+                <w:rFonts w:ascii="Calibri" w:cs="Calibri" w:eastAsia="Calibri" w:hAnsi="Calibri"/>
+              </w:rPr>
+              <w:t xml:space="preserve"> y una política específica del </w:t>
+            </w:r>
+            <w:r>
+              <w:rPr>
+                <w:rFonts w:ascii="Calibri" w:cs="Calibri" w:eastAsia="Calibri" w:hAnsi="Calibri"/>
+                <w:b/>
+                <w:bCs/>
+              </w:rPr>
+              <w:t xml:space="preserve">problema</w:t>
+            </w:r>
+          </w:p>
+        </w:tc>
+      </w:tr>
+      <w:tr>
+        <w:tc>
+          <w:tcPr>
+            <w:tcW w:type="dxa" w:w="3000"/>
+            <w:tcBorders>
+              <w:top w:val="single" w:color="000000" w:sz="4"/>
+              <w:left w:val="single" w:color="000000" w:sz="4"/>
+              <w:bottom w:val="single" w:color="000000" w:sz="4"/>
+              <w:right w:val="single" w:color="000000" w:sz="4"/>
+            </w:tcBorders>
+            <w:shd w:fill="FFFFFF" w:val="clear"/>
+            <w:tcMar>
+              <w:top w:type="dxa" w:w="60"/>
+              <w:left w:type="dxa" w:w="100"/>
+              <w:bottom w:type="dxa" w:w="60"/>
+              <w:right w:type="dxa" w:w="100"/>
+            </w:tcMar>
+          </w:tcPr>
+          <w:p>
+            <w:r>
+              <w:rPr>
+                <w:rFonts w:ascii="Calibri" w:cs="Calibri" w:eastAsia="Calibri" w:hAnsi="Calibri"/>
+                <w:b/>
+                <w:bCs/>
+              </w:rPr>
+              <w:t xml:space="preserve">Políticas de seguridad específicas</w:t>
+            </w:r>
+          </w:p>
+        </w:tc>
+        <w:tc>
+          <w:tcPr>
+            <w:tcW w:type="dxa" w:w="6360"/>
+            <w:tcBorders>
+              <w:top w:val="single" w:color="000000" w:sz="4"/>
+              <w:left w:val="single" w:color="000000" w:sz="4"/>
+              <w:bottom w:val="single" w:color="000000" w:sz="4"/>
+              <w:right w:val="single" w:color="000000" w:sz="4"/>
+            </w:tcBorders>
+            <w:shd w:fill="FFFFFF" w:val="clear"/>
+            <w:tcMar>
+              <w:top w:type="dxa" w:w="60"/>
+              <w:left w:type="dxa" w:w="100"/>
+              <w:bottom w:type="dxa" w:w="60"/>
+              <w:right w:type="dxa" w:w="100"/>
+            </w:tcMar>
+          </w:tcPr>
+          <w:p>
+            <w:r>
+              <w:rPr>
+                <w:rFonts w:ascii="Calibri" w:cs="Calibri" w:eastAsia="Calibri" w:hAnsi="Calibri"/>
+              </w:rPr>
+              <w:t xml:space="preserve">ID y autenticación, contraseña, uso aceptable, mantenimiento de la red, manejo de incidentes, datos, credenciales y organización</w:t>
+            </w:r>
+          </w:p>
+        </w:tc>
+      </w:tr>
+    </w:tbl>
+    <w:p>
+      <w:pPr>
+        <w:spacing w:after="80"/>
+      </w:pPr>
+    </w:p>
+    <w:p>
+      <w:pPr>
+        <w:spacing w:after="80" w:before="160"/>
+      </w:pPr>
+      <w:r>
+        <w:rPr>
+          <w:rFonts w:ascii="Calibri" w:cs="Calibri" w:eastAsia="Calibri" w:hAnsi="Calibri"/>
+          <w:b/>
+          <w:bCs/>
+        </w:rPr>
+        <w:t xml:space="preserve">Principios rectores de recursos humanos</w:t>
+      </w:r>
+    </w:p>
+    <w:p>
+      <w:pPr>
+        <w:pStyle w:val="ListParagraph"/>
+        <w:numPr>
+          <w:ilvl w:val="0"/>
+          <w:numId w:val="2"/>
+        </w:numPr>
+        <w:spacing w:after="60"/>
+      </w:pPr>
+      <w:r>
+        <w:rPr>
+          <w:rFonts w:ascii="Calibri" w:cs="Calibri" w:eastAsia="Calibri" w:hAnsi="Calibri"/>
+        </w:rPr>
+        <w:t xml:space="preserve">Verificaciones de antecedentes</w:t>
+      </w:r>
+    </w:p>
+    <w:p>
+      <w:pPr>
+        <w:pStyle w:val="ListParagraph"/>
+        <w:numPr>
+          <w:ilvl w:val="0"/>
+          <w:numId w:val="2"/>
+        </w:numPr>
+        <w:spacing w:after="60"/>
+      </w:pPr>
+      <w:r>
+        <w:rPr>
+          <w:rFonts w:ascii="Calibri" w:cs="Calibri" w:eastAsia="Calibri" w:hAnsi="Calibri"/>
+        </w:rPr>
+        <w:t xml:space="preserve">Inducción / desvinculación</w:t>
+      </w:r>
+    </w:p>
+    <w:p>
+      <w:pPr>
+        <w:pStyle w:val="ListParagraph"/>
+        <w:numPr>
+          <w:ilvl w:val="0"/>
+          <w:numId w:val="2"/>
+        </w:numPr>
+        <w:spacing w:after="60"/>
+      </w:pPr>
+      <w:r>
+        <w:rPr>
+          <w:rFonts w:ascii="Calibri" w:cs="Calibri" w:eastAsia="Calibri" w:hAnsi="Calibri"/>
+        </w:rPr>
+        <w:t xml:space="preserve">Escritorio limpio</w:t>
+      </w:r>
+    </w:p>
+    <w:p>
+      <w:pPr>
+        <w:pStyle w:val="ListParagraph"/>
+        <w:numPr>
+          <w:ilvl w:val="0"/>
+          <w:numId w:val="2"/>
+        </w:numPr>
+        <w:spacing w:after="60"/>
+      </w:pPr>
+      <w:r>
+        <w:rPr>
+          <w:rFonts w:ascii="Calibri" w:cs="Calibri" w:eastAsia="Calibri" w:hAnsi="Calibri"/>
+        </w:rPr>
+        <w:t xml:space="preserve">Necesidad de saber</w:t>
+      </w:r>
+    </w:p>
+    <w:p>
+      <w:pPr>
+        <w:pStyle w:val="ListParagraph"/>
+        <w:numPr>
+          <w:ilvl w:val="0"/>
+          <w:numId w:val="2"/>
+        </w:numPr>
+        <w:spacing w:after="60"/>
+      </w:pPr>
+      <w:r>
+        <w:rPr>
+          <w:rFonts w:ascii="Calibri" w:cs="Calibri" w:eastAsia="Calibri" w:hAnsi="Calibri"/>
+        </w:rPr>
+        <w:t xml:space="preserve">Separación de funciones</w:t>
+      </w:r>
+    </w:p>
+    <w:p>
+      <w:pPr>
+        <w:pStyle w:val="ListParagraph"/>
+        <w:numPr>
+          <w:ilvl w:val="0"/>
+          <w:numId w:val="2"/>
+        </w:numPr>
+        <w:spacing w:after="60"/>
+      </w:pPr>
+      <w:r>
+        <w:rPr>
+          <w:rFonts w:ascii="Calibri" w:cs="Calibri" w:eastAsia="Calibri" w:hAnsi="Calibri"/>
+        </w:rPr>
+        <w:t xml:space="preserve">Vacaciones obligatorias</w:t>
+      </w:r>
+    </w:p>
+    <w:p>
+      <w:pPr>
+        <w:pStyle w:val="ListParagraph"/>
+        <w:numPr>
+          <w:ilvl w:val="0"/>
+          <w:numId w:val="2"/>
+        </w:numPr>
+        <w:spacing w:after="60"/>
+      </w:pPr>
+      <w:r>
+        <w:rPr>
+          <w:rFonts w:ascii="Calibri" w:cs="Calibri" w:eastAsia="Calibri" w:hAnsi="Calibri"/>
+        </w:rPr>
+        <w:t xml:space="preserve">Rotación laboral</w:t>
+      </w:r>
+    </w:p>
+    <w:p>
+      <w:pPr>
+        <w:spacing w:after="120" w:before="280"/>
+      </w:pPr>
+      <w:r>
+        <w:rPr>
+          <w:rFonts w:ascii="Calibri" w:cs="Calibri" w:eastAsia="Calibri" w:hAnsi="Calibri"/>
+          <w:b/>
+          <w:bCs/>
+        </w:rPr>
+        <w:t xml:space="preserve">2. La ética de la ciberseguridad</w:t>
+      </w:r>
+    </w:p>
+    <w:p>
+      <w:pPr>
+        <w:spacing w:after="100"/>
+      </w:pPr>
+      <w:r>
+        <w:rPr>
+          <w:rFonts w:ascii="Calibri" w:cs="Calibri" w:eastAsia="Calibri" w:hAnsi="Calibri"/>
+        </w:rPr>
+        <w:t xml:space="preserve">Como especialista en ciberseguridad hay que entender </w:t>
+      </w:r>
+      <w:r>
+        <w:rPr>
+          <w:rFonts w:ascii="Calibri" w:cs="Calibri" w:eastAsia="Calibri" w:hAnsi="Calibri"/>
+          <w:b/>
+          <w:bCs/>
+        </w:rPr>
+        <w:t xml:space="preserve">tanto la ley como los intereses de la organización</w:t>
+      </w:r>
+      <w:r>
+        <w:rPr>
+          <w:rFonts w:ascii="Calibri" w:cs="Calibri" w:eastAsia="Calibri" w:hAnsi="Calibri"/>
+        </w:rPr>
+        <w:t xml:space="preserve">.</w:t>
+      </w:r>
+    </w:p>
+    <w:p>
+      <w:pPr>
+        <w:spacing w:after="80" w:before="160"/>
+      </w:pPr>
+      <w:r>
+        <w:rPr>
+          <w:rFonts w:ascii="Calibri" w:cs="Calibri" w:eastAsia="Calibri" w:hAnsi="Calibri"/>
+          <w:b/>
+          <w:bCs/>
+        </w:rPr>
+        <w:t xml:space="preserve">Enfoques éticos</w:t>
+      </w:r>
+    </w:p>
+    <w:tbl>
+      <w:tblPr>
+        <w:tblW w:type="dxa" w:w="9360"/>
+        <w:tblBorders>
+          <w:top w:val="single" w:color="auto" w:sz="4"/>
+          <w:left w:val="single" w:color="auto" w:sz="4"/>
+          <w:bottom w:val="single" w:color="auto" w:sz="4"/>
+          <w:right w:val="single" w:color="auto" w:sz="4"/>
+          <w:insideH w:val="single" w:color="auto" w:sz="4"/>
+          <w:insideV w:val="single" w:color="auto" w:sz="4"/>
+        </w:tblBorders>
+      </w:tblPr>
+      <w:tblGrid>
+        <w:gridCol w:w="2400"/>
+        <w:gridCol w:w="6960"/>
+      </w:tblGrid>
+      <w:tr>
+        <w:trPr>
+          <w:tblHeader/>
+        </w:trPr>
+        <w:tc>
+          <w:tcPr>
+            <w:tcW w:type="dxa" w:w="2400"/>
+            <w:tcBorders>
+              <w:top w:val="single" w:color="000000" w:sz="4"/>
+              <w:left w:val="single" w:color="000000" w:sz="4"/>
+              <w:bottom w:val="single" w:color="000000" w:sz="4"/>
+              <w:right w:val="single" w:color="000000" w:sz="4"/>
+            </w:tcBorders>
+            <w:shd w:fill="D9D9D9" w:val="clear"/>
+            <w:tcMar>
+              <w:top w:type="dxa" w:w="60"/>
+              <w:left w:type="dxa" w:w="100"/>
+              <w:bottom w:type="dxa" w:w="60"/>
+              <w:right w:type="dxa" w:w="100"/>
+            </w:tcMar>
+          </w:tcPr>
+          <w:p>
+            <w:r>
+              <w:rPr>
+                <w:rFonts w:ascii="Calibri" w:cs="Calibri" w:eastAsia="Calibri" w:hAnsi="Calibri"/>
+                <w:b/>
+                <w:bCs/>
+                <w:color w:val="000000"/>
+              </w:rPr>
+              <w:t xml:space="preserve">Enfoque</w:t>
+            </w:r>
+          </w:p>
+        </w:tc>
+        <w:tc>
+          <w:tcPr>
+            <w:tcW w:type="dxa" w:w="6960"/>
+            <w:tcBorders>
+              <w:top w:val="single" w:color="000000" w:sz="4"/>
+              <w:left w:val="single" w:color="000000" w:sz="4"/>
+              <w:bottom w:val="single" w:color="000000" w:sz="4"/>
+              <w:right w:val="single" w:color="000000" w:sz="4"/>
+            </w:tcBorders>
+            <w:shd w:fill="D9D9D9" w:val="clear"/>
+            <w:tcMar>
+              <w:top w:type="dxa" w:w="60"/>
+              <w:left w:type="dxa" w:w="100"/>
+              <w:bottom w:type="dxa" w:w="60"/>
+              <w:right w:type="dxa" w:w="100"/>
+            </w:tcMar>
+          </w:tcPr>
+          <w:p>
+            <w:r>
+              <w:rPr>
+                <w:rFonts w:ascii="Calibri" w:cs="Calibri" w:eastAsia="Calibri" w:hAnsi="Calibri"/>
+                <w:b/>
+                <w:bCs/>
+                <w:color w:val="000000"/>
+              </w:rPr>
+              <w:t xml:space="preserve">Idea</w:t>
+            </w:r>
+          </w:p>
+        </w:tc>
+      </w:tr>
+      <w:tr>
+        <w:tc>
+          <w:tcPr>
+            <w:tcW w:type="dxa" w:w="2400"/>
+            <w:tcBorders>
+              <w:top w:val="single" w:color="000000" w:sz="4"/>
+              <w:left w:val="single" w:color="000000" w:sz="4"/>
+              <w:bottom w:val="single" w:color="000000" w:sz="4"/>
+              <w:right w:val="single" w:color="000000" w:sz="4"/>
+            </w:tcBorders>
+            <w:shd w:fill="FFFFFF" w:val="clear"/>
+            <w:tcMar>
+              <w:top w:type="dxa" w:w="60"/>
+              <w:left w:type="dxa" w:w="100"/>
+              <w:bottom w:type="dxa" w:w="60"/>
+              <w:right w:type="dxa" w:w="100"/>
+            </w:tcMar>
+          </w:tcPr>
+          <w:p>
+            <w:r>
+              <w:rPr>
+                <w:rFonts w:ascii="Calibri" w:cs="Calibri" w:eastAsia="Calibri" w:hAnsi="Calibri"/>
+                <w:b/>
+                <w:bCs/>
+              </w:rPr>
+              <w:t xml:space="preserve">Ética utilitarista</w:t>
+            </w:r>
+          </w:p>
+        </w:tc>
+        <w:tc>
+          <w:tcPr>
+            <w:tcW w:type="dxa" w:w="6960"/>
+            <w:tcBorders>
+              <w:top w:val="single" w:color="000000" w:sz="4"/>
+              <w:left w:val="single" w:color="000000" w:sz="4"/>
+              <w:bottom w:val="single" w:color="000000" w:sz="4"/>
+              <w:right w:val="single" w:color="000000" w:sz="4"/>
+            </w:tcBorders>
+            <w:shd w:fill="FFFFFF" w:val="clear"/>
+            <w:tcMar>
+              <w:top w:type="dxa" w:w="60"/>
+              <w:left w:type="dxa" w:w="100"/>
+              <w:bottom w:type="dxa" w:w="60"/>
+              <w:right w:type="dxa" w:w="100"/>
+            </w:tcMar>
+          </w:tcPr>
+          <w:p>
+            <w:r>
+              <w:rPr>
+                <w:rFonts w:ascii="Calibri" w:cs="Calibri" w:eastAsia="Calibri" w:hAnsi="Calibri"/>
+              </w:rPr>
+              <w:t xml:space="preserve">La </w:t>
+            </w:r>
+            <w:r>
+              <w:rPr>
+                <w:rFonts w:ascii="Calibri" w:cs="Calibri" w:eastAsia="Calibri" w:hAnsi="Calibri"/>
+                <w:b/>
+                <w:bCs/>
+              </w:rPr>
+              <w:t xml:space="preserve">consecuencia</w:t>
+            </w:r>
+            <w:r>
+              <w:rPr>
+                <w:rFonts w:ascii="Calibri" w:cs="Calibri" w:eastAsia="Calibri" w:hAnsi="Calibri"/>
+              </w:rPr>
+              <w:t xml:space="preserve"> de una acción es el factor más importante para decidir si es moral o no</w:t>
+            </w:r>
+          </w:p>
+        </w:tc>
+      </w:tr>
+      <w:tr>
+        <w:tc>
+          <w:tcPr>
+            <w:tcW w:type="dxa" w:w="2400"/>
+            <w:tcBorders>
+              <w:top w:val="single" w:color="000000" w:sz="4"/>
+              <w:left w:val="single" w:color="000000" w:sz="4"/>
+              <w:bottom w:val="single" w:color="000000" w:sz="4"/>
+              <w:right w:val="single" w:color="000000" w:sz="4"/>
+            </w:tcBorders>
+            <w:shd w:fill="FFFFFF" w:val="clear"/>
+            <w:tcMar>
+              <w:top w:type="dxa" w:w="60"/>
+              <w:left w:type="dxa" w:w="100"/>
+              <w:bottom w:type="dxa" w:w="60"/>
+              <w:right w:type="dxa" w:w="100"/>
+            </w:tcMar>
+          </w:tcPr>
+          <w:p>
+            <w:r>
+              <w:rPr>
+                <w:rFonts w:ascii="Calibri" w:cs="Calibri" w:eastAsia="Calibri" w:hAnsi="Calibri"/>
+                <w:b/>
+                <w:bCs/>
+              </w:rPr>
+              <w:t xml:space="preserve">Enfoque de derechos</w:t>
+            </w:r>
+          </w:p>
+        </w:tc>
+        <w:tc>
+          <w:tcPr>
+            <w:tcW w:type="dxa" w:w="6960"/>
+            <w:tcBorders>
+              <w:top w:val="single" w:color="000000" w:sz="4"/>
+              <w:left w:val="single" w:color="000000" w:sz="4"/>
+              <w:bottom w:val="single" w:color="000000" w:sz="4"/>
+              <w:right w:val="single" w:color="000000" w:sz="4"/>
+            </w:tcBorders>
+            <w:shd w:fill="FFFFFF" w:val="clear"/>
+            <w:tcMar>
+              <w:top w:type="dxa" w:w="60"/>
+              <w:left w:type="dxa" w:w="100"/>
+              <w:bottom w:type="dxa" w:w="60"/>
+              <w:right w:type="dxa" w:w="100"/>
+            </w:tcMar>
+          </w:tcPr>
+          <w:p>
+            <w:r>
+              <w:rPr>
+                <w:rFonts w:ascii="Calibri" w:cs="Calibri" w:eastAsia="Calibri" w:hAnsi="Calibri"/>
+              </w:rPr>
+              <w:t xml:space="preserve">Un individuo tiene derecho a tomar </w:t>
+            </w:r>
+            <w:r>
+              <w:rPr>
+                <w:rFonts w:ascii="Calibri" w:cs="Calibri" w:eastAsia="Calibri" w:hAnsi="Calibri"/>
+                <w:b/>
+                <w:bCs/>
+              </w:rPr>
+              <w:t xml:space="preserve">sus propias decisiones</w:t>
+            </w:r>
+            <w:r>
+              <w:rPr>
+                <w:rFonts w:ascii="Calibri" w:cs="Calibri" w:eastAsia="Calibri" w:hAnsi="Calibri"/>
+              </w:rPr>
+              <w:t xml:space="preserve">, y la decisión de otra persona no puede violarlas</w:t>
+            </w:r>
+          </w:p>
+        </w:tc>
+      </w:tr>
+      <w:tr>
+        <w:tc>
+          <w:tcPr>
+            <w:tcW w:type="dxa" w:w="2400"/>
+            <w:tcBorders>
+              <w:top w:val="single" w:color="000000" w:sz="4"/>
+              <w:left w:val="single" w:color="000000" w:sz="4"/>
+              <w:bottom w:val="single" w:color="000000" w:sz="4"/>
+              <w:right w:val="single" w:color="000000" w:sz="4"/>
+            </w:tcBorders>
+            <w:shd w:fill="FFFFFF" w:val="clear"/>
+            <w:tcMar>
+              <w:top w:type="dxa" w:w="60"/>
+              <w:left w:type="dxa" w:w="100"/>
+              <w:bottom w:type="dxa" w:w="60"/>
+              <w:right w:type="dxa" w:w="100"/>
+            </w:tcMar>
+          </w:tcPr>
+          <w:p>
+            <w:r>
+              <w:rPr>
+                <w:rFonts w:ascii="Calibri" w:cs="Calibri" w:eastAsia="Calibri" w:hAnsi="Calibri"/>
+                <w:b/>
+                <w:bCs/>
+              </w:rPr>
+              <w:t xml:space="preserve">Bien común</w:t>
+            </w:r>
+          </w:p>
+        </w:tc>
+        <w:tc>
+          <w:tcPr>
+            <w:tcW w:type="dxa" w:w="6960"/>
+            <w:tcBorders>
+              <w:top w:val="single" w:color="000000" w:sz="4"/>
+              <w:left w:val="single" w:color="000000" w:sz="4"/>
+              <w:bottom w:val="single" w:color="000000" w:sz="4"/>
+              <w:right w:val="single" w:color="000000" w:sz="4"/>
+            </w:tcBorders>
+            <w:shd w:fill="FFFFFF" w:val="clear"/>
+            <w:tcMar>
+              <w:top w:type="dxa" w:w="60"/>
+              <w:left w:type="dxa" w:w="100"/>
+              <w:bottom w:type="dxa" w:w="60"/>
+              <w:right w:type="dxa" w:w="100"/>
+            </w:tcMar>
+          </w:tcPr>
+          <w:p>
+            <w:r>
+              <w:rPr>
+                <w:rFonts w:ascii="Calibri" w:cs="Calibri" w:eastAsia="Calibri" w:hAnsi="Calibri"/>
+              </w:rPr>
+              <w:t xml:space="preserve">Las acciones éticas son las que </w:t>
+            </w:r>
+            <w:r>
+              <w:rPr>
+                <w:rFonts w:ascii="Calibri" w:cs="Calibri" w:eastAsia="Calibri" w:hAnsi="Calibri"/>
+                <w:b/>
+                <w:bCs/>
+              </w:rPr>
+              <w:t xml:space="preserve">benefician a toda la comunidad</w:t>
+            </w:r>
+          </w:p>
+        </w:tc>
+      </w:tr>
+    </w:tbl>
+    <w:p>
+      <w:pPr>
+        <w:spacing w:after="80"/>
+      </w:pPr>
+    </w:p>
+    <w:p>
+      <w:pPr>
+        <w:spacing w:after="80" w:before="160"/>
+      </w:pPr>
+      <w:r>
+        <w:rPr>
+          <w:rFonts w:ascii="Calibri" w:cs="Calibri" w:eastAsia="Calibri" w:hAnsi="Calibri"/>
+          <w:b/>
+          <w:bCs/>
+        </w:rPr>
+        <w:t xml:space="preserve">Los diez mandamientos de la ética informática</w:t>
+      </w:r>
+    </w:p>
+    <w:p>
+      <w:pPr>
+        <w:spacing w:after="100"/>
+      </w:pPr>
+      <w:r>
+        <w:rPr>
+          <w:rFonts w:ascii="Calibri" w:cs="Calibri" w:eastAsia="Calibri" w:hAnsi="Calibri"/>
+        </w:rPr>
+        <w:t xml:space="preserve">En general cubren lo que </w:t>
+      </w:r>
+      <w:r>
+        <w:rPr>
+          <w:rFonts w:ascii="Calibri" w:cs="Calibri" w:eastAsia="Calibri" w:hAnsi="Calibri"/>
+          <w:b/>
+          <w:bCs/>
+        </w:rPr>
+        <w:t xml:space="preserve">no</w:t>
+      </w:r>
+      <w:r>
+        <w:rPr>
+          <w:rFonts w:ascii="Calibri" w:cs="Calibri" w:eastAsia="Calibri" w:hAnsi="Calibri"/>
+        </w:rPr>
+        <w:t xml:space="preserve"> se debe hacer con una computadora:</w:t>
+      </w:r>
+    </w:p>
+    <w:p>
+      <w:pPr>
+        <w:pStyle w:val="ListParagraph"/>
+        <w:numPr>
+          <w:ilvl w:val="0"/>
+          <w:numId w:val="2"/>
+        </w:numPr>
+        <w:spacing w:after="60"/>
+      </w:pPr>
+      <w:r>
+        <w:rPr>
+          <w:rFonts w:ascii="Calibri" w:cs="Calibri" w:eastAsia="Calibri" w:hAnsi="Calibri"/>
+        </w:rPr>
+        <w:t xml:space="preserve">No usar una computadora para </w:t>
+      </w:r>
+      <w:r>
+        <w:rPr>
+          <w:rFonts w:ascii="Calibri" w:cs="Calibri" w:eastAsia="Calibri" w:hAnsi="Calibri"/>
+          <w:b/>
+          <w:bCs/>
+        </w:rPr>
+        <w:t xml:space="preserve">dañar</w:t>
+      </w:r>
+      <w:r>
+        <w:rPr>
+          <w:rFonts w:ascii="Calibri" w:cs="Calibri" w:eastAsia="Calibri" w:hAnsi="Calibri"/>
+        </w:rPr>
+        <w:t xml:space="preserve"> a otros.</w:t>
+      </w:r>
+    </w:p>
+    <w:p>
+      <w:pPr>
+        <w:pStyle w:val="ListParagraph"/>
+        <w:numPr>
+          <w:ilvl w:val="0"/>
+          <w:numId w:val="2"/>
+        </w:numPr>
+        <w:spacing w:after="60"/>
+      </w:pPr>
+      <w:r>
+        <w:rPr>
+          <w:rFonts w:ascii="Calibri" w:cs="Calibri" w:eastAsia="Calibri" w:hAnsi="Calibri"/>
+        </w:rPr>
+        <w:t xml:space="preserve">No </w:t>
+      </w:r>
+      <w:r>
+        <w:rPr>
+          <w:rFonts w:ascii="Calibri" w:cs="Calibri" w:eastAsia="Calibri" w:hAnsi="Calibri"/>
+          <w:b/>
+          <w:bCs/>
+        </w:rPr>
+        <w:t xml:space="preserve">interferir</w:t>
+      </w:r>
+      <w:r>
+        <w:rPr>
+          <w:rFonts w:ascii="Calibri" w:cs="Calibri" w:eastAsia="Calibri" w:hAnsi="Calibri"/>
+        </w:rPr>
+        <w:t xml:space="preserve"> con el trabajo de otras personas.</w:t>
+      </w:r>
+    </w:p>
+    <w:p>
+      <w:pPr>
+        <w:pStyle w:val="ListParagraph"/>
+        <w:numPr>
+          <w:ilvl w:val="0"/>
+          <w:numId w:val="2"/>
+        </w:numPr>
+        <w:spacing w:after="60"/>
+      </w:pPr>
+      <w:r>
+        <w:rPr>
+          <w:rFonts w:ascii="Calibri" w:cs="Calibri" w:eastAsia="Calibri" w:hAnsi="Calibri"/>
+        </w:rPr>
+        <w:t xml:space="preserve">No </w:t>
+      </w:r>
+      <w:r>
+        <w:rPr>
+          <w:rFonts w:ascii="Calibri" w:cs="Calibri" w:eastAsia="Calibri" w:hAnsi="Calibri"/>
+          <w:b/>
+          <w:bCs/>
+        </w:rPr>
+        <w:t xml:space="preserve">espiar</w:t>
+      </w:r>
+      <w:r>
+        <w:rPr>
+          <w:rFonts w:ascii="Calibri" w:cs="Calibri" w:eastAsia="Calibri" w:hAnsi="Calibri"/>
+        </w:rPr>
+        <w:t xml:space="preserve"> los archivos de otras personas.</w:t>
+      </w:r>
+    </w:p>
+    <w:p>
+      <w:pPr>
+        <w:pStyle w:val="ListParagraph"/>
+        <w:numPr>
+          <w:ilvl w:val="0"/>
+          <w:numId w:val="2"/>
+        </w:numPr>
+        <w:spacing w:after="60"/>
+      </w:pPr>
+      <w:r>
+        <w:rPr>
+          <w:rFonts w:ascii="Calibri" w:cs="Calibri" w:eastAsia="Calibri" w:hAnsi="Calibri"/>
+        </w:rPr>
+        <w:t xml:space="preserve">No usarla para </w:t>
+      </w:r>
+      <w:r>
+        <w:rPr>
+          <w:rFonts w:ascii="Calibri" w:cs="Calibri" w:eastAsia="Calibri" w:hAnsi="Calibri"/>
+          <w:b/>
+          <w:bCs/>
+        </w:rPr>
+        <w:t xml:space="preserve">robar</w:t>
+      </w:r>
+      <w:r>
+        <w:rPr>
+          <w:rFonts w:ascii="Calibri" w:cs="Calibri" w:eastAsia="Calibri" w:hAnsi="Calibri"/>
+        </w:rPr>
+        <w:t xml:space="preserve"> (incluidos software y producción intelectual) o </w:t>
+      </w:r>
+      <w:r>
+        <w:rPr>
+          <w:rFonts w:ascii="Calibri" w:cs="Calibri" w:eastAsia="Calibri" w:hAnsi="Calibri"/>
+          <w:b/>
+          <w:bCs/>
+        </w:rPr>
+        <w:t xml:space="preserve">mentir</w:t>
+      </w:r>
+      <w:r>
+        <w:rPr>
+          <w:rFonts w:ascii="Calibri" w:cs="Calibri" w:eastAsia="Calibri" w:hAnsi="Calibri"/>
+        </w:rPr>
+        <w:t xml:space="preserve">.</w:t>
+      </w:r>
+    </w:p>
+    <w:p>
+      <w:pPr>
+        <w:pStyle w:val="ListParagraph"/>
+        <w:numPr>
+          <w:ilvl w:val="0"/>
+          <w:numId w:val="2"/>
+        </w:numPr>
+        <w:spacing w:after="60"/>
+      </w:pPr>
+      <w:r>
+        <w:rPr>
+          <w:rFonts w:ascii="Calibri" w:cs="Calibri" w:eastAsia="Calibri" w:hAnsi="Calibri"/>
+        </w:rPr>
+        <w:t xml:space="preserve">No usar los recursos informáticos de otras personas </w:t>
+      </w:r>
+      <w:r>
+        <w:rPr>
+          <w:rFonts w:ascii="Calibri" w:cs="Calibri" w:eastAsia="Calibri" w:hAnsi="Calibri"/>
+          <w:b/>
+          <w:bCs/>
+        </w:rPr>
+        <w:t xml:space="preserve">sin permiso y sin compensación</w:t>
+      </w:r>
+      <w:r>
+        <w:rPr>
+          <w:rFonts w:ascii="Calibri" w:cs="Calibri" w:eastAsia="Calibri" w:hAnsi="Calibri"/>
+        </w:rPr>
+        <w:t xml:space="preserve">.</w:t>
+      </w:r>
+    </w:p>
+    <w:p>
+      <w:pPr>
+        <w:pStyle w:val="ListParagraph"/>
+        <w:numPr>
+          <w:ilvl w:val="0"/>
+          <w:numId w:val="2"/>
+        </w:numPr>
+        <w:spacing w:after="60"/>
+      </w:pPr>
+      <w:r>
+        <w:rPr>
+          <w:rFonts w:ascii="Calibri" w:cs="Calibri" w:eastAsia="Calibri" w:hAnsi="Calibri"/>
+          <w:b/>
+          <w:bCs/>
+        </w:rPr>
+        <w:t xml:space="preserve">Pensar</w:t>
+      </w:r>
+      <w:r>
+        <w:rPr>
+          <w:rFonts w:ascii="Calibri" w:cs="Calibri" w:eastAsia="Calibri" w:hAnsi="Calibri"/>
+        </w:rPr>
+        <w:t xml:space="preserve"> en las consecuencias del programa que se está creando.</w:t>
+      </w:r>
+    </w:p>
+    <w:p>
+      <w:pPr>
+        <w:pStyle w:val="ListParagraph"/>
+        <w:numPr>
+          <w:ilvl w:val="0"/>
+          <w:numId w:val="2"/>
+        </w:numPr>
+        <w:spacing w:after="60"/>
+      </w:pPr>
+      <w:r>
+        <w:rPr>
+          <w:rFonts w:ascii="Calibri" w:cs="Calibri" w:eastAsia="Calibri" w:hAnsi="Calibri"/>
+        </w:rPr>
+        <w:t xml:space="preserve">Usar siempre la computadora de maneras que demuestren </w:t>
+      </w:r>
+      <w:r>
+        <w:rPr>
+          <w:rFonts w:ascii="Calibri" w:cs="Calibri" w:eastAsia="Calibri" w:hAnsi="Calibri"/>
+          <w:b/>
+          <w:bCs/>
+        </w:rPr>
+        <w:t xml:space="preserve">respeto por los demás</w:t>
+      </w:r>
+      <w:r>
+        <w:rPr>
+          <w:rFonts w:ascii="Calibri" w:cs="Calibri" w:eastAsia="Calibri" w:hAnsi="Calibri"/>
+        </w:rPr>
+        <w:t xml:space="preserve">.</w:t>
+      </w:r>
+    </w:p>
+    <w:p>
+      <w:pPr>
+        <w:spacing w:after="80" w:before="160"/>
+      </w:pPr>
+      <w:r>
+        <w:rPr>
+          <w:rFonts w:ascii="Calibri" w:cs="Calibri" w:eastAsia="Calibri" w:hAnsi="Calibri"/>
+          <w:b/>
+          <w:bCs/>
+        </w:rPr>
+        <w:t xml:space="preserve">Delitos cibernéticos</w:t>
+      </w:r>
+    </w:p>
+    <w:p>
+      <w:pPr>
+        <w:pStyle w:val="ListParagraph"/>
+        <w:numPr>
+          <w:ilvl w:val="0"/>
+          <w:numId w:val="2"/>
+        </w:numPr>
+        <w:spacing w:after="60"/>
+      </w:pPr>
+      <w:r>
+        <w:rPr>
+          <w:rFonts w:ascii="Calibri" w:cs="Calibri" w:eastAsia="Calibri" w:hAnsi="Calibri"/>
+          <w:b/>
+          <w:bCs/>
+        </w:rPr>
+        <w:t xml:space="preserve">3 categorías:</w:t>
+      </w:r>
+      <w:r>
+        <w:rPr>
+          <w:rFonts w:ascii="Calibri" w:cs="Calibri" w:eastAsia="Calibri" w:hAnsi="Calibri"/>
+        </w:rPr>
+        <w:t xml:space="preserve"> delito informático, asistidos por computadora e incidental informático.</w:t>
+      </w:r>
+    </w:p>
+    <w:p>
+      <w:pPr>
+        <w:pStyle w:val="ListParagraph"/>
+        <w:numPr>
+          <w:ilvl w:val="0"/>
+          <w:numId w:val="2"/>
+        </w:numPr>
+        <w:spacing w:after="60"/>
+      </w:pPr>
+      <w:r>
+        <w:rPr>
+          <w:rFonts w:ascii="Calibri" w:cs="Calibri" w:eastAsia="Calibri" w:hAnsi="Calibri"/>
+        </w:rPr>
+        <w:t xml:space="preserve">En Estados Unidos, </w:t>
+      </w:r>
+      <w:r>
+        <w:rPr>
+          <w:rFonts w:ascii="Calibri" w:cs="Calibri" w:eastAsia="Calibri" w:hAnsi="Calibri"/>
+          <w:b/>
+          <w:bCs/>
+        </w:rPr>
+        <w:t xml:space="preserve">3 fuentes primarias</w:t>
+      </w:r>
+      <w:r>
+        <w:rPr>
+          <w:rFonts w:ascii="Calibri" w:cs="Calibri" w:eastAsia="Calibri" w:hAnsi="Calibri"/>
+        </w:rPr>
+        <w:t xml:space="preserve"> de leyes y regulaciones: derecho </w:t>
+      </w:r>
+      <w:r>
+        <w:rPr>
+          <w:rFonts w:ascii="Calibri" w:cs="Calibri" w:eastAsia="Calibri" w:hAnsi="Calibri"/>
+          <w:b/>
+          <w:bCs/>
+        </w:rPr>
+        <w:t xml:space="preserve">estatutario</w:t>
+      </w:r>
+      <w:r>
+        <w:rPr>
+          <w:rFonts w:ascii="Calibri" w:cs="Calibri" w:eastAsia="Calibri" w:hAnsi="Calibri"/>
+        </w:rPr>
+        <w:t xml:space="preserve">, </w:t>
+      </w:r>
+      <w:r>
+        <w:rPr>
+          <w:rFonts w:ascii="Calibri" w:cs="Calibri" w:eastAsia="Calibri" w:hAnsi="Calibri"/>
+          <w:b/>
+          <w:bCs/>
+        </w:rPr>
+        <w:t xml:space="preserve">administrativo</w:t>
+      </w:r>
+      <w:r>
+        <w:rPr>
+          <w:rFonts w:ascii="Calibri" w:cs="Calibri" w:eastAsia="Calibri" w:hAnsi="Calibri"/>
+        </w:rPr>
+        <w:t xml:space="preserve"> y </w:t>
+      </w:r>
+      <w:r>
+        <w:rPr>
+          <w:rFonts w:ascii="Calibri" w:cs="Calibri" w:eastAsia="Calibri" w:hAnsi="Calibri"/>
+          <w:b/>
+          <w:bCs/>
+        </w:rPr>
+        <w:t xml:space="preserve">común</w:t>
+      </w:r>
+      <w:r>
+        <w:rPr>
+          <w:rFonts w:ascii="Calibri" w:cs="Calibri" w:eastAsia="Calibri" w:hAnsi="Calibri"/>
+        </w:rPr>
+        <w:t xml:space="preserve">.</w:t>
+      </w:r>
+    </w:p>
+    <w:p>
+      <w:pPr>
+        <w:pStyle w:val="ListParagraph"/>
+        <w:numPr>
+          <w:ilvl w:val="0"/>
+          <w:numId w:val="2"/>
+        </w:numPr>
+        <w:spacing w:after="60"/>
+      </w:pPr>
+      <w:r>
+        <w:rPr>
+          <w:rFonts w:ascii="Calibri" w:cs="Calibri" w:eastAsia="Calibri" w:hAnsi="Calibri"/>
+          <w:b/>
+          <w:bCs/>
+        </w:rPr>
+        <w:t xml:space="preserve">FISMA</w:t>
+      </w:r>
+      <w:r>
+        <w:rPr>
+          <w:rFonts w:ascii="Calibri" w:cs="Calibri" w:eastAsia="Calibri" w:hAnsi="Calibri"/>
+        </w:rPr>
+        <w:t xml:space="preserve"> lo creó el Congreso de EE. UU. para cubrir los sistemas de TI de las agencias federales.</w:t>
+      </w:r>
+    </w:p>
+    <w:p>
+      <w:pPr>
+        <w:pStyle w:val="ListParagraph"/>
+        <w:numPr>
+          <w:ilvl w:val="0"/>
+          <w:numId w:val="2"/>
+        </w:numPr>
+        <w:spacing w:after="60"/>
+      </w:pPr>
+      <w:r>
+        <w:rPr>
+          <w:rFonts w:ascii="Calibri" w:cs="Calibri" w:eastAsia="Calibri" w:hAnsi="Calibri"/>
+        </w:rPr>
+        <w:t xml:space="preserve">Algunas industrias tienen leyes específicas sobre el delito cibernético: finanzas, contabilidad corporativa, tarjetas de crédito y criptografía.</w:t>
+      </w:r>
+    </w:p>
+    <w:p>
+      <w:pPr>
+        <w:pStyle w:val="ListParagraph"/>
+        <w:numPr>
+          <w:ilvl w:val="0"/>
+          <w:numId w:val="2"/>
+        </w:numPr>
+        <w:spacing w:after="60"/>
+      </w:pPr>
+      <w:r>
+        <w:rPr>
+          <w:rFonts w:ascii="Calibri" w:cs="Calibri" w:eastAsia="Calibri" w:hAnsi="Calibri"/>
+        </w:rPr>
+        <w:t xml:space="preserve">Dos leyes de notificación de violaciones de seguridad: </w:t>
+      </w:r>
+      <w:r>
+        <w:rPr>
+          <w:rFonts w:ascii="Calibri" w:cs="Calibri" w:eastAsia="Calibri" w:hAnsi="Calibri"/>
+          <w:b/>
+          <w:bCs/>
+        </w:rPr>
+        <w:t xml:space="preserve">ECPA</w:t>
+      </w:r>
+      <w:r>
+        <w:rPr>
+          <w:rFonts w:ascii="Calibri" w:cs="Calibri" w:eastAsia="Calibri" w:hAnsi="Calibri"/>
+        </w:rPr>
+        <w:t xml:space="preserve"> y </w:t>
+      </w:r>
+      <w:r>
+        <w:rPr>
+          <w:rFonts w:ascii="Calibri" w:cs="Calibri" w:eastAsia="Calibri" w:hAnsi="Calibri"/>
+          <w:b/>
+          <w:bCs/>
+        </w:rPr>
+        <w:t xml:space="preserve">CFAA</w:t>
+      </w:r>
+      <w:r>
+        <w:rPr>
+          <w:rFonts w:ascii="Calibri" w:cs="Calibri" w:eastAsia="Calibri" w:hAnsi="Calibri"/>
+        </w:rPr>
+        <w:t xml:space="preserve">.</w:t>
+      </w:r>
+    </w:p>
+    <w:p>
+      <w:pPr>
+        <w:pStyle w:val="ListParagraph"/>
+        <w:numPr>
+          <w:ilvl w:val="0"/>
+          <w:numId w:val="2"/>
+        </w:numPr>
+        <w:spacing w:after="60"/>
+      </w:pPr>
+      <w:r>
+        <w:rPr>
+          <w:rFonts w:ascii="Calibri" w:cs="Calibri" w:eastAsia="Calibri" w:hAnsi="Calibri"/>
+        </w:rPr>
+        <w:t xml:space="preserve">Algunas leyes de privacidad de EE. UU.: Ley de Privacidad de 1974, </w:t>
+      </w:r>
+      <w:r>
+        <w:rPr>
+          <w:rFonts w:ascii="Calibri" w:cs="Calibri" w:eastAsia="Calibri" w:hAnsi="Calibri"/>
+          <w:b/>
+          <w:bCs/>
+        </w:rPr>
+        <w:t xml:space="preserve">FOIA, FERPA, COPPA, CIPA, VPPA, HIPAA</w:t>
+      </w:r>
+      <w:r>
+        <w:rPr>
+          <w:rFonts w:ascii="Calibri" w:cs="Calibri" w:eastAsia="Calibri" w:hAnsi="Calibri"/>
+        </w:rPr>
+        <w:t xml:space="preserve"> y </w:t>
+      </w:r>
+      <w:r>
+        <w:rPr>
+          <w:rFonts w:ascii="Calibri" w:cs="Calibri" w:eastAsia="Calibri" w:hAnsi="Calibri"/>
+          <w:b/>
+          <w:bCs/>
+        </w:rPr>
+        <w:t xml:space="preserve">PIA</w:t>
+      </w:r>
+      <w:r>
+        <w:rPr>
+          <w:rFonts w:ascii="Calibri" w:cs="Calibri" w:eastAsia="Calibri" w:hAnsi="Calibri"/>
+        </w:rPr>
+        <w:t xml:space="preserve">.</w:t>
+      </w:r>
+    </w:p>
+    <w:p>
+      <w:pPr>
+        <w:pStyle w:val="ListParagraph"/>
+        <w:numPr>
+          <w:ilvl w:val="0"/>
+          <w:numId w:val="2"/>
+        </w:numPr>
+        <w:spacing w:after="60"/>
+      </w:pPr>
+      <w:r>
+        <w:rPr>
+          <w:rFonts w:ascii="Calibri" w:cs="Calibri" w:eastAsia="Calibri" w:hAnsi="Calibri"/>
+        </w:rPr>
+        <w:t xml:space="preserve">Los esfuerzos internacionales contra el delito cibernético están creciendo.</w:t>
+      </w:r>
+    </w:p>
+    <w:p>
+      <w:pPr>
+        <w:pStyle w:val="ListParagraph"/>
+        <w:numPr>
+          <w:ilvl w:val="0"/>
+          <w:numId w:val="2"/>
+        </w:numPr>
+        <w:spacing w:after="60"/>
+      </w:pPr>
+      <w:r>
+        <w:rPr>
+          <w:rFonts w:ascii="Calibri" w:cs="Calibri" w:eastAsia="Calibri" w:hAnsi="Calibri"/>
+          <w:b/>
+          <w:bCs/>
+        </w:rPr>
+        <w:t xml:space="preserve">Convención sobre el Delito Cibernético:</w:t>
+      </w:r>
+      <w:r>
+        <w:rPr>
+          <w:rFonts w:ascii="Calibri" w:cs="Calibri" w:eastAsia="Calibri" w:hAnsi="Calibri"/>
+        </w:rPr>
+        <w:t xml:space="preserve"> ratificada por </w:t>
+      </w:r>
+      <w:r>
+        <w:rPr>
+          <w:rFonts w:ascii="Calibri" w:cs="Calibri" w:eastAsia="Calibri" w:hAnsi="Calibri"/>
+          <w:b/>
+          <w:bCs/>
+        </w:rPr>
+        <w:t xml:space="preserve">65 estados</w:t>
+      </w:r>
+      <w:r>
+        <w:rPr>
+          <w:rFonts w:ascii="Calibri" w:cs="Calibri" w:eastAsia="Calibri" w:hAnsi="Calibri"/>
+        </w:rPr>
+        <w:t xml:space="preserve">. Es el </w:t>
+      </w:r>
+      <w:r>
+        <w:rPr>
+          <w:rFonts w:ascii="Calibri" w:cs="Calibri" w:eastAsia="Calibri" w:hAnsi="Calibri"/>
+          <w:b/>
+          <w:bCs/>
+        </w:rPr>
+        <w:t xml:space="preserve">primer tratado internacional</w:t>
+      </w:r>
+      <w:r>
+        <w:rPr>
+          <w:rFonts w:ascii="Calibri" w:cs="Calibri" w:eastAsia="Calibri" w:hAnsi="Calibri"/>
+        </w:rPr>
+        <w:t xml:space="preserve"> sobre delitos digitales y de Internet, en especial infracción de derechos de autor, fraude informático, pornografía infantil y violaciones a la seguridad de las redes.</w:t>
+      </w:r>
+    </w:p>
+    <w:p>
+      <w:pPr>
+        <w:spacing w:after="120" w:before="280"/>
+      </w:pPr>
+      <w:r>
+        <w:rPr>
+          <w:rFonts w:ascii="Calibri" w:cs="Calibri" w:eastAsia="Calibri" w:hAnsi="Calibri"/>
+          <w:b/>
+          <w:bCs/>
+        </w:rPr>
+        <w:t xml:space="preserve">3. Marco de trabajo para la administración de la seguridad de TI</w:t>
+      </w:r>
+    </w:p>
+    <w:p>
+      <w:pPr>
+        <w:spacing w:after="80" w:before="160"/>
+      </w:pPr>
+      <w:r>
+        <w:rPr>
+          <w:rFonts w:ascii="Calibri" w:cs="Calibri" w:eastAsia="Calibri" w:hAnsi="Calibri"/>
+          <w:b/>
+          <w:bCs/>
+        </w:rPr>
+        <w:t xml:space="preserve">Los 12 dominios de la ciberseguridad</w:t>
+      </w:r>
+    </w:p>
+    <w:p>
+      <w:pPr>
+        <w:pStyle w:val="ListParagraph"/>
+        <w:numPr>
+          <w:ilvl w:val="0"/>
+          <w:numId w:val="2"/>
+        </w:numPr>
+        <w:spacing w:after="60"/>
+      </w:pPr>
+      <w:r>
+        <w:rPr>
+          <w:rFonts w:ascii="Calibri" w:cs="Calibri" w:eastAsia="Calibri" w:hAnsi="Calibri"/>
+        </w:rPr>
+        <w:t xml:space="preserve">Evaluación de riesgos</w:t>
+      </w:r>
+    </w:p>
+    <w:p>
+      <w:pPr>
+        <w:pStyle w:val="ListParagraph"/>
+        <w:numPr>
+          <w:ilvl w:val="0"/>
+          <w:numId w:val="2"/>
+        </w:numPr>
+        <w:spacing w:after="60"/>
+      </w:pPr>
+      <w:r>
+        <w:rPr>
+          <w:rFonts w:ascii="Calibri" w:cs="Calibri" w:eastAsia="Calibri" w:hAnsi="Calibri"/>
+        </w:rPr>
+        <w:t xml:space="preserve">Política de seguridad</w:t>
+      </w:r>
+    </w:p>
+    <w:p>
+      <w:pPr>
+        <w:pStyle w:val="ListParagraph"/>
+        <w:numPr>
+          <w:ilvl w:val="0"/>
+          <w:numId w:val="2"/>
+        </w:numPr>
+        <w:spacing w:after="60"/>
+      </w:pPr>
+      <w:r>
+        <w:rPr>
+          <w:rFonts w:ascii="Calibri" w:cs="Calibri" w:eastAsia="Calibri" w:hAnsi="Calibri"/>
+        </w:rPr>
+        <w:t xml:space="preserve">Organización de la seguridad de la información</w:t>
+      </w:r>
+    </w:p>
+    <w:p>
+      <w:pPr>
+        <w:pStyle w:val="ListParagraph"/>
+        <w:numPr>
+          <w:ilvl w:val="0"/>
+          <w:numId w:val="2"/>
+        </w:numPr>
+        <w:spacing w:after="60"/>
+      </w:pPr>
+      <w:r>
+        <w:rPr>
+          <w:rFonts w:ascii="Calibri" w:cs="Calibri" w:eastAsia="Calibri" w:hAnsi="Calibri"/>
+        </w:rPr>
+        <w:t xml:space="preserve">Administración de activos</w:t>
+      </w:r>
+    </w:p>
+    <w:p>
+      <w:pPr>
+        <w:pStyle w:val="ListParagraph"/>
+        <w:numPr>
+          <w:ilvl w:val="0"/>
+          <w:numId w:val="2"/>
+        </w:numPr>
+        <w:spacing w:after="60"/>
+      </w:pPr>
+      <w:r>
+        <w:rPr>
+          <w:rFonts w:ascii="Calibri" w:cs="Calibri" w:eastAsia="Calibri" w:hAnsi="Calibri"/>
+        </w:rPr>
+        <w:t xml:space="preserve">Seguridad de recursos humanos</w:t>
+      </w:r>
+    </w:p>
+    <w:p>
+      <w:pPr>
+        <w:pStyle w:val="ListParagraph"/>
+        <w:numPr>
+          <w:ilvl w:val="0"/>
+          <w:numId w:val="2"/>
+        </w:numPr>
+        <w:spacing w:after="60"/>
+      </w:pPr>
+      <w:r>
+        <w:rPr>
+          <w:rFonts w:ascii="Calibri" w:cs="Calibri" w:eastAsia="Calibri" w:hAnsi="Calibri"/>
+        </w:rPr>
+        <w:t xml:space="preserve">Seguridad física y ambiental</w:t>
+      </w:r>
+    </w:p>
+    <w:p>
+      <w:pPr>
+        <w:pStyle w:val="ListParagraph"/>
+        <w:numPr>
+          <w:ilvl w:val="0"/>
+          <w:numId w:val="2"/>
+        </w:numPr>
+        <w:spacing w:after="60"/>
+      </w:pPr>
+      <w:r>
+        <w:rPr>
+          <w:rFonts w:ascii="Calibri" w:cs="Calibri" w:eastAsia="Calibri" w:hAnsi="Calibri"/>
+        </w:rPr>
+        <w:t xml:space="preserve">Administración de comunicaciones y operaciones</w:t>
+      </w:r>
+    </w:p>
+    <w:p>
+      <w:pPr>
+        <w:pStyle w:val="ListParagraph"/>
+        <w:numPr>
+          <w:ilvl w:val="0"/>
+          <w:numId w:val="2"/>
+        </w:numPr>
+        <w:spacing w:after="60"/>
+      </w:pPr>
+      <w:r>
+        <w:rPr>
+          <w:rFonts w:ascii="Calibri" w:cs="Calibri" w:eastAsia="Calibri" w:hAnsi="Calibri"/>
+        </w:rPr>
+        <w:t xml:space="preserve">Adquisición, desarrollo y mantenimiento de sistemas de información</w:t>
+      </w:r>
+    </w:p>
+    <w:p>
+      <w:pPr>
+        <w:pStyle w:val="ListParagraph"/>
+        <w:numPr>
+          <w:ilvl w:val="0"/>
+          <w:numId w:val="2"/>
+        </w:numPr>
+        <w:spacing w:after="60"/>
+      </w:pPr>
+      <w:r>
+        <w:rPr>
+          <w:rFonts w:ascii="Calibri" w:cs="Calibri" w:eastAsia="Calibri" w:hAnsi="Calibri"/>
+        </w:rPr>
+        <w:t xml:space="preserve">Control de acceso</w:t>
+      </w:r>
+    </w:p>
+    <w:p>
+      <w:pPr>
+        <w:pStyle w:val="ListParagraph"/>
+        <w:numPr>
+          <w:ilvl w:val="0"/>
+          <w:numId w:val="2"/>
+        </w:numPr>
+        <w:spacing w:after="60"/>
+      </w:pPr>
+      <w:r>
+        <w:rPr>
+          <w:rFonts w:ascii="Calibri" w:cs="Calibri" w:eastAsia="Calibri" w:hAnsi="Calibri"/>
+        </w:rPr>
+        <w:t xml:space="preserve">Administración de incidentes de seguridad de la información</w:t>
+      </w:r>
+    </w:p>
+    <w:p>
+      <w:pPr>
+        <w:pStyle w:val="ListParagraph"/>
+        <w:numPr>
+          <w:ilvl w:val="0"/>
+          <w:numId w:val="2"/>
+        </w:numPr>
+        <w:spacing w:after="60"/>
+      </w:pPr>
+      <w:r>
+        <w:rPr>
+          <w:rFonts w:ascii="Calibri" w:cs="Calibri" w:eastAsia="Calibri" w:hAnsi="Calibri"/>
+        </w:rPr>
+        <w:t xml:space="preserve">Administración de la continuidad del negocio</w:t>
+      </w:r>
+    </w:p>
+    <w:p>
+      <w:pPr>
+        <w:pStyle w:val="ListParagraph"/>
+        <w:numPr>
+          <w:ilvl w:val="0"/>
+          <w:numId w:val="2"/>
+        </w:numPr>
+        <w:spacing w:after="60"/>
+      </w:pPr>
+      <w:r>
+        <w:rPr>
+          <w:rFonts w:ascii="Calibri" w:cs="Calibri" w:eastAsia="Calibri" w:hAnsi="Calibri"/>
+        </w:rPr>
+        <w:t xml:space="preserve">Cumplimiento</w:t>
+      </w:r>
+    </w:p>
+    <w:p>
+      <w:pPr>
+        <w:spacing w:after="80" w:before="160"/>
+      </w:pPr>
+      <w:r>
+        <w:rPr>
+          <w:rFonts w:ascii="Calibri" w:cs="Calibri" w:eastAsia="Calibri" w:hAnsi="Calibri"/>
+          <w:b/>
+          <w:bCs/>
+        </w:rPr>
+        <w:t xml:space="preserve">Objetivos de control y controles</w:t>
+      </w:r>
+    </w:p>
+    <w:p>
+      <w:pPr>
+        <w:pStyle w:val="ListParagraph"/>
+        <w:numPr>
+          <w:ilvl w:val="0"/>
+          <w:numId w:val="2"/>
+        </w:numPr>
+        <w:spacing w:after="60"/>
+      </w:pPr>
+      <w:r>
+        <w:rPr>
+          <w:rFonts w:ascii="Calibri" w:cs="Calibri" w:eastAsia="Calibri" w:hAnsi="Calibri"/>
+        </w:rPr>
+        <w:t xml:space="preserve">Los </w:t>
+      </w:r>
+      <w:r>
+        <w:rPr>
+          <w:rFonts w:ascii="Calibri" w:cs="Calibri" w:eastAsia="Calibri" w:hAnsi="Calibri"/>
+          <w:b/>
+          <w:bCs/>
+        </w:rPr>
+        <w:t xml:space="preserve">objetivos de control</w:t>
+      </w:r>
+      <w:r>
+        <w:rPr>
+          <w:rFonts w:ascii="Calibri" w:cs="Calibri" w:eastAsia="Calibri" w:hAnsi="Calibri"/>
+        </w:rPr>
+        <w:t xml:space="preserve"> definen requisitos de alto nivel para implementar un sistema integral de administración de seguridad de la información en una organización.</w:t>
+      </w:r>
+    </w:p>
+    <w:p>
+      <w:pPr>
+        <w:pStyle w:val="ListParagraph"/>
+        <w:numPr>
+          <w:ilvl w:val="0"/>
+          <w:numId w:val="2"/>
+        </w:numPr>
+        <w:spacing w:after="60"/>
+      </w:pPr>
+      <w:r>
+        <w:rPr>
+          <w:rFonts w:ascii="Calibri" w:cs="Calibri" w:eastAsia="Calibri" w:hAnsi="Calibri"/>
+        </w:rPr>
+        <w:t xml:space="preserve">Los </w:t>
+      </w:r>
+      <w:r>
+        <w:rPr>
+          <w:rFonts w:ascii="Calibri" w:cs="Calibri" w:eastAsia="Calibri" w:hAnsi="Calibri"/>
+          <w:b/>
+          <w:bCs/>
+        </w:rPr>
+        <w:t xml:space="preserve">controles</w:t>
+      </w:r>
+      <w:r>
+        <w:rPr>
+          <w:rFonts w:ascii="Calibri" w:cs="Calibri" w:eastAsia="Calibri" w:hAnsi="Calibri"/>
+        </w:rPr>
+        <w:t xml:space="preserve"> muestran </w:t>
+      </w:r>
+      <w:r>
+        <w:rPr>
+          <w:rFonts w:ascii="Calibri" w:cs="Calibri" w:eastAsia="Calibri" w:hAnsi="Calibri"/>
+          <w:b/>
+          <w:bCs/>
+        </w:rPr>
+        <w:t xml:space="preserve">cómo lograr</w:t>
+      </w:r>
+      <w:r>
+        <w:rPr>
+          <w:rFonts w:ascii="Calibri" w:cs="Calibri" w:eastAsia="Calibri" w:hAnsi="Calibri"/>
+        </w:rPr>
+        <w:t xml:space="preserve"> los objetivos de control. Establecen pautas para implementar, mantener y mejorar la administración de la seguridad de la información.</w:t>
+      </w:r>
+    </w:p>
+    <w:p>
+      <w:pPr>
+        <w:spacing w:after="80" w:before="160"/>
+      </w:pPr>
+      <w:r>
+        <w:rPr>
+          <w:rFonts w:ascii="Calibri" w:cs="Calibri" w:eastAsia="Calibri" w:hAnsi="Calibri"/>
+          <w:b/>
+          <w:bCs/>
+        </w:rPr>
+        <w:t xml:space="preserve">ISO 27000</w:t>
+      </w:r>
+    </w:p>
+    <w:p>
+      <w:pPr>
+        <w:pStyle w:val="ListParagraph"/>
+        <w:numPr>
+          <w:ilvl w:val="0"/>
+          <w:numId w:val="2"/>
+        </w:numPr>
+        <w:spacing w:after="60"/>
+      </w:pPr>
+      <w:r>
+        <w:rPr>
+          <w:rFonts w:ascii="Calibri" w:cs="Calibri" w:eastAsia="Calibri" w:hAnsi="Calibri"/>
+        </w:rPr>
+        <w:t xml:space="preserve">Es un marco de trabajo </w:t>
+      </w:r>
+      <w:r>
+        <w:rPr>
+          <w:rFonts w:ascii="Calibri" w:cs="Calibri" w:eastAsia="Calibri" w:hAnsi="Calibri"/>
+          <w:b/>
+          <w:bCs/>
+        </w:rPr>
+        <w:t xml:space="preserve">universal</w:t>
+      </w:r>
+      <w:r>
+        <w:rPr>
+          <w:rFonts w:ascii="Calibri" w:cs="Calibri" w:eastAsia="Calibri" w:hAnsi="Calibri"/>
+        </w:rPr>
+        <w:t xml:space="preserve">, aplicable a todo tipo de organización.</w:t>
+      </w:r>
+    </w:p>
+    <w:p>
+      <w:pPr>
+        <w:pStyle w:val="ListParagraph"/>
+        <w:numPr>
+          <w:ilvl w:val="0"/>
+          <w:numId w:val="2"/>
+        </w:numPr>
+        <w:spacing w:after="60"/>
+      </w:pPr>
+      <w:r>
+        <w:rPr>
+          <w:rFonts w:ascii="Calibri" w:cs="Calibri" w:eastAsia="Calibri" w:hAnsi="Calibri"/>
+        </w:rPr>
+        <w:t xml:space="preserve">La organización debe identificar qué dominios, objetivos de control y controles aplicar a su ambiente y operaciones.</w:t>
+      </w:r>
+    </w:p>
+    <w:p>
+      <w:pPr>
+        <w:pStyle w:val="ListParagraph"/>
+        <w:numPr>
+          <w:ilvl w:val="0"/>
+          <w:numId w:val="2"/>
+        </w:numPr>
+        <w:spacing w:after="60"/>
+      </w:pPr>
+      <w:r>
+        <w:rPr>
+          <w:rFonts w:ascii="Calibri" w:cs="Calibri" w:eastAsia="Calibri" w:hAnsi="Calibri"/>
+        </w:rPr>
+        <w:t xml:space="preserve">La mayoría arma un </w:t>
+      </w:r>
+      <w:r>
+        <w:rPr>
+          <w:rFonts w:ascii="Calibri" w:cs="Calibri" w:eastAsia="Calibri" w:hAnsi="Calibri"/>
+          <w:b/>
+          <w:bCs/>
+        </w:rPr>
+        <w:t xml:space="preserve">SOA</w:t>
+      </w:r>
+      <w:r>
+        <w:rPr>
+          <w:rFonts w:ascii="Calibri" w:cs="Calibri" w:eastAsia="Calibri" w:hAnsi="Calibri"/>
+        </w:rPr>
+        <w:t xml:space="preserve"> que ajusta los objetivos de control y controles para cumplir sus prioridades de </w:t>
+      </w:r>
+      <w:r>
+        <w:rPr>
+          <w:rFonts w:ascii="Calibri" w:cs="Calibri" w:eastAsia="Calibri" w:hAnsi="Calibri"/>
+          <w:b/>
+          <w:bCs/>
+        </w:rPr>
+        <w:t xml:space="preserve">confidencialidad, integridad y disponibilidad</w:t>
+      </w:r>
+      <w:r>
+        <w:rPr>
+          <w:rFonts w:ascii="Calibri" w:cs="Calibri" w:eastAsia="Calibri" w:hAnsi="Calibri"/>
+        </w:rPr>
+        <w:t xml:space="preserve">.</w:t>
+      </w:r>
+    </w:p>
+    <w:p>
+      <w:pPr>
+        <w:pStyle w:val="ListParagraph"/>
+        <w:numPr>
+          <w:ilvl w:val="0"/>
+          <w:numId w:val="2"/>
+        </w:numPr>
+        <w:spacing w:after="60"/>
+      </w:pPr>
+      <w:r>
+        <w:rPr>
+          <w:rFonts w:ascii="Calibri" w:cs="Calibri" w:eastAsia="Calibri" w:hAnsi="Calibri"/>
+        </w:rPr>
+        <w:t xml:space="preserve">Los controles ISO cubren la seguridad de los datos </w:t>
+      </w:r>
+      <w:r>
+        <w:rPr>
+          <w:rFonts w:ascii="Calibri" w:cs="Calibri" w:eastAsia="Calibri" w:hAnsi="Calibri"/>
+          <w:b/>
+          <w:bCs/>
+        </w:rPr>
+        <w:t xml:space="preserve">en proceso, en reposo (almacenamiento) y en tránsito</w:t>
+      </w:r>
+      <w:r>
+        <w:rPr>
+          <w:rFonts w:ascii="Calibri" w:cs="Calibri" w:eastAsia="Calibri" w:hAnsi="Calibri"/>
+        </w:rPr>
+        <w:t xml:space="preserve">.</w:t>
+      </w:r>
+    </w:p>
+    <w:p>
+      <w:pPr>
+        <w:spacing w:after="80" w:before="160"/>
+      </w:pPr>
+      <w:r>
+        <w:rPr>
+          <w:rFonts w:ascii="Calibri" w:cs="Calibri" w:eastAsia="Calibri" w:hAnsi="Calibri"/>
+          <w:b/>
+          <w:bCs/>
+        </w:rPr>
+        <w:t xml:space="preserve">Otros marcos</w:t>
+      </w:r>
+    </w:p>
+    <w:tbl>
+      <w:tblPr>
+        <w:tblW w:type="dxa" w:w="9360"/>
+        <w:tblBorders>
+          <w:top w:val="single" w:color="auto" w:sz="4"/>
+          <w:left w:val="single" w:color="auto" w:sz="4"/>
+          <w:bottom w:val="single" w:color="auto" w:sz="4"/>
+          <w:right w:val="single" w:color="auto" w:sz="4"/>
+          <w:insideH w:val="single" w:color="auto" w:sz="4"/>
+          <w:insideV w:val="single" w:color="auto" w:sz="4"/>
+        </w:tblBorders>
+      </w:tblPr>
+      <w:tblGrid>
+        <w:gridCol w:w="2000"/>
+        <w:gridCol w:w="7360"/>
+      </w:tblGrid>
+      <w:tr>
+        <w:trPr>
+          <w:tblHeader/>
+        </w:trPr>
+        <w:tc>
+          <w:tcPr>
+            <w:tcW w:type="dxa" w:w="2000"/>
+            <w:tcBorders>
+              <w:top w:val="single" w:color="000000" w:sz="4"/>
+              <w:left w:val="single" w:color="000000" w:sz="4"/>
+              <w:bottom w:val="single" w:color="000000" w:sz="4"/>
+              <w:right w:val="single" w:color="000000" w:sz="4"/>
+            </w:tcBorders>
+            <w:shd w:fill="D9D9D9" w:val="clear"/>
+            <w:tcMar>
+              <w:top w:type="dxa" w:w="60"/>
+              <w:left w:type="dxa" w:w="100"/>
+              <w:bottom w:type="dxa" w:w="60"/>
+              <w:right w:type="dxa" w:w="100"/>
+            </w:tcMar>
+          </w:tcPr>
+          <w:p>
+            <w:r>
+              <w:rPr>
+                <w:rFonts w:ascii="Calibri" w:cs="Calibri" w:eastAsia="Calibri" w:hAnsi="Calibri"/>
+                <w:b/>
+                <w:bCs/>
+                <w:color w:val="000000"/>
+              </w:rPr>
+              <w:t xml:space="preserve">Marco</w:t>
+            </w:r>
+          </w:p>
+        </w:tc>
+        <w:tc>
+          <w:tcPr>
+            <w:tcW w:type="dxa" w:w="7360"/>
+            <w:tcBorders>
+              <w:top w:val="single" w:color="000000" w:sz="4"/>
+              <w:left w:val="single" w:color="000000" w:sz="4"/>
+              <w:bottom w:val="single" w:color="000000" w:sz="4"/>
+              <w:right w:val="single" w:color="000000" w:sz="4"/>
+            </w:tcBorders>
+            <w:shd w:fill="D9D9D9" w:val="clear"/>
+            <w:tcMar>
+              <w:top w:type="dxa" w:w="60"/>
+              <w:left w:type="dxa" w:w="100"/>
+              <w:bottom w:type="dxa" w:w="60"/>
+              <w:right w:type="dxa" w:w="100"/>
+            </w:tcMar>
+          </w:tcPr>
+          <w:p>
+            <w:r>
+              <w:rPr>
+                <w:rFonts w:ascii="Calibri" w:cs="Calibri" w:eastAsia="Calibri" w:hAnsi="Calibri"/>
+                <w:b/>
+                <w:bCs/>
+                <w:color w:val="000000"/>
+              </w:rPr>
+              <w:t xml:space="preserve">Qué es</w:t>
+            </w:r>
+          </w:p>
+        </w:tc>
+      </w:tr>
+      <w:tr>
+        <w:tc>
+          <w:tcPr>
+            <w:tcW w:type="dxa" w:w="2000"/>
+            <w:tcBorders>
+              <w:top w:val="single" w:color="000000" w:sz="4"/>
+              <w:left w:val="single" w:color="000000" w:sz="4"/>
+              <w:bottom w:val="single" w:color="000000" w:sz="4"/>
+              <w:right w:val="single" w:color="000000" w:sz="4"/>
+            </w:tcBorders>
+            <w:shd w:fill="FFFFFF" w:val="clear"/>
+            <w:tcMar>
+              <w:top w:type="dxa" w:w="60"/>
+              <w:left w:type="dxa" w:w="100"/>
+              <w:bottom w:type="dxa" w:w="60"/>
+              <w:right w:type="dxa" w:w="100"/>
+            </w:tcMar>
+          </w:tcPr>
+          <w:p>
+            <w:r>
+              <w:rPr>
+                <w:rFonts w:ascii="Calibri" w:cs="Calibri" w:eastAsia="Calibri" w:hAnsi="Calibri"/>
+                <w:b/>
+                <w:bCs/>
+              </w:rPr>
+              <w:t xml:space="preserve">NIST</w:t>
+            </w:r>
+          </w:p>
+        </w:tc>
+        <w:tc>
+          <w:tcPr>
+            <w:tcW w:type="dxa" w:w="7360"/>
+            <w:tcBorders>
+              <w:top w:val="single" w:color="000000" w:sz="4"/>
+              <w:left w:val="single" w:color="000000" w:sz="4"/>
+              <w:bottom w:val="single" w:color="000000" w:sz="4"/>
+              <w:right w:val="single" w:color="000000" w:sz="4"/>
+            </w:tcBorders>
+            <w:shd w:fill="FFFFFF" w:val="clear"/>
+            <w:tcMar>
+              <w:top w:type="dxa" w:w="60"/>
+              <w:left w:type="dxa" w:w="100"/>
+              <w:bottom w:type="dxa" w:w="60"/>
+              <w:right w:type="dxa" w:w="100"/>
+            </w:tcMar>
+          </w:tcPr>
+          <w:p>
+            <w:r>
+              <w:rPr>
+                <w:rFonts w:ascii="Calibri" w:cs="Calibri" w:eastAsia="Calibri" w:hAnsi="Calibri"/>
+              </w:rPr>
+              <w:t xml:space="preserve">Creó el </w:t>
+            </w:r>
+            <w:r>
+              <w:rPr>
+                <w:rFonts w:ascii="Calibri" w:cs="Calibri" w:eastAsia="Calibri" w:hAnsi="Calibri"/>
+                <w:b/>
+                <w:bCs/>
+              </w:rPr>
+              <w:t xml:space="preserve">Marco de la Fuerza Laboral Nacional de Ciberseguridad</w:t>
+            </w:r>
+            <w:r>
+              <w:rPr>
+                <w:rFonts w:ascii="Calibri" w:cs="Calibri" w:eastAsia="Calibri" w:hAnsi="Calibri"/>
+              </w:rPr>
+              <w:t xml:space="preserve"> para apoyar a las organizaciones que buscan profesionales en ciberseguridad</w:t>
+            </w:r>
+          </w:p>
+        </w:tc>
+      </w:tr>
+      <w:tr>
+        <w:tc>
+          <w:tcPr>
+            <w:tcW w:type="dxa" w:w="2000"/>
+            <w:tcBorders>
+              <w:top w:val="single" w:color="000000" w:sz="4"/>
+              <w:left w:val="single" w:color="000000" w:sz="4"/>
+              <w:bottom w:val="single" w:color="000000" w:sz="4"/>
+              <w:right w:val="single" w:color="000000" w:sz="4"/>
+            </w:tcBorders>
+            <w:shd w:fill="FFFFFF" w:val="clear"/>
+            <w:tcMar>
+              <w:top w:type="dxa" w:w="60"/>
+              <w:left w:type="dxa" w:w="100"/>
+              <w:bottom w:type="dxa" w:w="60"/>
+              <w:right w:type="dxa" w:w="100"/>
+            </w:tcMar>
+          </w:tcPr>
+          <w:p>
+            <w:r>
+              <w:rPr>
+                <w:rFonts w:ascii="Calibri" w:cs="Calibri" w:eastAsia="Calibri" w:hAnsi="Calibri"/>
+                <w:b/>
+                <w:bCs/>
+              </w:rPr>
+              <w:t xml:space="preserve">CIS</w:t>
+            </w:r>
+          </w:p>
+        </w:tc>
+        <w:tc>
+          <w:tcPr>
+            <w:tcW w:type="dxa" w:w="7360"/>
+            <w:tcBorders>
+              <w:top w:val="single" w:color="000000" w:sz="4"/>
+              <w:left w:val="single" w:color="000000" w:sz="4"/>
+              <w:bottom w:val="single" w:color="000000" w:sz="4"/>
+              <w:right w:val="single" w:color="000000" w:sz="4"/>
+            </w:tcBorders>
+            <w:shd w:fill="FFFFFF" w:val="clear"/>
+            <w:tcMar>
+              <w:top w:type="dxa" w:w="60"/>
+              <w:left w:type="dxa" w:w="100"/>
+              <w:bottom w:type="dxa" w:w="60"/>
+              <w:right w:type="dxa" w:w="100"/>
+            </w:tcMar>
+          </w:tcPr>
+          <w:p>
+            <w:r>
+              <w:rPr>
+                <w:rFonts w:ascii="Calibri" w:cs="Calibri" w:eastAsia="Calibri" w:hAnsi="Calibri"/>
+              </w:rPr>
+              <w:t xml:space="preserve">Desarrolló un conjunto de </w:t>
+            </w:r>
+            <w:r>
+              <w:rPr>
+                <w:rFonts w:ascii="Calibri" w:cs="Calibri" w:eastAsia="Calibri" w:hAnsi="Calibri"/>
+                <w:b/>
+                <w:bCs/>
+              </w:rPr>
+              <w:t xml:space="preserve">controles de seguridad críticos</w:t>
+            </w:r>
+            <w:r>
+              <w:rPr>
+                <w:rFonts w:ascii="Calibri" w:cs="Calibri" w:eastAsia="Calibri" w:hAnsi="Calibri"/>
+              </w:rPr>
+              <w:t xml:space="preserve"> (básicos, fundacionales y organizacionales) para organizaciones con distintos niveles de recursos y experiencia</w:t>
+            </w:r>
+          </w:p>
+        </w:tc>
+      </w:tr>
+      <w:tr>
+        <w:tc>
+          <w:tcPr>
+            <w:tcW w:type="dxa" w:w="2000"/>
+            <w:tcBorders>
+              <w:top w:val="single" w:color="000000" w:sz="4"/>
+              <w:left w:val="single" w:color="000000" w:sz="4"/>
+              <w:bottom w:val="single" w:color="000000" w:sz="4"/>
+              <w:right w:val="single" w:color="000000" w:sz="4"/>
+            </w:tcBorders>
+            <w:shd w:fill="FFFFFF" w:val="clear"/>
+            <w:tcMar>
+              <w:top w:type="dxa" w:w="60"/>
+              <w:left w:type="dxa" w:w="100"/>
+              <w:bottom w:type="dxa" w:w="60"/>
+              <w:right w:type="dxa" w:w="100"/>
+            </w:tcMar>
+          </w:tcPr>
+          <w:p>
+            <w:r>
+              <w:rPr>
+                <w:rFonts w:ascii="Calibri" w:cs="Calibri" w:eastAsia="Calibri" w:hAnsi="Calibri"/>
+                <w:b/>
+                <w:bCs/>
+              </w:rPr>
+              <w:t xml:space="preserve">CSA</w:t>
+            </w:r>
+          </w:p>
+        </w:tc>
+        <w:tc>
+          <w:tcPr>
+            <w:tcW w:type="dxa" w:w="7360"/>
+            <w:tcBorders>
+              <w:top w:val="single" w:color="000000" w:sz="4"/>
+              <w:left w:val="single" w:color="000000" w:sz="4"/>
+              <w:bottom w:val="single" w:color="000000" w:sz="4"/>
+              <w:right w:val="single" w:color="000000" w:sz="4"/>
+            </w:tcBorders>
+            <w:shd w:fill="FFFFFF" w:val="clear"/>
+            <w:tcMar>
+              <w:top w:type="dxa" w:w="60"/>
+              <w:left w:type="dxa" w:w="100"/>
+              <w:bottom w:type="dxa" w:w="60"/>
+              <w:right w:type="dxa" w:w="100"/>
+            </w:tcMar>
+          </w:tcPr>
+          <w:p>
+            <w:r>
+              <w:rPr>
+                <w:rFonts w:ascii="Calibri" w:cs="Calibri" w:eastAsia="Calibri" w:hAnsi="Calibri"/>
+              </w:rPr>
+              <w:t xml:space="preserve">Da orientación de seguridad a organizaciones que usan la </w:t>
+            </w:r>
+            <w:r>
+              <w:rPr>
+                <w:rFonts w:ascii="Calibri" w:cs="Calibri" w:eastAsia="Calibri" w:hAnsi="Calibri"/>
+                <w:b/>
+                <w:bCs/>
+              </w:rPr>
+              <w:t xml:space="preserve">computación en la nube</w:t>
+            </w:r>
+            <w:r>
+              <w:rPr>
+                <w:rFonts w:ascii="Calibri" w:cs="Calibri" w:eastAsia="Calibri" w:hAnsi="Calibri"/>
+              </w:rPr>
+              <w:t xml:space="preserve"> o quieren evaluar el riesgo de un proveedor de nube</w:t>
+            </w:r>
+          </w:p>
+        </w:tc>
+      </w:tr>
+    </w:tbl>
+    <w:p>
+      <w:pPr>
+        <w:spacing w:after="80"/>
+      </w:pPr>
+    </w:p>
+    <w:p>
+      <w:pPr>
+        <w:spacing w:after="80" w:before="160"/>
+      </w:pPr>
+      <w:r>
+        <w:rPr>
+          <w:rFonts w:ascii="Calibri" w:cs="Calibri" w:eastAsia="Calibri" w:hAnsi="Calibri"/>
+          <w:b/>
+          <w:bCs/>
+        </w:rPr>
+        <w:t xml:space="preserve">CSA y la nube</w:t>
+      </w:r>
+    </w:p>
+    <w:p>
+      <w:pPr>
+        <w:pStyle w:val="ListParagraph"/>
+        <w:numPr>
+          <w:ilvl w:val="0"/>
+          <w:numId w:val="2"/>
+        </w:numPr>
+        <w:spacing w:after="60"/>
+      </w:pPr>
+      <w:r>
+        <w:rPr>
+          <w:rFonts w:ascii="Calibri" w:cs="Calibri" w:eastAsia="Calibri" w:hAnsi="Calibri"/>
+        </w:rPr>
+        <w:t xml:space="preserve">Su </w:t>
+      </w:r>
+      <w:r>
+        <w:rPr>
+          <w:rFonts w:ascii="Calibri" w:cs="Calibri" w:eastAsia="Calibri" w:hAnsi="Calibri"/>
+          <w:b/>
+          <w:bCs/>
+        </w:rPr>
+        <w:t xml:space="preserve">Matriz de Controles en la Nube (CCM)</w:t>
+      </w:r>
+      <w:r>
+        <w:rPr>
+          <w:rFonts w:ascii="Calibri" w:cs="Calibri" w:eastAsia="Calibri" w:hAnsi="Calibri"/>
+        </w:rPr>
+        <w:t xml:space="preserve"> asigna controles de seguridad específicos de la nube a los estándares principales, mejores prácticas y regulaciones.</w:t>
+      </w:r>
+    </w:p>
+    <w:p>
+      <w:pPr>
+        <w:pStyle w:val="ListParagraph"/>
+        <w:numPr>
+          <w:ilvl w:val="0"/>
+          <w:numId w:val="2"/>
+        </w:numPr>
+        <w:spacing w:after="60"/>
+      </w:pPr>
+      <w:r>
+        <w:rPr>
+          <w:rFonts w:ascii="Calibri" w:cs="Calibri" w:eastAsia="Calibri" w:hAnsi="Calibri"/>
+        </w:rPr>
+        <w:t xml:space="preserve">La CSA CCM se considera un </w:t>
+      </w:r>
+      <w:r>
+        <w:rPr>
+          <w:rFonts w:ascii="Calibri" w:cs="Calibri" w:eastAsia="Calibri" w:hAnsi="Calibri"/>
+          <w:b/>
+          <w:bCs/>
+        </w:rPr>
+        <w:t xml:space="preserve">estándar de facto</w:t>
+      </w:r>
+      <w:r>
+        <w:rPr>
+          <w:rFonts w:ascii="Calibri" w:cs="Calibri" w:eastAsia="Calibri" w:hAnsi="Calibri"/>
+        </w:rPr>
+        <w:t xml:space="preserve"> para el aseguramiento y el cumplimiento de la seguridad en la nube.</w:t>
+      </w:r>
+    </w:p>
+    <w:p>
+      <w:pPr>
+        <w:pStyle w:val="ListParagraph"/>
+        <w:numPr>
+          <w:ilvl w:val="0"/>
+          <w:numId w:val="2"/>
+        </w:numPr>
+        <w:spacing w:after="60"/>
+      </w:pPr>
+      <w:r>
+        <w:rPr>
+          <w:rFonts w:ascii="Calibri" w:cs="Calibri" w:eastAsia="Calibri" w:hAnsi="Calibri"/>
+        </w:rPr>
+        <w:t xml:space="preserve">Los proveedores de servicios deben garantizar que sus controles están bien diseñados y funcionan con eficacia.</w:t>
+      </w:r>
+    </w:p>
+    <w:p>
+      <w:pPr>
+        <w:pStyle w:val="ListParagraph"/>
+        <w:numPr>
+          <w:ilvl w:val="0"/>
+          <w:numId w:val="2"/>
+        </w:numPr>
+        <w:spacing w:after="60"/>
+      </w:pPr>
+      <w:r>
+        <w:rPr>
+          <w:rFonts w:ascii="Calibri" w:cs="Calibri" w:eastAsia="Calibri" w:hAnsi="Calibri"/>
+        </w:rPr>
+        <w:t xml:space="preserve">Una </w:t>
+      </w:r>
+      <w:r>
+        <w:rPr>
+          <w:rFonts w:ascii="Calibri" w:cs="Calibri" w:eastAsia="Calibri" w:hAnsi="Calibri"/>
+          <w:b/>
+          <w:bCs/>
+        </w:rPr>
+        <w:t xml:space="preserve">constancia (SSAE o SOC)</w:t>
+      </w:r>
+      <w:r>
+        <w:rPr>
+          <w:rFonts w:ascii="Calibri" w:cs="Calibri" w:eastAsia="Calibri" w:hAnsi="Calibri"/>
+        </w:rPr>
+        <w:t xml:space="preserve"> confirma que los controles están implementados:</w:t>
+      </w:r>
+    </w:p>
+    <w:p>
+      <w:pPr>
+        <w:pStyle w:val="ListParagraph"/>
+        <w:numPr>
+          <w:ilvl w:val="1"/>
+          <w:numId w:val="2"/>
+        </w:numPr>
+        <w:spacing w:after="60"/>
+      </w:pPr>
+      <w:r>
+        <w:rPr>
+          <w:rFonts w:ascii="Calibri" w:cs="Calibri" w:eastAsia="Calibri" w:hAnsi="Calibri"/>
+          <w:b/>
+          <w:bCs/>
+        </w:rPr>
+        <w:t xml:space="preserve">Tipo I:</w:t>
+      </w:r>
+      <w:r>
+        <w:rPr>
+          <w:rFonts w:ascii="Calibri" w:cs="Calibri" w:eastAsia="Calibri" w:hAnsi="Calibri"/>
+        </w:rPr>
+        <w:t xml:space="preserve"> en un momento específico</w:t>
+      </w:r>
+    </w:p>
+    <w:p>
+      <w:pPr>
+        <w:pStyle w:val="ListParagraph"/>
+        <w:numPr>
+          <w:ilvl w:val="1"/>
+          <w:numId w:val="2"/>
+        </w:numPr>
+        <w:spacing w:after="60"/>
+      </w:pPr>
+      <w:r>
+        <w:rPr>
+          <w:rFonts w:ascii="Calibri" w:cs="Calibri" w:eastAsia="Calibri" w:hAnsi="Calibri"/>
+          <w:b/>
+          <w:bCs/>
+        </w:rPr>
+        <w:t xml:space="preserve">Tipo II:</w:t>
+      </w:r>
+      <w:r>
+        <w:rPr>
+          <w:rFonts w:ascii="Calibri" w:cs="Calibri" w:eastAsia="Calibri" w:hAnsi="Calibri"/>
+        </w:rPr>
+        <w:t xml:space="preserve"> administrados durante un período de </w:t>
+      </w:r>
+      <w:r>
+        <w:rPr>
+          <w:rFonts w:ascii="Calibri" w:cs="Calibri" w:eastAsia="Calibri" w:hAnsi="Calibri"/>
+          <w:b/>
+          <w:bCs/>
+        </w:rPr>
+        <w:t xml:space="preserve">al menos seis meses</w:t>
+      </w:r>
+    </w:p>
+    <w:p>
+      <w:pPr>
+        <w:spacing w:after="80" w:before="160"/>
+      </w:pPr>
+      <w:r>
+        <w:rPr>
+          <w:rFonts w:ascii="Calibri" w:cs="Calibri" w:eastAsia="Calibri" w:hAnsi="Calibri"/>
+          <w:b/>
+          <w:bCs/>
+        </w:rPr>
+        <w:t xml:space="preserve">CMMC</w:t>
+      </w:r>
+    </w:p>
+    <w:p>
+      <w:pPr>
+        <w:pStyle w:val="ListParagraph"/>
+        <w:numPr>
+          <w:ilvl w:val="0"/>
+          <w:numId w:val="2"/>
+        </w:numPr>
+        <w:spacing w:after="60"/>
+      </w:pPr>
+      <w:r>
+        <w:rPr>
+          <w:rFonts w:ascii="Calibri" w:cs="Calibri" w:eastAsia="Calibri" w:hAnsi="Calibri"/>
+        </w:rPr>
+        <w:t xml:space="preserve">Establece </w:t>
+      </w:r>
+      <w:r>
+        <w:rPr>
+          <w:rFonts w:ascii="Calibri" w:cs="Calibri" w:eastAsia="Calibri" w:hAnsi="Calibri"/>
+          <w:b/>
+          <w:bCs/>
+        </w:rPr>
+        <w:t xml:space="preserve">5 niveles de certificación</w:t>
+      </w:r>
+      <w:r>
+        <w:rPr>
+          <w:rFonts w:ascii="Calibri" w:cs="Calibri" w:eastAsia="Calibri" w:hAnsi="Calibri"/>
+        </w:rPr>
+        <w:t xml:space="preserve">: desde "prácticas básicas de higiene cibernética" hasta "prácticas mejoradas que dan capacidades más sofisticadas para detectar y responder a los </w:t>
+      </w:r>
+      <w:r>
+        <w:rPr>
+          <w:rFonts w:ascii="Calibri" w:cs="Calibri" w:eastAsia="Calibri" w:hAnsi="Calibri"/>
+          <w:b/>
+          <w:bCs/>
+        </w:rPr>
+        <w:t xml:space="preserve">APT</w:t>
+      </w:r>
+      <w:r>
+        <w:rPr>
+          <w:rFonts w:ascii="Calibri" w:cs="Calibri" w:eastAsia="Calibri" w:hAnsi="Calibri"/>
+        </w:rPr>
+        <w:t xml:space="preserve">".</w:t>
+      </w:r>
+    </w:p>
     <w:sectPr>
       <w:pgSz w:w="12240" w:h="15840" w:orient="portrait"/>
       <w:pgMar w:top="1200" w:right="1440" w:bottom="1200" w:left="1440" w:header="708" w:footer="708" w:gutter="0"/>

</xml_diff>

<commit_message>
Agrega Módulo 23: Pruebas de seguridad en la red al resumen de módulos 19 en adelante
Co-Authored-By: Claude Sonnet 5.5 <noreply@anthropic.com>
Claude-Session: https://claude.ai/code/session_013iWwbBbHxw2c1QtKDe5PjZ
</commit_message>
<xml_diff>
--- a/Modulos_19_en_adelante_Resumen.docx
+++ b/Modulos_19_en_adelante_Resumen.docx
@@ -9316,6 +9316,2166 @@
           <w:rFonts w:ascii="Calibri" w:cs="Calibri" w:eastAsia="Calibri" w:hAnsi="Calibri"/>
         </w:rPr>
         <w:t xml:space="preserve">".</w:t>
+      </w:r>
+    </w:p>
+    <w:p>
+      <w:r>
+        <w:br w:type="page"/>
+      </w:r>
+    </w:p>
+    <w:p>
+      <w:pPr>
+        <w:spacing w:after="60"/>
+        <w:jc w:val="center"/>
+      </w:pPr>
+      <w:r>
+        <w:rPr>
+          <w:rFonts w:ascii="Calibri" w:cs="Calibri" w:eastAsia="Calibri" w:hAnsi="Calibri"/>
+          <w:b/>
+          <w:bCs/>
+          <w:color w:val="000000"/>
+          <w:sz w:val="24"/>
+          <w:szCs w:val="24"/>
+        </w:rPr>
+        <w:t xml:space="preserve">Módulo 23: Pruebas de seguridad en la red</w:t>
+      </w:r>
+    </w:p>
+    <w:p>
+      <w:pPr>
+        <w:spacing w:after="200"/>
+        <w:jc w:val="center"/>
+      </w:pPr>
+      <w:r>
+        <w:rPr>
+          <w:rFonts w:ascii="Calibri" w:cs="Calibri" w:eastAsia="Calibri" w:hAnsi="Calibri"/>
+          <w:color w:val="000000"/>
+          <w:sz w:val="24"/>
+          <w:szCs w:val="24"/>
+        </w:rPr>
+        <w:t xml:space="preserve">Resumen de ciberseguridad</w:t>
+      </w:r>
+    </w:p>
+    <w:p>
+      <w:pPr>
+        <w:spacing w:after="120" w:before="280"/>
+      </w:pPr>
+      <w:r>
+        <w:rPr>
+          <w:rFonts w:ascii="Calibri" w:cs="Calibri" w:eastAsia="Calibri" w:hAnsi="Calibri"/>
+          <w:b/>
+          <w:bCs/>
+        </w:rPr>
+        <w:t xml:space="preserve">1. Evaluaciones de seguridad</w:t>
+      </w:r>
+    </w:p>
+    <w:p>
+      <w:pPr>
+        <w:spacing w:after="80" w:before="160"/>
+      </w:pPr>
+      <w:r>
+        <w:rPr>
+          <w:rFonts w:ascii="Calibri" w:cs="Calibri" w:eastAsia="Calibri" w:hAnsi="Calibri"/>
+          <w:b/>
+          <w:bCs/>
+        </w:rPr>
+        <w:t xml:space="preserve">Escáner de vulnerabilidades</w:t>
+      </w:r>
+    </w:p>
+    <w:p>
+      <w:pPr>
+        <w:pStyle w:val="ListParagraph"/>
+        <w:numPr>
+          <w:ilvl w:val="0"/>
+          <w:numId w:val="2"/>
+        </w:numPr>
+        <w:spacing w:after="60"/>
+      </w:pPr>
+      <w:r>
+        <w:rPr>
+          <w:rFonts w:ascii="Calibri" w:cs="Calibri" w:eastAsia="Calibri" w:hAnsi="Calibri"/>
+        </w:rPr>
+        <w:t xml:space="preserve">Evalúa computadoras, sistemas informáticos, redes o aplicaciones en busca de </w:t>
+      </w:r>
+      <w:r>
+        <w:rPr>
+          <w:rFonts w:ascii="Calibri" w:cs="Calibri" w:eastAsia="Calibri" w:hAnsi="Calibri"/>
+          <w:b/>
+          <w:bCs/>
+        </w:rPr>
+        <w:t xml:space="preserve">debilidades</w:t>
+      </w:r>
+      <w:r>
+        <w:rPr>
+          <w:rFonts w:ascii="Calibri" w:cs="Calibri" w:eastAsia="Calibri" w:hAnsi="Calibri"/>
+        </w:rPr>
+        <w:t xml:space="preserve">.</w:t>
+      </w:r>
+    </w:p>
+    <w:p>
+      <w:pPr>
+        <w:pStyle w:val="ListParagraph"/>
+        <w:numPr>
+          <w:ilvl w:val="0"/>
+          <w:numId w:val="2"/>
+        </w:numPr>
+        <w:spacing w:after="60"/>
+      </w:pPr>
+      <w:r>
+        <w:rPr>
+          <w:rFonts w:ascii="Calibri" w:cs="Calibri" w:eastAsia="Calibri" w:hAnsi="Calibri"/>
+        </w:rPr>
+        <w:t xml:space="preserve">Los más usados en el mercado: </w:t>
+      </w:r>
+      <w:r>
+        <w:rPr>
+          <w:rFonts w:ascii="Calibri" w:cs="Calibri" w:eastAsia="Calibri" w:hAnsi="Calibri"/>
+          <w:b/>
+          <w:bCs/>
+        </w:rPr>
+        <w:t xml:space="preserve">Nessus, Retina, Core Impact y GFI LanGuard</w:t>
+      </w:r>
+      <w:r>
+        <w:rPr>
+          <w:rFonts w:ascii="Calibri" w:cs="Calibri" w:eastAsia="Calibri" w:hAnsi="Calibri"/>
+        </w:rPr>
+        <w:t xml:space="preserve">.</w:t>
+      </w:r>
+    </w:p>
+    <w:p>
+      <w:pPr>
+        <w:pStyle w:val="ListParagraph"/>
+        <w:numPr>
+          <w:ilvl w:val="0"/>
+          <w:numId w:val="2"/>
+        </w:numPr>
+        <w:spacing w:after="60"/>
+      </w:pPr>
+      <w:r>
+        <w:rPr>
+          <w:rFonts w:ascii="Calibri" w:cs="Calibri" w:eastAsia="Calibri" w:hAnsi="Calibri"/>
+        </w:rPr>
+        <w:t xml:space="preserve">Pueden ser escáneres de </w:t>
+      </w:r>
+      <w:r>
+        <w:rPr>
+          <w:rFonts w:ascii="Calibri" w:cs="Calibri" w:eastAsia="Calibri" w:hAnsi="Calibri"/>
+          <w:b/>
+          <w:bCs/>
+        </w:rPr>
+        <w:t xml:space="preserve">red</w:t>
+      </w:r>
+      <w:r>
+        <w:rPr>
+          <w:rFonts w:ascii="Calibri" w:cs="Calibri" w:eastAsia="Calibri" w:hAnsi="Calibri"/>
+        </w:rPr>
+        <w:t xml:space="preserve">, de </w:t>
+      </w:r>
+      <w:r>
+        <w:rPr>
+          <w:rFonts w:ascii="Calibri" w:cs="Calibri" w:eastAsia="Calibri" w:hAnsi="Calibri"/>
+          <w:b/>
+          <w:bCs/>
+        </w:rPr>
+        <w:t xml:space="preserve">aplicaciones</w:t>
+      </w:r>
+      <w:r>
+        <w:rPr>
+          <w:rFonts w:ascii="Calibri" w:cs="Calibri" w:eastAsia="Calibri" w:hAnsi="Calibri"/>
+        </w:rPr>
+        <w:t xml:space="preserve"> o de </w:t>
+      </w:r>
+      <w:r>
+        <w:rPr>
+          <w:rFonts w:ascii="Calibri" w:cs="Calibri" w:eastAsia="Calibri" w:hAnsi="Calibri"/>
+          <w:b/>
+          <w:bCs/>
+        </w:rPr>
+        <w:t xml:space="preserve">aplicaciones web</w:t>
+      </w:r>
+      <w:r>
+        <w:rPr>
+          <w:rFonts w:ascii="Calibri" w:cs="Calibri" w:eastAsia="Calibri" w:hAnsi="Calibri"/>
+        </w:rPr>
+        <w:t xml:space="preserve">.</w:t>
+      </w:r>
+    </w:p>
+    <w:tbl>
+      <w:tblPr>
+        <w:tblW w:type="dxa" w:w="9360"/>
+        <w:tblBorders>
+          <w:top w:val="single" w:color="auto" w:sz="4"/>
+          <w:left w:val="single" w:color="auto" w:sz="4"/>
+          <w:bottom w:val="single" w:color="auto" w:sz="4"/>
+          <w:right w:val="single" w:color="auto" w:sz="4"/>
+          <w:insideH w:val="single" w:color="auto" w:sz="4"/>
+          <w:insideV w:val="single" w:color="auto" w:sz="4"/>
+        </w:tblBorders>
+      </w:tblPr>
+      <w:tblGrid>
+        <w:gridCol w:w="3000"/>
+        <w:gridCol w:w="6360"/>
+      </w:tblGrid>
+      <w:tr>
+        <w:trPr>
+          <w:tblHeader/>
+        </w:trPr>
+        <w:tc>
+          <w:tcPr>
+            <w:tcW w:type="dxa" w:w="3000"/>
+            <w:tcBorders>
+              <w:top w:val="single" w:color="000000" w:sz="4"/>
+              <w:left w:val="single" w:color="000000" w:sz="4"/>
+              <w:bottom w:val="single" w:color="000000" w:sz="4"/>
+              <w:right w:val="single" w:color="000000" w:sz="4"/>
+            </w:tcBorders>
+            <w:shd w:fill="D9D9D9" w:val="clear"/>
+            <w:tcMar>
+              <w:top w:type="dxa" w:w="60"/>
+              <w:left w:type="dxa" w:w="100"/>
+              <w:bottom w:type="dxa" w:w="60"/>
+              <w:right w:type="dxa" w:w="100"/>
+            </w:tcMar>
+          </w:tcPr>
+          <w:p>
+            <w:r>
+              <w:rPr>
+                <w:rFonts w:ascii="Calibri" w:cs="Calibri" w:eastAsia="Calibri" w:hAnsi="Calibri"/>
+                <w:b/>
+                <w:bCs/>
+                <w:color w:val="000000"/>
+              </w:rPr>
+              <w:t xml:space="preserve">Tipo de escaneo</w:t>
+            </w:r>
+          </w:p>
+        </w:tc>
+        <w:tc>
+          <w:tcPr>
+            <w:tcW w:type="dxa" w:w="6360"/>
+            <w:tcBorders>
+              <w:top w:val="single" w:color="000000" w:sz="4"/>
+              <w:left w:val="single" w:color="000000" w:sz="4"/>
+              <w:bottom w:val="single" w:color="000000" w:sz="4"/>
+              <w:right w:val="single" w:color="000000" w:sz="4"/>
+            </w:tcBorders>
+            <w:shd w:fill="D9D9D9" w:val="clear"/>
+            <w:tcMar>
+              <w:top w:type="dxa" w:w="60"/>
+              <w:left w:type="dxa" w:w="100"/>
+              <w:bottom w:type="dxa" w:w="60"/>
+              <w:right w:type="dxa" w:w="100"/>
+            </w:tcMar>
+          </w:tcPr>
+          <w:p>
+            <w:r>
+              <w:rPr>
+                <w:rFonts w:ascii="Calibri" w:cs="Calibri" w:eastAsia="Calibri" w:hAnsi="Calibri"/>
+                <w:b/>
+                <w:bCs/>
+                <w:color w:val="000000"/>
+              </w:rPr>
+              <w:t xml:space="preserve">Qué hace</w:t>
+            </w:r>
+          </w:p>
+        </w:tc>
+      </w:tr>
+      <w:tr>
+        <w:tc>
+          <w:tcPr>
+            <w:tcW w:type="dxa" w:w="3000"/>
+            <w:tcBorders>
+              <w:top w:val="single" w:color="000000" w:sz="4"/>
+              <w:left w:val="single" w:color="000000" w:sz="4"/>
+              <w:bottom w:val="single" w:color="000000" w:sz="4"/>
+              <w:right w:val="single" w:color="000000" w:sz="4"/>
+            </w:tcBorders>
+            <w:shd w:fill="FFFFFF" w:val="clear"/>
+            <w:tcMar>
+              <w:top w:type="dxa" w:w="60"/>
+              <w:left w:type="dxa" w:w="100"/>
+              <w:bottom w:type="dxa" w:w="60"/>
+              <w:right w:type="dxa" w:w="100"/>
+            </w:tcMar>
+          </w:tcPr>
+          <w:p>
+            <w:r>
+              <w:rPr>
+                <w:rFonts w:ascii="Calibri" w:cs="Calibri" w:eastAsia="Calibri" w:hAnsi="Calibri"/>
+                <w:b/>
+                <w:bCs/>
+              </w:rPr>
+              <w:t xml:space="preserve">Intrusivo</w:t>
+            </w:r>
+          </w:p>
+        </w:tc>
+        <w:tc>
+          <w:tcPr>
+            <w:tcW w:type="dxa" w:w="6360"/>
+            <w:tcBorders>
+              <w:top w:val="single" w:color="000000" w:sz="4"/>
+              <w:left w:val="single" w:color="000000" w:sz="4"/>
+              <w:bottom w:val="single" w:color="000000" w:sz="4"/>
+              <w:right w:val="single" w:color="000000" w:sz="4"/>
+            </w:tcBorders>
+            <w:shd w:fill="FFFFFF" w:val="clear"/>
+            <w:tcMar>
+              <w:top w:type="dxa" w:w="60"/>
+              <w:left w:type="dxa" w:w="100"/>
+              <w:bottom w:type="dxa" w:w="60"/>
+              <w:right w:type="dxa" w:w="100"/>
+            </w:tcMar>
+          </w:tcPr>
+          <w:p>
+            <w:r>
+              <w:rPr>
+                <w:rFonts w:ascii="Calibri" w:cs="Calibri" w:eastAsia="Calibri" w:hAnsi="Calibri"/>
+              </w:rPr>
+              <w:t xml:space="preserve">Intenta </w:t>
+            </w:r>
+            <w:r>
+              <w:rPr>
+                <w:rFonts w:ascii="Calibri" w:cs="Calibri" w:eastAsia="Calibri" w:hAnsi="Calibri"/>
+                <w:b/>
+                <w:bCs/>
+              </w:rPr>
+              <w:t xml:space="preserve">aprovechar las vulnerabilidades</w:t>
+            </w:r>
+            <w:r>
+              <w:rPr>
+                <w:rFonts w:ascii="Calibri" w:cs="Calibri" w:eastAsia="Calibri" w:hAnsi="Calibri"/>
+              </w:rPr>
+              <w:t xml:space="preserve"> e incluso puede </w:t>
+            </w:r>
+            <w:r>
+              <w:rPr>
+                <w:rFonts w:ascii="Calibri" w:cs="Calibri" w:eastAsia="Calibri" w:hAnsi="Calibri"/>
+                <w:b/>
+                <w:bCs/>
+              </w:rPr>
+              <w:t xml:space="preserve">bloquear el objetivo</w:t>
+            </w:r>
+          </w:p>
+        </w:tc>
+      </w:tr>
+      <w:tr>
+        <w:tc>
+          <w:tcPr>
+            <w:tcW w:type="dxa" w:w="3000"/>
+            <w:tcBorders>
+              <w:top w:val="single" w:color="000000" w:sz="4"/>
+              <w:left w:val="single" w:color="000000" w:sz="4"/>
+              <w:bottom w:val="single" w:color="000000" w:sz="4"/>
+              <w:right w:val="single" w:color="000000" w:sz="4"/>
+            </w:tcBorders>
+            <w:shd w:fill="FFFFFF" w:val="clear"/>
+            <w:tcMar>
+              <w:top w:type="dxa" w:w="60"/>
+              <w:left w:type="dxa" w:w="100"/>
+              <w:bottom w:type="dxa" w:w="60"/>
+              <w:right w:type="dxa" w:w="100"/>
+            </w:tcMar>
+          </w:tcPr>
+          <w:p>
+            <w:r>
+              <w:rPr>
+                <w:rFonts w:ascii="Calibri" w:cs="Calibri" w:eastAsia="Calibri" w:hAnsi="Calibri"/>
+                <w:b/>
+                <w:bCs/>
+              </w:rPr>
+              <w:t xml:space="preserve">Con credenciales</w:t>
+            </w:r>
+          </w:p>
+        </w:tc>
+        <w:tc>
+          <w:tcPr>
+            <w:tcW w:type="dxa" w:w="6360"/>
+            <w:tcBorders>
+              <w:top w:val="single" w:color="000000" w:sz="4"/>
+              <w:left w:val="single" w:color="000000" w:sz="4"/>
+              <w:bottom w:val="single" w:color="000000" w:sz="4"/>
+              <w:right w:val="single" w:color="000000" w:sz="4"/>
+            </w:tcBorders>
+            <w:shd w:fill="FFFFFF" w:val="clear"/>
+            <w:tcMar>
+              <w:top w:type="dxa" w:w="60"/>
+              <w:left w:type="dxa" w:w="100"/>
+              <w:bottom w:type="dxa" w:w="60"/>
+              <w:right w:type="dxa" w:w="100"/>
+            </w:tcMar>
+          </w:tcPr>
+          <w:p>
+            <w:r>
+              <w:rPr>
+                <w:rFonts w:ascii="Calibri" w:cs="Calibri" w:eastAsia="Calibri" w:hAnsi="Calibri"/>
+              </w:rPr>
+              <w:t xml:space="preserve">Los nombres de usuario y contraseñas dan </w:t>
+            </w:r>
+            <w:r>
+              <w:rPr>
+                <w:rFonts w:ascii="Calibri" w:cs="Calibri" w:eastAsia="Calibri" w:hAnsi="Calibri"/>
+                <w:b/>
+                <w:bCs/>
+              </w:rPr>
+              <w:t xml:space="preserve">acceso autorizado</w:t>
+            </w:r>
+            <w:r>
+              <w:rPr>
+                <w:rFonts w:ascii="Calibri" w:cs="Calibri" w:eastAsia="Calibri" w:hAnsi="Calibri"/>
+              </w:rPr>
+              <w:t xml:space="preserve"> a un sistema, así que el escáner recopila </w:t>
+            </w:r>
+            <w:r>
+              <w:rPr>
+                <w:rFonts w:ascii="Calibri" w:cs="Calibri" w:eastAsia="Calibri" w:hAnsi="Calibri"/>
+                <w:b/>
+                <w:bCs/>
+              </w:rPr>
+              <w:t xml:space="preserve">más información</w:t>
+            </w:r>
+          </w:p>
+        </w:tc>
+      </w:tr>
+    </w:tbl>
+    <w:p>
+      <w:pPr>
+        <w:spacing w:after="80"/>
+      </w:pPr>
+    </w:p>
+    <w:p>
+      <w:pPr>
+        <w:spacing w:after="80" w:before="160"/>
+      </w:pPr>
+      <w:r>
+        <w:rPr>
+          <w:rFonts w:ascii="Calibri" w:cs="Calibri" w:eastAsia="Calibri" w:hAnsi="Calibri"/>
+          <w:b/>
+          <w:bCs/>
+        </w:rPr>
+        <w:t xml:space="preserve">Herramientas de línea de comandos para evaluar la vulnerabilidad</w:t>
+      </w:r>
+    </w:p>
+    <w:p>
+      <w:pPr>
+        <w:pStyle w:val="ListParagraph"/>
+        <w:numPr>
+          <w:ilvl w:val="0"/>
+          <w:numId w:val="2"/>
+        </w:numPr>
+        <w:spacing w:after="60"/>
+      </w:pPr>
+      <w:r>
+        <w:rPr>
+          <w:rFonts w:ascii="Calibri" w:cs="Calibri" w:eastAsia="Calibri" w:hAnsi="Calibri"/>
+          <w:b/>
+          <w:bCs/>
+        </w:rPr>
+        <w:t xml:space="preserve">ipconfig, ping, arp, tracert, nslookup, netstat, nbtstat, nmap, netcat y hping</w:t>
+      </w:r>
+      <w:r>
+        <w:rPr>
+          <w:rFonts w:ascii="Calibri" w:cs="Calibri" w:eastAsia="Calibri" w:hAnsi="Calibri"/>
+        </w:rPr>
+        <w:t xml:space="preserve">.</w:t>
+      </w:r>
+    </w:p>
+    <w:p>
+      <w:pPr>
+        <w:spacing w:after="80" w:before="160"/>
+      </w:pPr>
+      <w:r>
+        <w:rPr>
+          <w:rFonts w:ascii="Calibri" w:cs="Calibri" w:eastAsia="Calibri" w:hAnsi="Calibri"/>
+          <w:b/>
+          <w:bCs/>
+        </w:rPr>
+        <w:t xml:space="preserve">SIEM y SOAR</w:t>
+      </w:r>
+    </w:p>
+    <w:p>
+      <w:pPr>
+        <w:pStyle w:val="ListParagraph"/>
+        <w:numPr>
+          <w:ilvl w:val="0"/>
+          <w:numId w:val="2"/>
+        </w:numPr>
+        <w:spacing w:after="60"/>
+      </w:pPr>
+      <w:r>
+        <w:rPr>
+          <w:rFonts w:ascii="Calibri" w:cs="Calibri" w:eastAsia="Calibri" w:hAnsi="Calibri"/>
+        </w:rPr>
+        <w:t xml:space="preserve">Los sistemas </w:t>
+      </w:r>
+      <w:r>
+        <w:rPr>
+          <w:rFonts w:ascii="Calibri" w:cs="Calibri" w:eastAsia="Calibri" w:hAnsi="Calibri"/>
+          <w:b/>
+          <w:bCs/>
+        </w:rPr>
+        <w:t xml:space="preserve">SIEM</w:t>
+      </w:r>
+      <w:r>
+        <w:rPr>
+          <w:rFonts w:ascii="Calibri" w:cs="Calibri" w:eastAsia="Calibri" w:hAnsi="Calibri"/>
+        </w:rPr>
+        <w:t xml:space="preserve"> usan recopiladores de registros para </w:t>
+      </w:r>
+      <w:r>
+        <w:rPr>
+          <w:rFonts w:ascii="Calibri" w:cs="Calibri" w:eastAsia="Calibri" w:hAnsi="Calibri"/>
+          <w:b/>
+          <w:bCs/>
+        </w:rPr>
+        <w:t xml:space="preserve">agregar datos</w:t>
+      </w:r>
+      <w:r>
+        <w:rPr>
+          <w:rFonts w:ascii="Calibri" w:cs="Calibri" w:eastAsia="Calibri" w:hAnsi="Calibri"/>
+        </w:rPr>
+        <w:t xml:space="preserve"> de fuentes como dispositivos de seguridad, dispositivos de red, servidores y aplicaciones.</w:t>
+      </w:r>
+    </w:p>
+    <w:p>
+      <w:pPr>
+        <w:pStyle w:val="ListParagraph"/>
+        <w:numPr>
+          <w:ilvl w:val="0"/>
+          <w:numId w:val="2"/>
+        </w:numPr>
+        <w:spacing w:after="60"/>
+      </w:pPr>
+      <w:r>
+        <w:rPr>
+          <w:rFonts w:ascii="Calibri" w:cs="Calibri" w:eastAsia="Calibri" w:hAnsi="Calibri"/>
+        </w:rPr>
+        <w:t xml:space="preserve">Las herramientas </w:t>
+      </w:r>
+      <w:r>
+        <w:rPr>
+          <w:rFonts w:ascii="Calibri" w:cs="Calibri" w:eastAsia="Calibri" w:hAnsi="Calibri"/>
+          <w:b/>
+          <w:bCs/>
+        </w:rPr>
+        <w:t xml:space="preserve">SOAR</w:t>
+      </w:r>
+      <w:r>
+        <w:rPr>
+          <w:rFonts w:ascii="Calibri" w:cs="Calibri" w:eastAsia="Calibri" w:hAnsi="Calibri"/>
+        </w:rPr>
+        <w:t xml:space="preserve"> permiten recopilar datos sobre amenazas de seguridad de varias fuentes y </w:t>
+      </w:r>
+      <w:r>
+        <w:rPr>
+          <w:rFonts w:ascii="Calibri" w:cs="Calibri" w:eastAsia="Calibri" w:hAnsi="Calibri"/>
+          <w:b/>
+          <w:bCs/>
+        </w:rPr>
+        <w:t xml:space="preserve">responder a eventos de bajo nivel sin intervención humana</w:t>
+      </w:r>
+      <w:r>
+        <w:rPr>
+          <w:rFonts w:ascii="Calibri" w:cs="Calibri" w:eastAsia="Calibri" w:hAnsi="Calibri"/>
+        </w:rPr>
+        <w:t xml:space="preserve">.</w:t>
+      </w:r>
+    </w:p>
+    <w:p>
+      <w:pPr>
+        <w:spacing w:after="120" w:before="280"/>
+      </w:pPr>
+      <w:r>
+        <w:rPr>
+          <w:rFonts w:ascii="Calibri" w:cs="Calibri" w:eastAsia="Calibri" w:hAnsi="Calibri"/>
+          <w:b/>
+          <w:bCs/>
+        </w:rPr>
+        <w:t xml:space="preserve">2. Técnicas de pruebas de seguridad de la red</w:t>
+      </w:r>
+    </w:p>
+    <w:p>
+      <w:pPr>
+        <w:pStyle w:val="ListParagraph"/>
+        <w:numPr>
+          <w:ilvl w:val="0"/>
+          <w:numId w:val="2"/>
+        </w:numPr>
+        <w:spacing w:after="60"/>
+      </w:pPr>
+      <w:r>
+        <w:rPr>
+          <w:rFonts w:ascii="Calibri" w:cs="Calibri" w:eastAsia="Calibri" w:hAnsi="Calibri"/>
+        </w:rPr>
+        <w:t xml:space="preserve">La </w:t>
+      </w:r>
+      <w:r>
+        <w:rPr>
+          <w:rFonts w:ascii="Calibri" w:cs="Calibri" w:eastAsia="Calibri" w:hAnsi="Calibri"/>
+          <w:b/>
+          <w:bCs/>
+        </w:rPr>
+        <w:t xml:space="preserve">seguridad de las operaciones</w:t>
+      </w:r>
+      <w:r>
+        <w:rPr>
+          <w:rFonts w:ascii="Calibri" w:cs="Calibri" w:eastAsia="Calibri" w:hAnsi="Calibri"/>
+        </w:rPr>
+        <w:t xml:space="preserve"> se ocupa de las prácticas diarias para </w:t>
+      </w:r>
+      <w:r>
+        <w:rPr>
+          <w:rFonts w:ascii="Calibri" w:cs="Calibri" w:eastAsia="Calibri" w:hAnsi="Calibri"/>
+          <w:b/>
+          <w:bCs/>
+        </w:rPr>
+        <w:t xml:space="preserve">implementar</w:t>
+      </w:r>
+      <w:r>
+        <w:rPr>
+          <w:rFonts w:ascii="Calibri" w:cs="Calibri" w:eastAsia="Calibri" w:hAnsi="Calibri"/>
+        </w:rPr>
+        <w:t xml:space="preserve"> y luego </w:t>
+      </w:r>
+      <w:r>
+        <w:rPr>
+          <w:rFonts w:ascii="Calibri" w:cs="Calibri" w:eastAsia="Calibri" w:hAnsi="Calibri"/>
+          <w:b/>
+          <w:bCs/>
+        </w:rPr>
+        <w:t xml:space="preserve">mantener</w:t>
+      </w:r>
+      <w:r>
+        <w:rPr>
+          <w:rFonts w:ascii="Calibri" w:cs="Calibri" w:eastAsia="Calibri" w:hAnsi="Calibri"/>
+        </w:rPr>
+        <w:t xml:space="preserve"> un sistema seguro.</w:t>
+      </w:r>
+    </w:p>
+    <w:p>
+      <w:pPr>
+        <w:pStyle w:val="ListParagraph"/>
+        <w:numPr>
+          <w:ilvl w:val="0"/>
+          <w:numId w:val="2"/>
+        </w:numPr>
+        <w:spacing w:after="60"/>
+      </w:pPr>
+      <w:r>
+        <w:rPr>
+          <w:rFonts w:ascii="Calibri" w:cs="Calibri" w:eastAsia="Calibri" w:hAnsi="Calibri"/>
+        </w:rPr>
+        <w:t xml:space="preserve">Empieza con el proceso de </w:t>
+      </w:r>
+      <w:r>
+        <w:rPr>
+          <w:rFonts w:ascii="Calibri" w:cs="Calibri" w:eastAsia="Calibri" w:hAnsi="Calibri"/>
+          <w:b/>
+          <w:bCs/>
+        </w:rPr>
+        <w:t xml:space="preserve">planificación e implementación</w:t>
+      </w:r>
+      <w:r>
+        <w:rPr>
+          <w:rFonts w:ascii="Calibri" w:cs="Calibri" w:eastAsia="Calibri" w:hAnsi="Calibri"/>
+        </w:rPr>
+        <w:t xml:space="preserve"> de una red.</w:t>
+      </w:r>
+    </w:p>
+    <w:p>
+      <w:pPr>
+        <w:pStyle w:val="ListParagraph"/>
+        <w:numPr>
+          <w:ilvl w:val="0"/>
+          <w:numId w:val="2"/>
+        </w:numPr>
+        <w:spacing w:after="60"/>
+      </w:pPr>
+      <w:r>
+        <w:rPr>
+          <w:rFonts w:ascii="Calibri" w:cs="Calibri" w:eastAsia="Calibri" w:hAnsi="Calibri"/>
+        </w:rPr>
+        <w:t xml:space="preserve">Las pruebas de seguridad de la red se hacen </w:t>
+      </w:r>
+      <w:r>
+        <w:rPr>
+          <w:rFonts w:ascii="Calibri" w:cs="Calibri" w:eastAsia="Calibri" w:hAnsi="Calibri"/>
+          <w:b/>
+          <w:bCs/>
+        </w:rPr>
+        <w:t xml:space="preserve">durante la implementación y las etapas operativas</w:t>
+      </w:r>
+      <w:r>
+        <w:rPr>
+          <w:rFonts w:ascii="Calibri" w:cs="Calibri" w:eastAsia="Calibri" w:hAnsi="Calibri"/>
+        </w:rPr>
+        <w:t xml:space="preserve">, después de que el sistema se instaló e integró.</w:t>
+      </w:r>
+    </w:p>
+    <w:p>
+      <w:pPr>
+        <w:pStyle w:val="ListParagraph"/>
+        <w:numPr>
+          <w:ilvl w:val="0"/>
+          <w:numId w:val="2"/>
+        </w:numPr>
+        <w:spacing w:after="60"/>
+      </w:pPr>
+      <w:r>
+        <w:rPr>
+          <w:rFonts w:ascii="Calibri" w:cs="Calibri" w:eastAsia="Calibri" w:hAnsi="Calibri"/>
+        </w:rPr>
+        <w:t xml:space="preserve">Se hacen para garantizar que </w:t>
+      </w:r>
+      <w:r>
+        <w:rPr>
+          <w:rFonts w:ascii="Calibri" w:cs="Calibri" w:eastAsia="Calibri" w:hAnsi="Calibri"/>
+          <w:b/>
+          <w:bCs/>
+        </w:rPr>
+        <w:t xml:space="preserve">todas las implementaciones de seguridad funcionen como se espera</w:t>
+      </w:r>
+      <w:r>
+        <w:rPr>
+          <w:rFonts w:ascii="Calibri" w:cs="Calibri" w:eastAsia="Calibri" w:hAnsi="Calibri"/>
+        </w:rPr>
+        <w:t xml:space="preserve">.</w:t>
+      </w:r>
+    </w:p>
+    <w:p>
+      <w:pPr>
+        <w:pStyle w:val="ListParagraph"/>
+        <w:numPr>
+          <w:ilvl w:val="0"/>
+          <w:numId w:val="2"/>
+        </w:numPr>
+        <w:spacing w:after="60"/>
+      </w:pPr>
+      <w:r>
+        <w:rPr>
+          <w:rFonts w:ascii="Calibri" w:cs="Calibri" w:eastAsia="Calibri" w:hAnsi="Calibri"/>
+        </w:rPr>
+        <w:t xml:space="preserve">Un </w:t>
+      </w:r>
+      <w:r>
+        <w:rPr>
+          <w:rFonts w:ascii="Calibri" w:cs="Calibri" w:eastAsia="Calibri" w:hAnsi="Calibri"/>
+          <w:b/>
+          <w:bCs/>
+        </w:rPr>
+        <w:t xml:space="preserve">ST&amp;E</w:t>
+      </w:r>
+      <w:r>
+        <w:rPr>
+          <w:rFonts w:ascii="Calibri" w:cs="Calibri" w:eastAsia="Calibri" w:hAnsi="Calibri"/>
+        </w:rPr>
+        <w:t xml:space="preserve"> es un examen de las medidas de protección que se implementan en una red operativa.</w:t>
+      </w:r>
+    </w:p>
+    <w:p>
+      <w:pPr>
+        <w:spacing w:after="80" w:before="160"/>
+      </w:pPr>
+      <w:r>
+        <w:rPr>
+          <w:rFonts w:ascii="Calibri" w:cs="Calibri" w:eastAsia="Calibri" w:hAnsi="Calibri"/>
+          <w:b/>
+          <w:bCs/>
+        </w:rPr>
+        <w:t xml:space="preserve">Tipos de pruebas de red</w:t>
+      </w:r>
+    </w:p>
+    <w:p>
+      <w:pPr>
+        <w:pStyle w:val="ListParagraph"/>
+        <w:numPr>
+          <w:ilvl w:val="0"/>
+          <w:numId w:val="2"/>
+        </w:numPr>
+        <w:spacing w:after="60"/>
+      </w:pPr>
+      <w:r>
+        <w:rPr>
+          <w:rFonts w:ascii="Calibri" w:cs="Calibri" w:eastAsia="Calibri" w:hAnsi="Calibri"/>
+        </w:rPr>
+        <w:t xml:space="preserve">Penetración</w:t>
+      </w:r>
+    </w:p>
+    <w:p>
+      <w:pPr>
+        <w:pStyle w:val="ListParagraph"/>
+        <w:numPr>
+          <w:ilvl w:val="0"/>
+          <w:numId w:val="2"/>
+        </w:numPr>
+        <w:spacing w:after="60"/>
+      </w:pPr>
+      <w:r>
+        <w:rPr>
+          <w:rFonts w:ascii="Calibri" w:cs="Calibri" w:eastAsia="Calibri" w:hAnsi="Calibri"/>
+        </w:rPr>
+        <w:t xml:space="preserve">Escaneo de red</w:t>
+      </w:r>
+    </w:p>
+    <w:p>
+      <w:pPr>
+        <w:pStyle w:val="ListParagraph"/>
+        <w:numPr>
+          <w:ilvl w:val="0"/>
+          <w:numId w:val="2"/>
+        </w:numPr>
+        <w:spacing w:after="60"/>
+      </w:pPr>
+      <w:r>
+        <w:rPr>
+          <w:rFonts w:ascii="Calibri" w:cs="Calibri" w:eastAsia="Calibri" w:hAnsi="Calibri"/>
+        </w:rPr>
+        <w:t xml:space="preserve">Análisis de vulnerabilidad</w:t>
+      </w:r>
+    </w:p>
+    <w:p>
+      <w:pPr>
+        <w:pStyle w:val="ListParagraph"/>
+        <w:numPr>
+          <w:ilvl w:val="0"/>
+          <w:numId w:val="2"/>
+        </w:numPr>
+        <w:spacing w:after="60"/>
+      </w:pPr>
+      <w:r>
+        <w:rPr>
+          <w:rFonts w:ascii="Calibri" w:cs="Calibri" w:eastAsia="Calibri" w:hAnsi="Calibri"/>
+        </w:rPr>
+        <w:t xml:space="preserve">Descifrado de contraseñas</w:t>
+      </w:r>
+    </w:p>
+    <w:p>
+      <w:pPr>
+        <w:pStyle w:val="ListParagraph"/>
+        <w:numPr>
+          <w:ilvl w:val="0"/>
+          <w:numId w:val="2"/>
+        </w:numPr>
+        <w:spacing w:after="60"/>
+      </w:pPr>
+      <w:r>
+        <w:rPr>
+          <w:rFonts w:ascii="Calibri" w:cs="Calibri" w:eastAsia="Calibri" w:hAnsi="Calibri"/>
+        </w:rPr>
+        <w:t xml:space="preserve">Revisión de registros</w:t>
+      </w:r>
+    </w:p>
+    <w:p>
+      <w:pPr>
+        <w:pStyle w:val="ListParagraph"/>
+        <w:numPr>
+          <w:ilvl w:val="0"/>
+          <w:numId w:val="2"/>
+        </w:numPr>
+        <w:spacing w:after="60"/>
+      </w:pPr>
+      <w:r>
+        <w:rPr>
+          <w:rFonts w:ascii="Calibri" w:cs="Calibri" w:eastAsia="Calibri" w:hAnsi="Calibri"/>
+        </w:rPr>
+        <w:t xml:space="preserve">Verificadores de integridad</w:t>
+      </w:r>
+    </w:p>
+    <w:p>
+      <w:pPr>
+        <w:pStyle w:val="ListParagraph"/>
+        <w:numPr>
+          <w:ilvl w:val="0"/>
+          <w:numId w:val="2"/>
+        </w:numPr>
+        <w:spacing w:after="60"/>
+      </w:pPr>
+      <w:r>
+        <w:rPr>
+          <w:rFonts w:ascii="Calibri" w:cs="Calibri" w:eastAsia="Calibri" w:hAnsi="Calibri"/>
+        </w:rPr>
+        <w:t xml:space="preserve">Detección de virus</w:t>
+      </w:r>
+    </w:p>
+    <w:p>
+      <w:pPr>
+        <w:spacing w:after="120" w:before="280"/>
+      </w:pPr>
+      <w:r>
+        <w:rPr>
+          <w:rFonts w:ascii="Calibri" w:cs="Calibri" w:eastAsia="Calibri" w:hAnsi="Calibri"/>
+          <w:b/>
+          <w:bCs/>
+        </w:rPr>
+        <w:t xml:space="preserve">3. Herramientas de pruebas de seguridad de la red</w:t>
+      </w:r>
+    </w:p>
+    <w:p>
+      <w:pPr>
+        <w:spacing w:after="100"/>
+      </w:pPr>
+      <w:r>
+        <w:rPr>
+          <w:rFonts w:ascii="Calibri" w:cs="Calibri" w:eastAsia="Calibri" w:hAnsi="Calibri"/>
+        </w:rPr>
+        <w:t xml:space="preserve">Herramientas de software para pruebas de red:</w:t>
+      </w:r>
+    </w:p>
+    <w:tbl>
+      <w:tblPr>
+        <w:tblW w:type="dxa" w:w="9360"/>
+        <w:tblBorders>
+          <w:top w:val="single" w:color="auto" w:sz="4"/>
+          <w:left w:val="single" w:color="auto" w:sz="4"/>
+          <w:bottom w:val="single" w:color="auto" w:sz="4"/>
+          <w:right w:val="single" w:color="auto" w:sz="4"/>
+          <w:insideH w:val="single" w:color="auto" w:sz="4"/>
+          <w:insideV w:val="single" w:color="auto" w:sz="4"/>
+        </w:tblBorders>
+      </w:tblPr>
+      <w:tblGrid>
+        <w:gridCol w:w="2600"/>
+        <w:gridCol w:w="6760"/>
+      </w:tblGrid>
+      <w:tr>
+        <w:trPr>
+          <w:tblHeader/>
+        </w:trPr>
+        <w:tc>
+          <w:tcPr>
+            <w:tcW w:type="dxa" w:w="2600"/>
+            <w:tcBorders>
+              <w:top w:val="single" w:color="000000" w:sz="4"/>
+              <w:left w:val="single" w:color="000000" w:sz="4"/>
+              <w:bottom w:val="single" w:color="000000" w:sz="4"/>
+              <w:right w:val="single" w:color="000000" w:sz="4"/>
+            </w:tcBorders>
+            <w:shd w:fill="D9D9D9" w:val="clear"/>
+            <w:tcMar>
+              <w:top w:type="dxa" w:w="60"/>
+              <w:left w:type="dxa" w:w="100"/>
+              <w:bottom w:type="dxa" w:w="60"/>
+              <w:right w:type="dxa" w:w="100"/>
+            </w:tcMar>
+          </w:tcPr>
+          <w:p>
+            <w:r>
+              <w:rPr>
+                <w:rFonts w:ascii="Calibri" w:cs="Calibri" w:eastAsia="Calibri" w:hAnsi="Calibri"/>
+                <w:b/>
+                <w:bCs/>
+                <w:color w:val="000000"/>
+              </w:rPr>
+              <w:t xml:space="preserve">Herramienta</w:t>
+            </w:r>
+          </w:p>
+        </w:tc>
+        <w:tc>
+          <w:tcPr>
+            <w:tcW w:type="dxa" w:w="6760"/>
+            <w:tcBorders>
+              <w:top w:val="single" w:color="000000" w:sz="4"/>
+              <w:left w:val="single" w:color="000000" w:sz="4"/>
+              <w:bottom w:val="single" w:color="000000" w:sz="4"/>
+              <w:right w:val="single" w:color="000000" w:sz="4"/>
+            </w:tcBorders>
+            <w:shd w:fill="D9D9D9" w:val="clear"/>
+            <w:tcMar>
+              <w:top w:type="dxa" w:w="60"/>
+              <w:left w:type="dxa" w:w="100"/>
+              <w:bottom w:type="dxa" w:w="60"/>
+              <w:right w:type="dxa" w:w="100"/>
+            </w:tcMar>
+          </w:tcPr>
+          <w:p>
+            <w:r>
+              <w:rPr>
+                <w:rFonts w:ascii="Calibri" w:cs="Calibri" w:eastAsia="Calibri" w:hAnsi="Calibri"/>
+                <w:b/>
+                <w:bCs/>
+                <w:color w:val="000000"/>
+              </w:rPr>
+              <w:t xml:space="preserve">Qué hace</w:t>
+            </w:r>
+          </w:p>
+        </w:tc>
+      </w:tr>
+      <w:tr>
+        <w:tc>
+          <w:tcPr>
+            <w:tcW w:type="dxa" w:w="2600"/>
+            <w:tcBorders>
+              <w:top w:val="single" w:color="000000" w:sz="4"/>
+              <w:left w:val="single" w:color="000000" w:sz="4"/>
+              <w:bottom w:val="single" w:color="000000" w:sz="4"/>
+              <w:right w:val="single" w:color="000000" w:sz="4"/>
+            </w:tcBorders>
+            <w:shd w:fill="FFFFFF" w:val="clear"/>
+            <w:tcMar>
+              <w:top w:type="dxa" w:w="60"/>
+              <w:left w:type="dxa" w:w="100"/>
+              <w:bottom w:type="dxa" w:w="60"/>
+              <w:right w:type="dxa" w:w="100"/>
+            </w:tcMar>
+          </w:tcPr>
+          <w:p>
+            <w:r>
+              <w:rPr>
+                <w:rFonts w:ascii="Calibri" w:cs="Calibri" w:eastAsia="Calibri" w:hAnsi="Calibri"/>
+                <w:b/>
+                <w:bCs/>
+              </w:rPr>
+              <w:t xml:space="preserve">Nmap / Zenmap</w:t>
+            </w:r>
+          </w:p>
+        </w:tc>
+        <w:tc>
+          <w:tcPr>
+            <w:tcW w:type="dxa" w:w="6760"/>
+            <w:tcBorders>
+              <w:top w:val="single" w:color="000000" w:sz="4"/>
+              <w:left w:val="single" w:color="000000" w:sz="4"/>
+              <w:bottom w:val="single" w:color="000000" w:sz="4"/>
+              <w:right w:val="single" w:color="000000" w:sz="4"/>
+            </w:tcBorders>
+            <w:shd w:fill="FFFFFF" w:val="clear"/>
+            <w:tcMar>
+              <w:top w:type="dxa" w:w="60"/>
+              <w:left w:type="dxa" w:w="100"/>
+              <w:bottom w:type="dxa" w:w="60"/>
+              <w:right w:type="dxa" w:w="100"/>
+            </w:tcMar>
+          </w:tcPr>
+          <w:p>
+            <w:r>
+              <w:rPr>
+                <w:rFonts w:ascii="Calibri" w:cs="Calibri" w:eastAsia="Calibri" w:hAnsi="Calibri"/>
+              </w:rPr>
+              <w:t xml:space="preserve">Escaneo y barrido clásico de puertos </w:t>
+            </w:r>
+            <w:r>
+              <w:rPr>
+                <w:rFonts w:ascii="Calibri" w:cs="Calibri" w:eastAsia="Calibri" w:hAnsi="Calibri"/>
+                <w:b/>
+                <w:bCs/>
+              </w:rPr>
+              <w:t xml:space="preserve">TCP y UDP</w:t>
+            </w:r>
+            <w:r>
+              <w:rPr>
+                <w:rFonts w:ascii="Calibri" w:cs="Calibri" w:eastAsia="Calibri" w:hAnsi="Calibri"/>
+              </w:rPr>
+              <w:t xml:space="preserve">, escaneo y barridos </w:t>
+            </w:r>
+            <w:r>
+              <w:rPr>
+                <w:rFonts w:ascii="Calibri" w:cs="Calibri" w:eastAsia="Calibri" w:hAnsi="Calibri"/>
+                <w:b/>
+                <w:bCs/>
+              </w:rPr>
+              <w:t xml:space="preserve">sigilosos</w:t>
+            </w:r>
+            <w:r>
+              <w:rPr>
+                <w:rFonts w:ascii="Calibri" w:cs="Calibri" w:eastAsia="Calibri" w:hAnsi="Calibri"/>
+              </w:rPr>
+              <w:t xml:space="preserve"> de puertos UDP y TCP, e identificación de </w:t>
+            </w:r>
+            <w:r>
+              <w:rPr>
+                <w:rFonts w:ascii="Calibri" w:cs="Calibri" w:eastAsia="Calibri" w:hAnsi="Calibri"/>
+                <w:b/>
+                <w:bCs/>
+              </w:rPr>
+              <w:t xml:space="preserve">sistema operativo remoto</w:t>
+            </w:r>
+          </w:p>
+        </w:tc>
+      </w:tr>
+      <w:tr>
+        <w:tc>
+          <w:tcPr>
+            <w:tcW w:type="dxa" w:w="2600"/>
+            <w:tcBorders>
+              <w:top w:val="single" w:color="000000" w:sz="4"/>
+              <w:left w:val="single" w:color="000000" w:sz="4"/>
+              <w:bottom w:val="single" w:color="000000" w:sz="4"/>
+              <w:right w:val="single" w:color="000000" w:sz="4"/>
+            </w:tcBorders>
+            <w:shd w:fill="FFFFFF" w:val="clear"/>
+            <w:tcMar>
+              <w:top w:type="dxa" w:w="60"/>
+              <w:left w:type="dxa" w:w="100"/>
+              <w:bottom w:type="dxa" w:w="60"/>
+              <w:right w:type="dxa" w:w="100"/>
+            </w:tcMar>
+          </w:tcPr>
+          <w:p>
+            <w:r>
+              <w:rPr>
+                <w:rFonts w:ascii="Calibri" w:cs="Calibri" w:eastAsia="Calibri" w:hAnsi="Calibri"/>
+                <w:b/>
+                <w:bCs/>
+              </w:rPr>
+              <w:t xml:space="preserve">SuperScan</w:t>
+            </w:r>
+          </w:p>
+        </w:tc>
+        <w:tc>
+          <w:tcPr>
+            <w:tcW w:type="dxa" w:w="6760"/>
+            <w:tcBorders>
+              <w:top w:val="single" w:color="000000" w:sz="4"/>
+              <w:left w:val="single" w:color="000000" w:sz="4"/>
+              <w:bottom w:val="single" w:color="000000" w:sz="4"/>
+              <w:right w:val="single" w:color="000000" w:sz="4"/>
+            </w:tcBorders>
+            <w:shd w:fill="FFFFFF" w:val="clear"/>
+            <w:tcMar>
+              <w:top w:type="dxa" w:w="60"/>
+              <w:left w:type="dxa" w:w="100"/>
+              <w:bottom w:type="dxa" w:w="60"/>
+              <w:right w:type="dxa" w:w="100"/>
+            </w:tcMar>
+          </w:tcPr>
+          <w:p>
+            <w:r>
+              <w:rPr>
+                <w:rFonts w:ascii="Calibri" w:cs="Calibri" w:eastAsia="Calibri" w:hAnsi="Calibri"/>
+              </w:rPr>
+              <w:t xml:space="preserve">Herramienta de </w:t>
+            </w:r>
+            <w:r>
+              <w:rPr>
+                <w:rFonts w:ascii="Calibri" w:cs="Calibri" w:eastAsia="Calibri" w:hAnsi="Calibri"/>
+                <w:b/>
+                <w:bCs/>
+              </w:rPr>
+              <w:t xml:space="preserve">análisis de puertos de Microsoft Windows</w:t>
+            </w:r>
+            <w:r>
+              <w:rPr>
+                <w:rFonts w:ascii="Calibri" w:cs="Calibri" w:eastAsia="Calibri" w:hAnsi="Calibri"/>
+              </w:rPr>
+              <w:t xml:space="preserve">. Corre en la mayoría de las versiones de Windows y requiere </w:t>
+            </w:r>
+            <w:r>
+              <w:rPr>
+                <w:rFonts w:ascii="Calibri" w:cs="Calibri" w:eastAsia="Calibri" w:hAnsi="Calibri"/>
+                <w:b/>
+                <w:bCs/>
+              </w:rPr>
+              <w:t xml:space="preserve">privilegios de administrador</w:t>
+            </w:r>
+          </w:p>
+        </w:tc>
+      </w:tr>
+      <w:tr>
+        <w:tc>
+          <w:tcPr>
+            <w:tcW w:type="dxa" w:w="2600"/>
+            <w:tcBorders>
+              <w:top w:val="single" w:color="000000" w:sz="4"/>
+              <w:left w:val="single" w:color="000000" w:sz="4"/>
+              <w:bottom w:val="single" w:color="000000" w:sz="4"/>
+              <w:right w:val="single" w:color="000000" w:sz="4"/>
+            </w:tcBorders>
+            <w:shd w:fill="FFFFFF" w:val="clear"/>
+            <w:tcMar>
+              <w:top w:type="dxa" w:w="60"/>
+              <w:left w:type="dxa" w:w="100"/>
+              <w:bottom w:type="dxa" w:w="60"/>
+              <w:right w:type="dxa" w:w="100"/>
+            </w:tcMar>
+          </w:tcPr>
+          <w:p>
+            <w:r>
+              <w:rPr>
+                <w:rFonts w:ascii="Calibri" w:cs="Calibri" w:eastAsia="Calibri" w:hAnsi="Calibri"/>
+                <w:b/>
+                <w:bCs/>
+              </w:rPr>
+              <w:t xml:space="preserve">SIEM</w:t>
+            </w:r>
+          </w:p>
+        </w:tc>
+        <w:tc>
+          <w:tcPr>
+            <w:tcW w:type="dxa" w:w="6760"/>
+            <w:tcBorders>
+              <w:top w:val="single" w:color="000000" w:sz="4"/>
+              <w:left w:val="single" w:color="000000" w:sz="4"/>
+              <w:bottom w:val="single" w:color="000000" w:sz="4"/>
+              <w:right w:val="single" w:color="000000" w:sz="4"/>
+            </w:tcBorders>
+            <w:shd w:fill="FFFFFF" w:val="clear"/>
+            <w:tcMar>
+              <w:top w:type="dxa" w:w="60"/>
+              <w:left w:type="dxa" w:w="100"/>
+              <w:bottom w:type="dxa" w:w="60"/>
+              <w:right w:type="dxa" w:w="100"/>
+            </w:tcMar>
+          </w:tcPr>
+          <w:p>
+            <w:r>
+              <w:rPr>
+                <w:rFonts w:ascii="Calibri" w:cs="Calibri" w:eastAsia="Calibri" w:hAnsi="Calibri"/>
+              </w:rPr>
+              <w:t xml:space="preserve">Da </w:t>
+            </w:r>
+            <w:r>
+              <w:rPr>
+                <w:rFonts w:ascii="Calibri" w:cs="Calibri" w:eastAsia="Calibri" w:hAnsi="Calibri"/>
+                <w:b/>
+                <w:bCs/>
+              </w:rPr>
+              <w:t xml:space="preserve">correlación, agregación, análisis forense y retención</w:t>
+            </w:r>
+          </w:p>
+        </w:tc>
+      </w:tr>
+      <w:tr>
+        <w:tc>
+          <w:tcPr>
+            <w:tcW w:type="dxa" w:w="2600"/>
+            <w:tcBorders>
+              <w:top w:val="single" w:color="000000" w:sz="4"/>
+              <w:left w:val="single" w:color="000000" w:sz="4"/>
+              <w:bottom w:val="single" w:color="000000" w:sz="4"/>
+              <w:right w:val="single" w:color="000000" w:sz="4"/>
+            </w:tcBorders>
+            <w:shd w:fill="FFFFFF" w:val="clear"/>
+            <w:tcMar>
+              <w:top w:type="dxa" w:w="60"/>
+              <w:left w:type="dxa" w:w="100"/>
+              <w:bottom w:type="dxa" w:w="60"/>
+              <w:right w:type="dxa" w:w="100"/>
+            </w:tcMar>
+          </w:tcPr>
+          <w:p>
+            <w:r>
+              <w:rPr>
+                <w:rFonts w:ascii="Calibri" w:cs="Calibri" w:eastAsia="Calibri" w:hAnsi="Calibri"/>
+                <w:b/>
+                <w:bCs/>
+              </w:rPr>
+              <w:t xml:space="preserve">GFI LANguard</w:t>
+            </w:r>
+          </w:p>
+        </w:tc>
+        <w:tc>
+          <w:tcPr>
+            <w:tcW w:type="dxa" w:w="6760"/>
+            <w:tcBorders>
+              <w:top w:val="single" w:color="000000" w:sz="4"/>
+              <w:left w:val="single" w:color="000000" w:sz="4"/>
+              <w:bottom w:val="single" w:color="000000" w:sz="4"/>
+              <w:right w:val="single" w:color="000000" w:sz="4"/>
+            </w:tcBorders>
+            <w:shd w:fill="FFFFFF" w:val="clear"/>
+            <w:tcMar>
+              <w:top w:type="dxa" w:w="60"/>
+              <w:left w:type="dxa" w:w="100"/>
+              <w:bottom w:type="dxa" w:w="60"/>
+              <w:right w:type="dxa" w:w="100"/>
+            </w:tcMar>
+          </w:tcPr>
+          <w:p>
+            <w:r>
+              <w:rPr>
+                <w:rFonts w:ascii="Calibri" w:cs="Calibri" w:eastAsia="Calibri" w:hAnsi="Calibri"/>
+              </w:rPr>
+              <w:t xml:space="preserve">Escáner de vulnerabilidades</w:t>
+            </w:r>
+          </w:p>
+        </w:tc>
+      </w:tr>
+      <w:tr>
+        <w:tc>
+          <w:tcPr>
+            <w:tcW w:type="dxa" w:w="2600"/>
+            <w:tcBorders>
+              <w:top w:val="single" w:color="000000" w:sz="4"/>
+              <w:left w:val="single" w:color="000000" w:sz="4"/>
+              <w:bottom w:val="single" w:color="000000" w:sz="4"/>
+              <w:right w:val="single" w:color="000000" w:sz="4"/>
+            </w:tcBorders>
+            <w:shd w:fill="FFFFFF" w:val="clear"/>
+            <w:tcMar>
+              <w:top w:type="dxa" w:w="60"/>
+              <w:left w:type="dxa" w:w="100"/>
+              <w:bottom w:type="dxa" w:w="60"/>
+              <w:right w:type="dxa" w:w="100"/>
+            </w:tcMar>
+          </w:tcPr>
+          <w:p>
+            <w:r>
+              <w:rPr>
+                <w:rFonts w:ascii="Calibri" w:cs="Calibri" w:eastAsia="Calibri" w:hAnsi="Calibri"/>
+                <w:b/>
+                <w:bCs/>
+              </w:rPr>
+              <w:t xml:space="preserve">Tripwire</w:t>
+            </w:r>
+          </w:p>
+        </w:tc>
+        <w:tc>
+          <w:tcPr>
+            <w:tcW w:type="dxa" w:w="6760"/>
+            <w:tcBorders>
+              <w:top w:val="single" w:color="000000" w:sz="4"/>
+              <w:left w:val="single" w:color="000000" w:sz="4"/>
+              <w:bottom w:val="single" w:color="000000" w:sz="4"/>
+              <w:right w:val="single" w:color="000000" w:sz="4"/>
+            </w:tcBorders>
+            <w:shd w:fill="FFFFFF" w:val="clear"/>
+            <w:tcMar>
+              <w:top w:type="dxa" w:w="60"/>
+              <w:left w:type="dxa" w:w="100"/>
+              <w:bottom w:type="dxa" w:w="60"/>
+              <w:right w:type="dxa" w:w="100"/>
+            </w:tcMar>
+          </w:tcPr>
+          <w:p>
+            <w:r>
+              <w:rPr>
+                <w:rFonts w:ascii="Calibri" w:cs="Calibri" w:eastAsia="Calibri" w:hAnsi="Calibri"/>
+              </w:rPr>
+              <w:t xml:space="preserve">Verificador de integridad</w:t>
+            </w:r>
+          </w:p>
+        </w:tc>
+      </w:tr>
+      <w:tr>
+        <w:tc>
+          <w:tcPr>
+            <w:tcW w:type="dxa" w:w="2600"/>
+            <w:tcBorders>
+              <w:top w:val="single" w:color="000000" w:sz="4"/>
+              <w:left w:val="single" w:color="000000" w:sz="4"/>
+              <w:bottom w:val="single" w:color="000000" w:sz="4"/>
+              <w:right w:val="single" w:color="000000" w:sz="4"/>
+            </w:tcBorders>
+            <w:shd w:fill="FFFFFF" w:val="clear"/>
+            <w:tcMar>
+              <w:top w:type="dxa" w:w="60"/>
+              <w:left w:type="dxa" w:w="100"/>
+              <w:bottom w:type="dxa" w:w="60"/>
+              <w:right w:type="dxa" w:w="100"/>
+            </w:tcMar>
+          </w:tcPr>
+          <w:p>
+            <w:r>
+              <w:rPr>
+                <w:rFonts w:ascii="Calibri" w:cs="Calibri" w:eastAsia="Calibri" w:hAnsi="Calibri"/>
+                <w:b/>
+                <w:bCs/>
+              </w:rPr>
+              <w:t xml:space="preserve">Nessus</w:t>
+            </w:r>
+          </w:p>
+        </w:tc>
+        <w:tc>
+          <w:tcPr>
+            <w:tcW w:type="dxa" w:w="6760"/>
+            <w:tcBorders>
+              <w:top w:val="single" w:color="000000" w:sz="4"/>
+              <w:left w:val="single" w:color="000000" w:sz="4"/>
+              <w:bottom w:val="single" w:color="000000" w:sz="4"/>
+              <w:right w:val="single" w:color="000000" w:sz="4"/>
+            </w:tcBorders>
+            <w:shd w:fill="FFFFFF" w:val="clear"/>
+            <w:tcMar>
+              <w:top w:type="dxa" w:w="60"/>
+              <w:left w:type="dxa" w:w="100"/>
+              <w:bottom w:type="dxa" w:w="60"/>
+              <w:right w:type="dxa" w:w="100"/>
+            </w:tcMar>
+          </w:tcPr>
+          <w:p>
+            <w:r>
+              <w:rPr>
+                <w:rFonts w:ascii="Calibri" w:cs="Calibri" w:eastAsia="Calibri" w:hAnsi="Calibri"/>
+              </w:rPr>
+              <w:t xml:space="preserve">Escáner de vulnerabilidades</w:t>
+            </w:r>
+          </w:p>
+        </w:tc>
+      </w:tr>
+      <w:tr>
+        <w:tc>
+          <w:tcPr>
+            <w:tcW w:type="dxa" w:w="2600"/>
+            <w:tcBorders>
+              <w:top w:val="single" w:color="000000" w:sz="4"/>
+              <w:left w:val="single" w:color="000000" w:sz="4"/>
+              <w:bottom w:val="single" w:color="000000" w:sz="4"/>
+              <w:right w:val="single" w:color="000000" w:sz="4"/>
+            </w:tcBorders>
+            <w:shd w:fill="FFFFFF" w:val="clear"/>
+            <w:tcMar>
+              <w:top w:type="dxa" w:w="60"/>
+              <w:left w:type="dxa" w:w="100"/>
+              <w:bottom w:type="dxa" w:w="60"/>
+              <w:right w:type="dxa" w:w="100"/>
+            </w:tcMar>
+          </w:tcPr>
+          <w:p>
+            <w:r>
+              <w:rPr>
+                <w:rFonts w:ascii="Calibri" w:cs="Calibri" w:eastAsia="Calibri" w:hAnsi="Calibri"/>
+                <w:b/>
+                <w:bCs/>
+              </w:rPr>
+              <w:t xml:space="preserve">L0phtCrack</w:t>
+            </w:r>
+          </w:p>
+        </w:tc>
+        <w:tc>
+          <w:tcPr>
+            <w:tcW w:type="dxa" w:w="6760"/>
+            <w:tcBorders>
+              <w:top w:val="single" w:color="000000" w:sz="4"/>
+              <w:left w:val="single" w:color="000000" w:sz="4"/>
+              <w:bottom w:val="single" w:color="000000" w:sz="4"/>
+              <w:right w:val="single" w:color="000000" w:sz="4"/>
+            </w:tcBorders>
+            <w:shd w:fill="FFFFFF" w:val="clear"/>
+            <w:tcMar>
+              <w:top w:type="dxa" w:w="60"/>
+              <w:left w:type="dxa" w:w="100"/>
+              <w:bottom w:type="dxa" w:w="60"/>
+              <w:right w:type="dxa" w:w="100"/>
+            </w:tcMar>
+          </w:tcPr>
+          <w:p>
+            <w:r>
+              <w:rPr>
+                <w:rFonts w:ascii="Calibri" w:cs="Calibri" w:eastAsia="Calibri" w:hAnsi="Calibri"/>
+              </w:rPr>
+              <w:t xml:space="preserve">Descifrado de contraseñas</w:t>
+            </w:r>
+          </w:p>
+        </w:tc>
+      </w:tr>
+      <w:tr>
+        <w:tc>
+          <w:tcPr>
+            <w:tcW w:type="dxa" w:w="2600"/>
+            <w:tcBorders>
+              <w:top w:val="single" w:color="000000" w:sz="4"/>
+              <w:left w:val="single" w:color="000000" w:sz="4"/>
+              <w:bottom w:val="single" w:color="000000" w:sz="4"/>
+              <w:right w:val="single" w:color="000000" w:sz="4"/>
+            </w:tcBorders>
+            <w:shd w:fill="FFFFFF" w:val="clear"/>
+            <w:tcMar>
+              <w:top w:type="dxa" w:w="60"/>
+              <w:left w:type="dxa" w:w="100"/>
+              <w:bottom w:type="dxa" w:w="60"/>
+              <w:right w:type="dxa" w:w="100"/>
+            </w:tcMar>
+          </w:tcPr>
+          <w:p>
+            <w:r>
+              <w:rPr>
+                <w:rFonts w:ascii="Calibri" w:cs="Calibri" w:eastAsia="Calibri" w:hAnsi="Calibri"/>
+                <w:b/>
+                <w:bCs/>
+              </w:rPr>
+              <w:t xml:space="preserve">Metasploit</w:t>
+            </w:r>
+          </w:p>
+        </w:tc>
+        <w:tc>
+          <w:tcPr>
+            <w:tcW w:type="dxa" w:w="6760"/>
+            <w:tcBorders>
+              <w:top w:val="single" w:color="000000" w:sz="4"/>
+              <w:left w:val="single" w:color="000000" w:sz="4"/>
+              <w:bottom w:val="single" w:color="000000" w:sz="4"/>
+              <w:right w:val="single" w:color="000000" w:sz="4"/>
+            </w:tcBorders>
+            <w:shd w:fill="FFFFFF" w:val="clear"/>
+            <w:tcMar>
+              <w:top w:type="dxa" w:w="60"/>
+              <w:left w:type="dxa" w:w="100"/>
+              <w:bottom w:type="dxa" w:w="60"/>
+              <w:right w:type="dxa" w:w="100"/>
+            </w:tcMar>
+          </w:tcPr>
+          <w:p>
+            <w:r>
+              <w:rPr>
+                <w:rFonts w:ascii="Calibri" w:cs="Calibri" w:eastAsia="Calibri" w:hAnsi="Calibri"/>
+              </w:rPr>
+              <w:t xml:space="preserve">Pruebas de penetración</w:t>
+            </w:r>
+          </w:p>
+        </w:tc>
+      </w:tr>
+    </w:tbl>
+    <w:p>
+      <w:pPr>
+        <w:spacing w:after="80"/>
+      </w:pPr>
+    </w:p>
+    <w:p>
+      <w:pPr>
+        <w:spacing w:after="120" w:before="280"/>
+      </w:pPr>
+      <w:r>
+        <w:rPr>
+          <w:rFonts w:ascii="Calibri" w:cs="Calibri" w:eastAsia="Calibri" w:hAnsi="Calibri"/>
+          <w:b/>
+          <w:bCs/>
+        </w:rPr>
+        <w:t xml:space="preserve">4. Pruebas de penetración</w:t>
+      </w:r>
+    </w:p>
+    <w:p>
+      <w:pPr>
+        <w:pStyle w:val="ListParagraph"/>
+        <w:numPr>
+          <w:ilvl w:val="0"/>
+          <w:numId w:val="2"/>
+        </w:numPr>
+        <w:spacing w:after="60"/>
+      </w:pPr>
+      <w:r>
+        <w:rPr>
+          <w:rFonts w:ascii="Calibri" w:cs="Calibri" w:eastAsia="Calibri" w:hAnsi="Calibri"/>
+        </w:rPr>
+        <w:t xml:space="preserve">Es una forma de probar las </w:t>
+      </w:r>
+      <w:r>
+        <w:rPr>
+          <w:rFonts w:ascii="Calibri" w:cs="Calibri" w:eastAsia="Calibri" w:hAnsi="Calibri"/>
+          <w:b/>
+          <w:bCs/>
+        </w:rPr>
+        <w:t xml:space="preserve">áreas de debilidad</w:t>
+      </w:r>
+      <w:r>
+        <w:rPr>
+          <w:rFonts w:ascii="Calibri" w:cs="Calibri" w:eastAsia="Calibri" w:hAnsi="Calibri"/>
+        </w:rPr>
+        <w:t xml:space="preserve"> de los sistemas usando distintas </w:t>
+      </w:r>
+      <w:r>
+        <w:rPr>
+          <w:rFonts w:ascii="Calibri" w:cs="Calibri" w:eastAsia="Calibri" w:hAnsi="Calibri"/>
+          <w:b/>
+          <w:bCs/>
+        </w:rPr>
+        <w:t xml:space="preserve">técnicas maliciosas</w:t>
+      </w:r>
+      <w:r>
+        <w:rPr>
+          <w:rFonts w:ascii="Calibri" w:cs="Calibri" w:eastAsia="Calibri" w:hAnsi="Calibri"/>
+        </w:rPr>
+        <w:t xml:space="preserve">.</w:t>
+      </w:r>
+    </w:p>
+    <w:p>
+      <w:pPr>
+        <w:pStyle w:val="ListParagraph"/>
+        <w:numPr>
+          <w:ilvl w:val="0"/>
+          <w:numId w:val="2"/>
+        </w:numPr>
+        <w:spacing w:after="60"/>
+      </w:pPr>
+      <w:r>
+        <w:rPr>
+          <w:rFonts w:ascii="Calibri" w:cs="Calibri" w:eastAsia="Calibri" w:hAnsi="Calibri"/>
+        </w:rPr>
+        <w:t xml:space="preserve">Simula los métodos que usaría un atacante para obtener </w:t>
+      </w:r>
+      <w:r>
+        <w:rPr>
+          <w:rFonts w:ascii="Calibri" w:cs="Calibri" w:eastAsia="Calibri" w:hAnsi="Calibri"/>
+          <w:b/>
+          <w:bCs/>
+        </w:rPr>
+        <w:t xml:space="preserve">acceso no autorizado</w:t>
+      </w:r>
+      <w:r>
+        <w:rPr>
+          <w:rFonts w:ascii="Calibri" w:cs="Calibri" w:eastAsia="Calibri" w:hAnsi="Calibri"/>
+        </w:rPr>
+        <w:t xml:space="preserve"> a una red y comprometer los sistemas.</w:t>
+      </w:r>
+    </w:p>
+    <w:p>
+      <w:pPr>
+        <w:pStyle w:val="ListParagraph"/>
+        <w:numPr>
+          <w:ilvl w:val="0"/>
+          <w:numId w:val="2"/>
+        </w:numPr>
+        <w:spacing w:after="60"/>
+      </w:pPr>
+      <w:r>
+        <w:rPr>
+          <w:rFonts w:ascii="Calibri" w:cs="Calibri" w:eastAsia="Calibri" w:hAnsi="Calibri"/>
+        </w:rPr>
+        <w:t xml:space="preserve">Permite a la organización entender </w:t>
+      </w:r>
+      <w:r>
+        <w:rPr>
+          <w:rFonts w:ascii="Calibri" w:cs="Calibri" w:eastAsia="Calibri" w:hAnsi="Calibri"/>
+          <w:b/>
+          <w:bCs/>
+        </w:rPr>
+        <w:t xml:space="preserve">qué tanto toleraría un ataque real</w:t>
+      </w:r>
+      <w:r>
+        <w:rPr>
+          <w:rFonts w:ascii="Calibri" w:cs="Calibri" w:eastAsia="Calibri" w:hAnsi="Calibri"/>
+        </w:rPr>
+        <w:t xml:space="preserve">.</w:t>
+      </w:r>
+    </w:p>
+    <w:p>
+      <w:pPr>
+        <w:spacing w:after="80" w:before="160"/>
+      </w:pPr>
+      <w:r>
+        <w:rPr>
+          <w:rFonts w:ascii="Calibri" w:cs="Calibri" w:eastAsia="Calibri" w:hAnsi="Calibri"/>
+          <w:b/>
+          <w:bCs/>
+        </w:rPr>
+        <w:t xml:space="preserve">Las 4 fases de una prueba de penetración</w:t>
+      </w:r>
+    </w:p>
+    <w:tbl>
+      <w:tblPr>
+        <w:tblW w:type="dxa" w:w="9360"/>
+        <w:tblBorders>
+          <w:top w:val="single" w:color="auto" w:sz="4"/>
+          <w:left w:val="single" w:color="auto" w:sz="4"/>
+          <w:bottom w:val="single" w:color="auto" w:sz="4"/>
+          <w:right w:val="single" w:color="auto" w:sz="4"/>
+          <w:insideH w:val="single" w:color="auto" w:sz="4"/>
+          <w:insideV w:val="single" w:color="auto" w:sz="4"/>
+        </w:tblBorders>
+      </w:tblPr>
+      <w:tblGrid>
+        <w:gridCol w:w="900"/>
+        <w:gridCol w:w="8460"/>
+      </w:tblGrid>
+      <w:tr>
+        <w:trPr>
+          <w:tblHeader/>
+        </w:trPr>
+        <w:tc>
+          <w:tcPr>
+            <w:tcW w:type="dxa" w:w="900"/>
+            <w:tcBorders>
+              <w:top w:val="single" w:color="000000" w:sz="4"/>
+              <w:left w:val="single" w:color="000000" w:sz="4"/>
+              <w:bottom w:val="single" w:color="000000" w:sz="4"/>
+              <w:right w:val="single" w:color="000000" w:sz="4"/>
+            </w:tcBorders>
+            <w:shd w:fill="D9D9D9" w:val="clear"/>
+            <w:tcMar>
+              <w:top w:type="dxa" w:w="60"/>
+              <w:left w:type="dxa" w:w="100"/>
+              <w:bottom w:type="dxa" w:w="60"/>
+              <w:right w:type="dxa" w:w="100"/>
+            </w:tcMar>
+          </w:tcPr>
+          <w:p>
+            <w:r>
+              <w:rPr>
+                <w:rFonts w:ascii="Calibri" w:cs="Calibri" w:eastAsia="Calibri" w:hAnsi="Calibri"/>
+                <w:b/>
+                <w:bCs/>
+                <w:color w:val="000000"/>
+              </w:rPr>
+              <w:t xml:space="preserve">Fase</w:t>
+            </w:r>
+          </w:p>
+        </w:tc>
+        <w:tc>
+          <w:tcPr>
+            <w:tcW w:type="dxa" w:w="8460"/>
+            <w:tcBorders>
+              <w:top w:val="single" w:color="000000" w:sz="4"/>
+              <w:left w:val="single" w:color="000000" w:sz="4"/>
+              <w:bottom w:val="single" w:color="000000" w:sz="4"/>
+              <w:right w:val="single" w:color="000000" w:sz="4"/>
+            </w:tcBorders>
+            <w:shd w:fill="D9D9D9" w:val="clear"/>
+            <w:tcMar>
+              <w:top w:type="dxa" w:w="60"/>
+              <w:left w:type="dxa" w:w="100"/>
+              <w:bottom w:type="dxa" w:w="60"/>
+              <w:right w:type="dxa" w:w="100"/>
+            </w:tcMar>
+          </w:tcPr>
+          <w:p>
+            <w:r>
+              <w:rPr>
+                <w:rFonts w:ascii="Calibri" w:cs="Calibri" w:eastAsia="Calibri" w:hAnsi="Calibri"/>
+                <w:b/>
+                <w:bCs/>
+                <w:color w:val="000000"/>
+              </w:rPr>
+              <w:t xml:space="preserve">Nombre</w:t>
+            </w:r>
+          </w:p>
+        </w:tc>
+      </w:tr>
+      <w:tr>
+        <w:tc>
+          <w:tcPr>
+            <w:tcW w:type="dxa" w:w="900"/>
+            <w:tcBorders>
+              <w:top w:val="single" w:color="000000" w:sz="4"/>
+              <w:left w:val="single" w:color="000000" w:sz="4"/>
+              <w:bottom w:val="single" w:color="000000" w:sz="4"/>
+              <w:right w:val="single" w:color="000000" w:sz="4"/>
+            </w:tcBorders>
+            <w:shd w:fill="FFFFFF" w:val="clear"/>
+            <w:tcMar>
+              <w:top w:type="dxa" w:w="60"/>
+              <w:left w:type="dxa" w:w="100"/>
+              <w:bottom w:type="dxa" w:w="60"/>
+              <w:right w:type="dxa" w:w="100"/>
+            </w:tcMar>
+          </w:tcPr>
+          <w:p>
+            <w:r>
+              <w:rPr>
+                <w:rFonts w:ascii="Calibri" w:cs="Calibri" w:eastAsia="Calibri" w:hAnsi="Calibri"/>
+                <w:b/>
+                <w:bCs/>
+              </w:rPr>
+              <w:t xml:space="preserve">1</w:t>
+            </w:r>
+          </w:p>
+        </w:tc>
+        <w:tc>
+          <w:tcPr>
+            <w:tcW w:type="dxa" w:w="8460"/>
+            <w:tcBorders>
+              <w:top w:val="single" w:color="000000" w:sz="4"/>
+              <w:left w:val="single" w:color="000000" w:sz="4"/>
+              <w:bottom w:val="single" w:color="000000" w:sz="4"/>
+              <w:right w:val="single" w:color="000000" w:sz="4"/>
+            </w:tcBorders>
+            <w:shd w:fill="FFFFFF" w:val="clear"/>
+            <w:tcMar>
+              <w:top w:type="dxa" w:w="60"/>
+              <w:left w:type="dxa" w:w="100"/>
+              <w:bottom w:type="dxa" w:w="60"/>
+              <w:right w:type="dxa" w:w="100"/>
+            </w:tcMar>
+          </w:tcPr>
+          <w:p>
+            <w:r>
+              <w:rPr>
+                <w:rFonts w:ascii="Calibri" w:cs="Calibri" w:eastAsia="Calibri" w:hAnsi="Calibri"/>
+              </w:rPr>
+              <w:t xml:space="preserve">Planificación</w:t>
+            </w:r>
+          </w:p>
+        </w:tc>
+      </w:tr>
+      <w:tr>
+        <w:tc>
+          <w:tcPr>
+            <w:tcW w:type="dxa" w:w="900"/>
+            <w:tcBorders>
+              <w:top w:val="single" w:color="000000" w:sz="4"/>
+              <w:left w:val="single" w:color="000000" w:sz="4"/>
+              <w:bottom w:val="single" w:color="000000" w:sz="4"/>
+              <w:right w:val="single" w:color="000000" w:sz="4"/>
+            </w:tcBorders>
+            <w:shd w:fill="FFFFFF" w:val="clear"/>
+            <w:tcMar>
+              <w:top w:type="dxa" w:w="60"/>
+              <w:left w:type="dxa" w:w="100"/>
+              <w:bottom w:type="dxa" w:w="60"/>
+              <w:right w:type="dxa" w:w="100"/>
+            </w:tcMar>
+          </w:tcPr>
+          <w:p>
+            <w:r>
+              <w:rPr>
+                <w:rFonts w:ascii="Calibri" w:cs="Calibri" w:eastAsia="Calibri" w:hAnsi="Calibri"/>
+                <w:b/>
+                <w:bCs/>
+              </w:rPr>
+              <w:t xml:space="preserve">2</w:t>
+            </w:r>
+          </w:p>
+        </w:tc>
+        <w:tc>
+          <w:tcPr>
+            <w:tcW w:type="dxa" w:w="8460"/>
+            <w:tcBorders>
+              <w:top w:val="single" w:color="000000" w:sz="4"/>
+              <w:left w:val="single" w:color="000000" w:sz="4"/>
+              <w:bottom w:val="single" w:color="000000" w:sz="4"/>
+              <w:right w:val="single" w:color="000000" w:sz="4"/>
+            </w:tcBorders>
+            <w:shd w:fill="FFFFFF" w:val="clear"/>
+            <w:tcMar>
+              <w:top w:type="dxa" w:w="60"/>
+              <w:left w:type="dxa" w:w="100"/>
+              <w:bottom w:type="dxa" w:w="60"/>
+              <w:right w:type="dxa" w:w="100"/>
+            </w:tcMar>
+          </w:tcPr>
+          <w:p>
+            <w:r>
+              <w:rPr>
+                <w:rFonts w:ascii="Calibri" w:cs="Calibri" w:eastAsia="Calibri" w:hAnsi="Calibri"/>
+              </w:rPr>
+              <w:t xml:space="preserve">Detección</w:t>
+            </w:r>
+          </w:p>
+        </w:tc>
+      </w:tr>
+      <w:tr>
+        <w:tc>
+          <w:tcPr>
+            <w:tcW w:type="dxa" w:w="900"/>
+            <w:tcBorders>
+              <w:top w:val="single" w:color="000000" w:sz="4"/>
+              <w:left w:val="single" w:color="000000" w:sz="4"/>
+              <w:bottom w:val="single" w:color="000000" w:sz="4"/>
+              <w:right w:val="single" w:color="000000" w:sz="4"/>
+            </w:tcBorders>
+            <w:shd w:fill="FFFFFF" w:val="clear"/>
+            <w:tcMar>
+              <w:top w:type="dxa" w:w="60"/>
+              <w:left w:type="dxa" w:w="100"/>
+              <w:bottom w:type="dxa" w:w="60"/>
+              <w:right w:type="dxa" w:w="100"/>
+            </w:tcMar>
+          </w:tcPr>
+          <w:p>
+            <w:r>
+              <w:rPr>
+                <w:rFonts w:ascii="Calibri" w:cs="Calibri" w:eastAsia="Calibri" w:hAnsi="Calibri"/>
+                <w:b/>
+                <w:bCs/>
+              </w:rPr>
+              <w:t xml:space="preserve">3</w:t>
+            </w:r>
+          </w:p>
+        </w:tc>
+        <w:tc>
+          <w:tcPr>
+            <w:tcW w:type="dxa" w:w="8460"/>
+            <w:tcBorders>
+              <w:top w:val="single" w:color="000000" w:sz="4"/>
+              <w:left w:val="single" w:color="000000" w:sz="4"/>
+              <w:bottom w:val="single" w:color="000000" w:sz="4"/>
+              <w:right w:val="single" w:color="000000" w:sz="4"/>
+            </w:tcBorders>
+            <w:shd w:fill="FFFFFF" w:val="clear"/>
+            <w:tcMar>
+              <w:top w:type="dxa" w:w="60"/>
+              <w:left w:type="dxa" w:w="100"/>
+              <w:bottom w:type="dxa" w:w="60"/>
+              <w:right w:type="dxa" w:w="100"/>
+            </w:tcMar>
+          </w:tcPr>
+          <w:p>
+            <w:r>
+              <w:rPr>
+                <w:rFonts w:ascii="Calibri" w:cs="Calibri" w:eastAsia="Calibri" w:hAnsi="Calibri"/>
+              </w:rPr>
+              <w:t xml:space="preserve">Ataque</w:t>
+            </w:r>
+          </w:p>
+        </w:tc>
+      </w:tr>
+      <w:tr>
+        <w:tc>
+          <w:tcPr>
+            <w:tcW w:type="dxa" w:w="900"/>
+            <w:tcBorders>
+              <w:top w:val="single" w:color="000000" w:sz="4"/>
+              <w:left w:val="single" w:color="000000" w:sz="4"/>
+              <w:bottom w:val="single" w:color="000000" w:sz="4"/>
+              <w:right w:val="single" w:color="000000" w:sz="4"/>
+            </w:tcBorders>
+            <w:shd w:fill="FFFFFF" w:val="clear"/>
+            <w:tcMar>
+              <w:top w:type="dxa" w:w="60"/>
+              <w:left w:type="dxa" w:w="100"/>
+              <w:bottom w:type="dxa" w:w="60"/>
+              <w:right w:type="dxa" w:w="100"/>
+            </w:tcMar>
+          </w:tcPr>
+          <w:p>
+            <w:r>
+              <w:rPr>
+                <w:rFonts w:ascii="Calibri" w:cs="Calibri" w:eastAsia="Calibri" w:hAnsi="Calibri"/>
+                <w:b/>
+                <w:bCs/>
+              </w:rPr>
+              <w:t xml:space="preserve">4</w:t>
+            </w:r>
+          </w:p>
+        </w:tc>
+        <w:tc>
+          <w:tcPr>
+            <w:tcW w:type="dxa" w:w="8460"/>
+            <w:tcBorders>
+              <w:top w:val="single" w:color="000000" w:sz="4"/>
+              <w:left w:val="single" w:color="000000" w:sz="4"/>
+              <w:bottom w:val="single" w:color="000000" w:sz="4"/>
+              <w:right w:val="single" w:color="000000" w:sz="4"/>
+            </w:tcBorders>
+            <w:shd w:fill="FFFFFF" w:val="clear"/>
+            <w:tcMar>
+              <w:top w:type="dxa" w:w="60"/>
+              <w:left w:type="dxa" w:w="100"/>
+              <w:bottom w:type="dxa" w:w="60"/>
+              <w:right w:type="dxa" w:w="100"/>
+            </w:tcMar>
+          </w:tcPr>
+          <w:p>
+            <w:r>
+              <w:rPr>
+                <w:rFonts w:ascii="Calibri" w:cs="Calibri" w:eastAsia="Calibri" w:hAnsi="Calibri"/>
+              </w:rPr>
+              <w:t xml:space="preserve">Elaboración de informes</w:t>
+            </w:r>
+          </w:p>
+        </w:tc>
+      </w:tr>
+    </w:tbl>
+    <w:p>
+      <w:pPr>
+        <w:spacing w:after="80"/>
+      </w:pPr>
+    </w:p>
+    <w:p>
+      <w:pPr>
+        <w:spacing w:after="80" w:before="160"/>
+      </w:pPr>
+      <w:r>
+        <w:rPr>
+          <w:rFonts w:ascii="Calibri" w:cs="Calibri" w:eastAsia="Calibri" w:hAnsi="Calibri"/>
+          <w:b/>
+          <w:bCs/>
+        </w:rPr>
+        <w:t xml:space="preserve">Equipos de ejercicios de penetración</w:t>
+      </w:r>
+    </w:p>
+    <w:p>
+      <w:pPr>
+        <w:pStyle w:val="ListParagraph"/>
+        <w:numPr>
+          <w:ilvl w:val="0"/>
+          <w:numId w:val="2"/>
+        </w:numPr>
+        <w:spacing w:after="60"/>
+      </w:pPr>
+      <w:r>
+        <w:rPr>
+          <w:rFonts w:ascii="Calibri" w:cs="Calibri" w:eastAsia="Calibri" w:hAnsi="Calibri"/>
+        </w:rPr>
+        <w:t xml:space="preserve">Algunas organizaciones crean equipos que </w:t>
+      </w:r>
+      <w:r>
+        <w:rPr>
+          <w:rFonts w:ascii="Calibri" w:cs="Calibri" w:eastAsia="Calibri" w:hAnsi="Calibri"/>
+          <w:b/>
+          <w:bCs/>
+        </w:rPr>
+        <w:t xml:space="preserve">compiten</w:t>
+      </w:r>
+      <w:r>
+        <w:rPr>
+          <w:rFonts w:ascii="Calibri" w:cs="Calibri" w:eastAsia="Calibri" w:hAnsi="Calibri"/>
+        </w:rPr>
+        <w:t xml:space="preserve"> en ejercicios de penetración más extensos que una prueba de penetración.</w:t>
+      </w:r>
+    </w:p>
+    <w:p>
+      <w:pPr>
+        <w:pStyle w:val="ListParagraph"/>
+        <w:numPr>
+          <w:ilvl w:val="0"/>
+          <w:numId w:val="2"/>
+        </w:numPr>
+        <w:spacing w:after="60"/>
+      </w:pPr>
+      <w:r>
+        <w:rPr>
+          <w:rFonts w:ascii="Calibri" w:cs="Calibri" w:eastAsia="Calibri" w:hAnsi="Calibri"/>
+          <w:b/>
+          <w:bCs/>
+        </w:rPr>
+        <w:t xml:space="preserve">Equipo rojo:</w:t>
+      </w:r>
+      <w:r>
+        <w:rPr>
+          <w:rFonts w:ascii="Calibri" w:cs="Calibri" w:eastAsia="Calibri" w:hAnsi="Calibri"/>
+        </w:rPr>
+        <w:t xml:space="preserve"> intenta </w:t>
+      </w:r>
+      <w:r>
+        <w:rPr>
+          <w:rFonts w:ascii="Calibri" w:cs="Calibri" w:eastAsia="Calibri" w:hAnsi="Calibri"/>
+          <w:b/>
+          <w:bCs/>
+        </w:rPr>
+        <w:t xml:space="preserve">atacar</w:t>
+      </w:r>
+      <w:r>
+        <w:rPr>
+          <w:rFonts w:ascii="Calibri" w:cs="Calibri" w:eastAsia="Calibri" w:hAnsi="Calibri"/>
+        </w:rPr>
+        <w:t xml:space="preserve"> el sistema.</w:t>
+      </w:r>
+    </w:p>
+    <w:p>
+      <w:pPr>
+        <w:pStyle w:val="ListParagraph"/>
+        <w:numPr>
+          <w:ilvl w:val="0"/>
+          <w:numId w:val="2"/>
+        </w:numPr>
+        <w:spacing w:after="60"/>
+      </w:pPr>
+      <w:r>
+        <w:rPr>
+          <w:rFonts w:ascii="Calibri" w:cs="Calibri" w:eastAsia="Calibri" w:hAnsi="Calibri"/>
+          <w:b/>
+          <w:bCs/>
+        </w:rPr>
+        <w:t xml:space="preserve">Equipo azul:</w:t>
+      </w:r>
+      <w:r>
+        <w:rPr>
+          <w:rFonts w:ascii="Calibri" w:cs="Calibri" w:eastAsia="Calibri" w:hAnsi="Calibri"/>
+        </w:rPr>
+        <w:t xml:space="preserve"> intenta </w:t>
+      </w:r>
+      <w:r>
+        <w:rPr>
+          <w:rFonts w:ascii="Calibri" w:cs="Calibri" w:eastAsia="Calibri" w:hAnsi="Calibri"/>
+          <w:b/>
+          <w:bCs/>
+        </w:rPr>
+        <w:t xml:space="preserve">defender</w:t>
+      </w:r>
+      <w:r>
+        <w:rPr>
+          <w:rFonts w:ascii="Calibri" w:cs="Calibri" w:eastAsia="Calibri" w:hAnsi="Calibri"/>
+        </w:rPr>
+        <w:t xml:space="preserve"> el sistema.</w:t>
+      </w:r>
+    </w:p>
+    <w:p>
+      <w:pPr>
+        <w:spacing w:after="80" w:before="160"/>
+      </w:pPr>
+      <w:r>
+        <w:rPr>
+          <w:rFonts w:ascii="Calibri" w:cs="Calibri" w:eastAsia="Calibri" w:hAnsi="Calibri"/>
+          <w:b/>
+          <w:bCs/>
+        </w:rPr>
+        <w:t xml:space="preserve">Analizadores de paquetes</w:t>
+      </w:r>
+    </w:p>
+    <w:p>
+      <w:pPr>
+        <w:pStyle w:val="ListParagraph"/>
+        <w:numPr>
+          <w:ilvl w:val="0"/>
+          <w:numId w:val="2"/>
+        </w:numPr>
+        <w:spacing w:after="60"/>
+      </w:pPr>
+      <w:r>
+        <w:rPr>
+          <w:rFonts w:ascii="Calibri" w:cs="Calibri" w:eastAsia="Calibri" w:hAnsi="Calibri"/>
+        </w:rPr>
+        <w:t xml:space="preserve">También llamados analizadores de protocolos de paquetes: </w:t>
+      </w:r>
+      <w:r>
+        <w:rPr>
+          <w:rFonts w:ascii="Calibri" w:cs="Calibri" w:eastAsia="Calibri" w:hAnsi="Calibri"/>
+          <w:b/>
+          <w:bCs/>
+        </w:rPr>
+        <w:t xml:space="preserve">interceptan y registran</w:t>
+      </w:r>
+      <w:r>
+        <w:rPr>
+          <w:rFonts w:ascii="Calibri" w:cs="Calibri" w:eastAsia="Calibri" w:hAnsi="Calibri"/>
+        </w:rPr>
+        <w:t xml:space="preserve"> el tráfico de red.</w:t>
+      </w:r>
+    </w:p>
+    <w:p>
+      <w:pPr>
+        <w:pStyle w:val="ListParagraph"/>
+        <w:numPr>
+          <w:ilvl w:val="0"/>
+          <w:numId w:val="2"/>
+        </w:numPr>
+        <w:spacing w:after="60"/>
+      </w:pPr>
+      <w:r>
+        <w:rPr>
+          <w:rFonts w:ascii="Calibri" w:cs="Calibri" w:eastAsia="Calibri" w:hAnsi="Calibri"/>
+        </w:rPr>
+        <w:t xml:space="preserve">El análisis de paquetes </w:t>
+      </w:r>
+      <w:r>
+        <w:rPr>
+          <w:rFonts w:ascii="Calibri" w:cs="Calibri" w:eastAsia="Calibri" w:hAnsi="Calibri"/>
+          <w:b/>
+          <w:bCs/>
+        </w:rPr>
+        <w:t xml:space="preserve">no solo se usa con fines maliciosos</w:t>
+      </w:r>
+      <w:r>
+        <w:rPr>
+          <w:rFonts w:ascii="Calibri" w:cs="Calibri" w:eastAsia="Calibri" w:hAnsi="Calibri"/>
+        </w:rPr>
+        <w:t xml:space="preserve">.</w:t>
+      </w:r>
+    </w:p>
+    <w:p>
+      <w:pPr>
+        <w:pStyle w:val="ListParagraph"/>
+        <w:numPr>
+          <w:ilvl w:val="0"/>
+          <w:numId w:val="2"/>
+        </w:numPr>
+        <w:spacing w:after="60"/>
+      </w:pPr>
+      <w:r>
+        <w:rPr>
+          <w:rFonts w:ascii="Calibri" w:cs="Calibri" w:eastAsia="Calibri" w:hAnsi="Calibri"/>
+        </w:rPr>
+        <w:t xml:space="preserve">Los administradores de red lo usan para analizar el tráfico, </w:t>
+      </w:r>
+      <w:r>
+        <w:rPr>
+          <w:rFonts w:ascii="Calibri" w:cs="Calibri" w:eastAsia="Calibri" w:hAnsi="Calibri"/>
+          <w:b/>
+          <w:bCs/>
+        </w:rPr>
+        <w:t xml:space="preserve">identificar problemas con el ancho de banda</w:t>
+      </w:r>
+      <w:r>
+        <w:rPr>
+          <w:rFonts w:ascii="Calibri" w:cs="Calibri" w:eastAsia="Calibri" w:hAnsi="Calibri"/>
+        </w:rPr>
+        <w:t xml:space="preserve"> y solucionar otros problemas de la red.</w:t>
       </w:r>
     </w:p>
     <w:sectPr>

</xml_diff>

<commit_message>
Agrega Módulo 24: Inteligencia contra amenazas al resumen de módulos 19 en adelante
Co-Authored-By: Claude Sonnet 5.5 <noreply@anthropic.com>
Claude-Session: https://claude.ai/code/session_013iWwbBbHxw2c1QtKDe5PjZ
</commit_message>
<xml_diff>
--- a/Modulos_19_en_adelante_Resumen.docx
+++ b/Modulos_19_en_adelante_Resumen.docx
@@ -11476,6 +11476,1124 @@
           <w:rFonts w:ascii="Calibri" w:cs="Calibri" w:eastAsia="Calibri" w:hAnsi="Calibri"/>
         </w:rPr>
         <w:t xml:space="preserve"> y solucionar otros problemas de la red.</w:t>
+      </w:r>
+    </w:p>
+    <w:p>
+      <w:r>
+        <w:br w:type="page"/>
+      </w:r>
+    </w:p>
+    <w:p>
+      <w:pPr>
+        <w:spacing w:after="60"/>
+        <w:jc w:val="center"/>
+      </w:pPr>
+      <w:r>
+        <w:rPr>
+          <w:rFonts w:ascii="Calibri" w:cs="Calibri" w:eastAsia="Calibri" w:hAnsi="Calibri"/>
+          <w:b/>
+          <w:bCs/>
+          <w:color w:val="000000"/>
+          <w:sz w:val="24"/>
+          <w:szCs w:val="24"/>
+        </w:rPr>
+        <w:t xml:space="preserve">Módulo 24: Inteligencia contra amenazas</w:t>
+      </w:r>
+    </w:p>
+    <w:p>
+      <w:pPr>
+        <w:spacing w:after="200"/>
+        <w:jc w:val="center"/>
+      </w:pPr>
+      <w:r>
+        <w:rPr>
+          <w:rFonts w:ascii="Calibri" w:cs="Calibri" w:eastAsia="Calibri" w:hAnsi="Calibri"/>
+          <w:color w:val="000000"/>
+          <w:sz w:val="24"/>
+          <w:szCs w:val="24"/>
+        </w:rPr>
+        <w:t xml:space="preserve">Resumen de ciberseguridad</w:t>
+      </w:r>
+    </w:p>
+    <w:p>
+      <w:pPr>
+        <w:spacing w:after="120" w:before="280"/>
+      </w:pPr>
+      <w:r>
+        <w:rPr>
+          <w:rFonts w:ascii="Calibri" w:cs="Calibri" w:eastAsia="Calibri" w:hAnsi="Calibri"/>
+          <w:b/>
+          <w:bCs/>
+        </w:rPr>
+        <w:t xml:space="preserve">1. Fuentes de información</w:t>
+      </w:r>
+    </w:p>
+    <w:p>
+      <w:pPr>
+        <w:pStyle w:val="ListParagraph"/>
+        <w:numPr>
+          <w:ilvl w:val="0"/>
+          <w:numId w:val="2"/>
+        </w:numPr>
+        <w:spacing w:after="60"/>
+      </w:pPr>
+      <w:r>
+        <w:rPr>
+          <w:rFonts w:ascii="Calibri" w:cs="Calibri" w:eastAsia="Calibri" w:hAnsi="Calibri"/>
+        </w:rPr>
+        <w:t xml:space="preserve">Hay muchas organizaciones de seguridad que ofrecen </w:t>
+      </w:r>
+      <w:r>
+        <w:rPr>
+          <w:rFonts w:ascii="Calibri" w:cs="Calibri" w:eastAsia="Calibri" w:hAnsi="Calibri"/>
+          <w:b/>
+          <w:bCs/>
+        </w:rPr>
+        <w:t xml:space="preserve">servicios de inteligencia de la red</w:t>
+      </w:r>
+      <w:r>
+        <w:rPr>
+          <w:rFonts w:ascii="Calibri" w:cs="Calibri" w:eastAsia="Calibri" w:hAnsi="Calibri"/>
+        </w:rPr>
+        <w:t xml:space="preserve">.</w:t>
+      </w:r>
+    </w:p>
+    <w:p>
+      <w:pPr>
+        <w:pStyle w:val="ListParagraph"/>
+        <w:numPr>
+          <w:ilvl w:val="0"/>
+          <w:numId w:val="2"/>
+        </w:numPr>
+        <w:spacing w:after="60"/>
+      </w:pPr>
+      <w:r>
+        <w:rPr>
+          <w:rFonts w:ascii="Calibri" w:cs="Calibri" w:eastAsia="Calibri" w:hAnsi="Calibri"/>
+        </w:rPr>
+        <w:t xml:space="preserve">Algunas organizaciones de seguridad de red: </w:t>
+      </w:r>
+      <w:r>
+        <w:rPr>
+          <w:rFonts w:ascii="Calibri" w:cs="Calibri" w:eastAsia="Calibri" w:hAnsi="Calibri"/>
+          <w:b/>
+          <w:bCs/>
+        </w:rPr>
+        <w:t xml:space="preserve">SANS, Mitre, FIRST, SecurityNewsWire, (ISC)² y CIS</w:t>
+      </w:r>
+      <w:r>
+        <w:rPr>
+          <w:rFonts w:ascii="Calibri" w:cs="Calibri" w:eastAsia="Calibri" w:hAnsi="Calibri"/>
+        </w:rPr>
+        <w:t xml:space="preserve">.</w:t>
+      </w:r>
+    </w:p>
+    <w:p>
+      <w:pPr>
+        <w:pStyle w:val="ListParagraph"/>
+        <w:numPr>
+          <w:ilvl w:val="0"/>
+          <w:numId w:val="2"/>
+        </w:numPr>
+        <w:spacing w:after="60"/>
+      </w:pPr>
+      <w:r>
+        <w:rPr>
+          <w:rFonts w:ascii="Calibri" w:cs="Calibri" w:eastAsia="Calibri" w:hAnsi="Calibri"/>
+        </w:rPr>
+        <w:t xml:space="preserve">Hay que estar al tanto de las </w:t>
+      </w:r>
+      <w:r>
+        <w:rPr>
+          <w:rFonts w:ascii="Calibri" w:cs="Calibri" w:eastAsia="Calibri" w:hAnsi="Calibri"/>
+          <w:b/>
+          <w:bCs/>
+        </w:rPr>
+        <w:t xml:space="preserve">amenazas más recientes</w:t>
+      </w:r>
+      <w:r>
+        <w:rPr>
+          <w:rFonts w:ascii="Calibri" w:cs="Calibri" w:eastAsia="Calibri" w:hAnsi="Calibri"/>
+        </w:rPr>
+        <w:t xml:space="preserve"> y seguir mejorando las habilidades.</w:t>
+      </w:r>
+    </w:p>
+    <w:p>
+      <w:pPr>
+        <w:pStyle w:val="ListParagraph"/>
+        <w:numPr>
+          <w:ilvl w:val="0"/>
+          <w:numId w:val="2"/>
+        </w:numPr>
+        <w:spacing w:after="60"/>
+      </w:pPr>
+      <w:r>
+        <w:rPr>
+          <w:rFonts w:ascii="Calibri" w:cs="Calibri" w:eastAsia="Calibri" w:hAnsi="Calibri"/>
+        </w:rPr>
+        <w:t xml:space="preserve">Recursos útiles:</w:t>
+      </w:r>
+    </w:p>
+    <w:p>
+      <w:pPr>
+        <w:pStyle w:val="ListParagraph"/>
+        <w:numPr>
+          <w:ilvl w:val="1"/>
+          <w:numId w:val="2"/>
+        </w:numPr>
+        <w:spacing w:after="60"/>
+      </w:pPr>
+      <w:r>
+        <w:rPr>
+          <w:rFonts w:ascii="Calibri" w:cs="Calibri" w:eastAsia="Calibri" w:hAnsi="Calibri"/>
+          <w:b/>
+          <w:bCs/>
+        </w:rPr>
+        <w:t xml:space="preserve">Informe Anual de Ciberseguridad de Cisco</w:t>
+      </w:r>
+    </w:p>
+    <w:p>
+      <w:pPr>
+        <w:pStyle w:val="ListParagraph"/>
+        <w:numPr>
+          <w:ilvl w:val="1"/>
+          <w:numId w:val="2"/>
+        </w:numPr>
+        <w:spacing w:after="60"/>
+      </w:pPr>
+      <w:r>
+        <w:rPr>
+          <w:rFonts w:ascii="Calibri" w:cs="Calibri" w:eastAsia="Calibri" w:hAnsi="Calibri"/>
+          <w:b/>
+          <w:bCs/>
+        </w:rPr>
+        <w:t xml:space="preserve">Informe de Ciberseguridad a mitad de año</w:t>
+      </w:r>
+    </w:p>
+    <w:p>
+      <w:pPr>
+        <w:pStyle w:val="ListParagraph"/>
+        <w:numPr>
+          <w:ilvl w:val="1"/>
+          <w:numId w:val="2"/>
+        </w:numPr>
+        <w:spacing w:after="60"/>
+      </w:pPr>
+      <w:r>
+        <w:rPr>
+          <w:rFonts w:ascii="Calibri" w:cs="Calibri" w:eastAsia="Calibri" w:hAnsi="Calibri"/>
+        </w:rPr>
+        <w:t xml:space="preserve">Leer </w:t>
+      </w:r>
+      <w:r>
+        <w:rPr>
+          <w:rFonts w:ascii="Calibri" w:cs="Calibri" w:eastAsia="Calibri" w:hAnsi="Calibri"/>
+          <w:b/>
+          <w:bCs/>
+        </w:rPr>
+        <w:t xml:space="preserve">blogs</w:t>
+      </w:r>
+      <w:r>
+        <w:rPr>
+          <w:rFonts w:ascii="Calibri" w:cs="Calibri" w:eastAsia="Calibri" w:hAnsi="Calibri"/>
+        </w:rPr>
+        <w:t xml:space="preserve"> y escuchar </w:t>
+      </w:r>
+      <w:r>
+        <w:rPr>
+          <w:rFonts w:ascii="Calibri" w:cs="Calibri" w:eastAsia="Calibri" w:hAnsi="Calibri"/>
+          <w:b/>
+          <w:bCs/>
+        </w:rPr>
+        <w:t xml:space="preserve">podcasts</w:t>
+      </w:r>
+    </w:p>
+    <w:p>
+      <w:pPr>
+        <w:spacing w:after="120" w:before="280"/>
+      </w:pPr>
+      <w:r>
+        <w:rPr>
+          <w:rFonts w:ascii="Calibri" w:cs="Calibri" w:eastAsia="Calibri" w:hAnsi="Calibri"/>
+          <w:b/>
+          <w:bCs/>
+        </w:rPr>
+        <w:t xml:space="preserve">2. Servicios de inteligencia de amenazas</w:t>
+      </w:r>
+    </w:p>
+    <w:p>
+      <w:pPr>
+        <w:pStyle w:val="ListParagraph"/>
+        <w:numPr>
+          <w:ilvl w:val="0"/>
+          <w:numId w:val="2"/>
+        </w:numPr>
+        <w:spacing w:after="60"/>
+      </w:pPr>
+      <w:r>
+        <w:rPr>
+          <w:rFonts w:ascii="Calibri" w:cs="Calibri" w:eastAsia="Calibri" w:hAnsi="Calibri"/>
+        </w:rPr>
+        <w:t xml:space="preserve">Permiten </w:t>
+      </w:r>
+      <w:r>
+        <w:rPr>
+          <w:rFonts w:ascii="Calibri" w:cs="Calibri" w:eastAsia="Calibri" w:hAnsi="Calibri"/>
+          <w:b/>
+          <w:bCs/>
+        </w:rPr>
+        <w:t xml:space="preserve">intercambiar información</w:t>
+      </w:r>
+      <w:r>
+        <w:rPr>
+          <w:rFonts w:ascii="Calibri" w:cs="Calibri" w:eastAsia="Calibri" w:hAnsi="Calibri"/>
+        </w:rPr>
+        <w:t xml:space="preserve"> como vulnerabilidades, </w:t>
+      </w:r>
+      <w:r>
+        <w:rPr>
+          <w:rFonts w:ascii="Calibri" w:cs="Calibri" w:eastAsia="Calibri" w:hAnsi="Calibri"/>
+          <w:b/>
+          <w:bCs/>
+        </w:rPr>
+        <w:t xml:space="preserve">indicadores de riesgo (IOC, Indicator of Compromise)</w:t>
+      </w:r>
+      <w:r>
+        <w:rPr>
+          <w:rFonts w:ascii="Calibri" w:cs="Calibri" w:eastAsia="Calibri" w:hAnsi="Calibri"/>
+        </w:rPr>
+        <w:t xml:space="preserve"> y técnicas de mitigación.</w:t>
+      </w:r>
+    </w:p>
+    <w:p>
+      <w:pPr>
+        <w:pStyle w:val="ListParagraph"/>
+        <w:numPr>
+          <w:ilvl w:val="0"/>
+          <w:numId w:val="2"/>
+        </w:numPr>
+        <w:spacing w:after="60"/>
+      </w:pPr>
+      <w:r>
+        <w:rPr>
+          <w:rFonts w:ascii="Calibri" w:cs="Calibri" w:eastAsia="Calibri" w:hAnsi="Calibri"/>
+        </w:rPr>
+        <w:t xml:space="preserve">Esa información se comparte con el personal y también con los </w:t>
+      </w:r>
+      <w:r>
+        <w:rPr>
+          <w:rFonts w:ascii="Calibri" w:cs="Calibri" w:eastAsia="Calibri" w:hAnsi="Calibri"/>
+          <w:b/>
+          <w:bCs/>
+        </w:rPr>
+        <w:t xml:space="preserve">sistemas de seguridad</w:t>
+      </w:r>
+      <w:r>
+        <w:rPr>
+          <w:rFonts w:ascii="Calibri" w:cs="Calibri" w:eastAsia="Calibri" w:hAnsi="Calibri"/>
+        </w:rPr>
+        <w:t xml:space="preserve">.</w:t>
+      </w:r>
+    </w:p>
+    <w:p>
+      <w:pPr>
+        <w:pStyle w:val="ListParagraph"/>
+        <w:numPr>
+          <w:ilvl w:val="0"/>
+          <w:numId w:val="2"/>
+        </w:numPr>
+        <w:spacing w:after="60"/>
+      </w:pPr>
+      <w:r>
+        <w:rPr>
+          <w:rFonts w:ascii="Calibri" w:cs="Calibri" w:eastAsia="Calibri" w:hAnsi="Calibri"/>
+        </w:rPr>
+        <w:t xml:space="preserve">A medida que surgen amenazas, estos servicios </w:t>
+      </w:r>
+      <w:r>
+        <w:rPr>
+          <w:rFonts w:ascii="Calibri" w:cs="Calibri" w:eastAsia="Calibri" w:hAnsi="Calibri"/>
+          <w:b/>
+          <w:bCs/>
+        </w:rPr>
+        <w:t xml:space="preserve">crean y distribuyen reglas de firewalls e IOC</w:t>
+      </w:r>
+      <w:r>
+        <w:rPr>
+          <w:rFonts w:ascii="Calibri" w:cs="Calibri" w:eastAsia="Calibri" w:hAnsi="Calibri"/>
+        </w:rPr>
+        <w:t xml:space="preserve"> para los dispositivos suscritos al servicio.</w:t>
+      </w:r>
+    </w:p>
+    <w:p>
+      <w:pPr>
+        <w:spacing w:after="80" w:before="160"/>
+      </w:pPr>
+      <w:r>
+        <w:rPr>
+          <w:rFonts w:ascii="Calibri" w:cs="Calibri" w:eastAsia="Calibri" w:hAnsi="Calibri"/>
+          <w:b/>
+          <w:bCs/>
+        </w:rPr>
+        <w:t xml:space="preserve">Servicios y organizaciones</w:t>
+      </w:r>
+    </w:p>
+    <w:tbl>
+      <w:tblPr>
+        <w:tblW w:type="dxa" w:w="9360"/>
+        <w:tblBorders>
+          <w:top w:val="single" w:color="auto" w:sz="4"/>
+          <w:left w:val="single" w:color="auto" w:sz="4"/>
+          <w:bottom w:val="single" w:color="auto" w:sz="4"/>
+          <w:right w:val="single" w:color="auto" w:sz="4"/>
+          <w:insideH w:val="single" w:color="auto" w:sz="4"/>
+          <w:insideV w:val="single" w:color="auto" w:sz="4"/>
+        </w:tblBorders>
+      </w:tblPr>
+      <w:tblGrid>
+        <w:gridCol w:w="2600"/>
+        <w:gridCol w:w="6760"/>
+      </w:tblGrid>
+      <w:tr>
+        <w:trPr>
+          <w:tblHeader/>
+        </w:trPr>
+        <w:tc>
+          <w:tcPr>
+            <w:tcW w:type="dxa" w:w="2600"/>
+            <w:tcBorders>
+              <w:top w:val="single" w:color="000000" w:sz="4"/>
+              <w:left w:val="single" w:color="000000" w:sz="4"/>
+              <w:bottom w:val="single" w:color="000000" w:sz="4"/>
+              <w:right w:val="single" w:color="000000" w:sz="4"/>
+            </w:tcBorders>
+            <w:shd w:fill="D9D9D9" w:val="clear"/>
+            <w:tcMar>
+              <w:top w:type="dxa" w:w="60"/>
+              <w:left w:type="dxa" w:w="100"/>
+              <w:bottom w:type="dxa" w:w="60"/>
+              <w:right w:type="dxa" w:w="100"/>
+            </w:tcMar>
+          </w:tcPr>
+          <w:p>
+            <w:r>
+              <w:rPr>
+                <w:rFonts w:ascii="Calibri" w:cs="Calibri" w:eastAsia="Calibri" w:hAnsi="Calibri"/>
+                <w:b/>
+                <w:bCs/>
+                <w:color w:val="000000"/>
+              </w:rPr>
+              <w:t xml:space="preserve">Nombre</w:t>
+            </w:r>
+          </w:p>
+        </w:tc>
+        <w:tc>
+          <w:tcPr>
+            <w:tcW w:type="dxa" w:w="6760"/>
+            <w:tcBorders>
+              <w:top w:val="single" w:color="000000" w:sz="4"/>
+              <w:left w:val="single" w:color="000000" w:sz="4"/>
+              <w:bottom w:val="single" w:color="000000" w:sz="4"/>
+              <w:right w:val="single" w:color="000000" w:sz="4"/>
+            </w:tcBorders>
+            <w:shd w:fill="D9D9D9" w:val="clear"/>
+            <w:tcMar>
+              <w:top w:type="dxa" w:w="60"/>
+              <w:left w:type="dxa" w:w="100"/>
+              <w:bottom w:type="dxa" w:w="60"/>
+              <w:right w:type="dxa" w:w="100"/>
+            </w:tcMar>
+          </w:tcPr>
+          <w:p>
+            <w:r>
+              <w:rPr>
+                <w:rFonts w:ascii="Calibri" w:cs="Calibri" w:eastAsia="Calibri" w:hAnsi="Calibri"/>
+                <w:b/>
+                <w:bCs/>
+                <w:color w:val="000000"/>
+              </w:rPr>
+              <w:t xml:space="preserve">Qué ofrece</w:t>
+            </w:r>
+          </w:p>
+        </w:tc>
+      </w:tr>
+      <w:tr>
+        <w:tc>
+          <w:tcPr>
+            <w:tcW w:type="dxa" w:w="2600"/>
+            <w:tcBorders>
+              <w:top w:val="single" w:color="000000" w:sz="4"/>
+              <w:left w:val="single" w:color="000000" w:sz="4"/>
+              <w:bottom w:val="single" w:color="000000" w:sz="4"/>
+              <w:right w:val="single" w:color="000000" w:sz="4"/>
+            </w:tcBorders>
+            <w:shd w:fill="FFFFFF" w:val="clear"/>
+            <w:tcMar>
+              <w:top w:type="dxa" w:w="60"/>
+              <w:left w:type="dxa" w:w="100"/>
+              <w:bottom w:type="dxa" w:w="60"/>
+              <w:right w:type="dxa" w:w="100"/>
+            </w:tcMar>
+          </w:tcPr>
+          <w:p>
+            <w:r>
+              <w:rPr>
+                <w:rFonts w:ascii="Calibri" w:cs="Calibri" w:eastAsia="Calibri" w:hAnsi="Calibri"/>
+                <w:b/>
+                <w:bCs/>
+              </w:rPr>
+              <w:t xml:space="preserve">Cisco Talos</w:t>
+            </w:r>
+          </w:p>
+        </w:tc>
+        <w:tc>
+          <w:tcPr>
+            <w:tcW w:type="dxa" w:w="6760"/>
+            <w:tcBorders>
+              <w:top w:val="single" w:color="000000" w:sz="4"/>
+              <w:left w:val="single" w:color="000000" w:sz="4"/>
+              <w:bottom w:val="single" w:color="000000" w:sz="4"/>
+              <w:right w:val="single" w:color="000000" w:sz="4"/>
+            </w:tcBorders>
+            <w:shd w:fill="FFFFFF" w:val="clear"/>
+            <w:tcMar>
+              <w:top w:type="dxa" w:w="60"/>
+              <w:left w:type="dxa" w:w="100"/>
+              <w:bottom w:type="dxa" w:w="60"/>
+              <w:right w:type="dxa" w:w="100"/>
+            </w:tcMar>
+          </w:tcPr>
+          <w:p>
+            <w:r>
+              <w:rPr>
+                <w:rFonts w:ascii="Calibri" w:cs="Calibri" w:eastAsia="Calibri" w:hAnsi="Calibri"/>
+              </w:rPr>
+              <w:t xml:space="preserve">Grupo de Inteligencia de Amenazas de Cisco</w:t>
+            </w:r>
+          </w:p>
+        </w:tc>
+      </w:tr>
+      <w:tr>
+        <w:tc>
+          <w:tcPr>
+            <w:tcW w:type="dxa" w:w="2600"/>
+            <w:tcBorders>
+              <w:top w:val="single" w:color="000000" w:sz="4"/>
+              <w:left w:val="single" w:color="000000" w:sz="4"/>
+              <w:bottom w:val="single" w:color="000000" w:sz="4"/>
+              <w:right w:val="single" w:color="000000" w:sz="4"/>
+            </w:tcBorders>
+            <w:shd w:fill="FFFFFF" w:val="clear"/>
+            <w:tcMar>
+              <w:top w:type="dxa" w:w="60"/>
+              <w:left w:type="dxa" w:w="100"/>
+              <w:bottom w:type="dxa" w:w="60"/>
+              <w:right w:type="dxa" w:w="100"/>
+            </w:tcMar>
+          </w:tcPr>
+          <w:p>
+            <w:r>
+              <w:rPr>
+                <w:rFonts w:ascii="Calibri" w:cs="Calibri" w:eastAsia="Calibri" w:hAnsi="Calibri"/>
+                <w:b/>
+                <w:bCs/>
+              </w:rPr>
+              <w:t xml:space="preserve">FireEye</w:t>
+            </w:r>
+          </w:p>
+        </w:tc>
+        <w:tc>
+          <w:tcPr>
+            <w:tcW w:type="dxa" w:w="6760"/>
+            <w:tcBorders>
+              <w:top w:val="single" w:color="000000" w:sz="4"/>
+              <w:left w:val="single" w:color="000000" w:sz="4"/>
+              <w:bottom w:val="single" w:color="000000" w:sz="4"/>
+              <w:right w:val="single" w:color="000000" w:sz="4"/>
+            </w:tcBorders>
+            <w:shd w:fill="FFFFFF" w:val="clear"/>
+            <w:tcMar>
+              <w:top w:type="dxa" w:w="60"/>
+              <w:left w:type="dxa" w:w="100"/>
+              <w:bottom w:type="dxa" w:w="60"/>
+              <w:right w:type="dxa" w:w="100"/>
+            </w:tcMar>
+          </w:tcPr>
+          <w:p>
+            <w:r>
+              <w:rPr>
+                <w:rFonts w:ascii="Calibri" w:cs="Calibri" w:eastAsia="Calibri" w:hAnsi="Calibri"/>
+              </w:rPr>
+              <w:t xml:space="preserve">Empresa de seguridad con servicios para ayudar a proteger las redes. Usa un </w:t>
+            </w:r>
+            <w:r>
+              <w:rPr>
+                <w:rFonts w:ascii="Calibri" w:cs="Calibri" w:eastAsia="Calibri" w:hAnsi="Calibri"/>
+                <w:b/>
+                <w:bCs/>
+              </w:rPr>
+              <w:t xml:space="preserve">enfoque triple</w:t>
+            </w:r>
+            <w:r>
+              <w:rPr>
+                <w:rFonts w:ascii="Calibri" w:cs="Calibri" w:eastAsia="Calibri" w:hAnsi="Calibri"/>
+              </w:rPr>
+              <w:t xml:space="preserve">: inteligencia de seguridad, experiencia en seguridad y la tecnología. Ofrece </w:t>
+            </w:r>
+            <w:r>
+              <w:rPr>
+                <w:rFonts w:ascii="Calibri" w:cs="Calibri" w:eastAsia="Calibri" w:hAnsi="Calibri"/>
+                <w:b/>
+                <w:bCs/>
+              </w:rPr>
+              <w:t xml:space="preserve">SIEM y SOAR</w:t>
+            </w:r>
+            <w:r>
+              <w:rPr>
+                <w:rFonts w:ascii="Calibri" w:cs="Calibri" w:eastAsia="Calibri" w:hAnsi="Calibri"/>
+              </w:rPr>
+              <w:t xml:space="preserve"> con la plataforma de seguridad </w:t>
+            </w:r>
+            <w:r>
+              <w:rPr>
+                <w:rFonts w:ascii="Calibri" w:cs="Calibri" w:eastAsia="Calibri" w:hAnsi="Calibri"/>
+                <w:b/>
+                <w:bCs/>
+              </w:rPr>
+              <w:t xml:space="preserve">Helix</w:t>
+            </w:r>
+            <w:r>
+              <w:rPr>
+                <w:rFonts w:ascii="Calibri" w:cs="Calibri" w:eastAsia="Calibri" w:hAnsi="Calibri"/>
+              </w:rPr>
+              <w:t xml:space="preserve">, que usa análisis de comportamiento y detección avanzada de amenazas, con el apoyo de la red mundial de inteligencia </w:t>
+            </w:r>
+            <w:r>
+              <w:rPr>
+                <w:rFonts w:ascii="Calibri" w:cs="Calibri" w:eastAsia="Calibri" w:hAnsi="Calibri"/>
+                <w:b/>
+                <w:bCs/>
+              </w:rPr>
+              <w:t xml:space="preserve">FireEye Mandiant</w:t>
+            </w:r>
+          </w:p>
+        </w:tc>
+      </w:tr>
+      <w:tr>
+        <w:tc>
+          <w:tcPr>
+            <w:tcW w:type="dxa" w:w="2600"/>
+            <w:tcBorders>
+              <w:top w:val="single" w:color="000000" w:sz="4"/>
+              <w:left w:val="single" w:color="000000" w:sz="4"/>
+              <w:bottom w:val="single" w:color="000000" w:sz="4"/>
+              <w:right w:val="single" w:color="000000" w:sz="4"/>
+            </w:tcBorders>
+            <w:shd w:fill="FFFFFF" w:val="clear"/>
+            <w:tcMar>
+              <w:top w:type="dxa" w:w="60"/>
+              <w:left w:type="dxa" w:w="100"/>
+              <w:bottom w:type="dxa" w:w="60"/>
+              <w:right w:type="dxa" w:w="100"/>
+            </w:tcMar>
+          </w:tcPr>
+          <w:p>
+            <w:r>
+              <w:rPr>
+                <w:rFonts w:ascii="Calibri" w:cs="Calibri" w:eastAsia="Calibri" w:hAnsi="Calibri"/>
+                <w:b/>
+                <w:bCs/>
+              </w:rPr>
+              <w:t xml:space="preserve">AIS (DHS)</w:t>
+            </w:r>
+          </w:p>
+        </w:tc>
+        <w:tc>
+          <w:tcPr>
+            <w:tcW w:type="dxa" w:w="6760"/>
+            <w:tcBorders>
+              <w:top w:val="single" w:color="000000" w:sz="4"/>
+              <w:left w:val="single" w:color="000000" w:sz="4"/>
+              <w:bottom w:val="single" w:color="000000" w:sz="4"/>
+              <w:right w:val="single" w:color="000000" w:sz="4"/>
+            </w:tcBorders>
+            <w:shd w:fill="FFFFFF" w:val="clear"/>
+            <w:tcMar>
+              <w:top w:type="dxa" w:w="60"/>
+              <w:left w:type="dxa" w:w="100"/>
+              <w:bottom w:type="dxa" w:w="60"/>
+              <w:right w:type="dxa" w:w="100"/>
+            </w:tcMar>
+          </w:tcPr>
+          <w:p>
+            <w:r>
+              <w:rPr>
+                <w:rFonts w:ascii="Calibri" w:cs="Calibri" w:eastAsia="Calibri" w:hAnsi="Calibri"/>
+              </w:rPr>
+              <w:t xml:space="preserve">El Departamento de Seguridad Nacional de EE. UU. ofrece este servicio </w:t>
+            </w:r>
+            <w:r>
+              <w:rPr>
+                <w:rFonts w:ascii="Calibri" w:cs="Calibri" w:eastAsia="Calibri" w:hAnsi="Calibri"/>
+                <w:b/>
+                <w:bCs/>
+              </w:rPr>
+              <w:t xml:space="preserve">gratuito</w:t>
+            </w:r>
+            <w:r>
+              <w:rPr>
+                <w:rFonts w:ascii="Calibri" w:cs="Calibri" w:eastAsia="Calibri" w:hAnsi="Calibri"/>
+              </w:rPr>
+              <w:t xml:space="preserve">: </w:t>
+            </w:r>
+            <w:r>
+              <w:rPr>
+                <w:rFonts w:ascii="Calibri" w:cs="Calibri" w:eastAsia="Calibri" w:hAnsi="Calibri"/>
+                <w:b/>
+                <w:bCs/>
+              </w:rPr>
+              <w:t xml:space="preserve">Intercambio Automático de Indicadores</w:t>
+            </w:r>
+            <w:r>
+              <w:rPr>
+                <w:rFonts w:ascii="Calibri" w:cs="Calibri" w:eastAsia="Calibri" w:hAnsi="Calibri"/>
+              </w:rPr>
+              <w:t xml:space="preserve">. Permite el intercambio </w:t>
+            </w:r>
+            <w:r>
+              <w:rPr>
+                <w:rFonts w:ascii="Calibri" w:cs="Calibri" w:eastAsia="Calibri" w:hAnsi="Calibri"/>
+                <w:b/>
+                <w:bCs/>
+              </w:rPr>
+              <w:t xml:space="preserve">en tiempo real</w:t>
+            </w:r>
+            <w:r>
+              <w:rPr>
+                <w:rFonts w:ascii="Calibri" w:cs="Calibri" w:eastAsia="Calibri" w:hAnsi="Calibri"/>
+              </w:rPr>
+              <w:t xml:space="preserve"> de indicadores de ciberamenazas entre el Gobierno Federal de EE. UU. y el sector privado</w:t>
+            </w:r>
+          </w:p>
+        </w:tc>
+      </w:tr>
+      <w:tr>
+        <w:tc>
+          <w:tcPr>
+            <w:tcW w:type="dxa" w:w="2600"/>
+            <w:tcBorders>
+              <w:top w:val="single" w:color="000000" w:sz="4"/>
+              <w:left w:val="single" w:color="000000" w:sz="4"/>
+              <w:bottom w:val="single" w:color="000000" w:sz="4"/>
+              <w:right w:val="single" w:color="000000" w:sz="4"/>
+            </w:tcBorders>
+            <w:shd w:fill="FFFFFF" w:val="clear"/>
+            <w:tcMar>
+              <w:top w:type="dxa" w:w="60"/>
+              <w:left w:type="dxa" w:w="100"/>
+              <w:bottom w:type="dxa" w:w="60"/>
+              <w:right w:type="dxa" w:w="100"/>
+            </w:tcMar>
+          </w:tcPr>
+          <w:p>
+            <w:r>
+              <w:rPr>
+                <w:rFonts w:ascii="Calibri" w:cs="Calibri" w:eastAsia="Calibri" w:hAnsi="Calibri"/>
+                <w:b/>
+                <w:bCs/>
+              </w:rPr>
+              <w:t xml:space="preserve">MITRE</w:t>
+            </w:r>
+          </w:p>
+        </w:tc>
+        <w:tc>
+          <w:tcPr>
+            <w:tcW w:type="dxa" w:w="6760"/>
+            <w:tcBorders>
+              <w:top w:val="single" w:color="000000" w:sz="4"/>
+              <w:left w:val="single" w:color="000000" w:sz="4"/>
+              <w:bottom w:val="single" w:color="000000" w:sz="4"/>
+              <w:right w:val="single" w:color="000000" w:sz="4"/>
+            </w:tcBorders>
+            <w:shd w:fill="FFFFFF" w:val="clear"/>
+            <w:tcMar>
+              <w:top w:type="dxa" w:w="60"/>
+              <w:left w:type="dxa" w:w="100"/>
+              <w:bottom w:type="dxa" w:w="60"/>
+              <w:right w:type="dxa" w:w="100"/>
+            </w:tcMar>
+          </w:tcPr>
+          <w:p>
+            <w:r>
+              <w:rPr>
+                <w:rFonts w:ascii="Calibri" w:cs="Calibri" w:eastAsia="Calibri" w:hAnsi="Calibri"/>
+              </w:rPr>
+              <w:t xml:space="preserve">Corporación que patrocinó el gobierno de EE. UU. para crear y mantener un </w:t>
+            </w:r>
+            <w:r>
+              <w:rPr>
+                <w:rFonts w:ascii="Calibri" w:cs="Calibri" w:eastAsia="Calibri" w:hAnsi="Calibri"/>
+                <w:b/>
+                <w:bCs/>
+              </w:rPr>
+              <w:t xml:space="preserve">catálogo de amenazas de seguridad conocidas</w:t>
+            </w:r>
+            <w:r>
+              <w:rPr>
+                <w:rFonts w:ascii="Calibri" w:cs="Calibri" w:eastAsia="Calibri" w:hAnsi="Calibri"/>
+              </w:rPr>
+              <w:t xml:space="preserve">, llamado </w:t>
+            </w:r>
+            <w:r>
+              <w:rPr>
+                <w:rFonts w:ascii="Calibri" w:cs="Calibri" w:eastAsia="Calibri" w:hAnsi="Calibri"/>
+                <w:b/>
+                <w:bCs/>
+              </w:rPr>
+              <w:t xml:space="preserve">CVE</w:t>
+            </w:r>
+          </w:p>
+        </w:tc>
+      </w:tr>
+    </w:tbl>
+    <w:p>
+      <w:pPr>
+        <w:spacing w:after="80"/>
+      </w:pPr>
+    </w:p>
+    <w:p>
+      <w:pPr>
+        <w:spacing w:after="80" w:before="160"/>
+      </w:pPr>
+      <w:r>
+        <w:rPr>
+          <w:rFonts w:ascii="Calibri" w:cs="Calibri" w:eastAsia="Calibri" w:hAnsi="Calibri"/>
+          <w:b/>
+          <w:bCs/>
+        </w:rPr>
+        <w:t xml:space="preserve">Estándares de intercambio de información de amenazas</w:t>
+      </w:r>
+    </w:p>
+    <w:p>
+      <w:pPr>
+        <w:spacing w:after="100"/>
+      </w:pPr>
+      <w:r>
+        <w:rPr>
+          <w:rFonts w:ascii="Calibri" w:cs="Calibri" w:eastAsia="Calibri" w:hAnsi="Calibri"/>
+        </w:rPr>
+        <w:t xml:space="preserve">Los </w:t>
+      </w:r>
+      <w:r>
+        <w:rPr>
+          <w:rFonts w:ascii="Calibri" w:cs="Calibri" w:eastAsia="Calibri" w:hAnsi="Calibri"/>
+          <w:b/>
+          <w:bCs/>
+        </w:rPr>
+        <w:t xml:space="preserve">3 estándares comunes</w:t>
+      </w:r>
+      <w:r>
+        <w:rPr>
+          <w:rFonts w:ascii="Calibri" w:cs="Calibri" w:eastAsia="Calibri" w:hAnsi="Calibri"/>
+        </w:rPr>
+        <w:t xml:space="preserve">:</w:t>
+      </w:r>
+    </w:p>
+    <w:tbl>
+      <w:tblPr>
+        <w:tblW w:type="dxa" w:w="9360"/>
+        <w:tblBorders>
+          <w:top w:val="single" w:color="auto" w:sz="4"/>
+          <w:left w:val="single" w:color="auto" w:sz="4"/>
+          <w:bottom w:val="single" w:color="auto" w:sz="4"/>
+          <w:right w:val="single" w:color="auto" w:sz="4"/>
+          <w:insideH w:val="single" w:color="auto" w:sz="4"/>
+          <w:insideV w:val="single" w:color="auto" w:sz="4"/>
+        </w:tblBorders>
+      </w:tblPr>
+      <w:tblGrid>
+        <w:gridCol w:w="2200"/>
+        <w:gridCol w:w="7160"/>
+      </w:tblGrid>
+      <w:tr>
+        <w:trPr>
+          <w:tblHeader/>
+        </w:trPr>
+        <w:tc>
+          <w:tcPr>
+            <w:tcW w:type="dxa" w:w="2200"/>
+            <w:tcBorders>
+              <w:top w:val="single" w:color="000000" w:sz="4"/>
+              <w:left w:val="single" w:color="000000" w:sz="4"/>
+              <w:bottom w:val="single" w:color="000000" w:sz="4"/>
+              <w:right w:val="single" w:color="000000" w:sz="4"/>
+            </w:tcBorders>
+            <w:shd w:fill="D9D9D9" w:val="clear"/>
+            <w:tcMar>
+              <w:top w:type="dxa" w:w="60"/>
+              <w:left w:type="dxa" w:w="100"/>
+              <w:bottom w:type="dxa" w:w="60"/>
+              <w:right w:type="dxa" w:w="100"/>
+            </w:tcMar>
+          </w:tcPr>
+          <w:p>
+            <w:r>
+              <w:rPr>
+                <w:rFonts w:ascii="Calibri" w:cs="Calibri" w:eastAsia="Calibri" w:hAnsi="Calibri"/>
+                <w:b/>
+                <w:bCs/>
+                <w:color w:val="000000"/>
+              </w:rPr>
+              <w:t xml:space="preserve">Estándar</w:t>
+            </w:r>
+          </w:p>
+        </w:tc>
+        <w:tc>
+          <w:tcPr>
+            <w:tcW w:type="dxa" w:w="7160"/>
+            <w:tcBorders>
+              <w:top w:val="single" w:color="000000" w:sz="4"/>
+              <w:left w:val="single" w:color="000000" w:sz="4"/>
+              <w:bottom w:val="single" w:color="000000" w:sz="4"/>
+              <w:right w:val="single" w:color="000000" w:sz="4"/>
+            </w:tcBorders>
+            <w:shd w:fill="D9D9D9" w:val="clear"/>
+            <w:tcMar>
+              <w:top w:type="dxa" w:w="60"/>
+              <w:left w:type="dxa" w:w="100"/>
+              <w:bottom w:type="dxa" w:w="60"/>
+              <w:right w:type="dxa" w:w="100"/>
+            </w:tcMar>
+          </w:tcPr>
+          <w:p>
+            <w:r>
+              <w:rPr>
+                <w:rFonts w:ascii="Calibri" w:cs="Calibri" w:eastAsia="Calibri" w:hAnsi="Calibri"/>
+                <w:b/>
+                <w:bCs/>
+                <w:color w:val="000000"/>
+              </w:rPr>
+              <w:t xml:space="preserve">Nombre</w:t>
+            </w:r>
+          </w:p>
+        </w:tc>
+      </w:tr>
+      <w:tr>
+        <w:tc>
+          <w:tcPr>
+            <w:tcW w:type="dxa" w:w="2200"/>
+            <w:tcBorders>
+              <w:top w:val="single" w:color="000000" w:sz="4"/>
+              <w:left w:val="single" w:color="000000" w:sz="4"/>
+              <w:bottom w:val="single" w:color="000000" w:sz="4"/>
+              <w:right w:val="single" w:color="000000" w:sz="4"/>
+            </w:tcBorders>
+            <w:shd w:fill="FFFFFF" w:val="clear"/>
+            <w:tcMar>
+              <w:top w:type="dxa" w:w="60"/>
+              <w:left w:type="dxa" w:w="100"/>
+              <w:bottom w:type="dxa" w:w="60"/>
+              <w:right w:type="dxa" w:w="100"/>
+            </w:tcMar>
+          </w:tcPr>
+          <w:p>
+            <w:r>
+              <w:rPr>
+                <w:rFonts w:ascii="Calibri" w:cs="Calibri" w:eastAsia="Calibri" w:hAnsi="Calibri"/>
+                <w:b/>
+                <w:bCs/>
+              </w:rPr>
+              <w:t xml:space="preserve">STIX</w:t>
+            </w:r>
+          </w:p>
+        </w:tc>
+        <w:tc>
+          <w:tcPr>
+            <w:tcW w:type="dxa" w:w="7160"/>
+            <w:tcBorders>
+              <w:top w:val="single" w:color="000000" w:sz="4"/>
+              <w:left w:val="single" w:color="000000" w:sz="4"/>
+              <w:bottom w:val="single" w:color="000000" w:sz="4"/>
+              <w:right w:val="single" w:color="000000" w:sz="4"/>
+            </w:tcBorders>
+            <w:shd w:fill="FFFFFF" w:val="clear"/>
+            <w:tcMar>
+              <w:top w:type="dxa" w:w="60"/>
+              <w:left w:type="dxa" w:w="100"/>
+              <w:bottom w:type="dxa" w:w="60"/>
+              <w:right w:type="dxa" w:w="100"/>
+            </w:tcMar>
+          </w:tcPr>
+          <w:p>
+            <w:r>
+              <w:rPr>
+                <w:rFonts w:ascii="Calibri" w:cs="Calibri" w:eastAsia="Calibri" w:hAnsi="Calibri"/>
+              </w:rPr>
+              <w:t xml:space="preserve">Expresión Estructurada de Información sobre Amenazas</w:t>
+            </w:r>
+          </w:p>
+        </w:tc>
+      </w:tr>
+      <w:tr>
+        <w:tc>
+          <w:tcPr>
+            <w:tcW w:type="dxa" w:w="2200"/>
+            <w:tcBorders>
+              <w:top w:val="single" w:color="000000" w:sz="4"/>
+              <w:left w:val="single" w:color="000000" w:sz="4"/>
+              <w:bottom w:val="single" w:color="000000" w:sz="4"/>
+              <w:right w:val="single" w:color="000000" w:sz="4"/>
+            </w:tcBorders>
+            <w:shd w:fill="FFFFFF" w:val="clear"/>
+            <w:tcMar>
+              <w:top w:type="dxa" w:w="60"/>
+              <w:left w:type="dxa" w:w="100"/>
+              <w:bottom w:type="dxa" w:w="60"/>
+              <w:right w:type="dxa" w:w="100"/>
+            </w:tcMar>
+          </w:tcPr>
+          <w:p>
+            <w:r>
+              <w:rPr>
+                <w:rFonts w:ascii="Calibri" w:cs="Calibri" w:eastAsia="Calibri" w:hAnsi="Calibri"/>
+                <w:b/>
+                <w:bCs/>
+              </w:rPr>
+              <w:t xml:space="preserve">TAXII</w:t>
+            </w:r>
+          </w:p>
+        </w:tc>
+        <w:tc>
+          <w:tcPr>
+            <w:tcW w:type="dxa" w:w="7160"/>
+            <w:tcBorders>
+              <w:top w:val="single" w:color="000000" w:sz="4"/>
+              <w:left w:val="single" w:color="000000" w:sz="4"/>
+              <w:bottom w:val="single" w:color="000000" w:sz="4"/>
+              <w:right w:val="single" w:color="000000" w:sz="4"/>
+            </w:tcBorders>
+            <w:shd w:fill="FFFFFF" w:val="clear"/>
+            <w:tcMar>
+              <w:top w:type="dxa" w:w="60"/>
+              <w:left w:type="dxa" w:w="100"/>
+              <w:bottom w:type="dxa" w:w="60"/>
+              <w:right w:type="dxa" w:w="100"/>
+            </w:tcMar>
+          </w:tcPr>
+          <w:p>
+            <w:r>
+              <w:rPr>
+                <w:rFonts w:ascii="Calibri" w:cs="Calibri" w:eastAsia="Calibri" w:hAnsi="Calibri"/>
+              </w:rPr>
+              <w:t xml:space="preserve">Intercambio Automatizado y Confiable de Información de Inteligencia</w:t>
+            </w:r>
+          </w:p>
+        </w:tc>
+      </w:tr>
+      <w:tr>
+        <w:tc>
+          <w:tcPr>
+            <w:tcW w:type="dxa" w:w="2200"/>
+            <w:tcBorders>
+              <w:top w:val="single" w:color="000000" w:sz="4"/>
+              <w:left w:val="single" w:color="000000" w:sz="4"/>
+              <w:bottom w:val="single" w:color="000000" w:sz="4"/>
+              <w:right w:val="single" w:color="000000" w:sz="4"/>
+            </w:tcBorders>
+            <w:shd w:fill="FFFFFF" w:val="clear"/>
+            <w:tcMar>
+              <w:top w:type="dxa" w:w="60"/>
+              <w:left w:type="dxa" w:w="100"/>
+              <w:bottom w:type="dxa" w:w="60"/>
+              <w:right w:type="dxa" w:w="100"/>
+            </w:tcMar>
+          </w:tcPr>
+          <w:p>
+            <w:r>
+              <w:rPr>
+                <w:rFonts w:ascii="Calibri" w:cs="Calibri" w:eastAsia="Calibri" w:hAnsi="Calibri"/>
+                <w:b/>
+                <w:bCs/>
+              </w:rPr>
+              <w:t xml:space="preserve">CybOX</w:t>
+            </w:r>
+          </w:p>
+        </w:tc>
+        <w:tc>
+          <w:tcPr>
+            <w:tcW w:type="dxa" w:w="7160"/>
+            <w:tcBorders>
+              <w:top w:val="single" w:color="000000" w:sz="4"/>
+              <w:left w:val="single" w:color="000000" w:sz="4"/>
+              <w:bottom w:val="single" w:color="000000" w:sz="4"/>
+              <w:right w:val="single" w:color="000000" w:sz="4"/>
+            </w:tcBorders>
+            <w:shd w:fill="FFFFFF" w:val="clear"/>
+            <w:tcMar>
+              <w:top w:type="dxa" w:w="60"/>
+              <w:left w:type="dxa" w:w="100"/>
+              <w:bottom w:type="dxa" w:w="60"/>
+              <w:right w:type="dxa" w:w="100"/>
+            </w:tcMar>
+          </w:tcPr>
+          <w:p>
+            <w:r>
+              <w:rPr>
+                <w:rFonts w:ascii="Calibri" w:cs="Calibri" w:eastAsia="Calibri" w:hAnsi="Calibri"/>
+              </w:rPr>
+              <w:t xml:space="preserve">Estándar abierto de intercambio</w:t>
+            </w:r>
+          </w:p>
+        </w:tc>
+      </w:tr>
+    </w:tbl>
+    <w:p>
+      <w:pPr>
+        <w:spacing w:after="80"/>
+      </w:pPr>
+    </w:p>
+    <w:p>
+      <w:pPr>
+        <w:pStyle w:val="ListParagraph"/>
+        <w:numPr>
+          <w:ilvl w:val="0"/>
+          <w:numId w:val="2"/>
+        </w:numPr>
+        <w:spacing w:after="60"/>
+      </w:pPr>
+      <w:r>
+        <w:rPr>
+          <w:rFonts w:ascii="Calibri" w:cs="Calibri" w:eastAsia="Calibri" w:hAnsi="Calibri"/>
+        </w:rPr>
+        <w:t xml:space="preserve">Estos estándares abiertos dan las especificaciones que ayudan en el </w:t>
+      </w:r>
+      <w:r>
+        <w:rPr>
+          <w:rFonts w:ascii="Calibri" w:cs="Calibri" w:eastAsia="Calibri" w:hAnsi="Calibri"/>
+          <w:b/>
+          <w:bCs/>
+        </w:rPr>
+        <w:t xml:space="preserve">intercambio automatizado</w:t>
+      </w:r>
+      <w:r>
+        <w:rPr>
+          <w:rFonts w:ascii="Calibri" w:cs="Calibri" w:eastAsia="Calibri" w:hAnsi="Calibri"/>
+        </w:rPr>
+        <w:t xml:space="preserve"> de inteligencia de ciberamenazas en un </w:t>
+      </w:r>
+      <w:r>
+        <w:rPr>
+          <w:rFonts w:ascii="Calibri" w:cs="Calibri" w:eastAsia="Calibri" w:hAnsi="Calibri"/>
+          <w:b/>
+          <w:bCs/>
+        </w:rPr>
+        <w:t xml:space="preserve">formato estandarizado</w:t>
+      </w:r>
+      <w:r>
+        <w:rPr>
+          <w:rFonts w:ascii="Calibri" w:cs="Calibri" w:eastAsia="Calibri" w:hAnsi="Calibri"/>
+        </w:rPr>
+        <w:t xml:space="preserve">.</w:t>
       </w:r>
     </w:p>
     <w:sectPr>

</xml_diff>

<commit_message>
Agrega Módulo 25: Evaluación de vulnerabilidades de terminales al resumen de módulos 19 en adelante
Co-Authored-By: Claude Sonnet 5.5 <noreply@anthropic.com>
Claude-Session: https://claude.ai/code/session_013iWwbBbHxw2c1QtKDe5PjZ
</commit_message>
<xml_diff>
--- a/Modulos_19_en_adelante_Resumen.docx
+++ b/Modulos_19_en_adelante_Resumen.docx
@@ -12594,6 +12594,2766 @@
           <w:rFonts w:ascii="Calibri" w:cs="Calibri" w:eastAsia="Calibri" w:hAnsi="Calibri"/>
         </w:rPr>
         <w:t xml:space="preserve">.</w:t>
+      </w:r>
+    </w:p>
+    <w:p>
+      <w:r>
+        <w:br w:type="page"/>
+      </w:r>
+    </w:p>
+    <w:p>
+      <w:pPr>
+        <w:spacing w:after="60"/>
+        <w:jc w:val="center"/>
+      </w:pPr>
+      <w:r>
+        <w:rPr>
+          <w:rFonts w:ascii="Calibri" w:cs="Calibri" w:eastAsia="Calibri" w:hAnsi="Calibri"/>
+          <w:b/>
+          <w:bCs/>
+          <w:color w:val="000000"/>
+          <w:sz w:val="24"/>
+          <w:szCs w:val="24"/>
+        </w:rPr>
+        <w:t xml:space="preserve">Módulo 25: Evaluación de vulnerabilidades de terminales</w:t>
+      </w:r>
+    </w:p>
+    <w:p>
+      <w:pPr>
+        <w:spacing w:after="200"/>
+        <w:jc w:val="center"/>
+      </w:pPr>
+      <w:r>
+        <w:rPr>
+          <w:rFonts w:ascii="Calibri" w:cs="Calibri" w:eastAsia="Calibri" w:hAnsi="Calibri"/>
+          <w:color w:val="000000"/>
+          <w:sz w:val="24"/>
+          <w:szCs w:val="24"/>
+        </w:rPr>
+        <w:t xml:space="preserve">Resumen de ciberseguridad</w:t>
+      </w:r>
+    </w:p>
+    <w:p>
+      <w:pPr>
+        <w:spacing w:after="120" w:before="280"/>
+      </w:pPr>
+      <w:r>
+        <w:rPr>
+          <w:rFonts w:ascii="Calibri" w:cs="Calibri" w:eastAsia="Calibri" w:hAnsi="Calibri"/>
+          <w:b/>
+          <w:bCs/>
+        </w:rPr>
+        <w:t xml:space="preserve">1. Perfiles de redes y servidores</w:t>
+      </w:r>
+    </w:p>
+    <w:p>
+      <w:pPr>
+        <w:spacing w:after="80" w:before="160"/>
+      </w:pPr>
+      <w:r>
+        <w:rPr>
+          <w:rFonts w:ascii="Calibri" w:cs="Calibri" w:eastAsia="Calibri" w:hAnsi="Calibri"/>
+          <w:b/>
+          <w:bCs/>
+        </w:rPr>
+        <w:t xml:space="preserve">Perfil de red</w:t>
+      </w:r>
+    </w:p>
+    <w:p>
+      <w:pPr>
+        <w:pStyle w:val="ListParagraph"/>
+        <w:numPr>
+          <w:ilvl w:val="0"/>
+          <w:numId w:val="2"/>
+        </w:numPr>
+        <w:spacing w:after="60"/>
+      </w:pPr>
+      <w:r>
+        <w:rPr>
+          <w:rFonts w:ascii="Calibri" w:cs="Calibri" w:eastAsia="Calibri" w:hAnsi="Calibri"/>
+        </w:rPr>
+        <w:t xml:space="preserve">Sirve para tener </w:t>
+      </w:r>
+      <w:r>
+        <w:rPr>
+          <w:rFonts w:ascii="Calibri" w:cs="Calibri" w:eastAsia="Calibri" w:hAnsi="Calibri"/>
+          <w:b/>
+          <w:bCs/>
+        </w:rPr>
+        <w:t xml:space="preserve">información estadística de referencia</w:t>
+      </w:r>
+      <w:r>
+        <w:rPr>
+          <w:rFonts w:ascii="Calibri" w:cs="Calibri" w:eastAsia="Calibri" w:hAnsi="Calibri"/>
+        </w:rPr>
+        <w:t xml:space="preserve">: un punto de comparación para el </w:t>
+      </w:r>
+      <w:r>
+        <w:rPr>
+          <w:rFonts w:ascii="Calibri" w:cs="Calibri" w:eastAsia="Calibri" w:hAnsi="Calibri"/>
+          <w:b/>
+          <w:bCs/>
+        </w:rPr>
+        <w:t xml:space="preserve">rendimiento normal</w:t>
+      </w:r>
+      <w:r>
+        <w:rPr>
+          <w:rFonts w:ascii="Calibri" w:cs="Calibri" w:eastAsia="Calibri" w:hAnsi="Calibri"/>
+        </w:rPr>
+        <w:t xml:space="preserve"> de la red y del dispositivo.</w:t>
+      </w:r>
+    </w:p>
+    <w:p>
+      <w:pPr>
+        <w:spacing w:after="100"/>
+      </w:pPr>
+      <w:r>
+        <w:rPr>
+          <w:rFonts w:ascii="Calibri" w:cs="Calibri" w:eastAsia="Calibri" w:hAnsi="Calibri"/>
+        </w:rPr>
+        <w:t xml:space="preserve">Elementos importantes del perfil de red:</w:t>
+      </w:r>
+    </w:p>
+    <w:p>
+      <w:pPr>
+        <w:pStyle w:val="ListParagraph"/>
+        <w:numPr>
+          <w:ilvl w:val="0"/>
+          <w:numId w:val="2"/>
+        </w:numPr>
+        <w:spacing w:after="60"/>
+      </w:pPr>
+      <w:r>
+        <w:rPr>
+          <w:rFonts w:ascii="Calibri" w:cs="Calibri" w:eastAsia="Calibri" w:hAnsi="Calibri"/>
+          <w:b/>
+          <w:bCs/>
+        </w:rPr>
+        <w:t xml:space="preserve">Duración de la sesión</w:t>
+      </w:r>
+    </w:p>
+    <w:p>
+      <w:pPr>
+        <w:pStyle w:val="ListParagraph"/>
+        <w:numPr>
+          <w:ilvl w:val="0"/>
+          <w:numId w:val="2"/>
+        </w:numPr>
+        <w:spacing w:after="60"/>
+      </w:pPr>
+      <w:r>
+        <w:rPr>
+          <w:rFonts w:ascii="Calibri" w:cs="Calibri" w:eastAsia="Calibri" w:hAnsi="Calibri"/>
+          <w:b/>
+          <w:bCs/>
+        </w:rPr>
+        <w:t xml:space="preserve">Rendimiento total</w:t>
+      </w:r>
+    </w:p>
+    <w:p>
+      <w:pPr>
+        <w:pStyle w:val="ListParagraph"/>
+        <w:numPr>
+          <w:ilvl w:val="0"/>
+          <w:numId w:val="2"/>
+        </w:numPr>
+        <w:spacing w:after="60"/>
+      </w:pPr>
+      <w:r>
+        <w:rPr>
+          <w:rFonts w:ascii="Calibri" w:cs="Calibri" w:eastAsia="Calibri" w:hAnsi="Calibri"/>
+          <w:b/>
+          <w:bCs/>
+        </w:rPr>
+        <w:t xml:space="preserve">Puertos utilizados</w:t>
+      </w:r>
+    </w:p>
+    <w:p>
+      <w:pPr>
+        <w:pStyle w:val="ListParagraph"/>
+        <w:numPr>
+          <w:ilvl w:val="0"/>
+          <w:numId w:val="2"/>
+        </w:numPr>
+        <w:spacing w:after="60"/>
+      </w:pPr>
+      <w:r>
+        <w:rPr>
+          <w:rFonts w:ascii="Calibri" w:cs="Calibri" w:eastAsia="Calibri" w:hAnsi="Calibri"/>
+          <w:b/>
+          <w:bCs/>
+        </w:rPr>
+        <w:t xml:space="preserve">Espacio de direcciones de activos críticos</w:t>
+      </w:r>
+    </w:p>
+    <w:p>
+      <w:pPr>
+        <w:spacing w:after="80" w:before="160"/>
+      </w:pPr>
+      <w:r>
+        <w:rPr>
+          <w:rFonts w:ascii="Calibri" w:cs="Calibri" w:eastAsia="Calibri" w:hAnsi="Calibri"/>
+          <w:b/>
+          <w:bCs/>
+        </w:rPr>
+        <w:t xml:space="preserve">Perfil de servidor</w:t>
+      </w:r>
+    </w:p>
+    <w:p>
+      <w:pPr>
+        <w:pStyle w:val="ListParagraph"/>
+        <w:numPr>
+          <w:ilvl w:val="0"/>
+          <w:numId w:val="2"/>
+        </w:numPr>
+        <w:spacing w:after="60"/>
+      </w:pPr>
+      <w:r>
+        <w:rPr>
+          <w:rFonts w:ascii="Calibri" w:cs="Calibri" w:eastAsia="Calibri" w:hAnsi="Calibri"/>
+        </w:rPr>
+        <w:t xml:space="preserve">Se usa para establecer el </w:t>
+      </w:r>
+      <w:r>
+        <w:rPr>
+          <w:rFonts w:ascii="Calibri" w:cs="Calibri" w:eastAsia="Calibri" w:hAnsi="Calibri"/>
+          <w:b/>
+          <w:bCs/>
+        </w:rPr>
+        <w:t xml:space="preserve">funcionamiento aceptado</w:t>
+      </w:r>
+      <w:r>
+        <w:rPr>
+          <w:rFonts w:ascii="Calibri" w:cs="Calibri" w:eastAsia="Calibri" w:hAnsi="Calibri"/>
+        </w:rPr>
+        <w:t xml:space="preserve"> de los servidores.</w:t>
+      </w:r>
+    </w:p>
+    <w:p>
+      <w:pPr>
+        <w:pStyle w:val="ListParagraph"/>
+        <w:numPr>
+          <w:ilvl w:val="0"/>
+          <w:numId w:val="2"/>
+        </w:numPr>
+        <w:spacing w:after="60"/>
+      </w:pPr>
+      <w:r>
+        <w:rPr>
+          <w:rFonts w:ascii="Calibri" w:cs="Calibri" w:eastAsia="Calibri" w:hAnsi="Calibri"/>
+        </w:rPr>
+        <w:t xml:space="preserve">Es una referencia de seguridad para un servidor específico.</w:t>
+      </w:r>
+    </w:p>
+    <w:p>
+      <w:pPr>
+        <w:spacing w:after="100"/>
+      </w:pPr>
+      <w:r>
+        <w:rPr>
+          <w:rFonts w:ascii="Calibri" w:cs="Calibri" w:eastAsia="Calibri" w:hAnsi="Calibri"/>
+        </w:rPr>
+        <w:t xml:space="preserve">Establece:</w:t>
+      </w:r>
+    </w:p>
+    <w:p>
+      <w:pPr>
+        <w:pStyle w:val="ListParagraph"/>
+        <w:numPr>
+          <w:ilvl w:val="1"/>
+          <w:numId w:val="2"/>
+        </w:numPr>
+        <w:spacing w:after="60"/>
+      </w:pPr>
+      <w:r>
+        <w:rPr>
+          <w:rFonts w:ascii="Calibri" w:cs="Calibri" w:eastAsia="Calibri" w:hAnsi="Calibri"/>
+        </w:rPr>
+        <w:t xml:space="preserve">La </w:t>
+      </w:r>
+      <w:r>
+        <w:rPr>
+          <w:rFonts w:ascii="Calibri" w:cs="Calibri" w:eastAsia="Calibri" w:hAnsi="Calibri"/>
+          <w:b/>
+          <w:bCs/>
+        </w:rPr>
+        <w:t xml:space="preserve">red</w:t>
+      </w:r>
+    </w:p>
+    <w:p>
+      <w:pPr>
+        <w:pStyle w:val="ListParagraph"/>
+        <w:numPr>
+          <w:ilvl w:val="1"/>
+          <w:numId w:val="2"/>
+        </w:numPr>
+        <w:spacing w:after="60"/>
+      </w:pPr>
+      <w:r>
+        <w:rPr>
+          <w:rFonts w:ascii="Calibri" w:cs="Calibri" w:eastAsia="Calibri" w:hAnsi="Calibri"/>
+        </w:rPr>
+        <w:t xml:space="preserve">El </w:t>
+      </w:r>
+      <w:r>
+        <w:rPr>
+          <w:rFonts w:ascii="Calibri" w:cs="Calibri" w:eastAsia="Calibri" w:hAnsi="Calibri"/>
+          <w:b/>
+          <w:bCs/>
+        </w:rPr>
+        <w:t xml:space="preserve">usuario</w:t>
+      </w:r>
+    </w:p>
+    <w:p>
+      <w:pPr>
+        <w:pStyle w:val="ListParagraph"/>
+        <w:numPr>
+          <w:ilvl w:val="1"/>
+          <w:numId w:val="2"/>
+        </w:numPr>
+        <w:spacing w:after="60"/>
+      </w:pPr>
+      <w:r>
+        <w:rPr>
+          <w:rFonts w:ascii="Calibri" w:cs="Calibri" w:eastAsia="Calibri" w:hAnsi="Calibri"/>
+        </w:rPr>
+        <w:t xml:space="preserve">Los </w:t>
+      </w:r>
+      <w:r>
+        <w:rPr>
+          <w:rFonts w:ascii="Calibri" w:cs="Calibri" w:eastAsia="Calibri" w:hAnsi="Calibri"/>
+          <w:b/>
+          <w:bCs/>
+        </w:rPr>
+        <w:t xml:space="preserve">parámetros de aplicaciones</w:t>
+      </w:r>
+      <w:r>
+        <w:rPr>
+          <w:rFonts w:ascii="Calibri" w:cs="Calibri" w:eastAsia="Calibri" w:hAnsi="Calibri"/>
+        </w:rPr>
+        <w:t xml:space="preserve"> que se aceptan para ese servidor</w:t>
+      </w:r>
+    </w:p>
+    <w:p>
+      <w:pPr>
+        <w:spacing w:after="80" w:before="160"/>
+      </w:pPr>
+      <w:r>
+        <w:rPr>
+          <w:rFonts w:ascii="Calibri" w:cs="Calibri" w:eastAsia="Calibri" w:hAnsi="Calibri"/>
+          <w:b/>
+          <w:bCs/>
+        </w:rPr>
+        <w:t xml:space="preserve">Comportamiento de la red y big data</w:t>
+      </w:r>
+    </w:p>
+    <w:p>
+      <w:pPr>
+        <w:pStyle w:val="ListParagraph"/>
+        <w:numPr>
+          <w:ilvl w:val="0"/>
+          <w:numId w:val="2"/>
+        </w:numPr>
+        <w:spacing w:after="60"/>
+      </w:pPr>
+      <w:r>
+        <w:rPr>
+          <w:rFonts w:ascii="Calibri" w:cs="Calibri" w:eastAsia="Calibri" w:hAnsi="Calibri"/>
+        </w:rPr>
+        <w:t xml:space="preserve">El comportamiento de la red se puede describir con muchos datos distintos: características del </w:t>
+      </w:r>
+      <w:r>
+        <w:rPr>
+          <w:rFonts w:ascii="Calibri" w:cs="Calibri" w:eastAsia="Calibri" w:hAnsi="Calibri"/>
+          <w:b/>
+          <w:bCs/>
+        </w:rPr>
+        <w:t xml:space="preserve">flujo de paquetes</w:t>
+      </w:r>
+      <w:r>
+        <w:rPr>
+          <w:rFonts w:ascii="Calibri" w:cs="Calibri" w:eastAsia="Calibri" w:hAnsi="Calibri"/>
+        </w:rPr>
+        <w:t xml:space="preserve">, particularidades de los mismos paquetes y </w:t>
+      </w:r>
+      <w:r>
+        <w:rPr>
+          <w:rFonts w:ascii="Calibri" w:cs="Calibri" w:eastAsia="Calibri" w:hAnsi="Calibri"/>
+          <w:b/>
+          <w:bCs/>
+        </w:rPr>
+        <w:t xml:space="preserve">telemetría</w:t>
+      </w:r>
+      <w:r>
+        <w:rPr>
+          <w:rFonts w:ascii="Calibri" w:cs="Calibri" w:eastAsia="Calibri" w:hAnsi="Calibri"/>
+        </w:rPr>
+        <w:t xml:space="preserve"> de múltiples fuentes.</w:t>
+      </w:r>
+    </w:p>
+    <w:p>
+      <w:pPr>
+        <w:pStyle w:val="ListParagraph"/>
+        <w:numPr>
+          <w:ilvl w:val="0"/>
+          <w:numId w:val="2"/>
+        </w:numPr>
+        <w:spacing w:after="60"/>
+      </w:pPr>
+      <w:r>
+        <w:rPr>
+          <w:rFonts w:ascii="Calibri" w:cs="Calibri" w:eastAsia="Calibri" w:hAnsi="Calibri"/>
+        </w:rPr>
+        <w:t xml:space="preserve">El </w:t>
+      </w:r>
+      <w:r>
+        <w:rPr>
+          <w:rFonts w:ascii="Calibri" w:cs="Calibri" w:eastAsia="Calibri" w:hAnsi="Calibri"/>
+          <w:b/>
+          <w:bCs/>
+        </w:rPr>
+        <w:t xml:space="preserve">análisis de big data</w:t>
+      </w:r>
+      <w:r>
+        <w:rPr>
+          <w:rFonts w:ascii="Calibri" w:cs="Calibri" w:eastAsia="Calibri" w:hAnsi="Calibri"/>
+        </w:rPr>
+        <w:t xml:space="preserve"> sirve para detectar anomalías </w:t>
+      </w:r>
+      <w:r>
+        <w:rPr>
+          <w:rFonts w:ascii="Calibri" w:cs="Calibri" w:eastAsia="Calibri" w:hAnsi="Calibri"/>
+          <w:b/>
+          <w:bCs/>
+        </w:rPr>
+        <w:t xml:space="preserve">estadísticas, comportamentales y basadas en reglas</w:t>
+      </w:r>
+      <w:r>
+        <w:rPr>
+          <w:rFonts w:ascii="Calibri" w:cs="Calibri" w:eastAsia="Calibri" w:hAnsi="Calibri"/>
+        </w:rPr>
+        <w:t xml:space="preserve">.</w:t>
+      </w:r>
+    </w:p>
+    <w:p>
+      <w:pPr>
+        <w:spacing w:after="80" w:before="160"/>
+      </w:pPr>
+      <w:r>
+        <w:rPr>
+          <w:rFonts w:ascii="Calibri" w:cs="Calibri" w:eastAsia="Calibri" w:hAnsi="Calibri"/>
+          <w:b/>
+          <w:bCs/>
+        </w:rPr>
+        <w:t xml:space="preserve">Probar la seguridad de la red</w:t>
+      </w:r>
+    </w:p>
+    <w:tbl>
+      <w:tblPr>
+        <w:tblW w:type="dxa" w:w="9360"/>
+        <w:tblBorders>
+          <w:top w:val="single" w:color="auto" w:sz="4"/>
+          <w:left w:val="single" w:color="auto" w:sz="4"/>
+          <w:bottom w:val="single" w:color="auto" w:sz="4"/>
+          <w:right w:val="single" w:color="auto" w:sz="4"/>
+          <w:insideH w:val="single" w:color="auto" w:sz="4"/>
+          <w:insideV w:val="single" w:color="auto" w:sz="4"/>
+        </w:tblBorders>
+      </w:tblPr>
+      <w:tblGrid>
+        <w:gridCol w:w="3200"/>
+        <w:gridCol w:w="6160"/>
+      </w:tblGrid>
+      <w:tr>
+        <w:trPr>
+          <w:tblHeader/>
+        </w:trPr>
+        <w:tc>
+          <w:tcPr>
+            <w:tcW w:type="dxa" w:w="3200"/>
+            <w:tcBorders>
+              <w:top w:val="single" w:color="000000" w:sz="4"/>
+              <w:left w:val="single" w:color="000000" w:sz="4"/>
+              <w:bottom w:val="single" w:color="000000" w:sz="4"/>
+              <w:right w:val="single" w:color="000000" w:sz="4"/>
+            </w:tcBorders>
+            <w:shd w:fill="D9D9D9" w:val="clear"/>
+            <w:tcMar>
+              <w:top w:type="dxa" w:w="60"/>
+              <w:left w:type="dxa" w:w="100"/>
+              <w:bottom w:type="dxa" w:w="60"/>
+              <w:right w:type="dxa" w:w="100"/>
+            </w:tcMar>
+          </w:tcPr>
+          <w:p>
+            <w:r>
+              <w:rPr>
+                <w:rFonts w:ascii="Calibri" w:cs="Calibri" w:eastAsia="Calibri" w:hAnsi="Calibri"/>
+                <w:b/>
+                <w:bCs/>
+                <w:color w:val="000000"/>
+              </w:rPr>
+              <w:t xml:space="preserve">Herramienta o servicio</w:t>
+            </w:r>
+          </w:p>
+        </w:tc>
+        <w:tc>
+          <w:tcPr>
+            <w:tcW w:type="dxa" w:w="6160"/>
+            <w:tcBorders>
+              <w:top w:val="single" w:color="000000" w:sz="4"/>
+              <w:left w:val="single" w:color="000000" w:sz="4"/>
+              <w:bottom w:val="single" w:color="000000" w:sz="4"/>
+              <w:right w:val="single" w:color="000000" w:sz="4"/>
+            </w:tcBorders>
+            <w:shd w:fill="D9D9D9" w:val="clear"/>
+            <w:tcMar>
+              <w:top w:type="dxa" w:w="60"/>
+              <w:left w:type="dxa" w:w="100"/>
+              <w:bottom w:type="dxa" w:w="60"/>
+              <w:right w:type="dxa" w:w="100"/>
+            </w:tcMar>
+          </w:tcPr>
+          <w:p>
+            <w:r>
+              <w:rPr>
+                <w:rFonts w:ascii="Calibri" w:cs="Calibri" w:eastAsia="Calibri" w:hAnsi="Calibri"/>
+                <w:b/>
+                <w:bCs/>
+                <w:color w:val="000000"/>
+              </w:rPr>
+              <w:t xml:space="preserve">Qué es</w:t>
+            </w:r>
+          </w:p>
+        </w:tc>
+      </w:tr>
+      <w:tr>
+        <w:tc>
+          <w:tcPr>
+            <w:tcW w:type="dxa" w:w="3200"/>
+            <w:tcBorders>
+              <w:top w:val="single" w:color="000000" w:sz="4"/>
+              <w:left w:val="single" w:color="000000" w:sz="4"/>
+              <w:bottom w:val="single" w:color="000000" w:sz="4"/>
+              <w:right w:val="single" w:color="000000" w:sz="4"/>
+            </w:tcBorders>
+            <w:shd w:fill="FFFFFF" w:val="clear"/>
+            <w:tcMar>
+              <w:top w:type="dxa" w:w="60"/>
+              <w:left w:type="dxa" w:w="100"/>
+              <w:bottom w:type="dxa" w:w="60"/>
+              <w:right w:type="dxa" w:w="100"/>
+            </w:tcMar>
+          </w:tcPr>
+          <w:p>
+            <w:r>
+              <w:rPr>
+                <w:rFonts w:ascii="Calibri" w:cs="Calibri" w:eastAsia="Calibri" w:hAnsi="Calibri"/>
+                <w:b/>
+                <w:bCs/>
+              </w:rPr>
+              <w:t xml:space="preserve">Análisis de riesgos</w:t>
+            </w:r>
+          </w:p>
+        </w:tc>
+        <w:tc>
+          <w:tcPr>
+            <w:tcW w:type="dxa" w:w="6160"/>
+            <w:tcBorders>
+              <w:top w:val="single" w:color="000000" w:sz="4"/>
+              <w:left w:val="single" w:color="000000" w:sz="4"/>
+              <w:bottom w:val="single" w:color="000000" w:sz="4"/>
+              <w:right w:val="single" w:color="000000" w:sz="4"/>
+            </w:tcBorders>
+            <w:shd w:fill="FFFFFF" w:val="clear"/>
+            <w:tcMar>
+              <w:top w:type="dxa" w:w="60"/>
+              <w:left w:type="dxa" w:w="100"/>
+              <w:bottom w:type="dxa" w:w="60"/>
+              <w:right w:type="dxa" w:w="100"/>
+            </w:tcMar>
+          </w:tcPr>
+          <w:p>
+            <w:r>
+              <w:rPr>
+                <w:rFonts w:ascii="Calibri" w:cs="Calibri" w:eastAsia="Calibri" w:hAnsi="Calibri"/>
+              </w:rPr>
+              <w:t xml:space="preserve">Evaluación del riesgo que representan las vulnerabilidades para una organización específica</w:t>
+            </w:r>
+          </w:p>
+        </w:tc>
+      </w:tr>
+      <w:tr>
+        <w:tc>
+          <w:tcPr>
+            <w:tcW w:type="dxa" w:w="3200"/>
+            <w:tcBorders>
+              <w:top w:val="single" w:color="000000" w:sz="4"/>
+              <w:left w:val="single" w:color="000000" w:sz="4"/>
+              <w:bottom w:val="single" w:color="000000" w:sz="4"/>
+              <w:right w:val="single" w:color="000000" w:sz="4"/>
+            </w:tcBorders>
+            <w:shd w:fill="FFFFFF" w:val="clear"/>
+            <w:tcMar>
+              <w:top w:type="dxa" w:w="60"/>
+              <w:left w:type="dxa" w:w="100"/>
+              <w:bottom w:type="dxa" w:w="60"/>
+              <w:right w:type="dxa" w:w="100"/>
+            </w:tcMar>
+          </w:tcPr>
+          <w:p>
+            <w:r>
+              <w:rPr>
+                <w:rFonts w:ascii="Calibri" w:cs="Calibri" w:eastAsia="Calibri" w:hAnsi="Calibri"/>
+                <w:b/>
+                <w:bCs/>
+              </w:rPr>
+              <w:t xml:space="preserve">Evaluación de vulnerabilidades</w:t>
+            </w:r>
+          </w:p>
+        </w:tc>
+        <w:tc>
+          <w:tcPr>
+            <w:tcW w:type="dxa" w:w="6160"/>
+            <w:tcBorders>
+              <w:top w:val="single" w:color="000000" w:sz="4"/>
+              <w:left w:val="single" w:color="000000" w:sz="4"/>
+              <w:bottom w:val="single" w:color="000000" w:sz="4"/>
+              <w:right w:val="single" w:color="000000" w:sz="4"/>
+            </w:tcBorders>
+            <w:shd w:fill="FFFFFF" w:val="clear"/>
+            <w:tcMar>
+              <w:top w:type="dxa" w:w="60"/>
+              <w:left w:type="dxa" w:w="100"/>
+              <w:bottom w:type="dxa" w:w="60"/>
+              <w:right w:type="dxa" w:w="100"/>
+            </w:tcMar>
+          </w:tcPr>
+          <w:p>
+            <w:r>
+              <w:rPr>
+                <w:rFonts w:ascii="Calibri" w:cs="Calibri" w:eastAsia="Calibri" w:hAnsi="Calibri"/>
+              </w:rPr>
+              <w:t xml:space="preserve">Usa software para analizar servidores de Internet y redes internas en busca de distintos tipos de vulnerabilidades</w:t>
+            </w:r>
+          </w:p>
+        </w:tc>
+      </w:tr>
+      <w:tr>
+        <w:tc>
+          <w:tcPr>
+            <w:tcW w:type="dxa" w:w="3200"/>
+            <w:tcBorders>
+              <w:top w:val="single" w:color="000000" w:sz="4"/>
+              <w:left w:val="single" w:color="000000" w:sz="4"/>
+              <w:bottom w:val="single" w:color="000000" w:sz="4"/>
+              <w:right w:val="single" w:color="000000" w:sz="4"/>
+            </w:tcBorders>
+            <w:shd w:fill="FFFFFF" w:val="clear"/>
+            <w:tcMar>
+              <w:top w:type="dxa" w:w="60"/>
+              <w:left w:type="dxa" w:w="100"/>
+              <w:bottom w:type="dxa" w:w="60"/>
+              <w:right w:type="dxa" w:w="100"/>
+            </w:tcMar>
+          </w:tcPr>
+          <w:p>
+            <w:r>
+              <w:rPr>
+                <w:rFonts w:ascii="Calibri" w:cs="Calibri" w:eastAsia="Calibri" w:hAnsi="Calibri"/>
+                <w:b/>
+                <w:bCs/>
+              </w:rPr>
+              <w:t xml:space="preserve">Pruebas de penetración</w:t>
+            </w:r>
+          </w:p>
+        </w:tc>
+        <w:tc>
+          <w:tcPr>
+            <w:tcW w:type="dxa" w:w="6160"/>
+            <w:tcBorders>
+              <w:top w:val="single" w:color="000000" w:sz="4"/>
+              <w:left w:val="single" w:color="000000" w:sz="4"/>
+              <w:bottom w:val="single" w:color="000000" w:sz="4"/>
+              <w:right w:val="single" w:color="000000" w:sz="4"/>
+            </w:tcBorders>
+            <w:shd w:fill="FFFFFF" w:val="clear"/>
+            <w:tcMar>
+              <w:top w:type="dxa" w:w="60"/>
+              <w:left w:type="dxa" w:w="100"/>
+              <w:bottom w:type="dxa" w:w="60"/>
+              <w:right w:type="dxa" w:w="100"/>
+            </w:tcMar>
+          </w:tcPr>
+          <w:p>
+            <w:r>
+              <w:rPr>
+                <w:rFonts w:ascii="Calibri" w:cs="Calibri" w:eastAsia="Calibri" w:hAnsi="Calibri"/>
+              </w:rPr>
+              <w:t xml:space="preserve">Usan </w:t>
+            </w:r>
+            <w:r>
+              <w:rPr>
+                <w:rFonts w:ascii="Calibri" w:cs="Calibri" w:eastAsia="Calibri" w:hAnsi="Calibri"/>
+                <w:b/>
+                <w:bCs/>
+              </w:rPr>
+              <w:t xml:space="preserve">ataques simulados autorizados</w:t>
+            </w:r>
+            <w:r>
+              <w:rPr>
+                <w:rFonts w:ascii="Calibri" w:cs="Calibri" w:eastAsia="Calibri" w:hAnsi="Calibri"/>
+              </w:rPr>
+              <w:t xml:space="preserve"> para probar la solidez de la seguridad de la red</w:t>
+            </w:r>
+          </w:p>
+        </w:tc>
+      </w:tr>
+    </w:tbl>
+    <w:p>
+      <w:pPr>
+        <w:spacing w:after="80"/>
+      </w:pPr>
+    </w:p>
+    <w:p>
+      <w:pPr>
+        <w:spacing w:after="120" w:before="280"/>
+      </w:pPr>
+      <w:r>
+        <w:rPr>
+          <w:rFonts w:ascii="Calibri" w:cs="Calibri" w:eastAsia="Calibri" w:hAnsi="Calibri"/>
+          <w:b/>
+          <w:bCs/>
+        </w:rPr>
+        <w:t xml:space="preserve">2. Sistema Común de Puntuación de Vulnerabilidades (CVSS)</w:t>
+      </w:r>
+    </w:p>
+    <w:p>
+      <w:pPr>
+        <w:spacing w:after="80" w:before="160"/>
+      </w:pPr>
+      <w:r>
+        <w:rPr>
+          <w:rFonts w:ascii="Calibri" w:cs="Calibri" w:eastAsia="Calibri" w:hAnsi="Calibri"/>
+          <w:b/>
+          <w:bCs/>
+        </w:rPr>
+        <w:t xml:space="preserve">Qué es</w:t>
+      </w:r>
+    </w:p>
+    <w:p>
+      <w:pPr>
+        <w:pStyle w:val="ListParagraph"/>
+        <w:numPr>
+          <w:ilvl w:val="0"/>
+          <w:numId w:val="2"/>
+        </w:numPr>
+        <w:spacing w:after="60"/>
+      </w:pPr>
+      <w:r>
+        <w:rPr>
+          <w:rFonts w:ascii="Calibri" w:cs="Calibri" w:eastAsia="Calibri" w:hAnsi="Calibri"/>
+        </w:rPr>
+        <w:t xml:space="preserve">Es un </w:t>
+      </w:r>
+      <w:r>
+        <w:rPr>
+          <w:rFonts w:ascii="Calibri" w:cs="Calibri" w:eastAsia="Calibri" w:hAnsi="Calibri"/>
+          <w:b/>
+          <w:bCs/>
+        </w:rPr>
+        <w:t xml:space="preserve">marco abierto, independiente y estándar del sector</w:t>
+      </w:r>
+      <w:r>
+        <w:rPr>
+          <w:rFonts w:ascii="Calibri" w:cs="Calibri" w:eastAsia="Calibri" w:hAnsi="Calibri"/>
+        </w:rPr>
+        <w:t xml:space="preserve"> para ponderar los riesgos de una vulnerabilidad con distintas métricas.</w:t>
+      </w:r>
+    </w:p>
+    <w:p>
+      <w:pPr>
+        <w:pStyle w:val="ListParagraph"/>
+        <w:numPr>
+          <w:ilvl w:val="0"/>
+          <w:numId w:val="2"/>
+        </w:numPr>
+        <w:spacing w:after="60"/>
+      </w:pPr>
+      <w:r>
+        <w:rPr>
+          <w:rFonts w:ascii="Calibri" w:cs="Calibri" w:eastAsia="Calibri" w:hAnsi="Calibri"/>
+        </w:rPr>
+        <w:t xml:space="preserve">Da </w:t>
+      </w:r>
+      <w:r>
+        <w:rPr>
+          <w:rFonts w:ascii="Calibri" w:cs="Calibri" w:eastAsia="Calibri" w:hAnsi="Calibri"/>
+          <w:b/>
+          <w:bCs/>
+        </w:rPr>
+        <w:t xml:space="preserve">puntuaciones estandarizadas</w:t>
+      </w:r>
+      <w:r>
+        <w:rPr>
+          <w:rFonts w:ascii="Calibri" w:cs="Calibri" w:eastAsia="Calibri" w:hAnsi="Calibri"/>
+        </w:rPr>
+        <w:t xml:space="preserve"> de vulnerabilidades, a las que se les debe dar importancia en las organizaciones.</w:t>
+      </w:r>
+    </w:p>
+    <w:p>
+      <w:pPr>
+        <w:pStyle w:val="ListParagraph"/>
+        <w:numPr>
+          <w:ilvl w:val="0"/>
+          <w:numId w:val="2"/>
+        </w:numPr>
+        <w:spacing w:after="60"/>
+      </w:pPr>
+      <w:r>
+        <w:rPr>
+          <w:rFonts w:ascii="Calibri" w:cs="Calibri" w:eastAsia="Calibri" w:hAnsi="Calibri"/>
+        </w:rPr>
+        <w:t xml:space="preserve">Es un framework abierto: el significado de cada métrica está disponible para todos.</w:t>
+      </w:r>
+    </w:p>
+    <w:p>
+      <w:pPr>
+        <w:pStyle w:val="ListParagraph"/>
+        <w:numPr>
+          <w:ilvl w:val="0"/>
+          <w:numId w:val="2"/>
+        </w:numPr>
+        <w:spacing w:after="60"/>
+      </w:pPr>
+      <w:r>
+        <w:rPr>
+          <w:rFonts w:ascii="Calibri" w:cs="Calibri" w:eastAsia="Calibri" w:hAnsi="Calibri"/>
+        </w:rPr>
+        <w:t xml:space="preserve">Permite </w:t>
+      </w:r>
+      <w:r>
+        <w:rPr>
+          <w:rFonts w:ascii="Calibri" w:cs="Calibri" w:eastAsia="Calibri" w:hAnsi="Calibri"/>
+          <w:b/>
+          <w:bCs/>
+        </w:rPr>
+        <w:t xml:space="preserve">priorizar el riesgo</w:t>
+      </w:r>
+      <w:r>
+        <w:rPr>
+          <w:rFonts w:ascii="Calibri" w:cs="Calibri" w:eastAsia="Calibri" w:hAnsi="Calibri"/>
+        </w:rPr>
+        <w:t xml:space="preserve"> de forma significativa para cada organización.</w:t>
+      </w:r>
+    </w:p>
+    <w:p>
+      <w:pPr>
+        <w:spacing w:after="80" w:before="160"/>
+      </w:pPr>
+      <w:r>
+        <w:rPr>
+          <w:rFonts w:ascii="Calibri" w:cs="Calibri" w:eastAsia="Calibri" w:hAnsi="Calibri"/>
+          <w:b/>
+          <w:bCs/>
+        </w:rPr>
+        <w:t xml:space="preserve">Los 3 grupos de métricas</w:t>
+      </w:r>
+    </w:p>
+    <w:tbl>
+      <w:tblPr>
+        <w:tblW w:type="dxa" w:w="9360"/>
+        <w:tblBorders>
+          <w:top w:val="single" w:color="auto" w:sz="4"/>
+          <w:left w:val="single" w:color="auto" w:sz="4"/>
+          <w:bottom w:val="single" w:color="auto" w:sz="4"/>
+          <w:right w:val="single" w:color="auto" w:sz="4"/>
+          <w:insideH w:val="single" w:color="auto" w:sz="4"/>
+          <w:insideV w:val="single" w:color="auto" w:sz="4"/>
+        </w:tblBorders>
+      </w:tblPr>
+      <w:tblGrid>
+        <w:gridCol w:w="2400"/>
+        <w:gridCol w:w="6960"/>
+      </w:tblGrid>
+      <w:tr>
+        <w:trPr>
+          <w:tblHeader/>
+        </w:trPr>
+        <w:tc>
+          <w:tcPr>
+            <w:tcW w:type="dxa" w:w="2400"/>
+            <w:tcBorders>
+              <w:top w:val="single" w:color="000000" w:sz="4"/>
+              <w:left w:val="single" w:color="000000" w:sz="4"/>
+              <w:bottom w:val="single" w:color="000000" w:sz="4"/>
+              <w:right w:val="single" w:color="000000" w:sz="4"/>
+            </w:tcBorders>
+            <w:shd w:fill="D9D9D9" w:val="clear"/>
+            <w:tcMar>
+              <w:top w:type="dxa" w:w="60"/>
+              <w:left w:type="dxa" w:w="100"/>
+              <w:bottom w:type="dxa" w:w="60"/>
+              <w:right w:type="dxa" w:w="100"/>
+            </w:tcMar>
+          </w:tcPr>
+          <w:p>
+            <w:r>
+              <w:rPr>
+                <w:rFonts w:ascii="Calibri" w:cs="Calibri" w:eastAsia="Calibri" w:hAnsi="Calibri"/>
+                <w:b/>
+                <w:bCs/>
+                <w:color w:val="000000"/>
+              </w:rPr>
+              <w:t xml:space="preserve">Grupo</w:t>
+            </w:r>
+          </w:p>
+        </w:tc>
+        <w:tc>
+          <w:tcPr>
+            <w:tcW w:type="dxa" w:w="6960"/>
+            <w:tcBorders>
+              <w:top w:val="single" w:color="000000" w:sz="4"/>
+              <w:left w:val="single" w:color="000000" w:sz="4"/>
+              <w:bottom w:val="single" w:color="000000" w:sz="4"/>
+              <w:right w:val="single" w:color="000000" w:sz="4"/>
+            </w:tcBorders>
+            <w:shd w:fill="D9D9D9" w:val="clear"/>
+            <w:tcMar>
+              <w:top w:type="dxa" w:w="60"/>
+              <w:left w:type="dxa" w:w="100"/>
+              <w:bottom w:type="dxa" w:w="60"/>
+              <w:right w:type="dxa" w:w="100"/>
+            </w:tcMar>
+          </w:tcPr>
+          <w:p>
+            <w:r>
+              <w:rPr>
+                <w:rFonts w:ascii="Calibri" w:cs="Calibri" w:eastAsia="Calibri" w:hAnsi="Calibri"/>
+                <w:b/>
+                <w:bCs/>
+                <w:color w:val="000000"/>
+              </w:rPr>
+              <w:t xml:space="preserve">Qué hace</w:t>
+            </w:r>
+          </w:p>
+        </w:tc>
+      </w:tr>
+      <w:tr>
+        <w:tc>
+          <w:tcPr>
+            <w:tcW w:type="dxa" w:w="2400"/>
+            <w:tcBorders>
+              <w:top w:val="single" w:color="000000" w:sz="4"/>
+              <w:left w:val="single" w:color="000000" w:sz="4"/>
+              <w:bottom w:val="single" w:color="000000" w:sz="4"/>
+              <w:right w:val="single" w:color="000000" w:sz="4"/>
+            </w:tcBorders>
+            <w:shd w:fill="FFFFFF" w:val="clear"/>
+            <w:tcMar>
+              <w:top w:type="dxa" w:w="60"/>
+              <w:left w:type="dxa" w:w="100"/>
+              <w:bottom w:type="dxa" w:w="60"/>
+              <w:right w:type="dxa" w:w="100"/>
+            </w:tcMar>
+          </w:tcPr>
+          <w:p>
+            <w:r>
+              <w:rPr>
+                <w:rFonts w:ascii="Calibri" w:cs="Calibri" w:eastAsia="Calibri" w:hAnsi="Calibri"/>
+                <w:b/>
+                <w:bCs/>
+              </w:rPr>
+              <w:t xml:space="preserve">Base</w:t>
+            </w:r>
+          </w:p>
+        </w:tc>
+        <w:tc>
+          <w:tcPr>
+            <w:tcW w:type="dxa" w:w="6960"/>
+            <w:tcBorders>
+              <w:top w:val="single" w:color="000000" w:sz="4"/>
+              <w:left w:val="single" w:color="000000" w:sz="4"/>
+              <w:bottom w:val="single" w:color="000000" w:sz="4"/>
+              <w:right w:val="single" w:color="000000" w:sz="4"/>
+            </w:tcBorders>
+            <w:shd w:fill="FFFFFF" w:val="clear"/>
+            <w:tcMar>
+              <w:top w:type="dxa" w:w="60"/>
+              <w:left w:type="dxa" w:w="100"/>
+              <w:bottom w:type="dxa" w:w="60"/>
+              <w:right w:type="dxa" w:w="100"/>
+            </w:tcMar>
+          </w:tcPr>
+          <w:p>
+            <w:r>
+              <w:rPr>
+                <w:rFonts w:ascii="Calibri" w:cs="Calibri" w:eastAsia="Calibri" w:hAnsi="Calibri"/>
+              </w:rPr>
+              <w:t xml:space="preserve">Evalúa las </w:t>
+            </w:r>
+            <w:r>
+              <w:rPr>
+                <w:rFonts w:ascii="Calibri" w:cs="Calibri" w:eastAsia="Calibri" w:hAnsi="Calibri"/>
+                <w:b/>
+                <w:bCs/>
+              </w:rPr>
+              <w:t xml:space="preserve">vulnerabilidades de seguridad</w:t>
+            </w:r>
+            <w:r>
+              <w:rPr>
+                <w:rFonts w:ascii="Calibri" w:cs="Calibri" w:eastAsia="Calibri" w:hAnsi="Calibri"/>
+              </w:rPr>
+              <w:t xml:space="preserve"> de los sistemas de software y hardware</w:t>
+            </w:r>
+          </w:p>
+        </w:tc>
+      </w:tr>
+      <w:tr>
+        <w:tc>
+          <w:tcPr>
+            <w:tcW w:type="dxa" w:w="2400"/>
+            <w:tcBorders>
+              <w:top w:val="single" w:color="000000" w:sz="4"/>
+              <w:left w:val="single" w:color="000000" w:sz="4"/>
+              <w:bottom w:val="single" w:color="000000" w:sz="4"/>
+              <w:right w:val="single" w:color="000000" w:sz="4"/>
+            </w:tcBorders>
+            <w:shd w:fill="FFFFFF" w:val="clear"/>
+            <w:tcMar>
+              <w:top w:type="dxa" w:w="60"/>
+              <w:left w:type="dxa" w:w="100"/>
+              <w:bottom w:type="dxa" w:w="60"/>
+              <w:right w:type="dxa" w:w="100"/>
+            </w:tcMar>
+          </w:tcPr>
+          <w:p>
+            <w:r>
+              <w:rPr>
+                <w:rFonts w:ascii="Calibri" w:cs="Calibri" w:eastAsia="Calibri" w:hAnsi="Calibri"/>
+                <w:b/>
+                <w:bCs/>
+              </w:rPr>
+              <w:t xml:space="preserve">Temporal</w:t>
+            </w:r>
+          </w:p>
+        </w:tc>
+        <w:tc>
+          <w:tcPr>
+            <w:tcW w:type="dxa" w:w="6960"/>
+            <w:tcBorders>
+              <w:top w:val="single" w:color="000000" w:sz="4"/>
+              <w:left w:val="single" w:color="000000" w:sz="4"/>
+              <w:bottom w:val="single" w:color="000000" w:sz="4"/>
+              <w:right w:val="single" w:color="000000" w:sz="4"/>
+            </w:tcBorders>
+            <w:shd w:fill="FFFFFF" w:val="clear"/>
+            <w:tcMar>
+              <w:top w:type="dxa" w:w="60"/>
+              <w:left w:type="dxa" w:w="100"/>
+              <w:bottom w:type="dxa" w:w="60"/>
+              <w:right w:type="dxa" w:w="100"/>
+            </w:tcMar>
+          </w:tcPr>
+          <w:p>
+            <w:r>
+              <w:rPr>
+                <w:rFonts w:ascii="Calibri" w:cs="Calibri" w:eastAsia="Calibri" w:hAnsi="Calibri"/>
+              </w:rPr>
+              <w:t xml:space="preserve">Modifica la puntuación base según el </w:t>
+            </w:r>
+            <w:r>
+              <w:rPr>
+                <w:rFonts w:ascii="Calibri" w:cs="Calibri" w:eastAsia="Calibri" w:hAnsi="Calibri"/>
+                <w:b/>
+                <w:bCs/>
+              </w:rPr>
+              <w:t xml:space="preserve">historial de la vulnerabilidad</w:t>
+            </w:r>
+          </w:p>
+        </w:tc>
+      </w:tr>
+      <w:tr>
+        <w:tc>
+          <w:tcPr>
+            <w:tcW w:type="dxa" w:w="2400"/>
+            <w:tcBorders>
+              <w:top w:val="single" w:color="000000" w:sz="4"/>
+              <w:left w:val="single" w:color="000000" w:sz="4"/>
+              <w:bottom w:val="single" w:color="000000" w:sz="4"/>
+              <w:right w:val="single" w:color="000000" w:sz="4"/>
+            </w:tcBorders>
+            <w:shd w:fill="FFFFFF" w:val="clear"/>
+            <w:tcMar>
+              <w:top w:type="dxa" w:w="60"/>
+              <w:left w:type="dxa" w:w="100"/>
+              <w:bottom w:type="dxa" w:w="60"/>
+              <w:right w:type="dxa" w:w="100"/>
+            </w:tcMar>
+          </w:tcPr>
+          <w:p>
+            <w:r>
+              <w:rPr>
+                <w:rFonts w:ascii="Calibri" w:cs="Calibri" w:eastAsia="Calibri" w:hAnsi="Calibri"/>
+                <w:b/>
+                <w:bCs/>
+              </w:rPr>
+              <w:t xml:space="preserve">Ambiental</w:t>
+            </w:r>
+          </w:p>
+        </w:tc>
+        <w:tc>
+          <w:tcPr>
+            <w:tcW w:type="dxa" w:w="6960"/>
+            <w:tcBorders>
+              <w:top w:val="single" w:color="000000" w:sz="4"/>
+              <w:left w:val="single" w:color="000000" w:sz="4"/>
+              <w:bottom w:val="single" w:color="000000" w:sz="4"/>
+              <w:right w:val="single" w:color="000000" w:sz="4"/>
+            </w:tcBorders>
+            <w:shd w:fill="FFFFFF" w:val="clear"/>
+            <w:tcMar>
+              <w:top w:type="dxa" w:w="60"/>
+              <w:left w:type="dxa" w:w="100"/>
+              <w:bottom w:type="dxa" w:w="60"/>
+              <w:right w:type="dxa" w:w="100"/>
+            </w:tcMar>
+          </w:tcPr>
+          <w:p>
+            <w:r>
+              <w:rPr>
+                <w:rFonts w:ascii="Calibri" w:cs="Calibri" w:eastAsia="Calibri" w:hAnsi="Calibri"/>
+              </w:rPr>
+              <w:t xml:space="preserve">Modifica la puntuación base según el </w:t>
+            </w:r>
+            <w:r>
+              <w:rPr>
+                <w:rFonts w:ascii="Calibri" w:cs="Calibri" w:eastAsia="Calibri" w:hAnsi="Calibri"/>
+                <w:b/>
+                <w:bCs/>
+              </w:rPr>
+              <w:t xml:space="preserve">contexto de la organización</w:t>
+            </w:r>
+            <w:r>
+              <w:rPr>
+                <w:rFonts w:ascii="Calibri" w:cs="Calibri" w:eastAsia="Calibri" w:hAnsi="Calibri"/>
+              </w:rPr>
+              <w:t xml:space="preserve"> específica</w:t>
+            </w:r>
+          </w:p>
+        </w:tc>
+      </w:tr>
+    </w:tbl>
+    <w:p>
+      <w:pPr>
+        <w:spacing w:after="80"/>
+      </w:pPr>
+    </w:p>
+    <w:p>
+      <w:pPr>
+        <w:spacing w:after="80" w:before="160"/>
+      </w:pPr>
+      <w:r>
+        <w:rPr>
+          <w:rFonts w:ascii="Calibri" w:cs="Calibri" w:eastAsia="Calibri" w:hAnsi="Calibri"/>
+          <w:b/>
+          <w:bCs/>
+        </w:rPr>
+        <w:t xml:space="preserve">Cómo se clasifican las vulnerabilidades</w:t>
+      </w:r>
+    </w:p>
+    <w:p>
+      <w:pPr>
+        <w:pStyle w:val="ListParagraph"/>
+        <w:numPr>
+          <w:ilvl w:val="0"/>
+          <w:numId w:val="2"/>
+        </w:numPr>
+        <w:spacing w:after="60"/>
+      </w:pPr>
+      <w:r>
+        <w:rPr>
+          <w:rFonts w:ascii="Calibri" w:cs="Calibri" w:eastAsia="Calibri" w:hAnsi="Calibri"/>
+        </w:rPr>
+        <w:t xml:space="preserve">Vector de ataque</w:t>
+      </w:r>
+    </w:p>
+    <w:p>
+      <w:pPr>
+        <w:pStyle w:val="ListParagraph"/>
+        <w:numPr>
+          <w:ilvl w:val="0"/>
+          <w:numId w:val="2"/>
+        </w:numPr>
+        <w:spacing w:after="60"/>
+      </w:pPr>
+      <w:r>
+        <w:rPr>
+          <w:rFonts w:ascii="Calibri" w:cs="Calibri" w:eastAsia="Calibri" w:hAnsi="Calibri"/>
+        </w:rPr>
+        <w:t xml:space="preserve">Complejidad del ataque</w:t>
+      </w:r>
+    </w:p>
+    <w:p>
+      <w:pPr>
+        <w:pStyle w:val="ListParagraph"/>
+        <w:numPr>
+          <w:ilvl w:val="0"/>
+          <w:numId w:val="2"/>
+        </w:numPr>
+        <w:spacing w:after="60"/>
+      </w:pPr>
+      <w:r>
+        <w:rPr>
+          <w:rFonts w:ascii="Calibri" w:cs="Calibri" w:eastAsia="Calibri" w:hAnsi="Calibri"/>
+        </w:rPr>
+        <w:t xml:space="preserve">Privilegios necesarios</w:t>
+      </w:r>
+    </w:p>
+    <w:p>
+      <w:pPr>
+        <w:pStyle w:val="ListParagraph"/>
+        <w:numPr>
+          <w:ilvl w:val="0"/>
+          <w:numId w:val="2"/>
+        </w:numPr>
+        <w:spacing w:after="60"/>
+      </w:pPr>
+      <w:r>
+        <w:rPr>
+          <w:rFonts w:ascii="Calibri" w:cs="Calibri" w:eastAsia="Calibri" w:hAnsi="Calibri"/>
+        </w:rPr>
+        <w:t xml:space="preserve">Interacción del usuario</w:t>
+      </w:r>
+    </w:p>
+    <w:p>
+      <w:pPr>
+        <w:pStyle w:val="ListParagraph"/>
+        <w:numPr>
+          <w:ilvl w:val="0"/>
+          <w:numId w:val="2"/>
+        </w:numPr>
+        <w:spacing w:after="60"/>
+      </w:pPr>
+      <w:r>
+        <w:rPr>
+          <w:rFonts w:ascii="Calibri" w:cs="Calibri" w:eastAsia="Calibri" w:hAnsi="Calibri"/>
+        </w:rPr>
+        <w:t xml:space="preserve">Alcance</w:t>
+      </w:r>
+    </w:p>
+    <w:p>
+      <w:pPr>
+        <w:spacing w:after="80" w:before="160"/>
+      </w:pPr>
+      <w:r>
+        <w:rPr>
+          <w:rFonts w:ascii="Calibri" w:cs="Calibri" w:eastAsia="Calibri" w:hAnsi="Calibri"/>
+          <w:b/>
+          <w:bCs/>
+        </w:rPr>
+        <w:t xml:space="preserve">Calculadora y puntuaciones</w:t>
+      </w:r>
+    </w:p>
+    <w:p>
+      <w:pPr>
+        <w:pStyle w:val="ListParagraph"/>
+        <w:numPr>
+          <w:ilvl w:val="0"/>
+          <w:numId w:val="2"/>
+        </w:numPr>
+        <w:spacing w:after="60"/>
+      </w:pPr>
+      <w:r>
+        <w:rPr>
+          <w:rFonts w:ascii="Calibri" w:cs="Calibri" w:eastAsia="Calibri" w:hAnsi="Calibri"/>
+        </w:rPr>
+        <w:t xml:space="preserve">Hay una </w:t>
+      </w:r>
+      <w:r>
+        <w:rPr>
+          <w:rFonts w:ascii="Calibri" w:cs="Calibri" w:eastAsia="Calibri" w:hAnsi="Calibri"/>
+          <w:b/>
+          <w:bCs/>
+        </w:rPr>
+        <w:t xml:space="preserve">calculadora CVSS</w:t>
+      </w:r>
+      <w:r>
+        <w:rPr>
+          <w:rFonts w:ascii="Calibri" w:cs="Calibri" w:eastAsia="Calibri" w:hAnsi="Calibri"/>
+        </w:rPr>
+        <w:t xml:space="preserve"> en el sitio web de </w:t>
+      </w:r>
+      <w:r>
+        <w:rPr>
+          <w:rFonts w:ascii="Calibri" w:cs="Calibri" w:eastAsia="Calibri" w:hAnsi="Calibri"/>
+          <w:b/>
+          <w:bCs/>
+        </w:rPr>
+        <w:t xml:space="preserve">FIRST</w:t>
+      </w:r>
+      <w:r>
+        <w:rPr>
+          <w:rFonts w:ascii="Calibri" w:cs="Calibri" w:eastAsia="Calibri" w:hAnsi="Calibri"/>
+        </w:rPr>
+        <w:t xml:space="preserve">.</w:t>
+      </w:r>
+    </w:p>
+    <w:p>
+      <w:pPr>
+        <w:pStyle w:val="ListParagraph"/>
+        <w:numPr>
+          <w:ilvl w:val="0"/>
+          <w:numId w:val="2"/>
+        </w:numPr>
+        <w:spacing w:after="60"/>
+      </w:pPr>
+      <w:r>
+        <w:rPr>
+          <w:rFonts w:ascii="Calibri" w:cs="Calibri" w:eastAsia="Calibri" w:hAnsi="Calibri"/>
+        </w:rPr>
+        <w:t xml:space="preserve">Produce un número que describe la </w:t>
+      </w:r>
+      <w:r>
+        <w:rPr>
+          <w:rFonts w:ascii="Calibri" w:cs="Calibri" w:eastAsia="Calibri" w:hAnsi="Calibri"/>
+          <w:b/>
+          <w:bCs/>
+        </w:rPr>
+        <w:t xml:space="preserve">gravedad del riesgo</w:t>
+      </w:r>
+      <w:r>
+        <w:rPr>
+          <w:rFonts w:ascii="Calibri" w:cs="Calibri" w:eastAsia="Calibri" w:hAnsi="Calibri"/>
+        </w:rPr>
+        <w:t xml:space="preserve"> de la vulnerabilidad.</w:t>
+      </w:r>
+    </w:p>
+    <w:p>
+      <w:pPr>
+        <w:pStyle w:val="ListParagraph"/>
+        <w:numPr>
+          <w:ilvl w:val="0"/>
+          <w:numId w:val="2"/>
+        </w:numPr>
+        <w:spacing w:after="60"/>
+      </w:pPr>
+      <w:r>
+        <w:rPr>
+          <w:rFonts w:ascii="Calibri" w:cs="Calibri" w:eastAsia="Calibri" w:hAnsi="Calibri"/>
+        </w:rPr>
+        <w:t xml:space="preserve">Las puntuaciones van de </w:t>
+      </w:r>
+      <w:r>
+        <w:rPr>
+          <w:rFonts w:ascii="Calibri" w:cs="Calibri" w:eastAsia="Calibri" w:hAnsi="Calibri"/>
+          <w:b/>
+          <w:bCs/>
+        </w:rPr>
+        <w:t xml:space="preserve">0 a 10</w:t>
+      </w:r>
+      <w:r>
+        <w:rPr>
+          <w:rFonts w:ascii="Calibri" w:cs="Calibri" w:eastAsia="Calibri" w:hAnsi="Calibri"/>
+        </w:rPr>
+        <w:t xml:space="preserve">.</w:t>
+      </w:r>
+    </w:p>
+    <w:p>
+      <w:pPr>
+        <w:pStyle w:val="ListParagraph"/>
+        <w:numPr>
+          <w:ilvl w:val="0"/>
+          <w:numId w:val="2"/>
+        </w:numPr>
+        <w:spacing w:after="60"/>
+      </w:pPr>
+      <w:r>
+        <w:rPr>
+          <w:rFonts w:ascii="Calibri" w:cs="Calibri" w:eastAsia="Calibri" w:hAnsi="Calibri"/>
+        </w:rPr>
+        <w:t xml:space="preserve">Los rangos tienen valores cualitativos: </w:t>
+      </w:r>
+      <w:r>
+        <w:rPr>
+          <w:rFonts w:ascii="Calibri" w:cs="Calibri" w:eastAsia="Calibri" w:hAnsi="Calibri"/>
+          <w:b/>
+          <w:bCs/>
+        </w:rPr>
+        <w:t xml:space="preserve">cero, bajo, medio, alto o riesgo crítico</w:t>
+      </w:r>
+      <w:r>
+        <w:rPr>
+          <w:rFonts w:ascii="Calibri" w:cs="Calibri" w:eastAsia="Calibri" w:hAnsi="Calibri"/>
+        </w:rPr>
+        <w:t xml:space="preserve">.</w:t>
+      </w:r>
+    </w:p>
+    <w:p>
+      <w:pPr>
+        <w:pStyle w:val="ListParagraph"/>
+        <w:numPr>
+          <w:ilvl w:val="0"/>
+          <w:numId w:val="2"/>
+        </w:numPr>
+        <w:spacing w:after="60"/>
+      </w:pPr>
+      <w:r>
+        <w:rPr>
+          <w:rFonts w:ascii="Calibri" w:cs="Calibri" w:eastAsia="Calibri" w:hAnsi="Calibri"/>
+        </w:rPr>
+        <w:t xml:space="preserve">En general, hay que atender cualquier vulnerabilidad que supere el valor de </w:t>
+      </w:r>
+      <w:r>
+        <w:rPr>
+          <w:rFonts w:ascii="Calibri" w:cs="Calibri" w:eastAsia="Calibri" w:hAnsi="Calibri"/>
+          <w:b/>
+          <w:bCs/>
+        </w:rPr>
+        <w:t xml:space="preserve">3,9</w:t>
+      </w:r>
+      <w:r>
+        <w:rPr>
+          <w:rFonts w:ascii="Calibri" w:cs="Calibri" w:eastAsia="Calibri" w:hAnsi="Calibri"/>
+        </w:rPr>
+        <w:t xml:space="preserve">.</w:t>
+      </w:r>
+    </w:p>
+    <w:p>
+      <w:pPr>
+        <w:pStyle w:val="ListParagraph"/>
+        <w:numPr>
+          <w:ilvl w:val="0"/>
+          <w:numId w:val="2"/>
+        </w:numPr>
+        <w:spacing w:after="60"/>
+      </w:pPr>
+      <w:r>
+        <w:rPr>
+          <w:rFonts w:ascii="Calibri" w:cs="Calibri" w:eastAsia="Calibri" w:hAnsi="Calibri"/>
+        </w:rPr>
+        <w:t xml:space="preserve">Mientras </w:t>
+      </w:r>
+      <w:r>
+        <w:rPr>
+          <w:rFonts w:ascii="Calibri" w:cs="Calibri" w:eastAsia="Calibri" w:hAnsi="Calibri"/>
+          <w:b/>
+          <w:bCs/>
+        </w:rPr>
+        <w:t xml:space="preserve">mayor sea la clasificación, mayor la urgencia</w:t>
+      </w:r>
+      <w:r>
+        <w:rPr>
+          <w:rFonts w:ascii="Calibri" w:cs="Calibri" w:eastAsia="Calibri" w:hAnsi="Calibri"/>
+        </w:rPr>
+        <w:t xml:space="preserve"> de obtener una solución.</w:t>
+      </w:r>
+    </w:p>
+    <w:p>
+      <w:pPr>
+        <w:spacing w:after="80" w:before="160"/>
+      </w:pPr>
+      <w:r>
+        <w:rPr>
+          <w:rFonts w:ascii="Calibri" w:cs="Calibri" w:eastAsia="Calibri" w:hAnsi="Calibri"/>
+          <w:b/>
+          <w:bCs/>
+        </w:rPr>
+        <w:t xml:space="preserve">Otras fuentes de información de vulnerabilidades</w:t>
+      </w:r>
+    </w:p>
+    <w:p>
+      <w:pPr>
+        <w:pStyle w:val="ListParagraph"/>
+        <w:numPr>
+          <w:ilvl w:val="0"/>
+          <w:numId w:val="2"/>
+        </w:numPr>
+        <w:spacing w:after="60"/>
+      </w:pPr>
+      <w:r>
+        <w:rPr>
+          <w:rFonts w:ascii="Calibri" w:cs="Calibri" w:eastAsia="Calibri" w:hAnsi="Calibri"/>
+          <w:b/>
+          <w:bCs/>
+        </w:rPr>
+        <w:t xml:space="preserve">CVE:</w:t>
+      </w:r>
+      <w:r>
+        <w:rPr>
+          <w:rFonts w:ascii="Calibri" w:cs="Calibri" w:eastAsia="Calibri" w:hAnsi="Calibri"/>
+        </w:rPr>
+        <w:t xml:space="preserve"> Vulnerabilidades y Exposiciones Comunes.</w:t>
+      </w:r>
+    </w:p>
+    <w:p>
+      <w:pPr>
+        <w:pStyle w:val="ListParagraph"/>
+        <w:numPr>
+          <w:ilvl w:val="0"/>
+          <w:numId w:val="2"/>
+        </w:numPr>
+        <w:spacing w:after="60"/>
+      </w:pPr>
+      <w:r>
+        <w:rPr>
+          <w:rFonts w:ascii="Calibri" w:cs="Calibri" w:eastAsia="Calibri" w:hAnsi="Calibri"/>
+          <w:b/>
+          <w:bCs/>
+        </w:rPr>
+        <w:t xml:space="preserve">NVD:</w:t>
+      </w:r>
+      <w:r>
+        <w:rPr>
+          <w:rFonts w:ascii="Calibri" w:cs="Calibri" w:eastAsia="Calibri" w:hAnsi="Calibri"/>
+        </w:rPr>
+        <w:t xml:space="preserve"> Base Nacional de Datos sobre Vulnerabilidades.</w:t>
+      </w:r>
+    </w:p>
+    <w:p>
+      <w:pPr>
+        <w:pStyle w:val="ListParagraph"/>
+        <w:numPr>
+          <w:ilvl w:val="0"/>
+          <w:numId w:val="2"/>
+        </w:numPr>
+        <w:spacing w:after="60"/>
+      </w:pPr>
+      <w:r>
+        <w:rPr>
+          <w:rFonts w:ascii="Calibri" w:cs="Calibri" w:eastAsia="Calibri" w:hAnsi="Calibri"/>
+        </w:rPr>
+        <w:t xml:space="preserve">Las dos están disponibles en línea.</w:t>
+      </w:r>
+    </w:p>
+    <w:p>
+      <w:pPr>
+        <w:spacing w:after="120" w:before="280"/>
+      </w:pPr>
+      <w:r>
+        <w:rPr>
+          <w:rFonts w:ascii="Calibri" w:cs="Calibri" w:eastAsia="Calibri" w:hAnsi="Calibri"/>
+          <w:b/>
+          <w:bCs/>
+        </w:rPr>
+        <w:t xml:space="preserve">3. Administración segura de dispositivos</w:t>
+      </w:r>
+    </w:p>
+    <w:p>
+      <w:pPr>
+        <w:spacing w:after="80" w:before="160"/>
+      </w:pPr>
+      <w:r>
+        <w:rPr>
+          <w:rFonts w:ascii="Calibri" w:cs="Calibri" w:eastAsia="Calibri" w:hAnsi="Calibri"/>
+          <w:b/>
+          <w:bCs/>
+        </w:rPr>
+        <w:t xml:space="preserve">Gestión de riesgos</w:t>
+      </w:r>
+    </w:p>
+    <w:p>
+      <w:pPr>
+        <w:pStyle w:val="ListParagraph"/>
+        <w:numPr>
+          <w:ilvl w:val="0"/>
+          <w:numId w:val="2"/>
+        </w:numPr>
+        <w:spacing w:after="60"/>
+      </w:pPr>
+      <w:r>
+        <w:rPr>
+          <w:rFonts w:ascii="Calibri" w:cs="Calibri" w:eastAsia="Calibri" w:hAnsi="Calibri"/>
+        </w:rPr>
+        <w:t xml:space="preserve">Implica </w:t>
+      </w:r>
+      <w:r>
+        <w:rPr>
+          <w:rFonts w:ascii="Calibri" w:cs="Calibri" w:eastAsia="Calibri" w:hAnsi="Calibri"/>
+          <w:b/>
+          <w:bCs/>
+        </w:rPr>
+        <w:t xml:space="preserve">seleccionar y especificar controles de seguridad</w:t>
+      </w:r>
+      <w:r>
+        <w:rPr>
+          <w:rFonts w:ascii="Calibri" w:cs="Calibri" w:eastAsia="Calibri" w:hAnsi="Calibri"/>
+        </w:rPr>
+        <w:t xml:space="preserve"> para una organización.</w:t>
+      </w:r>
+    </w:p>
+    <w:p>
+      <w:pPr>
+        <w:spacing w:after="100"/>
+      </w:pPr>
+      <w:r>
+        <w:rPr>
+          <w:rFonts w:ascii="Calibri" w:cs="Calibri" w:eastAsia="Calibri" w:hAnsi="Calibri"/>
+        </w:rPr>
+        <w:t xml:space="preserve">Hay </w:t>
+      </w:r>
+      <w:r>
+        <w:rPr>
+          <w:rFonts w:ascii="Calibri" w:cs="Calibri" w:eastAsia="Calibri" w:hAnsi="Calibri"/>
+          <w:b/>
+          <w:bCs/>
+        </w:rPr>
+        <w:t xml:space="preserve">4 formas de responder a los riesgos</w:t>
+      </w:r>
+      <w:r>
+        <w:rPr>
+          <w:rFonts w:ascii="Calibri" w:cs="Calibri" w:eastAsia="Calibri" w:hAnsi="Calibri"/>
+        </w:rPr>
+        <w:t xml:space="preserve">:</w:t>
+      </w:r>
+    </w:p>
+    <w:tbl>
+      <w:tblPr>
+        <w:tblW w:type="dxa" w:w="9360"/>
+        <w:tblBorders>
+          <w:top w:val="single" w:color="auto" w:sz="4"/>
+          <w:left w:val="single" w:color="auto" w:sz="4"/>
+          <w:bottom w:val="single" w:color="auto" w:sz="4"/>
+          <w:right w:val="single" w:color="auto" w:sz="4"/>
+          <w:insideH w:val="single" w:color="auto" w:sz="4"/>
+          <w:insideV w:val="single" w:color="auto" w:sz="4"/>
+        </w:tblBorders>
+      </w:tblPr>
+      <w:tblGrid>
+        <w:gridCol w:w="2800"/>
+        <w:gridCol w:w="6560"/>
+      </w:tblGrid>
+      <w:tr>
+        <w:trPr>
+          <w:tblHeader/>
+        </w:trPr>
+        <w:tc>
+          <w:tcPr>
+            <w:tcW w:type="dxa" w:w="2800"/>
+            <w:tcBorders>
+              <w:top w:val="single" w:color="000000" w:sz="4"/>
+              <w:left w:val="single" w:color="000000" w:sz="4"/>
+              <w:bottom w:val="single" w:color="000000" w:sz="4"/>
+              <w:right w:val="single" w:color="000000" w:sz="4"/>
+            </w:tcBorders>
+            <w:shd w:fill="D9D9D9" w:val="clear"/>
+            <w:tcMar>
+              <w:top w:type="dxa" w:w="60"/>
+              <w:left w:type="dxa" w:w="100"/>
+              <w:bottom w:type="dxa" w:w="60"/>
+              <w:right w:type="dxa" w:w="100"/>
+            </w:tcMar>
+          </w:tcPr>
+          <w:p>
+            <w:r>
+              <w:rPr>
+                <w:rFonts w:ascii="Calibri" w:cs="Calibri" w:eastAsia="Calibri" w:hAnsi="Calibri"/>
+                <w:b/>
+                <w:bCs/>
+                <w:color w:val="000000"/>
+              </w:rPr>
+              <w:t xml:space="preserve">Respuesta</w:t>
+            </w:r>
+          </w:p>
+        </w:tc>
+        <w:tc>
+          <w:tcPr>
+            <w:tcW w:type="dxa" w:w="6560"/>
+            <w:tcBorders>
+              <w:top w:val="single" w:color="000000" w:sz="4"/>
+              <w:left w:val="single" w:color="000000" w:sz="4"/>
+              <w:bottom w:val="single" w:color="000000" w:sz="4"/>
+              <w:right w:val="single" w:color="000000" w:sz="4"/>
+            </w:tcBorders>
+            <w:shd w:fill="D9D9D9" w:val="clear"/>
+            <w:tcMar>
+              <w:top w:type="dxa" w:w="60"/>
+              <w:left w:type="dxa" w:w="100"/>
+              <w:bottom w:type="dxa" w:w="60"/>
+              <w:right w:type="dxa" w:w="100"/>
+            </w:tcMar>
+          </w:tcPr>
+          <w:p>
+            <w:r>
+              <w:rPr>
+                <w:rFonts w:ascii="Calibri" w:cs="Calibri" w:eastAsia="Calibri" w:hAnsi="Calibri"/>
+                <w:b/>
+                <w:bCs/>
+                <w:color w:val="000000"/>
+              </w:rPr>
+              <w:t xml:space="preserve">Qué significa</w:t>
+            </w:r>
+          </w:p>
+        </w:tc>
+      </w:tr>
+      <w:tr>
+        <w:tc>
+          <w:tcPr>
+            <w:tcW w:type="dxa" w:w="2800"/>
+            <w:tcBorders>
+              <w:top w:val="single" w:color="000000" w:sz="4"/>
+              <w:left w:val="single" w:color="000000" w:sz="4"/>
+              <w:bottom w:val="single" w:color="000000" w:sz="4"/>
+              <w:right w:val="single" w:color="000000" w:sz="4"/>
+            </w:tcBorders>
+            <w:shd w:fill="FFFFFF" w:val="clear"/>
+            <w:tcMar>
+              <w:top w:type="dxa" w:w="60"/>
+              <w:left w:type="dxa" w:w="100"/>
+              <w:bottom w:type="dxa" w:w="60"/>
+              <w:right w:type="dxa" w:w="100"/>
+            </w:tcMar>
+          </w:tcPr>
+          <w:p>
+            <w:r>
+              <w:rPr>
+                <w:rFonts w:ascii="Calibri" w:cs="Calibri" w:eastAsia="Calibri" w:hAnsi="Calibri"/>
+                <w:b/>
+                <w:bCs/>
+              </w:rPr>
+              <w:t xml:space="preserve">Evasión de riesgos</w:t>
+            </w:r>
+          </w:p>
+        </w:tc>
+        <w:tc>
+          <w:tcPr>
+            <w:tcW w:type="dxa" w:w="6560"/>
+            <w:tcBorders>
+              <w:top w:val="single" w:color="000000" w:sz="4"/>
+              <w:left w:val="single" w:color="000000" w:sz="4"/>
+              <w:bottom w:val="single" w:color="000000" w:sz="4"/>
+              <w:right w:val="single" w:color="000000" w:sz="4"/>
+            </w:tcBorders>
+            <w:shd w:fill="FFFFFF" w:val="clear"/>
+            <w:tcMar>
+              <w:top w:type="dxa" w:w="60"/>
+              <w:left w:type="dxa" w:w="100"/>
+              <w:bottom w:type="dxa" w:w="60"/>
+              <w:right w:type="dxa" w:w="100"/>
+            </w:tcMar>
+          </w:tcPr>
+          <w:p>
+            <w:r>
+              <w:rPr>
+                <w:rFonts w:ascii="Calibri" w:cs="Calibri" w:eastAsia="Calibri" w:hAnsi="Calibri"/>
+                <w:b/>
+                <w:bCs/>
+              </w:rPr>
+              <w:t xml:space="preserve">Interrumpir</w:t>
+            </w:r>
+            <w:r>
+              <w:rPr>
+                <w:rFonts w:ascii="Calibri" w:cs="Calibri" w:eastAsia="Calibri" w:hAnsi="Calibri"/>
+              </w:rPr>
+              <w:t xml:space="preserve"> la actividad, el sistema o el servicio vulnerables porque el riesgo es demasiado alto</w:t>
+            </w:r>
+          </w:p>
+        </w:tc>
+      </w:tr>
+      <w:tr>
+        <w:tc>
+          <w:tcPr>
+            <w:tcW w:type="dxa" w:w="2800"/>
+            <w:tcBorders>
+              <w:top w:val="single" w:color="000000" w:sz="4"/>
+              <w:left w:val="single" w:color="000000" w:sz="4"/>
+              <w:bottom w:val="single" w:color="000000" w:sz="4"/>
+              <w:right w:val="single" w:color="000000" w:sz="4"/>
+            </w:tcBorders>
+            <w:shd w:fill="FFFFFF" w:val="clear"/>
+            <w:tcMar>
+              <w:top w:type="dxa" w:w="60"/>
+              <w:left w:type="dxa" w:w="100"/>
+              <w:bottom w:type="dxa" w:w="60"/>
+              <w:right w:type="dxa" w:w="100"/>
+            </w:tcMar>
+          </w:tcPr>
+          <w:p>
+            <w:r>
+              <w:rPr>
+                <w:rFonts w:ascii="Calibri" w:cs="Calibri" w:eastAsia="Calibri" w:hAnsi="Calibri"/>
+                <w:b/>
+                <w:bCs/>
+              </w:rPr>
+              <w:t xml:space="preserve">Reducción del riesgo</w:t>
+            </w:r>
+          </w:p>
+        </w:tc>
+        <w:tc>
+          <w:tcPr>
+            <w:tcW w:type="dxa" w:w="6560"/>
+            <w:tcBorders>
+              <w:top w:val="single" w:color="000000" w:sz="4"/>
+              <w:left w:val="single" w:color="000000" w:sz="4"/>
+              <w:bottom w:val="single" w:color="000000" w:sz="4"/>
+              <w:right w:val="single" w:color="000000" w:sz="4"/>
+            </w:tcBorders>
+            <w:shd w:fill="FFFFFF" w:val="clear"/>
+            <w:tcMar>
+              <w:top w:type="dxa" w:w="60"/>
+              <w:left w:type="dxa" w:w="100"/>
+              <w:bottom w:type="dxa" w:w="60"/>
+              <w:right w:type="dxa" w:w="100"/>
+            </w:tcMar>
+          </w:tcPr>
+          <w:p>
+            <w:r>
+              <w:rPr>
+                <w:rFonts w:ascii="Calibri" w:cs="Calibri" w:eastAsia="Calibri" w:hAnsi="Calibri"/>
+              </w:rPr>
+              <w:t xml:space="preserve">Tomar medidas para </w:t>
+            </w:r>
+            <w:r>
+              <w:rPr>
+                <w:rFonts w:ascii="Calibri" w:cs="Calibri" w:eastAsia="Calibri" w:hAnsi="Calibri"/>
+                <w:b/>
+                <w:bCs/>
+              </w:rPr>
+              <w:t xml:space="preserve">mitigar</w:t>
+            </w:r>
+            <w:r>
+              <w:rPr>
+                <w:rFonts w:ascii="Calibri" w:cs="Calibri" w:eastAsia="Calibri" w:hAnsi="Calibri"/>
+              </w:rPr>
+              <w:t xml:space="preserve"> el riesgo y limitar su impacto</w:t>
+            </w:r>
+          </w:p>
+        </w:tc>
+      </w:tr>
+      <w:tr>
+        <w:tc>
+          <w:tcPr>
+            <w:tcW w:type="dxa" w:w="2800"/>
+            <w:tcBorders>
+              <w:top w:val="single" w:color="000000" w:sz="4"/>
+              <w:left w:val="single" w:color="000000" w:sz="4"/>
+              <w:bottom w:val="single" w:color="000000" w:sz="4"/>
+              <w:right w:val="single" w:color="000000" w:sz="4"/>
+            </w:tcBorders>
+            <w:shd w:fill="FFFFFF" w:val="clear"/>
+            <w:tcMar>
+              <w:top w:type="dxa" w:w="60"/>
+              <w:left w:type="dxa" w:w="100"/>
+              <w:bottom w:type="dxa" w:w="60"/>
+              <w:right w:type="dxa" w:w="100"/>
+            </w:tcMar>
+          </w:tcPr>
+          <w:p>
+            <w:r>
+              <w:rPr>
+                <w:rFonts w:ascii="Calibri" w:cs="Calibri" w:eastAsia="Calibri" w:hAnsi="Calibri"/>
+                <w:b/>
+                <w:bCs/>
+              </w:rPr>
+              <w:t xml:space="preserve">Riesgo compartido</w:t>
+            </w:r>
+          </w:p>
+        </w:tc>
+        <w:tc>
+          <w:tcPr>
+            <w:tcW w:type="dxa" w:w="6560"/>
+            <w:tcBorders>
+              <w:top w:val="single" w:color="000000" w:sz="4"/>
+              <w:left w:val="single" w:color="000000" w:sz="4"/>
+              <w:bottom w:val="single" w:color="000000" w:sz="4"/>
+              <w:right w:val="single" w:color="000000" w:sz="4"/>
+            </w:tcBorders>
+            <w:shd w:fill="FFFFFF" w:val="clear"/>
+            <w:tcMar>
+              <w:top w:type="dxa" w:w="60"/>
+              <w:left w:type="dxa" w:w="100"/>
+              <w:bottom w:type="dxa" w:w="60"/>
+              <w:right w:type="dxa" w:w="100"/>
+            </w:tcMar>
+          </w:tcPr>
+          <w:p>
+            <w:r>
+              <w:rPr>
+                <w:rFonts w:ascii="Calibri" w:cs="Calibri" w:eastAsia="Calibri" w:hAnsi="Calibri"/>
+                <w:b/>
+                <w:bCs/>
+              </w:rPr>
+              <w:t xml:space="preserve">Externalizar</w:t>
+            </w:r>
+            <w:r>
+              <w:rPr>
+                <w:rFonts w:ascii="Calibri" w:cs="Calibri" w:eastAsia="Calibri" w:hAnsi="Calibri"/>
+              </w:rPr>
+              <w:t xml:space="preserve"> la responsabilidad del riesgo o usar un </w:t>
+            </w:r>
+            <w:r>
+              <w:rPr>
+                <w:rFonts w:ascii="Calibri" w:cs="Calibri" w:eastAsia="Calibri" w:hAnsi="Calibri"/>
+                <w:b/>
+                <w:bCs/>
+              </w:rPr>
+              <w:t xml:space="preserve">seguro</w:t>
+            </w:r>
+            <w:r>
+              <w:rPr>
+                <w:rFonts w:ascii="Calibri" w:cs="Calibri" w:eastAsia="Calibri" w:hAnsi="Calibri"/>
+              </w:rPr>
+              <w:t xml:space="preserve"> para cubrir los daños</w:t>
+            </w:r>
+          </w:p>
+        </w:tc>
+      </w:tr>
+      <w:tr>
+        <w:tc>
+          <w:tcPr>
+            <w:tcW w:type="dxa" w:w="2800"/>
+            <w:tcBorders>
+              <w:top w:val="single" w:color="000000" w:sz="4"/>
+              <w:left w:val="single" w:color="000000" w:sz="4"/>
+              <w:bottom w:val="single" w:color="000000" w:sz="4"/>
+              <w:right w:val="single" w:color="000000" w:sz="4"/>
+            </w:tcBorders>
+            <w:shd w:fill="FFFFFF" w:val="clear"/>
+            <w:tcMar>
+              <w:top w:type="dxa" w:w="60"/>
+              <w:left w:type="dxa" w:w="100"/>
+              <w:bottom w:type="dxa" w:w="60"/>
+              <w:right w:type="dxa" w:w="100"/>
+            </w:tcMar>
+          </w:tcPr>
+          <w:p>
+            <w:r>
+              <w:rPr>
+                <w:rFonts w:ascii="Calibri" w:cs="Calibri" w:eastAsia="Calibri" w:hAnsi="Calibri"/>
+                <w:b/>
+                <w:bCs/>
+              </w:rPr>
+              <w:t xml:space="preserve">Retención de riesgos</w:t>
+            </w:r>
+          </w:p>
+        </w:tc>
+        <w:tc>
+          <w:tcPr>
+            <w:tcW w:type="dxa" w:w="6560"/>
+            <w:tcBorders>
+              <w:top w:val="single" w:color="000000" w:sz="4"/>
+              <w:left w:val="single" w:color="000000" w:sz="4"/>
+              <w:bottom w:val="single" w:color="000000" w:sz="4"/>
+              <w:right w:val="single" w:color="000000" w:sz="4"/>
+            </w:tcBorders>
+            <w:shd w:fill="FFFFFF" w:val="clear"/>
+            <w:tcMar>
+              <w:top w:type="dxa" w:w="60"/>
+              <w:left w:type="dxa" w:w="100"/>
+              <w:bottom w:type="dxa" w:w="60"/>
+              <w:right w:type="dxa" w:w="100"/>
+            </w:tcMar>
+          </w:tcPr>
+          <w:p>
+            <w:r>
+              <w:rPr>
+                <w:rFonts w:ascii="Calibri" w:cs="Calibri" w:eastAsia="Calibri" w:hAnsi="Calibri"/>
+                <w:b/>
+                <w:bCs/>
+              </w:rPr>
+              <w:t xml:space="preserve">Aceptar</w:t>
+            </w:r>
+            <w:r>
+              <w:rPr>
+                <w:rFonts w:ascii="Calibri" w:cs="Calibri" w:eastAsia="Calibri" w:hAnsi="Calibri"/>
+              </w:rPr>
+              <w:t xml:space="preserve"> el riesgo y no tomar ninguna acción</w:t>
+            </w:r>
+          </w:p>
+        </w:tc>
+      </w:tr>
+    </w:tbl>
+    <w:p>
+      <w:pPr>
+        <w:spacing w:after="80"/>
+      </w:pPr>
+    </w:p>
+    <w:p>
+      <w:pPr>
+        <w:spacing w:after="80" w:before="160"/>
+      </w:pPr>
+      <w:r>
+        <w:rPr>
+          <w:rFonts w:ascii="Calibri" w:cs="Calibri" w:eastAsia="Calibri" w:hAnsi="Calibri"/>
+          <w:b/>
+          <w:bCs/>
+        </w:rPr>
+        <w:t xml:space="preserve">Administración de vulnerabilidades</w:t>
+      </w:r>
+    </w:p>
+    <w:p>
+      <w:pPr>
+        <w:pStyle w:val="ListParagraph"/>
+        <w:numPr>
+          <w:ilvl w:val="0"/>
+          <w:numId w:val="2"/>
+        </w:numPr>
+        <w:spacing w:after="60"/>
+      </w:pPr>
+      <w:r>
+        <w:rPr>
+          <w:rFonts w:ascii="Calibri" w:cs="Calibri" w:eastAsia="Calibri" w:hAnsi="Calibri"/>
+        </w:rPr>
+        <w:t xml:space="preserve">Es una práctica de seguridad para </w:t>
+      </w:r>
+      <w:r>
+        <w:rPr>
+          <w:rFonts w:ascii="Calibri" w:cs="Calibri" w:eastAsia="Calibri" w:hAnsi="Calibri"/>
+          <w:b/>
+          <w:bCs/>
+        </w:rPr>
+        <w:t xml:space="preserve">prevenir de forma proactiva</w:t>
+      </w:r>
+      <w:r>
+        <w:rPr>
+          <w:rFonts w:ascii="Calibri" w:cs="Calibri" w:eastAsia="Calibri" w:hAnsi="Calibri"/>
+        </w:rPr>
+        <w:t xml:space="preserve"> que se exploten las vulnerabilidades de TI de una organización.</w:t>
+      </w:r>
+    </w:p>
+    <w:p>
+      <w:pPr>
+        <w:spacing w:after="100"/>
+      </w:pPr>
+      <w:r>
+        <w:rPr>
+          <w:rFonts w:ascii="Calibri" w:cs="Calibri" w:eastAsia="Calibri" w:hAnsi="Calibri"/>
+        </w:rPr>
+        <w:t xml:space="preserve">El ciclo de vida tiene </w:t>
+      </w:r>
+      <w:r>
+        <w:rPr>
+          <w:rFonts w:ascii="Calibri" w:cs="Calibri" w:eastAsia="Calibri" w:hAnsi="Calibri"/>
+          <w:b/>
+          <w:bCs/>
+        </w:rPr>
+        <w:t xml:space="preserve">6 pasos</w:t>
+      </w:r>
+      <w:r>
+        <w:rPr>
+          <w:rFonts w:ascii="Calibri" w:cs="Calibri" w:eastAsia="Calibri" w:hAnsi="Calibri"/>
+        </w:rPr>
+        <w:t xml:space="preserve">:</w:t>
+      </w:r>
+    </w:p>
+    <w:tbl>
+      <w:tblPr>
+        <w:tblW w:type="dxa" w:w="9360"/>
+        <w:tblBorders>
+          <w:top w:val="single" w:color="auto" w:sz="4"/>
+          <w:left w:val="single" w:color="auto" w:sz="4"/>
+          <w:bottom w:val="single" w:color="auto" w:sz="4"/>
+          <w:right w:val="single" w:color="auto" w:sz="4"/>
+          <w:insideH w:val="single" w:color="auto" w:sz="4"/>
+          <w:insideV w:val="single" w:color="auto" w:sz="4"/>
+        </w:tblBorders>
+      </w:tblPr>
+      <w:tblGrid>
+        <w:gridCol w:w="900"/>
+        <w:gridCol w:w="8460"/>
+      </w:tblGrid>
+      <w:tr>
+        <w:trPr>
+          <w:tblHeader/>
+        </w:trPr>
+        <w:tc>
+          <w:tcPr>
+            <w:tcW w:type="dxa" w:w="900"/>
+            <w:tcBorders>
+              <w:top w:val="single" w:color="000000" w:sz="4"/>
+              <w:left w:val="single" w:color="000000" w:sz="4"/>
+              <w:bottom w:val="single" w:color="000000" w:sz="4"/>
+              <w:right w:val="single" w:color="000000" w:sz="4"/>
+            </w:tcBorders>
+            <w:shd w:fill="D9D9D9" w:val="clear"/>
+            <w:tcMar>
+              <w:top w:type="dxa" w:w="60"/>
+              <w:left w:type="dxa" w:w="100"/>
+              <w:bottom w:type="dxa" w:w="60"/>
+              <w:right w:type="dxa" w:w="100"/>
+            </w:tcMar>
+          </w:tcPr>
+          <w:p>
+            <w:r>
+              <w:rPr>
+                <w:rFonts w:ascii="Calibri" w:cs="Calibri" w:eastAsia="Calibri" w:hAnsi="Calibri"/>
+                <w:b/>
+                <w:bCs/>
+                <w:color w:val="000000"/>
+              </w:rPr>
+              <w:t xml:space="preserve">Paso</w:t>
+            </w:r>
+          </w:p>
+        </w:tc>
+        <w:tc>
+          <w:tcPr>
+            <w:tcW w:type="dxa" w:w="8460"/>
+            <w:tcBorders>
+              <w:top w:val="single" w:color="000000" w:sz="4"/>
+              <w:left w:val="single" w:color="000000" w:sz="4"/>
+              <w:bottom w:val="single" w:color="000000" w:sz="4"/>
+              <w:right w:val="single" w:color="000000" w:sz="4"/>
+            </w:tcBorders>
+            <w:shd w:fill="D9D9D9" w:val="clear"/>
+            <w:tcMar>
+              <w:top w:type="dxa" w:w="60"/>
+              <w:left w:type="dxa" w:w="100"/>
+              <w:bottom w:type="dxa" w:w="60"/>
+              <w:right w:type="dxa" w:w="100"/>
+            </w:tcMar>
+          </w:tcPr>
+          <w:p>
+            <w:r>
+              <w:rPr>
+                <w:rFonts w:ascii="Calibri" w:cs="Calibri" w:eastAsia="Calibri" w:hAnsi="Calibri"/>
+                <w:b/>
+                <w:bCs/>
+                <w:color w:val="000000"/>
+              </w:rPr>
+              <w:t xml:space="preserve">Qué se hace</w:t>
+            </w:r>
+          </w:p>
+        </w:tc>
+      </w:tr>
+      <w:tr>
+        <w:tc>
+          <w:tcPr>
+            <w:tcW w:type="dxa" w:w="900"/>
+            <w:tcBorders>
+              <w:top w:val="single" w:color="000000" w:sz="4"/>
+              <w:left w:val="single" w:color="000000" w:sz="4"/>
+              <w:bottom w:val="single" w:color="000000" w:sz="4"/>
+              <w:right w:val="single" w:color="000000" w:sz="4"/>
+            </w:tcBorders>
+            <w:shd w:fill="FFFFFF" w:val="clear"/>
+            <w:tcMar>
+              <w:top w:type="dxa" w:w="60"/>
+              <w:left w:type="dxa" w:w="100"/>
+              <w:bottom w:type="dxa" w:w="60"/>
+              <w:right w:type="dxa" w:w="100"/>
+            </w:tcMar>
+          </w:tcPr>
+          <w:p>
+            <w:r>
+              <w:rPr>
+                <w:rFonts w:ascii="Calibri" w:cs="Calibri" w:eastAsia="Calibri" w:hAnsi="Calibri"/>
+                <w:b/>
+                <w:bCs/>
+              </w:rPr>
+              <w:t xml:space="preserve">1</w:t>
+            </w:r>
+          </w:p>
+        </w:tc>
+        <w:tc>
+          <w:tcPr>
+            <w:tcW w:type="dxa" w:w="8460"/>
+            <w:tcBorders>
+              <w:top w:val="single" w:color="000000" w:sz="4"/>
+              <w:left w:val="single" w:color="000000" w:sz="4"/>
+              <w:bottom w:val="single" w:color="000000" w:sz="4"/>
+              <w:right w:val="single" w:color="000000" w:sz="4"/>
+            </w:tcBorders>
+            <w:shd w:fill="FFFFFF" w:val="clear"/>
+            <w:tcMar>
+              <w:top w:type="dxa" w:w="60"/>
+              <w:left w:type="dxa" w:w="100"/>
+              <w:bottom w:type="dxa" w:w="60"/>
+              <w:right w:type="dxa" w:w="100"/>
+            </w:tcMar>
+          </w:tcPr>
+          <w:p>
+            <w:r>
+              <w:rPr>
+                <w:rFonts w:ascii="Calibri" w:cs="Calibri" w:eastAsia="Calibri" w:hAnsi="Calibri"/>
+              </w:rPr>
+              <w:t xml:space="preserve">Detectar</w:t>
+            </w:r>
+          </w:p>
+        </w:tc>
+      </w:tr>
+      <w:tr>
+        <w:tc>
+          <w:tcPr>
+            <w:tcW w:type="dxa" w:w="900"/>
+            <w:tcBorders>
+              <w:top w:val="single" w:color="000000" w:sz="4"/>
+              <w:left w:val="single" w:color="000000" w:sz="4"/>
+              <w:bottom w:val="single" w:color="000000" w:sz="4"/>
+              <w:right w:val="single" w:color="000000" w:sz="4"/>
+            </w:tcBorders>
+            <w:shd w:fill="FFFFFF" w:val="clear"/>
+            <w:tcMar>
+              <w:top w:type="dxa" w:w="60"/>
+              <w:left w:type="dxa" w:w="100"/>
+              <w:bottom w:type="dxa" w:w="60"/>
+              <w:right w:type="dxa" w:w="100"/>
+            </w:tcMar>
+          </w:tcPr>
+          <w:p>
+            <w:r>
+              <w:rPr>
+                <w:rFonts w:ascii="Calibri" w:cs="Calibri" w:eastAsia="Calibri" w:hAnsi="Calibri"/>
+                <w:b/>
+                <w:bCs/>
+              </w:rPr>
+              <w:t xml:space="preserve">2</w:t>
+            </w:r>
+          </w:p>
+        </w:tc>
+        <w:tc>
+          <w:tcPr>
+            <w:tcW w:type="dxa" w:w="8460"/>
+            <w:tcBorders>
+              <w:top w:val="single" w:color="000000" w:sz="4"/>
+              <w:left w:val="single" w:color="000000" w:sz="4"/>
+              <w:bottom w:val="single" w:color="000000" w:sz="4"/>
+              <w:right w:val="single" w:color="000000" w:sz="4"/>
+            </w:tcBorders>
+            <w:shd w:fill="FFFFFF" w:val="clear"/>
+            <w:tcMar>
+              <w:top w:type="dxa" w:w="60"/>
+              <w:left w:type="dxa" w:w="100"/>
+              <w:bottom w:type="dxa" w:w="60"/>
+              <w:right w:type="dxa" w:w="100"/>
+            </w:tcMar>
+          </w:tcPr>
+          <w:p>
+            <w:r>
+              <w:rPr>
+                <w:rFonts w:ascii="Calibri" w:cs="Calibri" w:eastAsia="Calibri" w:hAnsi="Calibri"/>
+              </w:rPr>
+              <w:t xml:space="preserve">Priorizar activos</w:t>
+            </w:r>
+          </w:p>
+        </w:tc>
+      </w:tr>
+      <w:tr>
+        <w:tc>
+          <w:tcPr>
+            <w:tcW w:type="dxa" w:w="900"/>
+            <w:tcBorders>
+              <w:top w:val="single" w:color="000000" w:sz="4"/>
+              <w:left w:val="single" w:color="000000" w:sz="4"/>
+              <w:bottom w:val="single" w:color="000000" w:sz="4"/>
+              <w:right w:val="single" w:color="000000" w:sz="4"/>
+            </w:tcBorders>
+            <w:shd w:fill="FFFFFF" w:val="clear"/>
+            <w:tcMar>
+              <w:top w:type="dxa" w:w="60"/>
+              <w:left w:type="dxa" w:w="100"/>
+              <w:bottom w:type="dxa" w:w="60"/>
+              <w:right w:type="dxa" w:w="100"/>
+            </w:tcMar>
+          </w:tcPr>
+          <w:p>
+            <w:r>
+              <w:rPr>
+                <w:rFonts w:ascii="Calibri" w:cs="Calibri" w:eastAsia="Calibri" w:hAnsi="Calibri"/>
+                <w:b/>
+                <w:bCs/>
+              </w:rPr>
+              <w:t xml:space="preserve">3</w:t>
+            </w:r>
+          </w:p>
+        </w:tc>
+        <w:tc>
+          <w:tcPr>
+            <w:tcW w:type="dxa" w:w="8460"/>
+            <w:tcBorders>
+              <w:top w:val="single" w:color="000000" w:sz="4"/>
+              <w:left w:val="single" w:color="000000" w:sz="4"/>
+              <w:bottom w:val="single" w:color="000000" w:sz="4"/>
+              <w:right w:val="single" w:color="000000" w:sz="4"/>
+            </w:tcBorders>
+            <w:shd w:fill="FFFFFF" w:val="clear"/>
+            <w:tcMar>
+              <w:top w:type="dxa" w:w="60"/>
+              <w:left w:type="dxa" w:w="100"/>
+              <w:bottom w:type="dxa" w:w="60"/>
+              <w:right w:type="dxa" w:w="100"/>
+            </w:tcMar>
+          </w:tcPr>
+          <w:p>
+            <w:r>
+              <w:rPr>
+                <w:rFonts w:ascii="Calibri" w:cs="Calibri" w:eastAsia="Calibri" w:hAnsi="Calibri"/>
+              </w:rPr>
+              <w:t xml:space="preserve">Evaluar</w:t>
+            </w:r>
+          </w:p>
+        </w:tc>
+      </w:tr>
+      <w:tr>
+        <w:tc>
+          <w:tcPr>
+            <w:tcW w:type="dxa" w:w="900"/>
+            <w:tcBorders>
+              <w:top w:val="single" w:color="000000" w:sz="4"/>
+              <w:left w:val="single" w:color="000000" w:sz="4"/>
+              <w:bottom w:val="single" w:color="000000" w:sz="4"/>
+              <w:right w:val="single" w:color="000000" w:sz="4"/>
+            </w:tcBorders>
+            <w:shd w:fill="FFFFFF" w:val="clear"/>
+            <w:tcMar>
+              <w:top w:type="dxa" w:w="60"/>
+              <w:left w:type="dxa" w:w="100"/>
+              <w:bottom w:type="dxa" w:w="60"/>
+              <w:right w:type="dxa" w:w="100"/>
+            </w:tcMar>
+          </w:tcPr>
+          <w:p>
+            <w:r>
+              <w:rPr>
+                <w:rFonts w:ascii="Calibri" w:cs="Calibri" w:eastAsia="Calibri" w:hAnsi="Calibri"/>
+                <w:b/>
+                <w:bCs/>
+              </w:rPr>
+              <w:t xml:space="preserve">4</w:t>
+            </w:r>
+          </w:p>
+        </w:tc>
+        <w:tc>
+          <w:tcPr>
+            <w:tcW w:type="dxa" w:w="8460"/>
+            <w:tcBorders>
+              <w:top w:val="single" w:color="000000" w:sz="4"/>
+              <w:left w:val="single" w:color="000000" w:sz="4"/>
+              <w:bottom w:val="single" w:color="000000" w:sz="4"/>
+              <w:right w:val="single" w:color="000000" w:sz="4"/>
+            </w:tcBorders>
+            <w:shd w:fill="FFFFFF" w:val="clear"/>
+            <w:tcMar>
+              <w:top w:type="dxa" w:w="60"/>
+              <w:left w:type="dxa" w:w="100"/>
+              <w:bottom w:type="dxa" w:w="60"/>
+              <w:right w:type="dxa" w:w="100"/>
+            </w:tcMar>
+          </w:tcPr>
+          <w:p>
+            <w:r>
+              <w:rPr>
+                <w:rFonts w:ascii="Calibri" w:cs="Calibri" w:eastAsia="Calibri" w:hAnsi="Calibri"/>
+              </w:rPr>
+              <w:t xml:space="preserve">Informar</w:t>
+            </w:r>
+          </w:p>
+        </w:tc>
+      </w:tr>
+      <w:tr>
+        <w:tc>
+          <w:tcPr>
+            <w:tcW w:type="dxa" w:w="900"/>
+            <w:tcBorders>
+              <w:top w:val="single" w:color="000000" w:sz="4"/>
+              <w:left w:val="single" w:color="000000" w:sz="4"/>
+              <w:bottom w:val="single" w:color="000000" w:sz="4"/>
+              <w:right w:val="single" w:color="000000" w:sz="4"/>
+            </w:tcBorders>
+            <w:shd w:fill="FFFFFF" w:val="clear"/>
+            <w:tcMar>
+              <w:top w:type="dxa" w:w="60"/>
+              <w:left w:type="dxa" w:w="100"/>
+              <w:bottom w:type="dxa" w:w="60"/>
+              <w:right w:type="dxa" w:w="100"/>
+            </w:tcMar>
+          </w:tcPr>
+          <w:p>
+            <w:r>
+              <w:rPr>
+                <w:rFonts w:ascii="Calibri" w:cs="Calibri" w:eastAsia="Calibri" w:hAnsi="Calibri"/>
+                <w:b/>
+                <w:bCs/>
+              </w:rPr>
+              <w:t xml:space="preserve">5</w:t>
+            </w:r>
+          </w:p>
+        </w:tc>
+        <w:tc>
+          <w:tcPr>
+            <w:tcW w:type="dxa" w:w="8460"/>
+            <w:tcBorders>
+              <w:top w:val="single" w:color="000000" w:sz="4"/>
+              <w:left w:val="single" w:color="000000" w:sz="4"/>
+              <w:bottom w:val="single" w:color="000000" w:sz="4"/>
+              <w:right w:val="single" w:color="000000" w:sz="4"/>
+            </w:tcBorders>
+            <w:shd w:fill="FFFFFF" w:val="clear"/>
+            <w:tcMar>
+              <w:top w:type="dxa" w:w="60"/>
+              <w:left w:type="dxa" w:w="100"/>
+              <w:bottom w:type="dxa" w:w="60"/>
+              <w:right w:type="dxa" w:w="100"/>
+            </w:tcMar>
+          </w:tcPr>
+          <w:p>
+            <w:r>
+              <w:rPr>
+                <w:rFonts w:ascii="Calibri" w:cs="Calibri" w:eastAsia="Calibri" w:hAnsi="Calibri"/>
+              </w:rPr>
+              <w:t xml:space="preserve">Remediar</w:t>
+            </w:r>
+          </w:p>
+        </w:tc>
+      </w:tr>
+      <w:tr>
+        <w:tc>
+          <w:tcPr>
+            <w:tcW w:type="dxa" w:w="900"/>
+            <w:tcBorders>
+              <w:top w:val="single" w:color="000000" w:sz="4"/>
+              <w:left w:val="single" w:color="000000" w:sz="4"/>
+              <w:bottom w:val="single" w:color="000000" w:sz="4"/>
+              <w:right w:val="single" w:color="000000" w:sz="4"/>
+            </w:tcBorders>
+            <w:shd w:fill="FFFFFF" w:val="clear"/>
+            <w:tcMar>
+              <w:top w:type="dxa" w:w="60"/>
+              <w:left w:type="dxa" w:w="100"/>
+              <w:bottom w:type="dxa" w:w="60"/>
+              <w:right w:type="dxa" w:w="100"/>
+            </w:tcMar>
+          </w:tcPr>
+          <w:p>
+            <w:r>
+              <w:rPr>
+                <w:rFonts w:ascii="Calibri" w:cs="Calibri" w:eastAsia="Calibri" w:hAnsi="Calibri"/>
+                <w:b/>
+                <w:bCs/>
+              </w:rPr>
+              <w:t xml:space="preserve">6</w:t>
+            </w:r>
+          </w:p>
+        </w:tc>
+        <w:tc>
+          <w:tcPr>
+            <w:tcW w:type="dxa" w:w="8460"/>
+            <w:tcBorders>
+              <w:top w:val="single" w:color="000000" w:sz="4"/>
+              <w:left w:val="single" w:color="000000" w:sz="4"/>
+              <w:bottom w:val="single" w:color="000000" w:sz="4"/>
+              <w:right w:val="single" w:color="000000" w:sz="4"/>
+            </w:tcBorders>
+            <w:shd w:fill="FFFFFF" w:val="clear"/>
+            <w:tcMar>
+              <w:top w:type="dxa" w:w="60"/>
+              <w:left w:type="dxa" w:w="100"/>
+              <w:bottom w:type="dxa" w:w="60"/>
+              <w:right w:type="dxa" w:w="100"/>
+            </w:tcMar>
+          </w:tcPr>
+          <w:p>
+            <w:r>
+              <w:rPr>
+                <w:rFonts w:ascii="Calibri" w:cs="Calibri" w:eastAsia="Calibri" w:hAnsi="Calibri"/>
+              </w:rPr>
+              <w:t xml:space="preserve">Verificar</w:t>
+            </w:r>
+          </w:p>
+        </w:tc>
+      </w:tr>
+    </w:tbl>
+    <w:p>
+      <w:pPr>
+        <w:spacing w:after="80"/>
+      </w:pPr>
+    </w:p>
+    <w:p>
+      <w:pPr>
+        <w:spacing w:after="80" w:before="160"/>
+      </w:pPr>
+      <w:r>
+        <w:rPr>
+          <w:rFonts w:ascii="Calibri" w:cs="Calibri" w:eastAsia="Calibri" w:hAnsi="Calibri"/>
+          <w:b/>
+          <w:bCs/>
+        </w:rPr>
+        <w:t xml:space="preserve">Administración de activos</w:t>
+      </w:r>
+    </w:p>
+    <w:p>
+      <w:pPr>
+        <w:pStyle w:val="ListParagraph"/>
+        <w:numPr>
+          <w:ilvl w:val="0"/>
+          <w:numId w:val="2"/>
+        </w:numPr>
+        <w:spacing w:after="60"/>
+      </w:pPr>
+      <w:r>
+        <w:rPr>
+          <w:rFonts w:ascii="Calibri" w:cs="Calibri" w:eastAsia="Calibri" w:hAnsi="Calibri"/>
+        </w:rPr>
+        <w:t xml:space="preserve">Implica sistemas que </w:t>
+      </w:r>
+      <w:r>
+        <w:rPr>
+          <w:rFonts w:ascii="Calibri" w:cs="Calibri" w:eastAsia="Calibri" w:hAnsi="Calibri"/>
+          <w:b/>
+          <w:bCs/>
+        </w:rPr>
+        <w:t xml:space="preserve">rastrean la ubicación y configuración</w:t>
+      </w:r>
+      <w:r>
+        <w:rPr>
+          <w:rFonts w:ascii="Calibri" w:cs="Calibri" w:eastAsia="Calibri" w:hAnsi="Calibri"/>
+        </w:rPr>
+        <w:t xml:space="preserve"> de dispositivos y software en la red de toda la empresa.</w:t>
+      </w:r>
+    </w:p>
+    <w:p>
+      <w:pPr>
+        <w:spacing w:after="80" w:before="160"/>
+      </w:pPr>
+      <w:r>
+        <w:rPr>
+          <w:rFonts w:ascii="Calibri" w:cs="Calibri" w:eastAsia="Calibri" w:hAnsi="Calibri"/>
+          <w:b/>
+          <w:bCs/>
+        </w:rPr>
+        <w:t xml:space="preserve">MDM (Mobile Device Management)</w:t>
+      </w:r>
+    </w:p>
+    <w:p>
+      <w:pPr>
+        <w:pStyle w:val="ListParagraph"/>
+        <w:numPr>
+          <w:ilvl w:val="0"/>
+          <w:numId w:val="2"/>
+        </w:numPr>
+        <w:spacing w:after="60"/>
+      </w:pPr>
+      <w:r>
+        <w:rPr>
+          <w:rFonts w:ascii="Calibri" w:cs="Calibri" w:eastAsia="Calibri" w:hAnsi="Calibri"/>
+        </w:rPr>
+        <w:t xml:space="preserve">Permiten al personal de seguridad </w:t>
+      </w:r>
+      <w:r>
+        <w:rPr>
+          <w:rFonts w:ascii="Calibri" w:cs="Calibri" w:eastAsia="Calibri" w:hAnsi="Calibri"/>
+          <w:b/>
+          <w:bCs/>
+        </w:rPr>
+        <w:t xml:space="preserve">configurar, monitorear y actualizar</w:t>
+      </w:r>
+      <w:r>
+        <w:rPr>
+          <w:rFonts w:ascii="Calibri" w:cs="Calibri" w:eastAsia="Calibri" w:hAnsi="Calibri"/>
+        </w:rPr>
+        <w:t xml:space="preserve"> un conjunto muy diverso de clientes móviles </w:t>
+      </w:r>
+      <w:r>
+        <w:rPr>
+          <w:rFonts w:ascii="Calibri" w:cs="Calibri" w:eastAsia="Calibri" w:hAnsi="Calibri"/>
+          <w:b/>
+          <w:bCs/>
+        </w:rPr>
+        <w:t xml:space="preserve">desde la nube</w:t>
+      </w:r>
+      <w:r>
+        <w:rPr>
+          <w:rFonts w:ascii="Calibri" w:cs="Calibri" w:eastAsia="Calibri" w:hAnsi="Calibri"/>
+        </w:rPr>
+        <w:t xml:space="preserve">.</w:t>
+      </w:r>
+    </w:p>
+    <w:p>
+      <w:pPr>
+        <w:spacing w:after="80" w:before="160"/>
+      </w:pPr>
+      <w:r>
+        <w:rPr>
+          <w:rFonts w:ascii="Calibri" w:cs="Calibri" w:eastAsia="Calibri" w:hAnsi="Calibri"/>
+          <w:b/>
+          <w:bCs/>
+        </w:rPr>
+        <w:t xml:space="preserve">Administración de configuraciones</w:t>
+      </w:r>
+    </w:p>
+    <w:p>
+      <w:pPr>
+        <w:pStyle w:val="ListParagraph"/>
+        <w:numPr>
+          <w:ilvl w:val="0"/>
+          <w:numId w:val="2"/>
+        </w:numPr>
+        <w:spacing w:after="60"/>
+      </w:pPr>
+      <w:r>
+        <w:rPr>
+          <w:rFonts w:ascii="Calibri" w:cs="Calibri" w:eastAsia="Calibri" w:hAnsi="Calibri"/>
+        </w:rPr>
+        <w:t xml:space="preserve">Se ocupa del </w:t>
+      </w:r>
+      <w:r>
+        <w:rPr>
+          <w:rFonts w:ascii="Calibri" w:cs="Calibri" w:eastAsia="Calibri" w:hAnsi="Calibri"/>
+          <w:b/>
+          <w:bCs/>
+        </w:rPr>
+        <w:t xml:space="preserve">inventario y control</w:t>
+      </w:r>
+      <w:r>
+        <w:rPr>
+          <w:rFonts w:ascii="Calibri" w:cs="Calibri" w:eastAsia="Calibri" w:hAnsi="Calibri"/>
+        </w:rPr>
+        <w:t xml:space="preserve"> de las configuraciones de hardware y software de los sistemas.</w:t>
+      </w:r>
+    </w:p>
+    <w:p>
+      <w:pPr>
+        <w:spacing w:after="80" w:before="160"/>
+      </w:pPr>
+      <w:r>
+        <w:rPr>
+          <w:rFonts w:ascii="Calibri" w:cs="Calibri" w:eastAsia="Calibri" w:hAnsi="Calibri"/>
+          <w:b/>
+          <w:bCs/>
+        </w:rPr>
+        <w:t xml:space="preserve">Administración de parches</w:t>
+      </w:r>
+    </w:p>
+    <w:p>
+      <w:pPr>
+        <w:pStyle w:val="ListParagraph"/>
+        <w:numPr>
+          <w:ilvl w:val="0"/>
+          <w:numId w:val="2"/>
+        </w:numPr>
+        <w:spacing w:after="60"/>
+      </w:pPr>
+      <w:r>
+        <w:rPr>
+          <w:rFonts w:ascii="Calibri" w:cs="Calibri" w:eastAsia="Calibri" w:hAnsi="Calibri"/>
+        </w:rPr>
+        <w:t xml:space="preserve">Está relacionada con la administración de vulnerabilidades. Implica todos los aspectos de la aplicación de parches de software: </w:t>
+      </w:r>
+      <w:r>
+        <w:rPr>
+          <w:rFonts w:ascii="Calibri" w:cs="Calibri" w:eastAsia="Calibri" w:hAnsi="Calibri"/>
+          <w:b/>
+          <w:bCs/>
+        </w:rPr>
+        <w:t xml:space="preserve">adquisición, distribución, instalación y verificación</w:t>
+      </w:r>
+      <w:r>
+        <w:rPr>
+          <w:rFonts w:ascii="Calibri" w:cs="Calibri" w:eastAsia="Calibri" w:hAnsi="Calibri"/>
+        </w:rPr>
+        <w:t xml:space="preserve">.</w:t>
+      </w:r>
+    </w:p>
+    <w:p>
+      <w:pPr>
+        <w:pStyle w:val="ListParagraph"/>
+        <w:numPr>
+          <w:ilvl w:val="0"/>
+          <w:numId w:val="2"/>
+        </w:numPr>
+        <w:spacing w:after="60"/>
+      </w:pPr>
+      <w:r>
+        <w:rPr>
+          <w:rFonts w:ascii="Calibri" w:cs="Calibri" w:eastAsia="Calibri" w:hAnsi="Calibri"/>
+        </w:rPr>
+        <w:t xml:space="preserve">Algunas regulaciones de cumplimiento la </w:t>
+      </w:r>
+      <w:r>
+        <w:rPr>
+          <w:rFonts w:ascii="Calibri" w:cs="Calibri" w:eastAsia="Calibri" w:hAnsi="Calibri"/>
+          <w:b/>
+          <w:bCs/>
+        </w:rPr>
+        <w:t xml:space="preserve">exigen</w:t>
+      </w:r>
+      <w:r>
+        <w:rPr>
+          <w:rFonts w:ascii="Calibri" w:cs="Calibri" w:eastAsia="Calibri" w:hAnsi="Calibri"/>
+        </w:rPr>
+        <w:t xml:space="preserve">.</w:t>
+      </w:r>
+    </w:p>
+    <w:p>
+      <w:pPr>
+        <w:spacing w:after="100"/>
+      </w:pPr>
+      <w:r>
+        <w:rPr>
+          <w:rFonts w:ascii="Calibri" w:cs="Calibri" w:eastAsia="Calibri" w:hAnsi="Calibri"/>
+        </w:rPr>
+        <w:t xml:space="preserve">Técnicas:</w:t>
+      </w:r>
+    </w:p>
+    <w:p>
+      <w:pPr>
+        <w:pStyle w:val="ListParagraph"/>
+        <w:numPr>
+          <w:ilvl w:val="1"/>
+          <w:numId w:val="2"/>
+        </w:numPr>
+        <w:spacing w:after="60"/>
+      </w:pPr>
+      <w:r>
+        <w:rPr>
+          <w:rFonts w:ascii="Calibri" w:cs="Calibri" w:eastAsia="Calibri" w:hAnsi="Calibri"/>
+        </w:rPr>
+        <w:t xml:space="preserve">Análisis </w:t>
+      </w:r>
+      <w:r>
+        <w:rPr>
+          <w:rFonts w:ascii="Calibri" w:cs="Calibri" w:eastAsia="Calibri" w:hAnsi="Calibri"/>
+          <w:b/>
+          <w:bCs/>
+        </w:rPr>
+        <w:t xml:space="preserve">basado en agentes</w:t>
+      </w:r>
+    </w:p>
+    <w:p>
+      <w:pPr>
+        <w:pStyle w:val="ListParagraph"/>
+        <w:numPr>
+          <w:ilvl w:val="1"/>
+          <w:numId w:val="2"/>
+        </w:numPr>
+        <w:spacing w:after="60"/>
+      </w:pPr>
+      <w:r>
+        <w:rPr>
+          <w:rFonts w:ascii="Calibri" w:cs="Calibri" w:eastAsia="Calibri" w:hAnsi="Calibri"/>
+        </w:rPr>
+        <w:t xml:space="preserve">Análisis </w:t>
+      </w:r>
+      <w:r>
+        <w:rPr>
+          <w:rFonts w:ascii="Calibri" w:cs="Calibri" w:eastAsia="Calibri" w:hAnsi="Calibri"/>
+          <w:b/>
+          <w:bCs/>
+        </w:rPr>
+        <w:t xml:space="preserve">sin agentes</w:t>
+      </w:r>
+    </w:p>
+    <w:p>
+      <w:pPr>
+        <w:pStyle w:val="ListParagraph"/>
+        <w:numPr>
+          <w:ilvl w:val="1"/>
+          <w:numId w:val="2"/>
+        </w:numPr>
+        <w:spacing w:after="60"/>
+      </w:pPr>
+      <w:r>
+        <w:rPr>
+          <w:rFonts w:ascii="Calibri" w:cs="Calibri" w:eastAsia="Calibri" w:hAnsi="Calibri"/>
+          <w:b/>
+          <w:bCs/>
+        </w:rPr>
+        <w:t xml:space="preserve">Supervisión pasiva</w:t>
+      </w:r>
+      <w:r>
+        <w:rPr>
+          <w:rFonts w:ascii="Calibri" w:cs="Calibri" w:eastAsia="Calibri" w:hAnsi="Calibri"/>
+        </w:rPr>
+        <w:t xml:space="preserve"> de redes</w:t>
       </w:r>
     </w:p>
     <w:sectPr>

</xml_diff>

<commit_message>
Agrega Módulo 26: Administración de riesgos y controles de seguridad al resumen de módulos 19 en adelante
Co-Authored-By: Claude Sonnet 5.5 <noreply@anthropic.com>
Claude-Session: https://claude.ai/code/session_013iWwbBbHxw2c1QtKDe5PjZ
</commit_message>
<xml_diff>
--- a/Modulos_19_en_adelante_Resumen.docx
+++ b/Modulos_19_en_adelante_Resumen.docx
@@ -15355,6 +15355,2437 @@
         </w:rPr>
         <w:t xml:space="preserve"> de redes</w:t>
       </w:r>
+    </w:p>
+    <w:p>
+      <w:r>
+        <w:br w:type="page"/>
+      </w:r>
+    </w:p>
+    <w:p>
+      <w:pPr>
+        <w:spacing w:after="60"/>
+        <w:jc w:val="center"/>
+      </w:pPr>
+      <w:r>
+        <w:rPr>
+          <w:rFonts w:ascii="Calibri" w:cs="Calibri" w:eastAsia="Calibri" w:hAnsi="Calibri"/>
+          <w:b/>
+          <w:bCs/>
+          <w:color w:val="000000"/>
+          <w:sz w:val="24"/>
+          <w:szCs w:val="24"/>
+        </w:rPr>
+        <w:t xml:space="preserve">Módulo 26: Administración de riesgos y controles de seguridad</w:t>
+      </w:r>
+    </w:p>
+    <w:p>
+      <w:pPr>
+        <w:spacing w:after="200"/>
+        <w:jc w:val="center"/>
+      </w:pPr>
+      <w:r>
+        <w:rPr>
+          <w:rFonts w:ascii="Calibri" w:cs="Calibri" w:eastAsia="Calibri" w:hAnsi="Calibri"/>
+          <w:color w:val="000000"/>
+          <w:sz w:val="24"/>
+          <w:szCs w:val="24"/>
+        </w:rPr>
+        <w:t xml:space="preserve">Resumen de ciberseguridad</w:t>
+      </w:r>
+    </w:p>
+    <w:p>
+      <w:pPr>
+        <w:spacing w:after="120" w:before="280"/>
+      </w:pPr>
+      <w:r>
+        <w:rPr>
+          <w:rFonts w:ascii="Calibri" w:cs="Calibri" w:eastAsia="Calibri" w:hAnsi="Calibri"/>
+          <w:b/>
+          <w:bCs/>
+        </w:rPr>
+        <w:t xml:space="preserve">1. Administración de riesgos</w:t>
+      </w:r>
+    </w:p>
+    <w:p>
+      <w:pPr>
+        <w:pStyle w:val="ListParagraph"/>
+        <w:numPr>
+          <w:ilvl w:val="0"/>
+          <w:numId w:val="2"/>
+        </w:numPr>
+        <w:spacing w:after="60"/>
+      </w:pPr>
+      <w:r>
+        <w:rPr>
+          <w:rFonts w:ascii="Calibri" w:cs="Calibri" w:eastAsia="Calibri" w:hAnsi="Calibri"/>
+          <w:b/>
+          <w:bCs/>
+        </w:rPr>
+        <w:t xml:space="preserve">Riesgo:</w:t>
+      </w:r>
+      <w:r>
+        <w:rPr>
+          <w:rFonts w:ascii="Calibri" w:cs="Calibri" w:eastAsia="Calibri" w:hAnsi="Calibri"/>
+        </w:rPr>
+        <w:t xml:space="preserve"> probabilidad de pérdida debido a una amenaza, un acto malicioso o un evento inesperado que daña los sistemas de información o los recursos de la organización.</w:t>
+      </w:r>
+    </w:p>
+    <w:p>
+      <w:pPr>
+        <w:pStyle w:val="ListParagraph"/>
+        <w:numPr>
+          <w:ilvl w:val="0"/>
+          <w:numId w:val="2"/>
+        </w:numPr>
+        <w:spacing w:after="60"/>
+      </w:pPr>
+      <w:r>
+        <w:rPr>
+          <w:rFonts w:ascii="Calibri" w:cs="Calibri" w:eastAsia="Calibri" w:hAnsi="Calibri"/>
+          <w:b/>
+          <w:bCs/>
+        </w:rPr>
+        <w:t xml:space="preserve">Impacto del riesgo:</w:t>
+      </w:r>
+      <w:r>
+        <w:rPr>
+          <w:rFonts w:ascii="Calibri" w:cs="Calibri" w:eastAsia="Calibri" w:hAnsi="Calibri"/>
+        </w:rPr>
+        <w:t xml:space="preserve"> el daño que causa un evento que provoca la </w:t>
+      </w:r>
+      <w:r>
+        <w:rPr>
+          <w:rFonts w:ascii="Calibri" w:cs="Calibri" w:eastAsia="Calibri" w:hAnsi="Calibri"/>
+          <w:b/>
+          <w:bCs/>
+        </w:rPr>
+        <w:t xml:space="preserve">pérdida de activos</w:t>
+      </w:r>
+      <w:r>
+        <w:rPr>
+          <w:rFonts w:ascii="Calibri" w:cs="Calibri" w:eastAsia="Calibri" w:hAnsi="Calibri"/>
+        </w:rPr>
+        <w:t xml:space="preserve"> o la </w:t>
+      </w:r>
+      <w:r>
+        <w:rPr>
+          <w:rFonts w:ascii="Calibri" w:cs="Calibri" w:eastAsia="Calibri" w:hAnsi="Calibri"/>
+          <w:b/>
+          <w:bCs/>
+        </w:rPr>
+        <w:t xml:space="preserve">interrupción de los servicios</w:t>
+      </w:r>
+      <w:r>
+        <w:rPr>
+          <w:rFonts w:ascii="Calibri" w:cs="Calibri" w:eastAsia="Calibri" w:hAnsi="Calibri"/>
+        </w:rPr>
+        <w:t xml:space="preserve">.</w:t>
+      </w:r>
+    </w:p>
+    <w:p>
+      <w:pPr>
+        <w:pStyle w:val="ListParagraph"/>
+        <w:numPr>
+          <w:ilvl w:val="0"/>
+          <w:numId w:val="2"/>
+        </w:numPr>
+        <w:spacing w:after="60"/>
+      </w:pPr>
+      <w:r>
+        <w:rPr>
+          <w:rFonts w:ascii="Calibri" w:cs="Calibri" w:eastAsia="Calibri" w:hAnsi="Calibri"/>
+          <w:b/>
+          <w:bCs/>
+        </w:rPr>
+        <w:t xml:space="preserve">Objetivo de la administración de riesgos:</w:t>
+      </w:r>
+      <w:r>
+        <w:rPr>
+          <w:rFonts w:ascii="Calibri" w:cs="Calibri" w:eastAsia="Calibri" w:hAnsi="Calibri"/>
+        </w:rPr>
+        <w:t xml:space="preserve"> reducir estas amenazas a un </w:t>
+      </w:r>
+      <w:r>
+        <w:rPr>
+          <w:rFonts w:ascii="Calibri" w:cs="Calibri" w:eastAsia="Calibri" w:hAnsi="Calibri"/>
+          <w:b/>
+          <w:bCs/>
+        </w:rPr>
+        <w:t xml:space="preserve">nivel aceptable</w:t>
+      </w:r>
+      <w:r>
+        <w:rPr>
+          <w:rFonts w:ascii="Calibri" w:cs="Calibri" w:eastAsia="Calibri" w:hAnsi="Calibri"/>
+        </w:rPr>
+        <w:t xml:space="preserve"> e implementar controles para mantener ese nivel.</w:t>
+      </w:r>
+    </w:p>
+    <w:p>
+      <w:pPr>
+        <w:pStyle w:val="ListParagraph"/>
+        <w:numPr>
+          <w:ilvl w:val="0"/>
+          <w:numId w:val="2"/>
+        </w:numPr>
+        <w:spacing w:after="60"/>
+      </w:pPr>
+      <w:r>
+        <w:rPr>
+          <w:rFonts w:ascii="Calibri" w:cs="Calibri" w:eastAsia="Calibri" w:hAnsi="Calibri"/>
+        </w:rPr>
+        <w:t xml:space="preserve">El riesgo puede ser </w:t>
+      </w:r>
+      <w:r>
+        <w:rPr>
+          <w:rFonts w:ascii="Calibri" w:cs="Calibri" w:eastAsia="Calibri" w:hAnsi="Calibri"/>
+          <w:b/>
+          <w:bCs/>
+        </w:rPr>
+        <w:t xml:space="preserve">interno, externo o ambos</w:t>
+      </w:r>
+      <w:r>
+        <w:rPr>
+          <w:rFonts w:ascii="Calibri" w:cs="Calibri" w:eastAsia="Calibri" w:hAnsi="Calibri"/>
+        </w:rPr>
+        <w:t xml:space="preserve">.</w:t>
+      </w:r>
+    </w:p>
+    <w:p>
+      <w:pPr>
+        <w:pStyle w:val="ListParagraph"/>
+        <w:numPr>
+          <w:ilvl w:val="0"/>
+          <w:numId w:val="2"/>
+        </w:numPr>
+        <w:spacing w:after="60"/>
+      </w:pPr>
+      <w:r>
+        <w:rPr>
+          <w:rFonts w:ascii="Calibri" w:cs="Calibri" w:eastAsia="Calibri" w:hAnsi="Calibri"/>
+        </w:rPr>
+        <w:t xml:space="preserve">Su impacto puede afectar a toda la organización y a otras entidades externas.</w:t>
+      </w:r>
+    </w:p>
+    <w:p>
+      <w:pPr>
+        <w:spacing w:after="80" w:before="160"/>
+      </w:pPr>
+      <w:r>
+        <w:rPr>
+          <w:rFonts w:ascii="Calibri" w:cs="Calibri" w:eastAsia="Calibri" w:hAnsi="Calibri"/>
+          <w:b/>
+          <w:bCs/>
+        </w:rPr>
+        <w:t xml:space="preserve">Proceso de administración de riesgos</w:t>
+      </w:r>
+    </w:p>
+    <w:tbl>
+      <w:tblPr>
+        <w:tblW w:type="dxa" w:w="9360"/>
+        <w:tblBorders>
+          <w:top w:val="single" w:color="auto" w:sz="4"/>
+          <w:left w:val="single" w:color="auto" w:sz="4"/>
+          <w:bottom w:val="single" w:color="auto" w:sz="4"/>
+          <w:right w:val="single" w:color="auto" w:sz="4"/>
+          <w:insideH w:val="single" w:color="auto" w:sz="4"/>
+          <w:insideV w:val="single" w:color="auto" w:sz="4"/>
+        </w:tblBorders>
+      </w:tblPr>
+      <w:tblGrid>
+        <w:gridCol w:w="900"/>
+        <w:gridCol w:w="8460"/>
+      </w:tblGrid>
+      <w:tr>
+        <w:trPr>
+          <w:tblHeader/>
+        </w:trPr>
+        <w:tc>
+          <w:tcPr>
+            <w:tcW w:type="dxa" w:w="900"/>
+            <w:tcBorders>
+              <w:top w:val="single" w:color="000000" w:sz="4"/>
+              <w:left w:val="single" w:color="000000" w:sz="4"/>
+              <w:bottom w:val="single" w:color="000000" w:sz="4"/>
+              <w:right w:val="single" w:color="000000" w:sz="4"/>
+            </w:tcBorders>
+            <w:shd w:fill="D9D9D9" w:val="clear"/>
+            <w:tcMar>
+              <w:top w:type="dxa" w:w="60"/>
+              <w:left w:type="dxa" w:w="100"/>
+              <w:bottom w:type="dxa" w:w="60"/>
+              <w:right w:type="dxa" w:w="100"/>
+            </w:tcMar>
+          </w:tcPr>
+          <w:p>
+            <w:r>
+              <w:rPr>
+                <w:rFonts w:ascii="Calibri" w:cs="Calibri" w:eastAsia="Calibri" w:hAnsi="Calibri"/>
+                <w:b/>
+                <w:bCs/>
+                <w:color w:val="000000"/>
+              </w:rPr>
+              <w:t xml:space="preserve">Paso</w:t>
+            </w:r>
+          </w:p>
+        </w:tc>
+        <w:tc>
+          <w:tcPr>
+            <w:tcW w:type="dxa" w:w="8460"/>
+            <w:tcBorders>
+              <w:top w:val="single" w:color="000000" w:sz="4"/>
+              <w:left w:val="single" w:color="000000" w:sz="4"/>
+              <w:bottom w:val="single" w:color="000000" w:sz="4"/>
+              <w:right w:val="single" w:color="000000" w:sz="4"/>
+            </w:tcBorders>
+            <w:shd w:fill="D9D9D9" w:val="clear"/>
+            <w:tcMar>
+              <w:top w:type="dxa" w:w="60"/>
+              <w:left w:type="dxa" w:w="100"/>
+              <w:bottom w:type="dxa" w:w="60"/>
+              <w:right w:type="dxa" w:w="100"/>
+            </w:tcMar>
+          </w:tcPr>
+          <w:p>
+            <w:r>
+              <w:rPr>
+                <w:rFonts w:ascii="Calibri" w:cs="Calibri" w:eastAsia="Calibri" w:hAnsi="Calibri"/>
+                <w:b/>
+                <w:bCs/>
+                <w:color w:val="000000"/>
+              </w:rPr>
+              <w:t xml:space="preserve">Qué se hace</w:t>
+            </w:r>
+          </w:p>
+        </w:tc>
+      </w:tr>
+      <w:tr>
+        <w:tc>
+          <w:tcPr>
+            <w:tcW w:type="dxa" w:w="900"/>
+            <w:tcBorders>
+              <w:top w:val="single" w:color="000000" w:sz="4"/>
+              <w:left w:val="single" w:color="000000" w:sz="4"/>
+              <w:bottom w:val="single" w:color="000000" w:sz="4"/>
+              <w:right w:val="single" w:color="000000" w:sz="4"/>
+            </w:tcBorders>
+            <w:shd w:fill="FFFFFF" w:val="clear"/>
+            <w:tcMar>
+              <w:top w:type="dxa" w:w="60"/>
+              <w:left w:type="dxa" w:w="100"/>
+              <w:bottom w:type="dxa" w:w="60"/>
+              <w:right w:type="dxa" w:w="100"/>
+            </w:tcMar>
+          </w:tcPr>
+          <w:p>
+            <w:r>
+              <w:rPr>
+                <w:rFonts w:ascii="Calibri" w:cs="Calibri" w:eastAsia="Calibri" w:hAnsi="Calibri"/>
+                <w:b/>
+                <w:bCs/>
+              </w:rPr>
+              <w:t xml:space="preserve">1</w:t>
+            </w:r>
+          </w:p>
+        </w:tc>
+        <w:tc>
+          <w:tcPr>
+            <w:tcW w:type="dxa" w:w="8460"/>
+            <w:tcBorders>
+              <w:top w:val="single" w:color="000000" w:sz="4"/>
+              <w:left w:val="single" w:color="000000" w:sz="4"/>
+              <w:bottom w:val="single" w:color="000000" w:sz="4"/>
+              <w:right w:val="single" w:color="000000" w:sz="4"/>
+            </w:tcBorders>
+            <w:shd w:fill="FFFFFF" w:val="clear"/>
+            <w:tcMar>
+              <w:top w:type="dxa" w:w="60"/>
+              <w:left w:type="dxa" w:w="100"/>
+              <w:bottom w:type="dxa" w:w="60"/>
+              <w:right w:type="dxa" w:w="100"/>
+            </w:tcMar>
+          </w:tcPr>
+          <w:p>
+            <w:r>
+              <w:rPr>
+                <w:rFonts w:ascii="Calibri" w:cs="Calibri" w:eastAsia="Calibri" w:hAnsi="Calibri"/>
+                <w:b/>
+                <w:bCs/>
+              </w:rPr>
+              <w:t xml:space="preserve">Enmarcar</w:t>
+            </w:r>
+            <w:r>
+              <w:rPr>
+                <w:rFonts w:ascii="Calibri" w:cs="Calibri" w:eastAsia="Calibri" w:hAnsi="Calibri"/>
+              </w:rPr>
+              <w:t xml:space="preserve"> el riesgo</w:t>
+            </w:r>
+          </w:p>
+        </w:tc>
+      </w:tr>
+      <w:tr>
+        <w:tc>
+          <w:tcPr>
+            <w:tcW w:type="dxa" w:w="900"/>
+            <w:tcBorders>
+              <w:top w:val="single" w:color="000000" w:sz="4"/>
+              <w:left w:val="single" w:color="000000" w:sz="4"/>
+              <w:bottom w:val="single" w:color="000000" w:sz="4"/>
+              <w:right w:val="single" w:color="000000" w:sz="4"/>
+            </w:tcBorders>
+            <w:shd w:fill="FFFFFF" w:val="clear"/>
+            <w:tcMar>
+              <w:top w:type="dxa" w:w="60"/>
+              <w:left w:type="dxa" w:w="100"/>
+              <w:bottom w:type="dxa" w:w="60"/>
+              <w:right w:type="dxa" w:w="100"/>
+            </w:tcMar>
+          </w:tcPr>
+          <w:p>
+            <w:r>
+              <w:rPr>
+                <w:rFonts w:ascii="Calibri" w:cs="Calibri" w:eastAsia="Calibri" w:hAnsi="Calibri"/>
+                <w:b/>
+                <w:bCs/>
+              </w:rPr>
+              <w:t xml:space="preserve">2</w:t>
+            </w:r>
+          </w:p>
+        </w:tc>
+        <w:tc>
+          <w:tcPr>
+            <w:tcW w:type="dxa" w:w="8460"/>
+            <w:tcBorders>
+              <w:top w:val="single" w:color="000000" w:sz="4"/>
+              <w:left w:val="single" w:color="000000" w:sz="4"/>
+              <w:bottom w:val="single" w:color="000000" w:sz="4"/>
+              <w:right w:val="single" w:color="000000" w:sz="4"/>
+            </w:tcBorders>
+            <w:shd w:fill="FFFFFF" w:val="clear"/>
+            <w:tcMar>
+              <w:top w:type="dxa" w:w="60"/>
+              <w:left w:type="dxa" w:w="100"/>
+              <w:bottom w:type="dxa" w:w="60"/>
+              <w:right w:type="dxa" w:w="100"/>
+            </w:tcMar>
+          </w:tcPr>
+          <w:p>
+            <w:r>
+              <w:rPr>
+                <w:rFonts w:ascii="Calibri" w:cs="Calibri" w:eastAsia="Calibri" w:hAnsi="Calibri"/>
+                <w:b/>
+                <w:bCs/>
+              </w:rPr>
+              <w:t xml:space="preserve">Evaluar</w:t>
+            </w:r>
+            <w:r>
+              <w:rPr>
+                <w:rFonts w:ascii="Calibri" w:cs="Calibri" w:eastAsia="Calibri" w:hAnsi="Calibri"/>
+              </w:rPr>
+              <w:t xml:space="preserve"> el riesgo</w:t>
+            </w:r>
+          </w:p>
+        </w:tc>
+      </w:tr>
+      <w:tr>
+        <w:tc>
+          <w:tcPr>
+            <w:tcW w:type="dxa" w:w="900"/>
+            <w:tcBorders>
+              <w:top w:val="single" w:color="000000" w:sz="4"/>
+              <w:left w:val="single" w:color="000000" w:sz="4"/>
+              <w:bottom w:val="single" w:color="000000" w:sz="4"/>
+              <w:right w:val="single" w:color="000000" w:sz="4"/>
+            </w:tcBorders>
+            <w:shd w:fill="FFFFFF" w:val="clear"/>
+            <w:tcMar>
+              <w:top w:type="dxa" w:w="60"/>
+              <w:left w:type="dxa" w:w="100"/>
+              <w:bottom w:type="dxa" w:w="60"/>
+              <w:right w:type="dxa" w:w="100"/>
+            </w:tcMar>
+          </w:tcPr>
+          <w:p>
+            <w:r>
+              <w:rPr>
+                <w:rFonts w:ascii="Calibri" w:cs="Calibri" w:eastAsia="Calibri" w:hAnsi="Calibri"/>
+                <w:b/>
+                <w:bCs/>
+              </w:rPr>
+              <w:t xml:space="preserve">3</w:t>
+            </w:r>
+          </w:p>
+        </w:tc>
+        <w:tc>
+          <w:tcPr>
+            <w:tcW w:type="dxa" w:w="8460"/>
+            <w:tcBorders>
+              <w:top w:val="single" w:color="000000" w:sz="4"/>
+              <w:left w:val="single" w:color="000000" w:sz="4"/>
+              <w:bottom w:val="single" w:color="000000" w:sz="4"/>
+              <w:right w:val="single" w:color="000000" w:sz="4"/>
+            </w:tcBorders>
+            <w:shd w:fill="FFFFFF" w:val="clear"/>
+            <w:tcMar>
+              <w:top w:type="dxa" w:w="60"/>
+              <w:left w:type="dxa" w:w="100"/>
+              <w:bottom w:type="dxa" w:w="60"/>
+              <w:right w:type="dxa" w:w="100"/>
+            </w:tcMar>
+          </w:tcPr>
+          <w:p>
+            <w:r>
+              <w:rPr>
+                <w:rFonts w:ascii="Calibri" w:cs="Calibri" w:eastAsia="Calibri" w:hAnsi="Calibri"/>
+                <w:b/>
+                <w:bCs/>
+              </w:rPr>
+              <w:t xml:space="preserve">Responder</w:t>
+            </w:r>
+            <w:r>
+              <w:rPr>
+                <w:rFonts w:ascii="Calibri" w:cs="Calibri" w:eastAsia="Calibri" w:hAnsi="Calibri"/>
+              </w:rPr>
+              <w:t xml:space="preserve"> al riesgo</w:t>
+            </w:r>
+          </w:p>
+        </w:tc>
+      </w:tr>
+    </w:tbl>
+    <w:p>
+      <w:pPr>
+        <w:spacing w:after="80"/>
+      </w:pPr>
+    </w:p>
+    <w:p>
+      <w:pPr>
+        <w:spacing w:after="120" w:before="280"/>
+      </w:pPr>
+      <w:r>
+        <w:rPr>
+          <w:rFonts w:ascii="Calibri" w:cs="Calibri" w:eastAsia="Calibri" w:hAnsi="Calibri"/>
+          <w:b/>
+          <w:bCs/>
+        </w:rPr>
+        <w:t xml:space="preserve">2. Evaluación de riesgos</w:t>
+      </w:r>
+    </w:p>
+    <w:p>
+      <w:pPr>
+        <w:spacing w:after="80" w:before="160"/>
+      </w:pPr>
+      <w:r>
+        <w:rPr>
+          <w:rFonts w:ascii="Calibri" w:cs="Calibri" w:eastAsia="Calibri" w:hAnsi="Calibri"/>
+          <w:b/>
+          <w:bCs/>
+        </w:rPr>
+        <w:t xml:space="preserve">Evaluación de amenazas</w:t>
+      </w:r>
+    </w:p>
+    <w:p>
+      <w:pPr>
+        <w:pStyle w:val="ListParagraph"/>
+        <w:numPr>
+          <w:ilvl w:val="0"/>
+          <w:numId w:val="2"/>
+        </w:numPr>
+        <w:spacing w:after="60"/>
+      </w:pPr>
+      <w:r>
+        <w:rPr>
+          <w:rFonts w:ascii="Calibri" w:cs="Calibri" w:eastAsia="Calibri" w:hAnsi="Calibri"/>
+        </w:rPr>
+        <w:t xml:space="preserve">Es la </w:t>
+      </w:r>
+      <w:r>
+        <w:rPr>
+          <w:rFonts w:ascii="Calibri" w:cs="Calibri" w:eastAsia="Calibri" w:hAnsi="Calibri"/>
+          <w:b/>
+          <w:bCs/>
+        </w:rPr>
+        <w:t xml:space="preserve">base</w:t>
+      </w:r>
+      <w:r>
+        <w:rPr>
+          <w:rFonts w:ascii="Calibri" w:cs="Calibri" w:eastAsia="Calibri" w:hAnsi="Calibri"/>
+        </w:rPr>
+        <w:t xml:space="preserve"> de la evaluación de riesgos.</w:t>
+      </w:r>
+    </w:p>
+    <w:p>
+      <w:pPr>
+        <w:pStyle w:val="ListParagraph"/>
+        <w:numPr>
+          <w:ilvl w:val="0"/>
+          <w:numId w:val="2"/>
+        </w:numPr>
+        <w:spacing w:after="60"/>
+      </w:pPr>
+      <w:r>
+        <w:rPr>
+          <w:rFonts w:ascii="Calibri" w:cs="Calibri" w:eastAsia="Calibri" w:hAnsi="Calibri"/>
+          <w:b/>
+          <w:bCs/>
+        </w:rPr>
+        <w:t xml:space="preserve">Amenaza:</w:t>
+      </w:r>
+      <w:r>
+        <w:rPr>
+          <w:rFonts w:ascii="Calibri" w:cs="Calibri" w:eastAsia="Calibri" w:hAnsi="Calibri"/>
+        </w:rPr>
+        <w:t xml:space="preserve"> el potencial de que una vulnerabilidad sea identificada y explotada.</w:t>
+      </w:r>
+    </w:p>
+    <w:p>
+      <w:pPr>
+        <w:pStyle w:val="ListParagraph"/>
+        <w:numPr>
+          <w:ilvl w:val="0"/>
+          <w:numId w:val="2"/>
+        </w:numPr>
+        <w:spacing w:after="60"/>
+      </w:pPr>
+      <w:r>
+        <w:rPr>
+          <w:rFonts w:ascii="Calibri" w:cs="Calibri" w:eastAsia="Calibri" w:hAnsi="Calibri"/>
+          <w:b/>
+          <w:bCs/>
+        </w:rPr>
+        <w:t xml:space="preserve">Vector de amenaza:</w:t>
+      </w:r>
+      <w:r>
+        <w:rPr>
+          <w:rFonts w:ascii="Calibri" w:cs="Calibri" w:eastAsia="Calibri" w:hAnsi="Calibri"/>
+        </w:rPr>
+        <w:t xml:space="preserve"> la ruta que usa un atacante para afectar el objetivo.</w:t>
+      </w:r>
+    </w:p>
+    <w:p>
+      <w:pPr>
+        <w:pStyle w:val="ListParagraph"/>
+        <w:numPr>
+          <w:ilvl w:val="0"/>
+          <w:numId w:val="2"/>
+        </w:numPr>
+        <w:spacing w:after="60"/>
+      </w:pPr>
+      <w:r>
+        <w:rPr>
+          <w:rFonts w:ascii="Calibri" w:cs="Calibri" w:eastAsia="Calibri" w:hAnsi="Calibri"/>
+        </w:rPr>
+        <w:t xml:space="preserve">Las fuentes de amenazas se clasifican en: </w:t>
+      </w:r>
+      <w:r>
+        <w:rPr>
+          <w:rFonts w:ascii="Calibri" w:cs="Calibri" w:eastAsia="Calibri" w:hAnsi="Calibri"/>
+          <w:b/>
+          <w:bCs/>
+        </w:rPr>
+        <w:t xml:space="preserve">adversarios, accidentales, estructurales y ambientales</w:t>
+      </w:r>
+      <w:r>
+        <w:rPr>
+          <w:rFonts w:ascii="Calibri" w:cs="Calibri" w:eastAsia="Calibri" w:hAnsi="Calibri"/>
+        </w:rPr>
+        <w:t xml:space="preserve">. Pueden ser internas o externas.</w:t>
+      </w:r>
+    </w:p>
+    <w:p>
+      <w:pPr>
+        <w:pStyle w:val="ListParagraph"/>
+        <w:numPr>
+          <w:ilvl w:val="0"/>
+          <w:numId w:val="2"/>
+        </w:numPr>
+        <w:spacing w:after="60"/>
+      </w:pPr>
+      <w:r>
+        <w:rPr>
+          <w:rFonts w:ascii="Calibri" w:cs="Calibri" w:eastAsia="Calibri" w:hAnsi="Calibri"/>
+        </w:rPr>
+        <w:t xml:space="preserve">Las organizaciones examinan sus riesgos operativos con una </w:t>
+      </w:r>
+      <w:r>
+        <w:rPr>
+          <w:rFonts w:ascii="Calibri" w:cs="Calibri" w:eastAsia="Calibri" w:hAnsi="Calibri"/>
+          <w:b/>
+          <w:bCs/>
+        </w:rPr>
+        <w:t xml:space="preserve">evaluación de riesgos</w:t>
+      </w:r>
+      <w:r>
+        <w:rPr>
+          <w:rFonts w:ascii="Calibri" w:cs="Calibri" w:eastAsia="Calibri" w:hAnsi="Calibri"/>
+        </w:rPr>
+        <w:t xml:space="preserve"> para garantizar que la administración de riesgos cumpla con todos sus objetivos comerciales. Determinan si la amenaza es </w:t>
+      </w:r>
+      <w:r>
+        <w:rPr>
+          <w:rFonts w:ascii="Calibri" w:cs="Calibri" w:eastAsia="Calibri" w:hAnsi="Calibri"/>
+          <w:b/>
+          <w:bCs/>
+        </w:rPr>
+        <w:t xml:space="preserve">baja, aceptable o alta</w:t>
+      </w:r>
+      <w:r>
+        <w:rPr>
+          <w:rFonts w:ascii="Calibri" w:cs="Calibri" w:eastAsia="Calibri" w:hAnsi="Calibri"/>
+        </w:rPr>
+        <w:t xml:space="preserve">.</w:t>
+      </w:r>
+    </w:p>
+    <w:p>
+      <w:pPr>
+        <w:spacing w:after="80" w:before="160"/>
+      </w:pPr>
+      <w:r>
+        <w:rPr>
+          <w:rFonts w:ascii="Calibri" w:cs="Calibri" w:eastAsia="Calibri" w:hAnsi="Calibri"/>
+          <w:b/>
+          <w:bCs/>
+        </w:rPr>
+        <w:t xml:space="preserve">Los 4 objetivos de un análisis de riesgos</w:t>
+      </w:r>
+    </w:p>
+    <w:p>
+      <w:pPr>
+        <w:pStyle w:val="ListParagraph"/>
+        <w:numPr>
+          <w:ilvl w:val="0"/>
+          <w:numId w:val="2"/>
+        </w:numPr>
+        <w:spacing w:after="60"/>
+      </w:pPr>
+      <w:r>
+        <w:rPr>
+          <w:rFonts w:ascii="Calibri" w:cs="Calibri" w:eastAsia="Calibri" w:hAnsi="Calibri"/>
+        </w:rPr>
+        <w:t xml:space="preserve">Identificar los </w:t>
+      </w:r>
+      <w:r>
+        <w:rPr>
+          <w:rFonts w:ascii="Calibri" w:cs="Calibri" w:eastAsia="Calibri" w:hAnsi="Calibri"/>
+          <w:b/>
+          <w:bCs/>
+        </w:rPr>
+        <w:t xml:space="preserve">activos</w:t>
+      </w:r>
+      <w:r>
+        <w:rPr>
+          <w:rFonts w:ascii="Calibri" w:cs="Calibri" w:eastAsia="Calibri" w:hAnsi="Calibri"/>
+        </w:rPr>
+        <w:t xml:space="preserve"> y su valor.</w:t>
+      </w:r>
+    </w:p>
+    <w:p>
+      <w:pPr>
+        <w:pStyle w:val="ListParagraph"/>
+        <w:numPr>
+          <w:ilvl w:val="0"/>
+          <w:numId w:val="2"/>
+        </w:numPr>
+        <w:spacing w:after="60"/>
+      </w:pPr>
+      <w:r>
+        <w:rPr>
+          <w:rFonts w:ascii="Calibri" w:cs="Calibri" w:eastAsia="Calibri" w:hAnsi="Calibri"/>
+        </w:rPr>
+        <w:t xml:space="preserve">Identificar </w:t>
+      </w:r>
+      <w:r>
+        <w:rPr>
+          <w:rFonts w:ascii="Calibri" w:cs="Calibri" w:eastAsia="Calibri" w:hAnsi="Calibri"/>
+          <w:b/>
+          <w:bCs/>
+        </w:rPr>
+        <w:t xml:space="preserve">vulnerabilidades y amenazas</w:t>
+      </w:r>
+      <w:r>
+        <w:rPr>
+          <w:rFonts w:ascii="Calibri" w:cs="Calibri" w:eastAsia="Calibri" w:hAnsi="Calibri"/>
+        </w:rPr>
+        <w:t xml:space="preserve">.</w:t>
+      </w:r>
+    </w:p>
+    <w:p>
+      <w:pPr>
+        <w:pStyle w:val="ListParagraph"/>
+        <w:numPr>
+          <w:ilvl w:val="0"/>
+          <w:numId w:val="2"/>
+        </w:numPr>
+        <w:spacing w:after="60"/>
+      </w:pPr>
+      <w:r>
+        <w:rPr>
+          <w:rFonts w:ascii="Calibri" w:cs="Calibri" w:eastAsia="Calibri" w:hAnsi="Calibri"/>
+          <w:b/>
+          <w:bCs/>
+        </w:rPr>
+        <w:t xml:space="preserve">Cuantificar</w:t>
+      </w:r>
+      <w:r>
+        <w:rPr>
+          <w:rFonts w:ascii="Calibri" w:cs="Calibri" w:eastAsia="Calibri" w:hAnsi="Calibri"/>
+        </w:rPr>
+        <w:t xml:space="preserve"> la probabilidad y el impacto de las amenazas identificadas.</w:t>
+      </w:r>
+    </w:p>
+    <w:p>
+      <w:pPr>
+        <w:pStyle w:val="ListParagraph"/>
+        <w:numPr>
+          <w:ilvl w:val="0"/>
+          <w:numId w:val="2"/>
+        </w:numPr>
+        <w:spacing w:after="60"/>
+      </w:pPr>
+      <w:r>
+        <w:rPr>
+          <w:rFonts w:ascii="Calibri" w:cs="Calibri" w:eastAsia="Calibri" w:hAnsi="Calibri"/>
+          <w:b/>
+          <w:bCs/>
+        </w:rPr>
+        <w:t xml:space="preserve">Equilibrar</w:t>
+      </w:r>
+      <w:r>
+        <w:rPr>
+          <w:rFonts w:ascii="Calibri" w:cs="Calibri" w:eastAsia="Calibri" w:hAnsi="Calibri"/>
+        </w:rPr>
+        <w:t xml:space="preserve"> el impacto de la amenaza con el costo de la contramedida.</w:t>
+      </w:r>
+    </w:p>
+    <w:p>
+      <w:pPr>
+        <w:spacing w:after="80" w:before="160"/>
+      </w:pPr>
+      <w:r>
+        <w:rPr>
+          <w:rFonts w:ascii="Calibri" w:cs="Calibri" w:eastAsia="Calibri" w:hAnsi="Calibri"/>
+          <w:b/>
+          <w:bCs/>
+        </w:rPr>
+        <w:t xml:space="preserve">Tipos de análisis de riesgos</w:t>
+      </w:r>
+    </w:p>
+    <w:tbl>
+      <w:tblPr>
+        <w:tblW w:type="dxa" w:w="9360"/>
+        <w:tblBorders>
+          <w:top w:val="single" w:color="auto" w:sz="4"/>
+          <w:left w:val="single" w:color="auto" w:sz="4"/>
+          <w:bottom w:val="single" w:color="auto" w:sz="4"/>
+          <w:right w:val="single" w:color="auto" w:sz="4"/>
+          <w:insideH w:val="single" w:color="auto" w:sz="4"/>
+          <w:insideV w:val="single" w:color="auto" w:sz="4"/>
+        </w:tblBorders>
+      </w:tblPr>
+      <w:tblGrid>
+        <w:gridCol w:w="2400"/>
+        <w:gridCol w:w="6960"/>
+      </w:tblGrid>
+      <w:tr>
+        <w:trPr>
+          <w:tblHeader/>
+        </w:trPr>
+        <w:tc>
+          <w:tcPr>
+            <w:tcW w:type="dxa" w:w="2400"/>
+            <w:tcBorders>
+              <w:top w:val="single" w:color="000000" w:sz="4"/>
+              <w:left w:val="single" w:color="000000" w:sz="4"/>
+              <w:bottom w:val="single" w:color="000000" w:sz="4"/>
+              <w:right w:val="single" w:color="000000" w:sz="4"/>
+            </w:tcBorders>
+            <w:shd w:fill="D9D9D9" w:val="clear"/>
+            <w:tcMar>
+              <w:top w:type="dxa" w:w="60"/>
+              <w:left w:type="dxa" w:w="100"/>
+              <w:bottom w:type="dxa" w:w="60"/>
+              <w:right w:type="dxa" w:w="100"/>
+            </w:tcMar>
+          </w:tcPr>
+          <w:p>
+            <w:r>
+              <w:rPr>
+                <w:rFonts w:ascii="Calibri" w:cs="Calibri" w:eastAsia="Calibri" w:hAnsi="Calibri"/>
+                <w:b/>
+                <w:bCs/>
+                <w:color w:val="000000"/>
+              </w:rPr>
+              <w:t xml:space="preserve">Análisis</w:t>
+            </w:r>
+          </w:p>
+        </w:tc>
+        <w:tc>
+          <w:tcPr>
+            <w:tcW w:type="dxa" w:w="6960"/>
+            <w:tcBorders>
+              <w:top w:val="single" w:color="000000" w:sz="4"/>
+              <w:left w:val="single" w:color="000000" w:sz="4"/>
+              <w:bottom w:val="single" w:color="000000" w:sz="4"/>
+              <w:right w:val="single" w:color="000000" w:sz="4"/>
+            </w:tcBorders>
+            <w:shd w:fill="D9D9D9" w:val="clear"/>
+            <w:tcMar>
+              <w:top w:type="dxa" w:w="60"/>
+              <w:left w:type="dxa" w:w="100"/>
+              <w:bottom w:type="dxa" w:w="60"/>
+              <w:right w:type="dxa" w:w="100"/>
+            </w:tcMar>
+          </w:tcPr>
+          <w:p>
+            <w:r>
+              <w:rPr>
+                <w:rFonts w:ascii="Calibri" w:cs="Calibri" w:eastAsia="Calibri" w:hAnsi="Calibri"/>
+                <w:b/>
+                <w:bCs/>
+                <w:color w:val="000000"/>
+              </w:rPr>
+              <w:t xml:space="preserve">Cómo funciona</w:t>
+            </w:r>
+          </w:p>
+        </w:tc>
+      </w:tr>
+      <w:tr>
+        <w:tc>
+          <w:tcPr>
+            <w:tcW w:type="dxa" w:w="2400"/>
+            <w:tcBorders>
+              <w:top w:val="single" w:color="000000" w:sz="4"/>
+              <w:left w:val="single" w:color="000000" w:sz="4"/>
+              <w:bottom w:val="single" w:color="000000" w:sz="4"/>
+              <w:right w:val="single" w:color="000000" w:sz="4"/>
+            </w:tcBorders>
+            <w:shd w:fill="FFFFFF" w:val="clear"/>
+            <w:tcMar>
+              <w:top w:type="dxa" w:w="60"/>
+              <w:left w:type="dxa" w:w="100"/>
+              <w:bottom w:type="dxa" w:w="60"/>
+              <w:right w:type="dxa" w:w="100"/>
+            </w:tcMar>
+          </w:tcPr>
+          <w:p>
+            <w:r>
+              <w:rPr>
+                <w:rFonts w:ascii="Calibri" w:cs="Calibri" w:eastAsia="Calibri" w:hAnsi="Calibri"/>
+                <w:b/>
+                <w:bCs/>
+              </w:rPr>
+              <w:t xml:space="preserve">Cuantitativo</w:t>
+            </w:r>
+          </w:p>
+        </w:tc>
+        <w:tc>
+          <w:tcPr>
+            <w:tcW w:type="dxa" w:w="6960"/>
+            <w:tcBorders>
+              <w:top w:val="single" w:color="000000" w:sz="4"/>
+              <w:left w:val="single" w:color="000000" w:sz="4"/>
+              <w:bottom w:val="single" w:color="000000" w:sz="4"/>
+              <w:right w:val="single" w:color="000000" w:sz="4"/>
+            </w:tcBorders>
+            <w:shd w:fill="FFFFFF" w:val="clear"/>
+            <w:tcMar>
+              <w:top w:type="dxa" w:w="60"/>
+              <w:left w:type="dxa" w:w="100"/>
+              <w:bottom w:type="dxa" w:w="60"/>
+              <w:right w:type="dxa" w:w="100"/>
+            </w:tcMar>
+          </w:tcPr>
+          <w:p>
+            <w:r>
+              <w:rPr>
+                <w:rFonts w:ascii="Calibri" w:cs="Calibri" w:eastAsia="Calibri" w:hAnsi="Calibri"/>
+              </w:rPr>
+              <w:t xml:space="preserve">Asigna </w:t>
+            </w:r>
+            <w:r>
+              <w:rPr>
+                <w:rFonts w:ascii="Calibri" w:cs="Calibri" w:eastAsia="Calibri" w:hAnsi="Calibri"/>
+                <w:b/>
+                <w:bCs/>
+              </w:rPr>
+              <w:t xml:space="preserve">números</w:t>
+            </w:r>
+            <w:r>
+              <w:rPr>
+                <w:rFonts w:ascii="Calibri" w:cs="Calibri" w:eastAsia="Calibri" w:hAnsi="Calibri"/>
+              </w:rPr>
+              <w:t xml:space="preserve"> al análisis de riesgos. Usa fórmulas que requieren: </w:t>
+            </w:r>
+            <w:r>
+              <w:rPr>
+                <w:rFonts w:ascii="Calibri" w:cs="Calibri" w:eastAsia="Calibri" w:hAnsi="Calibri"/>
+                <w:b/>
+                <w:bCs/>
+              </w:rPr>
+              <w:t xml:space="preserve">valor del activo, factor de exposición, expectativa de pérdida única, tasa de ocurrencia anual y expectativa de pérdida anual</w:t>
+            </w:r>
+          </w:p>
+        </w:tc>
+      </w:tr>
+      <w:tr>
+        <w:tc>
+          <w:tcPr>
+            <w:tcW w:type="dxa" w:w="2400"/>
+            <w:tcBorders>
+              <w:top w:val="single" w:color="000000" w:sz="4"/>
+              <w:left w:val="single" w:color="000000" w:sz="4"/>
+              <w:bottom w:val="single" w:color="000000" w:sz="4"/>
+              <w:right w:val="single" w:color="000000" w:sz="4"/>
+            </w:tcBorders>
+            <w:shd w:fill="FFFFFF" w:val="clear"/>
+            <w:tcMar>
+              <w:top w:type="dxa" w:w="60"/>
+              <w:left w:type="dxa" w:w="100"/>
+              <w:bottom w:type="dxa" w:w="60"/>
+              <w:right w:type="dxa" w:w="100"/>
+            </w:tcMar>
+          </w:tcPr>
+          <w:p>
+            <w:r>
+              <w:rPr>
+                <w:rFonts w:ascii="Calibri" w:cs="Calibri" w:eastAsia="Calibri" w:hAnsi="Calibri"/>
+                <w:b/>
+                <w:bCs/>
+              </w:rPr>
+              <w:t xml:space="preserve">Cualitativo</w:t>
+            </w:r>
+          </w:p>
+        </w:tc>
+        <w:tc>
+          <w:tcPr>
+            <w:tcW w:type="dxa" w:w="6960"/>
+            <w:tcBorders>
+              <w:top w:val="single" w:color="000000" w:sz="4"/>
+              <w:left w:val="single" w:color="000000" w:sz="4"/>
+              <w:bottom w:val="single" w:color="000000" w:sz="4"/>
+              <w:right w:val="single" w:color="000000" w:sz="4"/>
+            </w:tcBorders>
+            <w:shd w:fill="FFFFFF" w:val="clear"/>
+            <w:tcMar>
+              <w:top w:type="dxa" w:w="60"/>
+              <w:left w:type="dxa" w:w="100"/>
+              <w:bottom w:type="dxa" w:w="60"/>
+              <w:right w:type="dxa" w:w="100"/>
+            </w:tcMar>
+          </w:tcPr>
+          <w:p>
+            <w:r>
+              <w:rPr>
+                <w:rFonts w:ascii="Calibri" w:cs="Calibri" w:eastAsia="Calibri" w:hAnsi="Calibri"/>
+              </w:rPr>
+              <w:t xml:space="preserve">Usa </w:t>
+            </w:r>
+            <w:r>
+              <w:rPr>
+                <w:rFonts w:ascii="Calibri" w:cs="Calibri" w:eastAsia="Calibri" w:hAnsi="Calibri"/>
+                <w:b/>
+                <w:bCs/>
+              </w:rPr>
+              <w:t xml:space="preserve">opiniones y escenarios</w:t>
+            </w:r>
+            <w:r>
+              <w:rPr>
+                <w:rFonts w:ascii="Calibri" w:cs="Calibri" w:eastAsia="Calibri" w:hAnsi="Calibri"/>
+              </w:rPr>
+              <w:t xml:space="preserve"> que trazan la </w:t>
+            </w:r>
+            <w:r>
+              <w:rPr>
+                <w:rFonts w:ascii="Calibri" w:cs="Calibri" w:eastAsia="Calibri" w:hAnsi="Calibri"/>
+                <w:b/>
+                <w:bCs/>
+              </w:rPr>
+              <w:t xml:space="preserve">probabilidad</w:t>
+            </w:r>
+            <w:r>
+              <w:rPr>
+                <w:rFonts w:ascii="Calibri" w:cs="Calibri" w:eastAsia="Calibri" w:hAnsi="Calibri"/>
+              </w:rPr>
+              <w:t xml:space="preserve"> de una amenaza contra su </w:t>
+            </w:r>
+            <w:r>
+              <w:rPr>
+                <w:rFonts w:ascii="Calibri" w:cs="Calibri" w:eastAsia="Calibri" w:hAnsi="Calibri"/>
+                <w:b/>
+                <w:bCs/>
+              </w:rPr>
+              <w:t xml:space="preserve">impacto</w:t>
+            </w:r>
+          </w:p>
+        </w:tc>
+      </w:tr>
+    </w:tbl>
+    <w:p>
+      <w:pPr>
+        <w:spacing w:after="80"/>
+      </w:pPr>
+    </w:p>
+    <w:p>
+      <w:pPr>
+        <w:spacing w:after="80" w:before="160"/>
+      </w:pPr>
+      <w:r>
+        <w:rPr>
+          <w:rFonts w:ascii="Calibri" w:cs="Calibri" w:eastAsia="Calibri" w:hAnsi="Calibri"/>
+          <w:b/>
+          <w:bCs/>
+        </w:rPr>
+        <w:t xml:space="preserve">Matriz de riesgos</w:t>
+      </w:r>
+    </w:p>
+    <w:p>
+      <w:pPr>
+        <w:pStyle w:val="ListParagraph"/>
+        <w:numPr>
+          <w:ilvl w:val="0"/>
+          <w:numId w:val="2"/>
+        </w:numPr>
+        <w:spacing w:after="60"/>
+      </w:pPr>
+      <w:r>
+        <w:rPr>
+          <w:rFonts w:ascii="Calibri" w:cs="Calibri" w:eastAsia="Calibri" w:hAnsi="Calibri"/>
+        </w:rPr>
+        <w:t xml:space="preserve">Herramienta que ayuda a </w:t>
+      </w:r>
+      <w:r>
+        <w:rPr>
+          <w:rFonts w:ascii="Calibri" w:cs="Calibri" w:eastAsia="Calibri" w:hAnsi="Calibri"/>
+          <w:b/>
+          <w:bCs/>
+        </w:rPr>
+        <w:t xml:space="preserve">priorizar</w:t>
+      </w:r>
+      <w:r>
+        <w:rPr>
+          <w:rFonts w:ascii="Calibri" w:cs="Calibri" w:eastAsia="Calibri" w:hAnsi="Calibri"/>
+        </w:rPr>
+        <w:t xml:space="preserve"> los riesgos para decidir a cuáles debe la organización desarrollar una respuesta.</w:t>
+      </w:r>
+    </w:p>
+    <w:p>
+      <w:pPr>
+        <w:pStyle w:val="ListParagraph"/>
+        <w:numPr>
+          <w:ilvl w:val="0"/>
+          <w:numId w:val="2"/>
+        </w:numPr>
+        <w:spacing w:after="60"/>
+      </w:pPr>
+      <w:r>
+        <w:rPr>
+          <w:rFonts w:ascii="Calibri" w:cs="Calibri" w:eastAsia="Calibri" w:hAnsi="Calibri"/>
+        </w:rPr>
+        <w:t xml:space="preserve">Los resultados se pueden clasificar y usar como guía para decidir si la organización toma alguna medida.</w:t>
+      </w:r>
+    </w:p>
+    <w:p>
+      <w:pPr>
+        <w:spacing w:after="80" w:before="160"/>
+      </w:pPr>
+      <w:r>
+        <w:rPr>
+          <w:rFonts w:ascii="Calibri" w:cs="Calibri" w:eastAsia="Calibri" w:hAnsi="Calibri"/>
+          <w:b/>
+          <w:bCs/>
+        </w:rPr>
+        <w:t xml:space="preserve">Mitigación de riesgos</w:t>
+      </w:r>
+    </w:p>
+    <w:p>
+      <w:pPr>
+        <w:pStyle w:val="ListParagraph"/>
+        <w:numPr>
+          <w:ilvl w:val="0"/>
+          <w:numId w:val="2"/>
+        </w:numPr>
+        <w:spacing w:after="60"/>
+      </w:pPr>
+      <w:r>
+        <w:rPr>
+          <w:rFonts w:ascii="Calibri" w:cs="Calibri" w:eastAsia="Calibri" w:hAnsi="Calibri"/>
+        </w:rPr>
+        <w:t xml:space="preserve">La buena mitigación busca un </w:t>
+      </w:r>
+      <w:r>
+        <w:rPr>
+          <w:rFonts w:ascii="Calibri" w:cs="Calibri" w:eastAsia="Calibri" w:hAnsi="Calibri"/>
+          <w:b/>
+          <w:bCs/>
+        </w:rPr>
+        <w:t xml:space="preserve">equilibrio</w:t>
+      </w:r>
+      <w:r>
+        <w:rPr>
+          <w:rFonts w:ascii="Calibri" w:cs="Calibri" w:eastAsia="Calibri" w:hAnsi="Calibri"/>
+        </w:rPr>
+        <w:t xml:space="preserve"> entre el impacto negativo de las contramedidas y controles y el beneficio de reducir el riesgo.</w:t>
+      </w:r>
+    </w:p>
+    <w:p>
+      <w:pPr>
+        <w:spacing w:after="100"/>
+      </w:pPr>
+      <w:r>
+        <w:rPr>
+          <w:rFonts w:ascii="Calibri" w:cs="Calibri" w:eastAsia="Calibri" w:hAnsi="Calibri"/>
+        </w:rPr>
+        <w:t xml:space="preserve">Enfoques posibles:</w:t>
+      </w:r>
+    </w:p>
+    <w:tbl>
+      <w:tblPr>
+        <w:tblW w:type="dxa" w:w="9360"/>
+        <w:tblBorders>
+          <w:top w:val="single" w:color="auto" w:sz="4"/>
+          <w:left w:val="single" w:color="auto" w:sz="4"/>
+          <w:bottom w:val="single" w:color="auto" w:sz="4"/>
+          <w:right w:val="single" w:color="auto" w:sz="4"/>
+          <w:insideH w:val="single" w:color="auto" w:sz="4"/>
+          <w:insideV w:val="single" w:color="auto" w:sz="4"/>
+        </w:tblBorders>
+      </w:tblPr>
+      <w:tblGrid>
+        <w:gridCol w:w="3200"/>
+        <w:gridCol w:w="6160"/>
+      </w:tblGrid>
+      <w:tr>
+        <w:trPr>
+          <w:tblHeader/>
+        </w:trPr>
+        <w:tc>
+          <w:tcPr>
+            <w:tcW w:type="dxa" w:w="3200"/>
+            <w:tcBorders>
+              <w:top w:val="single" w:color="000000" w:sz="4"/>
+              <w:left w:val="single" w:color="000000" w:sz="4"/>
+              <w:bottom w:val="single" w:color="000000" w:sz="4"/>
+              <w:right w:val="single" w:color="000000" w:sz="4"/>
+            </w:tcBorders>
+            <w:shd w:fill="D9D9D9" w:val="clear"/>
+            <w:tcMar>
+              <w:top w:type="dxa" w:w="60"/>
+              <w:left w:type="dxa" w:w="100"/>
+              <w:bottom w:type="dxa" w:w="60"/>
+              <w:right w:type="dxa" w:w="100"/>
+            </w:tcMar>
+          </w:tcPr>
+          <w:p>
+            <w:r>
+              <w:rPr>
+                <w:rFonts w:ascii="Calibri" w:cs="Calibri" w:eastAsia="Calibri" w:hAnsi="Calibri"/>
+                <w:b/>
+                <w:bCs/>
+                <w:color w:val="000000"/>
+              </w:rPr>
+              <w:t xml:space="preserve">Enfoque</w:t>
+            </w:r>
+          </w:p>
+        </w:tc>
+        <w:tc>
+          <w:tcPr>
+            <w:tcW w:type="dxa" w:w="6160"/>
+            <w:tcBorders>
+              <w:top w:val="single" w:color="000000" w:sz="4"/>
+              <w:left w:val="single" w:color="000000" w:sz="4"/>
+              <w:bottom w:val="single" w:color="000000" w:sz="4"/>
+              <w:right w:val="single" w:color="000000" w:sz="4"/>
+            </w:tcBorders>
+            <w:shd w:fill="D9D9D9" w:val="clear"/>
+            <w:tcMar>
+              <w:top w:type="dxa" w:w="60"/>
+              <w:left w:type="dxa" w:w="100"/>
+              <w:bottom w:type="dxa" w:w="60"/>
+              <w:right w:type="dxa" w:w="100"/>
+            </w:tcMar>
+          </w:tcPr>
+          <w:p>
+            <w:r>
+              <w:rPr>
+                <w:rFonts w:ascii="Calibri" w:cs="Calibri" w:eastAsia="Calibri" w:hAnsi="Calibri"/>
+                <w:b/>
+                <w:bCs/>
+                <w:color w:val="000000"/>
+              </w:rPr>
+              <w:t xml:space="preserve">Qué significa</w:t>
+            </w:r>
+          </w:p>
+        </w:tc>
+      </w:tr>
+      <w:tr>
+        <w:tc>
+          <w:tcPr>
+            <w:tcW w:type="dxa" w:w="3200"/>
+            <w:tcBorders>
+              <w:top w:val="single" w:color="000000" w:sz="4"/>
+              <w:left w:val="single" w:color="000000" w:sz="4"/>
+              <w:bottom w:val="single" w:color="000000" w:sz="4"/>
+              <w:right w:val="single" w:color="000000" w:sz="4"/>
+            </w:tcBorders>
+            <w:shd w:fill="FFFFFF" w:val="clear"/>
+            <w:tcMar>
+              <w:top w:type="dxa" w:w="60"/>
+              <w:left w:type="dxa" w:w="100"/>
+              <w:bottom w:type="dxa" w:w="60"/>
+              <w:right w:type="dxa" w:w="100"/>
+            </w:tcMar>
+          </w:tcPr>
+          <w:p>
+            <w:r>
+              <w:rPr>
+                <w:rFonts w:ascii="Calibri" w:cs="Calibri" w:eastAsia="Calibri" w:hAnsi="Calibri"/>
+                <w:b/>
+                <w:bCs/>
+              </w:rPr>
+              <w:t xml:space="preserve">Aceptación del riesgo</w:t>
+            </w:r>
+            <w:r>
+              <w:rPr>
+                <w:rFonts w:ascii="Calibri" w:cs="Calibri" w:eastAsia="Calibri" w:hAnsi="Calibri"/>
+              </w:rPr>
+              <w:t xml:space="preserve"> y re-evaluación periódica</w:t>
+            </w:r>
+          </w:p>
+        </w:tc>
+        <w:tc>
+          <w:tcPr>
+            <w:tcW w:type="dxa" w:w="6160"/>
+            <w:tcBorders>
+              <w:top w:val="single" w:color="000000" w:sz="4"/>
+              <w:left w:val="single" w:color="000000" w:sz="4"/>
+              <w:bottom w:val="single" w:color="000000" w:sz="4"/>
+              <w:right w:val="single" w:color="000000" w:sz="4"/>
+            </w:tcBorders>
+            <w:shd w:fill="FFFFFF" w:val="clear"/>
+            <w:tcMar>
+              <w:top w:type="dxa" w:w="60"/>
+              <w:left w:type="dxa" w:w="100"/>
+              <w:bottom w:type="dxa" w:w="60"/>
+              <w:right w:type="dxa" w:w="100"/>
+            </w:tcMar>
+          </w:tcPr>
+          <w:p>
+            <w:r>
+              <w:rPr>
+                <w:rFonts w:ascii="Calibri" w:cs="Calibri" w:eastAsia="Calibri" w:hAnsi="Calibri"/>
+              </w:rPr>
+              <w:t xml:space="preserve">Aceptar el riesgo y revisarlo cada cierto tiempo</w:t>
+            </w:r>
+          </w:p>
+        </w:tc>
+      </w:tr>
+      <w:tr>
+        <w:tc>
+          <w:tcPr>
+            <w:tcW w:type="dxa" w:w="3200"/>
+            <w:tcBorders>
+              <w:top w:val="single" w:color="000000" w:sz="4"/>
+              <w:left w:val="single" w:color="000000" w:sz="4"/>
+              <w:bottom w:val="single" w:color="000000" w:sz="4"/>
+              <w:right w:val="single" w:color="000000" w:sz="4"/>
+            </w:tcBorders>
+            <w:shd w:fill="FFFFFF" w:val="clear"/>
+            <w:tcMar>
+              <w:top w:type="dxa" w:w="60"/>
+              <w:left w:type="dxa" w:w="100"/>
+              <w:bottom w:type="dxa" w:w="60"/>
+              <w:right w:type="dxa" w:w="100"/>
+            </w:tcMar>
+          </w:tcPr>
+          <w:p>
+            <w:r>
+              <w:rPr>
+                <w:rFonts w:ascii="Calibri" w:cs="Calibri" w:eastAsia="Calibri" w:hAnsi="Calibri"/>
+                <w:b/>
+                <w:bCs/>
+              </w:rPr>
+              <w:t xml:space="preserve">Reducción del riesgo</w:t>
+            </w:r>
+          </w:p>
+        </w:tc>
+        <w:tc>
+          <w:tcPr>
+            <w:tcW w:type="dxa" w:w="6160"/>
+            <w:tcBorders>
+              <w:top w:val="single" w:color="000000" w:sz="4"/>
+              <w:left w:val="single" w:color="000000" w:sz="4"/>
+              <w:bottom w:val="single" w:color="000000" w:sz="4"/>
+              <w:right w:val="single" w:color="000000" w:sz="4"/>
+            </w:tcBorders>
+            <w:shd w:fill="FFFFFF" w:val="clear"/>
+            <w:tcMar>
+              <w:top w:type="dxa" w:w="60"/>
+              <w:left w:type="dxa" w:w="100"/>
+              <w:bottom w:type="dxa" w:w="60"/>
+              <w:right w:type="dxa" w:w="100"/>
+            </w:tcMar>
+          </w:tcPr>
+          <w:p>
+            <w:r>
+              <w:rPr>
+                <w:rFonts w:ascii="Calibri" w:cs="Calibri" w:eastAsia="Calibri" w:hAnsi="Calibri"/>
+              </w:rPr>
+              <w:t xml:space="preserve">Implementar </w:t>
+            </w:r>
+            <w:r>
+              <w:rPr>
+                <w:rFonts w:ascii="Calibri" w:cs="Calibri" w:eastAsia="Calibri" w:hAnsi="Calibri"/>
+                <w:b/>
+                <w:bCs/>
+              </w:rPr>
+              <w:t xml:space="preserve">controles</w:t>
+            </w:r>
+          </w:p>
+        </w:tc>
+      </w:tr>
+      <w:tr>
+        <w:tc>
+          <w:tcPr>
+            <w:tcW w:type="dxa" w:w="3200"/>
+            <w:tcBorders>
+              <w:top w:val="single" w:color="000000" w:sz="4"/>
+              <w:left w:val="single" w:color="000000" w:sz="4"/>
+              <w:bottom w:val="single" w:color="000000" w:sz="4"/>
+              <w:right w:val="single" w:color="000000" w:sz="4"/>
+            </w:tcBorders>
+            <w:shd w:fill="FFFFFF" w:val="clear"/>
+            <w:tcMar>
+              <w:top w:type="dxa" w:w="60"/>
+              <w:left w:type="dxa" w:w="100"/>
+              <w:bottom w:type="dxa" w:w="60"/>
+              <w:right w:type="dxa" w:w="100"/>
+            </w:tcMar>
+          </w:tcPr>
+          <w:p>
+            <w:r>
+              <w:rPr>
+                <w:rFonts w:ascii="Calibri" w:cs="Calibri" w:eastAsia="Calibri" w:hAnsi="Calibri"/>
+                <w:b/>
+                <w:bCs/>
+              </w:rPr>
+              <w:t xml:space="preserve">Eliminación total del riesgo</w:t>
+            </w:r>
+          </w:p>
+        </w:tc>
+        <w:tc>
+          <w:tcPr>
+            <w:tcW w:type="dxa" w:w="6160"/>
+            <w:tcBorders>
+              <w:top w:val="single" w:color="000000" w:sz="4"/>
+              <w:left w:val="single" w:color="000000" w:sz="4"/>
+              <w:bottom w:val="single" w:color="000000" w:sz="4"/>
+              <w:right w:val="single" w:color="000000" w:sz="4"/>
+            </w:tcBorders>
+            <w:shd w:fill="FFFFFF" w:val="clear"/>
+            <w:tcMar>
+              <w:top w:type="dxa" w:w="60"/>
+              <w:left w:type="dxa" w:w="100"/>
+              <w:bottom w:type="dxa" w:w="60"/>
+              <w:right w:type="dxa" w:w="100"/>
+            </w:tcMar>
+          </w:tcPr>
+          <w:p>
+            <w:r>
+              <w:rPr>
+                <w:rFonts w:ascii="Calibri" w:cs="Calibri" w:eastAsia="Calibri" w:hAnsi="Calibri"/>
+              </w:rPr>
+              <w:t xml:space="preserve">Modificar el enfoque</w:t>
+            </w:r>
+          </w:p>
+        </w:tc>
+      </w:tr>
+      <w:tr>
+        <w:tc>
+          <w:tcPr>
+            <w:tcW w:type="dxa" w:w="3200"/>
+            <w:tcBorders>
+              <w:top w:val="single" w:color="000000" w:sz="4"/>
+              <w:left w:val="single" w:color="000000" w:sz="4"/>
+              <w:bottom w:val="single" w:color="000000" w:sz="4"/>
+              <w:right w:val="single" w:color="000000" w:sz="4"/>
+            </w:tcBorders>
+            <w:shd w:fill="FFFFFF" w:val="clear"/>
+            <w:tcMar>
+              <w:top w:type="dxa" w:w="60"/>
+              <w:left w:type="dxa" w:w="100"/>
+              <w:bottom w:type="dxa" w:w="60"/>
+              <w:right w:type="dxa" w:w="100"/>
+            </w:tcMar>
+          </w:tcPr>
+          <w:p>
+            <w:r>
+              <w:rPr>
+                <w:rFonts w:ascii="Calibri" w:cs="Calibri" w:eastAsia="Calibri" w:hAnsi="Calibri"/>
+                <w:b/>
+                <w:bCs/>
+              </w:rPr>
+              <w:t xml:space="preserve">Transferencia del riesgo</w:t>
+            </w:r>
+          </w:p>
+        </w:tc>
+        <w:tc>
+          <w:tcPr>
+            <w:tcW w:type="dxa" w:w="6160"/>
+            <w:tcBorders>
+              <w:top w:val="single" w:color="000000" w:sz="4"/>
+              <w:left w:val="single" w:color="000000" w:sz="4"/>
+              <w:bottom w:val="single" w:color="000000" w:sz="4"/>
+              <w:right w:val="single" w:color="000000" w:sz="4"/>
+            </w:tcBorders>
+            <w:shd w:fill="FFFFFF" w:val="clear"/>
+            <w:tcMar>
+              <w:top w:type="dxa" w:w="60"/>
+              <w:left w:type="dxa" w:w="100"/>
+              <w:bottom w:type="dxa" w:w="60"/>
+              <w:right w:type="dxa" w:w="100"/>
+            </w:tcMar>
+          </w:tcPr>
+          <w:p>
+            <w:r>
+              <w:rPr>
+                <w:rFonts w:ascii="Calibri" w:cs="Calibri" w:eastAsia="Calibri" w:hAnsi="Calibri"/>
+              </w:rPr>
+              <w:t xml:space="preserve">Pasar el riesgo a un </w:t>
+            </w:r>
+            <w:r>
+              <w:rPr>
+                <w:rFonts w:ascii="Calibri" w:cs="Calibri" w:eastAsia="Calibri" w:hAnsi="Calibri"/>
+                <w:b/>
+                <w:bCs/>
+              </w:rPr>
+              <w:t xml:space="preserve">tercero</w:t>
+            </w:r>
+          </w:p>
+        </w:tc>
+      </w:tr>
+    </w:tbl>
+    <w:p>
+      <w:pPr>
+        <w:spacing w:after="80"/>
+      </w:pPr>
+    </w:p>
+    <w:p>
+      <w:pPr>
+        <w:spacing w:after="120" w:before="280"/>
+      </w:pPr>
+      <w:r>
+        <w:rPr>
+          <w:rFonts w:ascii="Calibri" w:cs="Calibri" w:eastAsia="Calibri" w:hAnsi="Calibri"/>
+          <w:b/>
+          <w:bCs/>
+        </w:rPr>
+        <w:t xml:space="preserve">3. Controles de seguridad</w:t>
+      </w:r>
+    </w:p>
+    <w:p>
+      <w:pPr>
+        <w:pStyle w:val="ListParagraph"/>
+        <w:numPr>
+          <w:ilvl w:val="0"/>
+          <w:numId w:val="2"/>
+        </w:numPr>
+        <w:spacing w:after="60"/>
+      </w:pPr>
+      <w:r>
+        <w:rPr>
+          <w:rFonts w:ascii="Calibri" w:cs="Calibri" w:eastAsia="Calibri" w:hAnsi="Calibri"/>
+        </w:rPr>
+        <w:t xml:space="preserve">Son </w:t>
+      </w:r>
+      <w:r>
+        <w:rPr>
+          <w:rFonts w:ascii="Calibri" w:cs="Calibri" w:eastAsia="Calibri" w:hAnsi="Calibri"/>
+          <w:b/>
+          <w:bCs/>
+        </w:rPr>
+        <w:t xml:space="preserve">salvaguardas o contramedidas</w:t>
+      </w:r>
+      <w:r>
+        <w:rPr>
+          <w:rFonts w:ascii="Calibri" w:cs="Calibri" w:eastAsia="Calibri" w:hAnsi="Calibri"/>
+        </w:rPr>
+        <w:t xml:space="preserve"> que una organización implementa para </w:t>
+      </w:r>
+      <w:r>
+        <w:rPr>
+          <w:rFonts w:ascii="Calibri" w:cs="Calibri" w:eastAsia="Calibri" w:hAnsi="Calibri"/>
+          <w:b/>
+          <w:bCs/>
+        </w:rPr>
+        <w:t xml:space="preserve">evitar, detectar, contrarrestar o minimizar</w:t>
+      </w:r>
+      <w:r>
+        <w:rPr>
+          <w:rFonts w:ascii="Calibri" w:cs="Calibri" w:eastAsia="Calibri" w:hAnsi="Calibri"/>
+        </w:rPr>
+        <w:t xml:space="preserve"> los riesgos de seguridad de sus recursos.</w:t>
+      </w:r>
+    </w:p>
+    <w:p>
+      <w:pPr>
+        <w:spacing w:after="80" w:before="160"/>
+      </w:pPr>
+      <w:r>
+        <w:rPr>
+          <w:rFonts w:ascii="Calibri" w:cs="Calibri" w:eastAsia="Calibri" w:hAnsi="Calibri"/>
+          <w:b/>
+          <w:bCs/>
+        </w:rPr>
+        <w:t xml:space="preserve">Por naturaleza del control</w:t>
+      </w:r>
+    </w:p>
+    <w:tbl>
+      <w:tblPr>
+        <w:tblW w:type="dxa" w:w="9360"/>
+        <w:tblBorders>
+          <w:top w:val="single" w:color="auto" w:sz="4"/>
+          <w:left w:val="single" w:color="auto" w:sz="4"/>
+          <w:bottom w:val="single" w:color="auto" w:sz="4"/>
+          <w:right w:val="single" w:color="auto" w:sz="4"/>
+          <w:insideH w:val="single" w:color="auto" w:sz="4"/>
+          <w:insideV w:val="single" w:color="auto" w:sz="4"/>
+        </w:tblBorders>
+      </w:tblPr>
+      <w:tblGrid>
+        <w:gridCol w:w="2600"/>
+        <w:gridCol w:w="6760"/>
+      </w:tblGrid>
+      <w:tr>
+        <w:trPr>
+          <w:tblHeader/>
+        </w:trPr>
+        <w:tc>
+          <w:tcPr>
+            <w:tcW w:type="dxa" w:w="2600"/>
+            <w:tcBorders>
+              <w:top w:val="single" w:color="000000" w:sz="4"/>
+              <w:left w:val="single" w:color="000000" w:sz="4"/>
+              <w:bottom w:val="single" w:color="000000" w:sz="4"/>
+              <w:right w:val="single" w:color="000000" w:sz="4"/>
+            </w:tcBorders>
+            <w:shd w:fill="D9D9D9" w:val="clear"/>
+            <w:tcMar>
+              <w:top w:type="dxa" w:w="60"/>
+              <w:left w:type="dxa" w:w="100"/>
+              <w:bottom w:type="dxa" w:w="60"/>
+              <w:right w:type="dxa" w:w="100"/>
+            </w:tcMar>
+          </w:tcPr>
+          <w:p>
+            <w:r>
+              <w:rPr>
+                <w:rFonts w:ascii="Calibri" w:cs="Calibri" w:eastAsia="Calibri" w:hAnsi="Calibri"/>
+                <w:b/>
+                <w:bCs/>
+                <w:color w:val="000000"/>
+              </w:rPr>
+              <w:t xml:space="preserve">Control</w:t>
+            </w:r>
+          </w:p>
+        </w:tc>
+        <w:tc>
+          <w:tcPr>
+            <w:tcW w:type="dxa" w:w="6760"/>
+            <w:tcBorders>
+              <w:top w:val="single" w:color="000000" w:sz="4"/>
+              <w:left w:val="single" w:color="000000" w:sz="4"/>
+              <w:bottom w:val="single" w:color="000000" w:sz="4"/>
+              <w:right w:val="single" w:color="000000" w:sz="4"/>
+            </w:tcBorders>
+            <w:shd w:fill="D9D9D9" w:val="clear"/>
+            <w:tcMar>
+              <w:top w:type="dxa" w:w="60"/>
+              <w:left w:type="dxa" w:w="100"/>
+              <w:bottom w:type="dxa" w:w="60"/>
+              <w:right w:type="dxa" w:w="100"/>
+            </w:tcMar>
+          </w:tcPr>
+          <w:p>
+            <w:r>
+              <w:rPr>
+                <w:rFonts w:ascii="Calibri" w:cs="Calibri" w:eastAsia="Calibri" w:hAnsi="Calibri"/>
+                <w:b/>
+                <w:bCs/>
+                <w:color w:val="000000"/>
+              </w:rPr>
+              <w:t xml:space="preserve">Qué es</w:t>
+            </w:r>
+          </w:p>
+        </w:tc>
+      </w:tr>
+      <w:tr>
+        <w:tc>
+          <w:tcPr>
+            <w:tcW w:type="dxa" w:w="2600"/>
+            <w:tcBorders>
+              <w:top w:val="single" w:color="000000" w:sz="4"/>
+              <w:left w:val="single" w:color="000000" w:sz="4"/>
+              <w:bottom w:val="single" w:color="000000" w:sz="4"/>
+              <w:right w:val="single" w:color="000000" w:sz="4"/>
+            </w:tcBorders>
+            <w:shd w:fill="FFFFFF" w:val="clear"/>
+            <w:tcMar>
+              <w:top w:type="dxa" w:w="60"/>
+              <w:left w:type="dxa" w:w="100"/>
+              <w:bottom w:type="dxa" w:w="60"/>
+              <w:right w:type="dxa" w:w="100"/>
+            </w:tcMar>
+          </w:tcPr>
+          <w:p>
+            <w:r>
+              <w:rPr>
+                <w:rFonts w:ascii="Calibri" w:cs="Calibri" w:eastAsia="Calibri" w:hAnsi="Calibri"/>
+                <w:b/>
+                <w:bCs/>
+              </w:rPr>
+              <w:t xml:space="preserve">Administrativos</w:t>
+            </w:r>
+          </w:p>
+        </w:tc>
+        <w:tc>
+          <w:tcPr>
+            <w:tcW w:type="dxa" w:w="6760"/>
+            <w:tcBorders>
+              <w:top w:val="single" w:color="000000" w:sz="4"/>
+              <w:left w:val="single" w:color="000000" w:sz="4"/>
+              <w:bottom w:val="single" w:color="000000" w:sz="4"/>
+              <w:right w:val="single" w:color="000000" w:sz="4"/>
+            </w:tcBorders>
+            <w:shd w:fill="FFFFFF" w:val="clear"/>
+            <w:tcMar>
+              <w:top w:type="dxa" w:w="60"/>
+              <w:left w:type="dxa" w:w="100"/>
+              <w:bottom w:type="dxa" w:w="60"/>
+              <w:right w:type="dxa" w:w="100"/>
+            </w:tcMar>
+          </w:tcPr>
+          <w:p>
+            <w:r>
+              <w:rPr>
+                <w:rFonts w:ascii="Calibri" w:cs="Calibri" w:eastAsia="Calibri" w:hAnsi="Calibri"/>
+              </w:rPr>
+              <w:t xml:space="preserve">Procedimientos y </w:t>
+            </w:r>
+            <w:r>
+              <w:rPr>
+                <w:rFonts w:ascii="Calibri" w:cs="Calibri" w:eastAsia="Calibri" w:hAnsi="Calibri"/>
+                <w:b/>
+                <w:bCs/>
+              </w:rPr>
+              <w:t xml:space="preserve">políticas</w:t>
+            </w:r>
+            <w:r>
+              <w:rPr>
+                <w:rFonts w:ascii="Calibri" w:cs="Calibri" w:eastAsia="Calibri" w:hAnsi="Calibri"/>
+              </w:rPr>
+              <w:t xml:space="preserve"> que la organización implementa cuando maneja información confidencial</w:t>
+            </w:r>
+          </w:p>
+        </w:tc>
+      </w:tr>
+      <w:tr>
+        <w:tc>
+          <w:tcPr>
+            <w:tcW w:type="dxa" w:w="2600"/>
+            <w:tcBorders>
+              <w:top w:val="single" w:color="000000" w:sz="4"/>
+              <w:left w:val="single" w:color="000000" w:sz="4"/>
+              <w:bottom w:val="single" w:color="000000" w:sz="4"/>
+              <w:right w:val="single" w:color="000000" w:sz="4"/>
+            </w:tcBorders>
+            <w:shd w:fill="FFFFFF" w:val="clear"/>
+            <w:tcMar>
+              <w:top w:type="dxa" w:w="60"/>
+              <w:left w:type="dxa" w:w="100"/>
+              <w:bottom w:type="dxa" w:w="60"/>
+              <w:right w:type="dxa" w:w="100"/>
+            </w:tcMar>
+          </w:tcPr>
+          <w:p>
+            <w:r>
+              <w:rPr>
+                <w:rFonts w:ascii="Calibri" w:cs="Calibri" w:eastAsia="Calibri" w:hAnsi="Calibri"/>
+                <w:b/>
+                <w:bCs/>
+              </w:rPr>
+              <w:t xml:space="preserve">Técnicos</w:t>
+            </w:r>
+          </w:p>
+        </w:tc>
+        <w:tc>
+          <w:tcPr>
+            <w:tcW w:type="dxa" w:w="6760"/>
+            <w:tcBorders>
+              <w:top w:val="single" w:color="000000" w:sz="4"/>
+              <w:left w:val="single" w:color="000000" w:sz="4"/>
+              <w:bottom w:val="single" w:color="000000" w:sz="4"/>
+              <w:right w:val="single" w:color="000000" w:sz="4"/>
+            </w:tcBorders>
+            <w:shd w:fill="FFFFFF" w:val="clear"/>
+            <w:tcMar>
+              <w:top w:type="dxa" w:w="60"/>
+              <w:left w:type="dxa" w:w="100"/>
+              <w:bottom w:type="dxa" w:w="60"/>
+              <w:right w:type="dxa" w:w="100"/>
+            </w:tcMar>
+          </w:tcPr>
+          <w:p>
+            <w:r>
+              <w:rPr>
+                <w:rFonts w:ascii="Calibri" w:cs="Calibri" w:eastAsia="Calibri" w:hAnsi="Calibri"/>
+                <w:b/>
+                <w:bCs/>
+              </w:rPr>
+              <w:t xml:space="preserve">Hardware o software</w:t>
+            </w:r>
+            <w:r>
+              <w:rPr>
+                <w:rFonts w:ascii="Calibri" w:cs="Calibri" w:eastAsia="Calibri" w:hAnsi="Calibri"/>
+              </w:rPr>
+              <w:t xml:space="preserve"> implementado para administrar el riesgo y dar protección</w:t>
+            </w:r>
+          </w:p>
+        </w:tc>
+      </w:tr>
+      <w:tr>
+        <w:tc>
+          <w:tcPr>
+            <w:tcW w:type="dxa" w:w="2600"/>
+            <w:tcBorders>
+              <w:top w:val="single" w:color="000000" w:sz="4"/>
+              <w:left w:val="single" w:color="000000" w:sz="4"/>
+              <w:bottom w:val="single" w:color="000000" w:sz="4"/>
+              <w:right w:val="single" w:color="000000" w:sz="4"/>
+            </w:tcBorders>
+            <w:shd w:fill="FFFFFF" w:val="clear"/>
+            <w:tcMar>
+              <w:top w:type="dxa" w:w="60"/>
+              <w:left w:type="dxa" w:w="100"/>
+              <w:bottom w:type="dxa" w:w="60"/>
+              <w:right w:type="dxa" w:w="100"/>
+            </w:tcMar>
+          </w:tcPr>
+          <w:p>
+            <w:r>
+              <w:rPr>
+                <w:rFonts w:ascii="Calibri" w:cs="Calibri" w:eastAsia="Calibri" w:hAnsi="Calibri"/>
+                <w:b/>
+                <w:bCs/>
+              </w:rPr>
+              <w:t xml:space="preserve">Físicos</w:t>
+            </w:r>
+          </w:p>
+        </w:tc>
+        <w:tc>
+          <w:tcPr>
+            <w:tcW w:type="dxa" w:w="6760"/>
+            <w:tcBorders>
+              <w:top w:val="single" w:color="000000" w:sz="4"/>
+              <w:left w:val="single" w:color="000000" w:sz="4"/>
+              <w:bottom w:val="single" w:color="000000" w:sz="4"/>
+              <w:right w:val="single" w:color="000000" w:sz="4"/>
+            </w:tcBorders>
+            <w:shd w:fill="FFFFFF" w:val="clear"/>
+            <w:tcMar>
+              <w:top w:type="dxa" w:w="60"/>
+              <w:left w:type="dxa" w:w="100"/>
+              <w:bottom w:type="dxa" w:w="60"/>
+              <w:right w:type="dxa" w:w="100"/>
+            </w:tcMar>
+          </w:tcPr>
+          <w:p>
+            <w:r>
+              <w:rPr>
+                <w:rFonts w:ascii="Calibri" w:cs="Calibri" w:eastAsia="Calibri" w:hAnsi="Calibri"/>
+              </w:rPr>
+              <w:t xml:space="preserve">Mecanismos como </w:t>
+            </w:r>
+            <w:r>
+              <w:rPr>
+                <w:rFonts w:ascii="Calibri" w:cs="Calibri" w:eastAsia="Calibri" w:hAnsi="Calibri"/>
+                <w:b/>
+                <w:bCs/>
+              </w:rPr>
+              <w:t xml:space="preserve">cercas y cerraduras</w:t>
+            </w:r>
+            <w:r>
+              <w:rPr>
+                <w:rFonts w:ascii="Calibri" w:cs="Calibri" w:eastAsia="Calibri" w:hAnsi="Calibri"/>
+              </w:rPr>
+              <w:t xml:space="preserve"> para proteger sistemas, instalaciones, personal y recursos</w:t>
+            </w:r>
+          </w:p>
+        </w:tc>
+      </w:tr>
+    </w:tbl>
+    <w:p>
+      <w:pPr>
+        <w:spacing w:after="80"/>
+      </w:pPr>
+    </w:p>
+    <w:p>
+      <w:pPr>
+        <w:spacing w:after="80" w:before="160"/>
+      </w:pPr>
+      <w:r>
+        <w:rPr>
+          <w:rFonts w:ascii="Calibri" w:cs="Calibri" w:eastAsia="Calibri" w:hAnsi="Calibri"/>
+          <w:b/>
+          <w:bCs/>
+        </w:rPr>
+        <w:t xml:space="preserve">Controles de seguridad funcional</w:t>
+      </w:r>
+    </w:p>
+    <w:p>
+      <w:pPr>
+        <w:spacing w:after="100"/>
+      </w:pPr>
+      <w:r>
+        <w:rPr>
+          <w:rFonts w:ascii="Calibri" w:cs="Calibri" w:eastAsia="Calibri" w:hAnsi="Calibri"/>
+        </w:rPr>
+        <w:t xml:space="preserve">Son </w:t>
+      </w:r>
+      <w:r>
+        <w:rPr>
+          <w:rFonts w:ascii="Calibri" w:cs="Calibri" w:eastAsia="Calibri" w:hAnsi="Calibri"/>
+          <w:b/>
+          <w:bCs/>
+        </w:rPr>
+        <w:t xml:space="preserve">6 tipos</w:t>
+      </w:r>
+      <w:r>
+        <w:rPr>
+          <w:rFonts w:ascii="Calibri" w:cs="Calibri" w:eastAsia="Calibri" w:hAnsi="Calibri"/>
+        </w:rPr>
+        <w:t xml:space="preserve">:</w:t>
+      </w:r>
+    </w:p>
+    <w:tbl>
+      <w:tblPr>
+        <w:tblW w:type="dxa" w:w="9360"/>
+        <w:tblBorders>
+          <w:top w:val="single" w:color="auto" w:sz="4"/>
+          <w:left w:val="single" w:color="auto" w:sz="4"/>
+          <w:bottom w:val="single" w:color="auto" w:sz="4"/>
+          <w:right w:val="single" w:color="auto" w:sz="4"/>
+          <w:insideH w:val="single" w:color="auto" w:sz="4"/>
+          <w:insideV w:val="single" w:color="auto" w:sz="4"/>
+        </w:tblBorders>
+      </w:tblPr>
+      <w:tblGrid>
+        <w:gridCol w:w="2600"/>
+        <w:gridCol w:w="6760"/>
+      </w:tblGrid>
+      <w:tr>
+        <w:trPr>
+          <w:tblHeader/>
+        </w:trPr>
+        <w:tc>
+          <w:tcPr>
+            <w:tcW w:type="dxa" w:w="2600"/>
+            <w:tcBorders>
+              <w:top w:val="single" w:color="000000" w:sz="4"/>
+              <w:left w:val="single" w:color="000000" w:sz="4"/>
+              <w:bottom w:val="single" w:color="000000" w:sz="4"/>
+              <w:right w:val="single" w:color="000000" w:sz="4"/>
+            </w:tcBorders>
+            <w:shd w:fill="D9D9D9" w:val="clear"/>
+            <w:tcMar>
+              <w:top w:type="dxa" w:w="60"/>
+              <w:left w:type="dxa" w:w="100"/>
+              <w:bottom w:type="dxa" w:w="60"/>
+              <w:right w:type="dxa" w:w="100"/>
+            </w:tcMar>
+          </w:tcPr>
+          <w:p>
+            <w:r>
+              <w:rPr>
+                <w:rFonts w:ascii="Calibri" w:cs="Calibri" w:eastAsia="Calibri" w:hAnsi="Calibri"/>
+                <w:b/>
+                <w:bCs/>
+                <w:color w:val="000000"/>
+              </w:rPr>
+              <w:t xml:space="preserve">Control</w:t>
+            </w:r>
+          </w:p>
+        </w:tc>
+        <w:tc>
+          <w:tcPr>
+            <w:tcW w:type="dxa" w:w="6760"/>
+            <w:tcBorders>
+              <w:top w:val="single" w:color="000000" w:sz="4"/>
+              <w:left w:val="single" w:color="000000" w:sz="4"/>
+              <w:bottom w:val="single" w:color="000000" w:sz="4"/>
+              <w:right w:val="single" w:color="000000" w:sz="4"/>
+            </w:tcBorders>
+            <w:shd w:fill="D9D9D9" w:val="clear"/>
+            <w:tcMar>
+              <w:top w:type="dxa" w:w="60"/>
+              <w:left w:type="dxa" w:w="100"/>
+              <w:bottom w:type="dxa" w:w="60"/>
+              <w:right w:type="dxa" w:w="100"/>
+            </w:tcMar>
+          </w:tcPr>
+          <w:p>
+            <w:r>
+              <w:rPr>
+                <w:rFonts w:ascii="Calibri" w:cs="Calibri" w:eastAsia="Calibri" w:hAnsi="Calibri"/>
+                <w:b/>
+                <w:bCs/>
+                <w:color w:val="000000"/>
+              </w:rPr>
+              <w:t xml:space="preserve">Qué hace</w:t>
+            </w:r>
+          </w:p>
+        </w:tc>
+      </w:tr>
+      <w:tr>
+        <w:tc>
+          <w:tcPr>
+            <w:tcW w:type="dxa" w:w="2600"/>
+            <w:tcBorders>
+              <w:top w:val="single" w:color="000000" w:sz="4"/>
+              <w:left w:val="single" w:color="000000" w:sz="4"/>
+              <w:bottom w:val="single" w:color="000000" w:sz="4"/>
+              <w:right w:val="single" w:color="000000" w:sz="4"/>
+            </w:tcBorders>
+            <w:shd w:fill="FFFFFF" w:val="clear"/>
+            <w:tcMar>
+              <w:top w:type="dxa" w:w="60"/>
+              <w:left w:type="dxa" w:w="100"/>
+              <w:bottom w:type="dxa" w:w="60"/>
+              <w:right w:type="dxa" w:w="100"/>
+            </w:tcMar>
+          </w:tcPr>
+          <w:p>
+            <w:r>
+              <w:rPr>
+                <w:rFonts w:ascii="Calibri" w:cs="Calibri" w:eastAsia="Calibri" w:hAnsi="Calibri"/>
+                <w:b/>
+                <w:bCs/>
+              </w:rPr>
+              <w:t xml:space="preserve">Preventivos</w:t>
+            </w:r>
+          </w:p>
+        </w:tc>
+        <w:tc>
+          <w:tcPr>
+            <w:tcW w:type="dxa" w:w="6760"/>
+            <w:tcBorders>
+              <w:top w:val="single" w:color="000000" w:sz="4"/>
+              <w:left w:val="single" w:color="000000" w:sz="4"/>
+              <w:bottom w:val="single" w:color="000000" w:sz="4"/>
+              <w:right w:val="single" w:color="000000" w:sz="4"/>
+            </w:tcBorders>
+            <w:shd w:fill="FFFFFF" w:val="clear"/>
+            <w:tcMar>
+              <w:top w:type="dxa" w:w="60"/>
+              <w:left w:type="dxa" w:w="100"/>
+              <w:bottom w:type="dxa" w:w="60"/>
+              <w:right w:type="dxa" w:w="100"/>
+            </w:tcMar>
+          </w:tcPr>
+          <w:p>
+            <w:r>
+              <w:rPr>
+                <w:rFonts w:ascii="Calibri" w:cs="Calibri" w:eastAsia="Calibri" w:hAnsi="Calibri"/>
+                <w:b/>
+                <w:bCs/>
+              </w:rPr>
+              <w:t xml:space="preserve">Evitan</w:t>
+            </w:r>
+            <w:r>
+              <w:rPr>
+                <w:rFonts w:ascii="Calibri" w:cs="Calibri" w:eastAsia="Calibri" w:hAnsi="Calibri"/>
+              </w:rPr>
+              <w:t xml:space="preserve"> que se produzcan actividades no deseadas o no autorizadas y/o aplican </w:t>
+            </w:r>
+            <w:r>
+              <w:rPr>
+                <w:rFonts w:ascii="Calibri" w:cs="Calibri" w:eastAsia="Calibri" w:hAnsi="Calibri"/>
+                <w:b/>
+                <w:bCs/>
+              </w:rPr>
+              <w:t xml:space="preserve">restricciones</w:t>
+            </w:r>
+            <w:r>
+              <w:rPr>
+                <w:rFonts w:ascii="Calibri" w:cs="Calibri" w:eastAsia="Calibri" w:hAnsi="Calibri"/>
+              </w:rPr>
+              <w:t xml:space="preserve"> a los usuarios autorizados</w:t>
+            </w:r>
+          </w:p>
+        </w:tc>
+      </w:tr>
+      <w:tr>
+        <w:tc>
+          <w:tcPr>
+            <w:tcW w:type="dxa" w:w="2600"/>
+            <w:tcBorders>
+              <w:top w:val="single" w:color="000000" w:sz="4"/>
+              <w:left w:val="single" w:color="000000" w:sz="4"/>
+              <w:bottom w:val="single" w:color="000000" w:sz="4"/>
+              <w:right w:val="single" w:color="000000" w:sz="4"/>
+            </w:tcBorders>
+            <w:shd w:fill="FFFFFF" w:val="clear"/>
+            <w:tcMar>
+              <w:top w:type="dxa" w:w="60"/>
+              <w:left w:type="dxa" w:w="100"/>
+              <w:bottom w:type="dxa" w:w="60"/>
+              <w:right w:type="dxa" w:w="100"/>
+            </w:tcMar>
+          </w:tcPr>
+          <w:p>
+            <w:r>
+              <w:rPr>
+                <w:rFonts w:ascii="Calibri" w:cs="Calibri" w:eastAsia="Calibri" w:hAnsi="Calibri"/>
+                <w:b/>
+                <w:bCs/>
+              </w:rPr>
+              <w:t xml:space="preserve">Disuasivos</w:t>
+            </w:r>
+          </w:p>
+        </w:tc>
+        <w:tc>
+          <w:tcPr>
+            <w:tcW w:type="dxa" w:w="6760"/>
+            <w:tcBorders>
+              <w:top w:val="single" w:color="000000" w:sz="4"/>
+              <w:left w:val="single" w:color="000000" w:sz="4"/>
+              <w:bottom w:val="single" w:color="000000" w:sz="4"/>
+              <w:right w:val="single" w:color="000000" w:sz="4"/>
+            </w:tcBorders>
+            <w:shd w:fill="FFFFFF" w:val="clear"/>
+            <w:tcMar>
+              <w:top w:type="dxa" w:w="60"/>
+              <w:left w:type="dxa" w:w="100"/>
+              <w:bottom w:type="dxa" w:w="60"/>
+              <w:right w:type="dxa" w:w="100"/>
+            </w:tcMar>
+          </w:tcPr>
+          <w:p>
+            <w:r>
+              <w:rPr>
+                <w:rFonts w:ascii="Calibri" w:cs="Calibri" w:eastAsia="Calibri" w:hAnsi="Calibri"/>
+              </w:rPr>
+              <w:t xml:space="preserve">Buscan </w:t>
+            </w:r>
+            <w:r>
+              <w:rPr>
+                <w:rFonts w:ascii="Calibri" w:cs="Calibri" w:eastAsia="Calibri" w:hAnsi="Calibri"/>
+                <w:b/>
+                <w:bCs/>
+              </w:rPr>
+              <w:t xml:space="preserve">desalentar</w:t>
+            </w:r>
+            <w:r>
+              <w:rPr>
+                <w:rFonts w:ascii="Calibri" w:cs="Calibri" w:eastAsia="Calibri" w:hAnsi="Calibri"/>
+              </w:rPr>
+              <w:t xml:space="preserve"> que algo suceda. Los profesionales de ciberseguridad y las empresas los usan para limitar o mitigar una acción o un comportamiento</w:t>
+            </w:r>
+          </w:p>
+        </w:tc>
+      </w:tr>
+      <w:tr>
+        <w:tc>
+          <w:tcPr>
+            <w:tcW w:type="dxa" w:w="2600"/>
+            <w:tcBorders>
+              <w:top w:val="single" w:color="000000" w:sz="4"/>
+              <w:left w:val="single" w:color="000000" w:sz="4"/>
+              <w:bottom w:val="single" w:color="000000" w:sz="4"/>
+              <w:right w:val="single" w:color="000000" w:sz="4"/>
+            </w:tcBorders>
+            <w:shd w:fill="FFFFFF" w:val="clear"/>
+            <w:tcMar>
+              <w:top w:type="dxa" w:w="60"/>
+              <w:left w:type="dxa" w:w="100"/>
+              <w:bottom w:type="dxa" w:w="60"/>
+              <w:right w:type="dxa" w:w="100"/>
+            </w:tcMar>
+          </w:tcPr>
+          <w:p>
+            <w:r>
+              <w:rPr>
+                <w:rFonts w:ascii="Calibri" w:cs="Calibri" w:eastAsia="Calibri" w:hAnsi="Calibri"/>
+                <w:b/>
+                <w:bCs/>
+              </w:rPr>
+              <w:t xml:space="preserve">De detección</w:t>
+            </w:r>
+          </w:p>
+        </w:tc>
+        <w:tc>
+          <w:tcPr>
+            <w:tcW w:type="dxa" w:w="6760"/>
+            <w:tcBorders>
+              <w:top w:val="single" w:color="000000" w:sz="4"/>
+              <w:left w:val="single" w:color="000000" w:sz="4"/>
+              <w:bottom w:val="single" w:color="000000" w:sz="4"/>
+              <w:right w:val="single" w:color="000000" w:sz="4"/>
+            </w:tcBorders>
+            <w:shd w:fill="FFFFFF" w:val="clear"/>
+            <w:tcMar>
+              <w:top w:type="dxa" w:w="60"/>
+              <w:left w:type="dxa" w:w="100"/>
+              <w:bottom w:type="dxa" w:w="60"/>
+              <w:right w:type="dxa" w:w="100"/>
+            </w:tcMar>
+          </w:tcPr>
+          <w:p>
+            <w:r>
+              <w:rPr>
+                <w:rFonts w:ascii="Calibri" w:cs="Calibri" w:eastAsia="Calibri" w:hAnsi="Calibri"/>
+              </w:rPr>
+              <w:t xml:space="preserve">Los </w:t>
+            </w:r>
+            <w:r>
+              <w:rPr>
+                <w:rFonts w:ascii="Calibri" w:cs="Calibri" w:eastAsia="Calibri" w:hAnsi="Calibri"/>
+                <w:b/>
+                <w:bCs/>
+              </w:rPr>
+              <w:t xml:space="preserve">controles de detección de acceso</w:t>
+            </w:r>
+            <w:r>
+              <w:rPr>
+                <w:rFonts w:ascii="Calibri" w:cs="Calibri" w:eastAsia="Calibri" w:hAnsi="Calibri"/>
+              </w:rPr>
+              <w:t xml:space="preserve"> identifican distintos tipos de </w:t>
+            </w:r>
+            <w:r>
+              <w:rPr>
+                <w:rFonts w:ascii="Calibri" w:cs="Calibri" w:eastAsia="Calibri" w:hAnsi="Calibri"/>
+                <w:b/>
+                <w:bCs/>
+              </w:rPr>
+              <w:t xml:space="preserve">actividad no autorizada</w:t>
+            </w:r>
+          </w:p>
+        </w:tc>
+      </w:tr>
+      <w:tr>
+        <w:tc>
+          <w:tcPr>
+            <w:tcW w:type="dxa" w:w="2600"/>
+            <w:tcBorders>
+              <w:top w:val="single" w:color="000000" w:sz="4"/>
+              <w:left w:val="single" w:color="000000" w:sz="4"/>
+              <w:bottom w:val="single" w:color="000000" w:sz="4"/>
+              <w:right w:val="single" w:color="000000" w:sz="4"/>
+            </w:tcBorders>
+            <w:shd w:fill="FFFFFF" w:val="clear"/>
+            <w:tcMar>
+              <w:top w:type="dxa" w:w="60"/>
+              <w:left w:type="dxa" w:w="100"/>
+              <w:bottom w:type="dxa" w:w="60"/>
+              <w:right w:type="dxa" w:w="100"/>
+            </w:tcMar>
+          </w:tcPr>
+          <w:p>
+            <w:r>
+              <w:rPr>
+                <w:rFonts w:ascii="Calibri" w:cs="Calibri" w:eastAsia="Calibri" w:hAnsi="Calibri"/>
+                <w:b/>
+                <w:bCs/>
+              </w:rPr>
+              <w:t xml:space="preserve">Correctivos</w:t>
+            </w:r>
+          </w:p>
+        </w:tc>
+        <w:tc>
+          <w:tcPr>
+            <w:tcW w:type="dxa" w:w="6760"/>
+            <w:tcBorders>
+              <w:top w:val="single" w:color="000000" w:sz="4"/>
+              <w:left w:val="single" w:color="000000" w:sz="4"/>
+              <w:bottom w:val="single" w:color="000000" w:sz="4"/>
+              <w:right w:val="single" w:color="000000" w:sz="4"/>
+            </w:tcBorders>
+            <w:shd w:fill="FFFFFF" w:val="clear"/>
+            <w:tcMar>
+              <w:top w:type="dxa" w:w="60"/>
+              <w:left w:type="dxa" w:w="100"/>
+              <w:bottom w:type="dxa" w:w="60"/>
+              <w:right w:type="dxa" w:w="100"/>
+            </w:tcMar>
+          </w:tcPr>
+          <w:p>
+            <w:r>
+              <w:rPr>
+                <w:rFonts w:ascii="Calibri" w:cs="Calibri" w:eastAsia="Calibri" w:hAnsi="Calibri"/>
+                <w:b/>
+                <w:bCs/>
+              </w:rPr>
+              <w:t xml:space="preserve">Contrarrestan</w:t>
+            </w:r>
+            <w:r>
+              <w:rPr>
+                <w:rFonts w:ascii="Calibri" w:cs="Calibri" w:eastAsia="Calibri" w:hAnsi="Calibri"/>
+              </w:rPr>
+              <w:t xml:space="preserve"> algo indeseable al </w:t>
+            </w:r>
+            <w:r>
+              <w:rPr>
+                <w:rFonts w:ascii="Calibri" w:cs="Calibri" w:eastAsia="Calibri" w:hAnsi="Calibri"/>
+                <w:b/>
+                <w:bCs/>
+              </w:rPr>
+              <w:t xml:space="preserve">restaurar el sistema</w:t>
+            </w:r>
+            <w:r>
+              <w:rPr>
+                <w:rFonts w:ascii="Calibri" w:cs="Calibri" w:eastAsia="Calibri" w:hAnsi="Calibri"/>
+              </w:rPr>
+              <w:t xml:space="preserve"> a un estado de confidencialidad, integridad y disponibilidad. También pueden restaurar los sistemas a la normalidad luego de una actividad no autorizada</w:t>
+            </w:r>
+          </w:p>
+        </w:tc>
+      </w:tr>
+      <w:tr>
+        <w:tc>
+          <w:tcPr>
+            <w:tcW w:type="dxa" w:w="2600"/>
+            <w:tcBorders>
+              <w:top w:val="single" w:color="000000" w:sz="4"/>
+              <w:left w:val="single" w:color="000000" w:sz="4"/>
+              <w:bottom w:val="single" w:color="000000" w:sz="4"/>
+              <w:right w:val="single" w:color="000000" w:sz="4"/>
+            </w:tcBorders>
+            <w:shd w:fill="FFFFFF" w:val="clear"/>
+            <w:tcMar>
+              <w:top w:type="dxa" w:w="60"/>
+              <w:left w:type="dxa" w:w="100"/>
+              <w:bottom w:type="dxa" w:w="60"/>
+              <w:right w:type="dxa" w:w="100"/>
+            </w:tcMar>
+          </w:tcPr>
+          <w:p>
+            <w:r>
+              <w:rPr>
+                <w:rFonts w:ascii="Calibri" w:cs="Calibri" w:eastAsia="Calibri" w:hAnsi="Calibri"/>
+                <w:b/>
+                <w:bCs/>
+              </w:rPr>
+              <w:t xml:space="preserve">De recuperación</w:t>
+            </w:r>
+          </w:p>
+        </w:tc>
+        <w:tc>
+          <w:tcPr>
+            <w:tcW w:type="dxa" w:w="6760"/>
+            <w:tcBorders>
+              <w:top w:val="single" w:color="000000" w:sz="4"/>
+              <w:left w:val="single" w:color="000000" w:sz="4"/>
+              <w:bottom w:val="single" w:color="000000" w:sz="4"/>
+              <w:right w:val="single" w:color="000000" w:sz="4"/>
+            </w:tcBorders>
+            <w:shd w:fill="FFFFFF" w:val="clear"/>
+            <w:tcMar>
+              <w:top w:type="dxa" w:w="60"/>
+              <w:left w:type="dxa" w:w="100"/>
+              <w:bottom w:type="dxa" w:w="60"/>
+              <w:right w:type="dxa" w:w="100"/>
+            </w:tcMar>
+          </w:tcPr>
+          <w:p>
+            <w:r>
+              <w:rPr>
+                <w:rFonts w:ascii="Calibri" w:cs="Calibri" w:eastAsia="Calibri" w:hAnsi="Calibri"/>
+                <w:b/>
+                <w:bCs/>
+              </w:rPr>
+              <w:t xml:space="preserve">Restauran recursos, funciones y capacidades</w:t>
+            </w:r>
+            <w:r>
+              <w:rPr>
+                <w:rFonts w:ascii="Calibri" w:cs="Calibri" w:eastAsia="Calibri" w:hAnsi="Calibri"/>
+              </w:rPr>
+              <w:t xml:space="preserve"> después de la violación de una política de seguridad</w:t>
+            </w:r>
+          </w:p>
+        </w:tc>
+      </w:tr>
+      <w:tr>
+        <w:tc>
+          <w:tcPr>
+            <w:tcW w:type="dxa" w:w="2600"/>
+            <w:tcBorders>
+              <w:top w:val="single" w:color="000000" w:sz="4"/>
+              <w:left w:val="single" w:color="000000" w:sz="4"/>
+              <w:bottom w:val="single" w:color="000000" w:sz="4"/>
+              <w:right w:val="single" w:color="000000" w:sz="4"/>
+            </w:tcBorders>
+            <w:shd w:fill="FFFFFF" w:val="clear"/>
+            <w:tcMar>
+              <w:top w:type="dxa" w:w="60"/>
+              <w:left w:type="dxa" w:w="100"/>
+              <w:bottom w:type="dxa" w:w="60"/>
+              <w:right w:type="dxa" w:w="100"/>
+            </w:tcMar>
+          </w:tcPr>
+          <w:p>
+            <w:r>
+              <w:rPr>
+                <w:rFonts w:ascii="Calibri" w:cs="Calibri" w:eastAsia="Calibri" w:hAnsi="Calibri"/>
+                <w:b/>
+                <w:bCs/>
+              </w:rPr>
+              <w:t xml:space="preserve">Compensatorios</w:t>
+            </w:r>
+          </w:p>
+        </w:tc>
+        <w:tc>
+          <w:tcPr>
+            <w:tcW w:type="dxa" w:w="6760"/>
+            <w:tcBorders>
+              <w:top w:val="single" w:color="000000" w:sz="4"/>
+              <w:left w:val="single" w:color="000000" w:sz="4"/>
+              <w:bottom w:val="single" w:color="000000" w:sz="4"/>
+              <w:right w:val="single" w:color="000000" w:sz="4"/>
+            </w:tcBorders>
+            <w:shd w:fill="FFFFFF" w:val="clear"/>
+            <w:tcMar>
+              <w:top w:type="dxa" w:w="60"/>
+              <w:left w:type="dxa" w:w="100"/>
+              <w:bottom w:type="dxa" w:w="60"/>
+              <w:right w:type="dxa" w:w="100"/>
+            </w:tcMar>
+          </w:tcPr>
+          <w:p>
+            <w:r>
+              <w:rPr>
+                <w:rFonts w:ascii="Calibri" w:cs="Calibri" w:eastAsia="Calibri" w:hAnsi="Calibri"/>
+              </w:rPr>
+              <w:t xml:space="preserve">Ofrecen </w:t>
+            </w:r>
+            <w:r>
+              <w:rPr>
+                <w:rFonts w:ascii="Calibri" w:cs="Calibri" w:eastAsia="Calibri" w:hAnsi="Calibri"/>
+                <w:b/>
+                <w:bCs/>
+              </w:rPr>
+              <w:t xml:space="preserve">opciones a otros controles</w:t>
+            </w:r>
+            <w:r>
+              <w:rPr>
+                <w:rFonts w:ascii="Calibri" w:cs="Calibri" w:eastAsia="Calibri" w:hAnsi="Calibri"/>
+              </w:rPr>
+              <w:t xml:space="preserve"> para reforzar el cumplimiento en respaldo de la política de seguridad</w:t>
+            </w:r>
+          </w:p>
+        </w:tc>
+      </w:tr>
+    </w:tbl>
+    <w:p>
+      <w:pPr>
+        <w:spacing w:after="80"/>
+      </w:pPr>
     </w:p>
     <w:sectPr>
       <w:pgSz w:w="12240" w:h="15840" w:orient="portrait"/>

</xml_diff>

<commit_message>
Agrega Módulo 27: Análisis forense digital y respuesta a incidentes al resumen de módulos 19 en adelante
Co-Authored-By: Claude Sonnet 5.5 <noreply@anthropic.com>
Claude-Session: https://claude.ai/code/session_013iWwbBbHxw2c1QtKDe5PjZ
</commit_message>
<xml_diff>
--- a/Modulos_19_en_adelante_Resumen.docx
+++ b/Modulos_19_en_adelante_Resumen.docx
@@ -17777,6 +17777,4594 @@
                 <w:rFonts w:ascii="Calibri" w:cs="Calibri" w:eastAsia="Calibri" w:hAnsi="Calibri"/>
               </w:rPr>
               <w:t xml:space="preserve"> para reforzar el cumplimiento en respaldo de la política de seguridad</w:t>
+            </w:r>
+          </w:p>
+        </w:tc>
+      </w:tr>
+    </w:tbl>
+    <w:p>
+      <w:pPr>
+        <w:spacing w:after="80"/>
+      </w:pPr>
+    </w:p>
+    <w:p>
+      <w:r>
+        <w:br w:type="page"/>
+      </w:r>
+    </w:p>
+    <w:p>
+      <w:pPr>
+        <w:spacing w:after="60"/>
+        <w:jc w:val="center"/>
+      </w:pPr>
+      <w:r>
+        <w:rPr>
+          <w:rFonts w:ascii="Calibri" w:cs="Calibri" w:eastAsia="Calibri" w:hAnsi="Calibri"/>
+          <w:b/>
+          <w:bCs/>
+          <w:color w:val="000000"/>
+          <w:sz w:val="24"/>
+          <w:szCs w:val="24"/>
+        </w:rPr>
+        <w:t xml:space="preserve">Módulo 27: Análisis forense digital y análisis y respuesta a incidentes</w:t>
+      </w:r>
+    </w:p>
+    <w:p>
+      <w:pPr>
+        <w:spacing w:after="200"/>
+        <w:jc w:val="center"/>
+      </w:pPr>
+      <w:r>
+        <w:rPr>
+          <w:rFonts w:ascii="Calibri" w:cs="Calibri" w:eastAsia="Calibri" w:hAnsi="Calibri"/>
+          <w:color w:val="000000"/>
+          <w:sz w:val="24"/>
+          <w:szCs w:val="24"/>
+        </w:rPr>
+        <w:t xml:space="preserve">Resumen de ciberseguridad</w:t>
+      </w:r>
+    </w:p>
+    <w:p>
+      <w:pPr>
+        <w:spacing w:after="120" w:before="280"/>
+      </w:pPr>
+      <w:r>
+        <w:rPr>
+          <w:rFonts w:ascii="Calibri" w:cs="Calibri" w:eastAsia="Calibri" w:hAnsi="Calibri"/>
+          <w:b/>
+          <w:bCs/>
+        </w:rPr>
+        <w:t xml:space="preserve">1. Manejo de evidencia y atribución del ataque</w:t>
+      </w:r>
+    </w:p>
+    <w:p>
+      <w:pPr>
+        <w:spacing w:after="80" w:before="160"/>
+      </w:pPr>
+      <w:r>
+        <w:rPr>
+          <w:rFonts w:ascii="Calibri" w:cs="Calibri" w:eastAsia="Calibri" w:hAnsi="Calibri"/>
+          <w:b/>
+          <w:bCs/>
+        </w:rPr>
+        <w:t xml:space="preserve">Informática forense digital</w:t>
+      </w:r>
+    </w:p>
+    <w:p>
+      <w:pPr>
+        <w:pStyle w:val="ListParagraph"/>
+        <w:numPr>
+          <w:ilvl w:val="0"/>
+          <w:numId w:val="2"/>
+        </w:numPr>
+        <w:spacing w:after="60"/>
+      </w:pPr>
+      <w:r>
+        <w:rPr>
+          <w:rFonts w:ascii="Calibri" w:cs="Calibri" w:eastAsia="Calibri" w:hAnsi="Calibri"/>
+        </w:rPr>
+        <w:t xml:space="preserve">Es la </w:t>
+      </w:r>
+      <w:r>
+        <w:rPr>
+          <w:rFonts w:ascii="Calibri" w:cs="Calibri" w:eastAsia="Calibri" w:hAnsi="Calibri"/>
+          <w:b/>
+          <w:bCs/>
+        </w:rPr>
+        <w:t xml:space="preserve">recuperación e investigación</w:t>
+      </w:r>
+      <w:r>
+        <w:rPr>
+          <w:rFonts w:ascii="Calibri" w:cs="Calibri" w:eastAsia="Calibri" w:hAnsi="Calibri"/>
+        </w:rPr>
+        <w:t xml:space="preserve"> de la información de dispositivos digitales relacionada con actividades delictivas.</w:t>
+      </w:r>
+    </w:p>
+    <w:p>
+      <w:pPr>
+        <w:pStyle w:val="ListParagraph"/>
+        <w:numPr>
+          <w:ilvl w:val="0"/>
+          <w:numId w:val="2"/>
+        </w:numPr>
+        <w:spacing w:after="60"/>
+      </w:pPr>
+      <w:r>
+        <w:rPr>
+          <w:rFonts w:ascii="Calibri" w:cs="Calibri" w:eastAsia="Calibri" w:hAnsi="Calibri"/>
+        </w:rPr>
+        <w:t xml:space="preserve">Los </w:t>
+      </w:r>
+      <w:r>
+        <w:rPr>
+          <w:rFonts w:ascii="Calibri" w:cs="Calibri" w:eastAsia="Calibri" w:hAnsi="Calibri"/>
+          <w:b/>
+          <w:bCs/>
+        </w:rPr>
+        <w:t xml:space="preserve">indicadores de compromiso</w:t>
+      </w:r>
+      <w:r>
+        <w:rPr>
+          <w:rFonts w:ascii="Calibri" w:cs="Calibri" w:eastAsia="Calibri" w:hAnsi="Calibri"/>
+        </w:rPr>
+        <w:t xml:space="preserve"> son la evidencia de que se produjo un incidente de ciberseguridad. Hay que </w:t>
+      </w:r>
+      <w:r>
+        <w:rPr>
+          <w:rFonts w:ascii="Calibri" w:cs="Calibri" w:eastAsia="Calibri" w:hAnsi="Calibri"/>
+          <w:b/>
+          <w:bCs/>
+        </w:rPr>
+        <w:t xml:space="preserve">conservarlos</w:t>
+      </w:r>
+      <w:r>
+        <w:rPr>
+          <w:rFonts w:ascii="Calibri" w:cs="Calibri" w:eastAsia="Calibri" w:hAnsi="Calibri"/>
+        </w:rPr>
+        <w:t xml:space="preserve"> para futuros análisis y atribuciones.</w:t>
+      </w:r>
+    </w:p>
+    <w:p>
+      <w:pPr>
+        <w:pStyle w:val="ListParagraph"/>
+        <w:numPr>
+          <w:ilvl w:val="0"/>
+          <w:numId w:val="2"/>
+        </w:numPr>
+        <w:spacing w:after="60"/>
+      </w:pPr>
+      <w:r>
+        <w:rPr>
+          <w:rFonts w:ascii="Calibri" w:cs="Calibri" w:eastAsia="Calibri" w:hAnsi="Calibri"/>
+        </w:rPr>
+        <w:t xml:space="preserve">La organización necesita </w:t>
+      </w:r>
+      <w:r>
+        <w:rPr>
+          <w:rFonts w:ascii="Calibri" w:cs="Calibri" w:eastAsia="Calibri" w:hAnsi="Calibri"/>
+          <w:b/>
+          <w:bCs/>
+        </w:rPr>
+        <w:t xml:space="preserve">procesos y procedimientos</w:t>
+      </w:r>
+      <w:r>
+        <w:rPr>
+          <w:rFonts w:ascii="Calibri" w:cs="Calibri" w:eastAsia="Calibri" w:hAnsi="Calibri"/>
+        </w:rPr>
+        <w:t xml:space="preserve"> bien documentados para el análisis forense digital.</w:t>
+      </w:r>
+    </w:p>
+    <w:p>
+      <w:pPr>
+        <w:pStyle w:val="ListParagraph"/>
+        <w:numPr>
+          <w:ilvl w:val="0"/>
+          <w:numId w:val="2"/>
+        </w:numPr>
+        <w:spacing w:after="60"/>
+      </w:pPr>
+      <w:r>
+        <w:rPr>
+          <w:rFonts w:ascii="Calibri" w:cs="Calibri" w:eastAsia="Calibri" w:hAnsi="Calibri"/>
+        </w:rPr>
+        <w:t xml:space="preserve">NIST SP 800-86: Guía para la Integración de Técnicas Forenses en Respuesta a Incidentes. Es un recurso valioso.</w:t>
+      </w:r>
+    </w:p>
+    <w:p>
+      <w:pPr>
+        <w:spacing w:after="80" w:before="160"/>
+      </w:pPr>
+      <w:r>
+        <w:rPr>
+          <w:rFonts w:ascii="Calibri" w:cs="Calibri" w:eastAsia="Calibri" w:hAnsi="Calibri"/>
+          <w:b/>
+          <w:bCs/>
+        </w:rPr>
+        <w:t xml:space="preserve">Los 4 pasos del proceso forense</w:t>
+      </w:r>
+    </w:p>
+    <w:tbl>
+      <w:tblPr>
+        <w:tblW w:type="dxa" w:w="9360"/>
+        <w:tblBorders>
+          <w:top w:val="single" w:color="auto" w:sz="4"/>
+          <w:left w:val="single" w:color="auto" w:sz="4"/>
+          <w:bottom w:val="single" w:color="auto" w:sz="4"/>
+          <w:right w:val="single" w:color="auto" w:sz="4"/>
+          <w:insideH w:val="single" w:color="auto" w:sz="4"/>
+          <w:insideV w:val="single" w:color="auto" w:sz="4"/>
+        </w:tblBorders>
+      </w:tblPr>
+      <w:tblGrid>
+        <w:gridCol w:w="900"/>
+        <w:gridCol w:w="8460"/>
+      </w:tblGrid>
+      <w:tr>
+        <w:trPr>
+          <w:tblHeader/>
+        </w:trPr>
+        <w:tc>
+          <w:tcPr>
+            <w:tcW w:type="dxa" w:w="900"/>
+            <w:tcBorders>
+              <w:top w:val="single" w:color="000000" w:sz="4"/>
+              <w:left w:val="single" w:color="000000" w:sz="4"/>
+              <w:bottom w:val="single" w:color="000000" w:sz="4"/>
+              <w:right w:val="single" w:color="000000" w:sz="4"/>
+            </w:tcBorders>
+            <w:shd w:fill="D9D9D9" w:val="clear"/>
+            <w:tcMar>
+              <w:top w:type="dxa" w:w="60"/>
+              <w:left w:type="dxa" w:w="100"/>
+              <w:bottom w:type="dxa" w:w="60"/>
+              <w:right w:type="dxa" w:w="100"/>
+            </w:tcMar>
+          </w:tcPr>
+          <w:p>
+            <w:r>
+              <w:rPr>
+                <w:rFonts w:ascii="Calibri" w:cs="Calibri" w:eastAsia="Calibri" w:hAnsi="Calibri"/>
+                <w:b/>
+                <w:bCs/>
+                <w:color w:val="000000"/>
+              </w:rPr>
+              <w:t xml:space="preserve">Paso</w:t>
+            </w:r>
+          </w:p>
+        </w:tc>
+        <w:tc>
+          <w:tcPr>
+            <w:tcW w:type="dxa" w:w="8460"/>
+            <w:tcBorders>
+              <w:top w:val="single" w:color="000000" w:sz="4"/>
+              <w:left w:val="single" w:color="000000" w:sz="4"/>
+              <w:bottom w:val="single" w:color="000000" w:sz="4"/>
+              <w:right w:val="single" w:color="000000" w:sz="4"/>
+            </w:tcBorders>
+            <w:shd w:fill="D9D9D9" w:val="clear"/>
+            <w:tcMar>
+              <w:top w:type="dxa" w:w="60"/>
+              <w:left w:type="dxa" w:w="100"/>
+              <w:bottom w:type="dxa" w:w="60"/>
+              <w:right w:type="dxa" w:w="100"/>
+            </w:tcMar>
+          </w:tcPr>
+          <w:p>
+            <w:r>
+              <w:rPr>
+                <w:rFonts w:ascii="Calibri" w:cs="Calibri" w:eastAsia="Calibri" w:hAnsi="Calibri"/>
+                <w:b/>
+                <w:bCs/>
+                <w:color w:val="000000"/>
+              </w:rPr>
+              <w:t xml:space="preserve">Nombre</w:t>
+            </w:r>
+          </w:p>
+        </w:tc>
+      </w:tr>
+      <w:tr>
+        <w:tc>
+          <w:tcPr>
+            <w:tcW w:type="dxa" w:w="900"/>
+            <w:tcBorders>
+              <w:top w:val="single" w:color="000000" w:sz="4"/>
+              <w:left w:val="single" w:color="000000" w:sz="4"/>
+              <w:bottom w:val="single" w:color="000000" w:sz="4"/>
+              <w:right w:val="single" w:color="000000" w:sz="4"/>
+            </w:tcBorders>
+            <w:shd w:fill="FFFFFF" w:val="clear"/>
+            <w:tcMar>
+              <w:top w:type="dxa" w:w="60"/>
+              <w:left w:type="dxa" w:w="100"/>
+              <w:bottom w:type="dxa" w:w="60"/>
+              <w:right w:type="dxa" w:w="100"/>
+            </w:tcMar>
+          </w:tcPr>
+          <w:p>
+            <w:r>
+              <w:rPr>
+                <w:rFonts w:ascii="Calibri" w:cs="Calibri" w:eastAsia="Calibri" w:hAnsi="Calibri"/>
+                <w:b/>
+                <w:bCs/>
+              </w:rPr>
+              <w:t xml:space="preserve">1</w:t>
+            </w:r>
+          </w:p>
+        </w:tc>
+        <w:tc>
+          <w:tcPr>
+            <w:tcW w:type="dxa" w:w="8460"/>
+            <w:tcBorders>
+              <w:top w:val="single" w:color="000000" w:sz="4"/>
+              <w:left w:val="single" w:color="000000" w:sz="4"/>
+              <w:bottom w:val="single" w:color="000000" w:sz="4"/>
+              <w:right w:val="single" w:color="000000" w:sz="4"/>
+            </w:tcBorders>
+            <w:shd w:fill="FFFFFF" w:val="clear"/>
+            <w:tcMar>
+              <w:top w:type="dxa" w:w="60"/>
+              <w:left w:type="dxa" w:w="100"/>
+              <w:bottom w:type="dxa" w:w="60"/>
+              <w:right w:type="dxa" w:w="100"/>
+            </w:tcMar>
+          </w:tcPr>
+          <w:p>
+            <w:r>
+              <w:rPr>
+                <w:rFonts w:ascii="Calibri" w:cs="Calibri" w:eastAsia="Calibri" w:hAnsi="Calibri"/>
+              </w:rPr>
+              <w:t xml:space="preserve">Recolección</w:t>
+            </w:r>
+          </w:p>
+        </w:tc>
+      </w:tr>
+      <w:tr>
+        <w:tc>
+          <w:tcPr>
+            <w:tcW w:type="dxa" w:w="900"/>
+            <w:tcBorders>
+              <w:top w:val="single" w:color="000000" w:sz="4"/>
+              <w:left w:val="single" w:color="000000" w:sz="4"/>
+              <w:bottom w:val="single" w:color="000000" w:sz="4"/>
+              <w:right w:val="single" w:color="000000" w:sz="4"/>
+            </w:tcBorders>
+            <w:shd w:fill="FFFFFF" w:val="clear"/>
+            <w:tcMar>
+              <w:top w:type="dxa" w:w="60"/>
+              <w:left w:type="dxa" w:w="100"/>
+              <w:bottom w:type="dxa" w:w="60"/>
+              <w:right w:type="dxa" w:w="100"/>
+            </w:tcMar>
+          </w:tcPr>
+          <w:p>
+            <w:r>
+              <w:rPr>
+                <w:rFonts w:ascii="Calibri" w:cs="Calibri" w:eastAsia="Calibri" w:hAnsi="Calibri"/>
+                <w:b/>
+                <w:bCs/>
+              </w:rPr>
+              <w:t xml:space="preserve">2</w:t>
+            </w:r>
+          </w:p>
+        </w:tc>
+        <w:tc>
+          <w:tcPr>
+            <w:tcW w:type="dxa" w:w="8460"/>
+            <w:tcBorders>
+              <w:top w:val="single" w:color="000000" w:sz="4"/>
+              <w:left w:val="single" w:color="000000" w:sz="4"/>
+              <w:bottom w:val="single" w:color="000000" w:sz="4"/>
+              <w:right w:val="single" w:color="000000" w:sz="4"/>
+            </w:tcBorders>
+            <w:shd w:fill="FFFFFF" w:val="clear"/>
+            <w:tcMar>
+              <w:top w:type="dxa" w:w="60"/>
+              <w:left w:type="dxa" w:w="100"/>
+              <w:bottom w:type="dxa" w:w="60"/>
+              <w:right w:type="dxa" w:w="100"/>
+            </w:tcMar>
+          </w:tcPr>
+          <w:p>
+            <w:r>
+              <w:rPr>
+                <w:rFonts w:ascii="Calibri" w:cs="Calibri" w:eastAsia="Calibri" w:hAnsi="Calibri"/>
+              </w:rPr>
+              <w:t xml:space="preserve">Examen</w:t>
+            </w:r>
+          </w:p>
+        </w:tc>
+      </w:tr>
+      <w:tr>
+        <w:tc>
+          <w:tcPr>
+            <w:tcW w:type="dxa" w:w="900"/>
+            <w:tcBorders>
+              <w:top w:val="single" w:color="000000" w:sz="4"/>
+              <w:left w:val="single" w:color="000000" w:sz="4"/>
+              <w:bottom w:val="single" w:color="000000" w:sz="4"/>
+              <w:right w:val="single" w:color="000000" w:sz="4"/>
+            </w:tcBorders>
+            <w:shd w:fill="FFFFFF" w:val="clear"/>
+            <w:tcMar>
+              <w:top w:type="dxa" w:w="60"/>
+              <w:left w:type="dxa" w:w="100"/>
+              <w:bottom w:type="dxa" w:w="60"/>
+              <w:right w:type="dxa" w:w="100"/>
+            </w:tcMar>
+          </w:tcPr>
+          <w:p>
+            <w:r>
+              <w:rPr>
+                <w:rFonts w:ascii="Calibri" w:cs="Calibri" w:eastAsia="Calibri" w:hAnsi="Calibri"/>
+                <w:b/>
+                <w:bCs/>
+              </w:rPr>
+              <w:t xml:space="preserve">3</w:t>
+            </w:r>
+          </w:p>
+        </w:tc>
+        <w:tc>
+          <w:tcPr>
+            <w:tcW w:type="dxa" w:w="8460"/>
+            <w:tcBorders>
+              <w:top w:val="single" w:color="000000" w:sz="4"/>
+              <w:left w:val="single" w:color="000000" w:sz="4"/>
+              <w:bottom w:val="single" w:color="000000" w:sz="4"/>
+              <w:right w:val="single" w:color="000000" w:sz="4"/>
+            </w:tcBorders>
+            <w:shd w:fill="FFFFFF" w:val="clear"/>
+            <w:tcMar>
+              <w:top w:type="dxa" w:w="60"/>
+              <w:left w:type="dxa" w:w="100"/>
+              <w:bottom w:type="dxa" w:w="60"/>
+              <w:right w:type="dxa" w:w="100"/>
+            </w:tcMar>
+          </w:tcPr>
+          <w:p>
+            <w:r>
+              <w:rPr>
+                <w:rFonts w:ascii="Calibri" w:cs="Calibri" w:eastAsia="Calibri" w:hAnsi="Calibri"/>
+              </w:rPr>
+              <w:t xml:space="preserve">Análisis</w:t>
+            </w:r>
+          </w:p>
+        </w:tc>
+      </w:tr>
+      <w:tr>
+        <w:tc>
+          <w:tcPr>
+            <w:tcW w:type="dxa" w:w="900"/>
+            <w:tcBorders>
+              <w:top w:val="single" w:color="000000" w:sz="4"/>
+              <w:left w:val="single" w:color="000000" w:sz="4"/>
+              <w:bottom w:val="single" w:color="000000" w:sz="4"/>
+              <w:right w:val="single" w:color="000000" w:sz="4"/>
+            </w:tcBorders>
+            <w:shd w:fill="FFFFFF" w:val="clear"/>
+            <w:tcMar>
+              <w:top w:type="dxa" w:w="60"/>
+              <w:left w:type="dxa" w:w="100"/>
+              <w:bottom w:type="dxa" w:w="60"/>
+              <w:right w:type="dxa" w:w="100"/>
+            </w:tcMar>
+          </w:tcPr>
+          <w:p>
+            <w:r>
+              <w:rPr>
+                <w:rFonts w:ascii="Calibri" w:cs="Calibri" w:eastAsia="Calibri" w:hAnsi="Calibri"/>
+                <w:b/>
+                <w:bCs/>
+              </w:rPr>
+              <w:t xml:space="preserve">4</w:t>
+            </w:r>
+          </w:p>
+        </w:tc>
+        <w:tc>
+          <w:tcPr>
+            <w:tcW w:type="dxa" w:w="8460"/>
+            <w:tcBorders>
+              <w:top w:val="single" w:color="000000" w:sz="4"/>
+              <w:left w:val="single" w:color="000000" w:sz="4"/>
+              <w:bottom w:val="single" w:color="000000" w:sz="4"/>
+              <w:right w:val="single" w:color="000000" w:sz="4"/>
+            </w:tcBorders>
+            <w:shd w:fill="FFFFFF" w:val="clear"/>
+            <w:tcMar>
+              <w:top w:type="dxa" w:w="60"/>
+              <w:left w:type="dxa" w:w="100"/>
+              <w:bottom w:type="dxa" w:w="60"/>
+              <w:right w:type="dxa" w:w="100"/>
+            </w:tcMar>
+          </w:tcPr>
+          <w:p>
+            <w:r>
+              <w:rPr>
+                <w:rFonts w:ascii="Calibri" w:cs="Calibri" w:eastAsia="Calibri" w:hAnsi="Calibri"/>
+              </w:rPr>
+              <w:t xml:space="preserve">Presentación de informes</w:t>
+            </w:r>
+          </w:p>
+        </w:tc>
+      </w:tr>
+    </w:tbl>
+    <w:p>
+      <w:pPr>
+        <w:spacing w:after="80"/>
+      </w:pPr>
+    </w:p>
+    <w:p>
+      <w:pPr>
+        <w:pStyle w:val="ListParagraph"/>
+        <w:numPr>
+          <w:ilvl w:val="0"/>
+          <w:numId w:val="2"/>
+        </w:numPr>
+        <w:spacing w:after="60"/>
+      </w:pPr>
+      <w:r>
+        <w:rPr>
+          <w:rFonts w:ascii="Calibri" w:cs="Calibri" w:eastAsia="Calibri" w:hAnsi="Calibri"/>
+          <w:b/>
+          <w:bCs/>
+        </w:rPr>
+        <w:t xml:space="preserve">IETF RFC 3227:</w:t>
+      </w:r>
+      <w:r>
+        <w:rPr>
+          <w:rFonts w:ascii="Calibri" w:cs="Calibri" w:eastAsia="Calibri" w:hAnsi="Calibri"/>
+        </w:rPr>
+        <w:t xml:space="preserve"> describe un orden para recolectar la evidencia digital según la </w:t>
+      </w:r>
+      <w:r>
+        <w:rPr>
+          <w:rFonts w:ascii="Calibri" w:cs="Calibri" w:eastAsia="Calibri" w:hAnsi="Calibri"/>
+          <w:b/>
+          <w:bCs/>
+        </w:rPr>
+        <w:t xml:space="preserve">volatilidad de los datos</w:t>
+      </w:r>
+      <w:r>
+        <w:rPr>
+          <w:rFonts w:ascii="Calibri" w:cs="Calibri" w:eastAsia="Calibri" w:hAnsi="Calibri"/>
+        </w:rPr>
+        <w:t xml:space="preserve">.</w:t>
+      </w:r>
+    </w:p>
+    <w:p>
+      <w:pPr>
+        <w:pStyle w:val="ListParagraph"/>
+        <w:numPr>
+          <w:ilvl w:val="0"/>
+          <w:numId w:val="2"/>
+        </w:numPr>
+        <w:spacing w:after="60"/>
+      </w:pPr>
+      <w:r>
+        <w:rPr>
+          <w:rFonts w:ascii="Calibri" w:cs="Calibri" w:eastAsia="Calibri" w:hAnsi="Calibri"/>
+          <w:b/>
+          <w:bCs/>
+        </w:rPr>
+        <w:t xml:space="preserve">Cadena de custodia:</w:t>
+      </w:r>
+      <w:r>
+        <w:rPr>
+          <w:rFonts w:ascii="Calibri" w:cs="Calibri" w:eastAsia="Calibri" w:hAnsi="Calibri"/>
+        </w:rPr>
+        <w:t xml:space="preserve"> implica la </w:t>
+      </w:r>
+      <w:r>
+        <w:rPr>
+          <w:rFonts w:ascii="Calibri" w:cs="Calibri" w:eastAsia="Calibri" w:hAnsi="Calibri"/>
+          <w:b/>
+          <w:bCs/>
+        </w:rPr>
+        <w:t xml:space="preserve">recolección, el manejo y el almacenamiento seguro</w:t>
+      </w:r>
+      <w:r>
+        <w:rPr>
+          <w:rFonts w:ascii="Calibri" w:cs="Calibri" w:eastAsia="Calibri" w:hAnsi="Calibri"/>
+        </w:rPr>
+        <w:t xml:space="preserve"> de la evidencia.</w:t>
+      </w:r>
+    </w:p>
+    <w:p>
+      <w:pPr>
+        <w:spacing w:after="80" w:before="160"/>
+      </w:pPr>
+      <w:r>
+        <w:rPr>
+          <w:rFonts w:ascii="Calibri" w:cs="Calibri" w:eastAsia="Calibri" w:hAnsi="Calibri"/>
+          <w:b/>
+          <w:bCs/>
+        </w:rPr>
+        <w:t xml:space="preserve">Atribución de amenazas</w:t>
+      </w:r>
+    </w:p>
+    <w:p>
+      <w:pPr>
+        <w:pStyle w:val="ListParagraph"/>
+        <w:numPr>
+          <w:ilvl w:val="0"/>
+          <w:numId w:val="2"/>
+        </w:numPr>
+        <w:spacing w:after="60"/>
+      </w:pPr>
+      <w:r>
+        <w:rPr>
+          <w:rFonts w:ascii="Calibri" w:cs="Calibri" w:eastAsia="Calibri" w:hAnsi="Calibri"/>
+        </w:rPr>
+        <w:t xml:space="preserve">Es la identificación de los </w:t>
+      </w:r>
+      <w:r>
+        <w:rPr>
+          <w:rFonts w:ascii="Calibri" w:cs="Calibri" w:eastAsia="Calibri" w:hAnsi="Calibri"/>
+          <w:b/>
+          <w:bCs/>
+        </w:rPr>
+        <w:t xml:space="preserve">actores responsables</w:t>
+      </w:r>
+      <w:r>
+        <w:rPr>
+          <w:rFonts w:ascii="Calibri" w:cs="Calibri" w:eastAsia="Calibri" w:hAnsi="Calibri"/>
+        </w:rPr>
+        <w:t xml:space="preserve"> de la amenaza. Debe hacerse con una </w:t>
+      </w:r>
+      <w:r>
+        <w:rPr>
+          <w:rFonts w:ascii="Calibri" w:cs="Calibri" w:eastAsia="Calibri" w:hAnsi="Calibri"/>
+          <w:b/>
+          <w:bCs/>
+        </w:rPr>
+        <w:t xml:space="preserve">investigación sistemática y fundamentada en la evidencia</w:t>
+      </w:r>
+      <w:r>
+        <w:rPr>
+          <w:rFonts w:ascii="Calibri" w:cs="Calibri" w:eastAsia="Calibri" w:hAnsi="Calibri"/>
+        </w:rPr>
+        <w:t xml:space="preserve">.</w:t>
+      </w:r>
+    </w:p>
+    <w:p>
+      <w:pPr>
+        <w:pStyle w:val="ListParagraph"/>
+        <w:numPr>
+          <w:ilvl w:val="0"/>
+          <w:numId w:val="2"/>
+        </w:numPr>
+        <w:spacing w:after="60"/>
+      </w:pPr>
+      <w:r>
+        <w:rPr>
+          <w:rFonts w:ascii="Calibri" w:cs="Calibri" w:eastAsia="Calibri" w:hAnsi="Calibri"/>
+        </w:rPr>
+        <w:t xml:space="preserve">El equipo de respuesta correlaciona las </w:t>
+      </w:r>
+      <w:r>
+        <w:rPr>
+          <w:rFonts w:ascii="Calibri" w:cs="Calibri" w:eastAsia="Calibri" w:hAnsi="Calibri"/>
+          <w:b/>
+          <w:bCs/>
+        </w:rPr>
+        <w:t xml:space="preserve">TTP</w:t>
+      </w:r>
+      <w:r>
+        <w:rPr>
+          <w:rFonts w:ascii="Calibri" w:cs="Calibri" w:eastAsia="Calibri" w:hAnsi="Calibri"/>
+        </w:rPr>
+        <w:t xml:space="preserve"> (Tácticas, Técnicas y Procedimientos) del incidente con las de otros ataques conocidos.</w:t>
+      </w:r>
+    </w:p>
+    <w:p>
+      <w:pPr>
+        <w:pStyle w:val="ListParagraph"/>
+        <w:numPr>
+          <w:ilvl w:val="0"/>
+          <w:numId w:val="2"/>
+        </w:numPr>
+        <w:spacing w:after="60"/>
+      </w:pPr>
+      <w:r>
+        <w:rPr>
+          <w:rFonts w:ascii="Calibri" w:cs="Calibri" w:eastAsia="Calibri" w:hAnsi="Calibri"/>
+        </w:rPr>
+        <w:t xml:space="preserve">Las fuentes de </w:t>
+      </w:r>
+      <w:r>
+        <w:rPr>
+          <w:rFonts w:ascii="Calibri" w:cs="Calibri" w:eastAsia="Calibri" w:hAnsi="Calibri"/>
+          <w:b/>
+          <w:bCs/>
+        </w:rPr>
+        <w:t xml:space="preserve">inteligencia de amenazas</w:t>
+      </w:r>
+      <w:r>
+        <w:rPr>
+          <w:rFonts w:ascii="Calibri" w:cs="Calibri" w:eastAsia="Calibri" w:hAnsi="Calibri"/>
+        </w:rPr>
+        <w:t xml:space="preserve"> ayudan a relacionar las TTP con ataques similares.</w:t>
+      </w:r>
+    </w:p>
+    <w:p>
+      <w:pPr>
+        <w:pStyle w:val="ListParagraph"/>
+        <w:numPr>
+          <w:ilvl w:val="0"/>
+          <w:numId w:val="2"/>
+        </w:numPr>
+        <w:spacing w:after="60"/>
+      </w:pPr>
+      <w:r>
+        <w:rPr>
+          <w:rFonts w:ascii="Calibri" w:cs="Calibri" w:eastAsia="Calibri" w:hAnsi="Calibri"/>
+        </w:rPr>
+        <w:t xml:space="preserve">En amenazas </w:t>
+      </w:r>
+      <w:r>
+        <w:rPr>
+          <w:rFonts w:ascii="Calibri" w:cs="Calibri" w:eastAsia="Calibri" w:hAnsi="Calibri"/>
+          <w:b/>
+          <w:bCs/>
+        </w:rPr>
+        <w:t xml:space="preserve">internas</w:t>
+      </w:r>
+      <w:r>
+        <w:rPr>
+          <w:rFonts w:ascii="Calibri" w:cs="Calibri" w:eastAsia="Calibri" w:hAnsi="Calibri"/>
+        </w:rPr>
+        <w:t xml:space="preserve">, descubrir los dispositivos desde donde se inició el ataque puede llevar directo al actor.</w:t>
+      </w:r>
+    </w:p>
+    <w:p>
+      <w:pPr>
+        <w:pStyle w:val="ListParagraph"/>
+        <w:numPr>
+          <w:ilvl w:val="0"/>
+          <w:numId w:val="2"/>
+        </w:numPr>
+        <w:spacing w:after="60"/>
+      </w:pPr>
+      <w:r>
+        <w:rPr>
+          <w:rFonts w:ascii="Calibri" w:cs="Calibri" w:eastAsia="Calibri" w:hAnsi="Calibri"/>
+        </w:rPr>
+        <w:t xml:space="preserve">Otra forma de atribuir: </w:t>
+      </w:r>
+      <w:r>
+        <w:rPr>
+          <w:rFonts w:ascii="Calibri" w:cs="Calibri" w:eastAsia="Calibri" w:hAnsi="Calibri"/>
+          <w:b/>
+          <w:bCs/>
+        </w:rPr>
+        <w:t xml:space="preserve">modelar el comportamiento</w:t>
+      </w:r>
+      <w:r>
+        <w:rPr>
+          <w:rFonts w:ascii="Calibri" w:cs="Calibri" w:eastAsia="Calibri" w:hAnsi="Calibri"/>
+        </w:rPr>
+        <w:t xml:space="preserve"> del actor de amenaza.</w:t>
+      </w:r>
+    </w:p>
+    <w:p>
+      <w:pPr>
+        <w:pStyle w:val="ListParagraph"/>
+        <w:numPr>
+          <w:ilvl w:val="0"/>
+          <w:numId w:val="2"/>
+        </w:numPr>
+        <w:spacing w:after="60"/>
+      </w:pPr>
+      <w:r>
+        <w:rPr>
+          <w:rFonts w:ascii="Calibri" w:cs="Calibri" w:eastAsia="Calibri" w:hAnsi="Calibri"/>
+          <w:b/>
+          <w:bCs/>
+        </w:rPr>
+        <w:t xml:space="preserve">MITRE ATT&amp;CK</w:t>
+      </w:r>
+      <w:r>
+        <w:rPr>
+          <w:rFonts w:ascii="Calibri" w:cs="Calibri" w:eastAsia="Calibri" w:hAnsi="Calibri"/>
+        </w:rPr>
+        <w:t xml:space="preserve"> (Marco de Tácticas Adversariales, Técnicas y Conocimiento Común): permite detectar tácticas, técnicas y procedimientos del atacante como parte de la defensa y la atribución.</w:t>
+      </w:r>
+    </w:p>
+    <w:p>
+      <w:pPr>
+        <w:spacing w:after="120" w:before="280"/>
+      </w:pPr>
+      <w:r>
+        <w:rPr>
+          <w:rFonts w:ascii="Calibri" w:cs="Calibri" w:eastAsia="Calibri" w:hAnsi="Calibri"/>
+          <w:b/>
+          <w:bCs/>
+        </w:rPr>
+        <w:t xml:space="preserve">2. La Cadena de Eliminación Cibernética (Cyber Kill Chain)</w:t>
+      </w:r>
+    </w:p>
+    <w:p>
+      <w:pPr>
+        <w:pStyle w:val="ListParagraph"/>
+        <w:numPr>
+          <w:ilvl w:val="0"/>
+          <w:numId w:val="2"/>
+        </w:numPr>
+        <w:spacing w:after="60"/>
+      </w:pPr>
+      <w:r>
+        <w:rPr>
+          <w:rFonts w:ascii="Calibri" w:cs="Calibri" w:eastAsia="Calibri" w:hAnsi="Calibri"/>
+        </w:rPr>
+        <w:t xml:space="preserve">Tiene </w:t>
+      </w:r>
+      <w:r>
+        <w:rPr>
+          <w:rFonts w:ascii="Calibri" w:cs="Calibri" w:eastAsia="Calibri" w:hAnsi="Calibri"/>
+          <w:b/>
+          <w:bCs/>
+        </w:rPr>
+        <w:t xml:space="preserve">7 pasos</w:t>
+      </w:r>
+      <w:r>
+        <w:rPr>
+          <w:rFonts w:ascii="Calibri" w:cs="Calibri" w:eastAsia="Calibri" w:hAnsi="Calibri"/>
+        </w:rPr>
+        <w:t xml:space="preserve">. Ayudan a los analistas a entender las </w:t>
+      </w:r>
+      <w:r>
+        <w:rPr>
+          <w:rFonts w:ascii="Calibri" w:cs="Calibri" w:eastAsia="Calibri" w:hAnsi="Calibri"/>
+          <w:b/>
+          <w:bCs/>
+        </w:rPr>
+        <w:t xml:space="preserve">técnicas, herramientas y procedimientos</w:t>
+      </w:r>
+      <w:r>
+        <w:rPr>
+          <w:rFonts w:ascii="Calibri" w:cs="Calibri" w:eastAsia="Calibri" w:hAnsi="Calibri"/>
+        </w:rPr>
+        <w:t xml:space="preserve"> de los actores de amenazas.</w:t>
+      </w:r>
+    </w:p>
+    <w:p>
+      <w:pPr>
+        <w:pStyle w:val="ListParagraph"/>
+        <w:numPr>
+          <w:ilvl w:val="0"/>
+          <w:numId w:val="2"/>
+        </w:numPr>
+        <w:spacing w:after="60"/>
+      </w:pPr>
+      <w:r>
+        <w:rPr>
+          <w:rFonts w:ascii="Calibri" w:cs="Calibri" w:eastAsia="Calibri" w:hAnsi="Calibri"/>
+        </w:rPr>
+        <w:t xml:space="preserve">Al responder a un incidente, el objetivo es </w:t>
+      </w:r>
+      <w:r>
+        <w:rPr>
+          <w:rFonts w:ascii="Calibri" w:cs="Calibri" w:eastAsia="Calibri" w:hAnsi="Calibri"/>
+          <w:b/>
+          <w:bCs/>
+        </w:rPr>
+        <w:t xml:space="preserve">detectar y detener el ataque lo antes posible</w:t>
+      </w:r>
+      <w:r>
+        <w:rPr>
+          <w:rFonts w:ascii="Calibri" w:cs="Calibri" w:eastAsia="Calibri" w:hAnsi="Calibri"/>
+        </w:rPr>
+        <w:t xml:space="preserve"> dentro de la cadena.</w:t>
+      </w:r>
+    </w:p>
+    <w:tbl>
+      <w:tblPr>
+        <w:tblW w:type="dxa" w:w="9360"/>
+        <w:tblBorders>
+          <w:top w:val="single" w:color="auto" w:sz="4"/>
+          <w:left w:val="single" w:color="auto" w:sz="4"/>
+          <w:bottom w:val="single" w:color="auto" w:sz="4"/>
+          <w:right w:val="single" w:color="auto" w:sz="4"/>
+          <w:insideH w:val="single" w:color="auto" w:sz="4"/>
+          <w:insideV w:val="single" w:color="auto" w:sz="4"/>
+        </w:tblBorders>
+      </w:tblPr>
+      <w:tblGrid>
+        <w:gridCol w:w="900"/>
+        <w:gridCol w:w="2500"/>
+        <w:gridCol w:w="5960"/>
+      </w:tblGrid>
+      <w:tr>
+        <w:trPr>
+          <w:tblHeader/>
+        </w:trPr>
+        <w:tc>
+          <w:tcPr>
+            <w:tcW w:type="dxa" w:w="900"/>
+            <w:tcBorders>
+              <w:top w:val="single" w:color="000000" w:sz="4"/>
+              <w:left w:val="single" w:color="000000" w:sz="4"/>
+              <w:bottom w:val="single" w:color="000000" w:sz="4"/>
+              <w:right w:val="single" w:color="000000" w:sz="4"/>
+            </w:tcBorders>
+            <w:shd w:fill="D9D9D9" w:val="clear"/>
+            <w:tcMar>
+              <w:top w:type="dxa" w:w="60"/>
+              <w:left w:type="dxa" w:w="100"/>
+              <w:bottom w:type="dxa" w:w="60"/>
+              <w:right w:type="dxa" w:w="100"/>
+            </w:tcMar>
+          </w:tcPr>
+          <w:p>
+            <w:r>
+              <w:rPr>
+                <w:rFonts w:ascii="Calibri" w:cs="Calibri" w:eastAsia="Calibri" w:hAnsi="Calibri"/>
+                <w:b/>
+                <w:bCs/>
+                <w:color w:val="000000"/>
+              </w:rPr>
+              <w:t xml:space="preserve">N.°</w:t>
+            </w:r>
+          </w:p>
+        </w:tc>
+        <w:tc>
+          <w:tcPr>
+            <w:tcW w:type="dxa" w:w="2500"/>
+            <w:tcBorders>
+              <w:top w:val="single" w:color="000000" w:sz="4"/>
+              <w:left w:val="single" w:color="000000" w:sz="4"/>
+              <w:bottom w:val="single" w:color="000000" w:sz="4"/>
+              <w:right w:val="single" w:color="000000" w:sz="4"/>
+            </w:tcBorders>
+            <w:shd w:fill="D9D9D9" w:val="clear"/>
+            <w:tcMar>
+              <w:top w:type="dxa" w:w="60"/>
+              <w:left w:type="dxa" w:w="100"/>
+              <w:bottom w:type="dxa" w:w="60"/>
+              <w:right w:type="dxa" w:w="100"/>
+            </w:tcMar>
+          </w:tcPr>
+          <w:p>
+            <w:r>
+              <w:rPr>
+                <w:rFonts w:ascii="Calibri" w:cs="Calibri" w:eastAsia="Calibri" w:hAnsi="Calibri"/>
+                <w:b/>
+                <w:bCs/>
+                <w:color w:val="000000"/>
+              </w:rPr>
+              <w:t xml:space="preserve">Paso</w:t>
+            </w:r>
+          </w:p>
+        </w:tc>
+        <w:tc>
+          <w:tcPr>
+            <w:tcW w:type="dxa" w:w="5960"/>
+            <w:tcBorders>
+              <w:top w:val="single" w:color="000000" w:sz="4"/>
+              <w:left w:val="single" w:color="000000" w:sz="4"/>
+              <w:bottom w:val="single" w:color="000000" w:sz="4"/>
+              <w:right w:val="single" w:color="000000" w:sz="4"/>
+            </w:tcBorders>
+            <w:shd w:fill="D9D9D9" w:val="clear"/>
+            <w:tcMar>
+              <w:top w:type="dxa" w:w="60"/>
+              <w:left w:type="dxa" w:w="100"/>
+              <w:bottom w:type="dxa" w:w="60"/>
+              <w:right w:type="dxa" w:w="100"/>
+            </w:tcMar>
+          </w:tcPr>
+          <w:p>
+            <w:r>
+              <w:rPr>
+                <w:rFonts w:ascii="Calibri" w:cs="Calibri" w:eastAsia="Calibri" w:hAnsi="Calibri"/>
+                <w:b/>
+                <w:bCs/>
+                <w:color w:val="000000"/>
+              </w:rPr>
+              <w:t xml:space="preserve">Qué pasa</w:t>
+            </w:r>
+          </w:p>
+        </w:tc>
+      </w:tr>
+      <w:tr>
+        <w:tc>
+          <w:tcPr>
+            <w:tcW w:type="dxa" w:w="900"/>
+            <w:tcBorders>
+              <w:top w:val="single" w:color="000000" w:sz="4"/>
+              <w:left w:val="single" w:color="000000" w:sz="4"/>
+              <w:bottom w:val="single" w:color="000000" w:sz="4"/>
+              <w:right w:val="single" w:color="000000" w:sz="4"/>
+            </w:tcBorders>
+            <w:shd w:fill="FFFFFF" w:val="clear"/>
+            <w:tcMar>
+              <w:top w:type="dxa" w:w="60"/>
+              <w:left w:type="dxa" w:w="100"/>
+              <w:bottom w:type="dxa" w:w="60"/>
+              <w:right w:type="dxa" w:w="100"/>
+            </w:tcMar>
+          </w:tcPr>
+          <w:p>
+            <w:r>
+              <w:rPr>
+                <w:rFonts w:ascii="Calibri" w:cs="Calibri" w:eastAsia="Calibri" w:hAnsi="Calibri"/>
+                <w:b/>
+                <w:bCs/>
+              </w:rPr>
+              <w:t xml:space="preserve">1</w:t>
+            </w:r>
+          </w:p>
+        </w:tc>
+        <w:tc>
+          <w:tcPr>
+            <w:tcW w:type="dxa" w:w="2500"/>
+            <w:tcBorders>
+              <w:top w:val="single" w:color="000000" w:sz="4"/>
+              <w:left w:val="single" w:color="000000" w:sz="4"/>
+              <w:bottom w:val="single" w:color="000000" w:sz="4"/>
+              <w:right w:val="single" w:color="000000" w:sz="4"/>
+            </w:tcBorders>
+            <w:shd w:fill="FFFFFF" w:val="clear"/>
+            <w:tcMar>
+              <w:top w:type="dxa" w:w="60"/>
+              <w:left w:type="dxa" w:w="100"/>
+              <w:bottom w:type="dxa" w:w="60"/>
+              <w:right w:type="dxa" w:w="100"/>
+            </w:tcMar>
+          </w:tcPr>
+          <w:p>
+            <w:r>
+              <w:rPr>
+                <w:rFonts w:ascii="Calibri" w:cs="Calibri" w:eastAsia="Calibri" w:hAnsi="Calibri"/>
+                <w:b/>
+                <w:bCs/>
+              </w:rPr>
+              <w:t xml:space="preserve">Reconocimiento</w:t>
+            </w:r>
+          </w:p>
+        </w:tc>
+        <w:tc>
+          <w:tcPr>
+            <w:tcW w:type="dxa" w:w="5960"/>
+            <w:tcBorders>
+              <w:top w:val="single" w:color="000000" w:sz="4"/>
+              <w:left w:val="single" w:color="000000" w:sz="4"/>
+              <w:bottom w:val="single" w:color="000000" w:sz="4"/>
+              <w:right w:val="single" w:color="000000" w:sz="4"/>
+            </w:tcBorders>
+            <w:shd w:fill="FFFFFF" w:val="clear"/>
+            <w:tcMar>
+              <w:top w:type="dxa" w:w="60"/>
+              <w:left w:type="dxa" w:w="100"/>
+              <w:bottom w:type="dxa" w:w="60"/>
+              <w:right w:type="dxa" w:w="100"/>
+            </w:tcMar>
+          </w:tcPr>
+          <w:p>
+            <w:r>
+              <w:rPr>
+                <w:rFonts w:ascii="Calibri" w:cs="Calibri" w:eastAsia="Calibri" w:hAnsi="Calibri"/>
+              </w:rPr>
+              <w:t xml:space="preserve">El actor de amenaza hace una </w:t>
+            </w:r>
+            <w:r>
+              <w:rPr>
+                <w:rFonts w:ascii="Calibri" w:cs="Calibri" w:eastAsia="Calibri" w:hAnsi="Calibri"/>
+                <w:b/>
+                <w:bCs/>
+              </w:rPr>
+              <w:t xml:space="preserve">búsqueda</w:t>
+            </w:r>
+            <w:r>
+              <w:rPr>
+                <w:rFonts w:ascii="Calibri" w:cs="Calibri" w:eastAsia="Calibri" w:hAnsi="Calibri"/>
+              </w:rPr>
+              <w:t xml:space="preserve">, reúne inteligencia y selecciona objetivos</w:t>
+            </w:r>
+          </w:p>
+        </w:tc>
+      </w:tr>
+      <w:tr>
+        <w:tc>
+          <w:tcPr>
+            <w:tcW w:type="dxa" w:w="900"/>
+            <w:tcBorders>
+              <w:top w:val="single" w:color="000000" w:sz="4"/>
+              <w:left w:val="single" w:color="000000" w:sz="4"/>
+              <w:bottom w:val="single" w:color="000000" w:sz="4"/>
+              <w:right w:val="single" w:color="000000" w:sz="4"/>
+            </w:tcBorders>
+            <w:shd w:fill="FFFFFF" w:val="clear"/>
+            <w:tcMar>
+              <w:top w:type="dxa" w:w="60"/>
+              <w:left w:type="dxa" w:w="100"/>
+              <w:bottom w:type="dxa" w:w="60"/>
+              <w:right w:type="dxa" w:w="100"/>
+            </w:tcMar>
+          </w:tcPr>
+          <w:p>
+            <w:r>
+              <w:rPr>
+                <w:rFonts w:ascii="Calibri" w:cs="Calibri" w:eastAsia="Calibri" w:hAnsi="Calibri"/>
+                <w:b/>
+                <w:bCs/>
+              </w:rPr>
+              <w:t xml:space="preserve">2</w:t>
+            </w:r>
+          </w:p>
+        </w:tc>
+        <w:tc>
+          <w:tcPr>
+            <w:tcW w:type="dxa" w:w="2500"/>
+            <w:tcBorders>
+              <w:top w:val="single" w:color="000000" w:sz="4"/>
+              <w:left w:val="single" w:color="000000" w:sz="4"/>
+              <w:bottom w:val="single" w:color="000000" w:sz="4"/>
+              <w:right w:val="single" w:color="000000" w:sz="4"/>
+            </w:tcBorders>
+            <w:shd w:fill="FFFFFF" w:val="clear"/>
+            <w:tcMar>
+              <w:top w:type="dxa" w:w="60"/>
+              <w:left w:type="dxa" w:w="100"/>
+              <w:bottom w:type="dxa" w:w="60"/>
+              <w:right w:type="dxa" w:w="100"/>
+            </w:tcMar>
+          </w:tcPr>
+          <w:p>
+            <w:r>
+              <w:rPr>
+                <w:rFonts w:ascii="Calibri" w:cs="Calibri" w:eastAsia="Calibri" w:hAnsi="Calibri"/>
+                <w:b/>
+                <w:bCs/>
+              </w:rPr>
+              <w:t xml:space="preserve">Armamentización</w:t>
+            </w:r>
+          </w:p>
+        </w:tc>
+        <w:tc>
+          <w:tcPr>
+            <w:tcW w:type="dxa" w:w="5960"/>
+            <w:tcBorders>
+              <w:top w:val="single" w:color="000000" w:sz="4"/>
+              <w:left w:val="single" w:color="000000" w:sz="4"/>
+              <w:bottom w:val="single" w:color="000000" w:sz="4"/>
+              <w:right w:val="single" w:color="000000" w:sz="4"/>
+            </w:tcBorders>
+            <w:shd w:fill="FFFFFF" w:val="clear"/>
+            <w:tcMar>
+              <w:top w:type="dxa" w:w="60"/>
+              <w:left w:type="dxa" w:w="100"/>
+              <w:bottom w:type="dxa" w:w="60"/>
+              <w:right w:type="dxa" w:w="100"/>
+            </w:tcMar>
+          </w:tcPr>
+          <w:p>
+            <w:r>
+              <w:rPr>
+                <w:rFonts w:ascii="Calibri" w:cs="Calibri" w:eastAsia="Calibri" w:hAnsi="Calibri"/>
+              </w:rPr>
+              <w:t xml:space="preserve">Usa la información del reconocimiento para </w:t>
+            </w:r>
+            <w:r>
+              <w:rPr>
+                <w:rFonts w:ascii="Calibri" w:cs="Calibri" w:eastAsia="Calibri" w:hAnsi="Calibri"/>
+                <w:b/>
+                <w:bCs/>
+              </w:rPr>
+              <w:t xml:space="preserve">desarrollar un arma</w:t>
+            </w:r>
+            <w:r>
+              <w:rPr>
+                <w:rFonts w:ascii="Calibri" w:cs="Calibri" w:eastAsia="Calibri" w:hAnsi="Calibri"/>
+              </w:rPr>
+              <w:t xml:space="preserve"> contra sistemas o individuos que son blancos específicos</w:t>
+            </w:r>
+          </w:p>
+        </w:tc>
+      </w:tr>
+      <w:tr>
+        <w:tc>
+          <w:tcPr>
+            <w:tcW w:type="dxa" w:w="900"/>
+            <w:tcBorders>
+              <w:top w:val="single" w:color="000000" w:sz="4"/>
+              <w:left w:val="single" w:color="000000" w:sz="4"/>
+              <w:bottom w:val="single" w:color="000000" w:sz="4"/>
+              <w:right w:val="single" w:color="000000" w:sz="4"/>
+            </w:tcBorders>
+            <w:shd w:fill="FFFFFF" w:val="clear"/>
+            <w:tcMar>
+              <w:top w:type="dxa" w:w="60"/>
+              <w:left w:type="dxa" w:w="100"/>
+              <w:bottom w:type="dxa" w:w="60"/>
+              <w:right w:type="dxa" w:w="100"/>
+            </w:tcMar>
+          </w:tcPr>
+          <w:p>
+            <w:r>
+              <w:rPr>
+                <w:rFonts w:ascii="Calibri" w:cs="Calibri" w:eastAsia="Calibri" w:hAnsi="Calibri"/>
+                <w:b/>
+                <w:bCs/>
+              </w:rPr>
+              <w:t xml:space="preserve">3</w:t>
+            </w:r>
+          </w:p>
+        </w:tc>
+        <w:tc>
+          <w:tcPr>
+            <w:tcW w:type="dxa" w:w="2500"/>
+            <w:tcBorders>
+              <w:top w:val="single" w:color="000000" w:sz="4"/>
+              <w:left w:val="single" w:color="000000" w:sz="4"/>
+              <w:bottom w:val="single" w:color="000000" w:sz="4"/>
+              <w:right w:val="single" w:color="000000" w:sz="4"/>
+            </w:tcBorders>
+            <w:shd w:fill="FFFFFF" w:val="clear"/>
+            <w:tcMar>
+              <w:top w:type="dxa" w:w="60"/>
+              <w:left w:type="dxa" w:w="100"/>
+              <w:bottom w:type="dxa" w:w="60"/>
+              <w:right w:type="dxa" w:w="100"/>
+            </w:tcMar>
+          </w:tcPr>
+          <w:p>
+            <w:r>
+              <w:rPr>
+                <w:rFonts w:ascii="Calibri" w:cs="Calibri" w:eastAsia="Calibri" w:hAnsi="Calibri"/>
+                <w:b/>
+                <w:bCs/>
+              </w:rPr>
+              <w:t xml:space="preserve">Entrega</w:t>
+            </w:r>
+          </w:p>
+        </w:tc>
+        <w:tc>
+          <w:tcPr>
+            <w:tcW w:type="dxa" w:w="5960"/>
+            <w:tcBorders>
+              <w:top w:val="single" w:color="000000" w:sz="4"/>
+              <w:left w:val="single" w:color="000000" w:sz="4"/>
+              <w:bottom w:val="single" w:color="000000" w:sz="4"/>
+              <w:right w:val="single" w:color="000000" w:sz="4"/>
+            </w:tcBorders>
+            <w:shd w:fill="FFFFFF" w:val="clear"/>
+            <w:tcMar>
+              <w:top w:type="dxa" w:w="60"/>
+              <w:left w:type="dxa" w:w="100"/>
+              <w:bottom w:type="dxa" w:w="60"/>
+              <w:right w:type="dxa" w:w="100"/>
+            </w:tcMar>
+          </w:tcPr>
+          <w:p>
+            <w:r>
+              <w:rPr>
+                <w:rFonts w:ascii="Calibri" w:cs="Calibri" w:eastAsia="Calibri" w:hAnsi="Calibri"/>
+              </w:rPr>
+              <w:t xml:space="preserve">El arma se transmite a los objetivos usando un </w:t>
+            </w:r>
+            <w:r>
+              <w:rPr>
+                <w:rFonts w:ascii="Calibri" w:cs="Calibri" w:eastAsia="Calibri" w:hAnsi="Calibri"/>
+                <w:b/>
+                <w:bCs/>
+              </w:rPr>
+              <w:t xml:space="preserve">vector de entrega</w:t>
+            </w:r>
+          </w:p>
+        </w:tc>
+      </w:tr>
+      <w:tr>
+        <w:tc>
+          <w:tcPr>
+            <w:tcW w:type="dxa" w:w="900"/>
+            <w:tcBorders>
+              <w:top w:val="single" w:color="000000" w:sz="4"/>
+              <w:left w:val="single" w:color="000000" w:sz="4"/>
+              <w:bottom w:val="single" w:color="000000" w:sz="4"/>
+              <w:right w:val="single" w:color="000000" w:sz="4"/>
+            </w:tcBorders>
+            <w:shd w:fill="FFFFFF" w:val="clear"/>
+            <w:tcMar>
+              <w:top w:type="dxa" w:w="60"/>
+              <w:left w:type="dxa" w:w="100"/>
+              <w:bottom w:type="dxa" w:w="60"/>
+              <w:right w:type="dxa" w:w="100"/>
+            </w:tcMar>
+          </w:tcPr>
+          <w:p>
+            <w:r>
+              <w:rPr>
+                <w:rFonts w:ascii="Calibri" w:cs="Calibri" w:eastAsia="Calibri" w:hAnsi="Calibri"/>
+                <w:b/>
+                <w:bCs/>
+              </w:rPr>
+              <w:t xml:space="preserve">4</w:t>
+            </w:r>
+          </w:p>
+        </w:tc>
+        <w:tc>
+          <w:tcPr>
+            <w:tcW w:type="dxa" w:w="2500"/>
+            <w:tcBorders>
+              <w:top w:val="single" w:color="000000" w:sz="4"/>
+              <w:left w:val="single" w:color="000000" w:sz="4"/>
+              <w:bottom w:val="single" w:color="000000" w:sz="4"/>
+              <w:right w:val="single" w:color="000000" w:sz="4"/>
+            </w:tcBorders>
+            <w:shd w:fill="FFFFFF" w:val="clear"/>
+            <w:tcMar>
+              <w:top w:type="dxa" w:w="60"/>
+              <w:left w:type="dxa" w:w="100"/>
+              <w:bottom w:type="dxa" w:w="60"/>
+              <w:right w:type="dxa" w:w="100"/>
+            </w:tcMar>
+          </w:tcPr>
+          <w:p>
+            <w:r>
+              <w:rPr>
+                <w:rFonts w:ascii="Calibri" w:cs="Calibri" w:eastAsia="Calibri" w:hAnsi="Calibri"/>
+                <w:b/>
+                <w:bCs/>
+              </w:rPr>
+              <w:t xml:space="preserve">Explotación</w:t>
+            </w:r>
+          </w:p>
+        </w:tc>
+        <w:tc>
+          <w:tcPr>
+            <w:tcW w:type="dxa" w:w="5960"/>
+            <w:tcBorders>
+              <w:top w:val="single" w:color="000000" w:sz="4"/>
+              <w:left w:val="single" w:color="000000" w:sz="4"/>
+              <w:bottom w:val="single" w:color="000000" w:sz="4"/>
+              <w:right w:val="single" w:color="000000" w:sz="4"/>
+            </w:tcBorders>
+            <w:shd w:fill="FFFFFF" w:val="clear"/>
+            <w:tcMar>
+              <w:top w:type="dxa" w:w="60"/>
+              <w:left w:type="dxa" w:w="100"/>
+              <w:bottom w:type="dxa" w:w="60"/>
+              <w:right w:type="dxa" w:w="100"/>
+            </w:tcMar>
+          </w:tcPr>
+          <w:p>
+            <w:r>
+              <w:rPr>
+                <w:rFonts w:ascii="Calibri" w:cs="Calibri" w:eastAsia="Calibri" w:hAnsi="Calibri"/>
+              </w:rPr>
+              <w:t xml:space="preserve">Una vez entregada el arma, el actor la explota para </w:t>
+            </w:r>
+            <w:r>
+              <w:rPr>
+                <w:rFonts w:ascii="Calibri" w:cs="Calibri" w:eastAsia="Calibri" w:hAnsi="Calibri"/>
+                <w:b/>
+                <w:bCs/>
+              </w:rPr>
+              <w:t xml:space="preserve">obtener el control</w:t>
+            </w:r>
+            <w:r>
+              <w:rPr>
+                <w:rFonts w:ascii="Calibri" w:cs="Calibri" w:eastAsia="Calibri" w:hAnsi="Calibri"/>
+              </w:rPr>
+              <w:t xml:space="preserve"> del objetivo</w:t>
+            </w:r>
+          </w:p>
+        </w:tc>
+      </w:tr>
+      <w:tr>
+        <w:tc>
+          <w:tcPr>
+            <w:tcW w:type="dxa" w:w="900"/>
+            <w:tcBorders>
+              <w:top w:val="single" w:color="000000" w:sz="4"/>
+              <w:left w:val="single" w:color="000000" w:sz="4"/>
+              <w:bottom w:val="single" w:color="000000" w:sz="4"/>
+              <w:right w:val="single" w:color="000000" w:sz="4"/>
+            </w:tcBorders>
+            <w:shd w:fill="FFFFFF" w:val="clear"/>
+            <w:tcMar>
+              <w:top w:type="dxa" w:w="60"/>
+              <w:left w:type="dxa" w:w="100"/>
+              <w:bottom w:type="dxa" w:w="60"/>
+              <w:right w:type="dxa" w:w="100"/>
+            </w:tcMar>
+          </w:tcPr>
+          <w:p>
+            <w:r>
+              <w:rPr>
+                <w:rFonts w:ascii="Calibri" w:cs="Calibri" w:eastAsia="Calibri" w:hAnsi="Calibri"/>
+                <w:b/>
+                <w:bCs/>
+              </w:rPr>
+              <w:t xml:space="preserve">5</w:t>
+            </w:r>
+          </w:p>
+        </w:tc>
+        <w:tc>
+          <w:tcPr>
+            <w:tcW w:type="dxa" w:w="2500"/>
+            <w:tcBorders>
+              <w:top w:val="single" w:color="000000" w:sz="4"/>
+              <w:left w:val="single" w:color="000000" w:sz="4"/>
+              <w:bottom w:val="single" w:color="000000" w:sz="4"/>
+              <w:right w:val="single" w:color="000000" w:sz="4"/>
+            </w:tcBorders>
+            <w:shd w:fill="FFFFFF" w:val="clear"/>
+            <w:tcMar>
+              <w:top w:type="dxa" w:w="60"/>
+              <w:left w:type="dxa" w:w="100"/>
+              <w:bottom w:type="dxa" w:w="60"/>
+              <w:right w:type="dxa" w:w="100"/>
+            </w:tcMar>
+          </w:tcPr>
+          <w:p>
+            <w:r>
+              <w:rPr>
+                <w:rFonts w:ascii="Calibri" w:cs="Calibri" w:eastAsia="Calibri" w:hAnsi="Calibri"/>
+                <w:b/>
+                <w:bCs/>
+              </w:rPr>
+              <w:t xml:space="preserve">Instalación</w:t>
+            </w:r>
+          </w:p>
+        </w:tc>
+        <w:tc>
+          <w:tcPr>
+            <w:tcW w:type="dxa" w:w="5960"/>
+            <w:tcBorders>
+              <w:top w:val="single" w:color="000000" w:sz="4"/>
+              <w:left w:val="single" w:color="000000" w:sz="4"/>
+              <w:bottom w:val="single" w:color="000000" w:sz="4"/>
+              <w:right w:val="single" w:color="000000" w:sz="4"/>
+            </w:tcBorders>
+            <w:shd w:fill="FFFFFF" w:val="clear"/>
+            <w:tcMar>
+              <w:top w:type="dxa" w:w="60"/>
+              <w:left w:type="dxa" w:w="100"/>
+              <w:bottom w:type="dxa" w:w="60"/>
+              <w:right w:type="dxa" w:w="100"/>
+            </w:tcMar>
+          </w:tcPr>
+          <w:p>
+            <w:r>
+              <w:rPr>
+                <w:rFonts w:ascii="Calibri" w:cs="Calibri" w:eastAsia="Calibri" w:hAnsi="Calibri"/>
+              </w:rPr>
+              <w:t xml:space="preserve">El actor establece una </w:t>
+            </w:r>
+            <w:r>
+              <w:rPr>
+                <w:rFonts w:ascii="Calibri" w:cs="Calibri" w:eastAsia="Calibri" w:hAnsi="Calibri"/>
+                <w:b/>
+                <w:bCs/>
+              </w:rPr>
+              <w:t xml:space="preserve">puerta trasera</w:t>
+            </w:r>
+            <w:r>
+              <w:rPr>
+                <w:rFonts w:ascii="Calibri" w:cs="Calibri" w:eastAsia="Calibri" w:hAnsi="Calibri"/>
+              </w:rPr>
+              <w:t xml:space="preserve"> para seguir accediendo al objetivo. Es importante que el acceso remoto no alerte a los analistas ni a los usuarios</w:t>
+            </w:r>
+          </w:p>
+        </w:tc>
+      </w:tr>
+      <w:tr>
+        <w:tc>
+          <w:tcPr>
+            <w:tcW w:type="dxa" w:w="900"/>
+            <w:tcBorders>
+              <w:top w:val="single" w:color="000000" w:sz="4"/>
+              <w:left w:val="single" w:color="000000" w:sz="4"/>
+              <w:bottom w:val="single" w:color="000000" w:sz="4"/>
+              <w:right w:val="single" w:color="000000" w:sz="4"/>
+            </w:tcBorders>
+            <w:shd w:fill="FFFFFF" w:val="clear"/>
+            <w:tcMar>
+              <w:top w:type="dxa" w:w="60"/>
+              <w:left w:type="dxa" w:w="100"/>
+              <w:bottom w:type="dxa" w:w="60"/>
+              <w:right w:type="dxa" w:w="100"/>
+            </w:tcMar>
+          </w:tcPr>
+          <w:p>
+            <w:r>
+              <w:rPr>
+                <w:rFonts w:ascii="Calibri" w:cs="Calibri" w:eastAsia="Calibri" w:hAnsi="Calibri"/>
+                <w:b/>
+                <w:bCs/>
+              </w:rPr>
+              <w:t xml:space="preserve">6</w:t>
+            </w:r>
+          </w:p>
+        </w:tc>
+        <w:tc>
+          <w:tcPr>
+            <w:tcW w:type="dxa" w:w="2500"/>
+            <w:tcBorders>
+              <w:top w:val="single" w:color="000000" w:sz="4"/>
+              <w:left w:val="single" w:color="000000" w:sz="4"/>
+              <w:bottom w:val="single" w:color="000000" w:sz="4"/>
+              <w:right w:val="single" w:color="000000" w:sz="4"/>
+            </w:tcBorders>
+            <w:shd w:fill="FFFFFF" w:val="clear"/>
+            <w:tcMar>
+              <w:top w:type="dxa" w:w="60"/>
+              <w:left w:type="dxa" w:w="100"/>
+              <w:bottom w:type="dxa" w:w="60"/>
+              <w:right w:type="dxa" w:w="100"/>
+            </w:tcMar>
+          </w:tcPr>
+          <w:p>
+            <w:r>
+              <w:rPr>
+                <w:rFonts w:ascii="Calibri" w:cs="Calibri" w:eastAsia="Calibri" w:hAnsi="Calibri"/>
+                <w:b/>
+                <w:bCs/>
+              </w:rPr>
+              <w:t xml:space="preserve">Comando y Control (CnC)</w:t>
+            </w:r>
+          </w:p>
+        </w:tc>
+        <w:tc>
+          <w:tcPr>
+            <w:tcW w:type="dxa" w:w="5960"/>
+            <w:tcBorders>
+              <w:top w:val="single" w:color="000000" w:sz="4"/>
+              <w:left w:val="single" w:color="000000" w:sz="4"/>
+              <w:bottom w:val="single" w:color="000000" w:sz="4"/>
+              <w:right w:val="single" w:color="000000" w:sz="4"/>
+            </w:tcBorders>
+            <w:shd w:fill="FFFFFF" w:val="clear"/>
+            <w:tcMar>
+              <w:top w:type="dxa" w:w="60"/>
+              <w:left w:type="dxa" w:w="100"/>
+              <w:bottom w:type="dxa" w:w="60"/>
+              <w:right w:type="dxa" w:w="100"/>
+            </w:tcMar>
+          </w:tcPr>
+          <w:p>
+            <w:r>
+              <w:rPr>
+                <w:rFonts w:ascii="Calibri" w:cs="Calibri" w:eastAsia="Calibri" w:hAnsi="Calibri"/>
+              </w:rPr>
+              <w:t xml:space="preserve">El actor </w:t>
+            </w:r>
+            <w:r>
+              <w:rPr>
+                <w:rFonts w:ascii="Calibri" w:cs="Calibri" w:eastAsia="Calibri" w:hAnsi="Calibri"/>
+                <w:b/>
+                <w:bCs/>
+              </w:rPr>
+              <w:t xml:space="preserve">establece el control</w:t>
+            </w:r>
+            <w:r>
+              <w:rPr>
+                <w:rFonts w:ascii="Calibri" w:cs="Calibri" w:eastAsia="Calibri" w:hAnsi="Calibri"/>
+              </w:rPr>
+              <w:t xml:space="preserve"> sobre el objetivo. Usa los canales de CnC para </w:t>
+            </w:r>
+            <w:r>
+              <w:rPr>
+                <w:rFonts w:ascii="Calibri" w:cs="Calibri" w:eastAsia="Calibri" w:hAnsi="Calibri"/>
+                <w:b/>
+                <w:bCs/>
+              </w:rPr>
+              <w:t xml:space="preserve">emitir comandos</w:t>
+            </w:r>
+            <w:r>
+              <w:rPr>
+                <w:rFonts w:ascii="Calibri" w:cs="Calibri" w:eastAsia="Calibri" w:hAnsi="Calibri"/>
+              </w:rPr>
+              <w:t xml:space="preserve"> al software instalado</w:t>
+            </w:r>
+          </w:p>
+        </w:tc>
+      </w:tr>
+      <w:tr>
+        <w:tc>
+          <w:tcPr>
+            <w:tcW w:type="dxa" w:w="900"/>
+            <w:tcBorders>
+              <w:top w:val="single" w:color="000000" w:sz="4"/>
+              <w:left w:val="single" w:color="000000" w:sz="4"/>
+              <w:bottom w:val="single" w:color="000000" w:sz="4"/>
+              <w:right w:val="single" w:color="000000" w:sz="4"/>
+            </w:tcBorders>
+            <w:shd w:fill="FFFFFF" w:val="clear"/>
+            <w:tcMar>
+              <w:top w:type="dxa" w:w="60"/>
+              <w:left w:type="dxa" w:w="100"/>
+              <w:bottom w:type="dxa" w:w="60"/>
+              <w:right w:type="dxa" w:w="100"/>
+            </w:tcMar>
+          </w:tcPr>
+          <w:p>
+            <w:r>
+              <w:rPr>
+                <w:rFonts w:ascii="Calibri" w:cs="Calibri" w:eastAsia="Calibri" w:hAnsi="Calibri"/>
+                <w:b/>
+                <w:bCs/>
+              </w:rPr>
+              <w:t xml:space="preserve">7</w:t>
+            </w:r>
+          </w:p>
+        </w:tc>
+        <w:tc>
+          <w:tcPr>
+            <w:tcW w:type="dxa" w:w="2500"/>
+            <w:tcBorders>
+              <w:top w:val="single" w:color="000000" w:sz="4"/>
+              <w:left w:val="single" w:color="000000" w:sz="4"/>
+              <w:bottom w:val="single" w:color="000000" w:sz="4"/>
+              <w:right w:val="single" w:color="000000" w:sz="4"/>
+            </w:tcBorders>
+            <w:shd w:fill="FFFFFF" w:val="clear"/>
+            <w:tcMar>
+              <w:top w:type="dxa" w:w="60"/>
+              <w:left w:type="dxa" w:w="100"/>
+              <w:bottom w:type="dxa" w:w="60"/>
+              <w:right w:type="dxa" w:w="100"/>
+            </w:tcMar>
+          </w:tcPr>
+          <w:p>
+            <w:r>
+              <w:rPr>
+                <w:rFonts w:ascii="Calibri" w:cs="Calibri" w:eastAsia="Calibri" w:hAnsi="Calibri"/>
+                <w:b/>
+                <w:bCs/>
+              </w:rPr>
+              <w:t xml:space="preserve">Acciones sobre Objetivos</w:t>
+            </w:r>
+          </w:p>
+        </w:tc>
+        <w:tc>
+          <w:tcPr>
+            <w:tcW w:type="dxa" w:w="5960"/>
+            <w:tcBorders>
+              <w:top w:val="single" w:color="000000" w:sz="4"/>
+              <w:left w:val="single" w:color="000000" w:sz="4"/>
+              <w:bottom w:val="single" w:color="000000" w:sz="4"/>
+              <w:right w:val="single" w:color="000000" w:sz="4"/>
+            </w:tcBorders>
+            <w:shd w:fill="FFFFFF" w:val="clear"/>
+            <w:tcMar>
+              <w:top w:type="dxa" w:w="60"/>
+              <w:left w:type="dxa" w:w="100"/>
+              <w:bottom w:type="dxa" w:w="60"/>
+              <w:right w:type="dxa" w:w="100"/>
+            </w:tcMar>
+          </w:tcPr>
+          <w:p>
+            <w:r>
+              <w:rPr>
+                <w:rFonts w:ascii="Calibri" w:cs="Calibri" w:eastAsia="Calibri" w:hAnsi="Calibri"/>
+              </w:rPr>
+              <w:t xml:space="preserve">El agente de amenaza consigue su objetivo original: </w:t>
+            </w:r>
+            <w:r>
+              <w:rPr>
+                <w:rFonts w:ascii="Calibri" w:cs="Calibri" w:eastAsia="Calibri" w:hAnsi="Calibri"/>
+                <w:b/>
+                <w:bCs/>
+              </w:rPr>
+              <w:t xml:space="preserve">robo de datos</w:t>
+            </w:r>
+            <w:r>
+              <w:rPr>
+                <w:rFonts w:ascii="Calibri" w:cs="Calibri" w:eastAsia="Calibri" w:hAnsi="Calibri"/>
+              </w:rPr>
+              <w:t xml:space="preserve">, un ataque </w:t>
+            </w:r>
+            <w:r>
+              <w:rPr>
+                <w:rFonts w:ascii="Calibri" w:cs="Calibri" w:eastAsia="Calibri" w:hAnsi="Calibri"/>
+                <w:b/>
+                <w:bCs/>
+              </w:rPr>
+              <w:t xml:space="preserve">DDoS</w:t>
+            </w:r>
+            <w:r>
+              <w:rPr>
+                <w:rFonts w:ascii="Calibri" w:cs="Calibri" w:eastAsia="Calibri" w:hAnsi="Calibri"/>
+              </w:rPr>
+              <w:t xml:space="preserve"> o usar la red atacada para enviar </w:t>
+            </w:r>
+            <w:r>
+              <w:rPr>
+                <w:rFonts w:ascii="Calibri" w:cs="Calibri" w:eastAsia="Calibri" w:hAnsi="Calibri"/>
+                <w:b/>
+                <w:bCs/>
+              </w:rPr>
+              <w:t xml:space="preserve">correo no deseado</w:t>
+            </w:r>
+            <w:r>
+              <w:rPr>
+                <w:rFonts w:ascii="Calibri" w:cs="Calibri" w:eastAsia="Calibri" w:hAnsi="Calibri"/>
+              </w:rPr>
+              <w:t xml:space="preserve"> o </w:t>
+            </w:r>
+            <w:r>
+              <w:rPr>
+                <w:rFonts w:ascii="Calibri" w:cs="Calibri" w:eastAsia="Calibri" w:hAnsi="Calibri"/>
+                <w:b/>
+                <w:bCs/>
+              </w:rPr>
+              <w:t xml:space="preserve">minar Bitcoin</w:t>
+            </w:r>
+          </w:p>
+        </w:tc>
+      </w:tr>
+    </w:tbl>
+    <w:p>
+      <w:pPr>
+        <w:spacing w:after="80"/>
+      </w:pPr>
+    </w:p>
+    <w:p>
+      <w:pPr>
+        <w:spacing w:after="120" w:before="280"/>
+      </w:pPr>
+      <w:r>
+        <w:rPr>
+          <w:rFonts w:ascii="Calibri" w:cs="Calibri" w:eastAsia="Calibri" w:hAnsi="Calibri"/>
+          <w:b/>
+          <w:bCs/>
+        </w:rPr>
+        <w:t xml:space="preserve">3. El Modelo de Diamante del Análisis de Intrusiones</w:t>
+      </w:r>
+    </w:p>
+    <w:p>
+      <w:pPr>
+        <w:pStyle w:val="ListParagraph"/>
+        <w:numPr>
+          <w:ilvl w:val="0"/>
+          <w:numId w:val="2"/>
+        </w:numPr>
+        <w:spacing w:after="60"/>
+      </w:pPr>
+      <w:r>
+        <w:rPr>
+          <w:rFonts w:ascii="Calibri" w:cs="Calibri" w:eastAsia="Calibri" w:hAnsi="Calibri"/>
+        </w:rPr>
+        <w:t xml:space="preserve">Representa un </w:t>
+      </w:r>
+      <w:r>
+        <w:rPr>
+          <w:rFonts w:ascii="Calibri" w:cs="Calibri" w:eastAsia="Calibri" w:hAnsi="Calibri"/>
+          <w:b/>
+          <w:bCs/>
+        </w:rPr>
+        <w:t xml:space="preserve">incidente o evento de seguridad</w:t>
+      </w:r>
+      <w:r>
+        <w:rPr>
+          <w:rFonts w:ascii="Calibri" w:cs="Calibri" w:eastAsia="Calibri" w:hAnsi="Calibri"/>
+        </w:rPr>
+        <w:t xml:space="preserve">.</w:t>
+      </w:r>
+    </w:p>
+    <w:p>
+      <w:pPr>
+        <w:pStyle w:val="ListParagraph"/>
+        <w:numPr>
+          <w:ilvl w:val="0"/>
+          <w:numId w:val="2"/>
+        </w:numPr>
+        <w:spacing w:after="60"/>
+      </w:pPr>
+      <w:r>
+        <w:rPr>
+          <w:rFonts w:ascii="Calibri" w:cs="Calibri" w:eastAsia="Calibri" w:hAnsi="Calibri"/>
+          <w:b/>
+          <w:bCs/>
+        </w:rPr>
+        <w:t xml:space="preserve">Evento:</w:t>
+      </w:r>
+      <w:r>
+        <w:rPr>
+          <w:rFonts w:ascii="Calibri" w:cs="Calibri" w:eastAsia="Calibri" w:hAnsi="Calibri"/>
+        </w:rPr>
+        <w:t xml:space="preserve"> una actividad de tiempo limitado, restringida a un paso específico, donde el adversario usa la capacidad sobre la infraestructura para atacar una víctima y lograr un resultado específico.</w:t>
+      </w:r>
+    </w:p>
+    <w:p>
+      <w:pPr>
+        <w:spacing w:after="80" w:before="160"/>
+      </w:pPr>
+      <w:r>
+        <w:rPr>
+          <w:rFonts w:ascii="Calibri" w:cs="Calibri" w:eastAsia="Calibri" w:hAnsi="Calibri"/>
+          <w:b/>
+          <w:bCs/>
+        </w:rPr>
+        <w:t xml:space="preserve">Los 4 componentes principales</w:t>
+      </w:r>
+    </w:p>
+    <w:p>
+      <w:pPr>
+        <w:pStyle w:val="ListParagraph"/>
+        <w:numPr>
+          <w:ilvl w:val="0"/>
+          <w:numId w:val="2"/>
+        </w:numPr>
+        <w:spacing w:after="60"/>
+      </w:pPr>
+      <w:r>
+        <w:rPr>
+          <w:rFonts w:ascii="Calibri" w:cs="Calibri" w:eastAsia="Calibri" w:hAnsi="Calibri"/>
+          <w:b/>
+          <w:bCs/>
+        </w:rPr>
+        <w:t xml:space="preserve">Adversario</w:t>
+      </w:r>
+    </w:p>
+    <w:p>
+      <w:pPr>
+        <w:pStyle w:val="ListParagraph"/>
+        <w:numPr>
+          <w:ilvl w:val="0"/>
+          <w:numId w:val="2"/>
+        </w:numPr>
+        <w:spacing w:after="60"/>
+      </w:pPr>
+      <w:r>
+        <w:rPr>
+          <w:rFonts w:ascii="Calibri" w:cs="Calibri" w:eastAsia="Calibri" w:hAnsi="Calibri"/>
+          <w:b/>
+          <w:bCs/>
+        </w:rPr>
+        <w:t xml:space="preserve">Capacidad</w:t>
+      </w:r>
+    </w:p>
+    <w:p>
+      <w:pPr>
+        <w:pStyle w:val="ListParagraph"/>
+        <w:numPr>
+          <w:ilvl w:val="0"/>
+          <w:numId w:val="2"/>
+        </w:numPr>
+        <w:spacing w:after="60"/>
+      </w:pPr>
+      <w:r>
+        <w:rPr>
+          <w:rFonts w:ascii="Calibri" w:cs="Calibri" w:eastAsia="Calibri" w:hAnsi="Calibri"/>
+          <w:b/>
+          <w:bCs/>
+        </w:rPr>
+        <w:t xml:space="preserve">Infraestructura</w:t>
+      </w:r>
+    </w:p>
+    <w:p>
+      <w:pPr>
+        <w:pStyle w:val="ListParagraph"/>
+        <w:numPr>
+          <w:ilvl w:val="0"/>
+          <w:numId w:val="2"/>
+        </w:numPr>
+        <w:spacing w:after="60"/>
+      </w:pPr>
+      <w:r>
+        <w:rPr>
+          <w:rFonts w:ascii="Calibri" w:cs="Calibri" w:eastAsia="Calibri" w:hAnsi="Calibri"/>
+          <w:b/>
+          <w:bCs/>
+        </w:rPr>
+        <w:t xml:space="preserve">Víctima</w:t>
+      </w:r>
+    </w:p>
+    <w:p>
+      <w:pPr>
+        <w:spacing w:after="80" w:before="160"/>
+      </w:pPr>
+      <w:r>
+        <w:rPr>
+          <w:rFonts w:ascii="Calibri" w:cs="Calibri" w:eastAsia="Calibri" w:hAnsi="Calibri"/>
+          <w:b/>
+          <w:bCs/>
+        </w:rPr>
+        <w:t xml:space="preserve">Metacaracterísticas</w:t>
+      </w:r>
+    </w:p>
+    <w:p>
+      <w:pPr>
+        <w:pStyle w:val="ListParagraph"/>
+        <w:numPr>
+          <w:ilvl w:val="0"/>
+          <w:numId w:val="2"/>
+        </w:numPr>
+        <w:spacing w:after="60"/>
+      </w:pPr>
+      <w:r>
+        <w:rPr>
+          <w:rFonts w:ascii="Calibri" w:cs="Calibri" w:eastAsia="Calibri" w:hAnsi="Calibri"/>
+        </w:rPr>
+        <w:t xml:space="preserve">Amplían ligeramente el modelo: </w:t>
+      </w:r>
+      <w:r>
+        <w:rPr>
+          <w:rFonts w:ascii="Calibri" w:cs="Calibri" w:eastAsia="Calibri" w:hAnsi="Calibri"/>
+          <w:b/>
+          <w:bCs/>
+        </w:rPr>
+        <w:t xml:space="preserve">marca de tiempo, fase, resultado, dirección, metodología y recursos</w:t>
+      </w:r>
+      <w:r>
+        <w:rPr>
+          <w:rFonts w:ascii="Calibri" w:cs="Calibri" w:eastAsia="Calibri" w:hAnsi="Calibri"/>
+        </w:rPr>
+        <w:t xml:space="preserve">.</w:t>
+      </w:r>
+    </w:p>
+    <w:p>
+      <w:pPr>
+        <w:spacing w:after="80" w:before="160"/>
+      </w:pPr>
+      <w:r>
+        <w:rPr>
+          <w:rFonts w:ascii="Calibri" w:cs="Calibri" w:eastAsia="Calibri" w:hAnsi="Calibri"/>
+          <w:b/>
+          <w:bCs/>
+        </w:rPr>
+        <w:t xml:space="preserve">Uso por el analista</w:t>
+      </w:r>
+    </w:p>
+    <w:p>
+      <w:pPr>
+        <w:pStyle w:val="ListParagraph"/>
+        <w:numPr>
+          <w:ilvl w:val="0"/>
+          <w:numId w:val="2"/>
+        </w:numPr>
+        <w:spacing w:after="60"/>
+      </w:pPr>
+      <w:r>
+        <w:rPr>
+          <w:rFonts w:ascii="Calibri" w:cs="Calibri" w:eastAsia="Calibri" w:hAnsi="Calibri"/>
+        </w:rPr>
+        <w:t xml:space="preserve">Se puede pedir usarlo para </w:t>
+      </w:r>
+      <w:r>
+        <w:rPr>
+          <w:rFonts w:ascii="Calibri" w:cs="Calibri" w:eastAsia="Calibri" w:hAnsi="Calibri"/>
+          <w:b/>
+          <w:bCs/>
+        </w:rPr>
+        <w:t xml:space="preserve">diagramar una serie de eventos de intrusión</w:t>
+      </w:r>
+      <w:r>
+        <w:rPr>
+          <w:rFonts w:ascii="Calibri" w:cs="Calibri" w:eastAsia="Calibri" w:hAnsi="Calibri"/>
+        </w:rPr>
+        <w:t xml:space="preserve">.</w:t>
+      </w:r>
+    </w:p>
+    <w:p>
+      <w:pPr>
+        <w:pStyle w:val="ListParagraph"/>
+        <w:numPr>
+          <w:ilvl w:val="0"/>
+          <w:numId w:val="2"/>
+        </w:numPr>
+        <w:spacing w:after="60"/>
+      </w:pPr>
+      <w:r>
+        <w:rPr>
+          <w:rFonts w:ascii="Calibri" w:cs="Calibri" w:eastAsia="Calibri" w:hAnsi="Calibri"/>
+        </w:rPr>
+        <w:t xml:space="preserve">Los adversarios </w:t>
+      </w:r>
+      <w:r>
+        <w:rPr>
+          <w:rFonts w:ascii="Calibri" w:cs="Calibri" w:eastAsia="Calibri" w:hAnsi="Calibri"/>
+          <w:b/>
+          <w:bCs/>
+        </w:rPr>
+        <w:t xml:space="preserve">no ejecutan un solo evento</w:t>
+      </w:r>
+      <w:r>
+        <w:rPr>
+          <w:rFonts w:ascii="Calibri" w:cs="Calibri" w:eastAsia="Calibri" w:hAnsi="Calibri"/>
+        </w:rPr>
+        <w:t xml:space="preserve">: los eventos se entretejen en una </w:t>
+      </w:r>
+      <w:r>
+        <w:rPr>
+          <w:rFonts w:ascii="Calibri" w:cs="Calibri" w:eastAsia="Calibri" w:hAnsi="Calibri"/>
+          <w:b/>
+          <w:bCs/>
+        </w:rPr>
+        <w:t xml:space="preserve">cadena</w:t>
+      </w:r>
+      <w:r>
+        <w:rPr>
+          <w:rFonts w:ascii="Calibri" w:cs="Calibri" w:eastAsia="Calibri" w:hAnsi="Calibri"/>
+        </w:rPr>
+        <w:t xml:space="preserve">, y cada evento debe completarse con éxito antes del siguiente.</w:t>
+      </w:r>
+    </w:p>
+    <w:p>
+      <w:pPr>
+        <w:pStyle w:val="ListParagraph"/>
+        <w:numPr>
+          <w:ilvl w:val="0"/>
+          <w:numId w:val="2"/>
+        </w:numPr>
+        <w:spacing w:after="60"/>
+      </w:pPr>
+      <w:r>
+        <w:rPr>
+          <w:rFonts w:ascii="Calibri" w:cs="Calibri" w:eastAsia="Calibri" w:hAnsi="Calibri"/>
+        </w:rPr>
+        <w:t xml:space="preserve">Esa serie de eventos se puede asignar a la </w:t>
+      </w:r>
+      <w:r>
+        <w:rPr>
+          <w:rFonts w:ascii="Calibri" w:cs="Calibri" w:eastAsia="Calibri" w:hAnsi="Calibri"/>
+          <w:b/>
+          <w:bCs/>
+        </w:rPr>
+        <w:t xml:space="preserve">Cadena de Eliminación Cibernética</w:t>
+      </w:r>
+      <w:r>
+        <w:rPr>
+          <w:rFonts w:ascii="Calibri" w:cs="Calibri" w:eastAsia="Calibri" w:hAnsi="Calibri"/>
+        </w:rPr>
+        <w:t xml:space="preserve">.</w:t>
+      </w:r>
+    </w:p>
+    <w:p>
+      <w:pPr>
+        <w:spacing w:after="120" w:before="280"/>
+      </w:pPr>
+      <w:r>
+        <w:rPr>
+          <w:rFonts w:ascii="Calibri" w:cs="Calibri" w:eastAsia="Calibri" w:hAnsi="Calibri"/>
+          <w:b/>
+          <w:bCs/>
+        </w:rPr>
+        <w:t xml:space="preserve">4. Respuesta a incidentes</w:t>
+      </w:r>
+    </w:p>
+    <w:p>
+      <w:pPr>
+        <w:spacing w:after="80" w:before="160"/>
+      </w:pPr>
+      <w:r>
+        <w:rPr>
+          <w:rFonts w:ascii="Calibri" w:cs="Calibri" w:eastAsia="Calibri" w:hAnsi="Calibri"/>
+          <w:b/>
+          <w:bCs/>
+        </w:rPr>
+        <w:t xml:space="preserve">Qué es</w:t>
+      </w:r>
+    </w:p>
+    <w:p>
+      <w:pPr>
+        <w:pStyle w:val="ListParagraph"/>
+        <w:numPr>
+          <w:ilvl w:val="0"/>
+          <w:numId w:val="2"/>
+        </w:numPr>
+        <w:spacing w:after="60"/>
+      </w:pPr>
+      <w:r>
+        <w:rPr>
+          <w:rFonts w:ascii="Calibri" w:cs="Calibri" w:eastAsia="Calibri" w:hAnsi="Calibri"/>
+        </w:rPr>
+        <w:t xml:space="preserve">Son los </w:t>
+      </w:r>
+      <w:r>
+        <w:rPr>
+          <w:rFonts w:ascii="Calibri" w:cs="Calibri" w:eastAsia="Calibri" w:hAnsi="Calibri"/>
+          <w:b/>
+          <w:bCs/>
+        </w:rPr>
+        <w:t xml:space="preserve">métodos, políticas y procedimientos</w:t>
+      </w:r>
+      <w:r>
+        <w:rPr>
+          <w:rFonts w:ascii="Calibri" w:cs="Calibri" w:eastAsia="Calibri" w:hAnsi="Calibri"/>
+        </w:rPr>
+        <w:t xml:space="preserve"> que usa una organización para responder a un ciberataque.</w:t>
+      </w:r>
+    </w:p>
+    <w:p>
+      <w:pPr>
+        <w:spacing w:after="100"/>
+      </w:pPr>
+      <w:r>
+        <w:rPr>
+          <w:rFonts w:ascii="Calibri" w:cs="Calibri" w:eastAsia="Calibri" w:hAnsi="Calibri"/>
+        </w:rPr>
+        <w:t xml:space="preserve">Objetivos:</w:t>
+      </w:r>
+    </w:p>
+    <w:p>
+      <w:pPr>
+        <w:pStyle w:val="ListParagraph"/>
+        <w:numPr>
+          <w:ilvl w:val="1"/>
+          <w:numId w:val="2"/>
+        </w:numPr>
+        <w:spacing w:after="60"/>
+      </w:pPr>
+      <w:r>
+        <w:rPr>
+          <w:rFonts w:ascii="Calibri" w:cs="Calibri" w:eastAsia="Calibri" w:hAnsi="Calibri"/>
+          <w:b/>
+          <w:bCs/>
+        </w:rPr>
+        <w:t xml:space="preserve">Limitar el impacto</w:t>
+      </w:r>
+      <w:r>
+        <w:rPr>
+          <w:rFonts w:ascii="Calibri" w:cs="Calibri" w:eastAsia="Calibri" w:hAnsi="Calibri"/>
+        </w:rPr>
+        <w:t xml:space="preserve"> del ataque</w:t>
+      </w:r>
+    </w:p>
+    <w:p>
+      <w:pPr>
+        <w:pStyle w:val="ListParagraph"/>
+        <w:numPr>
+          <w:ilvl w:val="1"/>
+          <w:numId w:val="2"/>
+        </w:numPr>
+        <w:spacing w:after="60"/>
+      </w:pPr>
+      <w:r>
+        <w:rPr>
+          <w:rFonts w:ascii="Calibri" w:cs="Calibri" w:eastAsia="Calibri" w:hAnsi="Calibri"/>
+          <w:b/>
+          <w:bCs/>
+        </w:rPr>
+        <w:t xml:space="preserve">Evaluar los daños y causas</w:t>
+      </w:r>
+    </w:p>
+    <w:p>
+      <w:pPr>
+        <w:pStyle w:val="ListParagraph"/>
+        <w:numPr>
+          <w:ilvl w:val="1"/>
+          <w:numId w:val="2"/>
+        </w:numPr>
+        <w:spacing w:after="60"/>
+      </w:pPr>
+      <w:r>
+        <w:rPr>
+          <w:rFonts w:ascii="Calibri" w:cs="Calibri" w:eastAsia="Calibri" w:hAnsi="Calibri"/>
+          <w:b/>
+          <w:bCs/>
+        </w:rPr>
+        <w:t xml:space="preserve">Implementar procedimientos de recuperación</w:t>
+      </w:r>
+    </w:p>
+    <w:p>
+      <w:pPr>
+        <w:pStyle w:val="ListParagraph"/>
+        <w:numPr>
+          <w:ilvl w:val="0"/>
+          <w:numId w:val="2"/>
+        </w:numPr>
+        <w:spacing w:after="60"/>
+      </w:pPr>
+      <w:r>
+        <w:rPr>
+          <w:rFonts w:ascii="Calibri" w:cs="Calibri" w:eastAsia="Calibri" w:hAnsi="Calibri"/>
+        </w:rPr>
+        <w:t xml:space="preserve">Hay que crear y mantener </w:t>
+      </w:r>
+      <w:r>
+        <w:rPr>
+          <w:rFonts w:ascii="Calibri" w:cs="Calibri" w:eastAsia="Calibri" w:hAnsi="Calibri"/>
+          <w:b/>
+          <w:bCs/>
+        </w:rPr>
+        <w:t xml:space="preserve">planes detallados</w:t>
+      </w:r>
+      <w:r>
+        <w:rPr>
+          <w:rFonts w:ascii="Calibri" w:cs="Calibri" w:eastAsia="Calibri" w:hAnsi="Calibri"/>
+        </w:rPr>
+        <w:t xml:space="preserve"> de respuesta y </w:t>
+      </w:r>
+      <w:r>
+        <w:rPr>
+          <w:rFonts w:ascii="Calibri" w:cs="Calibri" w:eastAsia="Calibri" w:hAnsi="Calibri"/>
+          <w:b/>
+          <w:bCs/>
+        </w:rPr>
+        <w:t xml:space="preserve">designar al personal responsable</w:t>
+      </w:r>
+      <w:r>
+        <w:rPr>
+          <w:rFonts w:ascii="Calibri" w:cs="Calibri" w:eastAsia="Calibri" w:hAnsi="Calibri"/>
+        </w:rPr>
+        <w:t xml:space="preserve"> de ejecutar todos los aspectos del plan.</w:t>
+      </w:r>
+    </w:p>
+    <w:p>
+      <w:pPr>
+        <w:pStyle w:val="ListParagraph"/>
+        <w:numPr>
+          <w:ilvl w:val="0"/>
+          <w:numId w:val="2"/>
+        </w:numPr>
+        <w:spacing w:after="60"/>
+      </w:pPr>
+      <w:r>
+        <w:rPr>
+          <w:rFonts w:ascii="Calibri" w:cs="Calibri" w:eastAsia="Calibri" w:hAnsi="Calibri"/>
+        </w:rPr>
+        <w:t xml:space="preserve">Recomendaciones del NIST: SP 800-61 Revisión 2, Guía de Manejo de Incidentes de Seguridad Informática.</w:t>
+      </w:r>
+    </w:p>
+    <w:p>
+      <w:pPr>
+        <w:spacing w:after="80" w:before="160"/>
+      </w:pPr>
+      <w:r>
+        <w:rPr>
+          <w:rFonts w:ascii="Calibri" w:cs="Calibri" w:eastAsia="Calibri" w:hAnsi="Calibri"/>
+          <w:b/>
+          <w:bCs/>
+        </w:rPr>
+        <w:t xml:space="preserve">CSIRC</w:t>
+      </w:r>
+    </w:p>
+    <w:p>
+      <w:pPr>
+        <w:pStyle w:val="ListParagraph"/>
+        <w:numPr>
+          <w:ilvl w:val="0"/>
+          <w:numId w:val="2"/>
+        </w:numPr>
+        <w:spacing w:after="60"/>
+      </w:pPr>
+      <w:r>
+        <w:rPr>
+          <w:rFonts w:ascii="Calibri" w:cs="Calibri" w:eastAsia="Calibri" w:hAnsi="Calibri"/>
+        </w:rPr>
+        <w:t xml:space="preserve">El primer paso es establecer una </w:t>
+      </w:r>
+      <w:r>
+        <w:rPr>
+          <w:rFonts w:ascii="Calibri" w:cs="Calibri" w:eastAsia="Calibri" w:hAnsi="Calibri"/>
+          <w:b/>
+          <w:bCs/>
+        </w:rPr>
+        <w:t xml:space="preserve">capacidad de respuesta ante incidentes de seguridad informática (CSIRC)</w:t>
+      </w:r>
+      <w:r>
+        <w:rPr>
+          <w:rFonts w:ascii="Calibri" w:cs="Calibri" w:eastAsia="Calibri" w:hAnsi="Calibri"/>
+        </w:rPr>
+        <w:t xml:space="preserve">.</w:t>
+      </w:r>
+    </w:p>
+    <w:p>
+      <w:pPr>
+        <w:pStyle w:val="ListParagraph"/>
+        <w:numPr>
+          <w:ilvl w:val="0"/>
+          <w:numId w:val="2"/>
+        </w:numPr>
+        <w:spacing w:after="60"/>
+      </w:pPr>
+      <w:r>
+        <w:rPr>
+          <w:rFonts w:ascii="Calibri" w:cs="Calibri" w:eastAsia="Calibri" w:hAnsi="Calibri"/>
+        </w:rPr>
+        <w:t xml:space="preserve">NIST recomienda crear políticas y planes, y establecer y mantener un CSIRC.</w:t>
+      </w:r>
+    </w:p>
+    <w:p>
+      <w:pPr>
+        <w:spacing w:after="100"/>
+      </w:pPr>
+      <w:r>
+        <w:rPr>
+          <w:rFonts w:ascii="Calibri" w:cs="Calibri" w:eastAsia="Calibri" w:hAnsi="Calibri"/>
+        </w:rPr>
+        <w:t xml:space="preserve">Partes interesadas del CSIRC:</w:t>
+      </w:r>
+    </w:p>
+    <w:p>
+      <w:pPr>
+        <w:pStyle w:val="ListParagraph"/>
+        <w:numPr>
+          <w:ilvl w:val="1"/>
+          <w:numId w:val="2"/>
+        </w:numPr>
+        <w:spacing w:after="60"/>
+      </w:pPr>
+      <w:r>
+        <w:rPr>
+          <w:rFonts w:ascii="Calibri" w:cs="Calibri" w:eastAsia="Calibri" w:hAnsi="Calibri"/>
+        </w:rPr>
+        <w:t xml:space="preserve">Gerencia</w:t>
+      </w:r>
+    </w:p>
+    <w:p>
+      <w:pPr>
+        <w:pStyle w:val="ListParagraph"/>
+        <w:numPr>
+          <w:ilvl w:val="1"/>
+          <w:numId w:val="2"/>
+        </w:numPr>
+        <w:spacing w:after="60"/>
+      </w:pPr>
+      <w:r>
+        <w:rPr>
+          <w:rFonts w:ascii="Calibri" w:cs="Calibri" w:eastAsia="Calibri" w:hAnsi="Calibri"/>
+        </w:rPr>
+        <w:t xml:space="preserve">Aseguramiento de Información</w:t>
+      </w:r>
+    </w:p>
+    <w:p>
+      <w:pPr>
+        <w:pStyle w:val="ListParagraph"/>
+        <w:numPr>
+          <w:ilvl w:val="1"/>
+          <w:numId w:val="2"/>
+        </w:numPr>
+        <w:spacing w:after="60"/>
+      </w:pPr>
+      <w:r>
+        <w:rPr>
+          <w:rFonts w:ascii="Calibri" w:cs="Calibri" w:eastAsia="Calibri" w:hAnsi="Calibri"/>
+        </w:rPr>
+        <w:t xml:space="preserve">Soporte de TI</w:t>
+      </w:r>
+    </w:p>
+    <w:p>
+      <w:pPr>
+        <w:pStyle w:val="ListParagraph"/>
+        <w:numPr>
+          <w:ilvl w:val="1"/>
+          <w:numId w:val="2"/>
+        </w:numPr>
+        <w:spacing w:after="60"/>
+      </w:pPr>
+      <w:r>
+        <w:rPr>
+          <w:rFonts w:ascii="Calibri" w:cs="Calibri" w:eastAsia="Calibri" w:hAnsi="Calibri"/>
+        </w:rPr>
+        <w:t xml:space="preserve">Departamento Legal</w:t>
+      </w:r>
+    </w:p>
+    <w:p>
+      <w:pPr>
+        <w:pStyle w:val="ListParagraph"/>
+        <w:numPr>
+          <w:ilvl w:val="1"/>
+          <w:numId w:val="2"/>
+        </w:numPr>
+        <w:spacing w:after="60"/>
+      </w:pPr>
+      <w:r>
+        <w:rPr>
+          <w:rFonts w:ascii="Calibri" w:cs="Calibri" w:eastAsia="Calibri" w:hAnsi="Calibri"/>
+        </w:rPr>
+        <w:t xml:space="preserve">Relaciones Públicas y con los Medios</w:t>
+      </w:r>
+    </w:p>
+    <w:p>
+      <w:pPr>
+        <w:pStyle w:val="ListParagraph"/>
+        <w:numPr>
+          <w:ilvl w:val="1"/>
+          <w:numId w:val="2"/>
+        </w:numPr>
+        <w:spacing w:after="60"/>
+      </w:pPr>
+      <w:r>
+        <w:rPr>
+          <w:rFonts w:ascii="Calibri" w:cs="Calibri" w:eastAsia="Calibri" w:hAnsi="Calibri"/>
+        </w:rPr>
+        <w:t xml:space="preserve">Recursos Humanos</w:t>
+      </w:r>
+    </w:p>
+    <w:p>
+      <w:pPr>
+        <w:pStyle w:val="ListParagraph"/>
+        <w:numPr>
+          <w:ilvl w:val="1"/>
+          <w:numId w:val="2"/>
+        </w:numPr>
+        <w:spacing w:after="60"/>
+      </w:pPr>
+      <w:r>
+        <w:rPr>
+          <w:rFonts w:ascii="Calibri" w:cs="Calibri" w:eastAsia="Calibri" w:hAnsi="Calibri"/>
+        </w:rPr>
+        <w:t xml:space="preserve">Planificadores de Continuidad Comercial</w:t>
+      </w:r>
+    </w:p>
+    <w:p>
+      <w:pPr>
+        <w:pStyle w:val="ListParagraph"/>
+        <w:numPr>
+          <w:ilvl w:val="1"/>
+          <w:numId w:val="2"/>
+        </w:numPr>
+        <w:spacing w:after="60"/>
+      </w:pPr>
+      <w:r>
+        <w:rPr>
+          <w:rFonts w:ascii="Calibri" w:cs="Calibri" w:eastAsia="Calibri" w:hAnsi="Calibri"/>
+        </w:rPr>
+        <w:t xml:space="preserve">Seguridad Física y Administración de las Instalaciones</w:t>
+      </w:r>
+    </w:p>
+    <w:p>
+      <w:pPr>
+        <w:pStyle w:val="ListParagraph"/>
+        <w:numPr>
+          <w:ilvl w:val="0"/>
+          <w:numId w:val="2"/>
+        </w:numPr>
+        <w:spacing w:after="60"/>
+      </w:pPr>
+      <w:r>
+        <w:rPr>
+          <w:rFonts w:ascii="Calibri" w:cs="Calibri" w:eastAsia="Calibri" w:hAnsi="Calibri"/>
+        </w:rPr>
+        <w:t xml:space="preserve">El </w:t>
+      </w:r>
+      <w:r>
+        <w:rPr>
+          <w:rFonts w:ascii="Calibri" w:cs="Calibri" w:eastAsia="Calibri" w:hAnsi="Calibri"/>
+          <w:b/>
+          <w:bCs/>
+        </w:rPr>
+        <w:t xml:space="preserve">equipo legal</w:t>
+      </w:r>
+      <w:r>
+        <w:rPr>
+          <w:rFonts w:ascii="Calibri" w:cs="Calibri" w:eastAsia="Calibri" w:hAnsi="Calibri"/>
+        </w:rPr>
+        <w:t xml:space="preserve"> debe consultar las regulaciones gubernamentales para determinar la responsabilidad de informar el incidente.</w:t>
+      </w:r>
+    </w:p>
+    <w:p>
+      <w:pPr>
+        <w:pStyle w:val="ListParagraph"/>
+        <w:numPr>
+          <w:ilvl w:val="0"/>
+          <w:numId w:val="2"/>
+        </w:numPr>
+        <w:spacing w:after="60"/>
+      </w:pPr>
+      <w:r>
+        <w:rPr>
+          <w:rFonts w:ascii="Calibri" w:cs="Calibri" w:eastAsia="Calibri" w:hAnsi="Calibri"/>
+        </w:rPr>
+        <w:t xml:space="preserve">NIST recomienda trabajar con </w:t>
+      </w:r>
+      <w:r>
+        <w:rPr>
+          <w:rFonts w:ascii="Calibri" w:cs="Calibri" w:eastAsia="Calibri" w:hAnsi="Calibri"/>
+          <w:b/>
+          <w:bCs/>
+        </w:rPr>
+        <w:t xml:space="preserve">otras organizaciones</w:t>
+      </w:r>
+      <w:r>
+        <w:rPr>
+          <w:rFonts w:ascii="Calibri" w:cs="Calibri" w:eastAsia="Calibri" w:hAnsi="Calibri"/>
+        </w:rPr>
+        <w:t xml:space="preserve"> para compartir información sobre incidentes.</w:t>
+      </w:r>
+    </w:p>
+    <w:p>
+      <w:pPr>
+        <w:pStyle w:val="ListParagraph"/>
+        <w:numPr>
+          <w:ilvl w:val="0"/>
+          <w:numId w:val="2"/>
+        </w:numPr>
+        <w:spacing w:after="60"/>
+      </w:pPr>
+      <w:r>
+        <w:rPr>
+          <w:rFonts w:ascii="Calibri" w:cs="Calibri" w:eastAsia="Calibri" w:hAnsi="Calibri"/>
+        </w:rPr>
+        <w:t xml:space="preserve">Cada organización debe tener una política que detalle </w:t>
+      </w:r>
+      <w:r>
+        <w:rPr>
+          <w:rFonts w:ascii="Calibri" w:cs="Calibri" w:eastAsia="Calibri" w:hAnsi="Calibri"/>
+          <w:b/>
+          <w:bCs/>
+        </w:rPr>
+        <w:t xml:space="preserve">cuánto tiempo se conserva la evidencia</w:t>
+      </w:r>
+      <w:r>
+        <w:rPr>
+          <w:rFonts w:ascii="Calibri" w:cs="Calibri" w:eastAsia="Calibri" w:hAnsi="Calibri"/>
+        </w:rPr>
+        <w:t xml:space="preserve"> de un incidente.</w:t>
+      </w:r>
+    </w:p>
+    <w:p>
+      <w:pPr>
+        <w:spacing w:after="80" w:before="160"/>
+      </w:pPr>
+      <w:r>
+        <w:rPr>
+          <w:rFonts w:ascii="Calibri" w:cs="Calibri" w:eastAsia="Calibri" w:hAnsi="Calibri"/>
+          <w:b/>
+          <w:bCs/>
+        </w:rPr>
+        <w:t xml:space="preserve">CMMC (Modelo de Madurez de Ciberseguridad)</w:t>
+      </w:r>
+    </w:p>
+    <w:p>
+      <w:pPr>
+        <w:pStyle w:val="ListParagraph"/>
+        <w:numPr>
+          <w:ilvl w:val="0"/>
+          <w:numId w:val="2"/>
+        </w:numPr>
+        <w:spacing w:after="60"/>
+      </w:pPr>
+      <w:r>
+        <w:rPr>
+          <w:rFonts w:ascii="Calibri" w:cs="Calibri" w:eastAsia="Calibri" w:hAnsi="Calibri"/>
+        </w:rPr>
+        <w:t xml:space="preserve">Se creó para evaluar la capacidad de las organizaciones que trabajan para el </w:t>
+      </w:r>
+      <w:r>
+        <w:rPr>
+          <w:rFonts w:ascii="Calibri" w:cs="Calibri" w:eastAsia="Calibri" w:hAnsi="Calibri"/>
+          <w:b/>
+          <w:bCs/>
+        </w:rPr>
+        <w:t xml:space="preserve">Departamento de Defensa de EE. UU. (DoD)</w:t>
+      </w:r>
+      <w:r>
+        <w:rPr>
+          <w:rFonts w:ascii="Calibri" w:cs="Calibri" w:eastAsia="Calibri" w:hAnsi="Calibri"/>
+        </w:rPr>
+        <w:t xml:space="preserve"> de proteger la cadena de suministro militar de interrupciones o pérdidas por incidentes de ciberseguridad.</w:t>
+      </w:r>
+    </w:p>
+    <w:p>
+      <w:pPr>
+        <w:pStyle w:val="ListParagraph"/>
+        <w:numPr>
+          <w:ilvl w:val="0"/>
+          <w:numId w:val="2"/>
+        </w:numPr>
+        <w:spacing w:after="60"/>
+      </w:pPr>
+      <w:r>
+        <w:rPr>
+          <w:rFonts w:ascii="Calibri" w:cs="Calibri" w:eastAsia="Calibri" w:hAnsi="Calibri"/>
+        </w:rPr>
+        <w:t xml:space="preserve">Especifica </w:t>
+      </w:r>
+      <w:r>
+        <w:rPr>
+          <w:rFonts w:ascii="Calibri" w:cs="Calibri" w:eastAsia="Calibri" w:hAnsi="Calibri"/>
+          <w:b/>
+          <w:bCs/>
+        </w:rPr>
+        <w:t xml:space="preserve">17 dominios</w:t>
+      </w:r>
+      <w:r>
+        <w:rPr>
+          <w:rFonts w:ascii="Calibri" w:cs="Calibri" w:eastAsia="Calibri" w:hAnsi="Calibri"/>
+        </w:rPr>
+        <w:t xml:space="preserve">, cada uno con un número variable de capacidades.</w:t>
+      </w:r>
+    </w:p>
+    <w:p>
+      <w:pPr>
+        <w:pStyle w:val="ListParagraph"/>
+        <w:numPr>
+          <w:ilvl w:val="0"/>
+          <w:numId w:val="2"/>
+        </w:numPr>
+        <w:spacing w:after="60"/>
+      </w:pPr>
+      <w:r>
+        <w:rPr>
+          <w:rFonts w:ascii="Calibri" w:cs="Calibri" w:eastAsia="Calibri" w:hAnsi="Calibri"/>
+        </w:rPr>
+        <w:t xml:space="preserve">La organización se califica por el </w:t>
+      </w:r>
+      <w:r>
+        <w:rPr>
+          <w:rFonts w:ascii="Calibri" w:cs="Calibri" w:eastAsia="Calibri" w:hAnsi="Calibri"/>
+          <w:b/>
+          <w:bCs/>
+        </w:rPr>
+        <w:t xml:space="preserve">nivel de madurez</w:t>
+      </w:r>
+      <w:r>
+        <w:rPr>
+          <w:rFonts w:ascii="Calibri" w:cs="Calibri" w:eastAsia="Calibri" w:hAnsi="Calibri"/>
+        </w:rPr>
+        <w:t xml:space="preserve"> que alcanzó en cada dominio, y la CMMC la </w:t>
+      </w:r>
+      <w:r>
+        <w:rPr>
+          <w:rFonts w:ascii="Calibri" w:cs="Calibri" w:eastAsia="Calibri" w:hAnsi="Calibri"/>
+          <w:b/>
+          <w:bCs/>
+        </w:rPr>
+        <w:t xml:space="preserve">certifica por nivel</w:t>
+      </w:r>
+      <w:r>
+        <w:rPr>
+          <w:rFonts w:ascii="Calibri" w:cs="Calibri" w:eastAsia="Calibri" w:hAnsi="Calibri"/>
+        </w:rPr>
+        <w:t xml:space="preserve">.</w:t>
+      </w:r>
+    </w:p>
+    <w:p>
+      <w:pPr>
+        <w:spacing w:after="80" w:before="160"/>
+      </w:pPr>
+      <w:r>
+        <w:rPr>
+          <w:rFonts w:ascii="Calibri" w:cs="Calibri" w:eastAsia="Calibri" w:hAnsi="Calibri"/>
+          <w:b/>
+          <w:bCs/>
+        </w:rPr>
+        <w:t xml:space="preserve">Las 4 fases del ciclo de vida de NIST</w:t>
+      </w:r>
+    </w:p>
+    <w:tbl>
+      <w:tblPr>
+        <w:tblW w:type="dxa" w:w="9360"/>
+        <w:tblBorders>
+          <w:top w:val="single" w:color="auto" w:sz="4"/>
+          <w:left w:val="single" w:color="auto" w:sz="4"/>
+          <w:bottom w:val="single" w:color="auto" w:sz="4"/>
+          <w:right w:val="single" w:color="auto" w:sz="4"/>
+          <w:insideH w:val="single" w:color="auto" w:sz="4"/>
+          <w:insideV w:val="single" w:color="auto" w:sz="4"/>
+        </w:tblBorders>
+      </w:tblPr>
+      <w:tblGrid>
+        <w:gridCol w:w="900"/>
+        <w:gridCol w:w="8460"/>
+      </w:tblGrid>
+      <w:tr>
+        <w:trPr>
+          <w:tblHeader/>
+        </w:trPr>
+        <w:tc>
+          <w:tcPr>
+            <w:tcW w:type="dxa" w:w="900"/>
+            <w:tcBorders>
+              <w:top w:val="single" w:color="000000" w:sz="4"/>
+              <w:left w:val="single" w:color="000000" w:sz="4"/>
+              <w:bottom w:val="single" w:color="000000" w:sz="4"/>
+              <w:right w:val="single" w:color="000000" w:sz="4"/>
+            </w:tcBorders>
+            <w:shd w:fill="D9D9D9" w:val="clear"/>
+            <w:tcMar>
+              <w:top w:type="dxa" w:w="60"/>
+              <w:left w:type="dxa" w:w="100"/>
+              <w:bottom w:type="dxa" w:w="60"/>
+              <w:right w:type="dxa" w:w="100"/>
+            </w:tcMar>
+          </w:tcPr>
+          <w:p>
+            <w:r>
+              <w:rPr>
+                <w:rFonts w:ascii="Calibri" w:cs="Calibri" w:eastAsia="Calibri" w:hAnsi="Calibri"/>
+                <w:b/>
+                <w:bCs/>
+                <w:color w:val="000000"/>
+              </w:rPr>
+              <w:t xml:space="preserve">Fase</w:t>
+            </w:r>
+          </w:p>
+        </w:tc>
+        <w:tc>
+          <w:tcPr>
+            <w:tcW w:type="dxa" w:w="8460"/>
+            <w:tcBorders>
+              <w:top w:val="single" w:color="000000" w:sz="4"/>
+              <w:left w:val="single" w:color="000000" w:sz="4"/>
+              <w:bottom w:val="single" w:color="000000" w:sz="4"/>
+              <w:right w:val="single" w:color="000000" w:sz="4"/>
+            </w:tcBorders>
+            <w:shd w:fill="D9D9D9" w:val="clear"/>
+            <w:tcMar>
+              <w:top w:type="dxa" w:w="60"/>
+              <w:left w:type="dxa" w:w="100"/>
+              <w:bottom w:type="dxa" w:w="60"/>
+              <w:right w:type="dxa" w:w="100"/>
+            </w:tcMar>
+          </w:tcPr>
+          <w:p>
+            <w:r>
+              <w:rPr>
+                <w:rFonts w:ascii="Calibri" w:cs="Calibri" w:eastAsia="Calibri" w:hAnsi="Calibri"/>
+                <w:b/>
+                <w:bCs/>
+                <w:color w:val="000000"/>
+              </w:rPr>
+              <w:t xml:space="preserve">Nombre</w:t>
+            </w:r>
+          </w:p>
+        </w:tc>
+      </w:tr>
+      <w:tr>
+        <w:tc>
+          <w:tcPr>
+            <w:tcW w:type="dxa" w:w="900"/>
+            <w:tcBorders>
+              <w:top w:val="single" w:color="000000" w:sz="4"/>
+              <w:left w:val="single" w:color="000000" w:sz="4"/>
+              <w:bottom w:val="single" w:color="000000" w:sz="4"/>
+              <w:right w:val="single" w:color="000000" w:sz="4"/>
+            </w:tcBorders>
+            <w:shd w:fill="FFFFFF" w:val="clear"/>
+            <w:tcMar>
+              <w:top w:type="dxa" w:w="60"/>
+              <w:left w:type="dxa" w:w="100"/>
+              <w:bottom w:type="dxa" w:w="60"/>
+              <w:right w:type="dxa" w:w="100"/>
+            </w:tcMar>
+          </w:tcPr>
+          <w:p>
+            <w:r>
+              <w:rPr>
+                <w:rFonts w:ascii="Calibri" w:cs="Calibri" w:eastAsia="Calibri" w:hAnsi="Calibri"/>
+                <w:b/>
+                <w:bCs/>
+              </w:rPr>
+              <w:t xml:space="preserve">1</w:t>
+            </w:r>
+          </w:p>
+        </w:tc>
+        <w:tc>
+          <w:tcPr>
+            <w:tcW w:type="dxa" w:w="8460"/>
+            <w:tcBorders>
+              <w:top w:val="single" w:color="000000" w:sz="4"/>
+              <w:left w:val="single" w:color="000000" w:sz="4"/>
+              <w:bottom w:val="single" w:color="000000" w:sz="4"/>
+              <w:right w:val="single" w:color="000000" w:sz="4"/>
+            </w:tcBorders>
+            <w:shd w:fill="FFFFFF" w:val="clear"/>
+            <w:tcMar>
+              <w:top w:type="dxa" w:w="60"/>
+              <w:left w:type="dxa" w:w="100"/>
+              <w:bottom w:type="dxa" w:w="60"/>
+              <w:right w:type="dxa" w:w="100"/>
+            </w:tcMar>
+          </w:tcPr>
+          <w:p>
+            <w:r>
+              <w:rPr>
+                <w:rFonts w:ascii="Calibri" w:cs="Calibri" w:eastAsia="Calibri" w:hAnsi="Calibri"/>
+              </w:rPr>
+              <w:t xml:space="preserve">Preparación</w:t>
+            </w:r>
+          </w:p>
+        </w:tc>
+      </w:tr>
+      <w:tr>
+        <w:tc>
+          <w:tcPr>
+            <w:tcW w:type="dxa" w:w="900"/>
+            <w:tcBorders>
+              <w:top w:val="single" w:color="000000" w:sz="4"/>
+              <w:left w:val="single" w:color="000000" w:sz="4"/>
+              <w:bottom w:val="single" w:color="000000" w:sz="4"/>
+              <w:right w:val="single" w:color="000000" w:sz="4"/>
+            </w:tcBorders>
+            <w:shd w:fill="FFFFFF" w:val="clear"/>
+            <w:tcMar>
+              <w:top w:type="dxa" w:w="60"/>
+              <w:left w:type="dxa" w:w="100"/>
+              <w:bottom w:type="dxa" w:w="60"/>
+              <w:right w:type="dxa" w:w="100"/>
+            </w:tcMar>
+          </w:tcPr>
+          <w:p>
+            <w:r>
+              <w:rPr>
+                <w:rFonts w:ascii="Calibri" w:cs="Calibri" w:eastAsia="Calibri" w:hAnsi="Calibri"/>
+                <w:b/>
+                <w:bCs/>
+              </w:rPr>
+              <w:t xml:space="preserve">2</w:t>
+            </w:r>
+          </w:p>
+        </w:tc>
+        <w:tc>
+          <w:tcPr>
+            <w:tcW w:type="dxa" w:w="8460"/>
+            <w:tcBorders>
+              <w:top w:val="single" w:color="000000" w:sz="4"/>
+              <w:left w:val="single" w:color="000000" w:sz="4"/>
+              <w:bottom w:val="single" w:color="000000" w:sz="4"/>
+              <w:right w:val="single" w:color="000000" w:sz="4"/>
+            </w:tcBorders>
+            <w:shd w:fill="FFFFFF" w:val="clear"/>
+            <w:tcMar>
+              <w:top w:type="dxa" w:w="60"/>
+              <w:left w:type="dxa" w:w="100"/>
+              <w:bottom w:type="dxa" w:w="60"/>
+              <w:right w:type="dxa" w:w="100"/>
+            </w:tcMar>
+          </w:tcPr>
+          <w:p>
+            <w:r>
+              <w:rPr>
+                <w:rFonts w:ascii="Calibri" w:cs="Calibri" w:eastAsia="Calibri" w:hAnsi="Calibri"/>
+              </w:rPr>
+              <w:t xml:space="preserve">Detección y Análisis</w:t>
+            </w:r>
+          </w:p>
+        </w:tc>
+      </w:tr>
+      <w:tr>
+        <w:tc>
+          <w:tcPr>
+            <w:tcW w:type="dxa" w:w="900"/>
+            <w:tcBorders>
+              <w:top w:val="single" w:color="000000" w:sz="4"/>
+              <w:left w:val="single" w:color="000000" w:sz="4"/>
+              <w:bottom w:val="single" w:color="000000" w:sz="4"/>
+              <w:right w:val="single" w:color="000000" w:sz="4"/>
+            </w:tcBorders>
+            <w:shd w:fill="FFFFFF" w:val="clear"/>
+            <w:tcMar>
+              <w:top w:type="dxa" w:w="60"/>
+              <w:left w:type="dxa" w:w="100"/>
+              <w:bottom w:type="dxa" w:w="60"/>
+              <w:right w:type="dxa" w:w="100"/>
+            </w:tcMar>
+          </w:tcPr>
+          <w:p>
+            <w:r>
+              <w:rPr>
+                <w:rFonts w:ascii="Calibri" w:cs="Calibri" w:eastAsia="Calibri" w:hAnsi="Calibri"/>
+                <w:b/>
+                <w:bCs/>
+              </w:rPr>
+              <w:t xml:space="preserve">3</w:t>
+            </w:r>
+          </w:p>
+        </w:tc>
+        <w:tc>
+          <w:tcPr>
+            <w:tcW w:type="dxa" w:w="8460"/>
+            <w:tcBorders>
+              <w:top w:val="single" w:color="000000" w:sz="4"/>
+              <w:left w:val="single" w:color="000000" w:sz="4"/>
+              <w:bottom w:val="single" w:color="000000" w:sz="4"/>
+              <w:right w:val="single" w:color="000000" w:sz="4"/>
+            </w:tcBorders>
+            <w:shd w:fill="FFFFFF" w:val="clear"/>
+            <w:tcMar>
+              <w:top w:type="dxa" w:w="60"/>
+              <w:left w:type="dxa" w:w="100"/>
+              <w:bottom w:type="dxa" w:w="60"/>
+              <w:right w:type="dxa" w:w="100"/>
+            </w:tcMar>
+          </w:tcPr>
+          <w:p>
+            <w:r>
+              <w:rPr>
+                <w:rFonts w:ascii="Calibri" w:cs="Calibri" w:eastAsia="Calibri" w:hAnsi="Calibri"/>
+              </w:rPr>
+              <w:t xml:space="preserve">Contención, Erradicación y Recuperación</w:t>
+            </w:r>
+          </w:p>
+        </w:tc>
+      </w:tr>
+      <w:tr>
+        <w:tc>
+          <w:tcPr>
+            <w:tcW w:type="dxa" w:w="900"/>
+            <w:tcBorders>
+              <w:top w:val="single" w:color="000000" w:sz="4"/>
+              <w:left w:val="single" w:color="000000" w:sz="4"/>
+              <w:bottom w:val="single" w:color="000000" w:sz="4"/>
+              <w:right w:val="single" w:color="000000" w:sz="4"/>
+            </w:tcBorders>
+            <w:shd w:fill="FFFFFF" w:val="clear"/>
+            <w:tcMar>
+              <w:top w:type="dxa" w:w="60"/>
+              <w:left w:type="dxa" w:w="100"/>
+              <w:bottom w:type="dxa" w:w="60"/>
+              <w:right w:type="dxa" w:w="100"/>
+            </w:tcMar>
+          </w:tcPr>
+          <w:p>
+            <w:r>
+              <w:rPr>
+                <w:rFonts w:ascii="Calibri" w:cs="Calibri" w:eastAsia="Calibri" w:hAnsi="Calibri"/>
+                <w:b/>
+                <w:bCs/>
+              </w:rPr>
+              <w:t xml:space="preserve">4</w:t>
+            </w:r>
+          </w:p>
+        </w:tc>
+        <w:tc>
+          <w:tcPr>
+            <w:tcW w:type="dxa" w:w="8460"/>
+            <w:tcBorders>
+              <w:top w:val="single" w:color="000000" w:sz="4"/>
+              <w:left w:val="single" w:color="000000" w:sz="4"/>
+              <w:bottom w:val="single" w:color="000000" w:sz="4"/>
+              <w:right w:val="single" w:color="000000" w:sz="4"/>
+            </w:tcBorders>
+            <w:shd w:fill="FFFFFF" w:val="clear"/>
+            <w:tcMar>
+              <w:top w:type="dxa" w:w="60"/>
+              <w:left w:type="dxa" w:w="100"/>
+              <w:bottom w:type="dxa" w:w="60"/>
+              <w:right w:type="dxa" w:w="100"/>
+            </w:tcMar>
+          </w:tcPr>
+          <w:p>
+            <w:r>
+              <w:rPr>
+                <w:rFonts w:ascii="Calibri" w:cs="Calibri" w:eastAsia="Calibri" w:hAnsi="Calibri"/>
+              </w:rPr>
+              <w:t xml:space="preserve">Actividades Posteriores al Incidente</w:t>
+            </w:r>
+          </w:p>
+        </w:tc>
+      </w:tr>
+    </w:tbl>
+    <w:p>
+      <w:pPr>
+        <w:spacing w:after="80"/>
+      </w:pPr>
+    </w:p>
+    <w:p>
+      <w:pPr>
+        <w:spacing w:after="80" w:before="160"/>
+      </w:pPr>
+      <w:r>
+        <w:rPr>
+          <w:rFonts w:ascii="Calibri" w:cs="Calibri" w:eastAsia="Calibri" w:hAnsi="Calibri"/>
+          <w:b/>
+          <w:bCs/>
+        </w:rPr>
+        <w:t xml:space="preserve">1. Preparación</w:t>
+      </w:r>
+    </w:p>
+    <w:p>
+      <w:pPr>
+        <w:pStyle w:val="ListParagraph"/>
+        <w:numPr>
+          <w:ilvl w:val="0"/>
+          <w:numId w:val="2"/>
+        </w:numPr>
+        <w:spacing w:after="60"/>
+      </w:pPr>
+      <w:r>
+        <w:rPr>
+          <w:rFonts w:ascii="Calibri" w:cs="Calibri" w:eastAsia="Calibri" w:hAnsi="Calibri"/>
+        </w:rPr>
+        <w:t xml:space="preserve">Se crea el </w:t>
+      </w:r>
+      <w:r>
+        <w:rPr>
+          <w:rFonts w:ascii="Calibri" w:cs="Calibri" w:eastAsia="Calibri" w:hAnsi="Calibri"/>
+          <w:b/>
+          <w:bCs/>
+        </w:rPr>
+        <w:t xml:space="preserve">CSIRT</w:t>
+      </w:r>
+      <w:r>
+        <w:rPr>
+          <w:rFonts w:ascii="Calibri" w:cs="Calibri" w:eastAsia="Calibri" w:hAnsi="Calibri"/>
+        </w:rPr>
+        <w:t xml:space="preserve"> y se adquieren e implementan las </w:t>
+      </w:r>
+      <w:r>
+        <w:rPr>
+          <w:rFonts w:ascii="Calibri" w:cs="Calibri" w:eastAsia="Calibri" w:hAnsi="Calibri"/>
+          <w:b/>
+          <w:bCs/>
+        </w:rPr>
+        <w:t xml:space="preserve">herramientas y activos</w:t>
+      </w:r>
+      <w:r>
+        <w:rPr>
+          <w:rFonts w:ascii="Calibri" w:cs="Calibri" w:eastAsia="Calibri" w:hAnsi="Calibri"/>
+        </w:rPr>
+        <w:t xml:space="preserve"> que el equipo necesita para investigar los incidentes.</w:t>
+      </w:r>
+    </w:p>
+    <w:p>
+      <w:pPr>
+        <w:spacing w:after="80" w:before="160"/>
+      </w:pPr>
+      <w:r>
+        <w:rPr>
+          <w:rFonts w:ascii="Calibri" w:cs="Calibri" w:eastAsia="Calibri" w:hAnsi="Calibri"/>
+          <w:b/>
+          <w:bCs/>
+        </w:rPr>
+        <w:t xml:space="preserve">2. Detección y análisis</w:t>
+      </w:r>
+    </w:p>
+    <w:p>
+      <w:pPr>
+        <w:pStyle w:val="ListParagraph"/>
+        <w:numPr>
+          <w:ilvl w:val="0"/>
+          <w:numId w:val="2"/>
+        </w:numPr>
+        <w:spacing w:after="60"/>
+      </w:pPr>
+      <w:r>
+        <w:rPr>
+          <w:rFonts w:ascii="Calibri" w:cs="Calibri" w:eastAsia="Calibri" w:hAnsi="Calibri"/>
+        </w:rPr>
+        <w:t xml:space="preserve">Los incidentes se detectan con </w:t>
+      </w:r>
+      <w:r>
+        <w:rPr>
+          <w:rFonts w:ascii="Calibri" w:cs="Calibri" w:eastAsia="Calibri" w:hAnsi="Calibri"/>
+          <w:b/>
+          <w:bCs/>
+        </w:rPr>
+        <w:t xml:space="preserve">muchos métodos</w:t>
+      </w:r>
+      <w:r>
+        <w:rPr>
+          <w:rFonts w:ascii="Calibri" w:cs="Calibri" w:eastAsia="Calibri" w:hAnsi="Calibri"/>
+        </w:rPr>
+        <w:t xml:space="preserve"> y no todos son claros.</w:t>
+      </w:r>
+    </w:p>
+    <w:p>
+      <w:pPr>
+        <w:pStyle w:val="ListParagraph"/>
+        <w:numPr>
+          <w:ilvl w:val="0"/>
+          <w:numId w:val="2"/>
+        </w:numPr>
+        <w:spacing w:after="60"/>
+      </w:pPr>
+      <w:r>
+        <w:rPr>
+          <w:rFonts w:ascii="Calibri" w:cs="Calibri" w:eastAsia="Calibri" w:hAnsi="Calibri"/>
+        </w:rPr>
+        <w:t xml:space="preserve">Dos categorías de señales de un incidente: </w:t>
+      </w:r>
+      <w:r>
+        <w:rPr>
+          <w:rFonts w:ascii="Calibri" w:cs="Calibri" w:eastAsia="Calibri" w:hAnsi="Calibri"/>
+          <w:b/>
+          <w:bCs/>
+        </w:rPr>
+        <w:t xml:space="preserve">precursor</w:t>
+      </w:r>
+      <w:r>
+        <w:rPr>
+          <w:rFonts w:ascii="Calibri" w:cs="Calibri" w:eastAsia="Calibri" w:hAnsi="Calibri"/>
+        </w:rPr>
+        <w:t xml:space="preserve"> e </w:t>
+      </w:r>
+      <w:r>
+        <w:rPr>
+          <w:rFonts w:ascii="Calibri" w:cs="Calibri" w:eastAsia="Calibri" w:hAnsi="Calibri"/>
+          <w:b/>
+          <w:bCs/>
+        </w:rPr>
+        <w:t xml:space="preserve">indicador</w:t>
+      </w:r>
+      <w:r>
+        <w:rPr>
+          <w:rFonts w:ascii="Calibri" w:cs="Calibri" w:eastAsia="Calibri" w:hAnsi="Calibri"/>
+        </w:rPr>
+        <w:t xml:space="preserve">.</w:t>
+      </w:r>
+    </w:p>
+    <w:p>
+      <w:pPr>
+        <w:pStyle w:val="ListParagraph"/>
+        <w:numPr>
+          <w:ilvl w:val="0"/>
+          <w:numId w:val="2"/>
+        </w:numPr>
+        <w:spacing w:after="60"/>
+      </w:pPr>
+      <w:r>
+        <w:rPr>
+          <w:rFonts w:ascii="Calibri" w:cs="Calibri" w:eastAsia="Calibri" w:hAnsi="Calibri"/>
+        </w:rPr>
+        <w:t xml:space="preserve">Algoritmos complejos y </w:t>
+      </w:r>
+      <w:r>
+        <w:rPr>
+          <w:rFonts w:ascii="Calibri" w:cs="Calibri" w:eastAsia="Calibri" w:hAnsi="Calibri"/>
+          <w:b/>
+          <w:bCs/>
+        </w:rPr>
+        <w:t xml:space="preserve">aprendizaje mecanizado</w:t>
+      </w:r>
+      <w:r>
+        <w:rPr>
+          <w:rFonts w:ascii="Calibri" w:cs="Calibri" w:eastAsia="Calibri" w:hAnsi="Calibri"/>
+        </w:rPr>
+        <w:t xml:space="preserve"> pueden determinar si un incidente es válido.</w:t>
+      </w:r>
+    </w:p>
+    <w:p>
+      <w:pPr>
+        <w:pStyle w:val="ListParagraph"/>
+        <w:numPr>
+          <w:ilvl w:val="0"/>
+          <w:numId w:val="2"/>
+        </w:numPr>
+        <w:spacing w:after="60"/>
+      </w:pPr>
+      <w:r>
+        <w:rPr>
+          <w:rFonts w:ascii="Calibri" w:cs="Calibri" w:eastAsia="Calibri" w:hAnsi="Calibri"/>
+        </w:rPr>
+        <w:t xml:space="preserve">Un método útil es crear </w:t>
+      </w:r>
+      <w:r>
+        <w:rPr>
+          <w:rFonts w:ascii="Calibri" w:cs="Calibri" w:eastAsia="Calibri" w:hAnsi="Calibri"/>
+          <w:b/>
+          <w:bCs/>
+        </w:rPr>
+        <w:t xml:space="preserve">perfiles de la red y del sistema</w:t>
+      </w:r>
+      <w:r>
+        <w:rPr>
+          <w:rFonts w:ascii="Calibri" w:cs="Calibri" w:eastAsia="Calibri" w:hAnsi="Calibri"/>
+        </w:rPr>
+        <w:t xml:space="preserve">.</w:t>
+      </w:r>
+    </w:p>
+    <w:p>
+      <w:pPr>
+        <w:pStyle w:val="ListParagraph"/>
+        <w:numPr>
+          <w:ilvl w:val="0"/>
+          <w:numId w:val="2"/>
+        </w:numPr>
+        <w:spacing w:after="60"/>
+      </w:pPr>
+      <w:r>
+        <w:rPr>
+          <w:rFonts w:ascii="Calibri" w:cs="Calibri" w:eastAsia="Calibri" w:hAnsi="Calibri"/>
+        </w:rPr>
+        <w:t xml:space="preserve">Cuando el CSIRT cree que hubo un incidente, hace de inmediato un </w:t>
+      </w:r>
+      <w:r>
+        <w:rPr>
+          <w:rFonts w:ascii="Calibri" w:cs="Calibri" w:eastAsia="Calibri" w:hAnsi="Calibri"/>
+          <w:b/>
+          <w:bCs/>
+        </w:rPr>
+        <w:t xml:space="preserve">análisis inicial</w:t>
+      </w:r>
+      <w:r>
+        <w:rPr>
+          <w:rFonts w:ascii="Calibri" w:cs="Calibri" w:eastAsia="Calibri" w:hAnsi="Calibri"/>
+        </w:rPr>
+        <w:t xml:space="preserve"> para determinar el </w:t>
+      </w:r>
+      <w:r>
+        <w:rPr>
+          <w:rFonts w:ascii="Calibri" w:cs="Calibri" w:eastAsia="Calibri" w:hAnsi="Calibri"/>
+          <w:b/>
+          <w:bCs/>
+        </w:rPr>
+        <w:t xml:space="preserve">alcance</w:t>
+      </w:r>
+      <w:r>
+        <w:rPr>
+          <w:rFonts w:ascii="Calibri" w:cs="Calibri" w:eastAsia="Calibri" w:hAnsi="Calibri"/>
+        </w:rPr>
+        <w:t xml:space="preserve"> (qué redes, sistemas o aplicaciones se vieron afectados, quién originó el incidente y cómo está ocurriendo).</w:t>
+      </w:r>
+    </w:p>
+    <w:p>
+      <w:pPr>
+        <w:pStyle w:val="ListParagraph"/>
+        <w:numPr>
+          <w:ilvl w:val="0"/>
+          <w:numId w:val="2"/>
+        </w:numPr>
+        <w:spacing w:after="60"/>
+      </w:pPr>
+      <w:r>
+        <w:rPr>
+          <w:rFonts w:ascii="Calibri" w:cs="Calibri" w:eastAsia="Calibri" w:hAnsi="Calibri"/>
+        </w:rPr>
+        <w:t xml:space="preserve">Luego se </w:t>
+      </w:r>
+      <w:r>
+        <w:rPr>
+          <w:rFonts w:ascii="Calibri" w:cs="Calibri" w:eastAsia="Calibri" w:hAnsi="Calibri"/>
+          <w:b/>
+          <w:bCs/>
+        </w:rPr>
+        <w:t xml:space="preserve">analiza y prioriza</w:t>
+      </w:r>
+      <w:r>
+        <w:rPr>
+          <w:rFonts w:ascii="Calibri" w:cs="Calibri" w:eastAsia="Calibri" w:hAnsi="Calibri"/>
+        </w:rPr>
+        <w:t xml:space="preserve"> el incidente.</w:t>
+      </w:r>
+    </w:p>
+    <w:p>
+      <w:pPr>
+        <w:pStyle w:val="ListParagraph"/>
+        <w:numPr>
+          <w:ilvl w:val="0"/>
+          <w:numId w:val="2"/>
+        </w:numPr>
+        <w:spacing w:after="60"/>
+      </w:pPr>
+      <w:r>
+        <w:rPr>
+          <w:rFonts w:ascii="Calibri" w:cs="Calibri" w:eastAsia="Calibri" w:hAnsi="Calibri"/>
+        </w:rPr>
+        <w:t xml:space="preserve">Se </w:t>
+      </w:r>
+      <w:r>
+        <w:rPr>
+          <w:rFonts w:ascii="Calibri" w:cs="Calibri" w:eastAsia="Calibri" w:hAnsi="Calibri"/>
+          <w:b/>
+          <w:bCs/>
+        </w:rPr>
+        <w:t xml:space="preserve">notifica</w:t>
+      </w:r>
+      <w:r>
+        <w:rPr>
+          <w:rFonts w:ascii="Calibri" w:cs="Calibri" w:eastAsia="Calibri" w:hAnsi="Calibri"/>
+        </w:rPr>
+        <w:t xml:space="preserve"> a las personas y partes interesadas internas y externas, para que todos los que necesitan involucrarse desempeñen sus funciones.</w:t>
+      </w:r>
+    </w:p>
+    <w:p>
+      <w:pPr>
+        <w:pStyle w:val="ListParagraph"/>
+        <w:numPr>
+          <w:ilvl w:val="0"/>
+          <w:numId w:val="2"/>
+        </w:numPr>
+        <w:spacing w:after="60"/>
+      </w:pPr>
+      <w:r>
+        <w:rPr>
+          <w:rFonts w:ascii="Calibri" w:cs="Calibri" w:eastAsia="Calibri" w:hAnsi="Calibri"/>
+        </w:rPr>
+        <w:t xml:space="preserve">Es fundamental tener </w:t>
+      </w:r>
+      <w:r>
+        <w:rPr>
+          <w:rFonts w:ascii="Calibri" w:cs="Calibri" w:eastAsia="Calibri" w:hAnsi="Calibri"/>
+          <w:b/>
+          <w:bCs/>
+        </w:rPr>
+        <w:t xml:space="preserve">documentación clara y concisa</w:t>
+      </w:r>
+      <w:r>
+        <w:rPr>
+          <w:rFonts w:ascii="Calibri" w:cs="Calibri" w:eastAsia="Calibri" w:hAnsi="Calibri"/>
+        </w:rPr>
+        <w:t xml:space="preserve"> para preservar la evidencia.</w:t>
+      </w:r>
+    </w:p>
+    <w:p>
+      <w:pPr>
+        <w:spacing w:after="80" w:before="160"/>
+      </w:pPr>
+      <w:r>
+        <w:rPr>
+          <w:rFonts w:ascii="Calibri" w:cs="Calibri" w:eastAsia="Calibri" w:hAnsi="Calibri"/>
+          <w:b/>
+          <w:bCs/>
+        </w:rPr>
+        <w:t xml:space="preserve">3. Contención, erradicación y recuperación</w:t>
+      </w:r>
+    </w:p>
+    <w:p>
+      <w:pPr>
+        <w:pStyle w:val="ListParagraph"/>
+        <w:numPr>
+          <w:ilvl w:val="0"/>
+          <w:numId w:val="2"/>
+        </w:numPr>
+        <w:spacing w:after="60"/>
+      </w:pPr>
+      <w:r>
+        <w:rPr>
+          <w:rFonts w:ascii="Calibri" w:cs="Calibri" w:eastAsia="Calibri" w:hAnsi="Calibri"/>
+          <w:b/>
+          <w:bCs/>
+        </w:rPr>
+        <w:t xml:space="preserve">Identificar a los atacantes no es lo más importante</w:t>
+      </w:r>
+      <w:r>
+        <w:rPr>
+          <w:rFonts w:ascii="Calibri" w:cs="Calibri" w:eastAsia="Calibri" w:hAnsi="Calibri"/>
+        </w:rPr>
+        <w:t xml:space="preserve">: lo que importa es </w:t>
+      </w:r>
+      <w:r>
+        <w:rPr>
+          <w:rFonts w:ascii="Calibri" w:cs="Calibri" w:eastAsia="Calibri" w:hAnsi="Calibri"/>
+          <w:b/>
+          <w:bCs/>
+        </w:rPr>
+        <w:t xml:space="preserve">contener y erradicar</w:t>
+      </w:r>
+      <w:r>
+        <w:rPr>
+          <w:rFonts w:ascii="Calibri" w:cs="Calibri" w:eastAsia="Calibri" w:hAnsi="Calibri"/>
+        </w:rPr>
+        <w:t xml:space="preserve"> el ataque y </w:t>
+      </w:r>
+      <w:r>
+        <w:rPr>
+          <w:rFonts w:ascii="Calibri" w:cs="Calibri" w:eastAsia="Calibri" w:hAnsi="Calibri"/>
+          <w:b/>
+          <w:bCs/>
+        </w:rPr>
+        <w:t xml:space="preserve">recuperar</w:t>
+      </w:r>
+      <w:r>
+        <w:rPr>
+          <w:rFonts w:ascii="Calibri" w:cs="Calibri" w:eastAsia="Calibri" w:hAnsi="Calibri"/>
+        </w:rPr>
+        <w:t xml:space="preserve"> los hosts y servicios.</w:t>
+      </w:r>
+    </w:p>
+    <w:p>
+      <w:pPr>
+        <w:pStyle w:val="ListParagraph"/>
+        <w:numPr>
+          <w:ilvl w:val="0"/>
+          <w:numId w:val="2"/>
+        </w:numPr>
+        <w:spacing w:after="60"/>
+      </w:pPr>
+      <w:r>
+        <w:rPr>
+          <w:rFonts w:ascii="Calibri" w:cs="Calibri" w:eastAsia="Calibri" w:hAnsi="Calibri"/>
+        </w:rPr>
+        <w:t xml:space="preserve">Después de la contención, el primer paso de la </w:t>
+      </w:r>
+      <w:r>
+        <w:rPr>
+          <w:rFonts w:ascii="Calibri" w:cs="Calibri" w:eastAsia="Calibri" w:hAnsi="Calibri"/>
+          <w:b/>
+          <w:bCs/>
+        </w:rPr>
+        <w:t xml:space="preserve">erradicación</w:t>
+      </w:r>
+      <w:r>
+        <w:rPr>
+          <w:rFonts w:ascii="Calibri" w:cs="Calibri" w:eastAsia="Calibri" w:hAnsi="Calibri"/>
+        </w:rPr>
+        <w:t xml:space="preserve"> es identificar todos los hosts que necesitan correcciones.</w:t>
+      </w:r>
+    </w:p>
+    <w:p>
+      <w:pPr>
+        <w:pStyle w:val="ListParagraph"/>
+        <w:numPr>
+          <w:ilvl w:val="0"/>
+          <w:numId w:val="2"/>
+        </w:numPr>
+        <w:spacing w:after="60"/>
+      </w:pPr>
+      <w:r>
+        <w:rPr>
+          <w:rFonts w:ascii="Calibri" w:cs="Calibri" w:eastAsia="Calibri" w:hAnsi="Calibri"/>
+        </w:rPr>
+        <w:t xml:space="preserve">Hay que corregir o </w:t>
+      </w:r>
+      <w:r>
+        <w:rPr>
+          <w:rFonts w:ascii="Calibri" w:cs="Calibri" w:eastAsia="Calibri" w:hAnsi="Calibri"/>
+          <w:b/>
+          <w:bCs/>
+        </w:rPr>
+        <w:t xml:space="preserve">parchear</w:t>
+      </w:r>
+      <w:r>
+        <w:rPr>
+          <w:rFonts w:ascii="Calibri" w:cs="Calibri" w:eastAsia="Calibri" w:hAnsi="Calibri"/>
+        </w:rPr>
+        <w:t xml:space="preserve"> los efectos del incidente y todas las vulnerabilidades que aprovechó el atacante, para que no vuelva a ocurrir.</w:t>
+      </w:r>
+    </w:p>
+    <w:p>
+      <w:pPr>
+        <w:spacing w:after="80" w:before="160"/>
+      </w:pPr>
+      <w:r>
+        <w:rPr>
+          <w:rFonts w:ascii="Calibri" w:cs="Calibri" w:eastAsia="Calibri" w:hAnsi="Calibri"/>
+          <w:b/>
+          <w:bCs/>
+        </w:rPr>
+        <w:t xml:space="preserve">4. Actividades posteriores al incidente</w:t>
+      </w:r>
+    </w:p>
+    <w:p>
+      <w:pPr>
+        <w:pStyle w:val="ListParagraph"/>
+        <w:numPr>
+          <w:ilvl w:val="0"/>
+          <w:numId w:val="2"/>
+        </w:numPr>
+        <w:spacing w:after="60"/>
+      </w:pPr>
+      <w:r>
+        <w:rPr>
+          <w:rFonts w:ascii="Calibri" w:cs="Calibri" w:eastAsia="Calibri" w:hAnsi="Calibri"/>
+        </w:rPr>
+        <w:t xml:space="preserve">La organización debe </w:t>
+      </w:r>
+      <w:r>
+        <w:rPr>
+          <w:rFonts w:ascii="Calibri" w:cs="Calibri" w:eastAsia="Calibri" w:hAnsi="Calibri"/>
+          <w:b/>
+          <w:bCs/>
+        </w:rPr>
+        <w:t xml:space="preserve">informar y revisar la efectividad</w:t>
+      </w:r>
+      <w:r>
+        <w:rPr>
+          <w:rFonts w:ascii="Calibri" w:cs="Calibri" w:eastAsia="Calibri" w:hAnsi="Calibri"/>
+        </w:rPr>
+        <w:t xml:space="preserve"> del proceso de manejo de incidentes.</w:t>
+      </w:r>
+    </w:p>
+    <w:p>
+      <w:pPr>
+        <w:pStyle w:val="ListParagraph"/>
+        <w:numPr>
+          <w:ilvl w:val="0"/>
+          <w:numId w:val="2"/>
+        </w:numPr>
+        <w:spacing w:after="60"/>
+      </w:pPr>
+      <w:r>
+        <w:rPr>
+          <w:rFonts w:ascii="Calibri" w:cs="Calibri" w:eastAsia="Calibri" w:hAnsi="Calibri"/>
+        </w:rPr>
+        <w:t xml:space="preserve">También identifica el </w:t>
+      </w:r>
+      <w:r>
+        <w:rPr>
+          <w:rFonts w:ascii="Calibri" w:cs="Calibri" w:eastAsia="Calibri" w:hAnsi="Calibri"/>
+          <w:b/>
+          <w:bCs/>
+        </w:rPr>
+        <w:t xml:space="preserve">fortalecimiento necesario</w:t>
+      </w:r>
+      <w:r>
+        <w:rPr>
+          <w:rFonts w:ascii="Calibri" w:cs="Calibri" w:eastAsia="Calibri" w:hAnsi="Calibri"/>
+        </w:rPr>
+        <w:t xml:space="preserve"> para los controles y prácticas de seguridad existentes.</w:t>
+      </w:r>
+    </w:p>
+    <w:p>
+      <w:pPr>
+        <w:spacing w:after="120" w:before="280"/>
+      </w:pPr>
+      <w:r>
+        <w:rPr>
+          <w:rFonts w:ascii="Calibri" w:cs="Calibri" w:eastAsia="Calibri" w:hAnsi="Calibri"/>
+          <w:b/>
+          <w:bCs/>
+        </w:rPr>
+        <w:t xml:space="preserve">5. Recuperación tras un desastre</w:t>
+      </w:r>
+    </w:p>
+    <w:p>
+      <w:pPr>
+        <w:spacing w:after="80" w:before="160"/>
+      </w:pPr>
+      <w:r>
+        <w:rPr>
+          <w:rFonts w:ascii="Calibri" w:cs="Calibri" w:eastAsia="Calibri" w:hAnsi="Calibri"/>
+          <w:b/>
+          <w:bCs/>
+        </w:rPr>
+        <w:t xml:space="preserve">Tipos de desastre</w:t>
+      </w:r>
+    </w:p>
+    <w:tbl>
+      <w:tblPr>
+        <w:tblW w:type="dxa" w:w="9360"/>
+        <w:tblBorders>
+          <w:top w:val="single" w:color="auto" w:sz="4"/>
+          <w:left w:val="single" w:color="auto" w:sz="4"/>
+          <w:bottom w:val="single" w:color="auto" w:sz="4"/>
+          <w:right w:val="single" w:color="auto" w:sz="4"/>
+          <w:insideH w:val="single" w:color="auto" w:sz="4"/>
+          <w:insideV w:val="single" w:color="auto" w:sz="4"/>
+        </w:tblBorders>
+      </w:tblPr>
+      <w:tblGrid>
+        <w:gridCol w:w="3000"/>
+        <w:gridCol w:w="6360"/>
+      </w:tblGrid>
+      <w:tr>
+        <w:trPr>
+          <w:tblHeader/>
+        </w:trPr>
+        <w:tc>
+          <w:tcPr>
+            <w:tcW w:type="dxa" w:w="3000"/>
+            <w:tcBorders>
+              <w:top w:val="single" w:color="000000" w:sz="4"/>
+              <w:left w:val="single" w:color="000000" w:sz="4"/>
+              <w:bottom w:val="single" w:color="000000" w:sz="4"/>
+              <w:right w:val="single" w:color="000000" w:sz="4"/>
+            </w:tcBorders>
+            <w:shd w:fill="D9D9D9" w:val="clear"/>
+            <w:tcMar>
+              <w:top w:type="dxa" w:w="60"/>
+              <w:left w:type="dxa" w:w="100"/>
+              <w:bottom w:type="dxa" w:w="60"/>
+              <w:right w:type="dxa" w:w="100"/>
+            </w:tcMar>
+          </w:tcPr>
+          <w:p>
+            <w:r>
+              <w:rPr>
+                <w:rFonts w:ascii="Calibri" w:cs="Calibri" w:eastAsia="Calibri" w:hAnsi="Calibri"/>
+                <w:b/>
+                <w:bCs/>
+                <w:color w:val="000000"/>
+              </w:rPr>
+              <w:t xml:space="preserve">Tipo</w:t>
+            </w:r>
+          </w:p>
+        </w:tc>
+        <w:tc>
+          <w:tcPr>
+            <w:tcW w:type="dxa" w:w="6360"/>
+            <w:tcBorders>
+              <w:top w:val="single" w:color="000000" w:sz="4"/>
+              <w:left w:val="single" w:color="000000" w:sz="4"/>
+              <w:bottom w:val="single" w:color="000000" w:sz="4"/>
+              <w:right w:val="single" w:color="000000" w:sz="4"/>
+            </w:tcBorders>
+            <w:shd w:fill="D9D9D9" w:val="clear"/>
+            <w:tcMar>
+              <w:top w:type="dxa" w:w="60"/>
+              <w:left w:type="dxa" w:w="100"/>
+              <w:bottom w:type="dxa" w:w="60"/>
+              <w:right w:type="dxa" w:w="100"/>
+            </w:tcMar>
+          </w:tcPr>
+          <w:p>
+            <w:r>
+              <w:rPr>
+                <w:rFonts w:ascii="Calibri" w:cs="Calibri" w:eastAsia="Calibri" w:hAnsi="Calibri"/>
+                <w:b/>
+                <w:bCs/>
+                <w:color w:val="000000"/>
+              </w:rPr>
+              <w:t xml:space="preserve">Característica</w:t>
+            </w:r>
+          </w:p>
+        </w:tc>
+      </w:tr>
+      <w:tr>
+        <w:tc>
+          <w:tcPr>
+            <w:tcW w:type="dxa" w:w="3000"/>
+            <w:tcBorders>
+              <w:top w:val="single" w:color="000000" w:sz="4"/>
+              <w:left w:val="single" w:color="000000" w:sz="4"/>
+              <w:bottom w:val="single" w:color="000000" w:sz="4"/>
+              <w:right w:val="single" w:color="000000" w:sz="4"/>
+            </w:tcBorders>
+            <w:shd w:fill="FFFFFF" w:val="clear"/>
+            <w:tcMar>
+              <w:top w:type="dxa" w:w="60"/>
+              <w:left w:type="dxa" w:w="100"/>
+              <w:bottom w:type="dxa" w:w="60"/>
+              <w:right w:type="dxa" w:w="100"/>
+            </w:tcMar>
+          </w:tcPr>
+          <w:p>
+            <w:r>
+              <w:rPr>
+                <w:rFonts w:ascii="Calibri" w:cs="Calibri" w:eastAsia="Calibri" w:hAnsi="Calibri"/>
+                <w:b/>
+                <w:bCs/>
+              </w:rPr>
+              <w:t xml:space="preserve">Naturales</w:t>
+            </w:r>
+          </w:p>
+        </w:tc>
+        <w:tc>
+          <w:tcPr>
+            <w:tcW w:type="dxa" w:w="6360"/>
+            <w:tcBorders>
+              <w:top w:val="single" w:color="000000" w:sz="4"/>
+              <w:left w:val="single" w:color="000000" w:sz="4"/>
+              <w:bottom w:val="single" w:color="000000" w:sz="4"/>
+              <w:right w:val="single" w:color="000000" w:sz="4"/>
+            </w:tcBorders>
+            <w:shd w:fill="FFFFFF" w:val="clear"/>
+            <w:tcMar>
+              <w:top w:type="dxa" w:w="60"/>
+              <w:left w:type="dxa" w:w="100"/>
+              <w:bottom w:type="dxa" w:w="60"/>
+              <w:right w:type="dxa" w:w="100"/>
+            </w:tcMar>
+          </w:tcPr>
+          <w:p>
+            <w:r>
+              <w:rPr>
+                <w:rFonts w:ascii="Calibri" w:cs="Calibri" w:eastAsia="Calibri" w:hAnsi="Calibri"/>
+              </w:rPr>
+              <w:t xml:space="preserve">Difieren según la </w:t>
+            </w:r>
+            <w:r>
+              <w:rPr>
+                <w:rFonts w:ascii="Calibri" w:cs="Calibri" w:eastAsia="Calibri" w:hAnsi="Calibri"/>
+                <w:b/>
+                <w:bCs/>
+              </w:rPr>
+              <w:t xml:space="preserve">ubicación</w:t>
+            </w:r>
+            <w:r>
+              <w:rPr>
+                <w:rFonts w:ascii="Calibri" w:cs="Calibri" w:eastAsia="Calibri" w:hAnsi="Calibri"/>
+              </w:rPr>
+              <w:t xml:space="preserve"> y, a veces, son </w:t>
+            </w:r>
+            <w:r>
+              <w:rPr>
+                <w:rFonts w:ascii="Calibri" w:cs="Calibri" w:eastAsia="Calibri" w:hAnsi="Calibri"/>
+                <w:b/>
+                <w:bCs/>
+              </w:rPr>
+              <w:t xml:space="preserve">difíciles de predecir</w:t>
+            </w:r>
+          </w:p>
+        </w:tc>
+      </w:tr>
+      <w:tr>
+        <w:tc>
+          <w:tcPr>
+            <w:tcW w:type="dxa" w:w="3000"/>
+            <w:tcBorders>
+              <w:top w:val="single" w:color="000000" w:sz="4"/>
+              <w:left w:val="single" w:color="000000" w:sz="4"/>
+              <w:bottom w:val="single" w:color="000000" w:sz="4"/>
+              <w:right w:val="single" w:color="000000" w:sz="4"/>
+            </w:tcBorders>
+            <w:shd w:fill="FFFFFF" w:val="clear"/>
+            <w:tcMar>
+              <w:top w:type="dxa" w:w="60"/>
+              <w:left w:type="dxa" w:w="100"/>
+              <w:bottom w:type="dxa" w:w="60"/>
+              <w:right w:type="dxa" w:w="100"/>
+            </w:tcMar>
+          </w:tcPr>
+          <w:p>
+            <w:r>
+              <w:rPr>
+                <w:rFonts w:ascii="Calibri" w:cs="Calibri" w:eastAsia="Calibri" w:hAnsi="Calibri"/>
+                <w:b/>
+                <w:bCs/>
+              </w:rPr>
+              <w:t xml:space="preserve">Causados por el hombre</w:t>
+            </w:r>
+          </w:p>
+        </w:tc>
+        <w:tc>
+          <w:tcPr>
+            <w:tcW w:type="dxa" w:w="6360"/>
+            <w:tcBorders>
+              <w:top w:val="single" w:color="000000" w:sz="4"/>
+              <w:left w:val="single" w:color="000000" w:sz="4"/>
+              <w:bottom w:val="single" w:color="000000" w:sz="4"/>
+              <w:right w:val="single" w:color="000000" w:sz="4"/>
+            </w:tcBorders>
+            <w:shd w:fill="FFFFFF" w:val="clear"/>
+            <w:tcMar>
+              <w:top w:type="dxa" w:w="60"/>
+              <w:left w:type="dxa" w:w="100"/>
+              <w:bottom w:type="dxa" w:w="60"/>
+              <w:right w:type="dxa" w:w="100"/>
+            </w:tcMar>
+          </w:tcPr>
+          <w:p>
+            <w:r>
+              <w:rPr>
+                <w:rFonts w:ascii="Calibri" w:cs="Calibri" w:eastAsia="Calibri" w:hAnsi="Calibri"/>
+              </w:rPr>
+              <w:t xml:space="preserve">Involucran a </w:t>
+            </w:r>
+            <w:r>
+              <w:rPr>
+                <w:rFonts w:ascii="Calibri" w:cs="Calibri" w:eastAsia="Calibri" w:hAnsi="Calibri"/>
+                <w:b/>
+                <w:bCs/>
+              </w:rPr>
+              <w:t xml:space="preserve">personas u organizaciones</w:t>
+            </w:r>
+          </w:p>
+        </w:tc>
+      </w:tr>
+    </w:tbl>
+    <w:p>
+      <w:pPr>
+        <w:spacing w:after="80"/>
+      </w:pPr>
+    </w:p>
+    <w:p>
+      <w:pPr>
+        <w:spacing w:after="80" w:before="160"/>
+      </w:pPr>
+      <w:r>
+        <w:rPr>
+          <w:rFonts w:ascii="Calibri" w:cs="Calibri" w:eastAsia="Calibri" w:hAnsi="Calibri"/>
+          <w:b/>
+          <w:bCs/>
+        </w:rPr>
+        <w:t xml:space="preserve">DRP (plan de recuperación ante desastres)</w:t>
+      </w:r>
+    </w:p>
+    <w:p>
+      <w:pPr>
+        <w:pStyle w:val="ListParagraph"/>
+        <w:numPr>
+          <w:ilvl w:val="0"/>
+          <w:numId w:val="2"/>
+        </w:numPr>
+        <w:spacing w:after="60"/>
+      </w:pPr>
+      <w:r>
+        <w:rPr>
+          <w:rFonts w:ascii="Calibri" w:cs="Calibri" w:eastAsia="Calibri" w:hAnsi="Calibri"/>
+        </w:rPr>
+        <w:t xml:space="preserve">Incluye actividades para </w:t>
+      </w:r>
+      <w:r>
+        <w:rPr>
+          <w:rFonts w:ascii="Calibri" w:cs="Calibri" w:eastAsia="Calibri" w:hAnsi="Calibri"/>
+          <w:b/>
+          <w:bCs/>
+        </w:rPr>
+        <w:t xml:space="preserve">evaluar, recuperar, reparar y restaurar</w:t>
+      </w:r>
+      <w:r>
+        <w:rPr>
+          <w:rFonts w:ascii="Calibri" w:cs="Calibri" w:eastAsia="Calibri" w:hAnsi="Calibri"/>
+        </w:rPr>
+        <w:t xml:space="preserve"> las instalaciones y los activos dañados.</w:t>
+      </w:r>
+    </w:p>
+    <w:tbl>
+      <w:tblPr>
+        <w:tblW w:type="dxa" w:w="9360"/>
+        <w:tblBorders>
+          <w:top w:val="single" w:color="auto" w:sz="4"/>
+          <w:left w:val="single" w:color="auto" w:sz="4"/>
+          <w:bottom w:val="single" w:color="auto" w:sz="4"/>
+          <w:right w:val="single" w:color="auto" w:sz="4"/>
+          <w:insideH w:val="single" w:color="auto" w:sz="4"/>
+          <w:insideV w:val="single" w:color="auto" w:sz="4"/>
+        </w:tblBorders>
+      </w:tblPr>
+      <w:tblGrid>
+        <w:gridCol w:w="2600"/>
+        <w:gridCol w:w="6760"/>
+      </w:tblGrid>
+      <w:tr>
+        <w:trPr>
+          <w:tblHeader/>
+        </w:trPr>
+        <w:tc>
+          <w:tcPr>
+            <w:tcW w:type="dxa" w:w="2600"/>
+            <w:tcBorders>
+              <w:top w:val="single" w:color="000000" w:sz="4"/>
+              <w:left w:val="single" w:color="000000" w:sz="4"/>
+              <w:bottom w:val="single" w:color="000000" w:sz="4"/>
+              <w:right w:val="single" w:color="000000" w:sz="4"/>
+            </w:tcBorders>
+            <w:shd w:fill="D9D9D9" w:val="clear"/>
+            <w:tcMar>
+              <w:top w:type="dxa" w:w="60"/>
+              <w:left w:type="dxa" w:w="100"/>
+              <w:bottom w:type="dxa" w:w="60"/>
+              <w:right w:type="dxa" w:w="100"/>
+            </w:tcMar>
+          </w:tcPr>
+          <w:p>
+            <w:r>
+              <w:rPr>
+                <w:rFonts w:ascii="Calibri" w:cs="Calibri" w:eastAsia="Calibri" w:hAnsi="Calibri"/>
+                <w:b/>
+                <w:bCs/>
+                <w:color w:val="000000"/>
+              </w:rPr>
+              <w:t xml:space="preserve">Medidas</w:t>
+            </w:r>
+          </w:p>
+        </w:tc>
+        <w:tc>
+          <w:tcPr>
+            <w:tcW w:type="dxa" w:w="6760"/>
+            <w:tcBorders>
+              <w:top w:val="single" w:color="000000" w:sz="4"/>
+              <w:left w:val="single" w:color="000000" w:sz="4"/>
+              <w:bottom w:val="single" w:color="000000" w:sz="4"/>
+              <w:right w:val="single" w:color="000000" w:sz="4"/>
+            </w:tcBorders>
+            <w:shd w:fill="D9D9D9" w:val="clear"/>
+            <w:tcMar>
+              <w:top w:type="dxa" w:w="60"/>
+              <w:left w:type="dxa" w:w="100"/>
+              <w:bottom w:type="dxa" w:w="60"/>
+              <w:right w:type="dxa" w:w="100"/>
+            </w:tcMar>
+          </w:tcPr>
+          <w:p>
+            <w:r>
+              <w:rPr>
+                <w:rFonts w:ascii="Calibri" w:cs="Calibri" w:eastAsia="Calibri" w:hAnsi="Calibri"/>
+                <w:b/>
+                <w:bCs/>
+                <w:color w:val="000000"/>
+              </w:rPr>
+              <w:t xml:space="preserve">Qué incluyen</w:t>
+            </w:r>
+          </w:p>
+        </w:tc>
+      </w:tr>
+      <w:tr>
+        <w:tc>
+          <w:tcPr>
+            <w:tcW w:type="dxa" w:w="2600"/>
+            <w:tcBorders>
+              <w:top w:val="single" w:color="000000" w:sz="4"/>
+              <w:left w:val="single" w:color="000000" w:sz="4"/>
+              <w:bottom w:val="single" w:color="000000" w:sz="4"/>
+              <w:right w:val="single" w:color="000000" w:sz="4"/>
+            </w:tcBorders>
+            <w:shd w:fill="FFFFFF" w:val="clear"/>
+            <w:tcMar>
+              <w:top w:type="dxa" w:w="60"/>
+              <w:left w:type="dxa" w:w="100"/>
+              <w:bottom w:type="dxa" w:w="60"/>
+              <w:right w:type="dxa" w:w="100"/>
+            </w:tcMar>
+          </w:tcPr>
+          <w:p>
+            <w:r>
+              <w:rPr>
+                <w:rFonts w:ascii="Calibri" w:cs="Calibri" w:eastAsia="Calibri" w:hAnsi="Calibri"/>
+                <w:b/>
+                <w:bCs/>
+              </w:rPr>
+              <w:t xml:space="preserve">Preventivas</w:t>
+            </w:r>
+          </w:p>
+        </w:tc>
+        <w:tc>
+          <w:tcPr>
+            <w:tcW w:type="dxa" w:w="6760"/>
+            <w:tcBorders>
+              <w:top w:val="single" w:color="000000" w:sz="4"/>
+              <w:left w:val="single" w:color="000000" w:sz="4"/>
+              <w:bottom w:val="single" w:color="000000" w:sz="4"/>
+              <w:right w:val="single" w:color="000000" w:sz="4"/>
+            </w:tcBorders>
+            <w:shd w:fill="FFFFFF" w:val="clear"/>
+            <w:tcMar>
+              <w:top w:type="dxa" w:w="60"/>
+              <w:left w:type="dxa" w:w="100"/>
+              <w:bottom w:type="dxa" w:w="60"/>
+              <w:right w:type="dxa" w:w="100"/>
+            </w:tcMar>
+          </w:tcPr>
+          <w:p>
+            <w:r>
+              <w:rPr>
+                <w:rFonts w:ascii="Calibri" w:cs="Calibri" w:eastAsia="Calibri" w:hAnsi="Calibri"/>
+              </w:rPr>
+              <w:t xml:space="preserve">Controles que </w:t>
+            </w:r>
+            <w:r>
+              <w:rPr>
+                <w:rFonts w:ascii="Calibri" w:cs="Calibri" w:eastAsia="Calibri" w:hAnsi="Calibri"/>
+                <w:b/>
+                <w:bCs/>
+              </w:rPr>
+              <w:t xml:space="preserve">impiden</w:t>
+            </w:r>
+            <w:r>
+              <w:rPr>
+                <w:rFonts w:ascii="Calibri" w:cs="Calibri" w:eastAsia="Calibri" w:hAnsi="Calibri"/>
+              </w:rPr>
+              <w:t xml:space="preserve"> que ocurra un desastre</w:t>
+            </w:r>
+          </w:p>
+        </w:tc>
+      </w:tr>
+      <w:tr>
+        <w:tc>
+          <w:tcPr>
+            <w:tcW w:type="dxa" w:w="2600"/>
+            <w:tcBorders>
+              <w:top w:val="single" w:color="000000" w:sz="4"/>
+              <w:left w:val="single" w:color="000000" w:sz="4"/>
+              <w:bottom w:val="single" w:color="000000" w:sz="4"/>
+              <w:right w:val="single" w:color="000000" w:sz="4"/>
+            </w:tcBorders>
+            <w:shd w:fill="FFFFFF" w:val="clear"/>
+            <w:tcMar>
+              <w:top w:type="dxa" w:w="60"/>
+              <w:left w:type="dxa" w:w="100"/>
+              <w:bottom w:type="dxa" w:w="60"/>
+              <w:right w:type="dxa" w:w="100"/>
+            </w:tcMar>
+          </w:tcPr>
+          <w:p>
+            <w:r>
+              <w:rPr>
+                <w:rFonts w:ascii="Calibri" w:cs="Calibri" w:eastAsia="Calibri" w:hAnsi="Calibri"/>
+                <w:b/>
+                <w:bCs/>
+              </w:rPr>
+              <w:t xml:space="preserve">De detección</w:t>
+            </w:r>
+          </w:p>
+        </w:tc>
+        <w:tc>
+          <w:tcPr>
+            <w:tcW w:type="dxa" w:w="6760"/>
+            <w:tcBorders>
+              <w:top w:val="single" w:color="000000" w:sz="4"/>
+              <w:left w:val="single" w:color="000000" w:sz="4"/>
+              <w:bottom w:val="single" w:color="000000" w:sz="4"/>
+              <w:right w:val="single" w:color="000000" w:sz="4"/>
+            </w:tcBorders>
+            <w:shd w:fill="FFFFFF" w:val="clear"/>
+            <w:tcMar>
+              <w:top w:type="dxa" w:w="60"/>
+              <w:left w:type="dxa" w:w="100"/>
+              <w:bottom w:type="dxa" w:w="60"/>
+              <w:right w:type="dxa" w:w="100"/>
+            </w:tcMar>
+          </w:tcPr>
+          <w:p>
+            <w:r>
+              <w:rPr>
+                <w:rFonts w:ascii="Calibri" w:cs="Calibri" w:eastAsia="Calibri" w:hAnsi="Calibri"/>
+              </w:rPr>
+              <w:t xml:space="preserve">Controles que </w:t>
+            </w:r>
+            <w:r>
+              <w:rPr>
+                <w:rFonts w:ascii="Calibri" w:cs="Calibri" w:eastAsia="Calibri" w:hAnsi="Calibri"/>
+                <w:b/>
+                <w:bCs/>
+              </w:rPr>
+              <w:t xml:space="preserve">detectan eventos no deseados</w:t>
+            </w:r>
+          </w:p>
+        </w:tc>
+      </w:tr>
+      <w:tr>
+        <w:tc>
+          <w:tcPr>
+            <w:tcW w:type="dxa" w:w="2600"/>
+            <w:tcBorders>
+              <w:top w:val="single" w:color="000000" w:sz="4"/>
+              <w:left w:val="single" w:color="000000" w:sz="4"/>
+              <w:bottom w:val="single" w:color="000000" w:sz="4"/>
+              <w:right w:val="single" w:color="000000" w:sz="4"/>
+            </w:tcBorders>
+            <w:shd w:fill="FFFFFF" w:val="clear"/>
+            <w:tcMar>
+              <w:top w:type="dxa" w:w="60"/>
+              <w:left w:type="dxa" w:w="100"/>
+              <w:bottom w:type="dxa" w:w="60"/>
+              <w:right w:type="dxa" w:w="100"/>
+            </w:tcMar>
+          </w:tcPr>
+          <w:p>
+            <w:r>
+              <w:rPr>
+                <w:rFonts w:ascii="Calibri" w:cs="Calibri" w:eastAsia="Calibri" w:hAnsi="Calibri"/>
+                <w:b/>
+                <w:bCs/>
+              </w:rPr>
+              <w:t xml:space="preserve">Correctivas</w:t>
+            </w:r>
+          </w:p>
+        </w:tc>
+        <w:tc>
+          <w:tcPr>
+            <w:tcW w:type="dxa" w:w="6760"/>
+            <w:tcBorders>
+              <w:top w:val="single" w:color="000000" w:sz="4"/>
+              <w:left w:val="single" w:color="000000" w:sz="4"/>
+              <w:bottom w:val="single" w:color="000000" w:sz="4"/>
+              <w:right w:val="single" w:color="000000" w:sz="4"/>
+            </w:tcBorders>
+            <w:shd w:fill="FFFFFF" w:val="clear"/>
+            <w:tcMar>
+              <w:top w:type="dxa" w:w="60"/>
+              <w:left w:type="dxa" w:w="100"/>
+              <w:bottom w:type="dxa" w:w="60"/>
+              <w:right w:type="dxa" w:w="100"/>
+            </w:tcMar>
+          </w:tcPr>
+          <w:p>
+            <w:r>
+              <w:rPr>
+                <w:rFonts w:ascii="Calibri" w:cs="Calibri" w:eastAsia="Calibri" w:hAnsi="Calibri"/>
+              </w:rPr>
+              <w:t xml:space="preserve">Controles que </w:t>
+            </w:r>
+            <w:r>
+              <w:rPr>
+                <w:rFonts w:ascii="Calibri" w:cs="Calibri" w:eastAsia="Calibri" w:hAnsi="Calibri"/>
+                <w:b/>
+                <w:bCs/>
+              </w:rPr>
+              <w:t xml:space="preserve">restauran el sistema</w:t>
+            </w:r>
+            <w:r>
+              <w:rPr>
+                <w:rFonts w:ascii="Calibri" w:cs="Calibri" w:eastAsia="Calibri" w:hAnsi="Calibri"/>
+              </w:rPr>
+              <w:t xml:space="preserve"> después de un evento o desastre</w:t>
+            </w:r>
+          </w:p>
+        </w:tc>
+      </w:tr>
+    </w:tbl>
+    <w:p>
+      <w:pPr>
+        <w:spacing w:after="80"/>
+      </w:pPr>
+    </w:p>
+    <w:p>
+      <w:pPr>
+        <w:spacing w:after="80" w:before="160"/>
+      </w:pPr>
+      <w:r>
+        <w:rPr>
+          <w:rFonts w:ascii="Calibri" w:cs="Calibri" w:eastAsia="Calibri" w:hAnsi="Calibri"/>
+          <w:b/>
+          <w:bCs/>
+        </w:rPr>
+        <w:t xml:space="preserve">Continuidad de los negocios</w:t>
+      </w:r>
+    </w:p>
+    <w:p>
+      <w:pPr>
+        <w:pStyle w:val="ListParagraph"/>
+        <w:numPr>
+          <w:ilvl w:val="0"/>
+          <w:numId w:val="2"/>
+        </w:numPr>
+        <w:spacing w:after="60"/>
+      </w:pPr>
+      <w:r>
+        <w:rPr>
+          <w:rFonts w:ascii="Calibri" w:cs="Calibri" w:eastAsia="Calibri" w:hAnsi="Calibri"/>
+        </w:rPr>
+        <w:t xml:space="preserve">Los controles son </w:t>
+      </w:r>
+      <w:r>
+        <w:rPr>
+          <w:rFonts w:ascii="Calibri" w:cs="Calibri" w:eastAsia="Calibri" w:hAnsi="Calibri"/>
+          <w:b/>
+          <w:bCs/>
+        </w:rPr>
+        <w:t xml:space="preserve">mucho más que una copia de respaldo</w:t>
+      </w:r>
+      <w:r>
+        <w:rPr>
+          <w:rFonts w:ascii="Calibri" w:cs="Calibri" w:eastAsia="Calibri" w:hAnsi="Calibri"/>
+        </w:rPr>
+        <w:t xml:space="preserve"> de los datos y redundancia del hardware.</w:t>
+      </w:r>
+    </w:p>
+    <w:p>
+      <w:pPr>
+        <w:pStyle w:val="ListParagraph"/>
+        <w:numPr>
+          <w:ilvl w:val="0"/>
+          <w:numId w:val="2"/>
+        </w:numPr>
+        <w:spacing w:after="60"/>
+      </w:pPr>
+      <w:r>
+        <w:rPr>
+          <w:rFonts w:ascii="Calibri" w:cs="Calibri" w:eastAsia="Calibri" w:hAnsi="Calibri"/>
+        </w:rPr>
+        <w:t xml:space="preserve">Un plan de continuidad comercial empieza con un </w:t>
+      </w:r>
+      <w:r>
+        <w:rPr>
+          <w:rFonts w:ascii="Calibri" w:cs="Calibri" w:eastAsia="Calibri" w:hAnsi="Calibri"/>
+          <w:b/>
+          <w:bCs/>
+        </w:rPr>
+        <w:t xml:space="preserve">análisis de impacto comercial (BIA)</w:t>
+      </w:r>
+      <w:r>
+        <w:rPr>
+          <w:rFonts w:ascii="Calibri" w:cs="Calibri" w:eastAsia="Calibri" w:hAnsi="Calibri"/>
+        </w:rPr>
+        <w:t xml:space="preserve">, para identificar procesos comerciales críticos, recursos y relaciones entre sistemas.</w:t>
+      </w:r>
+    </w:p>
+    <w:p>
+      <w:pPr>
+        <w:pStyle w:val="ListParagraph"/>
+        <w:numPr>
+          <w:ilvl w:val="0"/>
+          <w:numId w:val="2"/>
+        </w:numPr>
+        <w:spacing w:after="60"/>
+      </w:pPr>
+      <w:r>
+        <w:rPr>
+          <w:rFonts w:ascii="Calibri" w:cs="Calibri" w:eastAsia="Calibri" w:hAnsi="Calibri"/>
+        </w:rPr>
+        <w:t xml:space="preserve">El BIA se centra en las </w:t>
+      </w:r>
+      <w:r>
+        <w:rPr>
+          <w:rFonts w:ascii="Calibri" w:cs="Calibri" w:eastAsia="Calibri" w:hAnsi="Calibri"/>
+          <w:b/>
+          <w:bCs/>
+        </w:rPr>
+        <w:t xml:space="preserve">consecuencias de interrumpir</w:t>
+      </w:r>
+      <w:r>
+        <w:rPr>
+          <w:rFonts w:ascii="Calibri" w:cs="Calibri" w:eastAsia="Calibri" w:hAnsi="Calibri"/>
+        </w:rPr>
+        <w:t xml:space="preserve"> las funciones comerciales críticas y examina estas consideraciones clave:</w:t>
+      </w:r>
+    </w:p>
+    <w:p>
+      <w:pPr>
+        <w:pStyle w:val="ListParagraph"/>
+        <w:numPr>
+          <w:ilvl w:val="1"/>
+          <w:numId w:val="2"/>
+        </w:numPr>
+        <w:spacing w:after="60"/>
+      </w:pPr>
+      <w:r>
+        <w:rPr>
+          <w:rFonts w:ascii="Calibri" w:cs="Calibri" w:eastAsia="Calibri" w:hAnsi="Calibri"/>
+          <w:b/>
+          <w:bCs/>
+        </w:rPr>
+        <w:t xml:space="preserve">RTO</w:t>
+      </w:r>
+    </w:p>
+    <w:p>
+      <w:pPr>
+        <w:pStyle w:val="ListParagraph"/>
+        <w:numPr>
+          <w:ilvl w:val="1"/>
+          <w:numId w:val="2"/>
+        </w:numPr>
+        <w:spacing w:after="60"/>
+      </w:pPr>
+      <w:r>
+        <w:rPr>
+          <w:rFonts w:ascii="Calibri" w:cs="Calibri" w:eastAsia="Calibri" w:hAnsi="Calibri"/>
+          <w:b/>
+          <w:bCs/>
+        </w:rPr>
+        <w:t xml:space="preserve">RPO</w:t>
+      </w:r>
+    </w:p>
+    <w:p>
+      <w:pPr>
+        <w:pStyle w:val="ListParagraph"/>
+        <w:numPr>
+          <w:ilvl w:val="1"/>
+          <w:numId w:val="2"/>
+        </w:numPr>
+        <w:spacing w:after="60"/>
+      </w:pPr>
+      <w:r>
+        <w:rPr>
+          <w:rFonts w:ascii="Calibri" w:cs="Calibri" w:eastAsia="Calibri" w:hAnsi="Calibri"/>
+          <w:b/>
+          <w:bCs/>
+        </w:rPr>
+        <w:t xml:space="preserve">MTTR</w:t>
+      </w:r>
+    </w:p>
+    <w:p>
+      <w:pPr>
+        <w:pStyle w:val="ListParagraph"/>
+        <w:numPr>
+          <w:ilvl w:val="1"/>
+          <w:numId w:val="2"/>
+        </w:numPr>
+        <w:spacing w:after="60"/>
+      </w:pPr>
+      <w:r>
+        <w:rPr>
+          <w:rFonts w:ascii="Calibri" w:cs="Calibri" w:eastAsia="Calibri" w:hAnsi="Calibri"/>
+          <w:b/>
+          <w:bCs/>
+        </w:rPr>
+        <w:t xml:space="preserve">MTBF</w:t>
+      </w:r>
+    </w:p>
+    <w:p>
+      <w:pPr>
+        <w:pStyle w:val="ListParagraph"/>
+        <w:numPr>
+          <w:ilvl w:val="0"/>
+          <w:numId w:val="2"/>
+        </w:numPr>
+        <w:spacing w:after="60"/>
+      </w:pPr>
+      <w:r>
+        <w:rPr>
+          <w:rFonts w:ascii="Calibri" w:cs="Calibri" w:eastAsia="Calibri" w:hAnsi="Calibri"/>
+        </w:rPr>
+        <w:t xml:space="preserve">El </w:t>
+      </w:r>
+      <w:r>
+        <w:rPr>
+          <w:rFonts w:ascii="Calibri" w:cs="Calibri" w:eastAsia="Calibri" w:hAnsi="Calibri"/>
+          <w:b/>
+          <w:bCs/>
+        </w:rPr>
+        <w:t xml:space="preserve">NIST</w:t>
+      </w:r>
+      <w:r>
+        <w:rPr>
+          <w:rFonts w:ascii="Calibri" w:cs="Calibri" w:eastAsia="Calibri" w:hAnsi="Calibri"/>
+        </w:rPr>
+        <w:t xml:space="preserve"> desarrolló mejores prácticas sobre la continuidad de los negocios.</w:t>
+      </w:r>
+    </w:p>
+    <w:p>
+      <w:pPr>
+        <w:spacing w:after="80" w:before="160"/>
+      </w:pPr>
+      <w:r>
+        <w:rPr>
+          <w:rFonts w:ascii="Calibri" w:cs="Calibri" w:eastAsia="Calibri" w:hAnsi="Calibri"/>
+          <w:b/>
+          <w:bCs/>
+        </w:rPr>
+        <w:t xml:space="preserve">Capacitación para el plan de recuperación</w:t>
+      </w:r>
+    </w:p>
+    <w:tbl>
+      <w:tblPr>
+        <w:tblW w:type="dxa" w:w="9360"/>
+        <w:tblBorders>
+          <w:top w:val="single" w:color="auto" w:sz="4"/>
+          <w:left w:val="single" w:color="auto" w:sz="4"/>
+          <w:bottom w:val="single" w:color="auto" w:sz="4"/>
+          <w:right w:val="single" w:color="auto" w:sz="4"/>
+          <w:insideH w:val="single" w:color="auto" w:sz="4"/>
+          <w:insideV w:val="single" w:color="auto" w:sz="4"/>
+        </w:tblBorders>
+      </w:tblPr>
+      <w:tblGrid>
+        <w:gridCol w:w="3000"/>
+        <w:gridCol w:w="6360"/>
+      </w:tblGrid>
+      <w:tr>
+        <w:trPr>
+          <w:tblHeader/>
+        </w:trPr>
+        <w:tc>
+          <w:tcPr>
+            <w:tcW w:type="dxa" w:w="3000"/>
+            <w:tcBorders>
+              <w:top w:val="single" w:color="000000" w:sz="4"/>
+              <w:left w:val="single" w:color="000000" w:sz="4"/>
+              <w:bottom w:val="single" w:color="000000" w:sz="4"/>
+              <w:right w:val="single" w:color="000000" w:sz="4"/>
+            </w:tcBorders>
+            <w:shd w:fill="D9D9D9" w:val="clear"/>
+            <w:tcMar>
+              <w:top w:type="dxa" w:w="60"/>
+              <w:left w:type="dxa" w:w="100"/>
+              <w:bottom w:type="dxa" w:w="60"/>
+              <w:right w:type="dxa" w:w="100"/>
+            </w:tcMar>
+          </w:tcPr>
+          <w:p>
+            <w:r>
+              <w:rPr>
+                <w:rFonts w:ascii="Calibri" w:cs="Calibri" w:eastAsia="Calibri" w:hAnsi="Calibri"/>
+                <w:b/>
+                <w:bCs/>
+                <w:color w:val="000000"/>
+              </w:rPr>
+              <w:t xml:space="preserve">Método</w:t>
+            </w:r>
+          </w:p>
+        </w:tc>
+        <w:tc>
+          <w:tcPr>
+            <w:tcW w:type="dxa" w:w="6360"/>
+            <w:tcBorders>
+              <w:top w:val="single" w:color="000000" w:sz="4"/>
+              <w:left w:val="single" w:color="000000" w:sz="4"/>
+              <w:bottom w:val="single" w:color="000000" w:sz="4"/>
+              <w:right w:val="single" w:color="000000" w:sz="4"/>
+            </w:tcBorders>
+            <w:shd w:fill="D9D9D9" w:val="clear"/>
+            <w:tcMar>
+              <w:top w:type="dxa" w:w="60"/>
+              <w:left w:type="dxa" w:w="100"/>
+              <w:bottom w:type="dxa" w:w="60"/>
+              <w:right w:type="dxa" w:w="100"/>
+            </w:tcMar>
+          </w:tcPr>
+          <w:p>
+            <w:r>
+              <w:rPr>
+                <w:rFonts w:ascii="Calibri" w:cs="Calibri" w:eastAsia="Calibri" w:hAnsi="Calibri"/>
+                <w:b/>
+                <w:bCs/>
+                <w:color w:val="000000"/>
+              </w:rPr>
+              <w:t xml:space="preserve">Qué es</w:t>
+            </w:r>
+          </w:p>
+        </w:tc>
+      </w:tr>
+      <w:tr>
+        <w:tc>
+          <w:tcPr>
+            <w:tcW w:type="dxa" w:w="3000"/>
+            <w:tcBorders>
+              <w:top w:val="single" w:color="000000" w:sz="4"/>
+              <w:left w:val="single" w:color="000000" w:sz="4"/>
+              <w:bottom w:val="single" w:color="000000" w:sz="4"/>
+              <w:right w:val="single" w:color="000000" w:sz="4"/>
+            </w:tcBorders>
+            <w:shd w:fill="FFFFFF" w:val="clear"/>
+            <w:tcMar>
+              <w:top w:type="dxa" w:w="60"/>
+              <w:left w:type="dxa" w:w="100"/>
+              <w:bottom w:type="dxa" w:w="60"/>
+              <w:right w:type="dxa" w:w="100"/>
+            </w:tcMar>
+          </w:tcPr>
+          <w:p>
+            <w:r>
+              <w:rPr>
+                <w:rFonts w:ascii="Calibri" w:cs="Calibri" w:eastAsia="Calibri" w:hAnsi="Calibri"/>
+                <w:b/>
+                <w:bCs/>
+              </w:rPr>
+              <w:t xml:space="preserve">Ejercicio de mesa</w:t>
+            </w:r>
+          </w:p>
+        </w:tc>
+        <w:tc>
+          <w:tcPr>
+            <w:tcW w:type="dxa" w:w="6360"/>
+            <w:tcBorders>
+              <w:top w:val="single" w:color="000000" w:sz="4"/>
+              <w:left w:val="single" w:color="000000" w:sz="4"/>
+              <w:bottom w:val="single" w:color="000000" w:sz="4"/>
+              <w:right w:val="single" w:color="000000" w:sz="4"/>
+            </w:tcBorders>
+            <w:shd w:fill="FFFFFF" w:val="clear"/>
+            <w:tcMar>
+              <w:top w:type="dxa" w:w="60"/>
+              <w:left w:type="dxa" w:w="100"/>
+              <w:bottom w:type="dxa" w:w="60"/>
+              <w:right w:type="dxa" w:w="100"/>
+            </w:tcMar>
+          </w:tcPr>
+          <w:p>
+            <w:r>
+              <w:rPr>
+                <w:rFonts w:ascii="Calibri" w:cs="Calibri" w:eastAsia="Calibri" w:hAnsi="Calibri"/>
+              </w:rPr>
+              <w:t xml:space="preserve">Los participantes se sientan con un </w:t>
+            </w:r>
+            <w:r>
+              <w:rPr>
+                <w:rFonts w:ascii="Calibri" w:cs="Calibri" w:eastAsia="Calibri" w:hAnsi="Calibri"/>
+                <w:b/>
+                <w:bCs/>
+              </w:rPr>
+              <w:t xml:space="preserve">facilitador</w:t>
+            </w:r>
+            <w:r>
+              <w:rPr>
+                <w:rFonts w:ascii="Calibri" w:cs="Calibri" w:eastAsia="Calibri" w:hAnsi="Calibri"/>
+              </w:rPr>
+              <w:t xml:space="preserve"> que da información sobre un incidente de escenario y los procesos que se examinan. </w:t>
+            </w:r>
+            <w:r>
+              <w:rPr>
+                <w:rFonts w:ascii="Calibri" w:cs="Calibri" w:eastAsia="Calibri" w:hAnsi="Calibri"/>
+                <w:b/>
+                <w:bCs/>
+              </w:rPr>
+              <w:t xml:space="preserve">No se invocan procesos reales</w:t>
+            </w:r>
+            <w:r>
+              <w:rPr>
+                <w:rFonts w:ascii="Calibri" w:cs="Calibri" w:eastAsia="Calibri" w:hAnsi="Calibri"/>
+              </w:rPr>
+              <w:t xml:space="preserve">: solo se discuten</w:t>
+            </w:r>
+          </w:p>
+        </w:tc>
+      </w:tr>
+      <w:tr>
+        <w:tc>
+          <w:tcPr>
+            <w:tcW w:type="dxa" w:w="3000"/>
+            <w:tcBorders>
+              <w:top w:val="single" w:color="000000" w:sz="4"/>
+              <w:left w:val="single" w:color="000000" w:sz="4"/>
+              <w:bottom w:val="single" w:color="000000" w:sz="4"/>
+              <w:right w:val="single" w:color="000000" w:sz="4"/>
+            </w:tcBorders>
+            <w:shd w:fill="FFFFFF" w:val="clear"/>
+            <w:tcMar>
+              <w:top w:type="dxa" w:w="60"/>
+              <w:left w:type="dxa" w:w="100"/>
+              <w:bottom w:type="dxa" w:w="60"/>
+              <w:right w:type="dxa" w:w="100"/>
+            </w:tcMar>
+          </w:tcPr>
+          <w:p>
+            <w:r>
+              <w:rPr>
+                <w:rFonts w:ascii="Calibri" w:cs="Calibri" w:eastAsia="Calibri" w:hAnsi="Calibri"/>
+                <w:b/>
+                <w:bCs/>
+              </w:rPr>
+              <w:t xml:space="preserve">Prueba funcional</w:t>
+            </w:r>
+          </w:p>
+        </w:tc>
+        <w:tc>
+          <w:tcPr>
+            <w:tcW w:type="dxa" w:w="6360"/>
+            <w:tcBorders>
+              <w:top w:val="single" w:color="000000" w:sz="4"/>
+              <w:left w:val="single" w:color="000000" w:sz="4"/>
+              <w:bottom w:val="single" w:color="000000" w:sz="4"/>
+              <w:right w:val="single" w:color="000000" w:sz="4"/>
+            </w:tcBorders>
+            <w:shd w:fill="FFFFFF" w:val="clear"/>
+            <w:tcMar>
+              <w:top w:type="dxa" w:w="60"/>
+              <w:left w:type="dxa" w:w="100"/>
+              <w:bottom w:type="dxa" w:w="60"/>
+              <w:right w:type="dxa" w:w="100"/>
+            </w:tcMar>
+          </w:tcPr>
+          <w:p>
+            <w:r>
+              <w:rPr>
+                <w:rFonts w:ascii="Calibri" w:cs="Calibri" w:eastAsia="Calibri" w:hAnsi="Calibri"/>
+              </w:rPr>
+              <w:t xml:space="preserve">Se prueban </w:t>
+            </w:r>
+            <w:r>
+              <w:rPr>
+                <w:rFonts w:ascii="Calibri" w:cs="Calibri" w:eastAsia="Calibri" w:hAnsi="Calibri"/>
+                <w:b/>
+                <w:bCs/>
+              </w:rPr>
+              <w:t xml:space="preserve">ciertos aspectos</w:t>
+            </w:r>
+            <w:r>
+              <w:rPr>
+                <w:rFonts w:ascii="Calibri" w:cs="Calibri" w:eastAsia="Calibri" w:hAnsi="Calibri"/>
+              </w:rPr>
+              <w:t xml:space="preserve"> de un plan para ver qué tan bien funcionan (y qué tan preparado está el personal)</w:t>
+            </w:r>
+          </w:p>
+        </w:tc>
+      </w:tr>
+      <w:tr>
+        <w:tc>
+          <w:tcPr>
+            <w:tcW w:type="dxa" w:w="3000"/>
+            <w:tcBorders>
+              <w:top w:val="single" w:color="000000" w:sz="4"/>
+              <w:left w:val="single" w:color="000000" w:sz="4"/>
+              <w:bottom w:val="single" w:color="000000" w:sz="4"/>
+              <w:right w:val="single" w:color="000000" w:sz="4"/>
+            </w:tcBorders>
+            <w:shd w:fill="FFFFFF" w:val="clear"/>
+            <w:tcMar>
+              <w:top w:type="dxa" w:w="60"/>
+              <w:left w:type="dxa" w:w="100"/>
+              <w:bottom w:type="dxa" w:w="60"/>
+              <w:right w:type="dxa" w:w="100"/>
+            </w:tcMar>
+          </w:tcPr>
+          <w:p>
+            <w:r>
+              <w:rPr>
+                <w:rFonts w:ascii="Calibri" w:cs="Calibri" w:eastAsia="Calibri" w:hAnsi="Calibri"/>
+                <w:b/>
+                <w:bCs/>
+              </w:rPr>
+              <w:t xml:space="preserve">Ejercicios operativos completos (simulaciones)</w:t>
+            </w:r>
+          </w:p>
+        </w:tc>
+        <w:tc>
+          <w:tcPr>
+            <w:tcW w:type="dxa" w:w="6360"/>
+            <w:tcBorders>
+              <w:top w:val="single" w:color="000000" w:sz="4"/>
+              <w:left w:val="single" w:color="000000" w:sz="4"/>
+              <w:bottom w:val="single" w:color="000000" w:sz="4"/>
+              <w:right w:val="single" w:color="000000" w:sz="4"/>
+            </w:tcBorders>
+            <w:shd w:fill="FFFFFF" w:val="clear"/>
+            <w:tcMar>
+              <w:top w:type="dxa" w:w="60"/>
+              <w:left w:type="dxa" w:w="100"/>
+              <w:bottom w:type="dxa" w:w="60"/>
+              <w:right w:type="dxa" w:w="100"/>
+            </w:tcMar>
+          </w:tcPr>
+          <w:p>
+            <w:r>
+              <w:rPr>
+                <w:rFonts w:ascii="Calibri" w:cs="Calibri" w:eastAsia="Calibri" w:hAnsi="Calibri"/>
+              </w:rPr>
+              <w:t xml:space="preserve">Es el extremo: están diseñados para </w:t>
+            </w:r>
+            <w:r>
+              <w:rPr>
+                <w:rFonts w:ascii="Calibri" w:cs="Calibri" w:eastAsia="Calibri" w:hAnsi="Calibri"/>
+                <w:b/>
+                <w:bCs/>
+              </w:rPr>
+              <w:t xml:space="preserve">interrumpir los servicios</w:t>
+            </w:r>
+            <w:r>
+              <w:rPr>
+                <w:rFonts w:ascii="Calibri" w:cs="Calibri" w:eastAsia="Calibri" w:hAnsi="Calibri"/>
+              </w:rPr>
+              <w:t xml:space="preserve"> y verificar que todos los aspectos del plan estén implementados y sean suficientes para responder al tipo de incidente simulado</w:t>
             </w:r>
           </w:p>
         </w:tc>

</xml_diff>